<commit_message>
Fixed arrows, made a render pipeline flowchart.
</commit_message>
<xml_diff>
--- a/Design.docx
+++ b/Design.docx
@@ -258,11 +258,12 @@
           <w:highlight w:val="none"/>
         </w:rPr>
       </w:r>
+      <w:r/>
     </w:p>
     <w:p>
       <w:pPr>
         <w:rPr>
-          <w:color w:val="000000" w:themeColor="text1"/>
+          <w:color w:val="000000"/>
           <w:sz w:val="22"/>
           <w:highlight w:val="none"/>
         </w:rPr>
@@ -361,7 +362,6 @@
           </mc:Fallback>
         </mc:AlternateContent>
       </w:r>
-      <w:r/>
       <w:r/>
     </w:p>
     <w:p>
@@ -812,7 +812,7 @@
     <w:p>
       <w:pPr>
         <w:rPr>
-          <w:color w:val="000000"/>
+          <w:color w:val="000000" w:themeColor="text1"/>
           <w:sz w:val="22"/>
           <w:highlight w:val="none"/>
           <w:vertAlign w:val="baseline"/>
@@ -867,6 +867,200 @@
         </w:rPr>
       </w:r>
       <w:r/>
+    </w:p>
+    <w:p>
+      <w:pPr>
+        <w:rPr>
+          <w:color w:val="000000"/>
+          <w:sz w:val="22"/>
+          <w:highlight w:val="none"/>
+          <w:vertAlign w:val="baseline"/>
+        </w:rPr>
+      </w:pPr>
+      <w:r>
+        <w:rPr>
+          <w:color w:val="000000"/>
+          <w:sz w:val="22"/>
+          <w:highlight w:val="none"/>
+          <w:vertAlign w:val="baseline"/>
+        </w:rPr>
+      </w:r>
+      <w:r>
+        <w:rPr>
+          <w:color w:val="000000"/>
+          <w:sz w:val="22"/>
+          <w:highlight w:val="none"/>
+          <w:vertAlign w:val="baseline"/>
+        </w:rPr>
+      </w:r>
+    </w:p>
+    <w:p>
+      <w:pPr>
+        <w:rPr>
+          <w:color w:val="4472C4" w:themeColor="accent5"/>
+          <w:sz w:val="28"/>
+          <w:highlight w:val="none"/>
+          <w:vertAlign w:val="baseline"/>
+        </w:rPr>
+      </w:pPr>
+      <w:r>
+        <w:rPr>
+          <w:color w:val="4472C4" w:themeColor="accent5"/>
+          <w:sz w:val="28"/>
+          <w:highlight w:val="none"/>
+          <w:vertAlign w:val="baseline"/>
+        </w:rPr>
+        <w:t xml:space="preserve">Display</w:t>
+      </w:r>
+      <w:r>
+        <w:rPr>
+          <w:color w:val="4472C4" w:themeColor="accent5"/>
+          <w:sz w:val="28"/>
+          <w:highlight w:val="none"/>
+          <w:vertAlign w:val="baseline"/>
+        </w:rPr>
+      </w:r>
+    </w:p>
+    <w:p>
+      <w:pPr>
+        <w:rPr>
+          <w:color w:val="auto"/>
+          <w:sz w:val="22"/>
+          <w:highlight w:val="none"/>
+          <w:vertAlign w:val="baseline"/>
+        </w:rPr>
+      </w:pPr>
+      <w:r>
+        <w:rPr>
+          <w:color w:val="auto"/>
+          <w:sz w:val="22"/>
+          <w:highlight w:val="none"/>
+          <w:vertAlign w:val="baseline"/>
+        </w:rPr>
+        <w:t xml:space="preserve">This is the render pipeline for my program during the main loop:</w:t>
+      </w:r>
+      <w:r>
+        <w:rPr>
+          <w:color w:val="auto"/>
+          <w:sz w:val="22"/>
+          <w:highlight w:val="none"/>
+          <w:vertAlign w:val="baseline"/>
+        </w:rPr>
+      </w:r>
+      <w:r>
+        <w:rPr>
+          <w:color w:val="auto"/>
+          <w:sz w:val="22"/>
+          <w:highlight w:val="none"/>
+          <w:vertAlign w:val="baseline"/>
+        </w:rPr>
+      </w:r>
+      <w:r>
+        <w:rPr>
+          <w:color w:val="auto"/>
+          <w:sz w:val="22"/>
+          <w:highlight w:val="none"/>
+          <w:vertAlign w:val="baseline"/>
+        </w:rPr>
+      </w:r>
+      <w:r>
+        <w:rPr>
+          <w:color w:val="auto"/>
+          <w:sz w:val="22"/>
+          <w:highlight w:val="none"/>
+          <w:vertAlign w:val="baseline"/>
+        </w:rPr>
+      </w:r>
+    </w:p>
+    <w:p>
+      <w:pPr>
+        <w:rPr>
+          <w:color w:val="auto"/>
+          <w:sz w:val="22"/>
+          <w:highlight w:val="none"/>
+          <w:vertAlign w:val="baseline"/>
+        </w:rPr>
+      </w:pPr>
+      <w:r>
+        <w:rPr>
+          <w:color w:val="auto"/>
+          <w:sz w:val="22"/>
+          <w:highlight w:val="none"/>
+          <w:vertAlign w:val="baseline"/>
+        </w:rPr>
+        <mc:AlternateContent>
+          <mc:Choice Requires="wpg">
+            <w:drawing>
+              <wp:inline xmlns:wp="http://schemas.openxmlformats.org/drawingml/2006/wordprocessingDrawing" distT="0" distB="0" distL="0" distR="0">
+                <wp:extent cx="2421916" cy="5000085"/>
+                <wp:effectExtent l="0" t="0" r="0" b="0"/>
+                <wp:docPr id="3" name="" hidden="0"/>
+                <wp:cNvGraphicFramePr>
+                  <a:graphicFrameLocks xmlns:a="http://schemas.openxmlformats.org/drawingml/2006/main" noChangeAspect="1"/>
+                </wp:cNvGraphicFramePr>
+                <a:graphic xmlns:a="http://schemas.openxmlformats.org/drawingml/2006/main">
+                  <a:graphicData uri="http://schemas.openxmlformats.org/drawingml/2006/picture">
+                    <pic:pic xmlns:pic="http://schemas.openxmlformats.org/drawingml/2006/picture">
+                      <pic:nvPicPr>
+                        <pic:cNvPr id="72036055" name="" hidden="0"/>
+                        <pic:cNvPicPr>
+                          <a:picLocks noChangeAspect="1"/>
+                        </pic:cNvPicPr>
+                        <pic:nvPr isPhoto="0" userDrawn="0"/>
+                      </pic:nvPicPr>
+                      <pic:blipFill>
+                        <a:blip r:embed="rId10"/>
+                        <a:stretch/>
+                      </pic:blipFill>
+                      <pic:spPr bwMode="auto">
+                        <a:xfrm flipH="0" flipV="0">
+                          <a:off x="0" y="0"/>
+                          <a:ext cx="2421915" cy="5000085"/>
+                        </a:xfrm>
+                        <a:prstGeom prst="rect">
+                          <a:avLst/>
+                        </a:prstGeom>
+                      </pic:spPr>
+                    </pic:pic>
+                  </a:graphicData>
+                </a:graphic>
+              </wp:inline>
+            </w:drawing>
+          </mc:Choice>
+          <mc:Fallback>
+            <w:pict>
+              <v:shapetype type="#_x0000_t75" o:spt="75" coordsize="21600,21600" o:preferrelative="t" path="m@4@5l@4@11@9@11@9@5xe">
+                <v:formulas>
+                  <v:f eqn="if lineDrawn pixelLineWidth 0"/>
+                  <v:f eqn="sum @0 1 0"/>
+                  <v:f eqn="sum 0 0 @1"/>
+                  <v:f eqn="prod @2 1 2"/>
+                  <v:f eqn="prod @3 21600 pixelWidth"/>
+                  <v:f eqn="prod @3 21600 pixelHeight"/>
+                  <v:f eqn="sum @0 0 1"/>
+                  <v:f eqn="prod @6 1 2"/>
+                  <v:f eqn="prod @7 21600 pixelWidth"/>
+                  <v:f eqn="sum @8 21600 0"/>
+                  <v:f eqn="prod @7 21600 pixelHeight"/>
+                  <v:f eqn="sum @10 21600 0"/>
+                </v:formulas>
+              </v:shapetype>
+              <v:shape id="_x0000_i2" o:spid="_x0000_s2" type="#_x0000_t75" style="mso-wrap-distance-left:0.0pt;mso-wrap-distance-top:0.0pt;mso-wrap-distance-right:0.0pt;mso-wrap-distance-bottom:0.0pt;width:190.7pt;height:393.7pt;" stroked="false">
+                <v:path textboxrect="0,0,0,0"/>
+                <v:imagedata r:id="rId10" o:title=""/>
+              </v:shape>
+            </w:pict>
+          </mc:Fallback>
+        </mc:AlternateContent>
+      </w:r>
+      <w:r>
+        <w:rPr>
+          <w:color w:val="auto"/>
+          <w:sz w:val="22"/>
+          <w:highlight w:val="none"/>
+          <w:vertAlign w:val="baseline"/>
+        </w:rPr>
+      </w:r>
     </w:p>
     <w:sectPr>
       <w:footnotePr/>

</xml_diff>

<commit_message>
Tiny bit more work on design
</commit_message>
<xml_diff>
--- a/Design.docx
+++ b/Design.docx
@@ -812,7 +812,7 @@
     <w:p>
       <w:pPr>
         <w:rPr>
-          <w:color w:val="000000" w:themeColor="text1"/>
+          <w:color w:val="000000"/>
           <w:sz w:val="22"/>
           <w:highlight w:val="none"/>
           <w:vertAlign w:val="baseline"/>
@@ -893,11 +893,12 @@
           <w:vertAlign w:val="baseline"/>
         </w:rPr>
       </w:r>
+      <w:r/>
     </w:p>
     <w:p>
       <w:pPr>
         <w:rPr>
-          <w:color w:val="4472C4" w:themeColor="accent5"/>
+          <w:color w:val="4472C4"/>
           <w:sz w:val="28"/>
           <w:highlight w:val="none"/>
           <w:vertAlign w:val="baseline"/>
@@ -920,6 +921,7 @@
           <w:vertAlign w:val="baseline"/>
         </w:rPr>
       </w:r>
+      <w:r/>
     </w:p>
     <w:p>
       <w:pPr>
@@ -947,30 +949,7 @@
           <w:vertAlign w:val="baseline"/>
         </w:rPr>
       </w:r>
-      <w:r>
-        <w:rPr>
-          <w:color w:val="auto"/>
-          <w:sz w:val="22"/>
-          <w:highlight w:val="none"/>
-          <w:vertAlign w:val="baseline"/>
-        </w:rPr>
-      </w:r>
-      <w:r>
-        <w:rPr>
-          <w:color w:val="auto"/>
-          <w:sz w:val="22"/>
-          <w:highlight w:val="none"/>
-          <w:vertAlign w:val="baseline"/>
-        </w:rPr>
-      </w:r>
-      <w:r>
-        <w:rPr>
-          <w:color w:val="auto"/>
-          <w:sz w:val="22"/>
-          <w:highlight w:val="none"/>
-          <w:vertAlign w:val="baseline"/>
-        </w:rPr>
-      </w:r>
+      <w:r/>
     </w:p>
     <w:p>
       <w:pPr>
@@ -1057,6 +1036,168 @@
         <w:rPr>
           <w:color w:val="auto"/>
           <w:sz w:val="22"/>
+          <w:highlight w:val="none"/>
+          <w:vertAlign w:val="baseline"/>
+        </w:rPr>
+      </w:r>
+      <w:r/>
+    </w:p>
+    <w:p>
+      <w:pPr>
+        <w:rPr>
+          <w:color w:val="4472C4" w:themeColor="accent5"/>
+          <w:sz w:val="28"/>
+          <w:highlight w:val="none"/>
+          <w:vertAlign w:val="baseline"/>
+        </w:rPr>
+      </w:pPr>
+      <w:r>
+        <w:rPr>
+          <w:color w:val="4472C4" w:themeColor="accent5"/>
+          <w:sz w:val="28"/>
+          <w:highlight w:val="none"/>
+          <w:vertAlign w:val="baseline"/>
+        </w:rPr>
+        <w:t xml:space="preserve">Methods used</w:t>
+      </w:r>
+      <w:r>
+        <w:rPr>
+          <w:color w:val="4472C4" w:themeColor="accent5"/>
+          <w:sz w:val="28"/>
+          <w:highlight w:val="none"/>
+          <w:vertAlign w:val="baseline"/>
+        </w:rPr>
+      </w:r>
+    </w:p>
+    <w:p>
+      <w:pPr>
+        <w:rPr>
+          <w:color w:val="2F5696" w:themeColor="accent5" w:themeShade="BF"/>
+          <w:sz w:val="22"/>
+          <w:highlight w:val="none"/>
+          <w:vertAlign w:val="baseline"/>
+        </w:rPr>
+      </w:pPr>
+      <w:r>
+        <w:rPr>
+          <w:color w:val="2F5696" w:themeColor="accent5" w:themeShade="BF"/>
+          <w:sz w:val="22"/>
+          <w:highlight w:val="none"/>
+          <w:vertAlign w:val="baseline"/>
+        </w:rPr>
+        <w:t xml:space="preserve">displayPlanets</w:t>
+      </w:r>
+      <w:r>
+        <w:rPr>
+          <w:color w:val="2F5696" w:themeColor="accent5" w:themeShade="BF"/>
+          <w:sz w:val="22"/>
+          <w:highlight w:val="none"/>
+          <w:vertAlign w:val="baseline"/>
+        </w:rPr>
+      </w:r>
+    </w:p>
+    <w:p>
+      <w:pPr>
+        <w:rPr>
+          <w:color w:val="auto"/>
+          <w:sz w:val="20"/>
+          <w:highlight w:val="none"/>
+          <w:vertAlign w:val="baseline"/>
+        </w:rPr>
+      </w:pPr>
+      <w:r>
+        <w:rPr>
+          <w:color w:val="auto"/>
+          <w:sz w:val="20"/>
+          <w:highlight w:val="none"/>
+          <w:vertAlign w:val="baseline"/>
+        </w:rPr>
+        <w:t xml:space="preserve">displayPlanets() will simply run a for loop through the list of planets and draws them all using drawPlanet(). drawPlanet() takes position as an argument, so displayPlanets() will need to give it a position. This position will be the adjustment calculated by focusAdjustment().</w:t>
+      </w:r>
+      <w:r>
+        <w:rPr>
+          <w:color w:val="auto"/>
+          <w:sz w:val="20"/>
+          <w:highlight w:val="none"/>
+          <w:vertAlign w:val="baseline"/>
+        </w:rPr>
+      </w:r>
+    </w:p>
+    <w:p>
+      <w:pPr>
+        <w:rPr>
+          <w:color w:val="auto"/>
+          <w:sz w:val="20"/>
+          <w:highlight w:val="none"/>
+          <w:vertAlign w:val="baseline"/>
+        </w:rPr>
+      </w:pPr>
+      <w:r>
+        <w:rPr>
+          <w:color w:val="auto"/>
+          <w:sz w:val="20"/>
+          <w:highlight w:val="none"/>
+          <w:vertAlign w:val="baseline"/>
+        </w:rPr>
+      </w:r>
+      <w:r>
+        <w:rPr>
+          <w:color w:val="auto"/>
+          <w:sz w:val="20"/>
+          <w:highlight w:val="none"/>
+          <w:vertAlign w:val="baseline"/>
+        </w:rPr>
+      </w:r>
+    </w:p>
+    <w:p>
+      <w:pPr>
+        <w:rPr>
+          <w:color w:val="2F5696" w:themeColor="accent5" w:themeShade="BF"/>
+          <w:sz w:val="22"/>
+          <w:highlight w:val="none"/>
+          <w:vertAlign w:val="baseline"/>
+        </w:rPr>
+      </w:pPr>
+      <w:r>
+        <w:rPr>
+          <w:color w:val="2F5696" w:themeColor="accent5" w:themeShade="BF"/>
+          <w:sz w:val="22"/>
+          <w:highlight w:val="none"/>
+          <w:vertAlign w:val="baseline"/>
+        </w:rPr>
+        <w:t xml:space="preserve">drawPlanet</w:t>
+      </w:r>
+      <w:r>
+        <w:rPr>
+          <w:color w:val="2F5696" w:themeColor="accent5" w:themeShade="BF"/>
+          <w:sz w:val="22"/>
+          <w:highlight w:val="none"/>
+          <w:vertAlign w:val="baseline"/>
+        </w:rPr>
+      </w:r>
+    </w:p>
+    <w:p>
+      <w:pPr>
+        <w:rPr>
+          <w:color w:val="auto"/>
+          <w:sz w:val="20"/>
+          <w:highlight w:val="none"/>
+          <w:vertAlign w:val="baseline"/>
+        </w:rPr>
+      </w:pPr>
+      <w:r>
+        <w:rPr>
+          <w:color w:val="auto"/>
+          <w:sz w:val="20"/>
+          <w:highlight w:val="none"/>
+          <w:vertAlign w:val="baseline"/>
+        </w:rPr>
+        <w:t xml:space="preserve">drawPlanet() should use pygame’s draw.circle() method, using the attributes of the planet to set the colour and size of the circle. The size of the planet will need to be multiplied by the distanceScale as pygame cannot draw circles with radii matching the actual size of planets. The function should take in position as an argument so that the planet can be drawn anywhere on the screen we want.</w:t>
+      </w:r>
+      <w:r>
+        <w:rPr>
+          <w:color w:val="auto"/>
+          <w:sz w:val="20"/>
           <w:highlight w:val="none"/>
           <w:vertAlign w:val="baseline"/>
         </w:rPr>

</xml_diff>

<commit_message>
Forgot to save design
</commit_message>
<xml_diff>
--- a/Design.docx
+++ b/Design.docx
@@ -967,6 +967,14 @@
           <w:highlight w:val="none"/>
           <w:vertAlign w:val="baseline"/>
         </w:rPr>
+      </w:r>
+      <w:r>
+        <w:rPr>
+          <w:color w:val="auto"/>
+          <w:sz w:val="22"/>
+          <w:highlight w:val="none"/>
+          <w:vertAlign w:val="baseline"/>
+        </w:rPr>
         <mc:AlternateContent>
           <mc:Choice Requires="wpg">
             <w:drawing>
@@ -981,7 +989,7 @@
                   <a:graphicData uri="http://schemas.openxmlformats.org/drawingml/2006/picture">
                     <pic:pic xmlns:pic="http://schemas.openxmlformats.org/drawingml/2006/picture">
                       <pic:nvPicPr>
-                        <pic:cNvPr id="72036055" name="" hidden="0"/>
+                        <pic:cNvPr id="764373622" name="" hidden="0"/>
                         <pic:cNvPicPr>
                           <a:picLocks noChangeAspect="1"/>
                         </pic:cNvPicPr>
@@ -994,7 +1002,7 @@
                       <pic:spPr bwMode="auto">
                         <a:xfrm flipH="0" flipV="0">
                           <a:off x="0" y="0"/>
-                          <a:ext cx="2421915" cy="5000085"/>
+                          <a:ext cx="2421914" cy="5000085"/>
                         </a:xfrm>
                         <a:prstGeom prst="rect">
                           <a:avLst/>
@@ -1059,6 +1067,59 @@
           <w:vertAlign w:val="baseline"/>
         </w:rPr>
         <w:t xml:space="preserve">Methods used</w:t>
+      </w:r>
+      <w:r>
+        <w:rPr>
+          <w:color w:val="4472C4" w:themeColor="accent5"/>
+          <w:sz w:val="28"/>
+          <w:highlight w:val="none"/>
+          <w:vertAlign w:val="baseline"/>
+        </w:rPr>
+      </w:r>
+    </w:p>
+    <w:p>
+      <w:pPr>
+        <w:rPr>
+          <w:color w:val="2F5696" w:themeColor="accent5" w:themeShade="BF"/>
+          <w:sz w:val="22"/>
+          <w:highlight w:val="none"/>
+          <w:vertAlign w:val="baseline"/>
+        </w:rPr>
+      </w:pPr>
+      <w:r>
+        <w:rPr>
+          <w:color w:val="2F5696" w:themeColor="accent5" w:themeShade="BF"/>
+          <w:sz w:val="22"/>
+          <w:highlight w:val="none"/>
+          <w:vertAlign w:val="baseline"/>
+        </w:rPr>
+        <w:t xml:space="preserve">focusAdjustment</w:t>
+      </w:r>
+      <w:r>
+        <w:rPr>
+          <w:color w:val="2F5696" w:themeColor="accent5" w:themeShade="BF"/>
+          <w:sz w:val="22"/>
+          <w:highlight w:val="none"/>
+          <w:vertAlign w:val="baseline"/>
+        </w:rPr>
+      </w:r>
+    </w:p>
+    <w:p>
+      <w:pPr>
+        <w:rPr>
+          <w:color w:val="4472C4" w:themeColor="accent5"/>
+          <w:sz w:val="28"/>
+          <w:highlight w:val="none"/>
+          <w:vertAlign w:val="baseline"/>
+        </w:rPr>
+      </w:pPr>
+      <w:r>
+        <w:rPr>
+          <w:color w:val="4472C4" w:themeColor="accent5"/>
+          <w:sz w:val="28"/>
+          <w:highlight w:val="none"/>
+          <w:vertAlign w:val="baseline"/>
+        </w:rPr>
       </w:r>
       <w:r>
         <w:rPr>

</xml_diff>

<commit_message>
*Tiny* bit more work on design, need to finish explaining focus.
</commit_message>
<xml_diff>
--- a/Design.docx
+++ b/Design.docx
@@ -309,14 +309,14 @@
       <w:pPr>
         <w:rPr>
           <w:color w:val="000000"/>
-          <w:sz w:val="22"/>
+          <w:sz w:val="20"/>
           <w:highlight w:val="none"/>
         </w:rPr>
       </w:pPr>
       <w:r>
         <w:rPr>
           <w:color w:val="000000" w:themeColor="text1"/>
-          <w:sz w:val="22"/>
+          <w:sz w:val="20"/>
           <w:highlight w:val="none"/>
         </w:rPr>
         <w:t xml:space="preserve">The flowchart below describes the for loop used to calculate the gravitational force on a planet.</w:t>
@@ -324,11 +324,15 @@
       <w:r>
         <w:rPr>
           <w:color w:val="000000" w:themeColor="text1"/>
-          <w:sz w:val="22"/>
+          <w:sz w:val="20"/>
           <w:highlight w:val="none"/>
         </w:rPr>
       </w:r>
-      <w:r/>
+      <w:r>
+        <w:rPr>
+          <w:sz w:val="20"/>
+        </w:rPr>
+      </w:r>
     </w:p>
     <w:p>
       <w:pPr>
@@ -494,14 +498,14 @@
       <w:pPr>
         <w:rPr>
           <w:color w:val="000000"/>
-          <w:sz w:val="22"/>
+          <w:sz w:val="20"/>
           <w:highlight w:val="none"/>
         </w:rPr>
       </w:pPr>
       <w:r>
         <w:rPr>
           <w:color w:val="000000" w:themeColor="text1"/>
-          <w:sz w:val="22"/>
+          <w:sz w:val="20"/>
           <w:highlight w:val="none"/>
         </w:rPr>
         <w:t xml:space="preserve">The gra</w:t>
@@ -509,7 +513,7 @@
       <w:r>
         <w:rPr>
           <w:color w:val="000000" w:themeColor="text1"/>
-          <w:sz w:val="22"/>
+          <w:sz w:val="20"/>
           <w:highlight w:val="none"/>
         </w:rPr>
         <w:t xml:space="preserve">vity() method will need to take two planets as arguments. The target planet p1, the one we are working the force out for, and the other planet, p2, to work out the force from. Newton’s law of universal gravitation will be used as mentioned in the analysis:</w:t>
@@ -517,31 +521,35 @@
       <w:r>
         <w:rPr>
           <w:color w:val="000000" w:themeColor="text1"/>
-          <w:sz w:val="22"/>
+          <w:sz w:val="20"/>
           <w:highlight w:val="none"/>
         </w:rPr>
       </w:r>
-      <w:r/>
+      <w:r>
+        <w:rPr>
+          <w:sz w:val="20"/>
+        </w:rPr>
+      </w:r>
     </w:p>
     <w:p>
       <w:pPr>
         <w:rPr>
           <w:color w:val="000000"/>
-          <w:sz w:val="22"/>
+          <w:sz w:val="20"/>
           <w:highlight w:val="none"/>
         </w:rPr>
       </w:pPr>
       <w:r>
         <w:rPr>
           <w:color w:val="000000" w:themeColor="text1"/>
-          <w:sz w:val="22"/>
+          <w:sz w:val="20"/>
           <w:highlight w:val="none"/>
         </w:rPr>
       </w:r>
       <w:r>
         <w:rPr>
           <w:color w:val="000000" w:themeColor="text1"/>
-          <w:sz w:val="22"/>
+          <w:sz w:val="20"/>
           <w:highlight w:val="none"/>
         </w:rPr>
       </w:r>
@@ -551,7 +559,7 @@
           <m:r>
             <w:rPr>
               <w:rFonts w:ascii="Cambria Math" w:hAnsi="Cambria Math" w:cs="Cambria Math" w:eastAsia="Cambria Math"/>
-              <w:sz w:val="22"/>
+              <w:sz w:val="20"/>
             </w:rPr>
             <m:rPr/>
             <m:t>F=</m:t>
@@ -560,14 +568,14 @@
             <m:fPr>
               <m:ctrlPr>
                 <w:rPr>
-                  <w:sz w:val="22"/>
+                  <w:sz w:val="20"/>
                 </w:rPr>
               </m:ctrlPr>
             </m:fPr>
             <m:num>
               <m:r>
                 <w:rPr>
-                  <w:sz w:val="22"/>
+                  <w:sz w:val="20"/>
                 </w:rPr>
                 <m:rPr/>
                 <m:t>G</m:t>
@@ -578,7 +586,7 @@
                     <w:rPr>
                       <w:rFonts w:ascii="Cambria Math" w:hAnsi="Cambria Math" w:cs="Cambria Math" w:eastAsia="Cambria Math"/>
                       <w:i/>
-                      <w:sz w:val="22"/>
+                      <w:sz w:val="20"/>
                     </w:rPr>
                   </m:ctrlPr>
                 </m:sSubPr>
@@ -586,7 +594,7 @@
                   <m:r>
                     <w:rPr>
                       <w:rFonts w:ascii="Cambria Math" w:hAnsi="Cambria Math" w:cs="Cambria Math" w:eastAsia="Cambria Math" w:hint="default"/>
-                      <w:sz w:val="22"/>
+                      <w:sz w:val="20"/>
                     </w:rPr>
                     <m:rPr>
                       <m:sty m:val="i"/>
@@ -598,7 +606,7 @@
                   <m:r>
                     <w:rPr>
                       <w:rFonts w:ascii="Cambria Math" w:hAnsi="Cambria Math" w:cs="Cambria Math" w:eastAsia="Cambria Math" w:hint="default"/>
-                      <w:sz w:val="22"/>
+                      <w:sz w:val="20"/>
                     </w:rPr>
                     <m:rPr>
                       <m:sty m:val="i"/>
@@ -613,7 +621,7 @@
                     <w:rPr>
                       <w:rFonts w:ascii="Cambria Math" w:hAnsi="Cambria Math" w:cs="Cambria Math" w:eastAsia="Cambria Math"/>
                       <w:i/>
-                      <w:sz w:val="22"/>
+                      <w:sz w:val="20"/>
                     </w:rPr>
                   </m:ctrlPr>
                 </m:sSubPr>
@@ -621,7 +629,7 @@
                   <m:r>
                     <w:rPr>
                       <w:rFonts w:ascii="Cambria Math" w:hAnsi="Cambria Math" w:cs="Cambria Math" w:eastAsia="Cambria Math" w:hint="default"/>
-                      <w:sz w:val="22"/>
+                      <w:sz w:val="20"/>
                     </w:rPr>
                     <m:rPr>
                       <m:sty m:val="i"/>
@@ -633,7 +641,7 @@
                   <m:r>
                     <w:rPr>
                       <w:rFonts w:ascii="Cambria Math" w:hAnsi="Cambria Math" w:cs="Cambria Math" w:eastAsia="Cambria Math" w:hint="default"/>
-                      <w:sz w:val="22"/>
+                      <w:sz w:val="20"/>
                     </w:rPr>
                     <m:rPr>
                       <m:sty m:val="i"/>
@@ -647,7 +655,7 @@
               <m:r>
                 <w:rPr>
                   <w:rFonts w:ascii="Cambria Math" w:hAnsi="Cambria Math" w:cs="Cambria Math" w:eastAsia="Cambria Math"/>
-                  <w:sz w:val="22"/>
+                  <w:sz w:val="20"/>
                 </w:rPr>
                 <m:rPr/>
                 <m:t>r²</m:t>
@@ -659,33 +667,41 @@
       <w:r>
         <w:rPr>
           <w:color w:val="000000" w:themeColor="text1"/>
-          <w:sz w:val="22"/>
+          <w:sz w:val="20"/>
           <w:highlight w:val="none"/>
         </w:rPr>
       </w:r>
-      <w:r/>
+      <w:r>
+        <w:rPr>
+          <w:sz w:val="20"/>
+        </w:rPr>
+      </w:r>
     </w:p>
     <w:p>
       <w:pPr>
         <w:rPr>
+          <w:sz w:val="20"/>
           <w:highlight w:val="none"/>
           <w:vertAlign w:val="baseline"/>
         </w:rPr>
       </w:pPr>
       <w:r>
         <w:rPr>
+          <w:sz w:val="20"/>
           <w:highlight w:val="none"/>
         </w:rPr>
         <w:t xml:space="preserve">G is the gravitational constant, I’ll take its value from wikipedia, </w:t>
       </w:r>
       <w:r>
         <w:rPr>
+          <w:sz w:val="20"/>
           <w:highlight w:val="none"/>
         </w:rPr>
         <w:t xml:space="preserve">6.6743015*10</w:t>
       </w:r>
       <w:r>
         <w:rPr>
+          <w:sz w:val="20"/>
           <w:highlight w:val="none"/>
           <w:vertAlign w:val="superscript"/>
         </w:rPr>
@@ -693,6 +709,7 @@
       </w:r>
       <w:r>
         <w:rPr>
+          <w:sz w:val="20"/>
           <w:highlight w:val="none"/>
           <w:vertAlign w:val="baseline"/>
         </w:rPr>
@@ -700,12 +717,14 @@
       </w:r>
       <w:r>
         <w:rPr>
+          <w:sz w:val="20"/>
           <w:highlight w:val="none"/>
         </w:rPr>
         <w:t xml:space="preserve"> m</w:t>
       </w:r>
       <w:r>
         <w:rPr>
+          <w:sz w:val="20"/>
           <w:highlight w:val="none"/>
           <w:vertAlign w:val="subscript"/>
         </w:rPr>
@@ -713,6 +732,7 @@
       </w:r>
       <w:r>
         <w:rPr>
+          <w:sz w:val="20"/>
           <w:highlight w:val="none"/>
           <w:vertAlign w:val="baseline"/>
         </w:rPr>
@@ -720,6 +740,7 @@
       </w:r>
       <w:r>
         <w:rPr>
+          <w:sz w:val="20"/>
           <w:highlight w:val="none"/>
           <w:vertAlign w:val="subscript"/>
         </w:rPr>
@@ -727,6 +748,7 @@
       </w:r>
       <w:r>
         <w:rPr>
+          <w:sz w:val="20"/>
           <w:highlight w:val="none"/>
           <w:vertAlign w:val="baseline"/>
         </w:rPr>
@@ -734,21 +756,28 @@
       </w:r>
       <w:r>
         <w:rPr>
+          <w:sz w:val="20"/>
           <w:highlight w:val="none"/>
           <w:vertAlign w:val="baseline"/>
         </w:rPr>
       </w:r>
-      <w:r/>
+      <w:r>
+        <w:rPr>
+          <w:sz w:val="20"/>
+        </w:rPr>
+      </w:r>
     </w:p>
     <w:p>
       <w:pPr>
         <w:rPr>
+          <w:sz w:val="20"/>
           <w:highlight w:val="none"/>
           <w:vertAlign w:val="baseline"/>
         </w:rPr>
       </w:pPr>
       <w:r>
         <w:rPr>
+          <w:sz w:val="20"/>
           <w:highlight w:val="none"/>
           <w:vertAlign w:val="baseline"/>
         </w:rPr>
@@ -756,11 +785,16 @@
       </w:r>
       <w:r>
         <w:rPr>
+          <w:sz w:val="20"/>
           <w:highlight w:val="none"/>
           <w:vertAlign w:val="baseline"/>
         </w:rPr>
       </w:r>
-      <w:r/>
+      <w:r>
+        <w:rPr>
+          <w:sz w:val="20"/>
+        </w:rPr>
+      </w:r>
     </w:p>
     <w:p>
       <w:pPr>
@@ -829,7 +863,7 @@
       <w:r>
         <w:rPr>
           <w:color w:val="000000" w:themeColor="text1"/>
-          <w:sz w:val="22"/>
+          <w:sz w:val="20"/>
           <w:highlight w:val="none"/>
           <w:vertAlign w:val="baseline"/>
         </w:rPr>
@@ -838,7 +872,7 @@
       <w:r>
         <w:rPr>
           <w:color w:val="000000" w:themeColor="text1"/>
-          <w:sz w:val="22"/>
+          <w:sz w:val="20"/>
           <w:highlight w:val="none"/>
           <w:vertAlign w:val="baseline"/>
         </w:rPr>
@@ -847,7 +881,7 @@
       <w:r>
         <w:rPr>
           <w:color w:val="000000" w:themeColor="text1"/>
-          <w:sz w:val="22"/>
+          <w:sz w:val="20"/>
           <w:highlight w:val="none"/>
           <w:vertAlign w:val="baseline"/>
         </w:rPr>
@@ -972,7 +1006,7 @@
       <w:pPr>
         <w:rPr>
           <w:color w:val="auto"/>
-          <w:sz w:val="22"/>
+          <w:sz w:val="20"/>
           <w:highlight w:val="none"/>
           <w:vertAlign w:val="baseline"/>
         </w:rPr>
@@ -980,7 +1014,7 @@
       <w:r>
         <w:rPr>
           <w:color w:val="auto"/>
-          <w:sz w:val="22"/>
+          <w:sz w:val="20"/>
           <w:highlight w:val="none"/>
           <w:vertAlign w:val="baseline"/>
         </w:rPr>
@@ -989,12 +1023,16 @@
       <w:r>
         <w:rPr>
           <w:color w:val="auto"/>
-          <w:sz w:val="22"/>
+          <w:sz w:val="20"/>
           <w:highlight w:val="none"/>
           <w:vertAlign w:val="baseline"/>
         </w:rPr>
       </w:r>
-      <w:r/>
+      <w:r>
+        <w:rPr>
+          <w:sz w:val="20"/>
+        </w:rPr>
+      </w:r>
     </w:p>
     <w:p>
       <w:pPr>
@@ -1126,7 +1164,7 @@
     <w:p>
       <w:pPr>
         <w:rPr>
-          <w:color w:val="2F5696"/>
+          <w:color w:val="2F5696" w:themeColor="accent5" w:themeShade="BF"/>
           <w:sz w:val="22"/>
           <w:highlight w:val="none"/>
           <w:vertAlign w:val="baseline"/>
@@ -1150,6 +1188,33 @@
         </w:rPr>
       </w:r>
       <w:r/>
+    </w:p>
+    <w:p>
+      <w:pPr>
+        <w:rPr>
+          <w:color w:val="000000" w:themeColor="text1"/>
+          <w:sz w:val="20"/>
+          <w:highlight w:val="none"/>
+          <w:vertAlign w:val="baseline"/>
+        </w:rPr>
+      </w:pPr>
+      <w:r>
+        <w:rPr>
+          <w:color w:val="000000" w:themeColor="text1"/>
+          <w:sz w:val="20"/>
+          <w:highlight w:val="none"/>
+          <w:vertAlign w:val="baseline"/>
+        </w:rPr>
+        <w:t xml:space="preserve">focusAdjustment() is probably the most important part of the display. To make the physics easy, the reference frame for the coordinates will always be the </w:t>
+      </w:r>
+      <w:r>
+        <w:rPr>
+          <w:color w:val="000000" w:themeColor="text1"/>
+          <w:sz w:val="20"/>
+          <w:highlight w:val="none"/>
+          <w:vertAlign w:val="baseline"/>
+        </w:rPr>
+      </w:r>
     </w:p>
     <w:p>
       <w:pPr>

</xml_diff>

<commit_message>
A bit more design, explained scaledPos and focusAdjustment.
</commit_message>
<xml_diff>
--- a/Design.docx
+++ b/Design.docx
@@ -5,7 +5,7 @@
     <w:p>
       <w:pPr>
         <w:rPr>
-          <w:color w:val="5B9BD5" w:themeColor="accent1"/>
+          <w:color w:val="5B9BD5"/>
           <w:sz w:val="32"/>
           <w:highlight w:val="none"/>
         </w:rPr>
@@ -22,35 +22,15 @@
         <w:rPr>
           <w:color w:val="5B9BD5" w:themeColor="accent1"/>
           <w:sz w:val="32"/>
+          <w:highlight w:val="none"/>
         </w:rPr>
       </w:r>
       <w:r/>
-      <w:r>
-        <w:rPr>
-          <w:color w:val="5B9BD5" w:themeColor="accent1"/>
-          <w:sz w:val="32"/>
-          <w:highlight w:val="none"/>
-        </w:rPr>
-      </w:r>
-      <w:r>
-        <w:rPr>
-          <w:color w:val="5B9BD5" w:themeColor="accent1"/>
-          <w:sz w:val="32"/>
-          <w:highlight w:val="none"/>
-        </w:rPr>
-      </w:r>
-      <w:r>
-        <w:rPr>
-          <w:color w:val="5B9BD5" w:themeColor="accent1"/>
-          <w:sz w:val="32"/>
-          <w:highlight w:val="none"/>
-        </w:rPr>
-      </w:r>
     </w:p>
     <w:p>
       <w:pPr>
         <w:rPr>
-          <w:color w:val="000000" w:themeColor="text1"/>
+          <w:color w:val="000000"/>
           <w:sz w:val="22"/>
           <w:highlight w:val="none"/>
         </w:rPr>
@@ -70,6 +50,7 @@
           <w:highlight w:val="none"/>
         </w:rPr>
       </w:r>
+      <w:r/>
     </w:p>
     <w:p>
       <w:pPr>
@@ -323,16 +304,10 @@
       </w:r>
       <w:r>
         <w:rPr>
-          <w:color w:val="000000" w:themeColor="text1"/>
           <w:sz w:val="20"/>
-          <w:highlight w:val="none"/>
         </w:rPr>
       </w:r>
-      <w:r>
-        <w:rPr>
-          <w:sz w:val="20"/>
-        </w:rPr>
-      </w:r>
+      <w:r/>
     </w:p>
     <w:p>
       <w:pPr>
@@ -520,16 +495,10 @@
       </w:r>
       <w:r>
         <w:rPr>
-          <w:color w:val="000000" w:themeColor="text1"/>
           <w:sz w:val="20"/>
-          <w:highlight w:val="none"/>
         </w:rPr>
       </w:r>
-      <w:r>
-        <w:rPr>
-          <w:sz w:val="20"/>
-        </w:rPr>
-      </w:r>
+      <w:r/>
     </w:p>
     <w:p>
       <w:pPr>
@@ -666,16 +635,10 @@
       </m:oMathPara>
       <w:r>
         <w:rPr>
-          <w:color w:val="000000" w:themeColor="text1"/>
           <w:sz w:val="20"/>
-          <w:highlight w:val="none"/>
         </w:rPr>
       </w:r>
-      <w:r>
-        <w:rPr>
-          <w:sz w:val="20"/>
-        </w:rPr>
-      </w:r>
+      <w:r/>
     </w:p>
     <w:p>
       <w:pPr>
@@ -757,15 +720,9 @@
       <w:r>
         <w:rPr>
           <w:sz w:val="20"/>
-          <w:highlight w:val="none"/>
-          <w:vertAlign w:val="baseline"/>
         </w:rPr>
       </w:r>
-      <w:r>
-        <w:rPr>
-          <w:sz w:val="20"/>
-        </w:rPr>
-      </w:r>
+      <w:r/>
     </w:p>
     <w:p>
       <w:pPr>
@@ -786,15 +743,9 @@
       <w:r>
         <w:rPr>
           <w:sz w:val="20"/>
-          <w:highlight w:val="none"/>
-          <w:vertAlign w:val="baseline"/>
         </w:rPr>
       </w:r>
-      <w:r>
-        <w:rPr>
-          <w:sz w:val="20"/>
-        </w:rPr>
-      </w:r>
+      <w:r/>
     </w:p>
     <w:p>
       <w:pPr>
@@ -1022,17 +973,10 @@
       </w:r>
       <w:r>
         <w:rPr>
-          <w:color w:val="auto"/>
           <w:sz w:val="20"/>
-          <w:highlight w:val="none"/>
-          <w:vertAlign w:val="baseline"/>
         </w:rPr>
       </w:r>
-      <w:r>
-        <w:rPr>
-          <w:sz w:val="20"/>
-        </w:rPr>
-      </w:r>
+      <w:r/>
     </w:p>
     <w:p>
       <w:pPr>
@@ -1136,7 +1080,7 @@
     <w:p>
       <w:pPr>
         <w:rPr>
-          <w:color w:val="4472C4"/>
+          <w:color w:val="4472C4" w:themeColor="accent5"/>
           <w:sz w:val="28"/>
           <w:highlight w:val="none"/>
           <w:vertAlign w:val="baseline"/>
@@ -1177,6 +1121,149 @@
           <w:highlight w:val="none"/>
           <w:vertAlign w:val="baseline"/>
         </w:rPr>
+        <w:t xml:space="preserve">scaledPos</w:t>
+      </w:r>
+      <w:r>
+        <w:rPr>
+          <w:color w:val="2F5696" w:themeColor="accent5" w:themeShade="BF"/>
+          <w:sz w:val="24"/>
+          <w:highlight w:val="none"/>
+          <w:vertAlign w:val="baseline"/>
+        </w:rPr>
+      </w:r>
+    </w:p>
+    <w:p>
+      <w:pPr>
+        <w:rPr>
+          <w:color w:val="auto"/>
+          <w:sz w:val="20"/>
+          <w:highlight w:val="none"/>
+          <w:vertAlign w:val="baseline"/>
+        </w:rPr>
+      </w:pPr>
+      <w:r>
+        <w:rPr>
+          <w:color w:val="auto"/>
+          <w:sz w:val="20"/>
+          <w:highlight w:val="none"/>
+          <w:vertAlign w:val="baseline"/>
+        </w:rPr>
+        <w:t xml:space="preserve">Obviously drawing a solar system with a 1:1 pixel to metre scale is not very useful, as you would never be able to see anything. To fix this, the whole system will be scaled by a number, distanceScale. Changing distanceScale will change how zoomed in or zoomed out the view is. The scaling will be done relative to the centre of mass of the system, i.e. making it the origin, as it’s the closest thing to an objective reference there is. </w:t>
+      </w:r>
+      <w:r>
+        <w:rPr>
+          <w:color w:val="auto"/>
+          <w:sz w:val="20"/>
+          <w:highlight w:val="none"/>
+          <w:vertAlign w:val="baseline"/>
+        </w:rPr>
+        <w:t xml:space="preserve">This means a vector, comVector, between the centre of mass and the position being scaled will be calculated. Then the position of the centre of mass will be added to the scaled version of comVector to get the scaled position. Here is some pseudocode for it:</w:t>
+      </w:r>
+      <w:r>
+        <w:rPr>
+          <w:color w:val="auto"/>
+          <w:sz w:val="20"/>
+          <w:highlight w:val="none"/>
+          <w:vertAlign w:val="baseline"/>
+        </w:rPr>
+      </w:r>
+    </w:p>
+    <w:p>
+      <w:pPr>
+        <w:rPr>
+          <w:color w:val="auto"/>
+          <w:sz w:val="20"/>
+          <w:highlight w:val="none"/>
+          <w:vertAlign w:val="baseline"/>
+        </w:rPr>
+      </w:pPr>
+      <w:r>
+        <w:rPr>
+          <w:color w:val="auto"/>
+          <w:sz w:val="20"/>
+          <w:highlight w:val="none"/>
+          <w:vertAlign w:val="baseline"/>
+        </w:rPr>
+        <w:t xml:space="preserve">comVector &lt;— position – com(planets)</w:t>
+      </w:r>
+      <w:r>
+        <w:rPr>
+          <w:color w:val="auto"/>
+          <w:sz w:val="20"/>
+          <w:highlight w:val="none"/>
+          <w:vertAlign w:val="baseline"/>
+        </w:rPr>
+      </w:r>
+    </w:p>
+    <w:p>
+      <w:pPr>
+        <w:rPr>
+          <w:color w:val="auto"/>
+          <w:sz w:val="20"/>
+          <w:highlight w:val="none"/>
+          <w:vertAlign w:val="baseline"/>
+        </w:rPr>
+      </w:pPr>
+      <w:r>
+        <w:rPr>
+          <w:color w:val="auto"/>
+          <w:sz w:val="20"/>
+          <w:highlight w:val="none"/>
+          <w:vertAlign w:val="baseline"/>
+        </w:rPr>
+        <w:t xml:space="preserve">scaledPosition &lt;— com(planets) + distScale*comVector</w:t>
+      </w:r>
+      <w:r>
+        <w:rPr>
+          <w:color w:val="auto"/>
+          <w:sz w:val="20"/>
+          <w:highlight w:val="none"/>
+          <w:vertAlign w:val="baseline"/>
+        </w:rPr>
+      </w:r>
+    </w:p>
+    <w:p>
+      <w:pPr>
+        <w:rPr>
+          <w:color w:val="4472C4"/>
+          <w:sz w:val="28"/>
+          <w:highlight w:val="none"/>
+          <w:vertAlign w:val="baseline"/>
+        </w:rPr>
+      </w:pPr>
+      <w:r>
+        <w:rPr>
+          <w:color w:val="4472C4" w:themeColor="accent5"/>
+          <w:sz w:val="28"/>
+          <w:highlight w:val="none"/>
+          <w:vertAlign w:val="baseline"/>
+        </w:rPr>
+      </w:r>
+      <w:r>
+        <w:rPr>
+          <w:color w:val="4472C4" w:themeColor="accent5"/>
+          <w:sz w:val="28"/>
+          <w:highlight w:val="none"/>
+          <w:vertAlign w:val="baseline"/>
+        </w:rPr>
+      </w:r>
+    </w:p>
+    <w:p>
+      <w:pPr>
+        <w:rPr>
+          <w:color w:val="2F5696"/>
+          <w:sz w:val="22"/>
+          <w:highlight w:val="none"/>
+          <w:vertAlign w:val="baseline"/>
+        </w:rPr>
+      </w:pPr>
+      <w:r>
+        <w:rPr>
+          <w:color w:val="2F5696" w:themeColor="accent5" w:themeShade="BF"/>
+          <w:sz w:val="22"/>
+          <w:highlight w:val="none"/>
+          <w:vertAlign w:val="baseline"/>
+        </w:rPr>
         <w:t xml:space="preserve">focusAdjustment</w:t>
       </w:r>
       <w:r>
@@ -1205,38 +1292,12 @@
           <w:highlight w:val="none"/>
           <w:vertAlign w:val="baseline"/>
         </w:rPr>
-        <w:t xml:space="preserve">focusAdjustment() is probably the most important part of the display. To make the physics easy, the reference frame for the coordinates will always be the </w:t>
+        <w:t xml:space="preserve">focusAdjustment() is probably the most important part of the display. To make the physics easy, the reference frame for the coordinates never changes. It’s set at the start to be the current position of the centre of mass of the solar system. The solar system, however, moves over time, which means that if the camera were to stay fixed the solar system would drift out of view. This is not very helpful. To stop this, an adjustment will be calculated, which is the purpose of this function. The adjustment, which will be called focusDisplacement inside the function as that is the physical definition of it, is a vector from the centre of the screen to the scaled position of the object the camera is currently focused on. Here is pseudocode for how to calculate it:</w:t>
       </w:r>
       <w:r>
         <w:rPr>
           <w:color w:val="000000" w:themeColor="text1"/>
           <w:sz w:val="20"/>
-          <w:highlight w:val="none"/>
-          <w:vertAlign w:val="baseline"/>
-        </w:rPr>
-      </w:r>
-    </w:p>
-    <w:p>
-      <w:pPr>
-        <w:rPr>
-          <w:color w:val="4472C4"/>
-          <w:sz w:val="28"/>
-          <w:highlight w:val="none"/>
-          <w:vertAlign w:val="baseline"/>
-        </w:rPr>
-      </w:pPr>
-      <w:r>
-        <w:rPr>
-          <w:color w:val="4472C4" w:themeColor="accent5"/>
-          <w:sz w:val="28"/>
-          <w:highlight w:val="none"/>
-          <w:vertAlign w:val="baseline"/>
-        </w:rPr>
-      </w:r>
-      <w:r>
-        <w:rPr>
-          <w:color w:val="4472C4" w:themeColor="accent5"/>
-          <w:sz w:val="28"/>
           <w:highlight w:val="none"/>
           <w:vertAlign w:val="baseline"/>
         </w:rPr>
@@ -1246,25 +1307,336 @@
     <w:p>
       <w:pPr>
         <w:rPr>
-          <w:color w:val="2F5696"/>
-          <w:sz w:val="22"/>
+          <w:color w:val="000000" w:themeColor="text1"/>
+          <w:sz w:val="20"/>
           <w:highlight w:val="none"/>
           <w:vertAlign w:val="baseline"/>
         </w:rPr>
       </w:pPr>
       <w:r>
         <w:rPr>
-          <w:color w:val="2F5696" w:themeColor="accent5" w:themeShade="BF"/>
-          <w:sz w:val="22"/>
+          <w:color w:val="000000" w:themeColor="text1"/>
+          <w:sz w:val="20"/>
           <w:highlight w:val="none"/>
           <w:vertAlign w:val="baseline"/>
         </w:rPr>
-        <w:t xml:space="preserve">displayPlanets</w:t>
+        <w:t xml:space="preserve">focusDisplacement &lt;— centre – scaledPos(currentFocus)</w:t>
       </w:r>
       <w:r>
         <w:rPr>
-          <w:color w:val="2F5696" w:themeColor="accent5" w:themeShade="BF"/>
-          <w:sz w:val="22"/>
+          <w:color w:val="000000" w:themeColor="text1"/>
+          <w:sz w:val="20"/>
+          <w:highlight w:val="none"/>
+          <w:vertAlign w:val="baseline"/>
+        </w:rPr>
+      </w:r>
+    </w:p>
+    <w:p>
+      <w:pPr>
+        <w:rPr>
+          <w:color w:val="000000" w:themeColor="text1"/>
+          <w:sz w:val="20"/>
+          <w:highlight w:val="none"/>
+          <w:vertAlign w:val="baseline"/>
+        </w:rPr>
+      </w:pPr>
+      <w:r>
+        <w:rPr>
+          <w:color w:val="000000" w:themeColor="text1"/>
+          <w:sz w:val="20"/>
+          <w:highlight w:val="none"/>
+          <w:vertAlign w:val="baseline"/>
+        </w:rPr>
+        <w:t xml:space="preserve">Where centre and scaledPos(currentFocus) are both vectors.</w:t>
+      </w:r>
+      <w:r>
+        <w:rPr>
+          <w:color w:val="000000" w:themeColor="text1"/>
+          <w:sz w:val="20"/>
+          <w:highlight w:val="none"/>
+          <w:vertAlign w:val="baseline"/>
+        </w:rPr>
+      </w:r>
+    </w:p>
+    <w:p>
+      <w:pPr>
+        <w:rPr>
+          <w:color w:val="000000" w:themeColor="text1"/>
+          <w:sz w:val="20"/>
+          <w:highlight w:val="none"/>
+          <w:vertAlign w:val="baseline"/>
+        </w:rPr>
+      </w:pPr>
+      <w:r>
+        <w:rPr>
+          <w:color w:val="000000" w:themeColor="text1"/>
+          <w:sz w:val="20"/>
+          <w:highlight w:val="none"/>
+          <w:vertAlign w:val="baseline"/>
+        </w:rPr>
+        <w:t xml:space="preserve">The program will support following the centre of mass of the system, or one of the celestial bodies (planets). To support this, a numerical value, focus, which represents the current planet being looked at, as well as a boolean, comFocus, which decides whether to look at a planet or the centre of the system, will be passed into the </w:t>
+      </w:r>
+      <w:r>
+        <w:rPr>
+          <w:color w:val="000000" w:themeColor="text1"/>
+          <w:sz w:val="20"/>
+          <w:highlight w:val="none"/>
+          <w:vertAlign w:val="baseline"/>
+        </w:rPr>
+        <w:t xml:space="preserve">function as arguments. An if statement will then be used to set currentFocus, like this:</w:t>
+      </w:r>
+      <w:r>
+        <w:rPr>
+          <w:color w:val="000000" w:themeColor="text1"/>
+          <w:sz w:val="20"/>
+          <w:highlight w:val="none"/>
+          <w:vertAlign w:val="baseline"/>
+        </w:rPr>
+      </w:r>
+      <w:r>
+        <w:rPr>
+          <w:color w:val="000000" w:themeColor="text1"/>
+          <w:sz w:val="20"/>
+          <w:highlight w:val="none"/>
+          <w:vertAlign w:val="baseline"/>
+        </w:rPr>
+      </w:r>
+    </w:p>
+    <w:p>
+      <w:pPr>
+        <w:rPr>
+          <w:color w:val="000000" w:themeColor="text1"/>
+          <w:sz w:val="20"/>
+          <w:highlight w:val="none"/>
+          <w:vertAlign w:val="baseline"/>
+        </w:rPr>
+      </w:pPr>
+      <w:r>
+        <w:rPr>
+          <w:color w:val="000000" w:themeColor="text1"/>
+          <w:sz w:val="20"/>
+          <w:highlight w:val="none"/>
+          <w:vertAlign w:val="baseline"/>
+        </w:rPr>
+      </w:r>
+      <w:r>
+        <w:rPr>
+          <w:color w:val="000000" w:themeColor="text1"/>
+          <w:sz w:val="20"/>
+          <w:highlight w:val="none"/>
+          <w:vertAlign w:val="baseline"/>
+        </w:rPr>
+      </w:r>
+    </w:p>
+    <w:p>
+      <w:pPr>
+        <w:rPr>
+          <w:color w:val="000000" w:themeColor="text1"/>
+          <w:sz w:val="20"/>
+          <w:highlight w:val="none"/>
+          <w:vertAlign w:val="baseline"/>
+        </w:rPr>
+      </w:pPr>
+      <w:r>
+        <w:rPr>
+          <w:color w:val="000000" w:themeColor="text1"/>
+          <w:sz w:val="20"/>
+          <w:highlight w:val="none"/>
+          <w:vertAlign w:val="baseline"/>
+        </w:rPr>
+        <w:t xml:space="preserve">IF comFocus THEN</w:t>
+      </w:r>
+      <w:r>
+        <w:rPr>
+          <w:color w:val="000000" w:themeColor="text1"/>
+          <w:sz w:val="20"/>
+          <w:highlight w:val="none"/>
+          <w:vertAlign w:val="baseline"/>
+        </w:rPr>
+      </w:r>
+    </w:p>
+    <w:p>
+      <w:pPr>
+        <w:rPr>
+          <w:color w:val="000000" w:themeColor="text1"/>
+          <w:sz w:val="20"/>
+          <w:highlight w:val="none"/>
+          <w:vertAlign w:val="baseline"/>
+        </w:rPr>
+      </w:pPr>
+      <w:r>
+        <w:rPr>
+          <w:color w:val="000000" w:themeColor="text1"/>
+          <w:sz w:val="20"/>
+          <w:highlight w:val="none"/>
+          <w:vertAlign w:val="baseline"/>
+        </w:rPr>
+        <w:t xml:space="preserve">    currentFocus &lt;— com(planets)</w:t>
+      </w:r>
+      <w:r>
+        <w:rPr>
+          <w:color w:val="000000" w:themeColor="text1"/>
+          <w:sz w:val="20"/>
+          <w:highlight w:val="none"/>
+          <w:vertAlign w:val="baseline"/>
+        </w:rPr>
+      </w:r>
+    </w:p>
+    <w:p>
+      <w:pPr>
+        <w:rPr>
+          <w:color w:val="000000" w:themeColor="text1"/>
+          <w:sz w:val="20"/>
+          <w:highlight w:val="none"/>
+          <w:vertAlign w:val="baseline"/>
+        </w:rPr>
+      </w:pPr>
+      <w:r>
+        <w:rPr>
+          <w:color w:val="000000" w:themeColor="text1"/>
+          <w:sz w:val="20"/>
+          <w:highlight w:val="none"/>
+          <w:vertAlign w:val="baseline"/>
+        </w:rPr>
+        <w:t xml:space="preserve">ELSE </w:t>
+      </w:r>
+      <w:r>
+        <w:rPr>
+          <w:color w:val="000000" w:themeColor="text1"/>
+          <w:sz w:val="20"/>
+          <w:highlight w:val="none"/>
+          <w:vertAlign w:val="baseline"/>
+        </w:rPr>
+      </w:r>
+    </w:p>
+    <w:p>
+      <w:pPr>
+        <w:rPr>
+          <w:color w:val="000000" w:themeColor="text1"/>
+          <w:sz w:val="20"/>
+          <w:highlight w:val="none"/>
+          <w:vertAlign w:val="baseline"/>
+        </w:rPr>
+      </w:pPr>
+      <w:r>
+        <w:rPr>
+          <w:color w:val="000000" w:themeColor="text1"/>
+          <w:sz w:val="20"/>
+          <w:highlight w:val="none"/>
+          <w:vertAlign w:val="baseline"/>
+        </w:rPr>
+        <w:t xml:space="preserve">    currentFocus &lt;— planets[focus].getPos()</w:t>
+      </w:r>
+      <w:r>
+        <w:rPr>
+          <w:color w:val="000000" w:themeColor="text1"/>
+          <w:sz w:val="20"/>
+          <w:highlight w:val="none"/>
+          <w:vertAlign w:val="baseline"/>
+        </w:rPr>
+      </w:r>
+    </w:p>
+    <w:p>
+      <w:pPr>
+        <w:rPr>
+          <w:color w:val="000000" w:themeColor="text1"/>
+          <w:sz w:val="20"/>
+          <w:highlight w:val="none"/>
+          <w:vertAlign w:val="baseline"/>
+        </w:rPr>
+      </w:pPr>
+      <w:r>
+        <w:rPr>
+          <w:color w:val="000000" w:themeColor="text1"/>
+          <w:sz w:val="20"/>
+          <w:highlight w:val="none"/>
+          <w:vertAlign w:val="baseline"/>
+        </w:rPr>
+        <w:t xml:space="preserve">ENDIF</w:t>
+      </w:r>
+      <w:r>
+        <w:rPr>
+          <w:color w:val="000000" w:themeColor="text1"/>
+          <w:sz w:val="20"/>
+          <w:highlight w:val="none"/>
+          <w:vertAlign w:val="baseline"/>
+        </w:rPr>
+      </w:r>
+    </w:p>
+    <w:p>
+      <w:pPr>
+        <w:rPr>
+          <w:color w:val="000000" w:themeColor="text1"/>
+          <w:sz w:val="20"/>
+          <w:highlight w:val="none"/>
+          <w:vertAlign w:val="baseline"/>
+        </w:rPr>
+      </w:pPr>
+      <w:r>
+        <w:rPr>
+          <w:color w:val="000000" w:themeColor="text1"/>
+          <w:sz w:val="20"/>
+          <w:highlight w:val="none"/>
+          <w:vertAlign w:val="baseline"/>
+        </w:rPr>
+      </w:r>
+      <w:r>
+        <w:rPr>
+          <w:color w:val="000000" w:themeColor="text1"/>
+          <w:sz w:val="20"/>
+          <w:highlight w:val="none"/>
+          <w:vertAlign w:val="baseline"/>
+        </w:rPr>
+      </w:r>
+    </w:p>
+    <w:p>
+      <w:pPr>
+        <w:rPr>
+          <w:color w:val="000000" w:themeColor="text1"/>
+          <w:sz w:val="20"/>
+          <w:highlight w:val="none"/>
+          <w:vertAlign w:val="baseline"/>
+        </w:rPr>
+      </w:pPr>
+      <w:r>
+        <w:rPr>
+          <w:color w:val="000000" w:themeColor="text1"/>
+          <w:sz w:val="20"/>
+          <w:highlight w:val="none"/>
+          <w:vertAlign w:val="baseline"/>
+        </w:rPr>
+        <w:t xml:space="preserve">Where com() is a function used to calculate the centre of mass of the system.</w:t>
+      </w:r>
+      <w:r>
+        <w:rPr>
+          <w:color w:val="000000" w:themeColor="text1"/>
+          <w:sz w:val="20"/>
+          <w:highlight w:val="none"/>
+          <w:vertAlign w:val="baseline"/>
+        </w:rPr>
+      </w:r>
+    </w:p>
+    <w:p>
+      <w:pPr>
+        <w:rPr>
+          <w:color w:val="4472C4"/>
+          <w:sz w:val="28"/>
+          <w:highlight w:val="none"/>
+          <w:vertAlign w:val="baseline"/>
+        </w:rPr>
+      </w:pPr>
+      <w:r>
+        <w:rPr>
+          <w:color w:val="4472C4" w:themeColor="accent5"/>
+          <w:sz w:val="28"/>
+          <w:highlight w:val="none"/>
+          <w:vertAlign w:val="baseline"/>
+        </w:rPr>
+      </w:r>
+      <w:r>
+        <w:rPr>
+          <w:color w:val="4472C4" w:themeColor="accent5"/>
+          <w:sz w:val="28"/>
           <w:highlight w:val="none"/>
           <w:vertAlign w:val="baseline"/>
         </w:rPr>
@@ -1274,34 +1646,25 @@
     <w:p>
       <w:pPr>
         <w:rPr>
-          <w:color w:val="auto"/>
-          <w:sz w:val="20"/>
+          <w:color w:val="2F5696"/>
+          <w:sz w:val="22"/>
           <w:highlight w:val="none"/>
           <w:vertAlign w:val="baseline"/>
         </w:rPr>
       </w:pPr>
       <w:r>
         <w:rPr>
-          <w:color w:val="auto"/>
-          <w:sz w:val="20"/>
+          <w:color w:val="2F5696" w:themeColor="accent5" w:themeShade="BF"/>
+          <w:sz w:val="22"/>
           <w:highlight w:val="none"/>
           <w:vertAlign w:val="baseline"/>
         </w:rPr>
-        <w:t xml:space="preserve">displayPlanets() will</w:t>
+        <w:t xml:space="preserve">displayPlanets</w:t>
       </w:r>
       <w:r>
         <w:rPr>
-          <w:color w:val="auto"/>
-          <w:sz w:val="20"/>
-          <w:highlight w:val="none"/>
-          <w:vertAlign w:val="baseline"/>
-        </w:rPr>
-        <w:t xml:space="preserve"> simply run a for loop through the list of planets and draws them all using drawPlanet(). drawPlanet() takes position as an argument, so displayPlanets() will need to give it a position. This position will be the adjustment calculated by focusAdjustment().</w:t>
-      </w:r>
-      <w:r>
-        <w:rPr>
-          <w:color w:val="auto"/>
-          <w:sz w:val="20"/>
+          <w:color w:val="2F5696" w:themeColor="accent5" w:themeShade="BF"/>
+          <w:sz w:val="22"/>
           <w:highlight w:val="none"/>
           <w:vertAlign w:val="baseline"/>
         </w:rPr>
@@ -1324,6 +1687,7 @@
           <w:highlight w:val="none"/>
           <w:vertAlign w:val="baseline"/>
         </w:rPr>
+        <w:t xml:space="preserve">displayPlanets() will</w:t>
       </w:r>
       <w:r>
         <w:rPr>
@@ -1332,8 +1696,97 @@
           <w:highlight w:val="none"/>
           <w:vertAlign w:val="baseline"/>
         </w:rPr>
+        <w:t xml:space="preserve"> simply run a for loop through the list of planets and draws them all using drawPlanet(). drawPlanet() takes position as an argument, so displayPlanets() will need to give it a position. This position will be calculated like this:</w:t>
       </w:r>
       <w:r/>
+      <w:r>
+        <w:rPr>
+          <w:color w:val="auto"/>
+          <w:sz w:val="20"/>
+          <w:highlight w:val="none"/>
+          <w:vertAlign w:val="baseline"/>
+        </w:rPr>
+      </w:r>
+    </w:p>
+    <w:p>
+      <w:pPr>
+        <w:rPr>
+          <w:color w:val="auto"/>
+          <w:sz w:val="20"/>
+          <w:highlight w:val="none"/>
+          <w:vertAlign w:val="baseline"/>
+        </w:rPr>
+      </w:pPr>
+      <w:r>
+        <w:rPr>
+          <w:color w:val="auto"/>
+          <w:sz w:val="20"/>
+          <w:highlight w:val="none"/>
+          <w:vertAlign w:val="baseline"/>
+        </w:rPr>
+        <w:t xml:space="preserve">position &lt;— p.getScaledPos()[:2]+adjustment[:2]</w:t>
+      </w:r>
+      <w:r>
+        <w:rPr>
+          <w:color w:val="auto"/>
+          <w:sz w:val="20"/>
+          <w:highlight w:val="none"/>
+          <w:vertAlign w:val="baseline"/>
+        </w:rPr>
+      </w:r>
+    </w:p>
+    <w:p>
+      <w:pPr>
+        <w:rPr>
+          <w:color w:val="auto"/>
+          <w:sz w:val="20"/>
+          <w:highlight w:val="none"/>
+          <w:vertAlign w:val="baseline"/>
+        </w:rPr>
+      </w:pPr>
+      <w:r>
+        <w:rPr>
+          <w:color w:val="auto"/>
+          <w:sz w:val="20"/>
+          <w:highlight w:val="none"/>
+          <w:vertAlign w:val="baseline"/>
+        </w:rPr>
+        <w:t xml:space="preserve">Where p is the current planet. Only the first two numbers in the coordinates are selected because the display is done in 2d to reduce computational load.</w:t>
+      </w:r>
+      <w:r>
+        <w:rPr>
+          <w:color w:val="auto"/>
+          <w:sz w:val="20"/>
+          <w:highlight w:val="none"/>
+          <w:vertAlign w:val="baseline"/>
+        </w:rPr>
+      </w:r>
+    </w:p>
+    <w:p>
+      <w:pPr>
+        <w:rPr>
+          <w:color w:val="auto"/>
+          <w:sz w:val="20"/>
+          <w:highlight w:val="none"/>
+          <w:vertAlign w:val="baseline"/>
+        </w:rPr>
+      </w:pPr>
+      <w:r>
+        <w:rPr>
+          <w:color w:val="auto"/>
+          <w:sz w:val="20"/>
+          <w:highlight w:val="none"/>
+          <w:vertAlign w:val="baseline"/>
+        </w:rPr>
+      </w:r>
+      <w:r>
+        <w:rPr>
+          <w:color w:val="auto"/>
+          <w:sz w:val="20"/>
+          <w:highlight w:val="none"/>
+          <w:vertAlign w:val="baseline"/>
+        </w:rPr>
+      </w:r>
     </w:p>
     <w:p>
       <w:pPr>

</xml_diff>

<commit_message>
Good progress on design, some cleaner code and added the moon back in.
</commit_message>
<xml_diff>
--- a/Design.docx
+++ b/Design.docx
@@ -31,6 +31,14 @@
           <w:highlight w:val="none"/>
         </w:rPr>
       </w:r>
+      <w:r>
+        <w:rPr>
+          <w:color w:val="5b9bd5" w:themeColor="accent1"/>
+          <w:sz w:val="36"/>
+          <w:szCs w:val="36"/>
+          <w:highlight w:val="none"/>
+        </w:rPr>
+      </w:r>
     </w:p>
     <w:p>
       <w:pPr>
@@ -61,6 +69,14 @@
           <w:highlight w:val="none"/>
         </w:rPr>
       </w:r>
+      <w:r>
+        <w:rPr>
+          <w:color w:val="5b9bd5" w:themeColor="accent1"/>
+          <w:sz w:val="32"/>
+          <w:szCs w:val="32"/>
+          <w:highlight w:val="none"/>
+        </w:rPr>
+      </w:r>
     </w:p>
     <w:p>
       <w:pPr>
@@ -81,7 +97,7 @@
           <w:szCs w:val="22"/>
           <w:highlight w:val="none"/>
         </w:rPr>
-        <w:t xml:space="preserve">Physics, especially gravity, relies heavily on vectors. Because of this, some way to implement vectors is needed. I will use arrays from the numpy module as they support vector addition and subtraction, which is very useful. There are a few vector operations that my program needs, these will be implemented in a separate file from the main one and imported as a module. The four operations needed are:</w:t>
+        <w:t xml:space="preserve">Physics, especially gravity, relies heavily on vectors. Because of this, some way to implement vectors is needed. I will use arrays from the numpy</w:t>
       </w:r>
       <w:r>
         <w:rPr>
@@ -90,11 +106,28 @@
           <w:szCs w:val="22"/>
           <w:highlight w:val="none"/>
         </w:rPr>
+        <w:t xml:space="preserve"> module as they support vector addition and subtraction, which is very useful. There are a few vector operations that my program needs, these will be implemented in a separate file from the main one and imported as a module. The four operations needed are:</w:t>
+      </w:r>
+      <w:r>
+        <w:rPr>
+          <w:color w:val="000000" w:themeColor="text1"/>
+          <w:sz w:val="22"/>
+          <w:szCs w:val="22"/>
+          <w:highlight w:val="none"/>
+        </w:rPr>
+      </w:r>
+      <w:r>
+        <w:rPr>
+          <w:color w:val="000000" w:themeColor="text1"/>
+          <w:sz w:val="22"/>
+          <w:szCs w:val="22"/>
+          <w:highlight w:val="none"/>
+        </w:rPr>
       </w:r>
     </w:p>
     <w:p>
       <w:pPr>
-        <w:pStyle w:val="833"/>
+        <w:pStyle w:val="836"/>
         <w:numPr>
           <w:ilvl w:val="0"/>
           <w:numId w:val="1"/>
@@ -126,10 +159,18 @@
           <w:highlight w:val="none"/>
         </w:rPr>
       </w:r>
+      <w:r>
+        <w:rPr>
+          <w:color w:val="000000" w:themeColor="text1"/>
+          <w:sz w:val="22"/>
+          <w:szCs w:val="22"/>
+          <w:highlight w:val="none"/>
+        </w:rPr>
+      </w:r>
     </w:p>
     <w:p>
       <w:pPr>
-        <w:pStyle w:val="833"/>
+        <w:pStyle w:val="836"/>
         <w:numPr>
           <w:ilvl w:val="0"/>
           <w:numId w:val="1"/>
@@ -161,10 +202,18 @@
           <w:highlight w:val="none"/>
         </w:rPr>
       </w:r>
+      <w:r>
+        <w:rPr>
+          <w:color w:val="000000" w:themeColor="text1"/>
+          <w:sz w:val="22"/>
+          <w:szCs w:val="22"/>
+          <w:highlight w:val="none"/>
+        </w:rPr>
+      </w:r>
     </w:p>
     <w:p>
       <w:pPr>
-        <w:pStyle w:val="833"/>
+        <w:pStyle w:val="836"/>
         <w:numPr>
           <w:ilvl w:val="0"/>
           <w:numId w:val="1"/>
@@ -196,10 +245,18 @@
           <w:highlight w:val="none"/>
         </w:rPr>
       </w:r>
+      <w:r>
+        <w:rPr>
+          <w:color w:val="000000" w:themeColor="text1"/>
+          <w:sz w:val="22"/>
+          <w:szCs w:val="22"/>
+          <w:highlight w:val="none"/>
+        </w:rPr>
+      </w:r>
     </w:p>
     <w:p>
       <w:pPr>
-        <w:pStyle w:val="833"/>
+        <w:pStyle w:val="836"/>
         <w:numPr>
           <w:ilvl w:val="0"/>
           <w:numId w:val="1"/>
@@ -231,26 +288,34 @@
           <w:highlight w:val="none"/>
         </w:rPr>
       </w:r>
-    </w:p>
-    <w:p>
-      <w:pPr>
-        <w:pBdr/>
-        <w:spacing/>
-        <w:ind/>
+      <w:r>
         <w:rPr>
           <w:color w:val="000000" w:themeColor="text1"/>
           <w:sz w:val="22"/>
           <w:szCs w:val="22"/>
           <w:highlight w:val="none"/>
         </w:rPr>
-      </w:pPr>
-      <w:r>
+      </w:r>
+    </w:p>
+    <w:p>
+      <w:pPr>
+        <w:pBdr/>
+        <w:spacing/>
+        <w:ind/>
         <w:rPr>
           <w:color w:val="000000" w:themeColor="text1"/>
           <w:sz w:val="22"/>
           <w:szCs w:val="22"/>
           <w:highlight w:val="none"/>
         </w:rPr>
+      </w:pPr>
+      <w:r>
+        <w:rPr>
+          <w:color w:val="000000" w:themeColor="text1"/>
+          <w:sz w:val="22"/>
+          <w:szCs w:val="22"/>
+          <w:highlight w:val="none"/>
+        </w:rPr>
         <w:t xml:space="preserve">Luckily these are all relatively simple to implement.</w:t>
       </w:r>
       <w:r>
@@ -261,6 +326,14 @@
           <w:highlight w:val="none"/>
         </w:rPr>
       </w:r>
+      <w:r>
+        <w:rPr>
+          <w:color w:val="000000" w:themeColor="text1"/>
+          <w:sz w:val="22"/>
+          <w:szCs w:val="22"/>
+          <w:highlight w:val="none"/>
+        </w:rPr>
+      </w:r>
     </w:p>
     <w:p>
       <w:pPr>
@@ -283,16 +356,62 @@
       </w:r>
       <w:r>
         <w:rPr>
+          <w:color w:val="4472c4"/>
+          <w:sz w:val="28"/>
+          <w:highlight w:val="none"/>
+        </w:rPr>
+      </w:r>
+      <w:r>
+        <w:rPr>
+          <w:color w:val="4472c4"/>
+          <w:sz w:val="28"/>
+          <w:highlight w:val="none"/>
+        </w:rPr>
+      </w:r>
+    </w:p>
+    <w:p>
+      <w:pPr>
+        <w:pBdr/>
+        <w:spacing/>
+        <w:ind/>
+        <w:rPr>
           <w:color w:val="000000" w:themeColor="text1"/>
           <w:sz w:val="22"/>
           <w:szCs w:val="22"/>
           <w:highlight w:val="none"/>
         </w:rPr>
+      </w:pPr>
+      <w:r>
+        <w:rPr>
+          <w:color w:val="000000" w:themeColor="text1"/>
+          <w:sz w:val="22"/>
+          <w:szCs w:val="22"/>
+          <w:highlight w:val="none"/>
+        </w:rPr>
+        <w:t xml:space="preserve">The dot product between two dimensional vectors is defined as follow</w:t>
       </w:r>
       <w:r>
         <w:rPr>
-          <w:color w:val="4472c4"/>
-          <w:sz w:val="28"/>
+          <w:color w:val="000000" w:themeColor="text1"/>
+          <w:sz w:val="22"/>
+          <w:szCs w:val="22"/>
+          <w:highlight w:val="none"/>
+        </w:rPr>
+        <w:t xml:space="preserve">s:</w:t>
+      </w:r>
+      <w:r>
+        <w:rPr>
+          <w:color w:val="000000" w:themeColor="text1"/>
+          <w:sz w:val="22"/>
+          <w:szCs w:val="22"/>
+          <w:highlight w:val="none"/>
+        </w:rPr>
+      </w:r>
+      <w:r>
+        <w:rPr>
+          <w:color w:val="000000" w:themeColor="text1"/>
+          <w:sz w:val="22"/>
+          <w:szCs w:val="22"/>
           <w:highlight w:val="none"/>
         </w:rPr>
       </w:r>
@@ -316,7 +435,6 @@
           <w:szCs w:val="22"/>
           <w:highlight w:val="none"/>
         </w:rPr>
-        <w:t xml:space="preserve">The dot product between two dimensional vectors is defined as follow</w:t>
       </w:r>
       <w:r>
         <w:rPr>
@@ -325,6 +443,7 @@
           <w:szCs w:val="22"/>
           <w:highlight w:val="none"/>
         </w:rPr>
+        <w:t xml:space="preserve">(a,b) . (c,d) = ac + bd. </w:t>
       </w:r>
       <w:r>
         <w:rPr>
@@ -342,14 +461,19 @@
           <w:highlight w:val="none"/>
         </w:rPr>
       </w:r>
-      <w:r>
+    </w:p>
+    <w:p>
+      <w:pPr>
+        <w:pBdr/>
+        <w:spacing/>
+        <w:ind/>
         <w:rPr>
           <w:color w:val="000000" w:themeColor="text1"/>
           <w:sz w:val="22"/>
           <w:szCs w:val="22"/>
           <w:highlight w:val="none"/>
         </w:rPr>
-      </w:r>
+      </w:pPr>
       <w:r>
         <w:rPr>
           <w:color w:val="000000" w:themeColor="text1"/>
@@ -357,6 +481,7 @@
           <w:szCs w:val="22"/>
           <w:highlight w:val="none"/>
         </w:rPr>
+        <w:t xml:space="preserve">It’s the first element * first element + second element * second element. This pattern continues for higher dimensional vectors as well.</w:t>
       </w:r>
       <w:r>
         <w:rPr>
@@ -365,7 +490,6 @@
           <w:szCs w:val="22"/>
           <w:highlight w:val="none"/>
         </w:rPr>
-        <w:t xml:space="preserve">s:</w:t>
       </w:r>
       <w:r>
         <w:rPr>
@@ -375,14 +499,19 @@
           <w:highlight w:val="none"/>
         </w:rPr>
       </w:r>
-      <w:r>
+    </w:p>
+    <w:p>
+      <w:pPr>
+        <w:pBdr/>
+        <w:spacing/>
+        <w:ind/>
         <w:rPr>
           <w:color w:val="000000" w:themeColor="text1"/>
           <w:sz w:val="22"/>
           <w:szCs w:val="22"/>
           <w:highlight w:val="none"/>
         </w:rPr>
-      </w:r>
+      </w:pPr>
       <w:r>
         <w:rPr>
           <w:color w:val="000000" w:themeColor="text1"/>
@@ -390,6 +519,7 @@
           <w:szCs w:val="22"/>
           <w:highlight w:val="none"/>
         </w:rPr>
+        <w:t xml:space="preserve">The dot product between vectors of different lengths is not defined, hence an if statement should be used to check the vectors are the same lengths.</w:t>
       </w:r>
       <w:r>
         <w:rPr>
@@ -407,14 +537,19 @@
           <w:highlight w:val="none"/>
         </w:rPr>
       </w:r>
-      <w:r>
+    </w:p>
+    <w:p>
+      <w:pPr>
+        <w:pBdr/>
+        <w:spacing/>
+        <w:ind/>
         <w:rPr>
           <w:color w:val="000000" w:themeColor="text1"/>
           <w:sz w:val="22"/>
           <w:szCs w:val="22"/>
           <w:highlight w:val="none"/>
         </w:rPr>
-      </w:r>
+      </w:pPr>
       <w:r>
         <w:rPr>
           <w:color w:val="000000" w:themeColor="text1"/>
@@ -422,126 +557,15 @@
           <w:szCs w:val="22"/>
           <w:highlight w:val="none"/>
         </w:rPr>
+        <w:t xml:space="preserve">Here is pseudocode for calculating the dot product:</w:t>
       </w:r>
-    </w:p>
-    <w:p>
-      <w:pPr>
-        <w:pBdr/>
-        <w:spacing/>
-        <w:ind/>
+      <w:r>
         <w:rPr>
           <w:color w:val="000000" w:themeColor="text1"/>
           <w:sz w:val="22"/>
           <w:szCs w:val="22"/>
           <w:highlight w:val="none"/>
         </w:rPr>
-      </w:pPr>
-      <w:r>
-        <w:rPr>
-          <w:color w:val="000000" w:themeColor="text1"/>
-          <w:sz w:val="22"/>
-          <w:szCs w:val="22"/>
-          <w:highlight w:val="none"/>
-        </w:rPr>
-      </w:r>
-      <w:r>
-        <w:rPr>
-          <w:color w:val="000000" w:themeColor="text1"/>
-          <w:sz w:val="22"/>
-          <w:szCs w:val="22"/>
-          <w:highlight w:val="none"/>
-        </w:rPr>
-        <w:t xml:space="preserve">(a,b) . (c,d) = ac + bd. </w:t>
-      </w:r>
-      <w:r>
-        <w:rPr>
-          <w:color w:val="000000" w:themeColor="text1"/>
-          <w:sz w:val="22"/>
-          <w:szCs w:val="22"/>
-          <w:highlight w:val="none"/>
-        </w:rPr>
-      </w:r>
-    </w:p>
-    <w:p>
-      <w:pPr>
-        <w:pBdr/>
-        <w:spacing/>
-        <w:ind/>
-        <w:rPr>
-          <w:color w:val="000000" w:themeColor="text1"/>
-          <w:sz w:val="22"/>
-          <w:szCs w:val="22"/>
-          <w:highlight w:val="none"/>
-        </w:rPr>
-      </w:pPr>
-      <w:r>
-        <w:rPr>
-          <w:color w:val="000000" w:themeColor="text1"/>
-          <w:sz w:val="22"/>
-          <w:szCs w:val="22"/>
-          <w:highlight w:val="none"/>
-        </w:rPr>
-        <w:t xml:space="preserve">It’s the first element * first element + second element * second element. This pattern continues for higher dimensional vectors as well.</w:t>
-      </w:r>
-      <w:r>
-        <w:rPr>
-          <w:color w:val="000000" w:themeColor="text1"/>
-          <w:sz w:val="22"/>
-          <w:szCs w:val="22"/>
-          <w:highlight w:val="none"/>
-        </w:rPr>
-      </w:r>
-    </w:p>
-    <w:p>
-      <w:pPr>
-        <w:pBdr/>
-        <w:spacing/>
-        <w:ind/>
-        <w:rPr>
-          <w:color w:val="000000" w:themeColor="text1"/>
-          <w:sz w:val="22"/>
-          <w:szCs w:val="22"/>
-          <w:highlight w:val="none"/>
-        </w:rPr>
-      </w:pPr>
-      <w:r>
-        <w:rPr>
-          <w:color w:val="000000" w:themeColor="text1"/>
-          <w:sz w:val="22"/>
-          <w:szCs w:val="22"/>
-          <w:highlight w:val="none"/>
-        </w:rPr>
-        <w:t xml:space="preserve">The dot product between vectors of different lengths is not defined, hence an if statement should be used to check the vectors are the same lengths.</w:t>
-      </w:r>
-      <w:r>
-        <w:rPr>
-          <w:color w:val="000000" w:themeColor="text1"/>
-          <w:sz w:val="22"/>
-          <w:szCs w:val="22"/>
-          <w:highlight w:val="none"/>
-        </w:rPr>
-      </w:r>
-    </w:p>
-    <w:p>
-      <w:pPr>
-        <w:pBdr/>
-        <w:spacing/>
-        <w:ind/>
-        <w:rPr>
-          <w:color w:val="000000" w:themeColor="text1"/>
-          <w:sz w:val="22"/>
-          <w:szCs w:val="22"/>
-          <w:highlight w:val="none"/>
-        </w:rPr>
-      </w:pPr>
-      <w:r>
-        <w:rPr>
-          <w:color w:val="000000" w:themeColor="text1"/>
-          <w:sz w:val="22"/>
-          <w:szCs w:val="22"/>
-          <w:highlight w:val="none"/>
-        </w:rPr>
-        <w:t xml:space="preserve">Here is pseudocode for calculating the dot product:</w:t>
       </w:r>
       <w:r>
         <w:rPr>
@@ -577,7 +601,7 @@
           <mc:Choice Requires="wpg">
             <w:drawing>
               <wp:inline xmlns:wp="http://schemas.openxmlformats.org/drawingml/2006/wordprocessingDrawing" distT="0" distB="0" distL="0" distR="0">
-                <wp:extent cx="5940425" cy="2087591"/>
+                <wp:extent cx="5940425" cy="1965635"/>
                 <wp:effectExtent l="0" t="0" r="0" b="0"/>
                 <wp:docPr id="1" name=""/>
                 <wp:cNvGraphicFramePr>
@@ -587,7 +611,7 @@
                   <a:graphicData uri="http://schemas.openxmlformats.org/drawingml/2006/picture">
                     <pic:pic xmlns:pic="http://schemas.openxmlformats.org/drawingml/2006/picture">
                       <pic:nvPicPr>
-                        <pic:cNvPr id="1589201525" name=""/>
+                        <pic:cNvPr id="291036560" name=""/>
                         <pic:cNvPicPr>
                           <a:picLocks noChangeAspect="1"/>
                         </pic:cNvPicPr>
@@ -600,7 +624,7 @@
                       <pic:spPr bwMode="auto">
                         <a:xfrm>
                           <a:off x="0" y="0"/>
-                          <a:ext cx="5940424" cy="2087591"/>
+                          <a:ext cx="5940424" cy="1965634"/>
                         </a:xfrm>
                         <a:prstGeom prst="rect">
                           <a:avLst/>
@@ -633,7 +657,7 @@
                 <v:path o:extrusionok="f" gradientshapeok="t" o:connecttype="rect"/>
                 <o:lock v:ext="edit" aspectratio="t"/>
               </v:shapetype>
-              <v:shape id="_x0000_i0" o:spid="_x0000_s0" type="#_x0000_t75" style="width:467.75pt;height:164.38pt;mso-wrap-distance-left:0.00pt;mso-wrap-distance-top:0.00pt;mso-wrap-distance-right:0.00pt;mso-wrap-distance-bottom:0.00pt;z-index:1;" stroked="false">
+              <v:shape id="_x0000_i0" o:spid="_x0000_s0" type="#_x0000_t75" style="width:467.75pt;height:154.77pt;mso-wrap-distance-left:0.00pt;mso-wrap-distance-top:0.00pt;mso-wrap-distance-right:0.00pt;mso-wrap-distance-bottom:0.00pt;z-index:1;" stroked="false">
                 <v:imagedata r:id="rId9" o:title=""/>
                 <o:lock v:ext="edit" rotation="t"/>
               </v:shape>
@@ -658,6 +682,7 @@
           <w:highlight w:val="none"/>
         </w:rPr>
       </w:r>
+      <w:r/>
       <w:r>
         <w:rPr>
           <w:color w:val="000000" w:themeColor="text1"/>
@@ -666,6 +691,14 @@
           <w:highlight w:val="none"/>
         </w:rPr>
       </w:r>
+      <w:r>
+        <w:rPr>
+          <w:color w:val="000000" w:themeColor="text1"/>
+          <w:sz w:val="22"/>
+          <w:szCs w:val="22"/>
+          <w:highlight w:val="none"/>
+        </w:rPr>
+      </w:r>
     </w:p>
     <w:p>
       <w:pPr>
@@ -693,6 +726,14 @@
           <w:highlight w:val="none"/>
         </w:rPr>
       </w:r>
+      <w:r>
+        <w:rPr>
+          <w:color w:val="4472c4"/>
+          <w:sz w:val="28"/>
+          <w:szCs w:val="28"/>
+          <w:highlight w:val="none"/>
+        </w:rPr>
+      </w:r>
     </w:p>
     <w:p>
       <w:pPr>
@@ -723,8 +764,9 @@
       </w:r>
       <w:r>
         <w:rPr>
-          <w:color w:val="4472c4"/>
+          <w:color w:val="4472c4" w:themeColor="accent5"/>
           <w:sz w:val="28"/>
+          <w:szCs w:val="28"/>
           <w:highlight w:val="none"/>
         </w:rPr>
       </w:r>
@@ -749,6 +791,14 @@
           <w:highlight w:val="none"/>
         </w:rPr>
         <w:t xml:space="preserve">The magnitude of a vector is the square root of the sum of the squares of all its elements. This is easier to understand in code, here is some pseudocode:</w:t>
+      </w:r>
+      <w:r>
+        <w:rPr>
+          <w:color w:val="000000" w:themeColor="text1"/>
+          <w:sz w:val="22"/>
+          <w:szCs w:val="22"/>
+          <w:highlight w:val="none"/>
+        </w:rPr>
       </w:r>
       <w:r>
         <w:rPr>
@@ -855,11 +905,45 @@
       </w:r>
       <w:r>
         <w:rPr>
+          <w:highlight w:val="none"/>
+        </w:rPr>
+      </w:r>
+    </w:p>
+    <w:p>
+      <w:pPr>
+        <w:pBdr/>
+        <w:spacing/>
+        <w:ind/>
+        <w:rPr>
           <w:color w:val="000000" w:themeColor="text1"/>
           <w:sz w:val="22"/>
           <w:szCs w:val="22"/>
           <w:highlight w:val="none"/>
         </w:rPr>
+      </w:pPr>
+      <w:r>
+        <w:rPr>
+          <w:color w:val="000000" w:themeColor="text1"/>
+          <w:sz w:val="22"/>
+          <w:szCs w:val="22"/>
+          <w:highlight w:val="none"/>
+        </w:rPr>
+      </w:r>
+      <w:r>
+        <w:rPr>
+          <w:color w:val="000000" w:themeColor="text1"/>
+          <w:sz w:val="22"/>
+          <w:szCs w:val="22"/>
+          <w:highlight w:val="none"/>
+        </w:rPr>
+      </w:r>
+      <w:r>
+        <w:rPr>
+          <w:color w:val="000000" w:themeColor="text1"/>
+          <w:sz w:val="22"/>
+          <w:szCs w:val="22"/>
+          <w:highlight w:val="none"/>
+        </w:rPr>
       </w:r>
     </w:p>
     <w:p>
@@ -868,12 +952,58 @@
         <w:spacing/>
         <w:ind/>
         <w:rPr>
+          <w:color w:val="4472c4" w:themeColor="accent5"/>
+          <w:sz w:val="28"/>
+          <w:szCs w:val="28"/>
+          <w:highlight w:val="none"/>
+        </w:rPr>
+      </w:pPr>
+      <w:r>
+        <w:rPr>
+          <w:color w:val="4472c4" w:themeColor="accent5"/>
+          <w:sz w:val="28"/>
+          <w:highlight w:val="none"/>
+        </w:rPr>
+        <w:t xml:space="preserve">Finding a unit vector</w:t>
+      </w:r>
+      <w:r>
+        <w:rPr>
+          <w:color w:val="4472c4" w:themeColor="accent5"/>
+          <w:sz w:val="28"/>
+          <w:szCs w:val="28"/>
+          <w:highlight w:val="none"/>
+        </w:rPr>
+      </w:r>
+      <w:r>
+        <w:rPr>
+          <w:color w:val="4472c4" w:themeColor="accent5"/>
+          <w:sz w:val="28"/>
+          <w:szCs w:val="28"/>
+          <w:highlight w:val="none"/>
+        </w:rPr>
+      </w:r>
+    </w:p>
+    <w:p>
+      <w:pPr>
+        <w:pBdr/>
+        <w:spacing/>
+        <w:ind/>
+        <w:rPr>
+          <w:color w:val="4472c4" w:themeColor="accent5"/>
+          <w:sz w:val="28"/>
+          <w:szCs w:val="28"/>
+          <w:highlight w:val="none"/>
+        </w:rPr>
+      </w:pPr>
+      <w:r>
+        <w:rPr>
           <w:color w:val="000000" w:themeColor="text1"/>
           <w:sz w:val="22"/>
           <w:szCs w:val="22"/>
           <w:highlight w:val="none"/>
         </w:rPr>
-      </w:pPr>
+        <w:t xml:space="preserve">The unit of a vector is a vector in the same direction as it of magnitude 1.</w:t>
+      </w:r>
       <w:r>
         <w:rPr>
           <w:color w:val="000000" w:themeColor="text1"/>
@@ -884,11 +1014,65 @@
       </w:r>
       <w:r>
         <w:rPr>
+          <w:color w:val="4472c4" w:themeColor="accent5"/>
+          <w:sz w:val="28"/>
+          <w:szCs w:val="28"/>
+          <w:highlight w:val="none"/>
+        </w:rPr>
+      </w:r>
+    </w:p>
+    <w:p>
+      <w:pPr>
+        <w:pBdr/>
+        <w:spacing/>
+        <w:ind/>
+        <w:rPr>
           <w:color w:val="000000" w:themeColor="text1"/>
           <w:sz w:val="22"/>
           <w:szCs w:val="22"/>
           <w:highlight w:val="none"/>
         </w:rPr>
+      </w:pPr>
+      <w:r>
+        <w:rPr>
+          <w:color w:val="4472c4" w:themeColor="accent5"/>
+          <w:sz w:val="28"/>
+          <w:highlight w:val="none"/>
+        </w:rPr>
+      </w:r>
+      <w:r>
+        <w:rPr>
+          <w:color w:val="000000" w:themeColor="text1"/>
+          <w:sz w:val="22"/>
+          <w:szCs w:val="22"/>
+          <w:highlight w:val="none"/>
+        </w:rPr>
+        <w:t xml:space="preserve">To find a </w:t>
+      </w:r>
+      <w:r>
+        <w:rPr>
+          <w:color w:val="000000" w:themeColor="text1"/>
+          <w:sz w:val="22"/>
+          <w:szCs w:val="22"/>
+          <w:highlight w:val="none"/>
+        </w:rPr>
+        <w:t xml:space="preserve">unit vector, simply divide every element in it by the magnitude of the vector. Numpy supports dividing whole vectors by a number, so this is even easier, just divide the vector by the magnitude. So, the unit() function will simply return vector/mag(vector)</w:t>
+      </w:r>
+      <w:r>
+        <w:rPr>
+          <w:color w:val="4472c4" w:themeColor="accent5"/>
+          <w:sz w:val="28"/>
+          <w:szCs w:val="28"/>
+          <w:highlight w:val="none"/>
+        </w:rPr>
+      </w:r>
+      <w:r>
+        <w:rPr>
+          <w:color w:val="000000" w:themeColor="text1"/>
+          <w:sz w:val="22"/>
+          <w:szCs w:val="22"/>
+          <w:highlight w:val="none"/>
+        </w:rPr>
       </w:r>
     </w:p>
     <w:p>
@@ -897,6 +1081,43 @@
         <w:spacing/>
         <w:ind/>
         <w:rPr>
+          <w:color w:val="000000" w:themeColor="text1"/>
+          <w:sz w:val="22"/>
+          <w:szCs w:val="22"/>
+          <w:highlight w:val="none"/>
+        </w:rPr>
+      </w:pPr>
+      <w:r>
+        <w:rPr>
+          <w:color w:val="000000" w:themeColor="text1"/>
+          <w:sz w:val="22"/>
+          <w:szCs w:val="22"/>
+          <w:highlight w:val="none"/>
+        </w:rPr>
+      </w:r>
+      <w:r>
+        <w:rPr>
+          <w:color w:val="000000" w:themeColor="text1"/>
+          <w:sz w:val="22"/>
+          <w:szCs w:val="22"/>
+          <w:highlight w:val="none"/>
+        </w:rPr>
+      </w:r>
+      <w:r>
+        <w:rPr>
+          <w:color w:val="000000" w:themeColor="text1"/>
+          <w:sz w:val="22"/>
+          <w:szCs w:val="22"/>
+          <w:highlight w:val="none"/>
+        </w:rPr>
+      </w:r>
+    </w:p>
+    <w:p>
+      <w:pPr>
+        <w:pBdr/>
+        <w:spacing/>
+        <w:ind/>
+        <w:rPr>
           <w:color w:val="4472c4" w:themeColor="accent5"/>
           <w:sz w:val="28"/>
           <w:szCs w:val="28"/>
@@ -905,11 +1126,20 @@
       </w:pPr>
       <w:r>
         <w:rPr>
+          <w:color w:val="000000" w:themeColor="text1"/>
+          <w:sz w:val="22"/>
+          <w:szCs w:val="22"/>
+          <w:highlight w:val="none"/>
+        </w:rPr>
+        <w:t xml:space="preserve"> </w:t>
+      </w:r>
+      <w:r>
+        <w:rPr>
           <w:color w:val="4472c4" w:themeColor="accent5"/>
           <w:sz w:val="28"/>
           <w:highlight w:val="none"/>
         </w:rPr>
-        <w:t xml:space="preserve">Finding a unit vector</w:t>
+        <w:t xml:space="preserve">Finding a normal vector</w:t>
       </w:r>
       <w:r>
         <w:rPr>
@@ -919,27 +1149,35 @@
           <w:highlight w:val="none"/>
         </w:rPr>
       </w:r>
-    </w:p>
-    <w:p>
-      <w:pPr>
-        <w:pBdr/>
-        <w:spacing/>
-        <w:ind/>
+      <w:r>
         <w:rPr>
           <w:color w:val="4472c4" w:themeColor="accent5"/>
           <w:sz w:val="28"/>
           <w:szCs w:val="28"/>
           <w:highlight w:val="none"/>
         </w:rPr>
-      </w:pPr>
-      <w:r>
+      </w:r>
+    </w:p>
+    <w:p>
+      <w:pPr>
+        <w:pBdr/>
+        <w:spacing/>
+        <w:ind/>
         <w:rPr>
           <w:color w:val="000000" w:themeColor="text1"/>
           <w:sz w:val="22"/>
           <w:szCs w:val="22"/>
           <w:highlight w:val="none"/>
         </w:rPr>
-        <w:t xml:space="preserve">The unit of a vector is a vector in the same direction as it of magnitude 1.</w:t>
+      </w:pPr>
+      <w:r>
+        <w:rPr>
+          <w:color w:val="000000" w:themeColor="text1"/>
+          <w:sz w:val="22"/>
+          <w:szCs w:val="18"/>
+          <w:highlight w:val="none"/>
+        </w:rPr>
+        <w:t xml:space="preserve">For a vector (a,b), a vector normal to that vector is (-b,a). However we want this vector to be of length 1, so that it is easy to scale. Hence we will return unit(-b,a).</w:t>
       </w:r>
       <w:r>
         <w:rPr>
@@ -949,57 +1187,35 @@
           <w:highlight w:val="none"/>
         </w:rPr>
       </w:r>
-    </w:p>
-    <w:p>
-      <w:pPr>
-        <w:pBdr/>
-        <w:spacing/>
-        <w:ind/>
+      <w:r>
         <w:rPr>
           <w:color w:val="000000" w:themeColor="text1"/>
           <w:sz w:val="22"/>
           <w:szCs w:val="22"/>
           <w:highlight w:val="none"/>
         </w:rPr>
-      </w:pPr>
-      <w:r>
-        <w:rPr>
-          <w:color w:val="4472c4" w:themeColor="accent5"/>
-          <w:sz w:val="28"/>
-          <w:highlight w:val="none"/>
-        </w:rPr>
       </w:r>
-      <w:r>
+    </w:p>
+    <w:p>
+      <w:pPr>
+        <w:pBdr/>
+        <w:spacing/>
+        <w:ind/>
         <w:rPr>
           <w:color w:val="000000" w:themeColor="text1"/>
           <w:sz w:val="22"/>
           <w:szCs w:val="22"/>
           <w:highlight w:val="none"/>
         </w:rPr>
-        <w:t xml:space="preserve">To find a unit vector, simply divide every element in it by the magnitude of the vector. Numpy supports dividing whole vectors by a number, so this is even easier, just divide the vector by the magnitude. So, the unit() function will simply return vector/mag(vector)</w:t>
-      </w:r>
+      </w:pPr>
       <w:r>
-        <w:rPr>
-          <w:color w:val="4472c4" w:themeColor="accent5"/>
-          <w:sz w:val="28"/>
-          <w:szCs w:val="28"/>
-          <w:highlight w:val="none"/>
-        </w:rPr>
-      </w:r>
-      <w:r/>
-    </w:p>
-    <w:p>
-      <w:pPr>
-        <w:pBdr/>
-        <w:spacing/>
-        <w:ind/>
         <w:rPr>
           <w:color w:val="000000" w:themeColor="text1"/>
           <w:sz w:val="22"/>
           <w:szCs w:val="22"/>
           <w:highlight w:val="none"/>
         </w:rPr>
-      </w:pPr>
+      </w:r>
       <w:r>
         <w:rPr>
           <w:color w:val="000000" w:themeColor="text1"/>
@@ -1023,59 +1239,57 @@
         <w:spacing/>
         <w:ind/>
         <w:rPr>
-          <w:color w:val="4472c4" w:themeColor="accent5"/>
-          <w:sz w:val="28"/>
-          <w:szCs w:val="28"/>
+          <w:color w:val="5b9bd5" w:themeColor="accent1"/>
+          <w:sz w:val="32"/>
+          <w:szCs w:val="32"/>
           <w:highlight w:val="none"/>
         </w:rPr>
       </w:pPr>
       <w:r>
+        <w:rPr>
+          <w:color w:val="5b9bd5" w:themeColor="accent1"/>
+          <w:sz w:val="32"/>
+          <w:highlight w:val="none"/>
+        </w:rPr>
+        <w:t xml:space="preserve">Overall system design</w:t>
+      </w:r>
+      <w:r>
+        <w:rPr>
+          <w:color w:val="5b9bd5" w:themeColor="accent1"/>
+          <w:sz w:val="32"/>
+          <w:szCs w:val="32"/>
+          <w:highlight w:val="none"/>
+        </w:rPr>
+      </w:r>
+      <w:r>
+        <w:rPr>
+          <w:color w:val="5b9bd5" w:themeColor="accent1"/>
+          <w:sz w:val="32"/>
+          <w:szCs w:val="32"/>
+          <w:highlight w:val="none"/>
+        </w:rPr>
+      </w:r>
+    </w:p>
+    <w:p>
+      <w:pPr>
+        <w:pBdr/>
+        <w:spacing/>
+        <w:ind/>
         <w:rPr>
           <w:color w:val="000000" w:themeColor="text1"/>
           <w:sz w:val="22"/>
           <w:szCs w:val="22"/>
           <w:highlight w:val="none"/>
         </w:rPr>
-        <w:t xml:space="preserve"> </w:t>
-      </w:r>
+      </w:pPr>
       <w:r>
-        <w:rPr>
-          <w:color w:val="4472c4" w:themeColor="accent5"/>
-          <w:sz w:val="28"/>
-          <w:highlight w:val="none"/>
-        </w:rPr>
-        <w:t xml:space="preserve">Finding a normal vector</w:t>
-      </w:r>
-      <w:r/>
-      <w:r>
-        <w:rPr>
-          <w:color w:val="4472c4" w:themeColor="accent5"/>
-          <w:sz w:val="28"/>
-          <w:szCs w:val="28"/>
-          <w:highlight w:val="none"/>
-        </w:rPr>
-      </w:r>
-    </w:p>
-    <w:p>
-      <w:pPr>
-        <w:pBdr/>
-        <w:spacing/>
-        <w:ind/>
         <w:rPr>
           <w:color w:val="000000" w:themeColor="text1"/>
           <w:sz w:val="22"/>
           <w:szCs w:val="22"/>
           <w:highlight w:val="none"/>
         </w:rPr>
-      </w:pPr>
-      <w:r>
-        <w:rPr>
-          <w:color w:val="000000" w:themeColor="text1"/>
-          <w:sz w:val="22"/>
-          <w:szCs w:val="18"/>
-          <w:highlight w:val="none"/>
-        </w:rPr>
-        <w:t xml:space="preserve">For a vector (a,b), a vector normal to that vector is (-b,a). However we want this vector to be of length 1, so that it is easy to scale. Hence we will return unit(-b,a).</w:t>
+        <w:t xml:space="preserve">This flowchart gives a high level overview of how my program works:</w:t>
       </w:r>
       <w:r>
         <w:rPr>
@@ -1085,115 +1299,14 @@
           <w:highlight w:val="none"/>
         </w:rPr>
       </w:r>
-    </w:p>
-    <w:p>
-      <w:pPr>
-        <w:pBdr/>
-        <w:spacing/>
-        <w:ind/>
+      <w:r>
         <w:rPr>
           <w:color w:val="000000" w:themeColor="text1"/>
           <w:sz w:val="22"/>
           <w:szCs w:val="22"/>
           <w:highlight w:val="none"/>
         </w:rPr>
-      </w:pPr>
-      <w:r>
-        <w:rPr>
-          <w:color w:val="000000" w:themeColor="text1"/>
-          <w:sz w:val="22"/>
-          <w:szCs w:val="22"/>
-          <w:highlight w:val="none"/>
-        </w:rPr>
       </w:r>
-      <w:r>
-        <w:rPr>
-          <w:color w:val="000000" w:themeColor="text1"/>
-          <w:sz w:val="22"/>
-          <w:szCs w:val="22"/>
-          <w:highlight w:val="none"/>
-        </w:rPr>
-      </w:r>
-    </w:p>
-    <w:p>
-      <w:pPr>
-        <w:pBdr/>
-        <w:spacing/>
-        <w:ind/>
-        <w:rPr>
-          <w:color w:val="5b9bd5" w:themeColor="accent1"/>
-          <w:sz w:val="32"/>
-          <w:szCs w:val="32"/>
-          <w:highlight w:val="none"/>
-        </w:rPr>
-      </w:pPr>
-      <w:r>
-        <w:rPr>
-          <w:color w:val="5b9bd5" w:themeColor="accent1"/>
-          <w:sz w:val="32"/>
-          <w:highlight w:val="none"/>
-        </w:rPr>
-        <w:t xml:space="preserve">Overall system design</w:t>
-      </w:r>
-      <w:r>
-        <w:rPr>
-          <w:color w:val="000000" w:themeColor="text1"/>
-          <w:sz w:val="22"/>
-          <w:szCs w:val="22"/>
-          <w:highlight w:val="none"/>
-        </w:rPr>
-      </w:r>
-      <w:r>
-        <w:rPr>
-          <w:color w:val="5b9bd5" w:themeColor="accent1"/>
-          <w:sz w:val="32"/>
-          <w:szCs w:val="32"/>
-          <w:highlight w:val="none"/>
-        </w:rPr>
-      </w:r>
-    </w:p>
-    <w:p>
-      <w:pPr>
-        <w:pBdr/>
-        <w:spacing/>
-        <w:ind/>
-        <w:rPr>
-          <w:color w:val="000000" w:themeColor="text1"/>
-          <w:sz w:val="22"/>
-          <w:szCs w:val="22"/>
-          <w:highlight w:val="none"/>
-        </w:rPr>
-      </w:pPr>
-      <w:r>
-        <w:rPr>
-          <w:color w:val="000000" w:themeColor="text1"/>
-          <w:sz w:val="22"/>
-          <w:szCs w:val="22"/>
-          <w:highlight w:val="none"/>
-        </w:rPr>
-        <w:t xml:space="preserve">This flowchart gives a high level overview of how my program works:</w:t>
-      </w:r>
-      <w:r>
-        <w:rPr>
-          <w:color w:val="000000" w:themeColor="text1"/>
-          <w:sz w:val="22"/>
-          <w:szCs w:val="22"/>
-          <w:highlight w:val="none"/>
-        </w:rPr>
-      </w:r>
-    </w:p>
-    <w:p>
-      <w:pPr>
-        <w:pBdr/>
-        <w:spacing/>
-        <w:ind/>
-        <w:rPr>
-          <w:color w:val="000000" w:themeColor="text1"/>
-          <w:sz w:val="22"/>
-          <w:szCs w:val="22"/>
-          <w:highlight w:val="none"/>
-        </w:rPr>
-      </w:pPr>
       <w:r>
         <w:rPr>
           <w:color w:val="000000" w:themeColor="text1"/>
@@ -1223,7 +1336,7 @@
                   <a:graphicData uri="http://schemas.openxmlformats.org/drawingml/2006/picture">
                     <pic:pic xmlns:pic="http://schemas.openxmlformats.org/drawingml/2006/picture">
                       <pic:nvPicPr>
-                        <pic:cNvPr id="695972017" name=""/>
+                        <pic:cNvPr id="342439995" name=""/>
                         <pic:cNvPicPr>
                           <a:picLocks noChangeAspect="1"/>
                         </pic:cNvPicPr>
@@ -1236,7 +1349,7 @@
                       <pic:spPr bwMode="auto">
                         <a:xfrm rot="0" flipH="0" flipV="0">
                           <a:off x="0" y="0"/>
-                          <a:ext cx="5225414" cy="3346555"/>
+                          <a:ext cx="5225413" cy="3346554"/>
                         </a:xfrm>
                         <a:prstGeom prst="rect">
                           <a:avLst/>
@@ -1293,26 +1406,122 @@
           <w:highlight w:val="none"/>
         </w:rPr>
       </w:r>
-    </w:p>
-    <w:p>
-      <w:pPr>
-        <w:pBdr/>
-        <w:spacing/>
-        <w:ind/>
+      <w:r>
         <w:rPr>
           <w:color w:val="000000" w:themeColor="text1"/>
           <w:sz w:val="22"/>
           <w:szCs w:val="22"/>
           <w:highlight w:val="none"/>
         </w:rPr>
-      </w:pPr>
-      <w:r>
+      </w:r>
+    </w:p>
+    <w:p>
+      <w:pPr>
+        <w:pBdr/>
+        <w:spacing/>
+        <w:ind/>
         <w:rPr>
           <w:color w:val="000000" w:themeColor="text1"/>
           <w:sz w:val="22"/>
           <w:szCs w:val="22"/>
           <w:highlight w:val="none"/>
         </w:rPr>
+      </w:pPr>
+      <w:r>
+        <w:rPr>
+          <w:color w:val="000000" w:themeColor="text1"/>
+          <w:sz w:val="22"/>
+          <w:szCs w:val="22"/>
+          <w:highlight w:val="none"/>
+        </w:rPr>
+      </w:r>
+      <w:r>
+        <w:rPr>
+          <w:color w:val="000000" w:themeColor="text1"/>
+          <w:sz w:val="22"/>
+          <w:szCs w:val="22"/>
+          <w:highlight w:val="none"/>
+        </w:rPr>
+      </w:r>
+    </w:p>
+    <w:p>
+      <w:pPr>
+        <w:pBdr/>
+        <w:spacing/>
+        <w:ind/>
+        <w:rPr>
+          <w:color w:val="000000" w:themeColor="text1"/>
+          <w:sz w:val="22"/>
+          <w:szCs w:val="22"/>
+          <w:highlight w:val="none"/>
+        </w:rPr>
+      </w:pPr>
+      <w:r>
+        <w:rPr>
+          <w:color w:val="000000" w:themeColor="text1"/>
+          <w:sz w:val="22"/>
+          <w:szCs w:val="22"/>
+          <w:highlight w:val="none"/>
+        </w:rPr>
+        <w:t xml:space="preserve">getEphemeris() uses Nasa’s Horizons database to get the positions of the planets at the date and time the program. The program then enters its main loop. It checks for any inputs in case the user has tried to do anything, it simulates the tick and does all the physics, it displays the planets, and then it calculates the energies and outputs them to the console to demonstrate conservation of energy as requested by client.</w:t>
+      </w:r>
+      <w:r>
+        <w:rPr>
+          <w:color w:val="000000" w:themeColor="text1"/>
+          <w:sz w:val="22"/>
+          <w:szCs w:val="22"/>
+          <w:highlight w:val="none"/>
+        </w:rPr>
+      </w:r>
+    </w:p>
+    <w:p>
+      <w:pPr>
+        <w:pBdr/>
+        <w:spacing/>
+        <w:ind/>
+        <w:rPr>
+          <w:color w:val="000000" w:themeColor="text1"/>
+          <w:sz w:val="22"/>
+          <w:szCs w:val="22"/>
+          <w:highlight w:val="none"/>
+        </w:rPr>
+      </w:pPr>
+      <w:r>
+        <w:rPr>
+          <w:color w:val="000000" w:themeColor="text1"/>
+          <w:sz w:val="22"/>
+          <w:szCs w:val="22"/>
+          <w:highlight w:val="none"/>
+        </w:rPr>
+      </w:r>
+      <w:r>
+        <w:rPr>
+          <w:color w:val="000000" w:themeColor="text1"/>
+          <w:sz w:val="22"/>
+          <w:szCs w:val="22"/>
+          <w:highlight w:val="none"/>
+        </w:rPr>
+      </w:r>
+    </w:p>
+    <w:p>
+      <w:pPr>
+        <w:pBdr/>
+        <w:spacing/>
+        <w:ind/>
+        <w:rPr>
+          <w:color w:val="000000" w:themeColor="text1"/>
+          <w:sz w:val="22"/>
+          <w:szCs w:val="22"/>
+          <w:highlight w:val="none"/>
+        </w:rPr>
+      </w:pPr>
+      <w:r>
+        <w:rPr>
+          <w:color w:val="000000" w:themeColor="text1"/>
+          <w:sz w:val="22"/>
+          <w:szCs w:val="22"/>
+          <w:highlight w:val="none"/>
+        </w:rPr>
         <w:t xml:space="preserve">I will now go into detail on the inputs, the physics (simulateTick), and display (calculating energies is very simple and doesn’t deserve its own section so will be included at the end of the physics of the section.</w:t>
       </w:r>
       <w:r>
@@ -1323,27 +1532,27 @@
           <w:highlight w:val="none"/>
         </w:rPr>
       </w:r>
-    </w:p>
-    <w:p>
-      <w:pPr>
-        <w:pBdr/>
-        <w:spacing/>
-        <w:ind/>
+      <w:r>
         <w:rPr>
           <w:color w:val="000000" w:themeColor="text1"/>
           <w:sz w:val="22"/>
           <w:szCs w:val="22"/>
           <w:highlight w:val="none"/>
         </w:rPr>
-      </w:pPr>
-      <w:r>
+      </w:r>
+    </w:p>
+    <w:p>
+      <w:pPr>
+        <w:pBdr/>
+        <w:spacing/>
+        <w:ind/>
         <w:rPr>
           <w:color w:val="000000" w:themeColor="text1"/>
           <w:sz w:val="22"/>
           <w:szCs w:val="22"/>
           <w:highlight w:val="none"/>
         </w:rPr>
-      </w:r>
+      </w:pPr>
       <w:r>
         <w:rPr>
           <w:color w:val="000000" w:themeColor="text1"/>
@@ -1352,6 +1561,22 @@
           <w:highlight w:val="none"/>
         </w:rPr>
       </w:r>
+      <w:r>
+        <w:rPr>
+          <w:color w:val="000000" w:themeColor="text1"/>
+          <w:sz w:val="22"/>
+          <w:szCs w:val="22"/>
+          <w:highlight w:val="none"/>
+        </w:rPr>
+      </w:r>
+      <w:r>
+        <w:rPr>
+          <w:color w:val="000000" w:themeColor="text1"/>
+          <w:sz w:val="22"/>
+          <w:szCs w:val="22"/>
+          <w:highlight w:val="none"/>
+        </w:rPr>
+      </w:r>
     </w:p>
     <w:p>
       <w:pPr>
@@ -1377,6 +1602,7 @@
         <w:rPr>
           <w:color w:val="5b9bd5" w:themeColor="accent1"/>
           <w:sz w:val="32"/>
+          <w:szCs w:val="32"/>
           <w:highlight w:val="none"/>
         </w:rPr>
       </w:r>
@@ -1410,7 +1636,7 @@
       </w:r>
       <w:r>
         <w:rPr>
-          <w:color w:val="000000" w:themeColor="text1"/>
+          <w:color w:val="000000"/>
           <w:sz w:val="22"/>
           <w:highlight w:val="none"/>
         </w:rPr>
@@ -1429,30 +1655,25 @@
         <w:spacing/>
         <w:ind/>
         <w:rPr>
+          <w:color w:val="4472c4" w:themeColor="accent5"/>
+          <w:sz w:val="28"/>
+          <w:szCs w:val="28"/>
+          <w:highlight w:val="none"/>
+        </w:rPr>
+      </w:pPr>
+      <w:r>
+        <w:rPr>
           <w:color w:val="4472c4"/>
           <w:sz w:val="28"/>
           <w:highlight w:val="none"/>
         </w:rPr>
-      </w:pPr>
+        <w:t xml:space="preserve">Simulating a tick</w:t>
+      </w:r>
       <w:r>
         <w:rPr>
           <w:color w:val="4472c4" w:themeColor="accent5"/>
           <w:sz w:val="28"/>
-          <w:highlight w:val="none"/>
-        </w:rPr>
-        <w:t xml:space="preserve">Physics</w:t>
-      </w:r>
-      <w:r>
-        <w:rPr>
-          <w:color w:val="4472c4"/>
-          <w:sz w:val="28"/>
-          <w:highlight w:val="none"/>
-        </w:rPr>
-      </w:r>
-      <w:r>
-        <w:rPr>
-          <w:color w:val="4472c4"/>
-          <w:sz w:val="28"/>
+          <w:szCs w:val="28"/>
           <w:highlight w:val="none"/>
         </w:rPr>
       </w:r>
@@ -1463,6 +1684,36 @@
         <w:spacing/>
         <w:ind/>
         <w:rPr>
+          <w:color w:val="000000" w:themeColor="text1"/>
+          <w:sz w:val="22"/>
+          <w:szCs w:val="22"/>
+          <w:highlight w:val="none"/>
+        </w:rPr>
+      </w:pPr>
+      <w:r>
+        <w:rPr>
+          <w:color w:val="000000" w:themeColor="text1"/>
+          <w:sz w:val="22"/>
+          <w:szCs w:val="22"/>
+          <w:highlight w:val="none"/>
+        </w:rPr>
+        <w:t xml:space="preserve">Here I will explain the meat of the program, the part that makes the planets actually behave like planets, accurately. I will describe the behaviour of simulateTick(), which is the function that does all the physics for a single tick, as well as handling some information that will later be needed for the display part of the program. </w:t>
+      </w:r>
+      <w:r>
+        <w:rPr>
+          <w:color w:val="000000" w:themeColor="text1"/>
+          <w:sz w:val="22"/>
+          <w:szCs w:val="22"/>
+          <w:highlight w:val="none"/>
+        </w:rPr>
+      </w:r>
+    </w:p>
+    <w:p>
+      <w:pPr>
+        <w:pBdr/>
+        <w:spacing/>
+        <w:ind/>
+        <w:rPr>
           <w:color w:val="000000"/>
           <w:sz w:val="22"/>
           <w:highlight w:val="none"/>
@@ -1478,7 +1729,7 @@
       </w:r>
       <w:r>
         <w:rPr>
-          <w:color w:val="000000" w:themeColor="text1"/>
+          <w:color w:val="000000"/>
           <w:sz w:val="22"/>
           <w:highlight w:val="none"/>
         </w:rPr>
@@ -1496,12 +1747,20 @@
         <w:pBdr/>
         <w:spacing/>
         <w:ind/>
+        <w:jc w:val="left"/>
         <w:rPr>
           <w:color w:val="000000"/>
           <w:sz w:val="22"/>
           <w:highlight w:val="none"/>
         </w:rPr>
       </w:pPr>
+      <w:r>
+        <w:rPr>
+          <w:color w:val="000000" w:themeColor="text1"/>
+          <w:sz w:val="22"/>
+          <w:highlight w:val="none"/>
+        </w:rPr>
+      </w:r>
       <w:r>
         <w:rPr>
           <w:color w:val="000000" w:themeColor="text1"/>
@@ -1512,9 +1771,9 @@
           <mc:Choice Requires="wpg">
             <w:drawing>
               <wp:inline xmlns:wp="http://schemas.openxmlformats.org/drawingml/2006/wordprocessingDrawing" distT="0" distB="0" distL="0" distR="0">
-                <wp:extent cx="5940425" cy="6643995"/>
+                <wp:extent cx="6086607" cy="5966460"/>
                 <wp:effectExtent l="0" t="0" r="0" b="0"/>
-                <wp:docPr id="4" name="" hidden="0"/>
+                <wp:docPr id="4" name=""/>
                 <wp:cNvGraphicFramePr>
                   <a:graphicFrameLocks xmlns:a="http://schemas.openxmlformats.org/drawingml/2006/main" noChangeAspect="1"/>
                 </wp:cNvGraphicFramePr>
@@ -1522,7 +1781,7 @@
                   <a:graphicData uri="http://schemas.openxmlformats.org/drawingml/2006/picture">
                     <pic:pic xmlns:pic="http://schemas.openxmlformats.org/drawingml/2006/picture">
                       <pic:nvPicPr>
-                        <pic:cNvPr id="1982550454" name="" hidden="0"/>
+                        <pic:cNvPr id="1754421428" name="" hidden="0"/>
                         <pic:cNvPicPr>
                           <a:picLocks noChangeAspect="1"/>
                         </pic:cNvPicPr>
@@ -1533,9 +1792,9 @@
                         <a:stretch/>
                       </pic:blipFill>
                       <pic:spPr bwMode="auto">
-                        <a:xfrm>
+                        <a:xfrm rot="0" flipH="0" flipV="0">
                           <a:off x="0" y="0"/>
-                          <a:ext cx="5940424" cy="6643994"/>
+                          <a:ext cx="6086607" cy="5966460"/>
                         </a:xfrm>
                         <a:prstGeom prst="rect">
                           <a:avLst/>
@@ -1568,7 +1827,7 @@
                 <v:path o:extrusionok="f" gradientshapeok="t" o:connecttype="rect"/>
                 <o:lock v:ext="edit" aspectratio="t"/>
               </v:shapetype>
-              <v:shape id="_x0000_i3" o:spid="_x0000_s3" type="#_x0000_t75" style="width:467.75pt;height:523.15pt;mso-wrap-distance-left:0.00pt;mso-wrap-distance-top:0.00pt;mso-wrap-distance-right:0.00pt;mso-wrap-distance-bottom:0.00pt;z-index:1;" stroked="false">
+              <v:shape id="_x0000_i3" o:spid="_x0000_s3" type="#_x0000_t75" style="width:479.26pt;height:469.80pt;mso-wrap-distance-left:0.00pt;mso-wrap-distance-top:0.00pt;mso-wrap-distance-right:0.00pt;mso-wrap-distance-bottom:0.00pt;rotation:0;z-index:1;" stroked="false">
                 <v:imagedata r:id="rId12" o:title=""/>
                 <o:lock v:ext="edit" rotation="t"/>
               </v:shape>
@@ -1585,6 +1844,55 @@
       </w:r>
       <w:r>
         <w:rPr>
+          <w:color w:val="000000" w:themeColor="text1"/>
+          <w:sz w:val="22"/>
+          <w:highlight w:val="none"/>
+        </w:rPr>
+      </w:r>
+      <w:r>
+        <w:rPr>
+          <w:color w:val="000000" w:themeColor="text1"/>
+          <w:sz w:val="22"/>
+          <w:highlight w:val="none"/>
+        </w:rPr>
+      </w:r>
+      <w:r>
+        <w:rPr>
+          <w:color w:val="000000" w:themeColor="text1"/>
+          <w:sz w:val="22"/>
+          <w:highlight w:val="none"/>
+        </w:rPr>
+      </w:r>
+      <w:r>
+        <w:rPr>
+          <w:color w:val="000000" w:themeColor="text1"/>
+          <w:sz w:val="22"/>
+          <w:highlight w:val="none"/>
+        </w:rPr>
+      </w:r>
+      <w:r>
+        <w:rPr>
+          <w:color w:val="000000" w:themeColor="text1"/>
+          <w:sz w:val="22"/>
+          <w:highlight w:val="none"/>
+        </w:rPr>
+      </w:r>
+      <w:r>
+        <w:rPr>
+          <w:color w:val="000000" w:themeColor="text1"/>
+          <w:sz w:val="22"/>
+          <w:highlight w:val="none"/>
+        </w:rPr>
+      </w:r>
+      <w:r>
+        <w:rPr>
+          <w:color w:val="000000"/>
+          <w:sz w:val="22"/>
+          <w:highlight w:val="none"/>
+        </w:rPr>
+      </w:r>
+      <w:r>
+        <w:rPr>
           <w:color w:val="000000"/>
           <w:sz w:val="22"/>
           <w:highlight w:val="none"/>
@@ -1597,29 +1905,48 @@
         <w:spacing/>
         <w:ind/>
         <w:rPr>
+          <w:color w:val="000000" w:themeColor="text1"/>
+          <w:sz w:val="22"/>
+          <w:szCs w:val="22"/>
+          <w:highlight w:val="none"/>
+        </w:rPr>
+      </w:pPr>
+      <w:r>
+        <w:rPr>
+          <w:color w:val="000000" w:themeColor="text1"/>
+          <w:sz w:val="22"/>
+          <w:highlight w:val="none"/>
+        </w:rPr>
+        <w:t xml:space="preserve">Here, the function (simulateTick()) takes in planets, focus and comFocus. Planets is a list of all the celestial bodies, focus and comFocus are for the display and not relevant yet. simulateTick() iterates over this list to do calculations for all the planets. It sets the kinetic and potential energies of the planet to 0, they are worked out during the verlet integration and gravity calculations. </w:t>
+      </w:r>
+      <w:r>
+        <w:rPr>
           <w:color w:val="000000"/>
           <w:sz w:val="22"/>
           <w:highlight w:val="none"/>
         </w:rPr>
-      </w:pPr>
+      </w:r>
       <w:r>
         <w:rPr>
           <w:color w:val="000000" w:themeColor="text1"/>
           <w:sz w:val="22"/>
           <w:highlight w:val="none"/>
         </w:rPr>
+        <w:t xml:space="preserve">It works out the resultant gravitational force on each planet, and then uses secondLaw() to work out the acceleration on each planet. Verlet integration is then performed (explained later below) to get the new position and velocity of the planet. The resultant force on the planet is then reset to 0 so it can be calculated next tick.</w:t>
       </w:r>
       <w:r>
         <w:rPr>
+          <w:color w:val="000000"/>
+          <w:sz w:val="22"/>
+          <w:highlight w:val="none"/>
+        </w:rPr>
+      </w:r>
+      <w:r/>
+      <w:r>
+        <w:rPr>
           <w:color w:val="000000" w:themeColor="text1"/>
           <w:sz w:val="22"/>
-          <w:highlight w:val="none"/>
-        </w:rPr>
-      </w:r>
-      <w:r>
-        <w:rPr>
-          <w:color w:val="000000"/>
-          <w:sz w:val="22"/>
+          <w:szCs w:val="22"/>
           <w:highlight w:val="none"/>
         </w:rPr>
       </w:r>
@@ -1630,28 +1957,23 @@
         <w:spacing/>
         <w:ind/>
         <w:rPr>
-          <w:color w:val="000000"/>
-          <w:sz w:val="22"/>
-          <w:highlight w:val="none"/>
-        </w:rPr>
-      </w:pPr>
-      <w:r>
-        <w:rPr>
           <w:color w:val="000000" w:themeColor="text1"/>
           <w:sz w:val="22"/>
-          <w:highlight w:val="none"/>
-        </w:rPr>
+          <w:szCs w:val="22"/>
+          <w:highlight w:val="none"/>
+        </w:rPr>
+      </w:pPr>
+      <w:r>
+        <w:rPr>
+          <w:color w:val="000000" w:themeColor="text1"/>
+          <w:sz w:val="22"/>
+          <w:highlight w:val="none"/>
+        </w:rPr>
+        <w:t xml:space="preserve">The program needs to be able to draw orbital lines showing the paths of planets. To do this we will draw lots of small lines that will create what looks like a smooth trajectory. To draw the small line, we need two points. Those two points will be the position of the planet at the start of the tick, i.e. before verlet() is run (that’s when its position is updated) and its position after verlet(). These two points will be added to the lines attribute of the planet.</w:t>
       </w:r>
       <w:r>
         <w:rPr>
           <w:color w:val="000000" w:themeColor="text1"/>
-          <w:sz w:val="22"/>
-          <w:highlight w:val="none"/>
-        </w:rPr>
-      </w:r>
-      <w:r>
-        <w:rPr>
-          <w:color w:val="000000"/>
           <w:sz w:val="22"/>
           <w:highlight w:val="none"/>
         </w:rPr>
@@ -1677,7 +1999,7 @@
       </w:r>
       <w:r>
         <w:rPr>
-          <w:color w:val="000000" w:themeColor="text1"/>
+          <w:color w:val="000000"/>
           <w:sz w:val="22"/>
           <w:highlight w:val="none"/>
         </w:rPr>
@@ -1710,7 +2032,7 @@
       </w:r>
       <w:r>
         <w:rPr>
-          <w:color w:val="000000" w:themeColor="text1"/>
+          <w:color w:val="000000"/>
           <w:sz w:val="22"/>
           <w:highlight w:val="none"/>
         </w:rPr>
@@ -1746,18 +2068,20 @@
       </w:r>
       <w:r>
         <w:rPr>
-          <w:sz w:val="22"/>
-          <w:szCs w:val="24"/>
-        </w:rPr>
-      </w:r>
-      <w:r>
-        <w:rPr>
           <w:color w:val="000000"/>
           <w:sz w:val="24"/>
           <w:szCs w:val="28"/>
           <w:highlight w:val="none"/>
         </w:rPr>
       </w:r>
+      <w:r>
+        <w:rPr>
+          <w:color w:val="000000"/>
+          <w:sz w:val="24"/>
+          <w:szCs w:val="28"/>
+          <w:highlight w:val="none"/>
+        </w:rPr>
+      </w:r>
     </w:p>
     <w:p>
       <w:pPr>
@@ -1765,6 +2089,9 @@
         <w:spacing/>
         <w:ind/>
         <w:rPr>
+          <w:color w:val="4472c4" w:themeColor="accent5"/>
+          <w:sz w:val="28"/>
+          <w:szCs w:val="28"/>
           <w:highlight w:val="none"/>
         </w:rPr>
       </w:pPr>
@@ -1847,18 +2174,21 @@
           <w:highlight w:val="none"/>
         </w:rPr>
       </w:r>
-    </w:p>
-    <w:p>
-      <w:pPr>
-        <w:pBdr/>
-        <w:spacing/>
-        <w:ind/>
+      <w:r>
+        <w:rPr>
+          <w:color w:val="4472c4" w:themeColor="accent5"/>
+          <w:sz w:val="28"/>
+          <w:szCs w:val="28"/>
+          <w:highlight w:val="none"/>
+        </w:rPr>
+      </w:r>
+      <w:r>
         <w:rPr>
           <w:color w:val="4472c4"/>
           <w:sz w:val="28"/>
           <w:highlight w:val="none"/>
         </w:rPr>
-      </w:pPr>
+      </w:r>
       <w:r>
         <w:rPr>
           <w:color w:val="4472c4"/>
@@ -1870,13 +2200,12 @@
         <w:rPr>
           <w:color w:val="4472c4"/>
           <w:sz w:val="28"/>
+          <w:szCs w:val="28"/>
           <w:highlight w:val="none"/>
         </w:rPr>
       </w:r>
       <w:r>
         <w:rPr>
-          <w:color w:val="4472c4"/>
-          <w:sz w:val="28"/>
           <w:highlight w:val="none"/>
         </w:rPr>
       </w:r>
@@ -1887,6 +2216,229 @@
         <w:spacing/>
         <w:ind/>
         <w:rPr>
+          <w:highlight w:val="none"/>
+        </w:rPr>
+      </w:pPr>
+      <w:r>
+        <w:rPr>
+          <w:highlight w:val="none"/>
+        </w:rPr>
+        <w:t xml:space="preserve">Force is a vector quantity, this means to find the resultant force on a planet, you have to find all of the individual forces on it from other planets and sum them. Hence, we use a for loop to iterate through the list of planets and use the gravity() function to find the forces. We then add each force to the resultant attribute of a planet until we’ve reached the end of the list.</w:t>
+      </w:r>
+      <w:r>
+        <w:rPr>
+          <w:highlight w:val="none"/>
+        </w:rPr>
+      </w:r>
+    </w:p>
+    <w:p>
+      <w:pPr>
+        <w:pBdr/>
+        <w:spacing/>
+        <w:ind/>
+        <w:rPr>
+          <w:highlight w:val="none"/>
+        </w:rPr>
+      </w:pPr>
+      <w:r>
+        <w:rPr>
+          <w:highlight w:val="none"/>
+        </w:rPr>
+        <w:t xml:space="preserve">We know however, because of Newton’s third law, that each action has an equal and opposite reaction. This means that the force on p1 from p2 is the negative of the force on p2 from p1. So, to save some iterations, we can also subtract the calculated force from p2’s resultant force. This means that each for loop starts at the planet just after p1, rather than at the start of the list of planets every time.</w:t>
+      </w:r>
+      <w:r>
+        <w:rPr>
+          <w:highlight w:val="none"/>
+        </w:rPr>
+      </w:r>
+    </w:p>
+    <w:p>
+      <w:pPr>
+        <w:pBdr/>
+        <w:spacing/>
+        <w:ind/>
+        <w:rPr>
+          <w:highlight w:val="none"/>
+        </w:rPr>
+      </w:pPr>
+      <w:r>
+        <w:rPr>
+          <w:highlight w:val="none"/>
+        </w:rPr>
+        <w:t xml:space="preserve">Also, we want the option to display arrows illustrating the forces on the currently selected planet. To do this, we check with an if statement if the p1 or p2 are selected, and if so, we add the force acting on them from the other to their arrows attribute, and we make these arrows white.</w:t>
+      </w:r>
+      <w:r>
+        <w:rPr>
+          <w:highlight w:val="none"/>
+        </w:rPr>
+      </w:r>
+    </w:p>
+    <w:p>
+      <w:pPr>
+        <w:pBdr/>
+        <w:spacing/>
+        <w:ind/>
+        <w:rPr>
+          <w:highlight w:val="none"/>
+        </w:rPr>
+      </w:pPr>
+      <w:r>
+        <w:rPr>
+          <w:highlight w:val="none"/>
+        </w:rPr>
+        <w:t xml:space="preserve">At the end of the loop, if p1 is the selected planet, we add another arrow representing its resultant force, and make this arrow the same colour as the planet to signify that it’s the resultant.</w:t>
+      </w:r>
+      <w:r>
+        <w:rPr>
+          <w:highlight w:val="none"/>
+        </w:rPr>
+      </w:r>
+    </w:p>
+    <w:p>
+      <w:pPr>
+        <w:pBdr/>
+        <w:spacing/>
+        <w:ind/>
+        <w:rPr>
+          <w:highlight w:val="none"/>
+        </w:rPr>
+      </w:pPr>
+      <w:r>
+        <w:rPr>
+          <w:highlight w:val="none"/>
+        </w:rPr>
+        <w:t xml:space="preserve">Now that we’ve covered how simulateTick works, here is some pseudocode with comments to demonstrate it more concretely:</w:t>
+      </w:r>
+      <w:r>
+        <w:rPr>
+          <w:highlight w:val="none"/>
+        </w:rPr>
+      </w:r>
+    </w:p>
+    <w:p>
+      <w:pPr>
+        <w:pBdr/>
+        <w:spacing/>
+        <w:ind/>
+        <w:rPr>
+          <w:highlight w:val="none"/>
+        </w:rPr>
+      </w:pPr>
+      <w:r>
+        <w:rPr>
+          <w:highlight w:val="none"/>
+        </w:rPr>
+      </w:r>
+      <w:r>
+        <mc:AlternateContent>
+          <mc:Choice Requires="wpg">
+            <w:drawing>
+              <wp:inline xmlns:wp="http://schemas.openxmlformats.org/drawingml/2006/wordprocessingDrawing" distT="0" distB="0" distL="0" distR="0">
+                <wp:extent cx="5940425" cy="5368116"/>
+                <wp:effectExtent l="0" t="0" r="0" b="0"/>
+                <wp:docPr id="6" name=""/>
+                <wp:cNvGraphicFramePr>
+                  <a:graphicFrameLocks xmlns:a="http://schemas.openxmlformats.org/drawingml/2006/main" noChangeAspect="1"/>
+                </wp:cNvGraphicFramePr>
+                <a:graphic xmlns:a="http://schemas.openxmlformats.org/drawingml/2006/main">
+                  <a:graphicData uri="http://schemas.openxmlformats.org/drawingml/2006/picture">
+                    <pic:pic xmlns:pic="http://schemas.openxmlformats.org/drawingml/2006/picture">
+                      <pic:nvPicPr>
+                        <pic:cNvPr id="556544280" name=""/>
+                        <pic:cNvPicPr>
+                          <a:picLocks noChangeAspect="1"/>
+                        </pic:cNvPicPr>
+                        <pic:nvPr/>
+                      </pic:nvPicPr>
+                      <pic:blipFill>
+                        <a:blip r:embed="rId14"/>
+                        <a:stretch/>
+                      </pic:blipFill>
+                      <pic:spPr bwMode="auto">
+                        <a:xfrm>
+                          <a:off x="0" y="0"/>
+                          <a:ext cx="5940424" cy="5368115"/>
+                        </a:xfrm>
+                        <a:prstGeom prst="rect">
+                          <a:avLst/>
+                        </a:prstGeom>
+                      </pic:spPr>
+                    </pic:pic>
+                  </a:graphicData>
+                </a:graphic>
+              </wp:inline>
+            </w:drawing>
+          </mc:Choice>
+          <mc:Fallback>
+            <w:pict>
+              <v:shapetype id="_x0000_t75" coordsize="21600,21600" o:spt="75" o:preferrelative="t" path="m@4@5l@4@11@9@11@9@5xe" filled="f" stroked="f">
+                <v:stroke joinstyle="miter"/>
+                <v:formulas>
+                  <v:f eqn="if lineDrawn pixelLineWidth 0"/>
+                  <v:f eqn="sum @0 1 0"/>
+                  <v:f eqn="sum 0 0 @1"/>
+                  <v:f eqn="prod @2 1 2"/>
+                  <v:f eqn="prod @3 21600 pixelWidth"/>
+                  <v:f eqn="prod @3 21600 pixelHeight"/>
+                  <v:f eqn="sum @0 0 1"/>
+                  <v:f eqn="prod @6 1 2"/>
+                  <v:f eqn="prod @7 21600 pixelWidth"/>
+                  <v:f eqn="sum @8 21600 0"/>
+                  <v:f eqn="prod @7 21600 pixelHeight"/>
+                  <v:f eqn="sum @10 21600 0"/>
+                </v:formulas>
+                <v:path o:extrusionok="f" gradientshapeok="t" o:connecttype="rect"/>
+                <o:lock v:ext="edit" aspectratio="t"/>
+              </v:shapetype>
+              <v:shape id="_x0000_i5" o:spid="_x0000_s5" type="#_x0000_t75" style="width:467.75pt;height:422.69pt;mso-wrap-distance-left:0.00pt;mso-wrap-distance-top:0.00pt;mso-wrap-distance-right:0.00pt;mso-wrap-distance-bottom:0.00pt;z-index:1;" stroked="false">
+                <v:imagedata r:id="rId14" o:title=""/>
+                <o:lock v:ext="edit" rotation="t"/>
+              </v:shape>
+            </w:pict>
+          </mc:Fallback>
+        </mc:AlternateContent>
+      </w:r>
+      <w:r>
+        <w:rPr>
+          <w:highlight w:val="none"/>
+        </w:rPr>
+      </w:r>
+      <w:r>
+        <w:rPr>
+          <w:highlight w:val="none"/>
+        </w:rPr>
+      </w:r>
+    </w:p>
+    <w:p>
+      <w:pPr>
+        <w:pBdr/>
+        <w:spacing/>
+        <w:ind/>
+        <w:rPr>
+          <w:highlight w:val="none"/>
+        </w:rPr>
+      </w:pPr>
+      <w:r>
+        <w:rPr>
+          <w:color w:val="4472c4" w:themeColor="accent5"/>
+          <w:sz w:val="28"/>
+          <w:highlight w:val="none"/>
+        </w:rPr>
+      </w:r>
+      <w:r>
+        <w:rPr>
+          <w:color w:val="4472c4" w:themeColor="accent5"/>
+          <w:sz w:val="28"/>
+          <w:highlight w:val="none"/>
+        </w:rPr>
+      </w:r>
+    </w:p>
+    <w:p>
+      <w:pPr>
+        <w:pBdr/>
+        <w:spacing/>
+        <w:ind/>
+        <w:rPr>
           <w:color w:val="4472c4"/>
           <w:sz w:val="28"/>
           <w:highlight w:val="none"/>
@@ -1902,7 +2454,7 @@
       </w:r>
       <w:r>
         <w:rPr>
-          <w:color w:val="4472c4" w:themeColor="accent5"/>
+          <w:color w:val="4472c4"/>
           <w:sz w:val="28"/>
           <w:highlight w:val="none"/>
         </w:rPr>
@@ -1943,7 +2495,7 @@
       </w:r>
       <w:r>
         <w:rPr>
-          <w:color w:val="2f5696" w:themeColor="accent5" w:themeShade="BF"/>
+          <w:color w:val="2f5696"/>
           <w:sz w:val="24"/>
           <w:highlight w:val="none"/>
         </w:rPr>
@@ -1988,8 +2540,10 @@
       </w:r>
       <w:r>
         <w:rPr>
-          <w:sz w:val="22"/>
-          <w:szCs w:val="24"/>
+          <w:color w:val="000000"/>
+          <w:sz w:val="24"/>
+          <w:szCs w:val="28"/>
+          <w:highlight w:val="none"/>
         </w:rPr>
       </w:r>
       <w:r>
@@ -2119,18 +2673,20 @@
       </m:oMathPara>
       <w:r>
         <w:rPr>
-          <w:sz w:val="22"/>
-          <w:szCs w:val="24"/>
-        </w:rPr>
-      </w:r>
-      <w:r>
-        <w:rPr>
           <w:color w:val="000000"/>
           <w:sz w:val="24"/>
           <w:szCs w:val="28"/>
           <w:highlight w:val="none"/>
         </w:rPr>
       </w:r>
+      <w:r>
+        <w:rPr>
+          <w:color w:val="000000"/>
+          <w:sz w:val="24"/>
+          <w:szCs w:val="28"/>
+          <w:highlight w:val="none"/>
+        </w:rPr>
+      </w:r>
     </w:p>
     <w:p>
       <w:pPr>
@@ -2224,8 +2780,10 @@
       </w:r>
       <w:r>
         <w:rPr>
-          <w:sz w:val="22"/>
-          <w:szCs w:val="24"/>
+          <w:sz w:val="24"/>
+          <w:szCs w:val="28"/>
+          <w:highlight w:val="none"/>
+          <w:vertAlign w:val="baseline"/>
         </w:rPr>
       </w:r>
       <w:r>
@@ -2260,8 +2818,10 @@
       </w:r>
       <w:r>
         <w:rPr>
-          <w:sz w:val="22"/>
-          <w:szCs w:val="24"/>
+          <w:sz w:val="24"/>
+          <w:szCs w:val="28"/>
+          <w:highlight w:val="none"/>
+          <w:vertAlign w:val="baseline"/>
         </w:rPr>
       </w:r>
       <w:r>
@@ -2295,7 +2855,7 @@
       </w:r>
       <w:r>
         <w:rPr>
-          <w:color w:val="2f5696" w:themeColor="accent5" w:themeShade="BF"/>
+          <w:color w:val="2f5696"/>
           <w:sz w:val="24"/>
           <w:highlight w:val="none"/>
           <w:vertAlign w:val="baseline"/>
@@ -2333,7 +2893,7 @@
       </w:r>
       <w:r>
         <w:rPr>
-          <w:color w:val="2f5696" w:themeColor="accent5" w:themeShade="BF"/>
+          <w:color w:val="2f5696"/>
           <w:sz w:val="24"/>
           <w:highlight w:val="none"/>
           <w:vertAlign w:val="baseline"/>
@@ -2383,9 +2943,9 @@
       </w:r>
       <w:r>
         <w:rPr>
-          <w:color w:val="000000" w:themeColor="text1"/>
-          <w:sz w:val="22"/>
-          <w:szCs w:val="24"/>
+          <w:color w:val="000000"/>
+          <w:sz w:val="28"/>
+          <w:szCs w:val="28"/>
           <w:highlight w:val="none"/>
           <w:vertAlign w:val="baseline"/>
         </w:rPr>
@@ -2466,15 +3026,6 @@
       </m:oMathPara>
       <w:r>
         <w:rPr>
-          <w:color w:val="000000" w:themeColor="text1"/>
-          <w:sz w:val="24"/>
-          <w:szCs w:val="24"/>
-          <w:highlight w:val="none"/>
-          <w:vertAlign w:val="baseline"/>
-        </w:rPr>
-      </w:r>
-      <w:r>
-        <w:rPr>
           <w:color w:val="000000"/>
           <w:sz w:val="28"/>
           <w:szCs w:val="28"/>
@@ -2482,39 +3033,11 @@
           <w:vertAlign w:val="baseline"/>
         </w:rPr>
       </w:r>
-    </w:p>
-    <w:p>
-      <w:pPr>
-        <w:pBdr/>
-        <w:spacing/>
-        <w:ind/>
+      <w:r>
         <w:rPr>
           <w:color w:val="000000"/>
-          <w:sz w:val="22"/>
-          <w:highlight w:val="none"/>
-          <w:vertAlign w:val="baseline"/>
-        </w:rPr>
-      </w:pPr>
-      <w:r>
-        <w:rPr>
-          <w:color w:val="000000"/>
-          <w:sz w:val="22"/>
-          <w:highlight w:val="none"/>
-          <w:vertAlign w:val="baseline"/>
-        </w:rPr>
-      </w:r>
-      <w:r>
-        <w:rPr>
-          <w:color w:val="000000"/>
-          <w:sz w:val="22"/>
-          <w:highlight w:val="none"/>
-          <w:vertAlign w:val="baseline"/>
-        </w:rPr>
-      </w:r>
-      <w:r>
-        <w:rPr>
-          <w:color w:val="000000"/>
-          <w:sz w:val="22"/>
+          <w:sz w:val="28"/>
+          <w:szCs w:val="28"/>
           <w:highlight w:val="none"/>
           <w:vertAlign w:val="baseline"/>
         </w:rPr>
@@ -2526,6 +3049,43 @@
         <w:spacing/>
         <w:ind/>
         <w:rPr>
+          <w:color w:val="000000"/>
+          <w:sz w:val="22"/>
+          <w:highlight w:val="none"/>
+          <w:vertAlign w:val="baseline"/>
+        </w:rPr>
+      </w:pPr>
+      <w:r>
+        <w:rPr>
+          <w:color w:val="000000"/>
+          <w:sz w:val="22"/>
+          <w:highlight w:val="none"/>
+          <w:vertAlign w:val="baseline"/>
+        </w:rPr>
+      </w:r>
+      <w:r>
+        <w:rPr>
+          <w:color w:val="000000"/>
+          <w:sz w:val="22"/>
+          <w:highlight w:val="none"/>
+          <w:vertAlign w:val="baseline"/>
+        </w:rPr>
+      </w:r>
+      <w:r>
+        <w:rPr>
+          <w:color w:val="000000"/>
+          <w:sz w:val="22"/>
+          <w:highlight w:val="none"/>
+          <w:vertAlign w:val="baseline"/>
+        </w:rPr>
+      </w:r>
+    </w:p>
+    <w:p>
+      <w:pPr>
+        <w:pBdr/>
+        <w:spacing/>
+        <w:ind/>
+        <w:rPr>
           <w:color w:val="4472c4"/>
           <w:sz w:val="28"/>
           <w:highlight w:val="none"/>
@@ -2543,7 +3103,7 @@
       </w:r>
       <w:r>
         <w:rPr>
-          <w:color w:val="4472c4" w:themeColor="accent5"/>
+          <w:color w:val="4472c4"/>
           <w:sz w:val="28"/>
           <w:highlight w:val="none"/>
           <w:vertAlign w:val="baseline"/>
@@ -2583,8 +3143,11 @@
       </w:r>
       <w:r>
         <w:rPr>
-          <w:sz w:val="22"/>
-          <w:szCs w:val="24"/>
+          <w:color w:val="auto"/>
+          <w:sz w:val="24"/>
+          <w:szCs w:val="28"/>
+          <w:highlight w:val="none"/>
+          <w:vertAlign w:val="baseline"/>
         </w:rPr>
       </w:r>
       <w:r>
@@ -2630,7 +3193,7 @@
               <wp:inline xmlns:wp="http://schemas.openxmlformats.org/drawingml/2006/wordprocessingDrawing" distT="0" distB="0" distL="0" distR="0">
                 <wp:extent cx="2421916" cy="5000085"/>
                 <wp:effectExtent l="0" t="0" r="0" b="0"/>
-                <wp:docPr id="6" name="" hidden="0"/>
+                <wp:docPr id="7" name="" hidden="0"/>
                 <wp:cNvGraphicFramePr>
                   <a:graphicFrameLocks xmlns:a="http://schemas.openxmlformats.org/drawingml/2006/main" noChangeAspect="1"/>
                 </wp:cNvGraphicFramePr>
@@ -2645,7 +3208,7 @@
                         <pic:nvPr isPhoto="0" userDrawn="0"/>
                       </pic:nvPicPr>
                       <pic:blipFill>
-                        <a:blip r:embed="rId14"/>
+                        <a:blip r:embed="rId15"/>
                         <a:stretch/>
                       </pic:blipFill>
                       <pic:spPr bwMode="auto">
@@ -2684,8 +3247,8 @@
                 <v:path o:extrusionok="f" gradientshapeok="t" o:connecttype="rect"/>
                 <o:lock v:ext="edit" aspectratio="t"/>
               </v:shapetype>
-              <v:shape id="_x0000_i5" o:spid="_x0000_s5" type="#_x0000_t75" style="width:190.70pt;height:393.71pt;mso-wrap-distance-left:0.00pt;mso-wrap-distance-top:0.00pt;mso-wrap-distance-right:0.00pt;mso-wrap-distance-bottom:0.00pt;z-index:1;" stroked="false">
-                <v:imagedata r:id="rId14" o:title=""/>
+              <v:shape id="_x0000_i6" o:spid="_x0000_s6" type="#_x0000_t75" style="width:190.70pt;height:393.71pt;mso-wrap-distance-left:0.00pt;mso-wrap-distance-top:0.00pt;mso-wrap-distance-right:0.00pt;mso-wrap-distance-bottom:0.00pt;z-index:1;" stroked="false">
+                <v:imagedata r:id="rId15" o:title=""/>
                 <o:lock v:ext="edit" rotation="t"/>
               </v:shape>
             </w:pict>
@@ -2771,7 +3334,7 @@
       <w:r>
         <w:rPr>
           <w:color w:val="2f5696" w:themeColor="accent5" w:themeShade="BF"/>
-          <w:sz w:val="24"/>
+          <w:sz w:val="22"/>
           <w:highlight w:val="none"/>
           <w:vertAlign w:val="baseline"/>
         </w:rPr>
@@ -2841,8 +3404,8 @@
       <w:r>
         <w:rPr>
           <w:color w:val="auto"/>
-          <w:sz w:val="22"/>
-          <w:szCs w:val="24"/>
+          <w:sz w:val="24"/>
+          <w:szCs w:val="28"/>
           <w:highlight w:val="none"/>
           <w:vertAlign w:val="baseline"/>
         </w:rPr>
@@ -2881,7 +3444,7 @@
               <wp:inline xmlns:wp="http://schemas.openxmlformats.org/drawingml/2006/wordprocessingDrawing" distT="0" distB="0" distL="0" distR="0">
                 <wp:extent cx="5940425" cy="868688"/>
                 <wp:effectExtent l="0" t="0" r="0" b="0"/>
-                <wp:docPr id="7" name=""/>
+                <wp:docPr id="8" name=""/>
                 <wp:cNvGraphicFramePr>
                   <a:graphicFrameLocks xmlns:a="http://schemas.openxmlformats.org/drawingml/2006/main" noChangeAspect="1"/>
                 </wp:cNvGraphicFramePr>
@@ -2896,7 +3459,7 @@
                         <pic:nvPr/>
                       </pic:nvPicPr>
                       <pic:blipFill>
-                        <a:blip r:embed="rId15"/>
+                        <a:blip r:embed="rId16"/>
                         <a:stretch/>
                       </pic:blipFill>
                       <pic:spPr bwMode="auto">
@@ -2935,8 +3498,8 @@
                 <v:path o:extrusionok="f" gradientshapeok="t" o:connecttype="rect"/>
                 <o:lock v:ext="edit" aspectratio="t"/>
               </v:shapetype>
-              <v:shape id="_x0000_i6" o:spid="_x0000_s6" type="#_x0000_t75" style="width:467.75pt;height:68.40pt;mso-wrap-distance-left:0.00pt;mso-wrap-distance-top:0.00pt;mso-wrap-distance-right:0.00pt;mso-wrap-distance-bottom:0.00pt;z-index:1;" stroked="false">
-                <v:imagedata r:id="rId15" o:title=""/>
+              <v:shape id="_x0000_i7" o:spid="_x0000_s7" type="#_x0000_t75" style="width:467.75pt;height:68.40pt;mso-wrap-distance-left:0.00pt;mso-wrap-distance-top:0.00pt;mso-wrap-distance-right:0.00pt;mso-wrap-distance-bottom:0.00pt;z-index:1;" stroked="false">
+                <v:imagedata r:id="rId16" o:title=""/>
                 <o:lock v:ext="edit" rotation="t"/>
               </v:shape>
             </w:pict>
@@ -2945,33 +3508,6 @@
       </w:r>
       <w:r>
         <w:rPr>
-          <w:color w:val="4472c4" w:themeColor="accent5"/>
-          <w:sz w:val="28"/>
-          <w:highlight w:val="none"/>
-          <w:vertAlign w:val="baseline"/>
-        </w:rPr>
-      </w:r>
-      <w:r/>
-      <w:r>
-        <w:rPr>
-          <w:color w:val="4472c4" w:themeColor="accent5"/>
-          <w:sz w:val="28"/>
-          <w:highlight w:val="none"/>
-          <w:vertAlign w:val="baseline"/>
-        </w:rPr>
-      </w:r>
-      <w:r>
-        <w:rPr>
-          <w:highlight w:val="none"/>
-        </w:rPr>
-      </w:r>
-      <w:r>
-        <w:rPr>
-          <w:highlight w:val="none"/>
-        </w:rPr>
-      </w:r>
-      <w:r>
-        <w:rPr>
           <w:highlight w:val="none"/>
         </w:rPr>
       </w:r>
@@ -3000,6 +3536,11 @@
           <w:highlight w:val="none"/>
         </w:rPr>
       </w:r>
+      <w:r>
+        <w:rPr>
+          <w:highlight w:val="none"/>
+        </w:rPr>
+      </w:r>
     </w:p>
     <w:p>
       <w:pPr>
@@ -3024,7 +3565,7 @@
       </w:r>
       <w:r>
         <w:rPr>
-          <w:color w:val="2f5696" w:themeColor="accent5" w:themeShade="BF"/>
+          <w:color w:val="2f5696"/>
           <w:sz w:val="22"/>
           <w:highlight w:val="none"/>
           <w:vertAlign w:val="baseline"/>
@@ -3086,7 +3627,7 @@
         <w:rPr>
           <w:color w:val="000000" w:themeColor="text1"/>
           <w:sz w:val="22"/>
-          <w:szCs w:val="24"/>
+          <w:szCs w:val="22"/>
           <w:highlight w:val="none"/>
           <w:vertAlign w:val="baseline"/>
         </w:rPr>
@@ -3130,7 +3671,7 @@
               <wp:inline xmlns:wp="http://schemas.openxmlformats.org/drawingml/2006/wordprocessingDrawing" distT="0" distB="0" distL="0" distR="0">
                 <wp:extent cx="4543425" cy="428625"/>
                 <wp:effectExtent l="0" t="0" r="0" b="0"/>
-                <wp:docPr id="8" name=""/>
+                <wp:docPr id="9" name=""/>
                 <wp:cNvGraphicFramePr>
                   <a:graphicFrameLocks xmlns:a="http://schemas.openxmlformats.org/drawingml/2006/main" noChangeAspect="1"/>
                 </wp:cNvGraphicFramePr>
@@ -3145,7 +3686,7 @@
                         <pic:nvPr/>
                       </pic:nvPicPr>
                       <pic:blipFill>
-                        <a:blip r:embed="rId16"/>
+                        <a:blip r:embed="rId17"/>
                         <a:stretch/>
                       </pic:blipFill>
                       <pic:spPr bwMode="auto">
@@ -3184,8 +3725,8 @@
                 <v:path o:extrusionok="f" gradientshapeok="t" o:connecttype="rect"/>
                 <o:lock v:ext="edit" aspectratio="t"/>
               </v:shapetype>
-              <v:shape id="_x0000_i7" o:spid="_x0000_s7" type="#_x0000_t75" style="width:357.75pt;height:33.75pt;mso-wrap-distance-left:0.00pt;mso-wrap-distance-top:0.00pt;mso-wrap-distance-right:0.00pt;mso-wrap-distance-bottom:0.00pt;z-index:1;" stroked="false">
-                <v:imagedata r:id="rId16" o:title=""/>
+              <v:shape id="_x0000_i8" o:spid="_x0000_s8" type="#_x0000_t75" style="width:357.75pt;height:33.75pt;mso-wrap-distance-left:0.00pt;mso-wrap-distance-top:0.00pt;mso-wrap-distance-right:0.00pt;mso-wrap-distance-bottom:0.00pt;z-index:1;" stroked="false">
+                <v:imagedata r:id="rId17" o:title=""/>
                 <o:lock v:ext="edit" rotation="t"/>
               </v:shape>
             </w:pict>
@@ -3204,7 +3745,7 @@
       <w:r>
         <w:rPr>
           <w:color w:val="000000" w:themeColor="text1"/>
-          <w:sz w:val="22"/>
+          <w:sz w:val="24"/>
           <w:szCs w:val="24"/>
           <w:highlight w:val="none"/>
           <w:vertAlign w:val="baseline"/>
@@ -3237,8 +3778,8 @@
       <w:r>
         <w:rPr>
           <w:color w:val="000000" w:themeColor="text1"/>
-          <w:sz w:val="22"/>
-          <w:szCs w:val="24"/>
+          <w:sz w:val="24"/>
+          <w:szCs w:val="28"/>
           <w:highlight w:val="none"/>
           <w:vertAlign w:val="baseline"/>
         </w:rPr>
@@ -3300,7 +3841,7 @@
         <w:rPr>
           <w:color w:val="000000" w:themeColor="text1"/>
           <w:sz w:val="22"/>
-          <w:szCs w:val="24"/>
+          <w:szCs w:val="22"/>
           <w:highlight w:val="none"/>
           <w:vertAlign w:val="baseline"/>
         </w:rPr>
@@ -3344,7 +3885,7 @@
               <wp:inline xmlns:wp="http://schemas.openxmlformats.org/drawingml/2006/wordprocessingDrawing" distT="0" distB="0" distL="0" distR="0">
                 <wp:extent cx="4791075" cy="2200275"/>
                 <wp:effectExtent l="0" t="0" r="0" b="0"/>
-                <wp:docPr id="9" name=""/>
+                <wp:docPr id="10" name=""/>
                 <wp:cNvGraphicFramePr>
                   <a:graphicFrameLocks xmlns:a="http://schemas.openxmlformats.org/drawingml/2006/main" noChangeAspect="1"/>
                 </wp:cNvGraphicFramePr>
@@ -3359,7 +3900,7 @@
                         <pic:nvPr/>
                       </pic:nvPicPr>
                       <pic:blipFill>
-                        <a:blip r:embed="rId17"/>
+                        <a:blip r:embed="rId18"/>
                         <a:stretch/>
                       </pic:blipFill>
                       <pic:spPr bwMode="auto">
@@ -3398,8 +3939,8 @@
                 <v:path o:extrusionok="f" gradientshapeok="t" o:connecttype="rect"/>
                 <o:lock v:ext="edit" aspectratio="t"/>
               </v:shapetype>
-              <v:shape id="_x0000_i8" o:spid="_x0000_s8" type="#_x0000_t75" style="width:377.25pt;height:173.25pt;mso-wrap-distance-left:0.00pt;mso-wrap-distance-top:0.00pt;mso-wrap-distance-right:0.00pt;mso-wrap-distance-bottom:0.00pt;z-index:1;" stroked="false">
-                <v:imagedata r:id="rId17" o:title=""/>
+              <v:shape id="_x0000_i9" o:spid="_x0000_s9" type="#_x0000_t75" style="width:377.25pt;height:173.25pt;mso-wrap-distance-left:0.00pt;mso-wrap-distance-top:0.00pt;mso-wrap-distance-right:0.00pt;mso-wrap-distance-bottom:0.00pt;z-index:1;" stroked="false">
+                <v:imagedata r:id="rId18" o:title=""/>
                 <o:lock v:ext="edit" rotation="t"/>
               </v:shape>
             </w:pict>
@@ -3418,7 +3959,7 @@
       <w:r>
         <w:rPr>
           <w:color w:val="000000" w:themeColor="text1"/>
-          <w:sz w:val="22"/>
+          <w:sz w:val="24"/>
           <w:szCs w:val="24"/>
           <w:highlight w:val="none"/>
           <w:vertAlign w:val="baseline"/>
@@ -3450,8 +3991,8 @@
       <w:r>
         <w:rPr>
           <w:color w:val="000000" w:themeColor="text1"/>
-          <w:sz w:val="22"/>
-          <w:szCs w:val="24"/>
+          <w:sz w:val="24"/>
+          <w:szCs w:val="28"/>
           <w:highlight w:val="none"/>
           <w:vertAlign w:val="baseline"/>
         </w:rPr>
@@ -3492,8 +4033,8 @@
       <w:r>
         <w:rPr>
           <w:color w:val="000000" w:themeColor="text1"/>
-          <w:sz w:val="22"/>
-          <w:szCs w:val="24"/>
+          <w:sz w:val="24"/>
+          <w:szCs w:val="28"/>
           <w:highlight w:val="none"/>
           <w:vertAlign w:val="baseline"/>
         </w:rPr>
@@ -3530,7 +4071,7 @@
       </w:r>
       <w:r>
         <w:rPr>
-          <w:color w:val="4472c4" w:themeColor="accent5"/>
+          <w:color w:val="4472c4"/>
           <w:sz w:val="28"/>
           <w:highlight w:val="none"/>
           <w:vertAlign w:val="baseline"/>
@@ -3568,7 +4109,7 @@
       </w:r>
       <w:r>
         <w:rPr>
-          <w:color w:val="2f5696" w:themeColor="accent5" w:themeShade="BF"/>
+          <w:color w:val="2f5696"/>
           <w:sz w:val="22"/>
           <w:highlight w:val="none"/>
           <w:vertAlign w:val="baseline"/>
@@ -3619,8 +4160,8 @@
       <w:r>
         <w:rPr>
           <w:color w:val="auto"/>
-          <w:sz w:val="22"/>
-          <w:szCs w:val="24"/>
+          <w:sz w:val="24"/>
+          <w:szCs w:val="28"/>
           <w:highlight w:val="none"/>
           <w:vertAlign w:val="baseline"/>
         </w:rPr>
@@ -3658,7 +4199,7 @@
               <wp:inline xmlns:wp="http://schemas.openxmlformats.org/drawingml/2006/wordprocessingDrawing" distT="0" distB="0" distL="0" distR="0">
                 <wp:extent cx="4010025" cy="314325"/>
                 <wp:effectExtent l="0" t="0" r="0" b="0"/>
-                <wp:docPr id="10" name=""/>
+                <wp:docPr id="11" name=""/>
                 <wp:cNvGraphicFramePr>
                   <a:graphicFrameLocks xmlns:a="http://schemas.openxmlformats.org/drawingml/2006/main" noChangeAspect="1"/>
                 </wp:cNvGraphicFramePr>
@@ -3673,7 +4214,7 @@
                         <pic:nvPr/>
                       </pic:nvPicPr>
                       <pic:blipFill>
-                        <a:blip r:embed="rId18"/>
+                        <a:blip r:embed="rId19"/>
                         <a:stretch/>
                       </pic:blipFill>
                       <pic:spPr bwMode="auto">
@@ -3712,8 +4253,8 @@
                 <v:path o:extrusionok="f" gradientshapeok="t" o:connecttype="rect"/>
                 <o:lock v:ext="edit" aspectratio="t"/>
               </v:shapetype>
-              <v:shape id="_x0000_i9" o:spid="_x0000_s9" type="#_x0000_t75" style="width:315.75pt;height:24.75pt;mso-wrap-distance-left:0.00pt;mso-wrap-distance-top:0.00pt;mso-wrap-distance-right:0.00pt;mso-wrap-distance-bottom:0.00pt;z-index:1;" stroked="false">
-                <v:imagedata r:id="rId18" o:title=""/>
+              <v:shape id="_x0000_i10" o:spid="_x0000_s10" type="#_x0000_t75" style="width:315.75pt;height:24.75pt;mso-wrap-distance-left:0.00pt;mso-wrap-distance-top:0.00pt;mso-wrap-distance-right:0.00pt;mso-wrap-distance-bottom:0.00pt;z-index:1;" stroked="false">
+                <v:imagedata r:id="rId19" o:title=""/>
                 <o:lock v:ext="edit" rotation="t"/>
               </v:shape>
             </w:pict>
@@ -3729,6 +4270,7 @@
           <w:vertAlign w:val="baseline"/>
         </w:rPr>
       </w:r>
+      <w:r/>
     </w:p>
     <w:p>
       <w:pPr>
@@ -3743,7 +4285,6 @@
           <w:vertAlign w:val="baseline"/>
         </w:rPr>
       </w:pPr>
-      <w:r/>
       <w:r>
         <w:rPr>
           <w:color w:val="auto"/>
@@ -3752,7 +4293,17 @@
           <w:highlight w:val="none"/>
           <w:vertAlign w:val="baseline"/>
         </w:rPr>
-        <w:t xml:space="preserve">Where p is the planet being drawn. A for loop will be used to iterate through all planets. Adjustment is calculated by focusAdjustment(). Only the first two numbers in the coordinates are selected because the display is done in 2d to reduce computational load.</w:t>
+        <w:t xml:space="preserve">Wher</w:t>
+      </w:r>
+      <w:r>
+        <w:rPr>
+          <w:color w:val="auto"/>
+          <w:sz w:val="22"/>
+          <w:szCs w:val="24"/>
+          <w:highlight w:val="none"/>
+          <w:vertAlign w:val="baseline"/>
+        </w:rPr>
+        <w:t xml:space="preserve">e p is the planet being drawn. A for loop will be used to iterate through all planets. Adjustment is calculated by focusAdjustment(). Only the first two numbers in the coordinates are selected because the display is done in 2d to reduce computational load.</w:t>
       </w:r>
       <w:r>
         <w:rPr>
@@ -3763,40 +4314,11 @@
           <w:vertAlign w:val="baseline"/>
         </w:rPr>
       </w:r>
-      <w:r/>
-    </w:p>
-    <w:p>
-      <w:pPr>
-        <w:pBdr/>
-        <w:spacing/>
-        <w:ind/>
+      <w:r>
         <w:rPr>
           <w:color w:val="auto"/>
-          <w:sz w:val="20"/>
-          <w:highlight w:val="none"/>
-          <w:vertAlign w:val="baseline"/>
-        </w:rPr>
-      </w:pPr>
-      <w:r>
-        <w:rPr>
-          <w:color w:val="auto"/>
-          <w:sz w:val="20"/>
-          <w:highlight w:val="none"/>
-          <w:vertAlign w:val="baseline"/>
-        </w:rPr>
-      </w:r>
-      <w:r>
-        <w:rPr>
-          <w:color w:val="auto"/>
-          <w:sz w:val="20"/>
-          <w:highlight w:val="none"/>
-          <w:vertAlign w:val="baseline"/>
-        </w:rPr>
-      </w:r>
-      <w:r>
-        <w:rPr>
-          <w:color w:val="auto"/>
-          <w:sz w:val="20"/>
+          <w:sz w:val="24"/>
+          <w:szCs w:val="24"/>
           <w:highlight w:val="none"/>
           <w:vertAlign w:val="baseline"/>
         </w:rPr>
@@ -3808,6 +4330,43 @@
         <w:spacing/>
         <w:ind/>
         <w:rPr>
+          <w:color w:val="auto"/>
+          <w:sz w:val="20"/>
+          <w:highlight w:val="none"/>
+          <w:vertAlign w:val="baseline"/>
+        </w:rPr>
+      </w:pPr>
+      <w:r>
+        <w:rPr>
+          <w:color w:val="auto"/>
+          <w:sz w:val="20"/>
+          <w:highlight w:val="none"/>
+          <w:vertAlign w:val="baseline"/>
+        </w:rPr>
+      </w:r>
+      <w:r>
+        <w:rPr>
+          <w:color w:val="auto"/>
+          <w:sz w:val="20"/>
+          <w:highlight w:val="none"/>
+          <w:vertAlign w:val="baseline"/>
+        </w:rPr>
+      </w:r>
+      <w:r>
+        <w:rPr>
+          <w:color w:val="auto"/>
+          <w:sz w:val="20"/>
+          <w:highlight w:val="none"/>
+          <w:vertAlign w:val="baseline"/>
+        </w:rPr>
+      </w:r>
+    </w:p>
+    <w:p>
+      <w:pPr>
+        <w:pBdr/>
+        <w:spacing/>
+        <w:ind/>
+        <w:rPr>
           <w:color w:val="2f5696"/>
           <w:sz w:val="22"/>
           <w:highlight w:val="none"/>
@@ -3825,7 +4384,7 @@
       </w:r>
       <w:r>
         <w:rPr>
-          <w:color w:val="2f5696" w:themeColor="accent5" w:themeShade="BF"/>
+          <w:color w:val="2f5696"/>
           <w:sz w:val="22"/>
           <w:highlight w:val="none"/>
           <w:vertAlign w:val="baseline"/>
@@ -3876,8 +4435,8 @@
       <w:r>
         <w:rPr>
           <w:color w:val="auto"/>
-          <w:sz w:val="22"/>
-          <w:szCs w:val="24"/>
+          <w:sz w:val="24"/>
+          <w:szCs w:val="28"/>
           <w:highlight w:val="none"/>
           <w:vertAlign w:val="baseline"/>
         </w:rPr>
@@ -4280,11 +4839,11 @@
     <w:lsdException w:name="Bibliography" w:uiPriority="37"/>
     <w:lsdException w:name="TOC Heading" w:uiPriority="39" w:qFormat="1"/>
   </w:latentStyles>
-  <w:style w:type="paragraph" w:styleId="653">
+  <w:style w:type="paragraph" w:styleId="656">
     <w:name w:val="Heading 1"/>
-    <w:basedOn w:val="829"/>
-    <w:next w:val="829"/>
-    <w:link w:val="654"/>
+    <w:basedOn w:val="832"/>
+    <w:next w:val="832"/>
+    <w:link w:val="657"/>
     <w:uiPriority w:val="9"/>
     <w:qFormat/>
     <w:pPr>
@@ -4301,9 +4860,9 @@
       <w:szCs w:val="40"/>
     </w:rPr>
   </w:style>
-  <w:style w:type="character" w:styleId="654">
+  <w:style w:type="character" w:styleId="657">
     <w:name w:val="Heading 1 Char"/>
-    <w:link w:val="653"/>
+    <w:link w:val="656"/>
     <w:uiPriority w:val="9"/>
     <w:pPr>
       <w:pBdr/>
@@ -4316,11 +4875,11 @@
       <w:szCs w:val="40"/>
     </w:rPr>
   </w:style>
-  <w:style w:type="paragraph" w:styleId="655">
+  <w:style w:type="paragraph" w:styleId="658">
     <w:name w:val="Heading 2"/>
-    <w:basedOn w:val="829"/>
-    <w:next w:val="829"/>
-    <w:link w:val="656"/>
+    <w:basedOn w:val="832"/>
+    <w:next w:val="832"/>
+    <w:link w:val="659"/>
     <w:uiPriority w:val="9"/>
     <w:unhideWhenUsed/>
     <w:qFormat/>
@@ -4337,9 +4896,9 @@
       <w:sz w:val="34"/>
     </w:rPr>
   </w:style>
-  <w:style w:type="character" w:styleId="656">
+  <w:style w:type="character" w:styleId="659">
     <w:name w:val="Heading 2 Char"/>
-    <w:link w:val="655"/>
+    <w:link w:val="658"/>
     <w:uiPriority w:val="9"/>
     <w:pPr>
       <w:pBdr/>
@@ -4351,11 +4910,11 @@
       <w:sz w:val="34"/>
     </w:rPr>
   </w:style>
-  <w:style w:type="paragraph" w:styleId="657">
+  <w:style w:type="paragraph" w:styleId="660">
     <w:name w:val="Heading 3"/>
-    <w:basedOn w:val="829"/>
-    <w:next w:val="829"/>
-    <w:link w:val="658"/>
+    <w:basedOn w:val="832"/>
+    <w:next w:val="832"/>
+    <w:link w:val="661"/>
     <w:uiPriority w:val="9"/>
     <w:unhideWhenUsed/>
     <w:qFormat/>
@@ -4373,9 +4932,9 @@
       <w:szCs w:val="30"/>
     </w:rPr>
   </w:style>
-  <w:style w:type="character" w:styleId="658">
+  <w:style w:type="character" w:styleId="661">
     <w:name w:val="Heading 3 Char"/>
-    <w:link w:val="657"/>
+    <w:link w:val="660"/>
     <w:uiPriority w:val="9"/>
     <w:pPr>
       <w:pBdr/>
@@ -4388,11 +4947,11 @@
       <w:szCs w:val="30"/>
     </w:rPr>
   </w:style>
-  <w:style w:type="paragraph" w:styleId="659">
+  <w:style w:type="paragraph" w:styleId="662">
     <w:name w:val="Heading 4"/>
-    <w:basedOn w:val="829"/>
-    <w:next w:val="829"/>
-    <w:link w:val="660"/>
+    <w:basedOn w:val="832"/>
+    <w:next w:val="832"/>
+    <w:link w:val="663"/>
     <w:uiPriority w:val="9"/>
     <w:unhideWhenUsed/>
     <w:qFormat/>
@@ -4412,9 +4971,9 @@
       <w:szCs w:val="26"/>
     </w:rPr>
   </w:style>
-  <w:style w:type="character" w:styleId="660">
+  <w:style w:type="character" w:styleId="663">
     <w:name w:val="Heading 4 Char"/>
-    <w:link w:val="659"/>
+    <w:link w:val="662"/>
     <w:uiPriority w:val="9"/>
     <w:pPr>
       <w:pBdr/>
@@ -4429,11 +4988,11 @@
       <w:szCs w:val="26"/>
     </w:rPr>
   </w:style>
-  <w:style w:type="paragraph" w:styleId="661">
+  <w:style w:type="paragraph" w:styleId="664">
     <w:name w:val="Heading 5"/>
-    <w:basedOn w:val="829"/>
-    <w:next w:val="829"/>
-    <w:link w:val="662"/>
+    <w:basedOn w:val="832"/>
+    <w:next w:val="832"/>
+    <w:link w:val="665"/>
     <w:uiPriority w:val="9"/>
     <w:unhideWhenUsed/>
     <w:qFormat/>
@@ -4453,9 +5012,9 @@
       <w:szCs w:val="24"/>
     </w:rPr>
   </w:style>
-  <w:style w:type="character" w:styleId="662">
+  <w:style w:type="character" w:styleId="665">
     <w:name w:val="Heading 5 Char"/>
-    <w:link w:val="661"/>
+    <w:link w:val="664"/>
     <w:uiPriority w:val="9"/>
     <w:pPr>
       <w:pBdr/>
@@ -4470,11 +5029,11 @@
       <w:szCs w:val="24"/>
     </w:rPr>
   </w:style>
-  <w:style w:type="paragraph" w:styleId="663">
+  <w:style w:type="paragraph" w:styleId="666">
     <w:name w:val="Heading 6"/>
-    <w:basedOn w:val="829"/>
-    <w:next w:val="829"/>
-    <w:link w:val="664"/>
+    <w:basedOn w:val="832"/>
+    <w:next w:val="832"/>
+    <w:link w:val="667"/>
     <w:uiPriority w:val="9"/>
     <w:unhideWhenUsed/>
     <w:qFormat/>
@@ -4494,9 +5053,9 @@
       <w:szCs w:val="22"/>
     </w:rPr>
   </w:style>
-  <w:style w:type="character" w:styleId="664">
+  <w:style w:type="character" w:styleId="667">
     <w:name w:val="Heading 6 Char"/>
-    <w:link w:val="663"/>
+    <w:link w:val="666"/>
     <w:uiPriority w:val="9"/>
     <w:pPr>
       <w:pBdr/>
@@ -4511,11 +5070,11 @@
       <w:szCs w:val="22"/>
     </w:rPr>
   </w:style>
-  <w:style w:type="paragraph" w:styleId="665">
+  <w:style w:type="paragraph" w:styleId="668">
     <w:name w:val="Heading 7"/>
-    <w:basedOn w:val="829"/>
-    <w:next w:val="829"/>
-    <w:link w:val="666"/>
+    <w:basedOn w:val="832"/>
+    <w:next w:val="832"/>
+    <w:link w:val="669"/>
     <w:uiPriority w:val="9"/>
     <w:unhideWhenUsed/>
     <w:qFormat/>
@@ -4537,9 +5096,9 @@
       <w:szCs w:val="22"/>
     </w:rPr>
   </w:style>
-  <w:style w:type="character" w:styleId="666">
+  <w:style w:type="character" w:styleId="669">
     <w:name w:val="Heading 7 Char"/>
-    <w:link w:val="665"/>
+    <w:link w:val="668"/>
     <w:uiPriority w:val="9"/>
     <w:pPr>
       <w:pBdr/>
@@ -4556,11 +5115,11 @@
       <w:szCs w:val="22"/>
     </w:rPr>
   </w:style>
-  <w:style w:type="paragraph" w:styleId="667">
+  <w:style w:type="paragraph" w:styleId="670">
     <w:name w:val="Heading 8"/>
-    <w:basedOn w:val="829"/>
-    <w:next w:val="829"/>
-    <w:link w:val="668"/>
+    <w:basedOn w:val="832"/>
+    <w:next w:val="832"/>
+    <w:link w:val="671"/>
     <w:uiPriority w:val="9"/>
     <w:unhideWhenUsed/>
     <w:qFormat/>
@@ -4580,9 +5139,9 @@
       <w:szCs w:val="22"/>
     </w:rPr>
   </w:style>
-  <w:style w:type="character" w:styleId="668">
+  <w:style w:type="character" w:styleId="671">
     <w:name w:val="Heading 8 Char"/>
-    <w:link w:val="667"/>
+    <w:link w:val="670"/>
     <w:uiPriority w:val="9"/>
     <w:pPr>
       <w:pBdr/>
@@ -4597,11 +5156,11 @@
       <w:szCs w:val="22"/>
     </w:rPr>
   </w:style>
-  <w:style w:type="paragraph" w:styleId="669">
+  <w:style w:type="paragraph" w:styleId="672">
     <w:name w:val="Heading 9"/>
-    <w:basedOn w:val="829"/>
-    <w:next w:val="829"/>
-    <w:link w:val="670"/>
+    <w:basedOn w:val="832"/>
+    <w:next w:val="832"/>
+    <w:link w:val="673"/>
     <w:uiPriority w:val="9"/>
     <w:unhideWhenUsed/>
     <w:qFormat/>
@@ -4621,9 +5180,9 @@
       <w:szCs w:val="21"/>
     </w:rPr>
   </w:style>
-  <w:style w:type="character" w:styleId="670">
+  <w:style w:type="character" w:styleId="673">
     <w:name w:val="Heading 9 Char"/>
-    <w:link w:val="669"/>
+    <w:link w:val="672"/>
     <w:uiPriority w:val="9"/>
     <w:pPr>
       <w:pBdr/>
@@ -4638,11 +5197,11 @@
       <w:szCs w:val="21"/>
     </w:rPr>
   </w:style>
-  <w:style w:type="paragraph" w:styleId="671">
+  <w:style w:type="paragraph" w:styleId="674">
     <w:name w:val="Title"/>
-    <w:basedOn w:val="829"/>
-    <w:next w:val="829"/>
-    <w:link w:val="672"/>
+    <w:basedOn w:val="832"/>
+    <w:next w:val="832"/>
+    <w:link w:val="675"/>
     <w:uiPriority w:val="10"/>
     <w:qFormat/>
     <w:pPr>
@@ -4656,9 +5215,9 @@
       <w:szCs w:val="48"/>
     </w:rPr>
   </w:style>
-  <w:style w:type="character" w:styleId="672">
+  <w:style w:type="character" w:styleId="675">
     <w:name w:val="Title Char"/>
-    <w:link w:val="671"/>
+    <w:link w:val="674"/>
     <w:uiPriority w:val="10"/>
     <w:pPr>
       <w:pBdr/>
@@ -4670,11 +5229,11 @@
       <w:szCs w:val="48"/>
     </w:rPr>
   </w:style>
-  <w:style w:type="paragraph" w:styleId="673">
+  <w:style w:type="paragraph" w:styleId="676">
     <w:name w:val="Subtitle"/>
-    <w:basedOn w:val="829"/>
-    <w:next w:val="829"/>
-    <w:link w:val="674"/>
+    <w:basedOn w:val="832"/>
+    <w:next w:val="832"/>
+    <w:link w:val="677"/>
     <w:uiPriority w:val="11"/>
     <w:qFormat/>
     <w:pPr>
@@ -4687,9 +5246,9 @@
       <w:szCs w:val="24"/>
     </w:rPr>
   </w:style>
-  <w:style w:type="character" w:styleId="674">
+  <w:style w:type="character" w:styleId="677">
     <w:name w:val="Subtitle Char"/>
-    <w:link w:val="673"/>
+    <w:link w:val="676"/>
     <w:uiPriority w:val="11"/>
     <w:pPr>
       <w:pBdr/>
@@ -4701,11 +5260,11 @@
       <w:szCs w:val="24"/>
     </w:rPr>
   </w:style>
-  <w:style w:type="paragraph" w:styleId="675">
+  <w:style w:type="paragraph" w:styleId="678">
     <w:name w:val="Quote"/>
-    <w:basedOn w:val="829"/>
-    <w:next w:val="829"/>
-    <w:link w:val="676"/>
+    <w:basedOn w:val="832"/>
+    <w:next w:val="832"/>
+    <w:link w:val="679"/>
     <w:uiPriority w:val="29"/>
     <w:qFormat/>
     <w:pPr>
@@ -4717,9 +5276,9 @@
       <w:i/>
     </w:rPr>
   </w:style>
-  <w:style w:type="character" w:styleId="676">
+  <w:style w:type="character" w:styleId="679">
     <w:name w:val="Quote Char"/>
-    <w:link w:val="675"/>
+    <w:link w:val="678"/>
     <w:uiPriority w:val="29"/>
     <w:pPr>
       <w:pBdr/>
@@ -4730,11 +5289,11 @@
       <w:i/>
     </w:rPr>
   </w:style>
-  <w:style w:type="paragraph" w:styleId="677">
+  <w:style w:type="paragraph" w:styleId="680">
     <w:name w:val="Intense Quote"/>
-    <w:basedOn w:val="829"/>
-    <w:next w:val="829"/>
-    <w:link w:val="678"/>
+    <w:basedOn w:val="832"/>
+    <w:next w:val="832"/>
+    <w:link w:val="681"/>
     <w:uiPriority w:val="30"/>
     <w:qFormat/>
     <w:pPr>
@@ -4753,9 +5312,9 @@
       <w:i/>
     </w:rPr>
   </w:style>
-  <w:style w:type="character" w:styleId="678">
+  <w:style w:type="character" w:styleId="681">
     <w:name w:val="Intense Quote Char"/>
-    <w:link w:val="677"/>
+    <w:link w:val="680"/>
     <w:uiPriority w:val="30"/>
     <w:pPr>
       <w:pBdr/>
@@ -4766,10 +5325,10 @@
       <w:i/>
     </w:rPr>
   </w:style>
-  <w:style w:type="paragraph" w:styleId="679">
+  <w:style w:type="paragraph" w:styleId="682">
     <w:name w:val="Header"/>
-    <w:basedOn w:val="829"/>
-    <w:link w:val="680"/>
+    <w:basedOn w:val="832"/>
+    <w:link w:val="683"/>
     <w:uiPriority w:val="99"/>
     <w:unhideWhenUsed/>
     <w:pPr>
@@ -4782,9 +5341,9 @@
       <w:ind/>
     </w:pPr>
   </w:style>
-  <w:style w:type="character" w:styleId="680">
+  <w:style w:type="character" w:styleId="683">
     <w:name w:val="Header Char"/>
-    <w:link w:val="679"/>
+    <w:link w:val="682"/>
     <w:uiPriority w:val="99"/>
     <w:pPr>
       <w:pBdr/>
@@ -4792,10 +5351,10 @@
       <w:ind/>
     </w:pPr>
   </w:style>
-  <w:style w:type="paragraph" w:styleId="681">
+  <w:style w:type="paragraph" w:styleId="684">
     <w:name w:val="Footer"/>
-    <w:basedOn w:val="829"/>
-    <w:link w:val="684"/>
+    <w:basedOn w:val="832"/>
+    <w:link w:val="687"/>
     <w:uiPriority w:val="99"/>
     <w:unhideWhenUsed/>
     <w:pPr>
@@ -4808,9 +5367,9 @@
       <w:ind/>
     </w:pPr>
   </w:style>
-  <w:style w:type="character" w:styleId="682">
+  <w:style w:type="character" w:styleId="685">
     <w:name w:val="Footer Char"/>
-    <w:link w:val="681"/>
+    <w:link w:val="684"/>
     <w:uiPriority w:val="99"/>
     <w:pPr>
       <w:pBdr/>
@@ -4818,10 +5377,10 @@
       <w:ind/>
     </w:pPr>
   </w:style>
-  <w:style w:type="paragraph" w:styleId="683">
+  <w:style w:type="paragraph" w:styleId="686">
     <w:name w:val="Caption"/>
-    <w:basedOn w:val="829"/>
-    <w:next w:val="829"/>
+    <w:basedOn w:val="832"/>
+    <w:next w:val="832"/>
     <w:uiPriority w:val="35"/>
     <w:semiHidden/>
     <w:unhideWhenUsed/>
@@ -4839,10 +5398,10 @@
       <w:szCs w:val="18"/>
     </w:rPr>
   </w:style>
-  <w:style w:type="character" w:styleId="684">
+  <w:style w:type="character" w:styleId="687">
     <w:name w:val="Caption Char"/>
-    <w:basedOn w:val="683"/>
-    <w:link w:val="681"/>
+    <w:basedOn w:val="686"/>
+    <w:link w:val="684"/>
     <w:uiPriority w:val="99"/>
     <w:pPr>
       <w:pBdr/>
@@ -4850,9 +5409,9 @@
       <w:ind/>
     </w:pPr>
   </w:style>
-  <w:style w:type="table" w:styleId="685">
+  <w:style w:type="table" w:styleId="688">
     <w:name w:val="Table Grid"/>
-    <w:basedOn w:val="830"/>
+    <w:basedOn w:val="833"/>
     <w:uiPriority w:val="59"/>
     <w:pPr>
       <w:pBdr/>
@@ -5049,9 +5608,9 @@
       </w:tcPr>
     </w:tblStylePr>
   </w:style>
-  <w:style w:type="table" w:styleId="686">
+  <w:style w:type="table" w:styleId="689">
     <w:name w:val="Table Grid Light"/>
-    <w:basedOn w:val="830"/>
+    <w:basedOn w:val="833"/>
     <w:uiPriority w:val="59"/>
     <w:pPr>
       <w:pBdr/>
@@ -5248,9 +5807,9 @@
       </w:tcPr>
     </w:tblStylePr>
   </w:style>
-  <w:style w:type="table" w:styleId="687">
+  <w:style w:type="table" w:styleId="690">
     <w:name w:val="Plain Table 1"/>
-    <w:basedOn w:val="830"/>
+    <w:basedOn w:val="833"/>
     <w:uiPriority w:val="59"/>
     <w:pPr>
       <w:pBdr/>
@@ -5473,9 +6032,9 @@
       </w:tcPr>
     </w:tblStylePr>
   </w:style>
-  <w:style w:type="table" w:styleId="688">
+  <w:style w:type="table" w:styleId="691">
     <w:name w:val="Plain Table 2"/>
-    <w:basedOn w:val="830"/>
+    <w:basedOn w:val="833"/>
     <w:uiPriority w:val="59"/>
     <w:pPr>
       <w:pBdr/>
@@ -5706,9 +6265,9 @@
       </w:tcPr>
     </w:tblStylePr>
   </w:style>
-  <w:style w:type="table" w:styleId="689">
+  <w:style w:type="table" w:styleId="692">
     <w:name w:val="Plain Table 3"/>
-    <w:basedOn w:val="830"/>
+    <w:basedOn w:val="833"/>
     <w:uiPriority w:val="99"/>
     <w:pPr>
       <w:pBdr/>
@@ -5936,9 +6495,9 @@
       </w:tcPr>
     </w:tblStylePr>
   </w:style>
-  <w:style w:type="table" w:styleId="690">
+  <w:style w:type="table" w:styleId="693">
     <w:name w:val="Plain Table 4"/>
-    <w:basedOn w:val="830"/>
+    <w:basedOn w:val="833"/>
     <w:uiPriority w:val="99"/>
     <w:pPr>
       <w:pBdr/>
@@ -6152,9 +6711,9 @@
       </w:tcPr>
     </w:tblStylePr>
   </w:style>
-  <w:style w:type="table" w:styleId="691">
+  <w:style w:type="table" w:styleId="694">
     <w:name w:val="Plain Table 5"/>
-    <w:basedOn w:val="830"/>
+    <w:basedOn w:val="833"/>
     <w:uiPriority w:val="99"/>
     <w:pPr>
       <w:pBdr/>
@@ -6385,9 +6944,9 @@
       </w:tcPr>
     </w:tblStylePr>
   </w:style>
-  <w:style w:type="table" w:styleId="692">
+  <w:style w:type="table" w:styleId="695">
     <w:name w:val="Grid Table 1 Light"/>
-    <w:basedOn w:val="830"/>
+    <w:basedOn w:val="833"/>
     <w:uiPriority w:val="99"/>
     <w:pPr>
       <w:pBdr/>
@@ -6608,9 +7167,9 @@
       </w:tcPr>
     </w:tblStylePr>
   </w:style>
-  <w:style w:type="table" w:styleId="693">
+  <w:style w:type="table" w:styleId="696">
     <w:name w:val="Grid Table 1 Light - Accent 1"/>
-    <w:basedOn w:val="830"/>
+    <w:basedOn w:val="833"/>
     <w:uiPriority w:val="99"/>
     <w:pPr>
       <w:pBdr/>
@@ -6831,9 +7390,9 @@
       </w:tcPr>
     </w:tblStylePr>
   </w:style>
-  <w:style w:type="table" w:styleId="694">
+  <w:style w:type="table" w:styleId="697">
     <w:name w:val="Grid Table 1 Light - Accent 2"/>
-    <w:basedOn w:val="830"/>
+    <w:basedOn w:val="833"/>
     <w:uiPriority w:val="99"/>
     <w:pPr>
       <w:pBdr/>
@@ -7054,9 +7613,9 @@
       </w:tcPr>
     </w:tblStylePr>
   </w:style>
-  <w:style w:type="table" w:styleId="695">
+  <w:style w:type="table" w:styleId="698">
     <w:name w:val="Grid Table 1 Light - Accent 3"/>
-    <w:basedOn w:val="830"/>
+    <w:basedOn w:val="833"/>
     <w:uiPriority w:val="99"/>
     <w:pPr>
       <w:pBdr/>
@@ -7277,9 +7836,9 @@
       </w:tcPr>
     </w:tblStylePr>
   </w:style>
-  <w:style w:type="table" w:styleId="696">
+  <w:style w:type="table" w:styleId="699">
     <w:name w:val="Grid Table 1 Light - Accent 4"/>
-    <w:basedOn w:val="830"/>
+    <w:basedOn w:val="833"/>
     <w:uiPriority w:val="99"/>
     <w:pPr>
       <w:pBdr/>
@@ -7500,9 +8059,9 @@
       </w:tcPr>
     </w:tblStylePr>
   </w:style>
-  <w:style w:type="table" w:styleId="697">
+  <w:style w:type="table" w:styleId="700">
     <w:name w:val="Grid Table 1 Light - Accent 5"/>
-    <w:basedOn w:val="830"/>
+    <w:basedOn w:val="833"/>
     <w:uiPriority w:val="99"/>
     <w:pPr>
       <w:pBdr/>
@@ -7723,9 +8282,9 @@
       </w:tcPr>
     </w:tblStylePr>
   </w:style>
-  <w:style w:type="table" w:styleId="698">
+  <w:style w:type="table" w:styleId="701">
     <w:name w:val="Grid Table 1 Light - Accent 6"/>
-    <w:basedOn w:val="830"/>
+    <w:basedOn w:val="833"/>
     <w:uiPriority w:val="99"/>
     <w:pPr>
       <w:pBdr/>
@@ -7946,9 +8505,9 @@
       </w:tcPr>
     </w:tblStylePr>
   </w:style>
-  <w:style w:type="table" w:styleId="699">
+  <w:style w:type="table" w:styleId="702">
     <w:name w:val="Grid Table 2"/>
-    <w:basedOn w:val="830"/>
+    <w:basedOn w:val="833"/>
     <w:uiPriority w:val="99"/>
     <w:pPr>
       <w:pBdr/>
@@ -8178,9 +8737,9 @@
       </w:tcPr>
     </w:tblStylePr>
   </w:style>
-  <w:style w:type="table" w:styleId="700">
+  <w:style w:type="table" w:styleId="703">
     <w:name w:val="Grid Table 2 - Accent 1"/>
-    <w:basedOn w:val="830"/>
+    <w:basedOn w:val="833"/>
     <w:uiPriority w:val="99"/>
     <w:pPr>
       <w:pBdr/>
@@ -8410,9 +8969,9 @@
       </w:tcPr>
     </w:tblStylePr>
   </w:style>
-  <w:style w:type="table" w:styleId="701">
+  <w:style w:type="table" w:styleId="704">
     <w:name w:val="Grid Table 2 - Accent 2"/>
-    <w:basedOn w:val="830"/>
+    <w:basedOn w:val="833"/>
     <w:uiPriority w:val="99"/>
     <w:pPr>
       <w:pBdr/>
@@ -8642,9 +9201,9 @@
       </w:tcPr>
     </w:tblStylePr>
   </w:style>
-  <w:style w:type="table" w:styleId="702">
+  <w:style w:type="table" w:styleId="705">
     <w:name w:val="Grid Table 2 - Accent 3"/>
-    <w:basedOn w:val="830"/>
+    <w:basedOn w:val="833"/>
     <w:uiPriority w:val="99"/>
     <w:pPr>
       <w:pBdr/>
@@ -8874,9 +9433,9 @@
       </w:tcPr>
     </w:tblStylePr>
   </w:style>
-  <w:style w:type="table" w:styleId="703">
+  <w:style w:type="table" w:styleId="706">
     <w:name w:val="Grid Table 2 - Accent 4"/>
-    <w:basedOn w:val="830"/>
+    <w:basedOn w:val="833"/>
     <w:uiPriority w:val="99"/>
     <w:pPr>
       <w:pBdr/>
@@ -9106,9 +9665,9 @@
       </w:tcPr>
     </w:tblStylePr>
   </w:style>
-  <w:style w:type="table" w:styleId="704">
+  <w:style w:type="table" w:styleId="707">
     <w:name w:val="Grid Table 2 - Accent 5"/>
-    <w:basedOn w:val="830"/>
+    <w:basedOn w:val="833"/>
     <w:uiPriority w:val="99"/>
     <w:pPr>
       <w:pBdr/>
@@ -9338,9 +9897,9 @@
       </w:tcPr>
     </w:tblStylePr>
   </w:style>
-  <w:style w:type="table" w:styleId="705">
+  <w:style w:type="table" w:styleId="708">
     <w:name w:val="Grid Table 2 - Accent 6"/>
-    <w:basedOn w:val="830"/>
+    <w:basedOn w:val="833"/>
     <w:uiPriority w:val="99"/>
     <w:pPr>
       <w:pBdr/>
@@ -9570,9 +10129,9 @@
       </w:tcPr>
     </w:tblStylePr>
   </w:style>
-  <w:style w:type="table" w:styleId="706">
+  <w:style w:type="table" w:styleId="709">
     <w:name w:val="Grid Table 3"/>
-    <w:basedOn w:val="830"/>
+    <w:basedOn w:val="833"/>
     <w:uiPriority w:val="99"/>
     <w:pPr>
       <w:pBdr/>
@@ -9815,9 +10374,9 @@
       </w:tcPr>
     </w:tblStylePr>
   </w:style>
-  <w:style w:type="table" w:styleId="707">
+  <w:style w:type="table" w:styleId="710">
     <w:name w:val="Grid Table 3 - Accent 1"/>
-    <w:basedOn w:val="830"/>
+    <w:basedOn w:val="833"/>
     <w:uiPriority w:val="99"/>
     <w:pPr>
       <w:pBdr/>
@@ -10060,9 +10619,9 @@
       </w:tcPr>
     </w:tblStylePr>
   </w:style>
-  <w:style w:type="table" w:styleId="708">
+  <w:style w:type="table" w:styleId="711">
     <w:name w:val="Grid Table 3 - Accent 2"/>
-    <w:basedOn w:val="830"/>
+    <w:basedOn w:val="833"/>
     <w:uiPriority w:val="99"/>
     <w:pPr>
       <w:pBdr/>
@@ -10305,9 +10864,9 @@
       </w:tcPr>
     </w:tblStylePr>
   </w:style>
-  <w:style w:type="table" w:styleId="709">
+  <w:style w:type="table" w:styleId="712">
     <w:name w:val="Grid Table 3 - Accent 3"/>
-    <w:basedOn w:val="830"/>
+    <w:basedOn w:val="833"/>
     <w:uiPriority w:val="99"/>
     <w:pPr>
       <w:pBdr/>
@@ -10550,9 +11109,9 @@
       </w:tcPr>
     </w:tblStylePr>
   </w:style>
-  <w:style w:type="table" w:styleId="710">
+  <w:style w:type="table" w:styleId="713">
     <w:name w:val="Grid Table 3 - Accent 4"/>
-    <w:basedOn w:val="830"/>
+    <w:basedOn w:val="833"/>
     <w:uiPriority w:val="99"/>
     <w:pPr>
       <w:pBdr/>
@@ -10795,9 +11354,9 @@
       </w:tcPr>
     </w:tblStylePr>
   </w:style>
-  <w:style w:type="table" w:styleId="711">
+  <w:style w:type="table" w:styleId="714">
     <w:name w:val="Grid Table 3 - Accent 5"/>
-    <w:basedOn w:val="830"/>
+    <w:basedOn w:val="833"/>
     <w:uiPriority w:val="99"/>
     <w:pPr>
       <w:pBdr/>
@@ -11040,9 +11599,9 @@
       </w:tcPr>
     </w:tblStylePr>
   </w:style>
-  <w:style w:type="table" w:styleId="712">
+  <w:style w:type="table" w:styleId="715">
     <w:name w:val="Grid Table 3 - Accent 6"/>
-    <w:basedOn w:val="830"/>
+    <w:basedOn w:val="833"/>
     <w:uiPriority w:val="99"/>
     <w:pPr>
       <w:pBdr/>
@@ -11285,9 +11844,9 @@
       </w:tcPr>
     </w:tblStylePr>
   </w:style>
-  <w:style w:type="table" w:styleId="713">
+  <w:style w:type="table" w:styleId="716">
     <w:name w:val="Grid Table 4"/>
-    <w:basedOn w:val="830"/>
+    <w:basedOn w:val="833"/>
     <w:uiPriority w:val="59"/>
     <w:pPr>
       <w:pBdr/>
@@ -11518,9 +12077,9 @@
       </w:tcPr>
     </w:tblStylePr>
   </w:style>
-  <w:style w:type="table" w:styleId="714">
+  <w:style w:type="table" w:styleId="717">
     <w:name w:val="Grid Table 4 - Accent 1"/>
-    <w:basedOn w:val="830"/>
+    <w:basedOn w:val="833"/>
     <w:uiPriority w:val="59"/>
     <w:pPr>
       <w:pBdr/>
@@ -11751,9 +12310,9 @@
       </w:tcPr>
     </w:tblStylePr>
   </w:style>
-  <w:style w:type="table" w:styleId="715">
+  <w:style w:type="table" w:styleId="718">
     <w:name w:val="Grid Table 4 - Accent 2"/>
-    <w:basedOn w:val="830"/>
+    <w:basedOn w:val="833"/>
     <w:uiPriority w:val="59"/>
     <w:pPr>
       <w:pBdr/>
@@ -11984,9 +12543,9 @@
       </w:tcPr>
     </w:tblStylePr>
   </w:style>
-  <w:style w:type="table" w:styleId="716">
+  <w:style w:type="table" w:styleId="719">
     <w:name w:val="Grid Table 4 - Accent 3"/>
-    <w:basedOn w:val="830"/>
+    <w:basedOn w:val="833"/>
     <w:uiPriority w:val="59"/>
     <w:pPr>
       <w:pBdr/>
@@ -12217,9 +12776,9 @@
       </w:tcPr>
     </w:tblStylePr>
   </w:style>
-  <w:style w:type="table" w:styleId="717">
+  <w:style w:type="table" w:styleId="720">
     <w:name w:val="Grid Table 4 - Accent 4"/>
-    <w:basedOn w:val="830"/>
+    <w:basedOn w:val="833"/>
     <w:uiPriority w:val="59"/>
     <w:pPr>
       <w:pBdr/>
@@ -12450,9 +13009,9 @@
       </w:tcPr>
     </w:tblStylePr>
   </w:style>
-  <w:style w:type="table" w:styleId="718">
+  <w:style w:type="table" w:styleId="721">
     <w:name w:val="Grid Table 4 - Accent 5"/>
-    <w:basedOn w:val="830"/>
+    <w:basedOn w:val="833"/>
     <w:uiPriority w:val="59"/>
     <w:pPr>
       <w:pBdr/>
@@ -12683,9 +13242,9 @@
       </w:tcPr>
     </w:tblStylePr>
   </w:style>
-  <w:style w:type="table" w:styleId="719">
+  <w:style w:type="table" w:styleId="722">
     <w:name w:val="Grid Table 4 - Accent 6"/>
-    <w:basedOn w:val="830"/>
+    <w:basedOn w:val="833"/>
     <w:uiPriority w:val="59"/>
     <w:pPr>
       <w:pBdr/>
@@ -12916,9 +13475,9 @@
       </w:tcPr>
     </w:tblStylePr>
   </w:style>
-  <w:style w:type="table" w:styleId="720">
+  <w:style w:type="table" w:styleId="723">
     <w:name w:val="Grid Table 5 Dark"/>
-    <w:basedOn w:val="830"/>
+    <w:basedOn w:val="833"/>
     <w:uiPriority w:val="99"/>
     <w:pPr>
       <w:pBdr/>
@@ -13144,9 +13703,9 @@
       </w:tcPr>
     </w:tblStylePr>
   </w:style>
-  <w:style w:type="table" w:styleId="721">
+  <w:style w:type="table" w:styleId="724">
     <w:name w:val="Grid Table 5 Dark- Accent 1"/>
-    <w:basedOn w:val="830"/>
+    <w:basedOn w:val="833"/>
     <w:uiPriority w:val="99"/>
     <w:pPr>
       <w:pBdr/>
@@ -13372,9 +13931,9 @@
       </w:tcPr>
     </w:tblStylePr>
   </w:style>
-  <w:style w:type="table" w:styleId="722">
+  <w:style w:type="table" w:styleId="725">
     <w:name w:val="Grid Table 5 Dark - Accent 2"/>
-    <w:basedOn w:val="830"/>
+    <w:basedOn w:val="833"/>
     <w:uiPriority w:val="99"/>
     <w:pPr>
       <w:pBdr/>
@@ -13600,9 +14159,9 @@
       </w:tcPr>
     </w:tblStylePr>
   </w:style>
-  <w:style w:type="table" w:styleId="723">
+  <w:style w:type="table" w:styleId="726">
     <w:name w:val="Grid Table 5 Dark - Accent 3"/>
-    <w:basedOn w:val="830"/>
+    <w:basedOn w:val="833"/>
     <w:uiPriority w:val="99"/>
     <w:pPr>
       <w:pBdr/>
@@ -13828,9 +14387,9 @@
       </w:tcPr>
     </w:tblStylePr>
   </w:style>
-  <w:style w:type="table" w:styleId="724">
+  <w:style w:type="table" w:styleId="727">
     <w:name w:val="Grid Table 5 Dark- Accent 4"/>
-    <w:basedOn w:val="830"/>
+    <w:basedOn w:val="833"/>
     <w:uiPriority w:val="99"/>
     <w:pPr>
       <w:pBdr/>
@@ -14056,9 +14615,9 @@
       </w:tcPr>
     </w:tblStylePr>
   </w:style>
-  <w:style w:type="table" w:styleId="725">
+  <w:style w:type="table" w:styleId="728">
     <w:name w:val="Grid Table 5 Dark - Accent 5"/>
-    <w:basedOn w:val="830"/>
+    <w:basedOn w:val="833"/>
     <w:uiPriority w:val="99"/>
     <w:pPr>
       <w:pBdr/>
@@ -14284,9 +14843,9 @@
       </w:tcPr>
     </w:tblStylePr>
   </w:style>
-  <w:style w:type="table" w:styleId="726">
+  <w:style w:type="table" w:styleId="729">
     <w:name w:val="Grid Table 5 Dark - Accent 6"/>
-    <w:basedOn w:val="830"/>
+    <w:basedOn w:val="833"/>
     <w:uiPriority w:val="99"/>
     <w:pPr>
       <w:pBdr/>
@@ -14512,9 +15071,9 @@
       </w:tcPr>
     </w:tblStylePr>
   </w:style>
-  <w:style w:type="table" w:styleId="727">
+  <w:style w:type="table" w:styleId="730">
     <w:name w:val="Grid Table 6 Colorful"/>
-    <w:basedOn w:val="830"/>
+    <w:basedOn w:val="833"/>
     <w:uiPriority w:val="99"/>
     <w:pPr>
       <w:pBdr/>
@@ -14742,9 +15301,9 @@
       </w:tcPr>
     </w:tblStylePr>
   </w:style>
-  <w:style w:type="table" w:styleId="728">
+  <w:style w:type="table" w:styleId="731">
     <w:name w:val="Grid Table 6 Colorful - Accent 1"/>
-    <w:basedOn w:val="830"/>
+    <w:basedOn w:val="833"/>
     <w:uiPriority w:val="99"/>
     <w:pPr>
       <w:pBdr/>
@@ -14972,9 +15531,9 @@
       </w:tcPr>
     </w:tblStylePr>
   </w:style>
-  <w:style w:type="table" w:styleId="729">
+  <w:style w:type="table" w:styleId="732">
     <w:name w:val="Grid Table 6 Colorful - Accent 2"/>
-    <w:basedOn w:val="830"/>
+    <w:basedOn w:val="833"/>
     <w:uiPriority w:val="99"/>
     <w:pPr>
       <w:pBdr/>
@@ -15202,9 +15761,9 @@
       </w:tcPr>
     </w:tblStylePr>
   </w:style>
-  <w:style w:type="table" w:styleId="730">
+  <w:style w:type="table" w:styleId="733">
     <w:name w:val="Grid Table 6 Colorful - Accent 3"/>
-    <w:basedOn w:val="830"/>
+    <w:basedOn w:val="833"/>
     <w:uiPriority w:val="99"/>
     <w:pPr>
       <w:pBdr/>
@@ -15432,9 +15991,9 @@
       </w:tcPr>
     </w:tblStylePr>
   </w:style>
-  <w:style w:type="table" w:styleId="731">
+  <w:style w:type="table" w:styleId="734">
     <w:name w:val="Grid Table 6 Colorful - Accent 4"/>
-    <w:basedOn w:val="830"/>
+    <w:basedOn w:val="833"/>
     <w:uiPriority w:val="99"/>
     <w:pPr>
       <w:pBdr/>
@@ -15662,9 +16221,9 @@
       </w:tcPr>
     </w:tblStylePr>
   </w:style>
-  <w:style w:type="table" w:styleId="732">
+  <w:style w:type="table" w:styleId="735">
     <w:name w:val="Grid Table 6 Colorful - Accent 5"/>
-    <w:basedOn w:val="830"/>
+    <w:basedOn w:val="833"/>
     <w:uiPriority w:val="99"/>
     <w:pPr>
       <w:pBdr/>
@@ -15892,9 +16451,9 @@
       </w:tcPr>
     </w:tblStylePr>
   </w:style>
-  <w:style w:type="table" w:styleId="733">
+  <w:style w:type="table" w:styleId="736">
     <w:name w:val="Grid Table 6 Colorful - Accent 6"/>
-    <w:basedOn w:val="830"/>
+    <w:basedOn w:val="833"/>
     <w:uiPriority w:val="99"/>
     <w:pPr>
       <w:pBdr/>
@@ -16122,9 +16681,9 @@
       </w:tcPr>
     </w:tblStylePr>
   </w:style>
-  <w:style w:type="table" w:styleId="734">
+  <w:style w:type="table" w:styleId="737">
     <w:name w:val="Grid Table 7 Colorful"/>
-    <w:basedOn w:val="830"/>
+    <w:basedOn w:val="833"/>
     <w:uiPriority w:val="99"/>
     <w:pPr>
       <w:pBdr/>
@@ -16376,9 +16935,9 @@
       </w:tcPr>
     </w:tblStylePr>
   </w:style>
-  <w:style w:type="table" w:styleId="735">
+  <w:style w:type="table" w:styleId="738">
     <w:name w:val="Grid Table 7 Colorful - Accent 1"/>
-    <w:basedOn w:val="830"/>
+    <w:basedOn w:val="833"/>
     <w:uiPriority w:val="99"/>
     <w:pPr>
       <w:pBdr/>
@@ -16630,9 +17189,9 @@
       </w:tcPr>
     </w:tblStylePr>
   </w:style>
-  <w:style w:type="table" w:styleId="736">
+  <w:style w:type="table" w:styleId="739">
     <w:name w:val="Grid Table 7 Colorful - Accent 2"/>
-    <w:basedOn w:val="830"/>
+    <w:basedOn w:val="833"/>
     <w:uiPriority w:val="99"/>
     <w:pPr>
       <w:pBdr/>
@@ -16884,9 +17443,9 @@
       </w:tcPr>
     </w:tblStylePr>
   </w:style>
-  <w:style w:type="table" w:styleId="737">
+  <w:style w:type="table" w:styleId="740">
     <w:name w:val="Grid Table 7 Colorful - Accent 3"/>
-    <w:basedOn w:val="830"/>
+    <w:basedOn w:val="833"/>
     <w:uiPriority w:val="99"/>
     <w:pPr>
       <w:pBdr/>
@@ -17138,9 +17697,9 @@
       </w:tcPr>
     </w:tblStylePr>
   </w:style>
-  <w:style w:type="table" w:styleId="738">
+  <w:style w:type="table" w:styleId="741">
     <w:name w:val="Grid Table 7 Colorful - Accent 4"/>
-    <w:basedOn w:val="830"/>
+    <w:basedOn w:val="833"/>
     <w:uiPriority w:val="99"/>
     <w:pPr>
       <w:pBdr/>
@@ -17392,9 +17951,9 @@
       </w:tcPr>
     </w:tblStylePr>
   </w:style>
-  <w:style w:type="table" w:styleId="739">
+  <w:style w:type="table" w:styleId="742">
     <w:name w:val="Grid Table 7 Colorful - Accent 5"/>
-    <w:basedOn w:val="830"/>
+    <w:basedOn w:val="833"/>
     <w:uiPriority w:val="99"/>
     <w:pPr>
       <w:pBdr/>
@@ -17646,9 +18205,9 @@
       </w:tcPr>
     </w:tblStylePr>
   </w:style>
-  <w:style w:type="table" w:styleId="740">
+  <w:style w:type="table" w:styleId="743">
     <w:name w:val="Grid Table 7 Colorful - Accent 6"/>
-    <w:basedOn w:val="830"/>
+    <w:basedOn w:val="833"/>
     <w:uiPriority w:val="99"/>
     <w:pPr>
       <w:pBdr/>
@@ -17900,9 +18459,9 @@
       </w:tcPr>
     </w:tblStylePr>
   </w:style>
-  <w:style w:type="table" w:styleId="741">
+  <w:style w:type="table" w:styleId="744">
     <w:name w:val="List Table 1 Light"/>
-    <w:basedOn w:val="830"/>
+    <w:basedOn w:val="833"/>
     <w:uiPriority w:val="99"/>
     <w:pPr>
       <w:pBdr/>
@@ -18116,9 +18675,9 @@
       </w:tcPr>
     </w:tblStylePr>
   </w:style>
-  <w:style w:type="table" w:styleId="742">
+  <w:style w:type="table" w:styleId="745">
     <w:name w:val="List Table 1 Light - Accent 1"/>
-    <w:basedOn w:val="830"/>
+    <w:basedOn w:val="833"/>
     <w:uiPriority w:val="99"/>
     <w:pPr>
       <w:pBdr/>
@@ -18332,9 +18891,9 @@
       </w:tcPr>
     </w:tblStylePr>
   </w:style>
-  <w:style w:type="table" w:styleId="743">
+  <w:style w:type="table" w:styleId="746">
     <w:name w:val="List Table 1 Light - Accent 2"/>
-    <w:basedOn w:val="830"/>
+    <w:basedOn w:val="833"/>
     <w:uiPriority w:val="99"/>
     <w:pPr>
       <w:pBdr/>
@@ -18548,9 +19107,9 @@
       </w:tcPr>
     </w:tblStylePr>
   </w:style>
-  <w:style w:type="table" w:styleId="744">
+  <w:style w:type="table" w:styleId="747">
     <w:name w:val="List Table 1 Light - Accent 3"/>
-    <w:basedOn w:val="830"/>
+    <w:basedOn w:val="833"/>
     <w:uiPriority w:val="99"/>
     <w:pPr>
       <w:pBdr/>
@@ -18764,9 +19323,9 @@
       </w:tcPr>
     </w:tblStylePr>
   </w:style>
-  <w:style w:type="table" w:styleId="745">
+  <w:style w:type="table" w:styleId="748">
     <w:name w:val="List Table 1 Light - Accent 4"/>
-    <w:basedOn w:val="830"/>
+    <w:basedOn w:val="833"/>
     <w:uiPriority w:val="99"/>
     <w:pPr>
       <w:pBdr/>
@@ -18980,9 +19539,9 @@
       </w:tcPr>
     </w:tblStylePr>
   </w:style>
-  <w:style w:type="table" w:styleId="746">
+  <w:style w:type="table" w:styleId="749">
     <w:name w:val="List Table 1 Light - Accent 5"/>
-    <w:basedOn w:val="830"/>
+    <w:basedOn w:val="833"/>
     <w:uiPriority w:val="99"/>
     <w:pPr>
       <w:pBdr/>
@@ -19196,9 +19755,9 @@
       </w:tcPr>
     </w:tblStylePr>
   </w:style>
-  <w:style w:type="table" w:styleId="747">
+  <w:style w:type="table" w:styleId="750">
     <w:name w:val="List Table 1 Light - Accent 6"/>
-    <w:basedOn w:val="830"/>
+    <w:basedOn w:val="833"/>
     <w:uiPriority w:val="99"/>
     <w:pPr>
       <w:pBdr/>
@@ -19412,9 +19971,9 @@
       </w:tcPr>
     </w:tblStylePr>
   </w:style>
-  <w:style w:type="table" w:styleId="748">
+  <w:style w:type="table" w:styleId="751">
     <w:name w:val="List Table 2"/>
-    <w:basedOn w:val="830"/>
+    <w:basedOn w:val="833"/>
     <w:uiPriority w:val="99"/>
     <w:pPr>
       <w:pBdr/>
@@ -19650,9 +20209,9 @@
       </w:tcPr>
     </w:tblStylePr>
   </w:style>
-  <w:style w:type="table" w:styleId="749">
+  <w:style w:type="table" w:styleId="752">
     <w:name w:val="List Table 2 - Accent 1"/>
-    <w:basedOn w:val="830"/>
+    <w:basedOn w:val="833"/>
     <w:uiPriority w:val="99"/>
     <w:pPr>
       <w:pBdr/>
@@ -19888,9 +20447,9 @@
       </w:tcPr>
     </w:tblStylePr>
   </w:style>
-  <w:style w:type="table" w:styleId="750">
+  <w:style w:type="table" w:styleId="753">
     <w:name w:val="List Table 2 - Accent 2"/>
-    <w:basedOn w:val="830"/>
+    <w:basedOn w:val="833"/>
     <w:uiPriority w:val="99"/>
     <w:pPr>
       <w:pBdr/>
@@ -20126,9 +20685,9 @@
       </w:tcPr>
     </w:tblStylePr>
   </w:style>
-  <w:style w:type="table" w:styleId="751">
+  <w:style w:type="table" w:styleId="754">
     <w:name w:val="List Table 2 - Accent 3"/>
-    <w:basedOn w:val="830"/>
+    <w:basedOn w:val="833"/>
     <w:uiPriority w:val="99"/>
     <w:pPr>
       <w:pBdr/>
@@ -20364,9 +20923,9 @@
       </w:tcPr>
     </w:tblStylePr>
   </w:style>
-  <w:style w:type="table" w:styleId="752">
+  <w:style w:type="table" w:styleId="755">
     <w:name w:val="List Table 2 - Accent 4"/>
-    <w:basedOn w:val="830"/>
+    <w:basedOn w:val="833"/>
     <w:uiPriority w:val="99"/>
     <w:pPr>
       <w:pBdr/>
@@ -20602,9 +21161,9 @@
       </w:tcPr>
     </w:tblStylePr>
   </w:style>
-  <w:style w:type="table" w:styleId="753">
+  <w:style w:type="table" w:styleId="756">
     <w:name w:val="List Table 2 - Accent 5"/>
-    <w:basedOn w:val="830"/>
+    <w:basedOn w:val="833"/>
     <w:uiPriority w:val="99"/>
     <w:pPr>
       <w:pBdr/>
@@ -20840,9 +21399,9 @@
       </w:tcPr>
     </w:tblStylePr>
   </w:style>
-  <w:style w:type="table" w:styleId="754">
+  <w:style w:type="table" w:styleId="757">
     <w:name w:val="List Table 2 - Accent 6"/>
-    <w:basedOn w:val="830"/>
+    <w:basedOn w:val="833"/>
     <w:uiPriority w:val="99"/>
     <w:pPr>
       <w:pBdr/>
@@ -21078,9 +21637,9 @@
       </w:tcPr>
     </w:tblStylePr>
   </w:style>
-  <w:style w:type="table" w:styleId="755">
+  <w:style w:type="table" w:styleId="758">
     <w:name w:val="List Table 3"/>
-    <w:basedOn w:val="830"/>
+    <w:basedOn w:val="833"/>
     <w:uiPriority w:val="99"/>
     <w:pPr>
       <w:pBdr/>
@@ -21306,9 +21865,9 @@
       </w:tcPr>
     </w:tblStylePr>
   </w:style>
-  <w:style w:type="table" w:styleId="756">
+  <w:style w:type="table" w:styleId="759">
     <w:name w:val="List Table 3 - Accent 1"/>
-    <w:basedOn w:val="830"/>
+    <w:basedOn w:val="833"/>
     <w:uiPriority w:val="99"/>
     <w:pPr>
       <w:pBdr/>
@@ -21534,9 +22093,9 @@
       </w:tcPr>
     </w:tblStylePr>
   </w:style>
-  <w:style w:type="table" w:styleId="757">
+  <w:style w:type="table" w:styleId="760">
     <w:name w:val="List Table 3 - Accent 2"/>
-    <w:basedOn w:val="830"/>
+    <w:basedOn w:val="833"/>
     <w:uiPriority w:val="99"/>
     <w:pPr>
       <w:pBdr/>
@@ -21762,9 +22321,9 @@
       </w:tcPr>
     </w:tblStylePr>
   </w:style>
-  <w:style w:type="table" w:styleId="758">
+  <w:style w:type="table" w:styleId="761">
     <w:name w:val="List Table 3 - Accent 3"/>
-    <w:basedOn w:val="830"/>
+    <w:basedOn w:val="833"/>
     <w:uiPriority w:val="99"/>
     <w:pPr>
       <w:pBdr/>
@@ -21990,9 +22549,9 @@
       </w:tcPr>
     </w:tblStylePr>
   </w:style>
-  <w:style w:type="table" w:styleId="759">
+  <w:style w:type="table" w:styleId="762">
     <w:name w:val="List Table 3 - Accent 4"/>
-    <w:basedOn w:val="830"/>
+    <w:basedOn w:val="833"/>
     <w:uiPriority w:val="99"/>
     <w:pPr>
       <w:pBdr/>
@@ -22218,9 +22777,9 @@
       </w:tcPr>
     </w:tblStylePr>
   </w:style>
-  <w:style w:type="table" w:styleId="760">
+  <w:style w:type="table" w:styleId="763">
     <w:name w:val="List Table 3 - Accent 5"/>
-    <w:basedOn w:val="830"/>
+    <w:basedOn w:val="833"/>
     <w:uiPriority w:val="99"/>
     <w:pPr>
       <w:pBdr/>
@@ -22446,9 +23005,9 @@
       </w:tcPr>
     </w:tblStylePr>
   </w:style>
-  <w:style w:type="table" w:styleId="761">
+  <w:style w:type="table" w:styleId="764">
     <w:name w:val="List Table 3 - Accent 6"/>
-    <w:basedOn w:val="830"/>
+    <w:basedOn w:val="833"/>
     <w:uiPriority w:val="99"/>
     <w:pPr>
       <w:pBdr/>
@@ -22674,9 +23233,9 @@
       </w:tcPr>
     </w:tblStylePr>
   </w:style>
-  <w:style w:type="table" w:styleId="762">
+  <w:style w:type="table" w:styleId="765">
     <w:name w:val="List Table 4"/>
-    <w:basedOn w:val="830"/>
+    <w:basedOn w:val="833"/>
     <w:uiPriority w:val="99"/>
     <w:pPr>
       <w:pBdr/>
@@ -22899,9 +23458,9 @@
       </w:tcPr>
     </w:tblStylePr>
   </w:style>
-  <w:style w:type="table" w:styleId="763">
+  <w:style w:type="table" w:styleId="766">
     <w:name w:val="List Table 4 - Accent 1"/>
-    <w:basedOn w:val="830"/>
+    <w:basedOn w:val="833"/>
     <w:uiPriority w:val="99"/>
     <w:pPr>
       <w:pBdr/>
@@ -23124,9 +23683,9 @@
       </w:tcPr>
     </w:tblStylePr>
   </w:style>
-  <w:style w:type="table" w:styleId="764">
+  <w:style w:type="table" w:styleId="767">
     <w:name w:val="List Table 4 - Accent 2"/>
-    <w:basedOn w:val="830"/>
+    <w:basedOn w:val="833"/>
     <w:uiPriority w:val="99"/>
     <w:pPr>
       <w:pBdr/>
@@ -23349,9 +23908,9 @@
       </w:tcPr>
     </w:tblStylePr>
   </w:style>
-  <w:style w:type="table" w:styleId="765">
+  <w:style w:type="table" w:styleId="768">
     <w:name w:val="List Table 4 - Accent 3"/>
-    <w:basedOn w:val="830"/>
+    <w:basedOn w:val="833"/>
     <w:uiPriority w:val="99"/>
     <w:pPr>
       <w:pBdr/>
@@ -23574,9 +24133,9 @@
       </w:tcPr>
     </w:tblStylePr>
   </w:style>
-  <w:style w:type="table" w:styleId="766">
+  <w:style w:type="table" w:styleId="769">
     <w:name w:val="List Table 4 - Accent 4"/>
-    <w:basedOn w:val="830"/>
+    <w:basedOn w:val="833"/>
     <w:uiPriority w:val="99"/>
     <w:pPr>
       <w:pBdr/>
@@ -23799,9 +24358,9 @@
       </w:tcPr>
     </w:tblStylePr>
   </w:style>
-  <w:style w:type="table" w:styleId="767">
+  <w:style w:type="table" w:styleId="770">
     <w:name w:val="List Table 4 - Accent 5"/>
-    <w:basedOn w:val="830"/>
+    <w:basedOn w:val="833"/>
     <w:uiPriority w:val="99"/>
     <w:pPr>
       <w:pBdr/>
@@ -24024,9 +24583,9 @@
       </w:tcPr>
     </w:tblStylePr>
   </w:style>
-  <w:style w:type="table" w:styleId="768">
+  <w:style w:type="table" w:styleId="771">
     <w:name w:val="List Table 4 - Accent 6"/>
-    <w:basedOn w:val="830"/>
+    <w:basedOn w:val="833"/>
     <w:uiPriority w:val="99"/>
     <w:pPr>
       <w:pBdr/>
@@ -24249,9 +24808,9 @@
       </w:tcPr>
     </w:tblStylePr>
   </w:style>
-  <w:style w:type="table" w:styleId="769">
+  <w:style w:type="table" w:styleId="772">
     <w:name w:val="List Table 5 Dark"/>
-    <w:basedOn w:val="830"/>
+    <w:basedOn w:val="833"/>
     <w:uiPriority w:val="99"/>
     <w:pPr>
       <w:pBdr/>
@@ -24491,9 +25050,9 @@
       </w:tcPr>
     </w:tblStylePr>
   </w:style>
-  <w:style w:type="table" w:styleId="770">
+  <w:style w:type="table" w:styleId="773">
     <w:name w:val="List Table 5 Dark - Accent 1"/>
-    <w:basedOn w:val="830"/>
+    <w:basedOn w:val="833"/>
     <w:uiPriority w:val="99"/>
     <w:pPr>
       <w:pBdr/>
@@ -24733,9 +25292,9 @@
       </w:tcPr>
     </w:tblStylePr>
   </w:style>
-  <w:style w:type="table" w:styleId="771">
+  <w:style w:type="table" w:styleId="774">
     <w:name w:val="List Table 5 Dark - Accent 2"/>
-    <w:basedOn w:val="830"/>
+    <w:basedOn w:val="833"/>
     <w:uiPriority w:val="99"/>
     <w:pPr>
       <w:pBdr/>
@@ -24975,9 +25534,9 @@
       </w:tcPr>
     </w:tblStylePr>
   </w:style>
-  <w:style w:type="table" w:styleId="772">
+  <w:style w:type="table" w:styleId="775">
     <w:name w:val="List Table 5 Dark - Accent 3"/>
-    <w:basedOn w:val="830"/>
+    <w:basedOn w:val="833"/>
     <w:uiPriority w:val="99"/>
     <w:pPr>
       <w:pBdr/>
@@ -25217,9 +25776,9 @@
       </w:tcPr>
     </w:tblStylePr>
   </w:style>
-  <w:style w:type="table" w:styleId="773">
+  <w:style w:type="table" w:styleId="776">
     <w:name w:val="List Table 5 Dark - Accent 4"/>
-    <w:basedOn w:val="830"/>
+    <w:basedOn w:val="833"/>
     <w:uiPriority w:val="99"/>
     <w:pPr>
       <w:pBdr/>
@@ -25459,9 +26018,9 @@
       </w:tcPr>
     </w:tblStylePr>
   </w:style>
-  <w:style w:type="table" w:styleId="774">
+  <w:style w:type="table" w:styleId="777">
     <w:name w:val="List Table 5 Dark - Accent 5"/>
-    <w:basedOn w:val="830"/>
+    <w:basedOn w:val="833"/>
     <w:uiPriority w:val="99"/>
     <w:pPr>
       <w:pBdr/>
@@ -25701,9 +26260,9 @@
       </w:tcPr>
     </w:tblStylePr>
   </w:style>
-  <w:style w:type="table" w:styleId="775">
+  <w:style w:type="table" w:styleId="778">
     <w:name w:val="List Table 5 Dark - Accent 6"/>
-    <w:basedOn w:val="830"/>
+    <w:basedOn w:val="833"/>
     <w:uiPriority w:val="99"/>
     <w:pPr>
       <w:pBdr/>
@@ -25943,9 +26502,9 @@
       </w:tcPr>
     </w:tblStylePr>
   </w:style>
-  <w:style w:type="table" w:styleId="776">
+  <w:style w:type="table" w:styleId="779">
     <w:name w:val="List Table 6 Colorful"/>
-    <w:basedOn w:val="830"/>
+    <w:basedOn w:val="833"/>
     <w:uiPriority w:val="99"/>
     <w:pPr>
       <w:pBdr/>
@@ -26166,9 +26725,9 @@
       </w:tcPr>
     </w:tblStylePr>
   </w:style>
-  <w:style w:type="table" w:styleId="777">
+  <w:style w:type="table" w:styleId="780">
     <w:name w:val="List Table 6 Colorful - Accent 1"/>
-    <w:basedOn w:val="830"/>
+    <w:basedOn w:val="833"/>
     <w:uiPriority w:val="99"/>
     <w:pPr>
       <w:pBdr/>
@@ -26389,9 +26948,9 @@
       </w:tcPr>
     </w:tblStylePr>
   </w:style>
-  <w:style w:type="table" w:styleId="778">
+  <w:style w:type="table" w:styleId="781">
     <w:name w:val="List Table 6 Colorful - Accent 2"/>
-    <w:basedOn w:val="830"/>
+    <w:basedOn w:val="833"/>
     <w:uiPriority w:val="99"/>
     <w:pPr>
       <w:pBdr/>
@@ -26612,9 +27171,9 @@
       </w:tcPr>
     </w:tblStylePr>
   </w:style>
-  <w:style w:type="table" w:styleId="779">
+  <w:style w:type="table" w:styleId="782">
     <w:name w:val="List Table 6 Colorful - Accent 3"/>
-    <w:basedOn w:val="830"/>
+    <w:basedOn w:val="833"/>
     <w:uiPriority w:val="99"/>
     <w:pPr>
       <w:pBdr/>
@@ -26835,9 +27394,9 @@
       </w:tcPr>
     </w:tblStylePr>
   </w:style>
-  <w:style w:type="table" w:styleId="780">
+  <w:style w:type="table" w:styleId="783">
     <w:name w:val="List Table 6 Colorful - Accent 4"/>
-    <w:basedOn w:val="830"/>
+    <w:basedOn w:val="833"/>
     <w:uiPriority w:val="99"/>
     <w:pPr>
       <w:pBdr/>
@@ -27058,9 +27617,9 @@
       </w:tcPr>
     </w:tblStylePr>
   </w:style>
-  <w:style w:type="table" w:styleId="781">
+  <w:style w:type="table" w:styleId="784">
     <w:name w:val="List Table 6 Colorful - Accent 5"/>
-    <w:basedOn w:val="830"/>
+    <w:basedOn w:val="833"/>
     <w:uiPriority w:val="99"/>
     <w:pPr>
       <w:pBdr/>
@@ -27281,9 +27840,9 @@
       </w:tcPr>
     </w:tblStylePr>
   </w:style>
-  <w:style w:type="table" w:styleId="782">
+  <w:style w:type="table" w:styleId="785">
     <w:name w:val="List Table 6 Colorful - Accent 6"/>
-    <w:basedOn w:val="830"/>
+    <w:basedOn w:val="833"/>
     <w:uiPriority w:val="99"/>
     <w:pPr>
       <w:pBdr/>
@@ -27504,9 +28063,9 @@
       </w:tcPr>
     </w:tblStylePr>
   </w:style>
-  <w:style w:type="table" w:styleId="783">
+  <w:style w:type="table" w:styleId="786">
     <w:name w:val="List Table 7 Colorful"/>
-    <w:basedOn w:val="830"/>
+    <w:basedOn w:val="833"/>
     <w:uiPriority w:val="99"/>
     <w:pPr>
       <w:pBdr/>
@@ -27760,9 +28319,9 @@
       </w:tcPr>
     </w:tblStylePr>
   </w:style>
-  <w:style w:type="table" w:styleId="784">
+  <w:style w:type="table" w:styleId="787">
     <w:name w:val="List Table 7 Colorful - Accent 1"/>
-    <w:basedOn w:val="830"/>
+    <w:basedOn w:val="833"/>
     <w:uiPriority w:val="99"/>
     <w:pPr>
       <w:pBdr/>
@@ -28016,9 +28575,9 @@
       </w:tcPr>
     </w:tblStylePr>
   </w:style>
-  <w:style w:type="table" w:styleId="785">
+  <w:style w:type="table" w:styleId="788">
     <w:name w:val="List Table 7 Colorful - Accent 2"/>
-    <w:basedOn w:val="830"/>
+    <w:basedOn w:val="833"/>
     <w:uiPriority w:val="99"/>
     <w:pPr>
       <w:pBdr/>
@@ -28272,9 +28831,9 @@
       </w:tcPr>
     </w:tblStylePr>
   </w:style>
-  <w:style w:type="table" w:styleId="786">
+  <w:style w:type="table" w:styleId="789">
     <w:name w:val="List Table 7 Colorful - Accent 3"/>
-    <w:basedOn w:val="830"/>
+    <w:basedOn w:val="833"/>
     <w:uiPriority w:val="99"/>
     <w:pPr>
       <w:pBdr/>
@@ -28528,9 +29087,9 @@
       </w:tcPr>
     </w:tblStylePr>
   </w:style>
-  <w:style w:type="table" w:styleId="787">
+  <w:style w:type="table" w:styleId="790">
     <w:name w:val="List Table 7 Colorful - Accent 4"/>
-    <w:basedOn w:val="830"/>
+    <w:basedOn w:val="833"/>
     <w:uiPriority w:val="99"/>
     <w:pPr>
       <w:pBdr/>
@@ -28784,9 +29343,9 @@
       </w:tcPr>
     </w:tblStylePr>
   </w:style>
-  <w:style w:type="table" w:styleId="788">
+  <w:style w:type="table" w:styleId="791">
     <w:name w:val="List Table 7 Colorful - Accent 5"/>
-    <w:basedOn w:val="830"/>
+    <w:basedOn w:val="833"/>
     <w:uiPriority w:val="99"/>
     <w:pPr>
       <w:pBdr/>
@@ -29040,9 +29599,9 @@
       </w:tcPr>
     </w:tblStylePr>
   </w:style>
-  <w:style w:type="table" w:styleId="789">
+  <w:style w:type="table" w:styleId="792">
     <w:name w:val="List Table 7 Colorful - Accent 6"/>
-    <w:basedOn w:val="830"/>
+    <w:basedOn w:val="833"/>
     <w:uiPriority w:val="99"/>
     <w:pPr>
       <w:pBdr/>
@@ -29296,9 +29855,9 @@
       </w:tcPr>
     </w:tblStylePr>
   </w:style>
-  <w:style w:type="table" w:styleId="790">
+  <w:style w:type="table" w:styleId="793">
     <w:name w:val="Lined - Accent"/>
-    <w:basedOn w:val="830"/>
+    <w:basedOn w:val="833"/>
     <w:uiPriority w:val="99"/>
     <w:pPr>
       <w:pBdr/>
@@ -29533,9 +30092,9 @@
       </w:tcPr>
     </w:tblStylePr>
   </w:style>
-  <w:style w:type="table" w:styleId="791">
+  <w:style w:type="table" w:styleId="794">
     <w:name w:val="Lined - Accent 1"/>
-    <w:basedOn w:val="830"/>
+    <w:basedOn w:val="833"/>
     <w:uiPriority w:val="99"/>
     <w:pPr>
       <w:pBdr/>
@@ -29770,9 +30329,9 @@
       </w:tcPr>
     </w:tblStylePr>
   </w:style>
-  <w:style w:type="table" w:styleId="792">
+  <w:style w:type="table" w:styleId="795">
     <w:name w:val="Lined - Accent 2"/>
-    <w:basedOn w:val="830"/>
+    <w:basedOn w:val="833"/>
     <w:uiPriority w:val="99"/>
     <w:pPr>
       <w:pBdr/>
@@ -30007,9 +30566,9 @@
       </w:tcPr>
     </w:tblStylePr>
   </w:style>
-  <w:style w:type="table" w:styleId="793">
+  <w:style w:type="table" w:styleId="796">
     <w:name w:val="Lined - Accent 3"/>
-    <w:basedOn w:val="830"/>
+    <w:basedOn w:val="833"/>
     <w:uiPriority w:val="99"/>
     <w:pPr>
       <w:pBdr/>
@@ -30244,9 +30803,9 @@
       </w:tcPr>
     </w:tblStylePr>
   </w:style>
-  <w:style w:type="table" w:styleId="794">
+  <w:style w:type="table" w:styleId="797">
     <w:name w:val="Lined - Accent 4"/>
-    <w:basedOn w:val="830"/>
+    <w:basedOn w:val="833"/>
     <w:uiPriority w:val="99"/>
     <w:pPr>
       <w:pBdr/>
@@ -30481,9 +31040,9 @@
       </w:tcPr>
     </w:tblStylePr>
   </w:style>
-  <w:style w:type="table" w:styleId="795">
+  <w:style w:type="table" w:styleId="798">
     <w:name w:val="Lined - Accent 5"/>
-    <w:basedOn w:val="830"/>
+    <w:basedOn w:val="833"/>
     <w:uiPriority w:val="99"/>
     <w:pPr>
       <w:pBdr/>
@@ -30718,9 +31277,9 @@
       </w:tcPr>
     </w:tblStylePr>
   </w:style>
-  <w:style w:type="table" w:styleId="796">
+  <w:style w:type="table" w:styleId="799">
     <w:name w:val="Lined - Accent 6"/>
-    <w:basedOn w:val="830"/>
+    <w:basedOn w:val="833"/>
     <w:uiPriority w:val="99"/>
     <w:pPr>
       <w:pBdr/>
@@ -30955,9 +31514,9 @@
       </w:tcPr>
     </w:tblStylePr>
   </w:style>
-  <w:style w:type="table" w:styleId="797">
+  <w:style w:type="table" w:styleId="800">
     <w:name w:val="Bordered &amp; Lined - Accent"/>
-    <w:basedOn w:val="830"/>
+    <w:basedOn w:val="833"/>
     <w:uiPriority w:val="99"/>
     <w:pPr>
       <w:pBdr/>
@@ -31199,9 +31758,9 @@
       </w:tcPr>
     </w:tblStylePr>
   </w:style>
-  <w:style w:type="table" w:styleId="798">
+  <w:style w:type="table" w:styleId="801">
     <w:name w:val="Bordered &amp; Lined - Accent 1"/>
-    <w:basedOn w:val="830"/>
+    <w:basedOn w:val="833"/>
     <w:uiPriority w:val="99"/>
     <w:pPr>
       <w:pBdr/>
@@ -31443,9 +32002,9 @@
       </w:tcPr>
     </w:tblStylePr>
   </w:style>
-  <w:style w:type="table" w:styleId="799">
+  <w:style w:type="table" w:styleId="802">
     <w:name w:val="Bordered &amp; Lined - Accent 2"/>
-    <w:basedOn w:val="830"/>
+    <w:basedOn w:val="833"/>
     <w:uiPriority w:val="99"/>
     <w:pPr>
       <w:pBdr/>
@@ -31687,9 +32246,9 @@
       </w:tcPr>
     </w:tblStylePr>
   </w:style>
-  <w:style w:type="table" w:styleId="800">
+  <w:style w:type="table" w:styleId="803">
     <w:name w:val="Bordered &amp; Lined - Accent 3"/>
-    <w:basedOn w:val="830"/>
+    <w:basedOn w:val="833"/>
     <w:uiPriority w:val="99"/>
     <w:pPr>
       <w:pBdr/>
@@ -31931,9 +32490,9 @@
       </w:tcPr>
     </w:tblStylePr>
   </w:style>
-  <w:style w:type="table" w:styleId="801">
+  <w:style w:type="table" w:styleId="804">
     <w:name w:val="Bordered &amp; Lined - Accent 4"/>
-    <w:basedOn w:val="830"/>
+    <w:basedOn w:val="833"/>
     <w:uiPriority w:val="99"/>
     <w:pPr>
       <w:pBdr/>
@@ -32175,9 +32734,9 @@
       </w:tcPr>
     </w:tblStylePr>
   </w:style>
-  <w:style w:type="table" w:styleId="802">
+  <w:style w:type="table" w:styleId="805">
     <w:name w:val="Bordered &amp; Lined - Accent 5"/>
-    <w:basedOn w:val="830"/>
+    <w:basedOn w:val="833"/>
     <w:uiPriority w:val="99"/>
     <w:pPr>
       <w:pBdr/>
@@ -32419,9 +32978,9 @@
       </w:tcPr>
     </w:tblStylePr>
   </w:style>
-  <w:style w:type="table" w:styleId="803">
+  <w:style w:type="table" w:styleId="806">
     <w:name w:val="Bordered &amp; Lined - Accent 6"/>
-    <w:basedOn w:val="830"/>
+    <w:basedOn w:val="833"/>
     <w:uiPriority w:val="99"/>
     <w:pPr>
       <w:pBdr/>
@@ -32663,9 +33222,9 @@
       </w:tcPr>
     </w:tblStylePr>
   </w:style>
-  <w:style w:type="table" w:styleId="804">
+  <w:style w:type="table" w:styleId="807">
     <w:name w:val="Bordered"/>
-    <w:basedOn w:val="830"/>
+    <w:basedOn w:val="833"/>
     <w:uiPriority w:val="99"/>
     <w:pPr>
       <w:pBdr/>
@@ -32894,9 +33453,9 @@
       </w:tcPr>
     </w:tblStylePr>
   </w:style>
-  <w:style w:type="table" w:styleId="805">
+  <w:style w:type="table" w:styleId="808">
     <w:name w:val="Bordered - Accent 1"/>
-    <w:basedOn w:val="830"/>
+    <w:basedOn w:val="833"/>
     <w:uiPriority w:val="99"/>
     <w:pPr>
       <w:pBdr/>
@@ -33125,9 +33684,9 @@
       </w:tcPr>
     </w:tblStylePr>
   </w:style>
-  <w:style w:type="table" w:styleId="806">
+  <w:style w:type="table" w:styleId="809">
     <w:name w:val="Bordered - Accent 2"/>
-    <w:basedOn w:val="830"/>
+    <w:basedOn w:val="833"/>
     <w:uiPriority w:val="99"/>
     <w:pPr>
       <w:pBdr/>
@@ -33356,9 +33915,9 @@
       </w:tcPr>
     </w:tblStylePr>
   </w:style>
-  <w:style w:type="table" w:styleId="807">
+  <w:style w:type="table" w:styleId="810">
     <w:name w:val="Bordered - Accent 3"/>
-    <w:basedOn w:val="830"/>
+    <w:basedOn w:val="833"/>
     <w:uiPriority w:val="99"/>
     <w:pPr>
       <w:pBdr/>
@@ -33587,9 +34146,9 @@
       </w:tcPr>
     </w:tblStylePr>
   </w:style>
-  <w:style w:type="table" w:styleId="808">
+  <w:style w:type="table" w:styleId="811">
     <w:name w:val="Bordered - Accent 4"/>
-    <w:basedOn w:val="830"/>
+    <w:basedOn w:val="833"/>
     <w:uiPriority w:val="99"/>
     <w:pPr>
       <w:pBdr/>
@@ -33818,9 +34377,9 @@
       </w:tcPr>
     </w:tblStylePr>
   </w:style>
-  <w:style w:type="table" w:styleId="809">
+  <w:style w:type="table" w:styleId="812">
     <w:name w:val="Bordered - Accent 5"/>
-    <w:basedOn w:val="830"/>
+    <w:basedOn w:val="833"/>
     <w:uiPriority w:val="99"/>
     <w:pPr>
       <w:pBdr/>
@@ -34049,9 +34608,9 @@
       </w:tcPr>
     </w:tblStylePr>
   </w:style>
-  <w:style w:type="table" w:styleId="810">
+  <w:style w:type="table" w:styleId="813">
     <w:name w:val="Bordered - Accent 6"/>
-    <w:basedOn w:val="830"/>
+    <w:basedOn w:val="833"/>
     <w:uiPriority w:val="99"/>
     <w:pPr>
       <w:pBdr/>
@@ -34280,7 +34839,7 @@
       </w:tcPr>
     </w:tblStylePr>
   </w:style>
-  <w:style w:type="character" w:styleId="811">
+  <w:style w:type="character" w:styleId="814">
     <w:name w:val="Hyperlink"/>
     <w:uiPriority w:val="99"/>
     <w:unhideWhenUsed/>
@@ -34294,10 +34853,10 @@
       <w:u w:val="single"/>
     </w:rPr>
   </w:style>
-  <w:style w:type="paragraph" w:styleId="812">
+  <w:style w:type="paragraph" w:styleId="815">
     <w:name w:val="footnote text"/>
-    <w:basedOn w:val="829"/>
-    <w:link w:val="813"/>
+    <w:basedOn w:val="832"/>
+    <w:link w:val="816"/>
     <w:uiPriority w:val="99"/>
     <w:semiHidden/>
     <w:unhideWhenUsed/>
@@ -34310,9 +34869,9 @@
       <w:sz w:val="18"/>
     </w:rPr>
   </w:style>
-  <w:style w:type="character" w:styleId="813">
+  <w:style w:type="character" w:styleId="816">
     <w:name w:val="Footnote Text Char"/>
-    <w:link w:val="812"/>
+    <w:link w:val="815"/>
     <w:uiPriority w:val="99"/>
     <w:pPr>
       <w:pBdr/>
@@ -34323,7 +34882,7 @@
       <w:sz w:val="18"/>
     </w:rPr>
   </w:style>
-  <w:style w:type="character" w:styleId="814">
+  <w:style w:type="character" w:styleId="817">
     <w:name w:val="footnote reference"/>
     <w:uiPriority w:val="99"/>
     <w:unhideWhenUsed/>
@@ -34336,10 +34895,10 @@
       <w:vertAlign w:val="superscript"/>
     </w:rPr>
   </w:style>
-  <w:style w:type="paragraph" w:styleId="815">
+  <w:style w:type="paragraph" w:styleId="818">
     <w:name w:val="endnote text"/>
-    <w:basedOn w:val="829"/>
-    <w:link w:val="816"/>
+    <w:basedOn w:val="832"/>
+    <w:link w:val="819"/>
     <w:uiPriority w:val="99"/>
     <w:semiHidden/>
     <w:unhideWhenUsed/>
@@ -34352,9 +34911,9 @@
       <w:sz w:val="20"/>
     </w:rPr>
   </w:style>
-  <w:style w:type="character" w:styleId="816">
+  <w:style w:type="character" w:styleId="819">
     <w:name w:val="Endnote Text Char"/>
-    <w:link w:val="815"/>
+    <w:link w:val="818"/>
     <w:uiPriority w:val="99"/>
     <w:pPr>
       <w:pBdr/>
@@ -34365,7 +34924,7 @@
       <w:sz w:val="20"/>
     </w:rPr>
   </w:style>
-  <w:style w:type="character" w:styleId="817">
+  <w:style w:type="character" w:styleId="820">
     <w:name w:val="endnote reference"/>
     <w:uiPriority w:val="99"/>
     <w:semiHidden/>
@@ -34379,10 +34938,10 @@
       <w:vertAlign w:val="superscript"/>
     </w:rPr>
   </w:style>
-  <w:style w:type="paragraph" w:styleId="818">
+  <w:style w:type="paragraph" w:styleId="821">
     <w:name w:val="toc 1"/>
-    <w:basedOn w:val="829"/>
-    <w:next w:val="829"/>
+    <w:basedOn w:val="832"/>
+    <w:next w:val="832"/>
     <w:uiPriority w:val="39"/>
     <w:unhideWhenUsed/>
     <w:pPr>
@@ -34391,10 +34950,10 @@
       <w:ind w:right="0" w:firstLine="0" w:left="0"/>
     </w:pPr>
   </w:style>
-  <w:style w:type="paragraph" w:styleId="819">
+  <w:style w:type="paragraph" w:styleId="822">
     <w:name w:val="toc 2"/>
-    <w:basedOn w:val="829"/>
-    <w:next w:val="829"/>
+    <w:basedOn w:val="832"/>
+    <w:next w:val="832"/>
     <w:uiPriority w:val="39"/>
     <w:unhideWhenUsed/>
     <w:pPr>
@@ -34403,10 +34962,10 @@
       <w:ind w:right="0" w:firstLine="0" w:left="283"/>
     </w:pPr>
   </w:style>
-  <w:style w:type="paragraph" w:styleId="820">
+  <w:style w:type="paragraph" w:styleId="823">
     <w:name w:val="toc 3"/>
-    <w:basedOn w:val="829"/>
-    <w:next w:val="829"/>
+    <w:basedOn w:val="832"/>
+    <w:next w:val="832"/>
     <w:uiPriority w:val="39"/>
     <w:unhideWhenUsed/>
     <w:pPr>
@@ -34415,10 +34974,10 @@
       <w:ind w:right="0" w:firstLine="0" w:left="567"/>
     </w:pPr>
   </w:style>
-  <w:style w:type="paragraph" w:styleId="821">
+  <w:style w:type="paragraph" w:styleId="824">
     <w:name w:val="toc 4"/>
-    <w:basedOn w:val="829"/>
-    <w:next w:val="829"/>
+    <w:basedOn w:val="832"/>
+    <w:next w:val="832"/>
     <w:uiPriority w:val="39"/>
     <w:unhideWhenUsed/>
     <w:pPr>
@@ -34427,10 +34986,10 @@
       <w:ind w:right="0" w:firstLine="0" w:left="850"/>
     </w:pPr>
   </w:style>
-  <w:style w:type="paragraph" w:styleId="822">
+  <w:style w:type="paragraph" w:styleId="825">
     <w:name w:val="toc 5"/>
-    <w:basedOn w:val="829"/>
-    <w:next w:val="829"/>
+    <w:basedOn w:val="832"/>
+    <w:next w:val="832"/>
     <w:uiPriority w:val="39"/>
     <w:unhideWhenUsed/>
     <w:pPr>
@@ -34439,10 +34998,10 @@
       <w:ind w:right="0" w:firstLine="0" w:left="1134"/>
     </w:pPr>
   </w:style>
-  <w:style w:type="paragraph" w:styleId="823">
+  <w:style w:type="paragraph" w:styleId="826">
     <w:name w:val="toc 6"/>
-    <w:basedOn w:val="829"/>
-    <w:next w:val="829"/>
+    <w:basedOn w:val="832"/>
+    <w:next w:val="832"/>
     <w:uiPriority w:val="39"/>
     <w:unhideWhenUsed/>
     <w:pPr>
@@ -34451,10 +35010,10 @@
       <w:ind w:right="0" w:firstLine="0" w:left="1417"/>
     </w:pPr>
   </w:style>
-  <w:style w:type="paragraph" w:styleId="824">
+  <w:style w:type="paragraph" w:styleId="827">
     <w:name w:val="toc 7"/>
-    <w:basedOn w:val="829"/>
-    <w:next w:val="829"/>
+    <w:basedOn w:val="832"/>
+    <w:next w:val="832"/>
     <w:uiPriority w:val="39"/>
     <w:unhideWhenUsed/>
     <w:pPr>
@@ -34463,10 +35022,10 @@
       <w:ind w:right="0" w:firstLine="0" w:left="1701"/>
     </w:pPr>
   </w:style>
-  <w:style w:type="paragraph" w:styleId="825">
+  <w:style w:type="paragraph" w:styleId="828">
     <w:name w:val="toc 8"/>
-    <w:basedOn w:val="829"/>
-    <w:next w:val="829"/>
+    <w:basedOn w:val="832"/>
+    <w:next w:val="832"/>
     <w:uiPriority w:val="39"/>
     <w:unhideWhenUsed/>
     <w:pPr>
@@ -34475,10 +35034,10 @@
       <w:ind w:right="0" w:firstLine="0" w:left="1984"/>
     </w:pPr>
   </w:style>
-  <w:style w:type="paragraph" w:styleId="826">
+  <w:style w:type="paragraph" w:styleId="829">
     <w:name w:val="toc 9"/>
-    <w:basedOn w:val="829"/>
-    <w:next w:val="829"/>
+    <w:basedOn w:val="832"/>
+    <w:next w:val="832"/>
     <w:uiPriority w:val="39"/>
     <w:unhideWhenUsed/>
     <w:pPr>
@@ -34487,7 +35046,7 @@
       <w:ind w:right="0" w:firstLine="0" w:left="2268"/>
     </w:pPr>
   </w:style>
-  <w:style w:type="paragraph" w:styleId="827">
+  <w:style w:type="paragraph" w:styleId="830">
     <w:name w:val="TOC Heading"/>
     <w:uiPriority w:val="39"/>
     <w:unhideWhenUsed/>
@@ -34497,10 +35056,10 @@
       <w:ind/>
     </w:pPr>
   </w:style>
-  <w:style w:type="paragraph" w:styleId="828">
+  <w:style w:type="paragraph" w:styleId="831">
     <w:name w:val="table of figures"/>
-    <w:basedOn w:val="829"/>
-    <w:next w:val="829"/>
+    <w:basedOn w:val="832"/>
+    <w:next w:val="832"/>
     <w:uiPriority w:val="99"/>
     <w:unhideWhenUsed/>
     <w:pPr>
@@ -34509,7 +35068,7 @@
       <w:ind/>
     </w:pPr>
   </w:style>
-  <w:style w:type="paragraph" w:styleId="829" w:default="1">
+  <w:style w:type="paragraph" w:styleId="832" w:default="1">
     <w:name w:val="Normal"/>
     <w:qFormat/>
     <w:pPr>
@@ -34518,7 +35077,7 @@
       <w:ind/>
     </w:pPr>
   </w:style>
-  <w:style w:type="table" w:styleId="830" w:default="1">
+  <w:style w:type="table" w:styleId="833" w:default="1">
     <w:name w:val="Normal Table"/>
     <w:uiPriority w:val="99"/>
     <w:semiHidden/>
@@ -34711,7 +35270,7 @@
       </w:tcPr>
     </w:tblStylePr>
   </w:style>
-  <w:style w:type="numbering" w:styleId="831" w:default="1">
+  <w:style w:type="numbering" w:styleId="834" w:default="1">
     <w:name w:val="No List"/>
     <w:uiPriority w:val="99"/>
     <w:semiHidden/>
@@ -34722,9 +35281,9 @@
       <w:ind/>
     </w:pPr>
   </w:style>
-  <w:style w:type="paragraph" w:styleId="832">
+  <w:style w:type="paragraph" w:styleId="835">
     <w:name w:val="No Spacing"/>
-    <w:basedOn w:val="829"/>
+    <w:basedOn w:val="832"/>
     <w:uiPriority w:val="1"/>
     <w:qFormat/>
     <w:pPr>
@@ -34733,9 +35292,9 @@
       <w:ind/>
     </w:pPr>
   </w:style>
-  <w:style w:type="paragraph" w:styleId="833">
+  <w:style w:type="paragraph" w:styleId="836">
     <w:name w:val="List Paragraph"/>
-    <w:basedOn w:val="829"/>
+    <w:basedOn w:val="832"/>
     <w:uiPriority w:val="34"/>
     <w:qFormat/>
     <w:pPr>
@@ -34745,7 +35304,7 @@
       <w:contextualSpacing w:val="true"/>
     </w:pPr>
   </w:style>
-  <w:style w:type="character" w:styleId="834" w:default="1">
+  <w:style w:type="character" w:styleId="837" w:default="1">
     <w:name w:val="Default Paragraph Font"/>
     <w:uiPriority w:val="1"/>
     <w:semiHidden/>

</xml_diff>

<commit_message>
fixed typo in design
</commit_message>
<xml_diff>
--- a/Design.docx
+++ b/Design.docx
@@ -2662,13 +2662,6 @@
               </m:r>
             </m:den>
           </m:f>
-          <m:r>
-            <w:rPr>
-              <w:rFonts w:ascii="Cambria Math" w:hAnsi="Cambria Math" w:eastAsia="Cambria Math" w:cs="Cambria Math"/>
-            </w:rPr>
-            <m:rPr/>
-            <m:t>}</m:t>
-          </m:r>
         </m:oMath>
       </m:oMathPara>
       <w:r>

</xml_diff>

<commit_message>
Nearly done with writing about horizonParsers, just need to finish explaining extractValue.
</commit_message>
<xml_diff>
--- a/Design.docx
+++ b/Design.docx
@@ -72,8 +72,8 @@
       <w:r>
         <w:rPr>
           <w:color w:val="5b9bd5" w:themeColor="accent1"/>
-          <w:sz w:val="36"/>
-          <w:szCs w:val="36"/>
+          <w:sz w:val="32"/>
+          <w:szCs w:val="32"/>
           <w:highlight w:val="none"/>
         </w:rPr>
       </w:r>
@@ -130,6 +130,151 @@
         <w:spacing/>
         <w:ind/>
         <w:rPr>
+          <w:color w:val="5b9bd5" w:themeColor="accent1"/>
+          <w:sz w:val="28"/>
+          <w:szCs w:val="28"/>
+          <w:highlight w:val="none"/>
+        </w:rPr>
+      </w:pPr>
+      <w:r>
+        <w:rPr>
+          <w:color w:val="5b9bd5" w:themeColor="accent1"/>
+          <w:sz w:val="28"/>
+          <w:szCs w:val="28"/>
+          <w:highlight w:val="none"/>
+        </w:rPr>
+        <w:t xml:space="preserve">horizonsParser</w:t>
+      </w:r>
+      <w:r>
+        <w:rPr>
+          <w:color w:val="5b9bd5" w:themeColor="accent1"/>
+          <w:sz w:val="28"/>
+          <w:szCs w:val="28"/>
+          <w:highlight w:val="none"/>
+        </w:rPr>
+      </w:r>
+      <w:r>
+        <w:rPr>
+          <w:color w:val="5b9bd5" w:themeColor="accent1"/>
+          <w:sz w:val="28"/>
+          <w:szCs w:val="28"/>
+          <w:highlight w:val="none"/>
+        </w:rPr>
+      </w:r>
+    </w:p>
+    <w:p>
+      <w:pPr>
+        <w:pBdr/>
+        <w:spacing/>
+        <w:ind/>
+        <w:rPr>
+          <w:color w:val="auto"/>
+          <w:sz w:val="22"/>
+          <w:szCs w:val="22"/>
+          <w:highlight w:val="none"/>
+        </w:rPr>
+      </w:pPr>
+      <w:r>
+        <w:rPr>
+          <w:color w:val="auto"/>
+          <w:sz w:val="22"/>
+          <w:szCs w:val="22"/>
+          <w:highlight w:val="none"/>
+        </w:rPr>
+        <w:t xml:space="preserve">I want my program to be accurate. That means the initial conditions of the planets should match their actual positions at the time of launch. The easiest way to do this is by fetching the initial conditions from a s</w:t>
+      </w:r>
+      <w:r>
+        <w:rPr>
+          <w:color w:val="auto"/>
+          <w:sz w:val="22"/>
+          <w:szCs w:val="22"/>
+          <w:highlight w:val="none"/>
+        </w:rPr>
+        <w:t xml:space="preserve">erver, and I have chosen NASA’s Horizons database as the place to fetch the values from because NASA is a reliable source of information, their servers have good uptime, and their API is easy to use (even if the data provided for it is horribly formatted.) Hence I will create a function, getEphemeris (ephemeris is the technical name of the kind of data that NASA provides) that fetches the required data and put it in a separate file so it can be imported as a module by the main program.</w:t>
+      </w:r>
+      <w:r>
+        <w:rPr>
+          <w:color w:val="auto"/>
+          <w:sz w:val="22"/>
+          <w:szCs w:val="22"/>
+          <w:highlight w:val="none"/>
+        </w:rPr>
+      </w:r>
+      <w:r>
+        <w:rPr>
+          <w:color w:val="auto"/>
+          <w:sz w:val="22"/>
+          <w:szCs w:val="22"/>
+          <w:highlight w:val="none"/>
+        </w:rPr>
+      </w:r>
+    </w:p>
+    <w:p>
+      <w:pPr>
+        <w:pBdr/>
+        <w:spacing/>
+        <w:ind/>
+        <w:rPr>
+          <w:color w:val="auto"/>
+          <w:sz w:val="22"/>
+          <w:szCs w:val="22"/>
+          <w:highlight w:val="none"/>
+        </w:rPr>
+      </w:pPr>
+      <w:r>
+        <w:rPr>
+          <w:color w:val="auto"/>
+          <w:sz w:val="22"/>
+          <w:szCs w:val="22"/>
+          <w:highlight w:val="none"/>
+        </w:rPr>
+        <w:t xml:space="preserve">To achieve this, the requests and datetime python modules will need to be imported. Requests is needed so that I can actually make a request, and datetime is needed to get the current date to put in the request.</w:t>
+      </w:r>
+      <w:r>
+        <w:rPr>
+          <w:color w:val="auto"/>
+          <w:sz w:val="22"/>
+          <w:szCs w:val="22"/>
+          <w:highlight w:val="none"/>
+        </w:rPr>
+      </w:r>
+    </w:p>
+    <w:p>
+      <w:pPr>
+        <w:pBdr/>
+        <w:spacing/>
+        <w:ind/>
+        <w:rPr>
+          <w:color w:val="auto"/>
+          <w:sz w:val="22"/>
+          <w:szCs w:val="22"/>
+          <w:highlight w:val="none"/>
+        </w:rPr>
+      </w:pPr>
+      <w:r>
+        <w:rPr>
+          <w:color w:val="auto"/>
+          <w:sz w:val="22"/>
+          <w:szCs w:val="22"/>
+          <w:highlight w:val="none"/>
+        </w:rPr>
+        <w:t xml:space="preserve">Also, NASA does not provide a useful format for their data. They do provide a json, but it only has one section which is just a bit of text containing the entire response. I have emailed them about fixing this but they did not reply. This means that to actually get values out of their ephemeris a lot of parsing must be done, which is the main reason this module exists.</w:t>
+      </w:r>
+      <w:r>
+        <w:rPr>
+          <w:color w:val="auto"/>
+          <w:sz w:val="22"/>
+          <w:szCs w:val="22"/>
+          <w:highlight w:val="none"/>
+        </w:rPr>
+      </w:r>
+    </w:p>
+    <w:p>
+      <w:pPr>
+        <w:pBdr/>
+        <w:spacing/>
+        <w:ind/>
+        <w:rPr>
           <w:color w:val="4472c4" w:themeColor="accent5"/>
           <w:sz w:val="28"/>
           <w:szCs w:val="28"/>
@@ -143,13 +288,13 @@
           <w:szCs w:val="28"/>
           <w:highlight w:val="none"/>
         </w:rPr>
-        <w:t xml:space="preserve">horizonsParser</w:t>
+        <w:t xml:space="preserve">getEphemeris</w:t>
       </w:r>
       <w:r>
         <w:rPr>
           <w:color w:val="4472c4" w:themeColor="accent5"/>
-          <w:sz w:val="24"/>
-          <w:szCs w:val="24"/>
+          <w:sz w:val="22"/>
+          <w:szCs w:val="22"/>
           <w:highlight w:val="none"/>
         </w:rPr>
       </w:r>
@@ -181,7 +326,7 @@
           <w:szCs w:val="22"/>
           <w:highlight w:val="none"/>
         </w:rPr>
-        <w:t xml:space="preserve">I want my program to be accurate. That means the initial conditions of the planets should match their actual positions at the time of launch. The easiest way to do this is by fetching the initial conditions from a s</w:t>
+        <w:t xml:space="preserve">The way getEphemeris will wor</w:t>
       </w:r>
       <w:r>
         <w:rPr>
@@ -190,7 +335,34 @@
           <w:szCs w:val="22"/>
           <w:highlight w:val="none"/>
         </w:rPr>
-        <w:t xml:space="preserve">erver, and I have chosen NASA’s Horizons database as the place to fetch the values from because NASA is a reliable source of information, their servers have good uptime, and their API is easy to use (even if the data provided for it is horribly formatted.)</w:t>
+        <w:t xml:space="preserve">k is by first getting the request from NASA’s database, and then iterating through the characters in the response searching for key phrases that indicate an attribute that I’m looking for (mass, position, velocity, radius). Once a key phrase is found, the </w:t>
+      </w:r>
+      <w:r>
+        <w:rPr>
+          <w:color w:val="auto"/>
+          <w:sz w:val="22"/>
+          <w:szCs w:val="22"/>
+          <w:highlight w:val="none"/>
+        </w:rPr>
+        <w:t xml:space="preserve">position of the key phrase, along with the text of the response, is given to a function called “extractValue” which extracts </w:t>
+      </w:r>
+      <w:r>
+        <w:rPr>
+          <w:color w:val="auto"/>
+          <w:sz w:val="22"/>
+          <w:szCs w:val="22"/>
+          <w:highlight w:val="none"/>
+        </w:rPr>
+        <w:t xml:space="preserve">the numeric value of said attribute and returns it. This repeats until all desired attributes are found and are returned in a list. This will be done by starting a counter once the key phrase for position is found (other attributes appear multiple times be</w:t>
+      </w:r>
+      <w:r>
+        <w:rPr>
+          <w:color w:val="auto"/>
+          <w:sz w:val="22"/>
+          <w:szCs w:val="22"/>
+          <w:highlight w:val="none"/>
+        </w:rPr>
+        <w:t xml:space="preserve">fore position in some ephemeris’s returned by NASA, but not other, so a counter used before then is not helpful) and breaking the for loop in the program once the counter is at 6 (i.e. all 3 coordinates for position and all 3 for velocity have been found.)</w:t>
       </w:r>
       <w:r>
         <w:rPr>
@@ -228,7 +400,7 @@
           <w:szCs w:val="22"/>
           <w:highlight w:val="none"/>
         </w:rPr>
-        <w:t xml:space="preserve">The way this program will wor</w:t>
+        <w:t xml:space="preserve">Here is a flowchart summarising this information:</w:t>
       </w:r>
       <w:r>
         <w:rPr>
@@ -237,7 +409,6 @@
           <w:szCs w:val="22"/>
           <w:highlight w:val="none"/>
         </w:rPr>
-        <w:t xml:space="preserve">k is by first getting the request from NASA’s database, and then iterating through the characters in the response searching for key phrases that indicate an attribute that I’m looking for (mass, position, velocity, radius). Once a key phrase is found, the </w:t>
       </w:r>
       <w:r>
         <w:rPr>
@@ -246,47 +417,7 @@
           <w:szCs w:val="22"/>
           <w:highlight w:val="none"/>
         </w:rPr>
-        <w:t xml:space="preserve">position of the key phrase, along with the text of the response, is given to a function called “extractValue” which extracts the numeric value of said attribute and returns it. This repeats until all desired attributes are found and are returned in a list. This will be done by starting a counter once the key phrase for position is found (other attributes appear multiple times before position in some ephemeris’s returned by NASA, but not other, so a counter used before then is not helpful) and breaking the for loop in the program once the counter is at 6 (i.e. all 3 coordinates for position and all 3 for velocity have been found.)</w:t>
-      </w:r>
-      <w:r>
-        <w:rPr>
-          <w:color w:val="auto"/>
-          <w:sz w:val="22"/>
-          <w:szCs w:val="22"/>
-          <w:highlight w:val="none"/>
-        </w:rPr>
-      </w:r>
-    </w:p>
-    <w:p>
-      <w:pPr>
-        <w:pBdr/>
-        <w:spacing/>
-        <w:ind/>
-        <w:rPr>
-          <w:color w:val="auto"/>
-          <w:sz w:val="22"/>
-          <w:szCs w:val="22"/>
-          <w:highlight w:val="none"/>
-        </w:rPr>
-      </w:pPr>
-      <w:r>
-        <w:rPr>
-          <w:color w:val="auto"/>
-          <w:sz w:val="22"/>
-          <w:szCs w:val="22"/>
-          <w:highlight w:val="none"/>
-        </w:rPr>
-        <w:t xml:space="preserve">Here is a flowchart summarising this information:</w:t>
-      </w:r>
-      <w:r>
-        <w:rPr>
-          <w:color w:val="auto"/>
-          <w:sz w:val="22"/>
-          <w:szCs w:val="22"/>
-          <w:highlight w:val="none"/>
-        </w:rPr>
-      </w:r>
-      <w:r/>
+      </w:r>
     </w:p>
     <w:p>
       <w:pPr>
@@ -328,7 +459,7 @@
                         <pic:nvPr/>
                       </pic:nvPicPr>
                       <pic:blipFill>
-                        <a:blip r:embed="rId9"/>
+                        <a:blip r:embed="rId10"/>
                         <a:stretch/>
                       </pic:blipFill>
                       <pic:spPr bwMode="auto">
@@ -368,7 +499,7 @@
                 <o:lock v:ext="edit" aspectratio="t"/>
               </v:shapetype>
               <v:shape id="_x0000_i0" o:spid="_x0000_s0" type="#_x0000_t75" style="width:467.75pt;height:336.20pt;mso-wrap-distance-left:0.00pt;mso-wrap-distance-top:0.00pt;mso-wrap-distance-right:0.00pt;mso-wrap-distance-bottom:0.00pt;z-index:1;" stroked="false">
-                <v:imagedata r:id="rId9" o:title=""/>
+                <v:imagedata r:id="rId10" o:title=""/>
                 <o:lock v:ext="edit" rotation="t"/>
               </v:shape>
             </w:pict>
@@ -383,6 +514,14 @@
           <w:highlight w:val="none"/>
         </w:rPr>
       </w:r>
+      <w:r>
+        <w:rPr>
+          <w:color w:val="auto"/>
+          <w:sz w:val="22"/>
+          <w:szCs w:val="22"/>
+          <w:highlight w:val="none"/>
+        </w:rPr>
+      </w:r>
     </w:p>
     <w:p>
       <w:pPr>
@@ -412,6 +551,14 @@
           <w:highlight w:val="none"/>
         </w:rPr>
       </w:r>
+      <w:r>
+        <w:rPr>
+          <w:color w:val="auto"/>
+          <w:sz w:val="22"/>
+          <w:szCs w:val="22"/>
+          <w:highlight w:val="none"/>
+        </w:rPr>
+      </w:r>
     </w:p>
     <w:p>
       <w:pPr>
@@ -457,8 +604,8 @@
         <w:ind/>
         <w:rPr>
           <w:color w:val="2f5496" w:themeColor="accent5" w:themeShade="BF"/>
-          <w:sz w:val="22"/>
-          <w:szCs w:val="18"/>
+          <w:sz w:val="24"/>
+          <w:szCs w:val="24"/>
           <w:highlight w:val="none"/>
         </w:rPr>
       </w:pPr>
@@ -482,8 +629,8 @@
       <w:r>
         <w:rPr>
           <w:color w:val="2f5496" w:themeColor="accent5" w:themeShade="BF"/>
-          <w:sz w:val="22"/>
-          <w:szCs w:val="18"/>
+          <w:sz w:val="24"/>
+          <w:szCs w:val="24"/>
           <w:highlight w:val="none"/>
         </w:rPr>
       </w:r>
@@ -494,12 +641,1327 @@
         <w:spacing/>
         <w:ind/>
         <w:rPr>
+          <w:color w:val="000000" w:themeColor="text1"/>
+          <w:sz w:val="22"/>
+          <w:szCs w:val="22"/>
+          <w:highlight w:val="none"/>
+        </w:rPr>
+      </w:pPr>
+      <w:r>
+        <w:rPr>
+          <w:color w:val="000000" w:themeColor="text1"/>
+          <w:sz w:val="22"/>
+          <w:szCs w:val="18"/>
+          <w:highlight w:val="none"/>
+        </w:rPr>
+        <w:t xml:space="preserve">getEphemeris will be given the target planet to get the request for. The first thing to do is to cast this target to a string, in case it’s been given in the form of a numerical ID, as the request format can only take strings.</w:t>
+      </w:r>
+      <w:r>
+        <w:rPr>
+          <w:color w:val="000000" w:themeColor="text1"/>
+          <w:sz w:val="22"/>
+          <w:szCs w:val="22"/>
+          <w:highlight w:val="none"/>
+        </w:rPr>
+      </w:r>
+    </w:p>
+    <w:p>
+      <w:pPr>
+        <w:pBdr/>
+        <w:spacing/>
+        <w:ind/>
+        <w:rPr>
+          <w:color w:val="000000" w:themeColor="text1"/>
+          <w:sz w:val="22"/>
+          <w:szCs w:val="22"/>
+          <w:highlight w:val="none"/>
+        </w:rPr>
+      </w:pPr>
+      <w:r>
+        <w:rPr>
+          <w:color w:val="000000" w:themeColor="text1"/>
+          <w:sz w:val="22"/>
+          <w:szCs w:val="18"/>
+          <w:highlight w:val="none"/>
+        </w:rPr>
+        <w:t xml:space="preserve">NASA then also requires a start and stop time for the ephemeris, as it has the capability to produce a list of coordinates for a planet over a time period. We just want the current position of the planet, but NASA does not let you make a request for just a single day, so I go with the shortest option available, the start time being the current day and the stop time being the day after. This will be found using datetime.datetime.now() from the datetime module. NASA requires the date to be in yyyy-mm-dd format, so I will format the date like this using .strftime() from the datetime module.</w:t>
+      </w:r>
+      <w:r>
+        <w:rPr>
+          <w:color w:val="000000" w:themeColor="text1"/>
+          <w:sz w:val="22"/>
+          <w:szCs w:val="18"/>
+          <w:highlight w:val="none"/>
+        </w:rPr>
+      </w:r>
+    </w:p>
+    <w:p>
+      <w:pPr>
+        <w:pBdr/>
+        <w:spacing/>
+        <w:ind/>
+        <w:rPr>
+          <w:color w:val="000000" w:themeColor="text1"/>
+          <w:sz w:val="22"/>
+          <w:szCs w:val="22"/>
+          <w:highlight w:val="none"/>
+        </w:rPr>
+      </w:pPr>
+      <w:r>
+        <w:rPr>
+          <w:color w:val="000000" w:themeColor="text1"/>
+          <w:sz w:val="22"/>
+          <w:szCs w:val="18"/>
+          <w:highlight w:val="none"/>
+        </w:rPr>
+        <w:t xml:space="preserve">This is all we need to make the request, as the rest of the parameters do not need to change and will be the same for every request. This is the request that I have settled on using after some trial and error:</w:t>
+      </w:r>
+      <w:r>
+        <w:rPr>
+          <w:color w:val="000000" w:themeColor="text1"/>
+          <w:sz w:val="22"/>
+          <w:szCs w:val="18"/>
+          <w:highlight w:val="none"/>
+        </w:rPr>
+      </w:r>
+      <w:r>
+        <w:rPr>
+          <w:color w:val="000000" w:themeColor="text1"/>
+          <w:sz w:val="22"/>
+          <w:szCs w:val="18"/>
+          <w:highlight w:val="none"/>
+        </w:rPr>
+      </w:r>
+      <w:r>
+        <w:rPr>
+          <w:color w:val="000000" w:themeColor="text1"/>
+          <w:sz w:val="20"/>
+          <w:szCs w:val="20"/>
+          <w:highlight w:val="none"/>
+        </w:rPr>
+      </w:r>
+      <w:r>
+        <w:rPr>
+          <w:color w:val="000000" w:themeColor="text1"/>
+          <w:sz w:val="22"/>
+          <w:szCs w:val="22"/>
+          <w:highlight w:val="none"/>
+        </w:rPr>
+      </w:r>
+    </w:p>
+    <w:p>
+      <w:pPr>
+        <w:pBdr/>
+        <w:spacing/>
+        <w:ind/>
+        <w:rPr>
+          <w:color w:val="000000" w:themeColor="text1"/>
+          <w:sz w:val="22"/>
+          <w:szCs w:val="22"/>
+          <w:highlight w:val="none"/>
+        </w:rPr>
+      </w:pPr>
+      <w:r>
+        <w:rPr>
+          <w:color w:val="000000" w:themeColor="text1"/>
+          <w:sz w:val="22"/>
+          <w:szCs w:val="18"/>
+          <w:highlight w:val="none"/>
+        </w:rPr>
+      </w:r>
+      <w:r>
+        <w:rPr>
+          <w:color w:val="000000" w:themeColor="text1"/>
+          <w:sz w:val="22"/>
+          <w:szCs w:val="18"/>
+          <w:highlight w:val="none"/>
+        </w:rPr>
+      </w:r>
+      <w:hyperlink r:id="rId11" w:tooltip="https://ssd.jpl.nasa.gov/api/horizons.api?format=text&amp;COMMAND='&quot;+target+&quot;'&amp;OBJ_DATA='YES'&amp;MAKE_EPHEM='YES'&amp;EPHEM_TYPE='VECTORS'&amp;START_TIME='&quot;+startTime+&quot;'&amp;STOP_TIME='&quot;+stopTime+&quot;'&amp;CENTER='500@0'&amp;STEP_SIZE='1 d'&amp;QUANTITIES='1,9,20,23,24,29'" w:history="1">
+        <w:r>
+          <w:rPr>
+            <w:rStyle w:val="814"/>
+            <w:color w:val="000000" w:themeColor="text1"/>
+            <w:sz w:val="22"/>
+            <w:szCs w:val="18"/>
+            <w:highlight w:val="none"/>
+          </w:rPr>
+          <w:t xml:space="preserve">https://ssd.jpl.nasa.gov/api/horizons.api?format=text&amp;COMMAND='"+target+"'&amp;OBJ_DATA='YES'&amp;MAKE_EPHEM='YES'&amp;EPHEM_TYPE='VECTORS'&amp;START_TIME='"+startTime+"'&amp;STOP_TIME='"+stopTime+"'&amp;CENTER='500@0'&amp;STEP_SIZE='1%20d'&amp;QUANTITIES=''’</w:t>
+        </w:r>
+        <w:r>
+          <w:rPr>
+            <w:rStyle w:val="814"/>
+            <w:color w:val="000000" w:themeColor="text1"/>
+            <w:sz w:val="22"/>
+            <w:szCs w:val="18"/>
+            <w:highlight w:val="none"/>
+          </w:rPr>
+        </w:r>
+        <w:r>
+          <w:rPr>
+            <w:rStyle w:val="814"/>
+            <w:color w:val="000000" w:themeColor="text1"/>
+            <w:sz w:val="22"/>
+            <w:szCs w:val="18"/>
+            <w:highlight w:val="none"/>
+          </w:rPr>
+        </w:r>
+      </w:hyperlink>
+      <w:r>
+        <w:rPr>
+          <w:color w:val="000000" w:themeColor="text1"/>
+          <w:sz w:val="22"/>
+          <w:szCs w:val="18"/>
+          <w:highlight w:val="none"/>
+        </w:rPr>
+      </w:r>
+    </w:p>
+    <w:p>
+      <w:pPr>
+        <w:pBdr/>
+        <w:spacing/>
+        <w:ind/>
+        <w:rPr>
+          <w:color w:val="000000" w:themeColor="text1"/>
+          <w:sz w:val="22"/>
+          <w:szCs w:val="22"/>
+          <w:highlight w:val="none"/>
+        </w:rPr>
+      </w:pPr>
+      <w:r>
+        <w:rPr>
+          <w:color w:val="000000" w:themeColor="text1"/>
+          <w:sz w:val="22"/>
+          <w:szCs w:val="22"/>
+          <w:highlight w:val="none"/>
+        </w:rPr>
+        <w:t xml:space="preserve">As you can see target, startTime and stopTime are inserted using string concatenation. Some other notable settings are:</w:t>
+      </w:r>
+      <w:r>
+        <w:rPr>
+          <w:color w:val="000000" w:themeColor="text1"/>
+          <w:sz w:val="22"/>
+          <w:szCs w:val="22"/>
+          <w:highlight w:val="none"/>
+        </w:rPr>
+      </w:r>
+    </w:p>
+    <w:p>
+      <w:pPr>
+        <w:pBdr/>
+        <w:spacing/>
+        <w:ind/>
+        <w:rPr>
+          <w:color w:val="000000" w:themeColor="text1"/>
+          <w:sz w:val="22"/>
+          <w:szCs w:val="22"/>
+          <w:highlight w:val="none"/>
+        </w:rPr>
+      </w:pPr>
+      <w:r>
+        <w:rPr>
+          <w:color w:val="000000" w:themeColor="text1"/>
+          <w:sz w:val="22"/>
+          <w:szCs w:val="22"/>
+          <w:highlight w:val="none"/>
+        </w:rPr>
+        <w:t xml:space="preserve">EPHEME_TYPE: This has multiple options. However the other options are all intended for uses not relevant to my program, e.g. making telescope observations or planning space missions to other planets. VECTORS is the type that NASA recommends for programming on their own site:</w:t>
+      </w:r>
+      <w:r>
+        <w:rPr>
+          <w:color w:val="000000" w:themeColor="text1"/>
+          <w:sz w:val="22"/>
+          <w:szCs w:val="22"/>
+          <w:highlight w:val="none"/>
+        </w:rPr>
+      </w:r>
+    </w:p>
+    <w:p>
+      <w:pPr>
+        <w:pBdr/>
+        <w:spacing/>
+        <w:ind/>
+        <w:rPr>
+          <w:color w:val="000000" w:themeColor="text1"/>
+          <w:sz w:val="22"/>
+          <w:szCs w:val="22"/>
+          <w:highlight w:val="none"/>
+        </w:rPr>
+      </w:pPr>
+      <w:r>
+        <w:rPr>
+          <w:color w:val="000000" w:themeColor="text1"/>
+          <w:sz w:val="22"/>
+          <w:szCs w:val="22"/>
+          <w:highlight w:val="none"/>
+        </w:rPr>
+      </w:r>
+      <w:r>
+        <w:rPr>
+          <w:color w:val="000000" w:themeColor="text1"/>
+          <w:sz w:val="22"/>
+          <w:szCs w:val="22"/>
+          <w:highlight w:val="none"/>
+        </w:rPr>
+      </w:r>
+      <w:hyperlink r:id="rId12" w:tooltip="https://ssd-api.jpl.nasa.gov/doc/horizons.html#ephem_type" w:history="1">
+        <w:r>
+          <w:rPr>
+            <w:rStyle w:val="814"/>
+            <w:color w:val="000000" w:themeColor="text1"/>
+            <w:sz w:val="22"/>
+            <w:szCs w:val="22"/>
+            <w:highlight w:val="none"/>
+          </w:rPr>
+          <w:t xml:space="preserve">https://ssd-api.jpl.nasa.gov/doc/horizons.html#ephem_type</w:t>
+        </w:r>
+        <w:r>
+          <w:rPr>
+            <w:rStyle w:val="814"/>
+            <w:color w:val="000000" w:themeColor="text1"/>
+            <w:sz w:val="22"/>
+            <w:szCs w:val="22"/>
+            <w:highlight w:val="none"/>
+          </w:rPr>
+        </w:r>
+        <w:r>
+          <w:rPr>
+            <w:rStyle w:val="814"/>
+            <w:color w:val="000000" w:themeColor="text1"/>
+            <w:sz w:val="22"/>
+            <w:szCs w:val="22"/>
+            <w:highlight w:val="none"/>
+          </w:rPr>
+        </w:r>
+      </w:hyperlink>
+      <w:r>
+        <w:rPr>
+          <w:color w:val="000000" w:themeColor="text1"/>
+          <w:sz w:val="22"/>
+          <w:szCs w:val="22"/>
+          <w:highlight w:val="none"/>
+        </w:rPr>
+      </w:r>
+    </w:p>
+    <w:p>
+      <w:pPr>
+        <w:pBdr/>
+        <w:spacing/>
+        <w:ind/>
+        <w:rPr>
+          <w:color w:val="000000" w:themeColor="text1"/>
+          <w:sz w:val="22"/>
+          <w:szCs w:val="22"/>
+          <w:highlight w:val="none"/>
+        </w:rPr>
+      </w:pPr>
+      <w:r>
+        <w:rPr>
+          <w:color w:val="000000" w:themeColor="text1"/>
+          <w:sz w:val="22"/>
+          <w:szCs w:val="22"/>
+          <w:highlight w:val="none"/>
+        </w:rPr>
+        <w:t xml:space="preserve">So it’s the one that I use.</w:t>
+      </w:r>
+      <w:r>
+        <w:rPr>
+          <w:color w:val="000000" w:themeColor="text1"/>
+          <w:sz w:val="22"/>
+          <w:szCs w:val="22"/>
+          <w:highlight w:val="none"/>
+        </w:rPr>
+      </w:r>
+    </w:p>
+    <w:p>
+      <w:pPr>
+        <w:pBdr/>
+        <w:spacing/>
+        <w:ind/>
+        <w:rPr>
+          <w:color w:val="000000" w:themeColor="text1"/>
+          <w:sz w:val="22"/>
+          <w:szCs w:val="22"/>
+          <w:highlight w:val="none"/>
+        </w:rPr>
+      </w:pPr>
+      <w:r>
+        <w:rPr>
+          <w:color w:val="000000" w:themeColor="text1"/>
+          <w:sz w:val="22"/>
+          <w:szCs w:val="22"/>
+          <w:highlight w:val="none"/>
+        </w:rPr>
+        <w:t xml:space="preserve">CENTER: This is the reference location for the coordinates returned by Ephemeris. 500@0 is the ID for the Solar Barycenter, the center of mass of the solar system. This is the most objective reference point available for our solar system, so is the one that I use.</w:t>
+      </w:r>
+      <w:r>
+        <w:rPr>
+          <w:color w:val="000000" w:themeColor="text1"/>
+          <w:sz w:val="22"/>
+          <w:szCs w:val="22"/>
+          <w:highlight w:val="none"/>
+        </w:rPr>
+      </w:r>
+    </w:p>
+    <w:p>
+      <w:pPr>
+        <w:pBdr/>
+        <w:spacing/>
+        <w:ind/>
+        <w:rPr>
+          <w:color w:val="000000" w:themeColor="text1"/>
+          <w:sz w:val="22"/>
+          <w:szCs w:val="22"/>
+          <w:highlight w:val="none"/>
+        </w:rPr>
+      </w:pPr>
+      <w:r>
+        <w:rPr>
+          <w:color w:val="000000" w:themeColor="text1"/>
+          <w:sz w:val="22"/>
+          <w:szCs w:val="22"/>
+          <w:highlight w:val="none"/>
+        </w:rPr>
+        <w:t xml:space="preserve">STEP_SIZE: This just means the ephemeris generates coordinates every day, this isn’t really relevant to the program as I’m only using the initial coordinates given in the response.</w:t>
+      </w:r>
+      <w:r>
+        <w:rPr>
+          <w:color w:val="000000" w:themeColor="text1"/>
+          <w:sz w:val="22"/>
+          <w:szCs w:val="22"/>
+          <w:highlight w:val="none"/>
+        </w:rPr>
+      </w:r>
+    </w:p>
+    <w:p>
+      <w:pPr>
+        <w:pBdr/>
+        <w:spacing/>
+        <w:ind/>
+        <w:rPr>
+          <w:color w:val="000000" w:themeColor="text1"/>
+          <w:sz w:val="22"/>
+          <w:szCs w:val="22"/>
+          <w:highlight w:val="none"/>
+        </w:rPr>
+      </w:pPr>
+      <w:r>
+        <w:rPr>
+          <w:color w:val="000000" w:themeColor="text1"/>
+          <w:sz w:val="22"/>
+          <w:szCs w:val="22"/>
+          <w:highlight w:val="none"/>
+        </w:rPr>
+        <w:t xml:space="preserve">QUANTITIES: This lets you request a bunch of very cool information, but none of it is needed by my program, so to make getting the requests faster and to reduce the size of the requests, it is set to be empty.</w:t>
+      </w:r>
+      <w:r>
+        <w:rPr>
+          <w:color w:val="000000" w:themeColor="text1"/>
+          <w:sz w:val="22"/>
+          <w:szCs w:val="22"/>
+          <w:highlight w:val="none"/>
+        </w:rPr>
+      </w:r>
+    </w:p>
+    <w:p>
+      <w:pPr>
+        <w:pBdr/>
+        <w:spacing/>
+        <w:ind/>
+        <w:rPr>
+          <w:color w:val="000000" w:themeColor="text1"/>
+          <w:sz w:val="22"/>
+          <w:szCs w:val="22"/>
+          <w:highlight w:val="none"/>
+        </w:rPr>
+      </w:pPr>
+      <w:r>
+        <w:rPr>
+          <w:color w:val="000000" w:themeColor="text1"/>
+          <w:sz w:val="22"/>
+          <w:szCs w:val="22"/>
+          <w:highlight w:val="none"/>
+        </w:rPr>
+        <w:t xml:space="preserve">Once we’ve got the request, I will assign it to the variable “response.” The text of the response can be accessed by doing response.text.</w:t>
+      </w:r>
+      <w:r>
+        <w:rPr>
+          <w:color w:val="000000" w:themeColor="text1"/>
+          <w:sz w:val="22"/>
+          <w:szCs w:val="22"/>
+          <w:highlight w:val="none"/>
+        </w:rPr>
+      </w:r>
+    </w:p>
+    <w:p>
+      <w:pPr>
+        <w:pBdr/>
+        <w:spacing/>
+        <w:ind/>
+        <w:rPr>
+          <w:color w:val="000000" w:themeColor="text1"/>
+          <w:sz w:val="22"/>
+          <w:szCs w:val="22"/>
+          <w:highlight w:val="none"/>
+        </w:rPr>
+      </w:pPr>
+      <w:r>
+        <w:rPr>
+          <w:color w:val="000000" w:themeColor="text1"/>
+          <w:sz w:val="22"/>
+          <w:szCs w:val="22"/>
+          <w:highlight w:val="none"/>
+        </w:rPr>
+      </w:r>
+      <w:r>
+        <w:rPr>
+          <w:color w:val="000000" w:themeColor="text1"/>
+          <w:sz w:val="22"/>
+          <w:szCs w:val="22"/>
+          <w:highlight w:val="none"/>
+        </w:rPr>
+      </w:r>
+    </w:p>
+    <w:p>
+      <w:pPr>
+        <w:pBdr/>
+        <w:spacing/>
+        <w:ind/>
+        <w:rPr>
+          <w:color w:val="2f5496" w:themeColor="accent5" w:themeShade="BF"/>
+          <w:sz w:val="24"/>
+          <w:szCs w:val="24"/>
+          <w:highlight w:val="none"/>
+        </w:rPr>
+      </w:pPr>
+      <w:r>
+        <w:rPr>
+          <w:color w:val="2f5496" w:themeColor="accent5" w:themeShade="BF"/>
+          <w:sz w:val="24"/>
+          <w:szCs w:val="20"/>
+          <w:highlight w:val="none"/>
+        </w:rPr>
+        <w:t xml:space="preserve">Parsing the request</w:t>
+      </w:r>
+      <w:r>
+        <w:rPr>
+          <w:color w:val="000000" w:themeColor="text1"/>
+          <w:sz w:val="22"/>
+          <w:szCs w:val="22"/>
+          <w:highlight w:val="none"/>
+        </w:rPr>
+      </w:r>
+      <w:r>
+        <w:rPr>
+          <w:color w:val="2f5496" w:themeColor="accent5" w:themeShade="BF"/>
+          <w:sz w:val="24"/>
+          <w:szCs w:val="24"/>
+          <w:highlight w:val="none"/>
+        </w:rPr>
+      </w:r>
+    </w:p>
+    <w:p>
+      <w:pPr>
+        <w:pBdr/>
+        <w:spacing/>
+        <w:ind/>
+        <w:rPr>
+          <w:color w:val="000000" w:themeColor="text1"/>
+          <w:sz w:val="22"/>
+          <w:szCs w:val="22"/>
+          <w:highlight w:val="none"/>
+        </w:rPr>
+      </w:pPr>
+      <w:r>
+        <w:rPr>
+          <w:color w:val="000000" w:themeColor="text1"/>
+          <w:sz w:val="22"/>
+          <w:szCs w:val="18"/>
+          <w:highlight w:val="none"/>
+        </w:rPr>
+        <w:t xml:space="preserve">We need 4 key attributes to create a planet, the size, mass, position and velocity. The way we will get these is by searching for key phrases in the ephemeris that signify that a numeric value for one of these attributes is about to appear. To make things easier to understand, here is a sample ephemeris for Earth:</w:t>
+      </w:r>
+      <w:r>
+        <w:rPr>
+          <w:color w:val="000000" w:themeColor="text1"/>
+          <w:sz w:val="22"/>
+          <w:szCs w:val="22"/>
+          <w:highlight w:val="none"/>
+        </w:rPr>
+      </w:r>
+    </w:p>
+    <w:p>
+      <w:pPr>
+        <w:pBdr/>
+        <w:spacing/>
+        <w:ind/>
+        <w:rPr>
+          <w:color w:val="000000" w:themeColor="text1"/>
+          <w:sz w:val="22"/>
+          <w:szCs w:val="22"/>
+          <w:highlight w:val="none"/>
+        </w:rPr>
+      </w:pPr>
+      <w:r>
+        <w:rPr>
+          <w:color w:val="000000" w:themeColor="text1"/>
+          <w:sz w:val="22"/>
+          <w:szCs w:val="18"/>
+          <w:highlight w:val="none"/>
+        </w:rPr>
+      </w:r>
+      <w:r>
+        <mc:AlternateContent>
+          <mc:Choice Requires="wpg">
+            <w:drawing>
+              <wp:inline xmlns:wp="http://schemas.openxmlformats.org/drawingml/2006/wordprocessingDrawing" distT="0" distB="0" distL="0" distR="0">
+                <wp:extent cx="5940425" cy="4900410"/>
+                <wp:effectExtent l="0" t="0" r="0" b="0"/>
+                <wp:docPr id="2" name=""/>
+                <wp:cNvGraphicFramePr>
+                  <a:graphicFrameLocks xmlns:a="http://schemas.openxmlformats.org/drawingml/2006/main" noChangeAspect="1"/>
+                </wp:cNvGraphicFramePr>
+                <a:graphic xmlns:a="http://schemas.openxmlformats.org/drawingml/2006/main">
+                  <a:graphicData uri="http://schemas.openxmlformats.org/drawingml/2006/picture">
+                    <pic:pic xmlns:pic="http://schemas.openxmlformats.org/drawingml/2006/picture">
+                      <pic:nvPicPr>
+                        <pic:cNvPr id="2029526916" name=""/>
+                        <pic:cNvPicPr>
+                          <a:picLocks noChangeAspect="1"/>
+                        </pic:cNvPicPr>
+                        <pic:nvPr/>
+                      </pic:nvPicPr>
+                      <pic:blipFill>
+                        <a:blip r:embed="rId13"/>
+                        <a:stretch/>
+                      </pic:blipFill>
+                      <pic:spPr bwMode="auto">
+                        <a:xfrm>
+                          <a:off x="0" y="0"/>
+                          <a:ext cx="5940424" cy="4900409"/>
+                        </a:xfrm>
+                        <a:prstGeom prst="rect">
+                          <a:avLst/>
+                        </a:prstGeom>
+                      </pic:spPr>
+                    </pic:pic>
+                  </a:graphicData>
+                </a:graphic>
+              </wp:inline>
+            </w:drawing>
+          </mc:Choice>
+          <mc:Fallback>
+            <w:pict>
+              <v:shapetype id="_x0000_t75" coordsize="21600,21600" o:spt="75" o:preferrelative="t" path="m@4@5l@4@11@9@11@9@5xe" filled="f" stroked="f">
+                <v:stroke joinstyle="miter"/>
+                <v:formulas>
+                  <v:f eqn="if lineDrawn pixelLineWidth 0"/>
+                  <v:f eqn="sum @0 1 0"/>
+                  <v:f eqn="sum 0 0 @1"/>
+                  <v:f eqn="prod @2 1 2"/>
+                  <v:f eqn="prod @3 21600 pixelWidth"/>
+                  <v:f eqn="prod @3 21600 pixelHeight"/>
+                  <v:f eqn="sum @0 0 1"/>
+                  <v:f eqn="prod @6 1 2"/>
+                  <v:f eqn="prod @7 21600 pixelWidth"/>
+                  <v:f eqn="sum @8 21600 0"/>
+                  <v:f eqn="prod @7 21600 pixelHeight"/>
+                  <v:f eqn="sum @10 21600 0"/>
+                </v:formulas>
+                <v:path o:extrusionok="f" gradientshapeok="t" o:connecttype="rect"/>
+                <o:lock v:ext="edit" aspectratio="t"/>
+              </v:shapetype>
+              <v:shape id="_x0000_i1" o:spid="_x0000_s1" type="#_x0000_t75" style="width:467.75pt;height:385.86pt;mso-wrap-distance-left:0.00pt;mso-wrap-distance-top:0.00pt;mso-wrap-distance-right:0.00pt;mso-wrap-distance-bottom:0.00pt;z-index:1;" stroked="false">
+                <v:imagedata r:id="rId13" o:title=""/>
+                <o:lock v:ext="edit" rotation="t"/>
+              </v:shape>
+            </w:pict>
+          </mc:Fallback>
+        </mc:AlternateContent>
+      </w:r>
+      <w:r>
+        <w:rPr>
+          <w:color w:val="000000" w:themeColor="text1"/>
+          <w:sz w:val="22"/>
+          <w:szCs w:val="18"/>
+          <w:highlight w:val="none"/>
+        </w:rPr>
+      </w:r>
+      <w:r>
+        <w:rPr>
+          <w:color w:val="000000" w:themeColor="text1"/>
+          <w:sz w:val="22"/>
+          <w:szCs w:val="18"/>
+          <w:highlight w:val="none"/>
+        </w:rPr>
+      </w:r>
+    </w:p>
+    <w:p>
+      <w:pPr>
+        <w:pBdr/>
+        <w:spacing/>
+        <w:ind/>
+        <w:rPr>
           <w:color w:val="auto"/>
           <w:sz w:val="22"/>
           <w:szCs w:val="22"/>
           <w:highlight w:val="none"/>
         </w:rPr>
       </w:pPr>
+      <w:r>
+        <w:rPr>
+          <w:color w:val="auto"/>
+          <w:sz w:val="22"/>
+          <w:szCs w:val="22"/>
+          <w:highlight w:val="none"/>
+        </w:rPr>
+      </w:r>
+      <w:r>
+        <w:rPr>
+          <w:color w:val="auto"/>
+          <w:sz w:val="22"/>
+          <w:szCs w:val="22"/>
+          <w:highlight w:val="none"/>
+        </w:rPr>
+      </w:r>
+    </w:p>
+    <w:p>
+      <w:pPr>
+        <w:pBdr/>
+        <w:spacing/>
+        <w:ind/>
+        <w:rPr>
+          <w:color w:val="auto"/>
+          <w:sz w:val="22"/>
+          <w:szCs w:val="22"/>
+          <w:highlight w:val="none"/>
+        </w:rPr>
+      </w:pPr>
+      <w:r>
+        <w:rPr>
+          <w:color w:val="auto"/>
+          <w:sz w:val="22"/>
+          <w:szCs w:val="22"/>
+          <w:highlight w:val="none"/>
+        </w:rPr>
+      </w:r>
+      <w:r>
+        <mc:AlternateContent>
+          <mc:Choice Requires="wpg">
+            <w:drawing>
+              <wp:inline xmlns:wp="http://schemas.openxmlformats.org/drawingml/2006/wordprocessingDrawing" distT="0" distB="0" distL="0" distR="0">
+                <wp:extent cx="5940425" cy="5310118"/>
+                <wp:effectExtent l="0" t="0" r="0" b="0"/>
+                <wp:docPr id="3" name=""/>
+                <wp:cNvGraphicFramePr>
+                  <a:graphicFrameLocks xmlns:a="http://schemas.openxmlformats.org/drawingml/2006/main" noChangeAspect="1"/>
+                </wp:cNvGraphicFramePr>
+                <a:graphic xmlns:a="http://schemas.openxmlformats.org/drawingml/2006/main">
+                  <a:graphicData uri="http://schemas.openxmlformats.org/drawingml/2006/picture">
+                    <pic:pic xmlns:pic="http://schemas.openxmlformats.org/drawingml/2006/picture">
+                      <pic:nvPicPr>
+                        <pic:cNvPr id="1051070343" name=""/>
+                        <pic:cNvPicPr>
+                          <a:picLocks noChangeAspect="1"/>
+                        </pic:cNvPicPr>
+                        <pic:nvPr/>
+                      </pic:nvPicPr>
+                      <pic:blipFill>
+                        <a:blip r:embed="rId14"/>
+                        <a:stretch/>
+                      </pic:blipFill>
+                      <pic:spPr bwMode="auto">
+                        <a:xfrm>
+                          <a:off x="0" y="0"/>
+                          <a:ext cx="5940424" cy="5310118"/>
+                        </a:xfrm>
+                        <a:prstGeom prst="rect">
+                          <a:avLst/>
+                        </a:prstGeom>
+                      </pic:spPr>
+                    </pic:pic>
+                  </a:graphicData>
+                </a:graphic>
+              </wp:inline>
+            </w:drawing>
+          </mc:Choice>
+          <mc:Fallback>
+            <w:pict>
+              <v:shapetype id="_x0000_t75" coordsize="21600,21600" o:spt="75" o:preferrelative="t" path="m@4@5l@4@11@9@11@9@5xe" filled="f" stroked="f">
+                <v:stroke joinstyle="miter"/>
+                <v:formulas>
+                  <v:f eqn="if lineDrawn pixelLineWidth 0"/>
+                  <v:f eqn="sum @0 1 0"/>
+                  <v:f eqn="sum 0 0 @1"/>
+                  <v:f eqn="prod @2 1 2"/>
+                  <v:f eqn="prod @3 21600 pixelWidth"/>
+                  <v:f eqn="prod @3 21600 pixelHeight"/>
+                  <v:f eqn="sum @0 0 1"/>
+                  <v:f eqn="prod @6 1 2"/>
+                  <v:f eqn="prod @7 21600 pixelWidth"/>
+                  <v:f eqn="sum @8 21600 0"/>
+                  <v:f eqn="prod @7 21600 pixelHeight"/>
+                  <v:f eqn="sum @10 21600 0"/>
+                </v:formulas>
+                <v:path o:extrusionok="f" gradientshapeok="t" o:connecttype="rect"/>
+                <o:lock v:ext="edit" aspectratio="t"/>
+              </v:shapetype>
+              <v:shape id="_x0000_i2" o:spid="_x0000_s2" type="#_x0000_t75" style="width:467.75pt;height:418.12pt;mso-wrap-distance-left:0.00pt;mso-wrap-distance-top:0.00pt;mso-wrap-distance-right:0.00pt;mso-wrap-distance-bottom:0.00pt;z-index:1;" stroked="false">
+                <v:imagedata r:id="rId14" o:title=""/>
+                <o:lock v:ext="edit" rotation="t"/>
+              </v:shape>
+            </w:pict>
+          </mc:Fallback>
+        </mc:AlternateContent>
+      </w:r>
+      <w:r>
+        <w:rPr>
+          <w:color w:val="auto"/>
+          <w:sz w:val="22"/>
+          <w:szCs w:val="22"/>
+          <w:highlight w:val="none"/>
+        </w:rPr>
+      </w:r>
+      <w:r>
+        <w:rPr>
+          <w:color w:val="auto"/>
+          <w:sz w:val="22"/>
+          <w:szCs w:val="22"/>
+          <w:highlight w:val="none"/>
+        </w:rPr>
+      </w:r>
+    </w:p>
+    <w:p>
+      <w:pPr>
+        <w:pBdr/>
+        <w:spacing/>
+        <w:ind/>
+        <w:rPr>
+          <w:color w:val="auto"/>
+          <w:sz w:val="22"/>
+          <w:szCs w:val="22"/>
+          <w:highlight w:val="none"/>
+        </w:rPr>
+      </w:pPr>
+      <w:r>
+        <w:rPr>
+          <w:color w:val="auto"/>
+          <w:sz w:val="22"/>
+          <w:szCs w:val="22"/>
+          <w:highlight w:val="none"/>
+        </w:rPr>
+        <w:t xml:space="preserve">So for example, if we want to get the mass of the planet, we need to look for the phrase “Mass “. Except this appears multiple times, so to be truly unique, we need to look for the phrase “Mass x” which only appears once. This will be done by iterating through each character with a for loop and checking that character along with the next 5 characters after it. So I will check response.text[i:i+6] where i is the dummy variable I’m using in a for loop. The phrases needed differ by planet, *and* have different lengths sometimes, as NASA does not have a standard formatting for their ephemeris, so a lot of OR statements will be used inside the program to handle all the different possible cases. The key phrases have been manually found by me through trial and error with different ephemerides (yes that’s the plural of ephemeris) and then put into the program.</w:t>
+      </w:r>
+      <w:r>
+        <w:rPr>
+          <w:color w:val="auto"/>
+          <w:sz w:val="22"/>
+          <w:szCs w:val="22"/>
+          <w:highlight w:val="none"/>
+        </w:rPr>
+      </w:r>
+    </w:p>
+    <w:p>
+      <w:pPr>
+        <w:pBdr/>
+        <w:spacing/>
+        <w:ind/>
+        <w:rPr>
+          <w:color w:val="auto"/>
+          <w:sz w:val="22"/>
+          <w:szCs w:val="22"/>
+          <w:highlight w:val="none"/>
+        </w:rPr>
+      </w:pPr>
+      <w:r>
+        <w:rPr>
+          <w:color w:val="auto"/>
+          <w:sz w:val="22"/>
+          <w:szCs w:val="22"/>
+          <w:highlight w:val="none"/>
+        </w:rPr>
+        <w:t xml:space="preserve">Once a key phrase is found, the numerical value needs to be extracted. I will skip over how this works for now and explain it in the next section on extractValue. Once we have the numerical value, the relevant attribute (e.g. mass) is set to be that value. So here mass would be set to “5.97219x10</w:t>
+      </w:r>
+      <w:r>
+        <w:rPr>
+          <w:color w:val="auto"/>
+          <w:sz w:val="22"/>
+          <w:szCs w:val="22"/>
+          <w:highlight w:val="none"/>
+          <w:vertAlign w:val="superscript"/>
+        </w:rPr>
+        <w:t xml:space="preserve">24</w:t>
+      </w:r>
+      <w:r>
+        <w:rPr>
+          <w:color w:val="auto"/>
+          <w:sz w:val="22"/>
+          <w:szCs w:val="22"/>
+          <w:highlight w:val="none"/>
+        </w:rPr>
+        <w:t xml:space="preserve">” as that is the value given by the ephemeris.</w:t>
+      </w:r>
+      <w:r>
+        <w:rPr>
+          <w:color w:val="auto"/>
+          <w:sz w:val="22"/>
+          <w:szCs w:val="22"/>
+          <w:highlight w:val="none"/>
+        </w:rPr>
+      </w:r>
+    </w:p>
+    <w:p>
+      <w:pPr>
+        <w:pBdr/>
+        <w:spacing/>
+        <w:ind/>
+        <w:rPr>
+          <w:color w:val="auto"/>
+          <w:sz w:val="22"/>
+          <w:szCs w:val="22"/>
+          <w:highlight w:val="none"/>
+        </w:rPr>
+      </w:pPr>
+      <w:r>
+        <w:rPr>
+          <w:color w:val="auto"/>
+          <w:sz w:val="22"/>
+          <w:szCs w:val="22"/>
+          <w:highlight w:val="none"/>
+        </w:rPr>
+        <w:t xml:space="preserve">A slightly different approach needs to be used for position and velocity, as they are vectors. I will create two numpy arrays for position and velocity at the start and set all the elements to 0, these elements can then be updated as the values for them are found. This is because arrays are fixed length so you cannot append values to them.</w:t>
+      </w:r>
+      <w:r>
+        <w:rPr>
+          <w:color w:val="auto"/>
+          <w:sz w:val="22"/>
+          <w:szCs w:val="22"/>
+          <w:highlight w:val="none"/>
+        </w:rPr>
+      </w:r>
+    </w:p>
+    <w:p>
+      <w:pPr>
+        <w:pBdr/>
+        <w:spacing/>
+        <w:ind/>
+        <w:rPr>
+          <w:color w:val="auto"/>
+          <w:sz w:val="22"/>
+          <w:szCs w:val="22"/>
+          <w:highlight w:val="none"/>
+        </w:rPr>
+      </w:pPr>
+      <w:r>
+        <w:rPr>
+          <w:color w:val="auto"/>
+          <w:sz w:val="22"/>
+          <w:szCs w:val="22"/>
+          <w:highlight w:val="none"/>
+        </w:rPr>
+        <w:t xml:space="preserve">To decide which element to update, a dictionary will be used containing all the key phrases, like this:</w:t>
+      </w:r>
+      <w:r>
+        <w:rPr>
+          <w:color w:val="auto"/>
+          <w:sz w:val="22"/>
+          <w:szCs w:val="22"/>
+          <w:highlight w:val="none"/>
+        </w:rPr>
+      </w:r>
+    </w:p>
+    <w:p>
+      <w:pPr>
+        <w:pBdr/>
+        <w:spacing/>
+        <w:ind/>
+        <w:rPr>
+          <w:highlight w:val="none"/>
+        </w:rPr>
+      </w:pPr>
+      <w:r>
+        <w:rPr>
+          <w:color w:val="auto"/>
+          <w:sz w:val="22"/>
+          <w:szCs w:val="22"/>
+          <w:highlight w:val="none"/>
+        </w:rPr>
+      </w:r>
+      <w:r>
+        <mc:AlternateContent>
+          <mc:Choice Requires="wpg">
+            <w:drawing>
+              <wp:inline xmlns:wp="http://schemas.openxmlformats.org/drawingml/2006/wordprocessingDrawing" distT="0" distB="0" distL="0" distR="0">
+                <wp:extent cx="1581150" cy="1200150"/>
+                <wp:effectExtent l="0" t="0" r="0" b="0"/>
+                <wp:docPr id="4" name=""/>
+                <wp:cNvGraphicFramePr>
+                  <a:graphicFrameLocks xmlns:a="http://schemas.openxmlformats.org/drawingml/2006/main" noChangeAspect="1"/>
+                </wp:cNvGraphicFramePr>
+                <a:graphic xmlns:a="http://schemas.openxmlformats.org/drawingml/2006/main">
+                  <a:graphicData uri="http://schemas.openxmlformats.org/drawingml/2006/picture">
+                    <pic:pic xmlns:pic="http://schemas.openxmlformats.org/drawingml/2006/picture">
+                      <pic:nvPicPr>
+                        <pic:cNvPr id="603657534" name=""/>
+                        <pic:cNvPicPr>
+                          <a:picLocks noChangeAspect="1"/>
+                        </pic:cNvPicPr>
+                        <pic:nvPr/>
+                      </pic:nvPicPr>
+                      <pic:blipFill>
+                        <a:blip r:embed="rId15"/>
+                        <a:stretch/>
+                      </pic:blipFill>
+                      <pic:spPr bwMode="auto">
+                        <a:xfrm>
+                          <a:off x="0" y="0"/>
+                          <a:ext cx="1581149" cy="1200150"/>
+                        </a:xfrm>
+                        <a:prstGeom prst="rect">
+                          <a:avLst/>
+                        </a:prstGeom>
+                      </pic:spPr>
+                    </pic:pic>
+                  </a:graphicData>
+                </a:graphic>
+              </wp:inline>
+            </w:drawing>
+          </mc:Choice>
+          <mc:Fallback>
+            <w:pict>
+              <v:shapetype id="_x0000_t75" coordsize="21600,21600" o:spt="75" o:preferrelative="t" path="m@4@5l@4@11@9@11@9@5xe" filled="f" stroked="f">
+                <v:stroke joinstyle="miter"/>
+                <v:formulas>
+                  <v:f eqn="if lineDrawn pixelLineWidth 0"/>
+                  <v:f eqn="sum @0 1 0"/>
+                  <v:f eqn="sum 0 0 @1"/>
+                  <v:f eqn="prod @2 1 2"/>
+                  <v:f eqn="prod @3 21600 pixelWidth"/>
+                  <v:f eqn="prod @3 21600 pixelHeight"/>
+                  <v:f eqn="sum @0 0 1"/>
+                  <v:f eqn="prod @6 1 2"/>
+                  <v:f eqn="prod @7 21600 pixelWidth"/>
+                  <v:f eqn="sum @8 21600 0"/>
+                  <v:f eqn="prod @7 21600 pixelHeight"/>
+                  <v:f eqn="sum @10 21600 0"/>
+                </v:formulas>
+                <v:path o:extrusionok="f" gradientshapeok="t" o:connecttype="rect"/>
+                <o:lock v:ext="edit" aspectratio="t"/>
+              </v:shapetype>
+              <v:shape id="_x0000_i3" o:spid="_x0000_s3" type="#_x0000_t75" style="width:124.50pt;height:94.50pt;mso-wrap-distance-left:0.00pt;mso-wrap-distance-top:0.00pt;mso-wrap-distance-right:0.00pt;mso-wrap-distance-bottom:0.00pt;z-index:1;" stroked="false">
+                <v:imagedata r:id="rId15" o:title=""/>
+                <o:lock v:ext="edit" rotation="t"/>
+              </v:shape>
+            </w:pict>
+          </mc:Fallback>
+        </mc:AlternateContent>
+      </w:r>
+      <w:r>
+        <w:rPr>
+          <w:color w:val="auto"/>
+          <w:sz w:val="22"/>
+          <w:szCs w:val="22"/>
+          <w:highlight w:val="none"/>
+        </w:rPr>
+      </w:r>
+      <w:r>
+        <w:rPr>
+          <w:color w:val="auto"/>
+          <w:sz w:val="22"/>
+          <w:szCs w:val="22"/>
+          <w:highlight w:val="none"/>
+        </w:rPr>
+      </w:r>
+    </w:p>
+    <w:p>
+      <w:pPr>
+        <w:pBdr/>
+        <w:spacing/>
+        <w:ind/>
+        <w:rPr>
+          <w:highlight w:val="none"/>
+        </w:rPr>
+      </w:pPr>
+      <w:r>
+        <w:rPr>
+          <w:highlight w:val="none"/>
+        </w:rPr>
+        <w:t xml:space="preserve">And I will then update position[posDict[response.text[i:i+3]] so that I update the correct element. I will do the same thing for velocity, but a different dictionary will be used as the key phrases for velocity are different.</w:t>
+      </w:r>
+      <w:r>
+        <w:rPr>
+          <w:highlight w:val="none"/>
+        </w:rPr>
+      </w:r>
+    </w:p>
+    <w:p>
+      <w:pPr>
+        <w:pBdr/>
+        <w:spacing/>
+        <w:ind/>
+        <w:rPr>
+          <w:highlight w:val="none"/>
+        </w:rPr>
+      </w:pPr>
+      <w:r>
+        <w:rPr>
+          <w:highlight w:val="none"/>
+        </w:rPr>
+        <w:t xml:space="preserve">Once the final velocity element, velocity[2], is found (i.e. it’s no longer 0, the chance of a velocity component of a plane naturally being 0 is so small that it will never happen during the lifetime of the Earth), then the for loop should break and size, mass, position and velocity should be returned in a list.</w:t>
+      </w:r>
+      <w:r>
+        <w:rPr>
+          <w:highlight w:val="none"/>
+        </w:rPr>
+      </w:r>
+      <w:r/>
+    </w:p>
+    <w:p>
+      <w:pPr>
+        <w:pBdr/>
+        <w:spacing/>
+        <w:ind/>
+        <w:rPr>
+          <w:highlight w:val="none"/>
+        </w:rPr>
+      </w:pPr>
+      <w:r>
+        <w:rPr>
+          <w:highlight w:val="none"/>
+        </w:rPr>
+        <w:t xml:space="preserve">There are two optional flags that can be set in getEphemeris. The first will be “useGM.” Some ephemerides, for example the ones for Jupiter’s moons, give a physical attribute “GM” instead of the planet’s mass. The mass however can be derived from this by simply multiplying the value by a constant. If “useGM” is true then the program should ignore the key phrases relevant to mass and instead search for the key phrases relevant to GM, and should extract the value and multiply by the constant to then get the mass of the planet.</w:t>
+      </w:r>
+      <w:r>
+        <w:rPr>
+          <w:highlight w:val="none"/>
+        </w:rPr>
+      </w:r>
+    </w:p>
+    <w:p>
+      <w:pPr>
+        <w:pBdr/>
+        <w:spacing/>
+        <w:ind/>
+        <w:rPr>
+          <w:highlight w:val="none"/>
+        </w:rPr>
+      </w:pPr>
+      <w:r>
+        <w:rPr>
+          <w:highlight w:val="none"/>
+        </w:rPr>
+        <w:t xml:space="preserve">The other flag is “ignoreMassSize”. For particularly small objects, especially human-made satellites, the mass and size of the object are not given. In this case the mass and size of the object will be manually passed into getEphemeris as arguments and the key phrases relating to them will be ignored.</w:t>
+      </w:r>
+      <w:r>
+        <w:rPr>
+          <w:highlight w:val="none"/>
+        </w:rPr>
+      </w:r>
+    </w:p>
+    <w:p>
+      <w:pPr>
+        <w:pBdr/>
+        <w:spacing/>
+        <w:ind/>
+        <w:rPr>
+          <w:highlight w:val="none"/>
+        </w:rPr>
+      </w:pPr>
+      <w:r>
+        <w:rPr>
+          <w:highlight w:val="none"/>
+        </w:rPr>
+        <w:t xml:space="preserve">Now that all of that is explained, here is some pseudocode for getEphemeris:</w:t>
+      </w:r>
+      <w:r>
+        <w:rPr>
+          <w:highlight w:val="none"/>
+        </w:rPr>
+      </w:r>
+    </w:p>
+    <w:p>
+      <w:pPr>
+        <w:pBdr/>
+        <w:spacing/>
+        <w:ind/>
+        <w:rPr>
+          <w:highlight w:val="none"/>
+        </w:rPr>
+      </w:pPr>
+      <w:r>
+        <w:rPr>
+          <w:highlight w:val="none"/>
+        </w:rPr>
+      </w:r>
+      <w:r>
+        <mc:AlternateContent>
+          <mc:Choice Requires="wpg">
+            <w:drawing>
+              <wp:inline xmlns:wp="http://schemas.openxmlformats.org/drawingml/2006/wordprocessingDrawing" distT="0" distB="0" distL="0" distR="0">
+                <wp:extent cx="5940425" cy="4440900"/>
+                <wp:effectExtent l="0" t="0" r="0" b="0"/>
+                <wp:docPr id="5" name=""/>
+                <wp:cNvGraphicFramePr>
+                  <a:graphicFrameLocks xmlns:a="http://schemas.openxmlformats.org/drawingml/2006/main" noChangeAspect="1"/>
+                </wp:cNvGraphicFramePr>
+                <a:graphic xmlns:a="http://schemas.openxmlformats.org/drawingml/2006/main">
+                  <a:graphicData uri="http://schemas.openxmlformats.org/drawingml/2006/picture">
+                    <pic:pic xmlns:pic="http://schemas.openxmlformats.org/drawingml/2006/picture">
+                      <pic:nvPicPr>
+                        <pic:cNvPr id="939327410" name=""/>
+                        <pic:cNvPicPr>
+                          <a:picLocks noChangeAspect="1"/>
+                        </pic:cNvPicPr>
+                        <pic:nvPr/>
+                      </pic:nvPicPr>
+                      <pic:blipFill>
+                        <a:blip r:embed="rId16"/>
+                        <a:stretch/>
+                      </pic:blipFill>
+                      <pic:spPr bwMode="auto">
+                        <a:xfrm>
+                          <a:off x="0" y="0"/>
+                          <a:ext cx="5940424" cy="4440900"/>
+                        </a:xfrm>
+                        <a:prstGeom prst="rect">
+                          <a:avLst/>
+                        </a:prstGeom>
+                      </pic:spPr>
+                    </pic:pic>
+                  </a:graphicData>
+                </a:graphic>
+              </wp:inline>
+            </w:drawing>
+          </mc:Choice>
+          <mc:Fallback>
+            <w:pict>
+              <v:shapetype id="_x0000_t75" coordsize="21600,21600" o:spt="75" o:preferrelative="t" path="m@4@5l@4@11@9@11@9@5xe" filled="f" stroked="f">
+                <v:stroke joinstyle="miter"/>
+                <v:formulas>
+                  <v:f eqn="if lineDrawn pixelLineWidth 0"/>
+                  <v:f eqn="sum @0 1 0"/>
+                  <v:f eqn="sum 0 0 @1"/>
+                  <v:f eqn="prod @2 1 2"/>
+                  <v:f eqn="prod @3 21600 pixelWidth"/>
+                  <v:f eqn="prod @3 21600 pixelHeight"/>
+                  <v:f eqn="sum @0 0 1"/>
+                  <v:f eqn="prod @6 1 2"/>
+                  <v:f eqn="prod @7 21600 pixelWidth"/>
+                  <v:f eqn="sum @8 21600 0"/>
+                  <v:f eqn="prod @7 21600 pixelHeight"/>
+                  <v:f eqn="sum @10 21600 0"/>
+                </v:formulas>
+                <v:path o:extrusionok="f" gradientshapeok="t" o:connecttype="rect"/>
+                <o:lock v:ext="edit" aspectratio="t"/>
+              </v:shapetype>
+              <v:shape id="_x0000_i4" o:spid="_x0000_s4" type="#_x0000_t75" style="width:467.75pt;height:349.68pt;mso-wrap-distance-left:0.00pt;mso-wrap-distance-top:0.00pt;mso-wrap-distance-right:0.00pt;mso-wrap-distance-bottom:0.00pt;z-index:1;" stroked="false">
+                <v:imagedata r:id="rId16" o:title=""/>
+                <o:lock v:ext="edit" rotation="t"/>
+              </v:shape>
+            </w:pict>
+          </mc:Fallback>
+        </mc:AlternateContent>
+      </w:r>
+      <w:r>
+        <w:rPr>
+          <w:highlight w:val="none"/>
+        </w:rPr>
+      </w:r>
+      <w:r>
+        <w:rPr>
+          <w:highlight w:val="none"/>
+        </w:rPr>
+      </w:r>
+    </w:p>
+    <w:p>
+      <w:pPr>
+        <w:pBdr/>
+        <w:spacing/>
+        <w:ind/>
+        <w:rPr>
+          <w:color w:val="auto"/>
+          <w:sz w:val="22"/>
+          <w:szCs w:val="22"/>
+          <w:highlight w:val="none"/>
+        </w:rPr>
+      </w:pPr>
+      <w:r>
+        <w:rPr>
+          <w:color w:val="auto"/>
+          <w:sz w:val="22"/>
+          <w:szCs w:val="22"/>
+          <w:highlight w:val="none"/>
+        </w:rPr>
+      </w:r>
+      <w:r>
+        <mc:AlternateContent>
+          <mc:Choice Requires="wpg">
+            <w:drawing>
+              <wp:inline xmlns:wp="http://schemas.openxmlformats.org/drawingml/2006/wordprocessingDrawing" distT="0" distB="0" distL="0" distR="0">
+                <wp:extent cx="5940425" cy="5667137"/>
+                <wp:effectExtent l="0" t="0" r="0" b="0"/>
+                <wp:docPr id="6" name=""/>
+                <wp:cNvGraphicFramePr>
+                  <a:graphicFrameLocks xmlns:a="http://schemas.openxmlformats.org/drawingml/2006/main" noChangeAspect="1"/>
+                </wp:cNvGraphicFramePr>
+                <a:graphic xmlns:a="http://schemas.openxmlformats.org/drawingml/2006/main">
+                  <a:graphicData uri="http://schemas.openxmlformats.org/drawingml/2006/picture">
+                    <pic:pic xmlns:pic="http://schemas.openxmlformats.org/drawingml/2006/picture">
+                      <pic:nvPicPr>
+                        <pic:cNvPr id="2110391258" name=""/>
+                        <pic:cNvPicPr>
+                          <a:picLocks noChangeAspect="1"/>
+                        </pic:cNvPicPr>
+                        <pic:nvPr/>
+                      </pic:nvPicPr>
+                      <pic:blipFill>
+                        <a:blip r:embed="rId17"/>
+                        <a:stretch/>
+                      </pic:blipFill>
+                      <pic:spPr bwMode="auto">
+                        <a:xfrm>
+                          <a:off x="0" y="0"/>
+                          <a:ext cx="5940424" cy="5667136"/>
+                        </a:xfrm>
+                        <a:prstGeom prst="rect">
+                          <a:avLst/>
+                        </a:prstGeom>
+                      </pic:spPr>
+                    </pic:pic>
+                  </a:graphicData>
+                </a:graphic>
+              </wp:inline>
+            </w:drawing>
+          </mc:Choice>
+          <mc:Fallback>
+            <w:pict>
+              <v:shapetype id="_x0000_t75" coordsize="21600,21600" o:spt="75" o:preferrelative="t" path="m@4@5l@4@11@9@11@9@5xe" filled="f" stroked="f">
+                <v:stroke joinstyle="miter"/>
+                <v:formulas>
+                  <v:f eqn="if lineDrawn pixelLineWidth 0"/>
+                  <v:f eqn="sum @0 1 0"/>
+                  <v:f eqn="sum 0 0 @1"/>
+                  <v:f eqn="prod @2 1 2"/>
+                  <v:f eqn="prod @3 21600 pixelWidth"/>
+                  <v:f eqn="prod @3 21600 pixelHeight"/>
+                  <v:f eqn="sum @0 0 1"/>
+                  <v:f eqn="prod @6 1 2"/>
+                  <v:f eqn="prod @7 21600 pixelWidth"/>
+                  <v:f eqn="sum @8 21600 0"/>
+                  <v:f eqn="prod @7 21600 pixelHeight"/>
+                  <v:f eqn="sum @10 21600 0"/>
+                </v:formulas>
+                <v:path o:extrusionok="f" gradientshapeok="t" o:connecttype="rect"/>
+                <o:lock v:ext="edit" aspectratio="t"/>
+              </v:shapetype>
+              <v:shape id="_x0000_i5" o:spid="_x0000_s5" type="#_x0000_t75" style="width:467.75pt;height:446.23pt;mso-wrap-distance-left:0.00pt;mso-wrap-distance-top:0.00pt;mso-wrap-distance-right:0.00pt;mso-wrap-distance-bottom:0.00pt;z-index:1;" stroked="false">
+                <v:imagedata r:id="rId17" o:title=""/>
+                <o:lock v:ext="edit" rotation="t"/>
+              </v:shape>
+            </w:pict>
+          </mc:Fallback>
+        </mc:AlternateContent>
+      </w:r>
       <w:r>
         <w:rPr>
           <w:color w:val="auto"/>
@@ -539,26 +2001,590 @@
       </w:pPr>
       <w:r>
         <w:rPr>
+          <w:color w:val="5b9bd5" w:themeColor="accent1"/>
+          <w:sz w:val="28"/>
+          <w:szCs w:val="28"/>
+          <w:highlight w:val="none"/>
+        </w:rPr>
+      </w:r>
+      <w:r>
+        <mc:AlternateContent>
+          <mc:Choice Requires="wpg">
+            <w:drawing>
+              <wp:inline xmlns:wp="http://schemas.openxmlformats.org/drawingml/2006/wordprocessingDrawing" distT="0" distB="0" distL="0" distR="0">
+                <wp:extent cx="5940425" cy="1466951"/>
+                <wp:effectExtent l="0" t="0" r="0" b="0"/>
+                <wp:docPr id="7" name=""/>
+                <wp:cNvGraphicFramePr>
+                  <a:graphicFrameLocks xmlns:a="http://schemas.openxmlformats.org/drawingml/2006/main" noChangeAspect="1"/>
+                </wp:cNvGraphicFramePr>
+                <a:graphic xmlns:a="http://schemas.openxmlformats.org/drawingml/2006/main">
+                  <a:graphicData uri="http://schemas.openxmlformats.org/drawingml/2006/picture">
+                    <pic:pic xmlns:pic="http://schemas.openxmlformats.org/drawingml/2006/picture">
+                      <pic:nvPicPr>
+                        <pic:cNvPr id="1468425184" name=""/>
+                        <pic:cNvPicPr>
+                          <a:picLocks noChangeAspect="1"/>
+                        </pic:cNvPicPr>
+                        <pic:nvPr/>
+                      </pic:nvPicPr>
+                      <pic:blipFill>
+                        <a:blip r:embed="rId18"/>
+                        <a:stretch/>
+                      </pic:blipFill>
+                      <pic:spPr bwMode="auto">
+                        <a:xfrm>
+                          <a:off x="0" y="0"/>
+                          <a:ext cx="5940424" cy="1466950"/>
+                        </a:xfrm>
+                        <a:prstGeom prst="rect">
+                          <a:avLst/>
+                        </a:prstGeom>
+                      </pic:spPr>
+                    </pic:pic>
+                  </a:graphicData>
+                </a:graphic>
+              </wp:inline>
+            </w:drawing>
+          </mc:Choice>
+          <mc:Fallback>
+            <w:pict>
+              <v:shapetype id="_x0000_t75" coordsize="21600,21600" o:spt="75" o:preferrelative="t" path="m@4@5l@4@11@9@11@9@5xe" filled="f" stroked="f">
+                <v:stroke joinstyle="miter"/>
+                <v:formulas>
+                  <v:f eqn="if lineDrawn pixelLineWidth 0"/>
+                  <v:f eqn="sum @0 1 0"/>
+                  <v:f eqn="sum 0 0 @1"/>
+                  <v:f eqn="prod @2 1 2"/>
+                  <v:f eqn="prod @3 21600 pixelWidth"/>
+                  <v:f eqn="prod @3 21600 pixelHeight"/>
+                  <v:f eqn="sum @0 0 1"/>
+                  <v:f eqn="prod @6 1 2"/>
+                  <v:f eqn="prod @7 21600 pixelWidth"/>
+                  <v:f eqn="sum @8 21600 0"/>
+                  <v:f eqn="prod @7 21600 pixelHeight"/>
+                  <v:f eqn="sum @10 21600 0"/>
+                </v:formulas>
+                <v:path o:extrusionok="f" gradientshapeok="t" o:connecttype="rect"/>
+                <o:lock v:ext="edit" aspectratio="t"/>
+              </v:shapetype>
+              <v:shape id="_x0000_i6" o:spid="_x0000_s6" type="#_x0000_t75" style="width:467.75pt;height:115.51pt;mso-wrap-distance-left:0.00pt;mso-wrap-distance-top:0.00pt;mso-wrap-distance-right:0.00pt;mso-wrap-distance-bottom:0.00pt;z-index:1;" stroked="false">
+                <v:imagedata r:id="rId18" o:title=""/>
+                <o:lock v:ext="edit" rotation="t"/>
+              </v:shape>
+            </w:pict>
+          </mc:Fallback>
+        </mc:AlternateContent>
+      </w:r>
+      <w:r>
+        <w:rPr>
+          <w:color w:val="5b9bd5" w:themeColor="accent1"/>
+          <w:sz w:val="28"/>
+          <w:szCs w:val="28"/>
+          <w:highlight w:val="none"/>
+        </w:rPr>
+      </w:r>
+      <w:r>
+        <w:rPr>
+          <w:color w:val="5b9bd5" w:themeColor="accent1"/>
+          <w:sz w:val="28"/>
+          <w:szCs w:val="28"/>
+          <w:highlight w:val="none"/>
+        </w:rPr>
+      </w:r>
+    </w:p>
+    <w:p>
+      <w:pPr>
+        <w:pBdr/>
+        <w:spacing/>
+        <w:ind/>
+        <w:rPr>
+          <w:color w:val="000000" w:themeColor="text1"/>
+          <w:sz w:val="22"/>
+          <w:szCs w:val="22"/>
+          <w:highlight w:val="none"/>
+        </w:rPr>
+      </w:pPr>
+      <w:r>
+        <w:rPr>
+          <w:color w:val="000000" w:themeColor="text1"/>
+          <w:sz w:val="22"/>
+          <w:szCs w:val="22"/>
+          <w:highlight w:val="none"/>
+        </w:rPr>
+      </w:r>
+      <w:r>
+        <w:rPr>
+          <w:color w:val="000000" w:themeColor="text1"/>
+          <w:sz w:val="22"/>
+          <w:szCs w:val="22"/>
+          <w:highlight w:val="none"/>
+        </w:rPr>
+      </w:r>
+    </w:p>
+    <w:p>
+      <w:pPr>
+        <w:pBdr/>
+        <w:spacing/>
+        <w:ind/>
+        <w:rPr>
           <w:color w:val="4472c4" w:themeColor="accent5"/>
           <w:sz w:val="28"/>
           <w:szCs w:val="28"/>
           <w:highlight w:val="none"/>
         </w:rPr>
-        <w:t xml:space="preserve">Vectors</w:t>
-      </w:r>
+      </w:pPr>
       <w:r>
         <w:rPr>
           <w:color w:val="4472c4" w:themeColor="accent5"/>
+          <w:sz w:val="28"/>
+          <w:szCs w:val="28"/>
+          <w:highlight w:val="none"/>
+        </w:rPr>
+        <w:t xml:space="preserve">extractValue</w:t>
+      </w:r>
+      <w:r>
+        <w:rPr>
+          <w:color w:val="4472c4" w:themeColor="accent5"/>
+          <w:sz w:val="28"/>
+          <w:szCs w:val="28"/>
+          <w:highlight w:val="none"/>
+        </w:rPr>
+      </w:r>
+      <w:r>
+        <w:rPr>
+          <w:color w:val="4472c4" w:themeColor="accent5"/>
+          <w:sz w:val="28"/>
+          <w:szCs w:val="28"/>
+          <w:highlight w:val="none"/>
+        </w:rPr>
+      </w:r>
+    </w:p>
+    <w:p>
+      <w:pPr>
+        <w:pBdr/>
+        <w:spacing/>
+        <w:ind/>
+        <w:rPr>
+          <w:color w:val="000000" w:themeColor="text1"/>
+          <w:sz w:val="22"/>
+          <w:szCs w:val="22"/>
+          <w:highlight w:val="none"/>
+        </w:rPr>
+      </w:pPr>
+      <w:r>
+        <w:rPr>
+          <w:color w:val="000000" w:themeColor="text1"/>
+          <w:sz w:val="22"/>
+          <w:szCs w:val="22"/>
+          <w:highlight w:val="none"/>
+        </w:rPr>
+        <w:t xml:space="preserve">Now that we have a high level overview of how getEphemeris works, let’s analyse how it actually gets numeric values from the text. extractValue will be given a section of the response starting from the key phrase and continuing for a few dozen characters so that it only gets the number relating to the attribute we’re interested in. extractValue will need to do two things:</w:t>
+      </w:r>
+      <w:r>
+        <w:rPr>
+          <w:color w:val="000000" w:themeColor="text1"/>
+          <w:sz w:val="22"/>
+          <w:szCs w:val="22"/>
+          <w:highlight w:val="none"/>
+        </w:rPr>
+      </w:r>
+    </w:p>
+    <w:p>
+      <w:pPr>
+        <w:pStyle w:val="836"/>
+        <w:numPr>
+          <w:ilvl w:val="0"/>
+          <w:numId w:val="2"/>
+        </w:numPr>
+        <w:pBdr/>
+        <w:spacing/>
+        <w:ind/>
+        <w:rPr>
+          <w:color w:val="000000" w:themeColor="text1"/>
+          <w:sz w:val="22"/>
+          <w:szCs w:val="22"/>
+          <w:highlight w:val="none"/>
+        </w:rPr>
+      </w:pPr>
+      <w:r>
+        <w:rPr>
+          <w:color w:val="000000" w:themeColor="text1"/>
+          <w:sz w:val="22"/>
+          <w:szCs w:val="22"/>
+          <w:highlight w:val="none"/>
+        </w:rPr>
+        <w:t xml:space="preserve">Find, if there is one, the scale given by NASA. E.g. they might give the scale as 10^24, and then the numeric value would be 57.9. This means you should interpret the number as 57.9 * 10^24. If no scale is found, scale should be set to 1 by default.</w:t>
+      </w:r>
+      <w:r>
+        <w:rPr>
+          <w:color w:val="000000" w:themeColor="text1"/>
+          <w:sz w:val="22"/>
+          <w:szCs w:val="22"/>
+          <w:highlight w:val="none"/>
+        </w:rPr>
+      </w:r>
+    </w:p>
+    <w:p>
+      <w:pPr>
+        <w:pStyle w:val="836"/>
+        <w:numPr>
+          <w:ilvl w:val="0"/>
+          <w:numId w:val="2"/>
+        </w:numPr>
+        <w:pBdr/>
+        <w:spacing/>
+        <w:ind/>
+        <w:rPr>
+          <w:color w:val="000000" w:themeColor="text1"/>
+          <w:sz w:val="22"/>
+          <w:szCs w:val="22"/>
+          <w:highlight w:val="none"/>
+        </w:rPr>
+      </w:pPr>
+      <w:r>
+        <w:rPr>
+          <w:color w:val="000000" w:themeColor="text1"/>
+          <w:sz w:val="22"/>
+          <w:szCs w:val="22"/>
+          <w:highlight w:val="none"/>
+        </w:rPr>
+        <w:t xml:space="preserve">Find the actual numeric value for the attribute.</w:t>
+      </w:r>
+      <w:r>
+        <w:rPr>
+          <w:color w:val="000000" w:themeColor="text1"/>
+          <w:sz w:val="22"/>
+          <w:szCs w:val="22"/>
+          <w:highlight w:val="none"/>
+        </w:rPr>
+      </w:r>
+    </w:p>
+    <w:p>
+      <w:pPr>
+        <w:pBdr/>
+        <w:spacing/>
+        <w:ind/>
+        <w:rPr>
+          <w:color w:val="000000" w:themeColor="text1"/>
+          <w:sz w:val="22"/>
+          <w:szCs w:val="22"/>
+          <w:highlight w:val="none"/>
+        </w:rPr>
+      </w:pPr>
+      <w:r>
+        <w:rPr>
+          <w:color w:val="000000" w:themeColor="text1"/>
+          <w:sz w:val="22"/>
+          <w:szCs w:val="22"/>
+          <w:highlight w:val="none"/>
+        </w:rPr>
+        <w:t xml:space="preserve">We will pass in a boolean value telling the function whether or not it should look for a scale. We will also have the option of passing in a “conversion factor”, which is just a number we want to multiply the final answer by. Handy if the value is given in non-SI units by NASA and we want to convert it to SI.</w:t>
+      </w:r>
+      <w:r>
+        <w:rPr>
+          <w:color w:val="000000" w:themeColor="text1"/>
+          <w:sz w:val="22"/>
+          <w:szCs w:val="22"/>
+          <w:highlight w:val="none"/>
+        </w:rPr>
+      </w:r>
+    </w:p>
+    <w:p>
+      <w:pPr>
+        <w:pBdr/>
+        <w:spacing/>
+        <w:ind/>
+        <w:rPr>
+          <w:color w:val="000000" w:themeColor="text1"/>
+          <w:sz w:val="22"/>
+          <w:szCs w:val="22"/>
+          <w:highlight w:val="none"/>
+        </w:rPr>
+      </w:pPr>
+      <w:r>
+        <w:rPr>
+          <w:color w:val="000000" w:themeColor="text1"/>
+          <w:sz w:val="22"/>
+          <w:szCs w:val="22"/>
+          <w:highlight w:val="none"/>
+        </w:rPr>
+        <w:t xml:space="preserve">Here is a flowchart explaining the basic algorithm used to get a number from a piece of text once the position of a key phrase has been found:</w:t>
+      </w:r>
+      <w:r>
+        <w:rPr>
+          <w:color w:val="000000" w:themeColor="text1"/>
+          <w:sz w:val="22"/>
+          <w:szCs w:val="22"/>
+          <w:highlight w:val="none"/>
+        </w:rPr>
+      </w:r>
+      <w:r/>
+    </w:p>
+    <w:p>
+      <w:pPr>
+        <w:pBdr/>
+        <w:spacing/>
+        <w:ind/>
+        <w:rPr>
+          <w:color w:val="000000" w:themeColor="text1"/>
+          <w:sz w:val="22"/>
+          <w:szCs w:val="22"/>
+          <w:highlight w:val="none"/>
+        </w:rPr>
+      </w:pPr>
+      <w:r>
+        <w:rPr>
+          <w:color w:val="000000" w:themeColor="text1"/>
+          <w:sz w:val="22"/>
+          <w:szCs w:val="22"/>
+          <w:highlight w:val="none"/>
+        </w:rPr>
+        <mc:AlternateContent>
+          <mc:Choice Requires="wpg">
+            <w:drawing>
+              <wp:inline xmlns:wp="http://schemas.openxmlformats.org/drawingml/2006/wordprocessingDrawing" distT="0" distB="0" distL="0" distR="0">
+                <wp:extent cx="5940425" cy="7141203"/>
+                <wp:effectExtent l="0" t="0" r="0" b="0"/>
+                <wp:docPr id="8" name=""/>
+                <wp:cNvGraphicFramePr>
+                  <a:graphicFrameLocks xmlns:a="http://schemas.openxmlformats.org/drawingml/2006/main" noChangeAspect="1"/>
+                </wp:cNvGraphicFramePr>
+                <a:graphic xmlns:a="http://schemas.openxmlformats.org/drawingml/2006/main">
+                  <a:graphicData uri="http://schemas.openxmlformats.org/drawingml/2006/picture">
+                    <pic:pic xmlns:pic="http://schemas.openxmlformats.org/drawingml/2006/picture">
+                      <pic:nvPicPr>
+                        <pic:cNvPr id="27892686" name=""/>
+                        <pic:cNvPicPr>
+                          <a:picLocks noChangeAspect="1"/>
+                        </pic:cNvPicPr>
+                        <pic:nvPr/>
+                      </pic:nvPicPr>
+                      <pic:blipFill>
+                        <a:blip r:embed="rId19"/>
+                        <a:stretch/>
+                      </pic:blipFill>
+                      <pic:spPr bwMode="auto">
+                        <a:xfrm>
+                          <a:off x="0" y="0"/>
+                          <a:ext cx="5940424" cy="7141203"/>
+                        </a:xfrm>
+                        <a:prstGeom prst="rect">
+                          <a:avLst/>
+                        </a:prstGeom>
+                      </pic:spPr>
+                    </pic:pic>
+                  </a:graphicData>
+                </a:graphic>
+              </wp:inline>
+            </w:drawing>
+          </mc:Choice>
+          <mc:Fallback>
+            <w:pict>
+              <v:shapetype id="_x0000_t75" coordsize="21600,21600" o:spt="75" o:preferrelative="t" path="m@4@5l@4@11@9@11@9@5xe" filled="f" stroked="f">
+                <v:stroke joinstyle="miter"/>
+                <v:formulas>
+                  <v:f eqn="if lineDrawn pixelLineWidth 0"/>
+                  <v:f eqn="sum @0 1 0"/>
+                  <v:f eqn="sum 0 0 @1"/>
+                  <v:f eqn="prod @2 1 2"/>
+                  <v:f eqn="prod @3 21600 pixelWidth"/>
+                  <v:f eqn="prod @3 21600 pixelHeight"/>
+                  <v:f eqn="sum @0 0 1"/>
+                  <v:f eqn="prod @6 1 2"/>
+                  <v:f eqn="prod @7 21600 pixelWidth"/>
+                  <v:f eqn="sum @8 21600 0"/>
+                  <v:f eqn="prod @7 21600 pixelHeight"/>
+                  <v:f eqn="sum @10 21600 0"/>
+                </v:formulas>
+                <v:path o:extrusionok="f" gradientshapeok="t" o:connecttype="rect"/>
+                <o:lock v:ext="edit" aspectratio="t"/>
+              </v:shapetype>
+              <v:shape id="_x0000_i7" o:spid="_x0000_s7" type="#_x0000_t75" style="width:467.75pt;height:562.30pt;mso-wrap-distance-left:0.00pt;mso-wrap-distance-top:0.00pt;mso-wrap-distance-right:0.00pt;mso-wrap-distance-bottom:0.00pt;z-index:1;" stroked="false">
+                <v:imagedata r:id="rId19" o:title=""/>
+                <o:lock v:ext="edit" rotation="t"/>
+              </v:shape>
+            </w:pict>
+          </mc:Fallback>
+        </mc:AlternateContent>
+      </w:r>
+      <w:r>
+        <w:rPr>
+          <w:color w:val="000000" w:themeColor="text1"/>
+          <w:sz w:val="22"/>
+          <w:szCs w:val="22"/>
+          <w:highlight w:val="none"/>
+        </w:rPr>
+      </w:r>
+    </w:p>
+    <w:p>
+      <w:pPr>
+        <w:pBdr/>
+        <w:spacing/>
+        <w:ind/>
+        <w:rPr>
+          <w:color w:val="000000" w:themeColor="text1"/>
+          <w:sz w:val="22"/>
+          <w:szCs w:val="22"/>
+          <w:highlight w:val="none"/>
+        </w:rPr>
+      </w:pPr>
+      <w:r>
+        <w:rPr>
+          <w:color w:val="000000" w:themeColor="text1"/>
+          <w:sz w:val="22"/>
+          <w:szCs w:val="22"/>
+          <w:highlight w:val="none"/>
+        </w:rPr>
+        <w:t xml:space="preserve">This same basic algorithm will be used by both the loop that finds the scale, and the loop that finds the numeric value of the attribute we’re interested in. Some caveats will need to be introduced, with the scale we need to evaluate it as a power of 10, and with the value we need to take into account the fact that it could be negative and could also be given using “E notation” (a way of writing standard form that uses E to represent the 10^ part, e.g. 1250 = 1.25 * 10^3 = 1.25E3). I will describe how I’ve handled this in the individual sections on finding the scale and finding the value.</w:t>
+      </w:r>
+      <w:r>
+        <w:rPr>
+          <w:color w:val="000000" w:themeColor="text1"/>
+          <w:sz w:val="22"/>
+          <w:szCs w:val="22"/>
+          <w:highlight w:val="none"/>
+        </w:rPr>
+      </w:r>
+      <w:r>
+        <w:rPr>
+          <w:color w:val="000000" w:themeColor="text1"/>
+          <w:sz w:val="22"/>
+          <w:szCs w:val="22"/>
+          <w:highlight w:val="none"/>
+        </w:rPr>
+      </w:r>
+    </w:p>
+    <w:p>
+      <w:pPr>
+        <w:pBdr/>
+        <w:spacing/>
+        <w:ind/>
+        <w:rPr>
+          <w:color w:val="2f5496" w:themeColor="accent5" w:themeShade="BF"/>
           <w:sz w:val="24"/>
           <w:szCs w:val="24"/>
           <w:highlight w:val="none"/>
         </w:rPr>
-      </w:r>
-      <w:r>
-        <w:rPr>
-          <w:color w:val="4472c4" w:themeColor="accent5"/>
+      </w:pPr>
+      <w:r>
+        <w:rPr>
+          <w:color w:val="2f5496" w:themeColor="accent5" w:themeShade="BF"/>
+          <w:sz w:val="24"/>
+          <w:szCs w:val="20"/>
+          <w:highlight w:val="none"/>
+        </w:rPr>
+        <w:t xml:space="preserve">Finding the scale</w:t>
+      </w:r>
+      <w:r>
+        <w:rPr>
+          <w:color w:val="000000" w:themeColor="text1"/>
+          <w:sz w:val="22"/>
+          <w:szCs w:val="22"/>
+          <w:highlight w:val="none"/>
+        </w:rPr>
+      </w:r>
+      <w:r>
+        <w:rPr>
+          <w:color w:val="2f5496" w:themeColor="accent5" w:themeShade="BF"/>
           <w:sz w:val="24"/>
           <w:szCs w:val="24"/>
+          <w:highlight w:val="none"/>
+        </w:rPr>
+      </w:r>
+    </w:p>
+    <w:p>
+      <w:pPr>
+        <w:pBdr/>
+        <w:spacing/>
+        <w:ind/>
+        <w:rPr>
+          <w:color w:val="000000" w:themeColor="text1"/>
+          <w:sz w:val="22"/>
+          <w:szCs w:val="22"/>
+          <w:highlight w:val="none"/>
+        </w:rPr>
+      </w:pPr>
+      <w:r>
+        <w:rPr>
+          <w:color w:val="000000" w:themeColor="text1"/>
+          <w:sz w:val="22"/>
+          <w:szCs w:val="22"/>
+          <w:highlight w:val="none"/>
+        </w:rPr>
+      </w:r>
+      <w:r>
+        <w:rPr>
+          <w:color w:val="000000" w:themeColor="text1"/>
+          <w:sz w:val="22"/>
+          <w:szCs w:val="22"/>
+          <w:highlight w:val="none"/>
+        </w:rPr>
+      </w:r>
+    </w:p>
+    <w:p>
+      <w:pPr>
+        <w:pBdr/>
+        <w:spacing/>
+        <w:ind/>
+        <w:rPr>
+          <w:color w:val="5b9bd5" w:themeColor="accent1"/>
+          <w:sz w:val="28"/>
+          <w:szCs w:val="28"/>
+          <w:highlight w:val="none"/>
+        </w:rPr>
+      </w:pPr>
+      <w:r>
+        <w:rPr>
+          <w:color w:val="5b9bd5" w:themeColor="accent1"/>
+          <w:sz w:val="28"/>
+          <w:szCs w:val="28"/>
+          <w:highlight w:val="none"/>
+        </w:rPr>
+      </w:r>
+      <w:r>
+        <w:rPr>
+          <w:color w:val="5b9bd5" w:themeColor="accent1"/>
+          <w:sz w:val="28"/>
+          <w:szCs w:val="28"/>
+          <w:highlight w:val="none"/>
+        </w:rPr>
+      </w:r>
+    </w:p>
+    <w:p>
+      <w:pPr>
+        <w:pBdr/>
+        <w:spacing/>
+        <w:ind/>
+        <w:rPr>
+          <w:color w:val="5b9bd5" w:themeColor="accent1"/>
+          <w:sz w:val="28"/>
+          <w:szCs w:val="28"/>
+          <w:highlight w:val="none"/>
+        </w:rPr>
+      </w:pPr>
+      <w:r>
+        <w:rPr>
+          <w:color w:val="5b9bd5" w:themeColor="accent1"/>
+          <w:sz w:val="28"/>
+          <w:szCs w:val="28"/>
+          <w:highlight w:val="none"/>
+        </w:rPr>
+        <w:t xml:space="preserve">Vectors</w:t>
+      </w:r>
+      <w:r>
+        <w:rPr>
+          <w:color w:val="5b9bd5" w:themeColor="accent1"/>
+          <w:sz w:val="24"/>
+          <w:szCs w:val="24"/>
+          <w:highlight w:val="none"/>
+        </w:rPr>
+      </w:r>
+      <w:r>
+        <w:rPr>
+          <w:color w:val="5b9bd5" w:themeColor="accent1"/>
+          <w:sz w:val="28"/>
+          <w:szCs w:val="28"/>
           <w:highlight w:val="none"/>
         </w:rPr>
       </w:r>
@@ -1085,7 +3111,7 @@
       </m:oMathPara>
       <w:r>
         <w:rPr>
-          <w:color w:val="000000" w:themeColor="text1"/>
+          <w:color w:val="000000"/>
           <w:sz w:val="22"/>
           <w:szCs w:val="22"/>
           <w:highlight w:val="none"/>
@@ -1241,7 +3267,7 @@
               <wp:inline xmlns:wp="http://schemas.openxmlformats.org/drawingml/2006/wordprocessingDrawing" distT="0" distB="0" distL="0" distR="0">
                 <wp:extent cx="5940425" cy="1965635"/>
                 <wp:effectExtent l="0" t="0" r="0" b="0"/>
-                <wp:docPr id="2" name="" hidden="0"/>
+                <wp:docPr id="9" name="" hidden="0"/>
                 <wp:cNvGraphicFramePr>
                   <a:graphicFrameLocks xmlns:a="http://schemas.openxmlformats.org/drawingml/2006/main" noChangeAspect="1"/>
                 </wp:cNvGraphicFramePr>
@@ -1256,7 +3282,7 @@
                         <pic:nvPr isPhoto="0" userDrawn="0"/>
                       </pic:nvPicPr>
                       <pic:blipFill>
-                        <a:blip r:embed="rId10"/>
+                        <a:blip r:embed="rId20"/>
                         <a:stretch/>
                       </pic:blipFill>
                       <pic:spPr bwMode="auto">
@@ -1295,8 +3321,8 @@
                 <v:path o:extrusionok="f" gradientshapeok="t" o:connecttype="rect"/>
                 <o:lock v:ext="edit" aspectratio="t"/>
               </v:shapetype>
-              <v:shape id="_x0000_i1" o:spid="_x0000_s1" type="#_x0000_t75" style="width:467.75pt;height:154.77pt;mso-wrap-distance-left:0.00pt;mso-wrap-distance-top:0.00pt;mso-wrap-distance-right:0.00pt;mso-wrap-distance-bottom:0.00pt;z-index:1;" stroked="false">
-                <v:imagedata r:id="rId10" o:title=""/>
+              <v:shape id="_x0000_i8" o:spid="_x0000_s8" type="#_x0000_t75" style="width:467.75pt;height:154.77pt;mso-wrap-distance-left:0.00pt;mso-wrap-distance-top:0.00pt;mso-wrap-distance-right:0.00pt;mso-wrap-distance-bottom:0.00pt;z-index:1;" stroked="false">
+                <v:imagedata r:id="rId20" o:title=""/>
                 <o:lock v:ext="edit" rotation="t"/>
               </v:shape>
             </w:pict>
@@ -1456,7 +3482,7 @@
               <wp:inline xmlns:wp="http://schemas.openxmlformats.org/drawingml/2006/wordprocessingDrawing" distT="0" distB="0" distL="0" distR="0">
                 <wp:extent cx="2781300" cy="1647825"/>
                 <wp:effectExtent l="0" t="0" r="0" b="0"/>
-                <wp:docPr id="3" name="" hidden="0"/>
+                <wp:docPr id="10" name="" hidden="0"/>
                 <wp:cNvGraphicFramePr>
                   <a:graphicFrameLocks xmlns:a="http://schemas.openxmlformats.org/drawingml/2006/main" noChangeAspect="1"/>
                 </wp:cNvGraphicFramePr>
@@ -1471,7 +3497,7 @@
                         <pic:nvPr isPhoto="0" userDrawn="0"/>
                       </pic:nvPicPr>
                       <pic:blipFill>
-                        <a:blip r:embed="rId11"/>
+                        <a:blip r:embed="rId21"/>
                         <a:stretch/>
                       </pic:blipFill>
                       <pic:spPr bwMode="auto">
@@ -1510,8 +3536,8 @@
                 <v:path o:extrusionok="f" gradientshapeok="t" o:connecttype="rect"/>
                 <o:lock v:ext="edit" aspectratio="t"/>
               </v:shapetype>
-              <v:shape id="_x0000_i2" o:spid="_x0000_s2" type="#_x0000_t75" style="width:219.00pt;height:129.75pt;mso-wrap-distance-left:0.00pt;mso-wrap-distance-top:0.00pt;mso-wrap-distance-right:0.00pt;mso-wrap-distance-bottom:0.00pt;z-index:1;" stroked="false">
-                <v:imagedata r:id="rId11" o:title=""/>
+              <v:shape id="_x0000_i9" o:spid="_x0000_s9" type="#_x0000_t75" style="width:219.00pt;height:129.75pt;mso-wrap-distance-left:0.00pt;mso-wrap-distance-top:0.00pt;mso-wrap-distance-right:0.00pt;mso-wrap-distance-bottom:0.00pt;z-index:1;" stroked="false">
+                <v:imagedata r:id="rId21" o:title=""/>
                 <o:lock v:ext="edit" rotation="t"/>
               </v:shape>
             </w:pict>
@@ -1926,7 +3952,7 @@
               <wp:inline xmlns:wp="http://schemas.openxmlformats.org/drawingml/2006/wordprocessingDrawing" distT="0" distB="0" distL="0" distR="0">
                 <wp:extent cx="5225415" cy="3346555"/>
                 <wp:effectExtent l="0" t="0" r="0" b="0"/>
-                <wp:docPr id="4" name="" hidden="0"/>
+                <wp:docPr id="11" name="" hidden="0"/>
                 <wp:cNvGraphicFramePr>
                   <a:graphicFrameLocks xmlns:a="http://schemas.openxmlformats.org/drawingml/2006/main" noChangeAspect="1"/>
                 </wp:cNvGraphicFramePr>
@@ -1941,7 +3967,7 @@
                         <pic:nvPr isPhoto="0" userDrawn="0"/>
                       </pic:nvPicPr>
                       <pic:blipFill>
-                        <a:blip r:embed="rId12"/>
+                        <a:blip r:embed="rId22"/>
                         <a:stretch/>
                       </pic:blipFill>
                       <pic:spPr bwMode="auto">
@@ -1980,8 +4006,8 @@
                 <v:path o:extrusionok="f" gradientshapeok="t" o:connecttype="rect"/>
                 <o:lock v:ext="edit" aspectratio="t"/>
               </v:shapetype>
-              <v:shape id="_x0000_i3" o:spid="_x0000_s3" type="#_x0000_t75" style="width:411.45pt;height:263.51pt;mso-wrap-distance-left:0.00pt;mso-wrap-distance-top:0.00pt;mso-wrap-distance-right:0.00pt;mso-wrap-distance-bottom:0.00pt;rotation:0;z-index:1;" stroked="false">
-                <v:imagedata r:id="rId12" o:title=""/>
+              <v:shape id="_x0000_i10" o:spid="_x0000_s10" type="#_x0000_t75" style="width:411.45pt;height:263.51pt;mso-wrap-distance-left:0.00pt;mso-wrap-distance-top:0.00pt;mso-wrap-distance-right:0.00pt;mso-wrap-distance-bottom:0.00pt;rotation:0;z-index:1;" stroked="false">
+                <v:imagedata r:id="rId22" o:title=""/>
                 <o:lock v:ext="edit" rotation="t"/>
               </v:shape>
             </w:pict>
@@ -2421,7 +4447,7 @@
               <wp:inline xmlns:wp="http://schemas.openxmlformats.org/drawingml/2006/wordprocessingDrawing" distT="0" distB="0" distL="0" distR="0">
                 <wp:extent cx="6086607" cy="5966460"/>
                 <wp:effectExtent l="0" t="0" r="0" b="0"/>
-                <wp:docPr id="5" name="" hidden="0"/>
+                <wp:docPr id="12" name="" hidden="0"/>
                 <wp:cNvGraphicFramePr>
                   <a:graphicFrameLocks xmlns:a="http://schemas.openxmlformats.org/drawingml/2006/main" noChangeAspect="1"/>
                 </wp:cNvGraphicFramePr>
@@ -2436,7 +4462,7 @@
                         <pic:nvPr isPhoto="0" userDrawn="0"/>
                       </pic:nvPicPr>
                       <pic:blipFill>
-                        <a:blip r:embed="rId13"/>
+                        <a:blip r:embed="rId23"/>
                         <a:stretch/>
                       </pic:blipFill>
                       <pic:spPr bwMode="auto">
@@ -2475,8 +4501,8 @@
                 <v:path o:extrusionok="f" gradientshapeok="t" o:connecttype="rect"/>
                 <o:lock v:ext="edit" aspectratio="t"/>
               </v:shapetype>
-              <v:shape id="_x0000_i4" o:spid="_x0000_s4" type="#_x0000_t75" style="width:479.26pt;height:469.80pt;mso-wrap-distance-left:0.00pt;mso-wrap-distance-top:0.00pt;mso-wrap-distance-right:0.00pt;mso-wrap-distance-bottom:0.00pt;rotation:0;z-index:1;" stroked="false">
-                <v:imagedata r:id="rId13" o:title=""/>
+              <v:shape id="_x0000_i11" o:spid="_x0000_s11" type="#_x0000_t75" style="width:479.26pt;height:469.80pt;mso-wrap-distance-left:0.00pt;mso-wrap-distance-top:0.00pt;mso-wrap-distance-right:0.00pt;mso-wrap-distance-bottom:0.00pt;rotation:0;z-index:1;" stroked="false">
+                <v:imagedata r:id="rId23" o:title=""/>
                 <o:lock v:ext="edit" rotation="t"/>
               </v:shape>
             </w:pict>
@@ -2732,7 +4758,7 @@
               <wp:inline xmlns:wp="http://schemas.openxmlformats.org/drawingml/2006/wordprocessingDrawing" distT="0" distB="0" distL="0" distR="0">
                 <wp:extent cx="4618588" cy="6662610"/>
                 <wp:effectExtent l="0" t="0" r="0" b="0"/>
-                <wp:docPr id="6" name="" hidden="0"/>
+                <wp:docPr id="13" name="" hidden="0"/>
                 <wp:cNvGraphicFramePr>
                   <a:graphicFrameLocks xmlns:a="http://schemas.openxmlformats.org/drawingml/2006/main" noChangeAspect="1"/>
                 </wp:cNvGraphicFramePr>
@@ -2747,7 +4773,7 @@
                         <pic:nvPr isPhoto="0" userDrawn="0"/>
                       </pic:nvPicPr>
                       <pic:blipFill>
-                        <a:blip r:embed="rId14"/>
+                        <a:blip r:embed="rId24"/>
                         <a:stretch/>
                       </pic:blipFill>
                       <pic:spPr bwMode="auto">
@@ -2786,8 +4812,8 @@
                 <v:path o:extrusionok="f" gradientshapeok="t" o:connecttype="rect"/>
                 <o:lock v:ext="edit" aspectratio="t"/>
               </v:shapetype>
-              <v:shape id="_x0000_i5" o:spid="_x0000_s5" type="#_x0000_t75" style="width:363.67pt;height:524.61pt;mso-wrap-distance-left:0.00pt;mso-wrap-distance-top:0.00pt;mso-wrap-distance-right:0.00pt;mso-wrap-distance-bottom:0.00pt;rotation:0;z-index:1;" stroked="false">
-                <v:imagedata r:id="rId14" o:title=""/>
+              <v:shape id="_x0000_i12" o:spid="_x0000_s12" type="#_x0000_t75" style="width:363.67pt;height:524.61pt;mso-wrap-distance-left:0.00pt;mso-wrap-distance-top:0.00pt;mso-wrap-distance-right:0.00pt;mso-wrap-distance-bottom:0.00pt;rotation:0;z-index:1;" stroked="false">
+                <v:imagedata r:id="rId24" o:title=""/>
                 <o:lock v:ext="edit" rotation="t"/>
               </v:shape>
             </w:pict>
@@ -2980,7 +5006,7 @@
               <wp:inline xmlns:wp="http://schemas.openxmlformats.org/drawingml/2006/wordprocessingDrawing" distT="0" distB="0" distL="0" distR="0">
                 <wp:extent cx="5940425" cy="5569148"/>
                 <wp:effectExtent l="0" t="0" r="0" b="0"/>
-                <wp:docPr id="7" name=""/>
+                <wp:docPr id="14" name=""/>
                 <wp:cNvGraphicFramePr>
                   <a:graphicFrameLocks xmlns:a="http://schemas.openxmlformats.org/drawingml/2006/main" noChangeAspect="1"/>
                 </wp:cNvGraphicFramePr>
@@ -2995,7 +5021,7 @@
                         <pic:nvPr/>
                       </pic:nvPicPr>
                       <pic:blipFill>
-                        <a:blip r:embed="rId15"/>
+                        <a:blip r:embed="rId25"/>
                         <a:stretch/>
                       </pic:blipFill>
                       <pic:spPr bwMode="auto">
@@ -3034,8 +5060,8 @@
                 <v:path o:extrusionok="f" gradientshapeok="t" o:connecttype="rect"/>
                 <o:lock v:ext="edit" aspectratio="t"/>
               </v:shapetype>
-              <v:shape id="_x0000_i6" o:spid="_x0000_s6" type="#_x0000_t75" style="width:467.75pt;height:438.52pt;mso-wrap-distance-left:0.00pt;mso-wrap-distance-top:0.00pt;mso-wrap-distance-right:0.00pt;mso-wrap-distance-bottom:0.00pt;z-index:1;" stroked="false">
-                <v:imagedata r:id="rId15" o:title=""/>
+              <v:shape id="_x0000_i13" o:spid="_x0000_s13" type="#_x0000_t75" style="width:467.75pt;height:438.52pt;mso-wrap-distance-left:0.00pt;mso-wrap-distance-top:0.00pt;mso-wrap-distance-right:0.00pt;mso-wrap-distance-bottom:0.00pt;z-index:1;" stroked="false">
+                <v:imagedata r:id="rId25" o:title=""/>
                 <o:lock v:ext="edit" rotation="t"/>
               </v:shape>
             </w:pict>
@@ -3266,8 +5292,8 @@
       <w:r>
         <w:rPr>
           <w:color w:val="2f5496" w:themeColor="accent5" w:themeShade="BF"/>
-          <w:sz w:val="28"/>
-          <w:szCs w:val="28"/>
+          <w:sz w:val="24"/>
+          <w:szCs w:val="24"/>
           <w:highlight w:val="none"/>
           <w:vertAlign w:val="baseline"/>
         </w:rPr>
@@ -4440,7 +6466,7 @@
               <wp:inline xmlns:wp="http://schemas.openxmlformats.org/drawingml/2006/wordprocessingDrawing" distT="0" distB="0" distL="0" distR="0">
                 <wp:extent cx="5940425" cy="1654572"/>
                 <wp:effectExtent l="0" t="0" r="0" b="0"/>
-                <wp:docPr id="8" name=""/>
+                <wp:docPr id="15" name=""/>
                 <wp:cNvGraphicFramePr>
                   <a:graphicFrameLocks xmlns:a="http://schemas.openxmlformats.org/drawingml/2006/main" noChangeAspect="1"/>
                 </wp:cNvGraphicFramePr>
@@ -4455,7 +6481,7 @@
                         <pic:nvPr/>
                       </pic:nvPicPr>
                       <pic:blipFill>
-                        <a:blip r:embed="rId16"/>
+                        <a:blip r:embed="rId26"/>
                         <a:stretch/>
                       </pic:blipFill>
                       <pic:spPr bwMode="auto">
@@ -4494,8 +6520,8 @@
                 <v:path o:extrusionok="f" gradientshapeok="t" o:connecttype="rect"/>
                 <o:lock v:ext="edit" aspectratio="t"/>
               </v:shapetype>
-              <v:shape id="_x0000_i7" o:spid="_x0000_s7" type="#_x0000_t75" style="width:467.75pt;height:130.28pt;mso-wrap-distance-left:0.00pt;mso-wrap-distance-top:0.00pt;mso-wrap-distance-right:0.00pt;mso-wrap-distance-bottom:0.00pt;z-index:1;" stroked="false">
-                <v:imagedata r:id="rId16" o:title=""/>
+              <v:shape id="_x0000_i14" o:spid="_x0000_s14" type="#_x0000_t75" style="width:467.75pt;height:130.28pt;mso-wrap-distance-left:0.00pt;mso-wrap-distance-top:0.00pt;mso-wrap-distance-right:0.00pt;mso-wrap-distance-bottom:0.00pt;z-index:1;" stroked="false">
+                <v:imagedata r:id="rId26" o:title=""/>
                 <o:lock v:ext="edit" rotation="t"/>
               </v:shape>
             </w:pict>
@@ -5391,6 +7417,7 @@
       </m:oMathPara>
       <w:r>
         <w:rPr>
+          <w:rFonts w:ascii="Cambria Math" w:hAnsi="Cambria Math" w:eastAsia="Cambria Math" w:cs="Cambria Math"/>
           <w:color w:val="auto"/>
           <w:sz w:val="22"/>
           <w:szCs w:val="22"/>
@@ -5527,7 +7554,7 @@
               <wp:inline xmlns:wp="http://schemas.openxmlformats.org/drawingml/2006/wordprocessingDrawing" distT="0" distB="0" distL="0" distR="0">
                 <wp:extent cx="5940425" cy="1330714"/>
                 <wp:effectExtent l="0" t="0" r="0" b="0"/>
-                <wp:docPr id="9" name=""/>
+                <wp:docPr id="16" name=""/>
                 <wp:cNvGraphicFramePr>
                   <a:graphicFrameLocks xmlns:a="http://schemas.openxmlformats.org/drawingml/2006/main" noChangeAspect="1"/>
                 </wp:cNvGraphicFramePr>
@@ -5542,7 +7569,7 @@
                         <pic:nvPr/>
                       </pic:nvPicPr>
                       <pic:blipFill>
-                        <a:blip r:embed="rId17"/>
+                        <a:blip r:embed="rId27"/>
                         <a:stretch/>
                       </pic:blipFill>
                       <pic:spPr bwMode="auto">
@@ -5581,8 +7608,8 @@
                 <v:path o:extrusionok="f" gradientshapeok="t" o:connecttype="rect"/>
                 <o:lock v:ext="edit" aspectratio="t"/>
               </v:shapetype>
-              <v:shape id="_x0000_i8" o:spid="_x0000_s8" type="#_x0000_t75" style="width:467.75pt;height:104.78pt;mso-wrap-distance-left:0.00pt;mso-wrap-distance-top:0.00pt;mso-wrap-distance-right:0.00pt;mso-wrap-distance-bottom:0.00pt;z-index:1;" stroked="false">
-                <v:imagedata r:id="rId17" o:title=""/>
+              <v:shape id="_x0000_i15" o:spid="_x0000_s15" type="#_x0000_t75" style="width:467.75pt;height:104.78pt;mso-wrap-distance-left:0.00pt;mso-wrap-distance-top:0.00pt;mso-wrap-distance-right:0.00pt;mso-wrap-distance-bottom:0.00pt;z-index:1;" stroked="false">
+                <v:imagedata r:id="rId27" o:title=""/>
                 <o:lock v:ext="edit" rotation="t"/>
               </v:shape>
             </w:pict>
@@ -5837,7 +7864,7 @@
               <wp:inline xmlns:wp="http://schemas.openxmlformats.org/drawingml/2006/wordprocessingDrawing" distT="0" distB="0" distL="0" distR="0">
                 <wp:extent cx="3701415" cy="7641631"/>
                 <wp:effectExtent l="0" t="0" r="0" b="0"/>
-                <wp:docPr id="10" name="" hidden="0"/>
+                <wp:docPr id="17" name="" hidden="0"/>
                 <wp:cNvGraphicFramePr>
                   <a:graphicFrameLocks xmlns:a="http://schemas.openxmlformats.org/drawingml/2006/main" noChangeAspect="1"/>
                 </wp:cNvGraphicFramePr>
@@ -5852,7 +7879,7 @@
                         <pic:nvPr isPhoto="0" userDrawn="0"/>
                       </pic:nvPicPr>
                       <pic:blipFill>
-                        <a:blip r:embed="rId18"/>
+                        <a:blip r:embed="rId28"/>
                         <a:stretch/>
                       </pic:blipFill>
                       <pic:spPr bwMode="auto">
@@ -5891,8 +7918,8 @@
                 <v:path o:extrusionok="f" gradientshapeok="t" o:connecttype="rect"/>
                 <o:lock v:ext="edit" aspectratio="t"/>
               </v:shapetype>
-              <v:shape id="_x0000_i9" o:spid="_x0000_s9" type="#_x0000_t75" style="width:291.45pt;height:601.70pt;mso-wrap-distance-left:0.00pt;mso-wrap-distance-top:0.00pt;mso-wrap-distance-right:0.00pt;mso-wrap-distance-bottom:0.00pt;z-index:1;" stroked="false">
-                <v:imagedata r:id="rId18" o:title=""/>
+              <v:shape id="_x0000_i16" o:spid="_x0000_s16" type="#_x0000_t75" style="width:291.45pt;height:601.70pt;mso-wrap-distance-left:0.00pt;mso-wrap-distance-top:0.00pt;mso-wrap-distance-right:0.00pt;mso-wrap-distance-bottom:0.00pt;z-index:1;" stroked="false">
+                <v:imagedata r:id="rId28" o:title=""/>
                 <o:lock v:ext="edit" rotation="t"/>
               </v:shape>
             </w:pict>
@@ -6257,7 +8284,7 @@
               <wp:inline xmlns:wp="http://schemas.openxmlformats.org/drawingml/2006/wordprocessingDrawing" distT="0" distB="0" distL="0" distR="0">
                 <wp:extent cx="5940425" cy="868688"/>
                 <wp:effectExtent l="0" t="0" r="0" b="0"/>
-                <wp:docPr id="11" name="" hidden="0"/>
+                <wp:docPr id="18" name="" hidden="0"/>
                 <wp:cNvGraphicFramePr>
                   <a:graphicFrameLocks xmlns:a="http://schemas.openxmlformats.org/drawingml/2006/main" noChangeAspect="1"/>
                 </wp:cNvGraphicFramePr>
@@ -6272,7 +8299,7 @@
                         <pic:nvPr isPhoto="0" userDrawn="0"/>
                       </pic:nvPicPr>
                       <pic:blipFill>
-                        <a:blip r:embed="rId19"/>
+                        <a:blip r:embed="rId29"/>
                         <a:stretch/>
                       </pic:blipFill>
                       <pic:spPr bwMode="auto">
@@ -6311,8 +8338,8 @@
                 <v:path o:extrusionok="f" gradientshapeok="t" o:connecttype="rect"/>
                 <o:lock v:ext="edit" aspectratio="t"/>
               </v:shapetype>
-              <v:shape id="_x0000_i10" o:spid="_x0000_s10" type="#_x0000_t75" style="width:467.75pt;height:68.40pt;mso-wrap-distance-left:0.00pt;mso-wrap-distance-top:0.00pt;mso-wrap-distance-right:0.00pt;mso-wrap-distance-bottom:0.00pt;z-index:1;" stroked="false">
-                <v:imagedata r:id="rId19" o:title=""/>
+              <v:shape id="_x0000_i17" o:spid="_x0000_s17" type="#_x0000_t75" style="width:467.75pt;height:68.40pt;mso-wrap-distance-left:0.00pt;mso-wrap-distance-top:0.00pt;mso-wrap-distance-right:0.00pt;mso-wrap-distance-bottom:0.00pt;z-index:1;" stroked="false">
+                <v:imagedata r:id="rId29" o:title=""/>
                 <o:lock v:ext="edit" rotation="t"/>
               </v:shape>
             </w:pict>
@@ -6484,7 +8511,7 @@
               <wp:inline xmlns:wp="http://schemas.openxmlformats.org/drawingml/2006/wordprocessingDrawing" distT="0" distB="0" distL="0" distR="0">
                 <wp:extent cx="4543425" cy="428625"/>
                 <wp:effectExtent l="0" t="0" r="0" b="0"/>
-                <wp:docPr id="12" name="" hidden="0"/>
+                <wp:docPr id="19" name="" hidden="0"/>
                 <wp:cNvGraphicFramePr>
                   <a:graphicFrameLocks xmlns:a="http://schemas.openxmlformats.org/drawingml/2006/main" noChangeAspect="1"/>
                 </wp:cNvGraphicFramePr>
@@ -6499,7 +8526,7 @@
                         <pic:nvPr isPhoto="0" userDrawn="0"/>
                       </pic:nvPicPr>
                       <pic:blipFill>
-                        <a:blip r:embed="rId20"/>
+                        <a:blip r:embed="rId30"/>
                         <a:stretch/>
                       </pic:blipFill>
                       <pic:spPr bwMode="auto">
@@ -6538,8 +8565,8 @@
                 <v:path o:extrusionok="f" gradientshapeok="t" o:connecttype="rect"/>
                 <o:lock v:ext="edit" aspectratio="t"/>
               </v:shapetype>
-              <v:shape id="_x0000_i11" o:spid="_x0000_s11" type="#_x0000_t75" style="width:357.75pt;height:33.75pt;mso-wrap-distance-left:0.00pt;mso-wrap-distance-top:0.00pt;mso-wrap-distance-right:0.00pt;mso-wrap-distance-bottom:0.00pt;z-index:1;" stroked="false">
-                <v:imagedata r:id="rId20" o:title=""/>
+              <v:shape id="_x0000_i18" o:spid="_x0000_s18" type="#_x0000_t75" style="width:357.75pt;height:33.75pt;mso-wrap-distance-left:0.00pt;mso-wrap-distance-top:0.00pt;mso-wrap-distance-right:0.00pt;mso-wrap-distance-bottom:0.00pt;z-index:1;" stroked="false">
+                <v:imagedata r:id="rId30" o:title=""/>
                 <o:lock v:ext="edit" rotation="t"/>
               </v:shape>
             </w:pict>
@@ -6698,7 +8725,7 @@
               <wp:inline xmlns:wp="http://schemas.openxmlformats.org/drawingml/2006/wordprocessingDrawing" distT="0" distB="0" distL="0" distR="0">
                 <wp:extent cx="4791075" cy="2200275"/>
                 <wp:effectExtent l="0" t="0" r="0" b="0"/>
-                <wp:docPr id="13" name="" hidden="0"/>
+                <wp:docPr id="20" name="" hidden="0"/>
                 <wp:cNvGraphicFramePr>
                   <a:graphicFrameLocks xmlns:a="http://schemas.openxmlformats.org/drawingml/2006/main" noChangeAspect="1"/>
                 </wp:cNvGraphicFramePr>
@@ -6713,7 +8740,7 @@
                         <pic:nvPr isPhoto="0" userDrawn="0"/>
                       </pic:nvPicPr>
                       <pic:blipFill>
-                        <a:blip r:embed="rId21"/>
+                        <a:blip r:embed="rId31"/>
                         <a:stretch/>
                       </pic:blipFill>
                       <pic:spPr bwMode="auto">
@@ -6752,8 +8779,8 @@
                 <v:path o:extrusionok="f" gradientshapeok="t" o:connecttype="rect"/>
                 <o:lock v:ext="edit" aspectratio="t"/>
               </v:shapetype>
-              <v:shape id="_x0000_i12" o:spid="_x0000_s12" type="#_x0000_t75" style="width:377.25pt;height:173.25pt;mso-wrap-distance-left:0.00pt;mso-wrap-distance-top:0.00pt;mso-wrap-distance-right:0.00pt;mso-wrap-distance-bottom:0.00pt;z-index:1;" stroked="false">
-                <v:imagedata r:id="rId21" o:title=""/>
+              <v:shape id="_x0000_i19" o:spid="_x0000_s19" type="#_x0000_t75" style="width:377.25pt;height:173.25pt;mso-wrap-distance-left:0.00pt;mso-wrap-distance-top:0.00pt;mso-wrap-distance-right:0.00pt;mso-wrap-distance-bottom:0.00pt;z-index:1;" stroked="false">
+                <v:imagedata r:id="rId31" o:title=""/>
                 <o:lock v:ext="edit" rotation="t"/>
               </v:shape>
             </w:pict>
@@ -7012,7 +9039,7 @@
               <wp:inline xmlns:wp="http://schemas.openxmlformats.org/drawingml/2006/wordprocessingDrawing" distT="0" distB="0" distL="0" distR="0">
                 <wp:extent cx="4010025" cy="314325"/>
                 <wp:effectExtent l="0" t="0" r="0" b="0"/>
-                <wp:docPr id="14" name="" hidden="0"/>
+                <wp:docPr id="21" name="" hidden="0"/>
                 <wp:cNvGraphicFramePr>
                   <a:graphicFrameLocks xmlns:a="http://schemas.openxmlformats.org/drawingml/2006/main" noChangeAspect="1"/>
                 </wp:cNvGraphicFramePr>
@@ -7027,7 +9054,7 @@
                         <pic:nvPr isPhoto="0" userDrawn="0"/>
                       </pic:nvPicPr>
                       <pic:blipFill>
-                        <a:blip r:embed="rId22"/>
+                        <a:blip r:embed="rId32"/>
                         <a:stretch/>
                       </pic:blipFill>
                       <pic:spPr bwMode="auto">
@@ -7066,8 +9093,8 @@
                 <v:path o:extrusionok="f" gradientshapeok="t" o:connecttype="rect"/>
                 <o:lock v:ext="edit" aspectratio="t"/>
               </v:shapetype>
-              <v:shape id="_x0000_i13" o:spid="_x0000_s13" type="#_x0000_t75" style="width:315.75pt;height:24.75pt;mso-wrap-distance-left:0.00pt;mso-wrap-distance-top:0.00pt;mso-wrap-distance-right:0.00pt;mso-wrap-distance-bottom:0.00pt;z-index:1;" stroked="false">
-                <v:imagedata r:id="rId22" o:title=""/>
+              <v:shape id="_x0000_i20" o:spid="_x0000_s20" type="#_x0000_t75" style="width:315.75pt;height:24.75pt;mso-wrap-distance-left:0.00pt;mso-wrap-distance-top:0.00pt;mso-wrap-distance-right:0.00pt;mso-wrap-distance-bottom:0.00pt;z-index:1;" stroked="false">
+                <v:imagedata r:id="rId32" o:title=""/>
                 <o:lock v:ext="edit" rotation="t"/>
               </v:shape>
             </w:pict>
@@ -7265,6 +9292,7 @@
       </w:r>
     </w:p>
     <w:sectPr>
+      <w:headerReference w:type="default" r:id="rId9"/>
       <w:footnotePr/>
       <w:endnotePr/>
       <w:type w:val="nextPage"/>
@@ -7342,6 +9370,22 @@
 </w:footnotes>
 </file>
 
+<file path=word/header1.xml><?xml version="1.0" encoding="utf-8"?>
+<w:hdr xmlns:wpc="http://schemas.microsoft.com/office/word/2010/wordprocessingCanvas" xmlns:mc="http://schemas.openxmlformats.org/markup-compatibility/2006" xmlns:o="urn:schemas-microsoft-com:office:office" xmlns:r="http://schemas.openxmlformats.org/officeDocument/2006/relationships" xmlns:m="http://schemas.openxmlformats.org/officeDocument/2006/math" xmlns:v="urn:schemas-microsoft-com:vml" xmlns:wp14="http://schemas.microsoft.com/office/word/2010/wordprocessingDrawing" xmlns:wp="http://schemas.openxmlformats.org/drawingml/2006/wordprocessingDrawing" xmlns:w10="urn:schemas-microsoft-com:office:word" xmlns:w="http://schemas.openxmlformats.org/wordprocessingml/2006/main" xmlns:w14="http://schemas.microsoft.com/office/word/2010/wordml" xmlns:w15="http://schemas.microsoft.com/office/word/2012/wordml" xmlns:wpg="http://schemas.microsoft.com/office/word/2010/wordprocessingGroup" xmlns:wpi="http://schemas.microsoft.com/office/word/2010/wordprocessingInk" xmlns:wne="http://schemas.microsoft.com/office/word/2006/wordml" xmlns:a="http://schemas.openxmlformats.org/drawingml/2006/main" xmlns:wps="http://schemas.microsoft.com/office/word/2010/wordprocessingShape" mc:Ignorable="w14 w15 wp14">
+  <w:p>
+    <w:pPr>
+      <w:pStyle w:val="682"/>
+      <w:pBdr/>
+      <w:spacing/>
+      <w:ind/>
+      <w:rPr/>
+    </w:pPr>
+    <w:r/>
+    <w:r/>
+  </w:p>
+</w:hdr>
+</file>
+
 <file path=word/numbering.xml><?xml version="1.0" encoding="utf-8"?>
 <w:numbering xmlns:wpc="http://schemas.microsoft.com/office/word/2010/wordprocessingCanvas" xmlns:mc="http://schemas.openxmlformats.org/markup-compatibility/2006" xmlns:o="urn:schemas-microsoft-com:office:office" xmlns:r="http://schemas.openxmlformats.org/officeDocument/2006/relationships" xmlns:m="http://schemas.openxmlformats.org/officeDocument/2006/math" xmlns:v="urn:schemas-microsoft-com:vml" xmlns:wp14="http://schemas.microsoft.com/office/word/2010/wordprocessingDrawing" xmlns:wp="http://schemas.openxmlformats.org/drawingml/2006/wordprocessingDrawing" xmlns:w10="urn:schemas-microsoft-com:office:word" xmlns:w="http://schemas.openxmlformats.org/wordprocessingml/2006/main" xmlns:w14="http://schemas.microsoft.com/office/word/2010/wordml" xmlns:w15="http://schemas.microsoft.com/office/word/2012/wordml" xmlns:wpg="http://schemas.microsoft.com/office/word/2010/wordprocessingGroup" xmlns:wpi="http://schemas.microsoft.com/office/word/2010/wordprocessingInk" xmlns:wne="http://schemas.microsoft.com/office/word/2006/wordml" xmlns:wps="http://schemas.microsoft.com/office/word/2010/wordprocessingShape" mc:Ignorable="w14 w15 wp14">
   <w:abstractNum w:abstractNumId="0">
@@ -7488,8 +9532,139 @@
       <w:suff w:val="tab"/>
     </w:lvl>
   </w:abstractNum>
+  <w:abstractNum w:abstractNumId="1">
+    <w:lvl w:ilvl="0">
+      <w:isLgl w:val="false"/>
+      <w:lvlJc w:val="left"/>
+      <w:lvlText w:val="%1."/>
+      <w:numFmt w:val="decimal"/>
+      <w:pPr>
+        <w:pBdr/>
+        <w:spacing/>
+        <w:ind w:hanging="360" w:left="709"/>
+      </w:pPr>
+      <w:rPr/>
+      <w:start w:val="1"/>
+      <w:suff w:val="tab"/>
+    </w:lvl>
+    <w:lvl w:ilvl="1">
+      <w:isLgl w:val="false"/>
+      <w:lvlJc w:val="left"/>
+      <w:lvlText w:val="%2."/>
+      <w:numFmt w:val="lowerLetter"/>
+      <w:pPr>
+        <w:pBdr/>
+        <w:spacing/>
+        <w:ind w:hanging="360" w:left="1429"/>
+      </w:pPr>
+      <w:rPr/>
+      <w:start w:val="1"/>
+      <w:suff w:val="tab"/>
+    </w:lvl>
+    <w:lvl w:ilvl="2">
+      <w:isLgl w:val="false"/>
+      <w:lvlJc w:val="right"/>
+      <w:lvlText w:val="%3."/>
+      <w:numFmt w:val="lowerRoman"/>
+      <w:pPr>
+        <w:pBdr/>
+        <w:spacing/>
+        <w:ind w:hanging="180" w:left="2149"/>
+      </w:pPr>
+      <w:rPr/>
+      <w:start w:val="1"/>
+      <w:suff w:val="tab"/>
+    </w:lvl>
+    <w:lvl w:ilvl="3">
+      <w:isLgl w:val="false"/>
+      <w:lvlJc w:val="left"/>
+      <w:lvlText w:val="%4."/>
+      <w:numFmt w:val="decimal"/>
+      <w:pPr>
+        <w:pBdr/>
+        <w:spacing/>
+        <w:ind w:hanging="360" w:left="2869"/>
+      </w:pPr>
+      <w:rPr/>
+      <w:start w:val="1"/>
+      <w:suff w:val="tab"/>
+    </w:lvl>
+    <w:lvl w:ilvl="4">
+      <w:isLgl w:val="false"/>
+      <w:lvlJc w:val="left"/>
+      <w:lvlText w:val="%5."/>
+      <w:numFmt w:val="lowerLetter"/>
+      <w:pPr>
+        <w:pBdr/>
+        <w:spacing/>
+        <w:ind w:hanging="360" w:left="3589"/>
+      </w:pPr>
+      <w:rPr/>
+      <w:start w:val="1"/>
+      <w:suff w:val="tab"/>
+    </w:lvl>
+    <w:lvl w:ilvl="5">
+      <w:isLgl w:val="false"/>
+      <w:lvlJc w:val="right"/>
+      <w:lvlText w:val="%6."/>
+      <w:numFmt w:val="lowerRoman"/>
+      <w:pPr>
+        <w:pBdr/>
+        <w:spacing/>
+        <w:ind w:hanging="180" w:left="4309"/>
+      </w:pPr>
+      <w:rPr/>
+      <w:start w:val="1"/>
+      <w:suff w:val="tab"/>
+    </w:lvl>
+    <w:lvl w:ilvl="6">
+      <w:isLgl w:val="false"/>
+      <w:lvlJc w:val="left"/>
+      <w:lvlText w:val="%7."/>
+      <w:numFmt w:val="decimal"/>
+      <w:pPr>
+        <w:pBdr/>
+        <w:spacing/>
+        <w:ind w:hanging="360" w:left="5029"/>
+      </w:pPr>
+      <w:rPr/>
+      <w:start w:val="1"/>
+      <w:suff w:val="tab"/>
+    </w:lvl>
+    <w:lvl w:ilvl="7">
+      <w:isLgl w:val="false"/>
+      <w:lvlJc w:val="left"/>
+      <w:lvlText w:val="%8."/>
+      <w:numFmt w:val="lowerLetter"/>
+      <w:pPr>
+        <w:pBdr/>
+        <w:spacing/>
+        <w:ind w:hanging="360" w:left="5749"/>
+      </w:pPr>
+      <w:rPr/>
+      <w:start w:val="1"/>
+      <w:suff w:val="tab"/>
+    </w:lvl>
+    <w:lvl w:ilvl="8">
+      <w:isLgl w:val="false"/>
+      <w:lvlJc w:val="right"/>
+      <w:lvlText w:val="%9."/>
+      <w:numFmt w:val="lowerRoman"/>
+      <w:pPr>
+        <w:pBdr/>
+        <w:spacing/>
+        <w:ind w:hanging="180" w:left="6469"/>
+      </w:pPr>
+      <w:rPr/>
+      <w:start w:val="1"/>
+      <w:suff w:val="tab"/>
+    </w:lvl>
+  </w:abstractNum>
   <w:num w:numId="1">
     <w:abstractNumId w:val="0"/>
+  </w:num>
+  <w:num w:numId="2">
+    <w:abstractNumId w:val="1"/>
   </w:num>
 </w:numbering>
 </file>

</xml_diff>

<commit_message>
horizonsParser design is pretty much done!
</commit_message>
<xml_diff>
--- a/Design.docx
+++ b/Design.docx
@@ -1898,7 +1898,7 @@
           <mc:Choice Requires="wpg">
             <w:drawing>
               <wp:inline xmlns:wp="http://schemas.openxmlformats.org/drawingml/2006/wordprocessingDrawing" distT="0" distB="0" distL="0" distR="0">
-                <wp:extent cx="5940425" cy="5667137"/>
+                <wp:extent cx="5940425" cy="4478834"/>
                 <wp:effectExtent l="0" t="0" r="0" b="0"/>
                 <wp:docPr id="6" name=""/>
                 <wp:cNvGraphicFramePr>
@@ -1908,7 +1908,7 @@
                   <a:graphicData uri="http://schemas.openxmlformats.org/drawingml/2006/picture">
                     <pic:pic xmlns:pic="http://schemas.openxmlformats.org/drawingml/2006/picture">
                       <pic:nvPicPr>
-                        <pic:cNvPr id="2110391258" name=""/>
+                        <pic:cNvPr id="824088147" name=""/>
                         <pic:cNvPicPr>
                           <a:picLocks noChangeAspect="1"/>
                         </pic:cNvPicPr>
@@ -1921,7 +1921,7 @@
                       <pic:spPr bwMode="auto">
                         <a:xfrm>
                           <a:off x="0" y="0"/>
-                          <a:ext cx="5940424" cy="5667136"/>
+                          <a:ext cx="5940424" cy="4478834"/>
                         </a:xfrm>
                         <a:prstGeom prst="rect">
                           <a:avLst/>
@@ -1954,7 +1954,7 @@
                 <v:path o:extrusionok="f" gradientshapeok="t" o:connecttype="rect"/>
                 <o:lock v:ext="edit" aspectratio="t"/>
               </v:shapetype>
-              <v:shape id="_x0000_i5" o:spid="_x0000_s5" type="#_x0000_t75" style="width:467.75pt;height:446.23pt;mso-wrap-distance-left:0.00pt;mso-wrap-distance-top:0.00pt;mso-wrap-distance-right:0.00pt;mso-wrap-distance-bottom:0.00pt;z-index:1;" stroked="false">
+              <v:shape id="_x0000_i5" o:spid="_x0000_s5" type="#_x0000_t75" style="width:467.75pt;height:352.66pt;mso-wrap-distance-left:0.00pt;mso-wrap-distance-top:0.00pt;mso-wrap-distance-right:0.00pt;mso-wrap-distance-bottom:0.00pt;z-index:1;" stroked="false">
                 <v:imagedata r:id="rId17" o:title=""/>
                 <o:lock v:ext="edit" rotation="t"/>
               </v:shape>
@@ -1970,6 +1970,17 @@
           <w:highlight w:val="none"/>
         </w:rPr>
       </w:r>
+      <w:r/>
+      <w:r/>
+      <w:r/>
+      <w:r>
+        <w:rPr>
+          <w:color w:val="auto"/>
+          <w:sz w:val="22"/>
+          <w:szCs w:val="22"/>
+          <w:highlight w:val="none"/>
+        </w:rPr>
+      </w:r>
       <w:r>
         <w:rPr>
           <w:color w:val="auto"/>
@@ -2012,7 +2023,7 @@
           <mc:Choice Requires="wpg">
             <w:drawing>
               <wp:inline xmlns:wp="http://schemas.openxmlformats.org/drawingml/2006/wordprocessingDrawing" distT="0" distB="0" distL="0" distR="0">
-                <wp:extent cx="5940425" cy="1466951"/>
+                <wp:extent cx="5940425" cy="2679297"/>
                 <wp:effectExtent l="0" t="0" r="0" b="0"/>
                 <wp:docPr id="7" name=""/>
                 <wp:cNvGraphicFramePr>
@@ -2022,7 +2033,7 @@
                   <a:graphicData uri="http://schemas.openxmlformats.org/drawingml/2006/picture">
                     <pic:pic xmlns:pic="http://schemas.openxmlformats.org/drawingml/2006/picture">
                       <pic:nvPicPr>
-                        <pic:cNvPr id="1468425184" name=""/>
+                        <pic:cNvPr id="853504673" name=""/>
                         <pic:cNvPicPr>
                           <a:picLocks noChangeAspect="1"/>
                         </pic:cNvPicPr>
@@ -2035,7 +2046,7 @@
                       <pic:spPr bwMode="auto">
                         <a:xfrm>
                           <a:off x="0" y="0"/>
-                          <a:ext cx="5940424" cy="1466950"/>
+                          <a:ext cx="5940424" cy="2679296"/>
                         </a:xfrm>
                         <a:prstGeom prst="rect">
                           <a:avLst/>
@@ -2068,7 +2079,7 @@
                 <v:path o:extrusionok="f" gradientshapeok="t" o:connecttype="rect"/>
                 <o:lock v:ext="edit" aspectratio="t"/>
               </v:shapetype>
-              <v:shape id="_x0000_i6" o:spid="_x0000_s6" type="#_x0000_t75" style="width:467.75pt;height:115.51pt;mso-wrap-distance-left:0.00pt;mso-wrap-distance-top:0.00pt;mso-wrap-distance-right:0.00pt;mso-wrap-distance-bottom:0.00pt;z-index:1;" stroked="false">
+              <v:shape id="_x0000_i6" o:spid="_x0000_s6" type="#_x0000_t75" style="width:467.75pt;height:210.97pt;mso-wrap-distance-left:0.00pt;mso-wrap-distance-top:0.00pt;mso-wrap-distance-right:0.00pt;mso-wrap-distance-bottom:0.00pt;z-index:1;" stroked="false">
                 <v:imagedata r:id="rId18" o:title=""/>
                 <o:lock v:ext="edit" rotation="t"/>
               </v:shape>
@@ -2084,6 +2095,7 @@
           <w:highlight w:val="none"/>
         </w:rPr>
       </w:r>
+      <w:r/>
       <w:r>
         <w:rPr>
           <w:color w:val="5b9bd5" w:themeColor="accent1"/>
@@ -2092,6 +2104,14 @@
           <w:highlight w:val="none"/>
         </w:rPr>
       </w:r>
+      <w:r>
+        <w:rPr>
+          <w:color w:val="5b9bd5" w:themeColor="accent1"/>
+          <w:sz w:val="28"/>
+          <w:szCs w:val="28"/>
+          <w:highlight w:val="none"/>
+        </w:rPr>
+      </w:r>
     </w:p>
     <w:p>
       <w:pPr>
@@ -2179,7 +2199,7 @@
           <w:szCs w:val="22"/>
           <w:highlight w:val="none"/>
         </w:rPr>
-        <w:t xml:space="preserve">Now that we have a high level overview of how getEphemeris works, let’s analyse how it actually gets numeric values from the text. extractValue will be given a section of the response starting from the key phrase and continuing for a few dozen characters so that it only gets the number relating to the attribute we’re interested in. extractValue will need to do two things:</w:t>
+        <w:t xml:space="preserve">Now that we have a high level overview of how getEphemeris works, let’s analyse how it actually gets numeric values from the text. extractValue will be given a section of the response starting from the key phrase and continuing for a few dozen characters so that it only gets the number relating to the attribute we’re interested in and doesn’t accidentally find the value of something else. extractValue will need to do two things:</w:t>
       </w:r>
       <w:r>
         <w:rPr>
@@ -2436,7 +2456,7 @@
           <w:szCs w:val="22"/>
           <w:highlight w:val="none"/>
         </w:rPr>
-        <w:t xml:space="preserve">This same basic algorithm will be used by both the loop that finds the scale, and the loop that finds the numeric value of the attribute we’re interested in. Some caveats will need to be introduced, with the scale we need to evaluate it as a power of 10, and with the value we need to take into account the fact that it could be negative and could also be given using “E notation” (a way of writing standard form that uses E to represent the 10^ part, e.g. 1250 = 1.25 * 10^3 = 1.25E3). I will describe how I’ve handled this in the individual sections on finding the scale and finding the value.</w:t>
+        <w:t xml:space="preserve">This same basic algorithm will be used by both the loop that finds the scale, and the loop that finds the numeric value of the attribute we’re interested in. Here is how one might implement it in pseudocode with a given piece of text:</w:t>
       </w:r>
       <w:r>
         <w:rPr>
@@ -2446,14 +2466,161 @@
           <w:highlight w:val="none"/>
         </w:rPr>
       </w:r>
-      <w:r>
+    </w:p>
+    <w:p>
+      <w:pPr>
+        <w:pBdr/>
+        <w:spacing/>
+        <w:ind/>
         <w:rPr>
           <w:color w:val="000000" w:themeColor="text1"/>
           <w:sz w:val="22"/>
           <w:szCs w:val="22"/>
           <w:highlight w:val="none"/>
         </w:rPr>
-      </w:r>
+      </w:pPr>
+      <w:r>
+        <w:rPr>
+          <w:color w:val="000000" w:themeColor="text1"/>
+          <w:sz w:val="22"/>
+          <w:szCs w:val="22"/>
+          <w:highlight w:val="none"/>
+        </w:rPr>
+      </w:r>
+      <w:r>
+        <mc:AlternateContent>
+          <mc:Choice Requires="wpg">
+            <w:drawing>
+              <wp:inline xmlns:wp="http://schemas.openxmlformats.org/drawingml/2006/wordprocessingDrawing" distT="0" distB="0" distL="0" distR="0">
+                <wp:extent cx="5940425" cy="2311791"/>
+                <wp:effectExtent l="0" t="0" r="0" b="0"/>
+                <wp:docPr id="9" name=""/>
+                <wp:cNvGraphicFramePr>
+                  <a:graphicFrameLocks xmlns:a="http://schemas.openxmlformats.org/drawingml/2006/main" noChangeAspect="1"/>
+                </wp:cNvGraphicFramePr>
+                <a:graphic xmlns:a="http://schemas.openxmlformats.org/drawingml/2006/main">
+                  <a:graphicData uri="http://schemas.openxmlformats.org/drawingml/2006/picture">
+                    <pic:pic xmlns:pic="http://schemas.openxmlformats.org/drawingml/2006/picture">
+                      <pic:nvPicPr>
+                        <pic:cNvPr id="192871308" name=""/>
+                        <pic:cNvPicPr>
+                          <a:picLocks noChangeAspect="1"/>
+                        </pic:cNvPicPr>
+                        <pic:nvPr/>
+                      </pic:nvPicPr>
+                      <pic:blipFill>
+                        <a:blip r:embed="rId20"/>
+                        <a:stretch/>
+                      </pic:blipFill>
+                      <pic:spPr bwMode="auto">
+                        <a:xfrm>
+                          <a:off x="0" y="0"/>
+                          <a:ext cx="5940424" cy="2311790"/>
+                        </a:xfrm>
+                        <a:prstGeom prst="rect">
+                          <a:avLst/>
+                        </a:prstGeom>
+                      </pic:spPr>
+                    </pic:pic>
+                  </a:graphicData>
+                </a:graphic>
+              </wp:inline>
+            </w:drawing>
+          </mc:Choice>
+          <mc:Fallback>
+            <w:pict>
+              <v:shapetype id="_x0000_t75" coordsize="21600,21600" o:spt="75" o:preferrelative="t" path="m@4@5l@4@11@9@11@9@5xe" filled="f" stroked="f">
+                <v:stroke joinstyle="miter"/>
+                <v:formulas>
+                  <v:f eqn="if lineDrawn pixelLineWidth 0"/>
+                  <v:f eqn="sum @0 1 0"/>
+                  <v:f eqn="sum 0 0 @1"/>
+                  <v:f eqn="prod @2 1 2"/>
+                  <v:f eqn="prod @3 21600 pixelWidth"/>
+                  <v:f eqn="prod @3 21600 pixelHeight"/>
+                  <v:f eqn="sum @0 0 1"/>
+                  <v:f eqn="prod @6 1 2"/>
+                  <v:f eqn="prod @7 21600 pixelWidth"/>
+                  <v:f eqn="sum @8 21600 0"/>
+                  <v:f eqn="prod @7 21600 pixelHeight"/>
+                  <v:f eqn="sum @10 21600 0"/>
+                </v:formulas>
+                <v:path o:extrusionok="f" gradientshapeok="t" o:connecttype="rect"/>
+                <o:lock v:ext="edit" aspectratio="t"/>
+              </v:shapetype>
+              <v:shape id="_x0000_i8" o:spid="_x0000_s8" type="#_x0000_t75" style="width:467.75pt;height:182.03pt;mso-wrap-distance-left:0.00pt;mso-wrap-distance-top:0.00pt;mso-wrap-distance-right:0.00pt;mso-wrap-distance-bottom:0.00pt;z-index:1;" stroked="false">
+                <v:imagedata r:id="rId20" o:title=""/>
+                <o:lock v:ext="edit" rotation="t"/>
+              </v:shape>
+            </w:pict>
+          </mc:Fallback>
+        </mc:AlternateContent>
+      </w:r>
+      <w:r>
+        <w:rPr>
+          <w:color w:val="000000" w:themeColor="text1"/>
+          <w:sz w:val="22"/>
+          <w:szCs w:val="22"/>
+          <w:highlight w:val="none"/>
+        </w:rPr>
+      </w:r>
+      <w:r/>
+      <w:r>
+        <w:rPr>
+          <w:color w:val="000000" w:themeColor="text1"/>
+          <w:sz w:val="22"/>
+          <w:szCs w:val="22"/>
+          <w:highlight w:val="none"/>
+        </w:rPr>
+      </w:r>
+      <w:r/>
+      <w:r>
+        <w:rPr>
+          <w:color w:val="000000" w:themeColor="text1"/>
+          <w:sz w:val="22"/>
+          <w:szCs w:val="22"/>
+          <w:highlight w:val="none"/>
+        </w:rPr>
+      </w:r>
+      <w:r>
+        <w:rPr>
+          <w:color w:val="000000" w:themeColor="text1"/>
+          <w:sz w:val="22"/>
+          <w:szCs w:val="22"/>
+          <w:highlight w:val="none"/>
+        </w:rPr>
+      </w:r>
+    </w:p>
+    <w:p>
+      <w:pPr>
+        <w:pBdr/>
+        <w:spacing/>
+        <w:ind/>
+        <w:rPr>
+          <w:color w:val="000000" w:themeColor="text1"/>
+          <w:sz w:val="22"/>
+          <w:szCs w:val="22"/>
+          <w:highlight w:val="none"/>
+        </w:rPr>
+      </w:pPr>
+      <w:r>
+        <w:rPr>
+          <w:color w:val="000000" w:themeColor="text1"/>
+          <w:sz w:val="22"/>
+          <w:szCs w:val="22"/>
+          <w:highlight w:val="none"/>
+        </w:rPr>
+        <w:t xml:space="preserve">Some caveats will need to be introduced, with the scale we need to evaluate it as a power of 10, and with the value we need to take into account the fact that it could be negative or have a decimal point and could also be written using “E notation” (a way of writing standard form that uses E to represent the 10^ part, e.g. 1250 = 1.25 * 10^3 = 1.25E3). I will describe how I’ve handled this in the individual sections on finding the scale and finding the value.</w:t>
+      </w:r>
+      <w:r>
+        <w:rPr>
+          <w:color w:val="000000" w:themeColor="text1"/>
+          <w:sz w:val="22"/>
+          <w:szCs w:val="22"/>
+          <w:highlight w:val="none"/>
+        </w:rPr>
+      </w:r>
+      <w:r/>
     </w:p>
     <w:p>
       <w:pPr>
@@ -2489,6 +2656,634 @@
           <w:color w:val="2f5496" w:themeColor="accent5" w:themeShade="BF"/>
           <w:sz w:val="24"/>
           <w:szCs w:val="24"/>
+          <w:highlight w:val="none"/>
+        </w:rPr>
+      </w:r>
+    </w:p>
+    <w:p>
+      <w:pPr>
+        <w:pBdr/>
+        <w:spacing/>
+        <w:ind/>
+        <w:rPr>
+          <w:color w:val="000000" w:themeColor="text1"/>
+          <w:sz w:val="22"/>
+          <w:szCs w:val="22"/>
+          <w:highlight w:val="none"/>
+        </w:rPr>
+      </w:pPr>
+      <w:r>
+        <w:rPr>
+          <w:color w:val="000000" w:themeColor="text1"/>
+          <w:sz w:val="22"/>
+          <w:szCs w:val="18"/>
+          <w:highlight w:val="none"/>
+        </w:rPr>
+        <w:t xml:space="preserve">The scale in the ephemeris is always in the form 10^x, where x is a natural number. This means we can find a ^ character (they only appear in scales and nowhere else) and then use the algorithm above to find x. Since x is always a natural number, no extra tricks are needed with the algorithm. Once we have found x, we evaluate 10**x using python’s eval function and set scale equal to that.</w:t>
+      </w:r>
+      <w:r>
+        <w:rPr>
+          <w:color w:val="000000" w:themeColor="text1"/>
+          <w:sz w:val="22"/>
+          <w:szCs w:val="22"/>
+          <w:highlight w:val="none"/>
+        </w:rPr>
+      </w:r>
+    </w:p>
+    <w:p>
+      <w:pPr>
+        <w:pBdr/>
+        <w:spacing/>
+        <w:ind/>
+        <w:rPr>
+          <w:color w:val="000000" w:themeColor="text1"/>
+          <w:sz w:val="22"/>
+          <w:szCs w:val="22"/>
+          <w:highlight w:val="none"/>
+        </w:rPr>
+      </w:pPr>
+      <w:r>
+        <w:rPr>
+          <w:color w:val="000000" w:themeColor="text1"/>
+          <w:sz w:val="22"/>
+          <w:szCs w:val="18"/>
+          <w:highlight w:val="none"/>
+        </w:rPr>
+        <w:t xml:space="preserve">We will then also create a variable, “scaleAt”, and set it equal to the position of the last digit. This is so that the next part of the function, which finds the value, can start just after the scale. If we do not do this then we would end up accidentally finding the scale again when trying to find the value</w:t>
+      </w:r>
+      <w:r>
+        <w:rPr>
+          <w:color w:val="000000" w:themeColor="text1"/>
+          <w:sz w:val="22"/>
+          <w:szCs w:val="18"/>
+          <w:highlight w:val="none"/>
+        </w:rPr>
+      </w:r>
+      <w:r>
+        <w:rPr>
+          <w:color w:val="000000" w:themeColor="text1"/>
+          <w:sz w:val="22"/>
+          <w:szCs w:val="18"/>
+          <w:highlight w:val="none"/>
+        </w:rPr>
+      </w:r>
+      <w:r>
+        <w:rPr>
+          <w:color w:val="000000" w:themeColor="text1"/>
+          <w:sz w:val="22"/>
+          <w:szCs w:val="22"/>
+          <w:highlight w:val="none"/>
+        </w:rPr>
+      </w:r>
+    </w:p>
+    <w:p>
+      <w:pPr>
+        <w:pBdr/>
+        <w:spacing/>
+        <w:ind/>
+        <w:rPr>
+          <w:color w:val="000000" w:themeColor="text1"/>
+          <w:sz w:val="22"/>
+          <w:szCs w:val="22"/>
+          <w:highlight w:val="none"/>
+        </w:rPr>
+      </w:pPr>
+      <w:r>
+        <w:rPr>
+          <w:color w:val="000000" w:themeColor="text1"/>
+          <w:sz w:val="22"/>
+          <w:szCs w:val="22"/>
+          <w:highlight w:val="none"/>
+        </w:rPr>
+      </w:r>
+      <w:r>
+        <w:rPr>
+          <w:color w:val="000000" w:themeColor="text1"/>
+          <w:sz w:val="22"/>
+          <w:szCs w:val="22"/>
+          <w:highlight w:val="none"/>
+        </w:rPr>
+      </w:r>
+    </w:p>
+    <w:p>
+      <w:pPr>
+        <w:pBdr/>
+        <w:spacing/>
+        <w:ind/>
+        <w:rPr>
+          <w:color w:val="2f5496" w:themeColor="accent5" w:themeShade="BF"/>
+          <w:sz w:val="24"/>
+          <w:szCs w:val="24"/>
+          <w:highlight w:val="none"/>
+        </w:rPr>
+      </w:pPr>
+      <w:r>
+        <w:rPr>
+          <w:color w:val="2f5496" w:themeColor="accent5" w:themeShade="BF"/>
+          <w:sz w:val="24"/>
+          <w:szCs w:val="20"/>
+          <w:highlight w:val="none"/>
+        </w:rPr>
+        <w:t xml:space="preserve">Finding the value</w:t>
+      </w:r>
+      <w:r>
+        <w:rPr>
+          <w:color w:val="000000" w:themeColor="text1"/>
+          <w:sz w:val="22"/>
+          <w:szCs w:val="18"/>
+          <w:highlight w:val="none"/>
+        </w:rPr>
+      </w:r>
+      <w:r>
+        <w:rPr>
+          <w:color w:val="2f5496" w:themeColor="accent5" w:themeShade="BF"/>
+          <w:sz w:val="24"/>
+          <w:szCs w:val="24"/>
+          <w:highlight w:val="none"/>
+        </w:rPr>
+      </w:r>
+    </w:p>
+    <w:p>
+      <w:pPr>
+        <w:pBdr/>
+        <w:spacing/>
+        <w:ind/>
+        <w:rPr>
+          <w:color w:val="000000" w:themeColor="text1"/>
+          <w:sz w:val="22"/>
+          <w:szCs w:val="22"/>
+          <w:highlight w:val="none"/>
+        </w:rPr>
+      </w:pPr>
+      <w:r>
+        <w:rPr>
+          <w:color w:val="000000" w:themeColor="text1"/>
+          <w:sz w:val="22"/>
+          <w:szCs w:val="18"/>
+          <w:highlight w:val="none"/>
+        </w:rPr>
+        <w:t xml:space="preserve">We will need to make some modifications to the algorithm above when it comes to finding the value. Instead of just checking if the current character is a digit, we need to check if it’s a digit, a + sign, a – sign, a decimal point . or E. Luckily if you use float() on a string written in E notation in python it can successfully convert that string to a number, so we do not need to worry about evaluating E notation ourselves. Python can also handle positives and negatives when casting to a float.</w:t>
+      </w:r>
+      <w:r>
+        <w:rPr>
+          <w:color w:val="000000" w:themeColor="text1"/>
+          <w:sz w:val="22"/>
+          <w:szCs w:val="22"/>
+          <w:highlight w:val="none"/>
+        </w:rPr>
+      </w:r>
+    </w:p>
+    <w:p>
+      <w:pPr>
+        <w:pBdr/>
+        <w:spacing/>
+        <w:ind/>
+        <w:rPr>
+          <w:color w:val="000000" w:themeColor="text1"/>
+          <w:sz w:val="22"/>
+          <w:szCs w:val="22"/>
+          <w:highlight w:val="none"/>
+        </w:rPr>
+      </w:pPr>
+      <w:r>
+        <w:rPr>
+          <w:color w:val="000000" w:themeColor="text1"/>
+          <w:sz w:val="22"/>
+          <w:szCs w:val="18"/>
+          <w:highlight w:val="none"/>
+        </w:rPr>
+        <w:t xml:space="preserve">Now the only thing to worry about is “error margins”. NASA wants to make it clear that their values are not exact, so they put error margins on them. This means that instead of writing a mass as 500, they might write it as 500+-1. This is a bit problematic. We count + and – as “digits” because we need to be able to handle negative values, so our program would continue until it got to the 1, and only then would it cast the string to a float. But python cannot cast 500+-1 as a float, because it’s not a simple number. So, what we need to do is search for any instances of ‘+-‘ in the string, and if we find one, then we slice the string to only include characters before the +-.</w:t>
+      </w:r>
+      <w:r>
+        <w:rPr>
+          <w:color w:val="000000" w:themeColor="text1"/>
+          <w:sz w:val="22"/>
+          <w:szCs w:val="18"/>
+          <w:highlight w:val="none"/>
+        </w:rPr>
+      </w:r>
+    </w:p>
+    <w:p>
+      <w:pPr>
+        <w:pBdr/>
+        <w:spacing/>
+        <w:ind/>
+        <w:rPr>
+          <w:color w:val="000000" w:themeColor="text1"/>
+          <w:sz w:val="22"/>
+          <w:szCs w:val="22"/>
+          <w:highlight w:val="none"/>
+        </w:rPr>
+      </w:pPr>
+      <w:r>
+        <w:rPr>
+          <w:color w:val="000000" w:themeColor="text1"/>
+          <w:sz w:val="22"/>
+          <w:szCs w:val="18"/>
+          <w:highlight w:val="none"/>
+        </w:rPr>
+        <w:t xml:space="preserve">Once that’s done, we can safely float our value, and we’re finished. All we need to do is return scale*value*conversionFactor, and that’s the attribute for our planet.</w:t>
+      </w:r>
+      <w:r>
+        <w:rPr>
+          <w:color w:val="000000" w:themeColor="text1"/>
+          <w:sz w:val="22"/>
+          <w:szCs w:val="18"/>
+          <w:highlight w:val="none"/>
+        </w:rPr>
+      </w:r>
+      <w:r>
+        <w:rPr>
+          <w:color w:val="000000" w:themeColor="text1"/>
+          <w:sz w:val="22"/>
+          <w:szCs w:val="18"/>
+          <w:highlight w:val="none"/>
+        </w:rPr>
+      </w:r>
+      <w:r>
+        <w:rPr>
+          <w:color w:val="000000" w:themeColor="text1"/>
+          <w:sz w:val="22"/>
+          <w:szCs w:val="18"/>
+          <w:highlight w:val="none"/>
+        </w:rPr>
+      </w:r>
+      <w:r>
+        <w:rPr>
+          <w:color w:val="000000" w:themeColor="text1"/>
+          <w:sz w:val="22"/>
+          <w:szCs w:val="22"/>
+          <w:highlight w:val="none"/>
+        </w:rPr>
+      </w:r>
+    </w:p>
+    <w:p>
+      <w:pPr>
+        <w:pBdr/>
+        <w:spacing/>
+        <w:ind/>
+        <w:rPr>
+          <w:color w:val="000000" w:themeColor="text1"/>
+          <w:sz w:val="22"/>
+          <w:szCs w:val="22"/>
+          <w:highlight w:val="none"/>
+        </w:rPr>
+      </w:pPr>
+      <w:r>
+        <w:rPr>
+          <w:color w:val="000000" w:themeColor="text1"/>
+          <w:sz w:val="22"/>
+          <w:szCs w:val="18"/>
+          <w:highlight w:val="none"/>
+        </w:rPr>
+        <w:t xml:space="preserve">Here is some pseudocode for the whole function:</w:t>
+      </w:r>
+      <w:r>
+        <w:rPr>
+          <w:color w:val="000000" w:themeColor="text1"/>
+          <w:sz w:val="22"/>
+          <w:szCs w:val="18"/>
+          <w:highlight w:val="none"/>
+        </w:rPr>
+      </w:r>
+    </w:p>
+    <w:p>
+      <w:pPr>
+        <w:pBdr/>
+        <w:spacing/>
+        <w:ind/>
+        <w:rPr>
+          <w:highlight w:val="none"/>
+        </w:rPr>
+      </w:pPr>
+      <w:r>
+        <w:rPr>
+          <w:color w:val="000000" w:themeColor="text1"/>
+          <w:sz w:val="22"/>
+          <w:szCs w:val="22"/>
+          <w:highlight w:val="none"/>
+        </w:rPr>
+      </w:r>
+      <w:r>
+        <mc:AlternateContent>
+          <mc:Choice Requires="wpg">
+            <w:drawing>
+              <wp:inline xmlns:wp="http://schemas.openxmlformats.org/drawingml/2006/wordprocessingDrawing" distT="0" distB="0" distL="0" distR="0">
+                <wp:extent cx="5940425" cy="3436128"/>
+                <wp:effectExtent l="0" t="0" r="0" b="0"/>
+                <wp:docPr id="10" name=""/>
+                <wp:cNvGraphicFramePr>
+                  <a:graphicFrameLocks xmlns:a="http://schemas.openxmlformats.org/drawingml/2006/main" noChangeAspect="1"/>
+                </wp:cNvGraphicFramePr>
+                <a:graphic xmlns:a="http://schemas.openxmlformats.org/drawingml/2006/main">
+                  <a:graphicData uri="http://schemas.openxmlformats.org/drawingml/2006/picture">
+                    <pic:pic xmlns:pic="http://schemas.openxmlformats.org/drawingml/2006/picture">
+                      <pic:nvPicPr>
+                        <pic:cNvPr id="391157428" name=""/>
+                        <pic:cNvPicPr>
+                          <a:picLocks noChangeAspect="1"/>
+                        </pic:cNvPicPr>
+                        <pic:nvPr/>
+                      </pic:nvPicPr>
+                      <pic:blipFill>
+                        <a:blip r:embed="rId21"/>
+                        <a:stretch/>
+                      </pic:blipFill>
+                      <pic:spPr bwMode="auto">
+                        <a:xfrm>
+                          <a:off x="0" y="0"/>
+                          <a:ext cx="5940424" cy="3436127"/>
+                        </a:xfrm>
+                        <a:prstGeom prst="rect">
+                          <a:avLst/>
+                        </a:prstGeom>
+                      </pic:spPr>
+                    </pic:pic>
+                  </a:graphicData>
+                </a:graphic>
+              </wp:inline>
+            </w:drawing>
+          </mc:Choice>
+          <mc:Fallback>
+            <w:pict>
+              <v:shapetype id="_x0000_t75" coordsize="21600,21600" o:spt="75" o:preferrelative="t" path="m@4@5l@4@11@9@11@9@5xe" filled="f" stroked="f">
+                <v:stroke joinstyle="miter"/>
+                <v:formulas>
+                  <v:f eqn="if lineDrawn pixelLineWidth 0"/>
+                  <v:f eqn="sum @0 1 0"/>
+                  <v:f eqn="sum 0 0 @1"/>
+                  <v:f eqn="prod @2 1 2"/>
+                  <v:f eqn="prod @3 21600 pixelWidth"/>
+                  <v:f eqn="prod @3 21600 pixelHeight"/>
+                  <v:f eqn="sum @0 0 1"/>
+                  <v:f eqn="prod @6 1 2"/>
+                  <v:f eqn="prod @7 21600 pixelWidth"/>
+                  <v:f eqn="sum @8 21600 0"/>
+                  <v:f eqn="prod @7 21600 pixelHeight"/>
+                  <v:f eqn="sum @10 21600 0"/>
+                </v:formulas>
+                <v:path o:extrusionok="f" gradientshapeok="t" o:connecttype="rect"/>
+                <o:lock v:ext="edit" aspectratio="t"/>
+              </v:shapetype>
+              <v:shape id="_x0000_i9" o:spid="_x0000_s9" type="#_x0000_t75" style="width:467.75pt;height:270.56pt;mso-wrap-distance-left:0.00pt;mso-wrap-distance-top:0.00pt;mso-wrap-distance-right:0.00pt;mso-wrap-distance-bottom:0.00pt;z-index:1;" stroked="false">
+                <v:imagedata r:id="rId21" o:title=""/>
+                <o:lock v:ext="edit" rotation="t"/>
+              </v:shape>
+            </w:pict>
+          </mc:Fallback>
+        </mc:AlternateContent>
+      </w:r>
+      <w:r>
+        <w:rPr>
+          <w:color w:val="000000" w:themeColor="text1"/>
+          <w:sz w:val="22"/>
+          <w:szCs w:val="22"/>
+          <w:highlight w:val="none"/>
+        </w:rPr>
+      </w:r>
+      <w:r>
+        <w:rPr>
+          <w:color w:val="000000" w:themeColor="text1"/>
+          <w:sz w:val="22"/>
+          <w:szCs w:val="22"/>
+          <w:highlight w:val="none"/>
+        </w:rPr>
+      </w:r>
+      <w:r>
+        <w:rPr>
+          <w:color w:val="000000" w:themeColor="text1"/>
+          <w:sz w:val="22"/>
+          <w:szCs w:val="22"/>
+          <w:highlight w:val="none"/>
+        </w:rPr>
+      </w:r>
+      <w:r>
+        <w:rPr>
+          <w:color w:val="000000" w:themeColor="text1"/>
+          <w:sz w:val="22"/>
+          <w:szCs w:val="22"/>
+          <w:highlight w:val="none"/>
+        </w:rPr>
+      </w:r>
+      <w:r>
+        <w:rPr>
+          <w:color w:val="000000" w:themeColor="text1"/>
+          <w:sz w:val="22"/>
+          <w:szCs w:val="22"/>
+          <w:highlight w:val="none"/>
+        </w:rPr>
+      </w:r>
+    </w:p>
+    <w:p>
+      <w:pPr>
+        <w:pBdr/>
+        <w:spacing/>
+        <w:ind/>
+        <w:rPr>
+          <w:color w:val="000000" w:themeColor="text1"/>
+          <w:sz w:val="22"/>
+          <w:szCs w:val="22"/>
+          <w:highlight w:val="none"/>
+        </w:rPr>
+      </w:pPr>
+      <w:r>
+        <w:rPr>
+          <w:highlight w:val="none"/>
+        </w:rPr>
+      </w:r>
+      <w:r>
+        <mc:AlternateContent>
+          <mc:Choice Requires="wpg">
+            <w:drawing>
+              <wp:inline xmlns:wp="http://schemas.openxmlformats.org/drawingml/2006/wordprocessingDrawing" distT="0" distB="0" distL="0" distR="0">
+                <wp:extent cx="5940425" cy="3005657"/>
+                <wp:effectExtent l="0" t="0" r="0" b="0"/>
+                <wp:docPr id="11" name=""/>
+                <wp:cNvGraphicFramePr>
+                  <a:graphicFrameLocks xmlns:a="http://schemas.openxmlformats.org/drawingml/2006/main" noChangeAspect="1"/>
+                </wp:cNvGraphicFramePr>
+                <a:graphic xmlns:a="http://schemas.openxmlformats.org/drawingml/2006/main">
+                  <a:graphicData uri="http://schemas.openxmlformats.org/drawingml/2006/picture">
+                    <pic:pic xmlns:pic="http://schemas.openxmlformats.org/drawingml/2006/picture">
+                      <pic:nvPicPr>
+                        <pic:cNvPr id="2071679047" name=""/>
+                        <pic:cNvPicPr>
+                          <a:picLocks noChangeAspect="1"/>
+                        </pic:cNvPicPr>
+                        <pic:nvPr/>
+                      </pic:nvPicPr>
+                      <pic:blipFill>
+                        <a:blip r:embed="rId22"/>
+                        <a:stretch/>
+                      </pic:blipFill>
+                      <pic:spPr bwMode="auto">
+                        <a:xfrm>
+                          <a:off x="0" y="0"/>
+                          <a:ext cx="5940424" cy="3005656"/>
+                        </a:xfrm>
+                        <a:prstGeom prst="rect">
+                          <a:avLst/>
+                        </a:prstGeom>
+                      </pic:spPr>
+                    </pic:pic>
+                  </a:graphicData>
+                </a:graphic>
+              </wp:inline>
+            </w:drawing>
+          </mc:Choice>
+          <mc:Fallback>
+            <w:pict>
+              <v:shapetype id="_x0000_t75" coordsize="21600,21600" o:spt="75" o:preferrelative="t" path="m@4@5l@4@11@9@11@9@5xe" filled="f" stroked="f">
+                <v:stroke joinstyle="miter"/>
+                <v:formulas>
+                  <v:f eqn="if lineDrawn pixelLineWidth 0"/>
+                  <v:f eqn="sum @0 1 0"/>
+                  <v:f eqn="sum 0 0 @1"/>
+                  <v:f eqn="prod @2 1 2"/>
+                  <v:f eqn="prod @3 21600 pixelWidth"/>
+                  <v:f eqn="prod @3 21600 pixelHeight"/>
+                  <v:f eqn="sum @0 0 1"/>
+                  <v:f eqn="prod @6 1 2"/>
+                  <v:f eqn="prod @7 21600 pixelWidth"/>
+                  <v:f eqn="sum @8 21600 0"/>
+                  <v:f eqn="prod @7 21600 pixelHeight"/>
+                  <v:f eqn="sum @10 21600 0"/>
+                </v:formulas>
+                <v:path o:extrusionok="f" gradientshapeok="t" o:connecttype="rect"/>
+                <o:lock v:ext="edit" aspectratio="t"/>
+              </v:shapetype>
+              <v:shape id="_x0000_i10" o:spid="_x0000_s10" type="#_x0000_t75" style="width:467.75pt;height:236.67pt;mso-wrap-distance-left:0.00pt;mso-wrap-distance-top:0.00pt;mso-wrap-distance-right:0.00pt;mso-wrap-distance-bottom:0.00pt;z-index:1;" stroked="false">
+                <v:imagedata r:id="rId22" o:title=""/>
+                <o:lock v:ext="edit" rotation="t"/>
+              </v:shape>
+            </w:pict>
+          </mc:Fallback>
+        </mc:AlternateContent>
+      </w:r>
+      <w:r>
+        <w:rPr>
+          <w:highlight w:val="none"/>
+        </w:rPr>
+      </w:r>
+      <w:r>
+        <w:rPr>
+          <w:highlight w:val="none"/>
+        </w:rPr>
+      </w:r>
+    </w:p>
+    <w:p>
+      <w:pPr>
+        <w:pBdr/>
+        <w:spacing/>
+        <w:ind/>
+        <w:rPr>
+          <w:color w:val="000000" w:themeColor="text1"/>
+          <w:sz w:val="22"/>
+          <w:szCs w:val="22"/>
+          <w:highlight w:val="none"/>
+        </w:rPr>
+      </w:pPr>
+      <w:r>
+        <w:rPr>
+          <w:color w:val="000000" w:themeColor="text1"/>
+          <w:sz w:val="22"/>
+          <w:szCs w:val="18"/>
+          <w:highlight w:val="none"/>
+        </w:rPr>
+        <w:t xml:space="preserve">The numbers chosen for i and j to range over are fairly arbitrary, I just picked some numbers that would be large enough that we’d get all the numbers we needed but wouldn’t include any numbers from other attributes that we might accidentally retun.</w:t>
+      </w:r>
+      <w:r>
+        <w:rPr>
+          <w:color w:val="000000" w:themeColor="text1"/>
+          <w:sz w:val="22"/>
+          <w:szCs w:val="18"/>
+          <w:highlight w:val="none"/>
+        </w:rPr>
+      </w:r>
+    </w:p>
+    <w:p>
+      <w:pPr>
+        <w:pBdr/>
+        <w:spacing/>
+        <w:ind/>
+        <w:rPr>
+          <w:color w:val="000000" w:themeColor="text1"/>
+          <w:sz w:val="22"/>
+          <w:szCs w:val="22"/>
+          <w:highlight w:val="none"/>
+        </w:rPr>
+      </w:pPr>
+      <w:r>
+        <w:rPr>
+          <w:color w:val="000000" w:themeColor="text1"/>
+          <w:sz w:val="22"/>
+          <w:szCs w:val="18"/>
+          <w:highlight w:val="none"/>
+        </w:rPr>
+      </w:r>
+      <w:r>
+        <w:rPr>
+          <w:color w:val="000000" w:themeColor="text1"/>
+          <w:sz w:val="22"/>
+          <w:szCs w:val="18"/>
+          <w:highlight w:val="none"/>
+        </w:rPr>
+      </w:r>
+    </w:p>
+    <w:p>
+      <w:pPr>
+        <w:pBdr/>
+        <w:spacing/>
+        <w:ind/>
+        <w:rPr>
+          <w:color w:val="000000" w:themeColor="text1"/>
+          <w:sz w:val="22"/>
+          <w:szCs w:val="22"/>
+          <w:highlight w:val="none"/>
+        </w:rPr>
+      </w:pPr>
+      <w:r>
+        <w:rPr>
+          <w:color w:val="000000" w:themeColor="text1"/>
+          <w:sz w:val="22"/>
+          <w:szCs w:val="22"/>
+          <w:highlight w:val="none"/>
+        </w:rPr>
+      </w:r>
+      <w:r>
+        <w:rPr>
+          <w:color w:val="000000" w:themeColor="text1"/>
+          <w:sz w:val="22"/>
+          <w:szCs w:val="22"/>
+          <w:highlight w:val="none"/>
+        </w:rPr>
+      </w:r>
+    </w:p>
+    <w:p>
+      <w:pPr>
+        <w:pBdr/>
+        <w:spacing/>
+        <w:ind/>
+        <w:rPr>
+          <w:color w:val="000000" w:themeColor="text1"/>
+          <w:sz w:val="22"/>
+          <w:szCs w:val="22"/>
+          <w:highlight w:val="none"/>
+        </w:rPr>
+      </w:pPr>
+      <w:r>
+        <w:rPr>
+          <w:color w:val="000000" w:themeColor="text1"/>
+          <w:sz w:val="22"/>
+          <w:szCs w:val="18"/>
+          <w:highlight w:val="none"/>
+        </w:rPr>
+      </w:r>
+      <w:r>
+        <w:rPr>
+          <w:color w:val="000000" w:themeColor="text1"/>
+          <w:sz w:val="22"/>
+          <w:szCs w:val="18"/>
           <w:highlight w:val="none"/>
         </w:rPr>
       </w:r>
@@ -3265,9 +4060,9 @@
           <mc:Choice Requires="wpg">
             <w:drawing>
               <wp:inline xmlns:wp="http://schemas.openxmlformats.org/drawingml/2006/wordprocessingDrawing" distT="0" distB="0" distL="0" distR="0">
-                <wp:extent cx="5940425" cy="1965635"/>
+                <wp:extent cx="5940425" cy="2024308"/>
                 <wp:effectExtent l="0" t="0" r="0" b="0"/>
-                <wp:docPr id="9" name="" hidden="0"/>
+                <wp:docPr id="12" name=""/>
                 <wp:cNvGraphicFramePr>
                   <a:graphicFrameLocks xmlns:a="http://schemas.openxmlformats.org/drawingml/2006/main" noChangeAspect="1"/>
                 </wp:cNvGraphicFramePr>
@@ -3275,20 +4070,20 @@
                   <a:graphicData uri="http://schemas.openxmlformats.org/drawingml/2006/picture">
                     <pic:pic xmlns:pic="http://schemas.openxmlformats.org/drawingml/2006/picture">
                       <pic:nvPicPr>
-                        <pic:cNvPr id="291036560" name="" hidden="0"/>
+                        <pic:cNvPr id="240713866" name=""/>
                         <pic:cNvPicPr>
                           <a:picLocks noChangeAspect="1"/>
                         </pic:cNvPicPr>
-                        <pic:nvPr isPhoto="0" userDrawn="0"/>
+                        <pic:nvPr/>
                       </pic:nvPicPr>
                       <pic:blipFill>
-                        <a:blip r:embed="rId20"/>
+                        <a:blip r:embed="rId23"/>
                         <a:stretch/>
                       </pic:blipFill>
                       <pic:spPr bwMode="auto">
                         <a:xfrm>
                           <a:off x="0" y="0"/>
-                          <a:ext cx="5940424" cy="1965634"/>
+                          <a:ext cx="5940424" cy="2024308"/>
                         </a:xfrm>
                         <a:prstGeom prst="rect">
                           <a:avLst/>
@@ -3321,8 +4116,8 @@
                 <v:path o:extrusionok="f" gradientshapeok="t" o:connecttype="rect"/>
                 <o:lock v:ext="edit" aspectratio="t"/>
               </v:shapetype>
-              <v:shape id="_x0000_i8" o:spid="_x0000_s8" type="#_x0000_t75" style="width:467.75pt;height:154.77pt;mso-wrap-distance-left:0.00pt;mso-wrap-distance-top:0.00pt;mso-wrap-distance-right:0.00pt;mso-wrap-distance-bottom:0.00pt;z-index:1;" stroked="false">
-                <v:imagedata r:id="rId20" o:title=""/>
+              <v:shape id="_x0000_i11" o:spid="_x0000_s11" type="#_x0000_t75" style="width:467.75pt;height:159.39pt;mso-wrap-distance-left:0.00pt;mso-wrap-distance-top:0.00pt;mso-wrap-distance-right:0.00pt;mso-wrap-distance-bottom:0.00pt;z-index:1;" stroked="false">
+                <v:imagedata r:id="rId23" o:title=""/>
                 <o:lock v:ext="edit" rotation="t"/>
               </v:shape>
             </w:pict>
@@ -3331,6 +4126,15 @@
       </w:r>
       <w:r>
         <w:rPr>
+          <w:color w:val="000000" w:themeColor="text1"/>
+          <w:sz w:val="22"/>
+          <w:szCs w:val="22"/>
+          <w:highlight w:val="none"/>
+        </w:rPr>
+      </w:r>
+      <w:r/>
+      <w:r>
+        <w:rPr>
           <w:color w:val="000000"/>
           <w:sz w:val="22"/>
           <w:szCs w:val="22"/>
@@ -3480,9 +4284,9 @@
           <mc:Choice Requires="wpg">
             <w:drawing>
               <wp:inline xmlns:wp="http://schemas.openxmlformats.org/drawingml/2006/wordprocessingDrawing" distT="0" distB="0" distL="0" distR="0">
-                <wp:extent cx="2781300" cy="1647825"/>
+                <wp:extent cx="2838450" cy="1924050"/>
                 <wp:effectExtent l="0" t="0" r="0" b="0"/>
-                <wp:docPr id="10" name="" hidden="0"/>
+                <wp:docPr id="13" name=""/>
                 <wp:cNvGraphicFramePr>
                   <a:graphicFrameLocks xmlns:a="http://schemas.openxmlformats.org/drawingml/2006/main" noChangeAspect="1"/>
                 </wp:cNvGraphicFramePr>
@@ -3490,20 +4294,20 @@
                   <a:graphicData uri="http://schemas.openxmlformats.org/drawingml/2006/picture">
                     <pic:pic xmlns:pic="http://schemas.openxmlformats.org/drawingml/2006/picture">
                       <pic:nvPicPr>
-                        <pic:cNvPr id="179409794" name="" hidden="0"/>
+                        <pic:cNvPr id="1146913699" name=""/>
                         <pic:cNvPicPr>
                           <a:picLocks noChangeAspect="1"/>
                         </pic:cNvPicPr>
-                        <pic:nvPr isPhoto="0" userDrawn="0"/>
+                        <pic:nvPr/>
                       </pic:nvPicPr>
                       <pic:blipFill>
-                        <a:blip r:embed="rId21"/>
+                        <a:blip r:embed="rId24"/>
                         <a:stretch/>
                       </pic:blipFill>
                       <pic:spPr bwMode="auto">
                         <a:xfrm>
                           <a:off x="0" y="0"/>
-                          <a:ext cx="2781299" cy="1647824"/>
+                          <a:ext cx="2838449" cy="1924049"/>
                         </a:xfrm>
                         <a:prstGeom prst="rect">
                           <a:avLst/>
@@ -3536,14 +4340,23 @@
                 <v:path o:extrusionok="f" gradientshapeok="t" o:connecttype="rect"/>
                 <o:lock v:ext="edit" aspectratio="t"/>
               </v:shapetype>
-              <v:shape id="_x0000_i9" o:spid="_x0000_s9" type="#_x0000_t75" style="width:219.00pt;height:129.75pt;mso-wrap-distance-left:0.00pt;mso-wrap-distance-top:0.00pt;mso-wrap-distance-right:0.00pt;mso-wrap-distance-bottom:0.00pt;z-index:1;" stroked="false">
-                <v:imagedata r:id="rId21" o:title=""/>
+              <v:shape id="_x0000_i12" o:spid="_x0000_s12" type="#_x0000_t75" style="width:223.50pt;height:151.50pt;mso-wrap-distance-left:0.00pt;mso-wrap-distance-top:0.00pt;mso-wrap-distance-right:0.00pt;mso-wrap-distance-bottom:0.00pt;z-index:1;" stroked="false">
+                <v:imagedata r:id="rId24" o:title=""/>
                 <o:lock v:ext="edit" rotation="t"/>
               </v:shape>
             </w:pict>
           </mc:Fallback>
         </mc:AlternateContent>
       </w:r>
+      <w:r>
+        <w:rPr>
+          <w:color w:val="000000" w:themeColor="text1"/>
+          <w:sz w:val="22"/>
+          <w:szCs w:val="22"/>
+          <w:highlight w:val="none"/>
+        </w:rPr>
+      </w:r>
+      <w:r/>
       <w:r>
         <w:rPr>
           <w:highlight w:val="none"/>
@@ -3952,7 +4765,7 @@
               <wp:inline xmlns:wp="http://schemas.openxmlformats.org/drawingml/2006/wordprocessingDrawing" distT="0" distB="0" distL="0" distR="0">
                 <wp:extent cx="5225415" cy="3346555"/>
                 <wp:effectExtent l="0" t="0" r="0" b="0"/>
-                <wp:docPr id="11" name="" hidden="0"/>
+                <wp:docPr id="14" name="" hidden="0"/>
                 <wp:cNvGraphicFramePr>
                   <a:graphicFrameLocks xmlns:a="http://schemas.openxmlformats.org/drawingml/2006/main" noChangeAspect="1"/>
                 </wp:cNvGraphicFramePr>
@@ -3967,7 +4780,7 @@
                         <pic:nvPr isPhoto="0" userDrawn="0"/>
                       </pic:nvPicPr>
                       <pic:blipFill>
-                        <a:blip r:embed="rId22"/>
+                        <a:blip r:embed="rId25"/>
                         <a:stretch/>
                       </pic:blipFill>
                       <pic:spPr bwMode="auto">
@@ -4006,8 +4819,8 @@
                 <v:path o:extrusionok="f" gradientshapeok="t" o:connecttype="rect"/>
                 <o:lock v:ext="edit" aspectratio="t"/>
               </v:shapetype>
-              <v:shape id="_x0000_i10" o:spid="_x0000_s10" type="#_x0000_t75" style="width:411.45pt;height:263.51pt;mso-wrap-distance-left:0.00pt;mso-wrap-distance-top:0.00pt;mso-wrap-distance-right:0.00pt;mso-wrap-distance-bottom:0.00pt;rotation:0;z-index:1;" stroked="false">
-                <v:imagedata r:id="rId22" o:title=""/>
+              <v:shape id="_x0000_i13" o:spid="_x0000_s13" type="#_x0000_t75" style="width:411.45pt;height:263.51pt;mso-wrap-distance-left:0.00pt;mso-wrap-distance-top:0.00pt;mso-wrap-distance-right:0.00pt;mso-wrap-distance-bottom:0.00pt;rotation:0;z-index:1;" stroked="false">
+                <v:imagedata r:id="rId25" o:title=""/>
                 <o:lock v:ext="edit" rotation="t"/>
               </v:shape>
             </w:pict>
@@ -4447,7 +5260,7 @@
               <wp:inline xmlns:wp="http://schemas.openxmlformats.org/drawingml/2006/wordprocessingDrawing" distT="0" distB="0" distL="0" distR="0">
                 <wp:extent cx="6086607" cy="5966460"/>
                 <wp:effectExtent l="0" t="0" r="0" b="0"/>
-                <wp:docPr id="12" name="" hidden="0"/>
+                <wp:docPr id="15" name="" hidden="0"/>
                 <wp:cNvGraphicFramePr>
                   <a:graphicFrameLocks xmlns:a="http://schemas.openxmlformats.org/drawingml/2006/main" noChangeAspect="1"/>
                 </wp:cNvGraphicFramePr>
@@ -4462,7 +5275,7 @@
                         <pic:nvPr isPhoto="0" userDrawn="0"/>
                       </pic:nvPicPr>
                       <pic:blipFill>
-                        <a:blip r:embed="rId23"/>
+                        <a:blip r:embed="rId26"/>
                         <a:stretch/>
                       </pic:blipFill>
                       <pic:spPr bwMode="auto">
@@ -4501,8 +5314,8 @@
                 <v:path o:extrusionok="f" gradientshapeok="t" o:connecttype="rect"/>
                 <o:lock v:ext="edit" aspectratio="t"/>
               </v:shapetype>
-              <v:shape id="_x0000_i11" o:spid="_x0000_s11" type="#_x0000_t75" style="width:479.26pt;height:469.80pt;mso-wrap-distance-left:0.00pt;mso-wrap-distance-top:0.00pt;mso-wrap-distance-right:0.00pt;mso-wrap-distance-bottom:0.00pt;rotation:0;z-index:1;" stroked="false">
-                <v:imagedata r:id="rId23" o:title=""/>
+              <v:shape id="_x0000_i14" o:spid="_x0000_s14" type="#_x0000_t75" style="width:479.26pt;height:469.80pt;mso-wrap-distance-left:0.00pt;mso-wrap-distance-top:0.00pt;mso-wrap-distance-right:0.00pt;mso-wrap-distance-bottom:0.00pt;rotation:0;z-index:1;" stroked="false">
+                <v:imagedata r:id="rId26" o:title=""/>
                 <o:lock v:ext="edit" rotation="t"/>
               </v:shape>
             </w:pict>
@@ -4758,7 +5571,7 @@
               <wp:inline xmlns:wp="http://schemas.openxmlformats.org/drawingml/2006/wordprocessingDrawing" distT="0" distB="0" distL="0" distR="0">
                 <wp:extent cx="4618588" cy="6662610"/>
                 <wp:effectExtent l="0" t="0" r="0" b="0"/>
-                <wp:docPr id="13" name="" hidden="0"/>
+                <wp:docPr id="16" name="" hidden="0"/>
                 <wp:cNvGraphicFramePr>
                   <a:graphicFrameLocks xmlns:a="http://schemas.openxmlformats.org/drawingml/2006/main" noChangeAspect="1"/>
                 </wp:cNvGraphicFramePr>
@@ -4773,7 +5586,7 @@
                         <pic:nvPr isPhoto="0" userDrawn="0"/>
                       </pic:nvPicPr>
                       <pic:blipFill>
-                        <a:blip r:embed="rId24"/>
+                        <a:blip r:embed="rId27"/>
                         <a:stretch/>
                       </pic:blipFill>
                       <pic:spPr bwMode="auto">
@@ -4812,8 +5625,8 @@
                 <v:path o:extrusionok="f" gradientshapeok="t" o:connecttype="rect"/>
                 <o:lock v:ext="edit" aspectratio="t"/>
               </v:shapetype>
-              <v:shape id="_x0000_i12" o:spid="_x0000_s12" type="#_x0000_t75" style="width:363.67pt;height:524.61pt;mso-wrap-distance-left:0.00pt;mso-wrap-distance-top:0.00pt;mso-wrap-distance-right:0.00pt;mso-wrap-distance-bottom:0.00pt;rotation:0;z-index:1;" stroked="false">
-                <v:imagedata r:id="rId24" o:title=""/>
+              <v:shape id="_x0000_i15" o:spid="_x0000_s15" type="#_x0000_t75" style="width:363.67pt;height:524.61pt;mso-wrap-distance-left:0.00pt;mso-wrap-distance-top:0.00pt;mso-wrap-distance-right:0.00pt;mso-wrap-distance-bottom:0.00pt;rotation:0;z-index:1;" stroked="false">
+                <v:imagedata r:id="rId27" o:title=""/>
                 <o:lock v:ext="edit" rotation="t"/>
               </v:shape>
             </w:pict>
@@ -5004,9 +5817,9 @@
           <mc:Choice Requires="wpg">
             <w:drawing>
               <wp:inline xmlns:wp="http://schemas.openxmlformats.org/drawingml/2006/wordprocessingDrawing" distT="0" distB="0" distL="0" distR="0">
-                <wp:extent cx="5940425" cy="5569148"/>
+                <wp:extent cx="5940425" cy="5548270"/>
                 <wp:effectExtent l="0" t="0" r="0" b="0"/>
-                <wp:docPr id="14" name=""/>
+                <wp:docPr id="17" name=""/>
                 <wp:cNvGraphicFramePr>
                   <a:graphicFrameLocks xmlns:a="http://schemas.openxmlformats.org/drawingml/2006/main" noChangeAspect="1"/>
                 </wp:cNvGraphicFramePr>
@@ -5014,20 +5827,20 @@
                   <a:graphicData uri="http://schemas.openxmlformats.org/drawingml/2006/picture">
                     <pic:pic xmlns:pic="http://schemas.openxmlformats.org/drawingml/2006/picture">
                       <pic:nvPicPr>
-                        <pic:cNvPr id="2106428187" name=""/>
+                        <pic:cNvPr id="771064058" name=""/>
                         <pic:cNvPicPr>
                           <a:picLocks noChangeAspect="1"/>
                         </pic:cNvPicPr>
                         <pic:nvPr/>
                       </pic:nvPicPr>
                       <pic:blipFill>
-                        <a:blip r:embed="rId25"/>
+                        <a:blip r:embed="rId28"/>
                         <a:stretch/>
                       </pic:blipFill>
                       <pic:spPr bwMode="auto">
                         <a:xfrm>
                           <a:off x="0" y="0"/>
-                          <a:ext cx="5940424" cy="5569148"/>
+                          <a:ext cx="5940424" cy="5548269"/>
                         </a:xfrm>
                         <a:prstGeom prst="rect">
                           <a:avLst/>
@@ -5060,14 +5873,32 @@
                 <v:path o:extrusionok="f" gradientshapeok="t" o:connecttype="rect"/>
                 <o:lock v:ext="edit" aspectratio="t"/>
               </v:shapetype>
-              <v:shape id="_x0000_i13" o:spid="_x0000_s13" type="#_x0000_t75" style="width:467.75pt;height:438.52pt;mso-wrap-distance-left:0.00pt;mso-wrap-distance-top:0.00pt;mso-wrap-distance-right:0.00pt;mso-wrap-distance-bottom:0.00pt;z-index:1;" stroked="false">
-                <v:imagedata r:id="rId25" o:title=""/>
+              <v:shape id="_x0000_i16" o:spid="_x0000_s16" type="#_x0000_t75" style="width:467.75pt;height:436.87pt;mso-wrap-distance-left:0.00pt;mso-wrap-distance-top:0.00pt;mso-wrap-distance-right:0.00pt;mso-wrap-distance-bottom:0.00pt;z-index:1;" stroked="false">
+                <v:imagedata r:id="rId28" o:title=""/>
                 <o:lock v:ext="edit" rotation="t"/>
               </v:shape>
             </w:pict>
           </mc:Fallback>
         </mc:AlternateContent>
       </w:r>
+      <w:r>
+        <w:rPr>
+          <w:highlight w:val="none"/>
+        </w:rPr>
+      </w:r>
+      <w:r/>
+      <w:r>
+        <w:rPr>
+          <w:highlight w:val="none"/>
+        </w:rPr>
+      </w:r>
+      <w:r/>
+      <w:r>
+        <w:rPr>
+          <w:highlight w:val="none"/>
+        </w:rPr>
+      </w:r>
+      <w:r/>
       <w:r>
         <w:rPr>
           <w:highlight w:val="none"/>
@@ -6466,7 +7297,7 @@
               <wp:inline xmlns:wp="http://schemas.openxmlformats.org/drawingml/2006/wordprocessingDrawing" distT="0" distB="0" distL="0" distR="0">
                 <wp:extent cx="5940425" cy="1654572"/>
                 <wp:effectExtent l="0" t="0" r="0" b="0"/>
-                <wp:docPr id="15" name=""/>
+                <wp:docPr id="18" name=""/>
                 <wp:cNvGraphicFramePr>
                   <a:graphicFrameLocks xmlns:a="http://schemas.openxmlformats.org/drawingml/2006/main" noChangeAspect="1"/>
                 </wp:cNvGraphicFramePr>
@@ -6481,7 +7312,7 @@
                         <pic:nvPr/>
                       </pic:nvPicPr>
                       <pic:blipFill>
-                        <a:blip r:embed="rId26"/>
+                        <a:blip r:embed="rId29"/>
                         <a:stretch/>
                       </pic:blipFill>
                       <pic:spPr bwMode="auto">
@@ -6520,8 +7351,8 @@
                 <v:path o:extrusionok="f" gradientshapeok="t" o:connecttype="rect"/>
                 <o:lock v:ext="edit" aspectratio="t"/>
               </v:shapetype>
-              <v:shape id="_x0000_i14" o:spid="_x0000_s14" type="#_x0000_t75" style="width:467.75pt;height:130.28pt;mso-wrap-distance-left:0.00pt;mso-wrap-distance-top:0.00pt;mso-wrap-distance-right:0.00pt;mso-wrap-distance-bottom:0.00pt;z-index:1;" stroked="false">
-                <v:imagedata r:id="rId26" o:title=""/>
+              <v:shape id="_x0000_i17" o:spid="_x0000_s17" type="#_x0000_t75" style="width:467.75pt;height:130.28pt;mso-wrap-distance-left:0.00pt;mso-wrap-distance-top:0.00pt;mso-wrap-distance-right:0.00pt;mso-wrap-distance-bottom:0.00pt;z-index:1;" stroked="false">
+                <v:imagedata r:id="rId29" o:title=""/>
                 <o:lock v:ext="edit" rotation="t"/>
               </v:shape>
             </w:pict>
@@ -7554,7 +8385,7 @@
               <wp:inline xmlns:wp="http://schemas.openxmlformats.org/drawingml/2006/wordprocessingDrawing" distT="0" distB="0" distL="0" distR="0">
                 <wp:extent cx="5940425" cy="1330714"/>
                 <wp:effectExtent l="0" t="0" r="0" b="0"/>
-                <wp:docPr id="16" name=""/>
+                <wp:docPr id="19" name=""/>
                 <wp:cNvGraphicFramePr>
                   <a:graphicFrameLocks xmlns:a="http://schemas.openxmlformats.org/drawingml/2006/main" noChangeAspect="1"/>
                 </wp:cNvGraphicFramePr>
@@ -7569,7 +8400,7 @@
                         <pic:nvPr/>
                       </pic:nvPicPr>
                       <pic:blipFill>
-                        <a:blip r:embed="rId27"/>
+                        <a:blip r:embed="rId30"/>
                         <a:stretch/>
                       </pic:blipFill>
                       <pic:spPr bwMode="auto">
@@ -7608,8 +8439,8 @@
                 <v:path o:extrusionok="f" gradientshapeok="t" o:connecttype="rect"/>
                 <o:lock v:ext="edit" aspectratio="t"/>
               </v:shapetype>
-              <v:shape id="_x0000_i15" o:spid="_x0000_s15" type="#_x0000_t75" style="width:467.75pt;height:104.78pt;mso-wrap-distance-left:0.00pt;mso-wrap-distance-top:0.00pt;mso-wrap-distance-right:0.00pt;mso-wrap-distance-bottom:0.00pt;z-index:1;" stroked="false">
-                <v:imagedata r:id="rId27" o:title=""/>
+              <v:shape id="_x0000_i18" o:spid="_x0000_s18" type="#_x0000_t75" style="width:467.75pt;height:104.78pt;mso-wrap-distance-left:0.00pt;mso-wrap-distance-top:0.00pt;mso-wrap-distance-right:0.00pt;mso-wrap-distance-bottom:0.00pt;z-index:1;" stroked="false">
+                <v:imagedata r:id="rId30" o:title=""/>
                 <o:lock v:ext="edit" rotation="t"/>
               </v:shape>
             </w:pict>
@@ -7864,7 +8695,7 @@
               <wp:inline xmlns:wp="http://schemas.openxmlformats.org/drawingml/2006/wordprocessingDrawing" distT="0" distB="0" distL="0" distR="0">
                 <wp:extent cx="3701415" cy="7641631"/>
                 <wp:effectExtent l="0" t="0" r="0" b="0"/>
-                <wp:docPr id="17" name="" hidden="0"/>
+                <wp:docPr id="20" name="" hidden="0"/>
                 <wp:cNvGraphicFramePr>
                   <a:graphicFrameLocks xmlns:a="http://schemas.openxmlformats.org/drawingml/2006/main" noChangeAspect="1"/>
                 </wp:cNvGraphicFramePr>
@@ -7879,7 +8710,7 @@
                         <pic:nvPr isPhoto="0" userDrawn="0"/>
                       </pic:nvPicPr>
                       <pic:blipFill>
-                        <a:blip r:embed="rId28"/>
+                        <a:blip r:embed="rId31"/>
                         <a:stretch/>
                       </pic:blipFill>
                       <pic:spPr bwMode="auto">
@@ -7918,8 +8749,8 @@
                 <v:path o:extrusionok="f" gradientshapeok="t" o:connecttype="rect"/>
                 <o:lock v:ext="edit" aspectratio="t"/>
               </v:shapetype>
-              <v:shape id="_x0000_i16" o:spid="_x0000_s16" type="#_x0000_t75" style="width:291.45pt;height:601.70pt;mso-wrap-distance-left:0.00pt;mso-wrap-distance-top:0.00pt;mso-wrap-distance-right:0.00pt;mso-wrap-distance-bottom:0.00pt;z-index:1;" stroked="false">
-                <v:imagedata r:id="rId28" o:title=""/>
+              <v:shape id="_x0000_i19" o:spid="_x0000_s19" type="#_x0000_t75" style="width:291.45pt;height:601.70pt;mso-wrap-distance-left:0.00pt;mso-wrap-distance-top:0.00pt;mso-wrap-distance-right:0.00pt;mso-wrap-distance-bottom:0.00pt;z-index:1;" stroked="false">
+                <v:imagedata r:id="rId31" o:title=""/>
                 <o:lock v:ext="edit" rotation="t"/>
               </v:shape>
             </w:pict>
@@ -8284,7 +9115,7 @@
               <wp:inline xmlns:wp="http://schemas.openxmlformats.org/drawingml/2006/wordprocessingDrawing" distT="0" distB="0" distL="0" distR="0">
                 <wp:extent cx="5940425" cy="868688"/>
                 <wp:effectExtent l="0" t="0" r="0" b="0"/>
-                <wp:docPr id="18" name="" hidden="0"/>
+                <wp:docPr id="21" name="" hidden="0"/>
                 <wp:cNvGraphicFramePr>
                   <a:graphicFrameLocks xmlns:a="http://schemas.openxmlformats.org/drawingml/2006/main" noChangeAspect="1"/>
                 </wp:cNvGraphicFramePr>
@@ -8299,7 +9130,7 @@
                         <pic:nvPr isPhoto="0" userDrawn="0"/>
                       </pic:nvPicPr>
                       <pic:blipFill>
-                        <a:blip r:embed="rId29"/>
+                        <a:blip r:embed="rId32"/>
                         <a:stretch/>
                       </pic:blipFill>
                       <pic:spPr bwMode="auto">
@@ -8338,8 +9169,8 @@
                 <v:path o:extrusionok="f" gradientshapeok="t" o:connecttype="rect"/>
                 <o:lock v:ext="edit" aspectratio="t"/>
               </v:shapetype>
-              <v:shape id="_x0000_i17" o:spid="_x0000_s17" type="#_x0000_t75" style="width:467.75pt;height:68.40pt;mso-wrap-distance-left:0.00pt;mso-wrap-distance-top:0.00pt;mso-wrap-distance-right:0.00pt;mso-wrap-distance-bottom:0.00pt;z-index:1;" stroked="false">
-                <v:imagedata r:id="rId29" o:title=""/>
+              <v:shape id="_x0000_i20" o:spid="_x0000_s20" type="#_x0000_t75" style="width:467.75pt;height:68.40pt;mso-wrap-distance-left:0.00pt;mso-wrap-distance-top:0.00pt;mso-wrap-distance-right:0.00pt;mso-wrap-distance-bottom:0.00pt;z-index:1;" stroked="false">
+                <v:imagedata r:id="rId32" o:title=""/>
                 <o:lock v:ext="edit" rotation="t"/>
               </v:shape>
             </w:pict>
@@ -8511,7 +9342,7 @@
               <wp:inline xmlns:wp="http://schemas.openxmlformats.org/drawingml/2006/wordprocessingDrawing" distT="0" distB="0" distL="0" distR="0">
                 <wp:extent cx="4543425" cy="428625"/>
                 <wp:effectExtent l="0" t="0" r="0" b="0"/>
-                <wp:docPr id="19" name="" hidden="0"/>
+                <wp:docPr id="22" name="" hidden="0"/>
                 <wp:cNvGraphicFramePr>
                   <a:graphicFrameLocks xmlns:a="http://schemas.openxmlformats.org/drawingml/2006/main" noChangeAspect="1"/>
                 </wp:cNvGraphicFramePr>
@@ -8526,7 +9357,7 @@
                         <pic:nvPr isPhoto="0" userDrawn="0"/>
                       </pic:nvPicPr>
                       <pic:blipFill>
-                        <a:blip r:embed="rId30"/>
+                        <a:blip r:embed="rId33"/>
                         <a:stretch/>
                       </pic:blipFill>
                       <pic:spPr bwMode="auto">
@@ -8565,8 +9396,8 @@
                 <v:path o:extrusionok="f" gradientshapeok="t" o:connecttype="rect"/>
                 <o:lock v:ext="edit" aspectratio="t"/>
               </v:shapetype>
-              <v:shape id="_x0000_i18" o:spid="_x0000_s18" type="#_x0000_t75" style="width:357.75pt;height:33.75pt;mso-wrap-distance-left:0.00pt;mso-wrap-distance-top:0.00pt;mso-wrap-distance-right:0.00pt;mso-wrap-distance-bottom:0.00pt;z-index:1;" stroked="false">
-                <v:imagedata r:id="rId30" o:title=""/>
+              <v:shape id="_x0000_i21" o:spid="_x0000_s21" type="#_x0000_t75" style="width:357.75pt;height:33.75pt;mso-wrap-distance-left:0.00pt;mso-wrap-distance-top:0.00pt;mso-wrap-distance-right:0.00pt;mso-wrap-distance-bottom:0.00pt;z-index:1;" stroked="false">
+                <v:imagedata r:id="rId33" o:title=""/>
                 <o:lock v:ext="edit" rotation="t"/>
               </v:shape>
             </w:pict>
@@ -8725,7 +9556,7 @@
               <wp:inline xmlns:wp="http://schemas.openxmlformats.org/drawingml/2006/wordprocessingDrawing" distT="0" distB="0" distL="0" distR="0">
                 <wp:extent cx="4791075" cy="2200275"/>
                 <wp:effectExtent l="0" t="0" r="0" b="0"/>
-                <wp:docPr id="20" name="" hidden="0"/>
+                <wp:docPr id="23" name="" hidden="0"/>
                 <wp:cNvGraphicFramePr>
                   <a:graphicFrameLocks xmlns:a="http://schemas.openxmlformats.org/drawingml/2006/main" noChangeAspect="1"/>
                 </wp:cNvGraphicFramePr>
@@ -8740,7 +9571,7 @@
                         <pic:nvPr isPhoto="0" userDrawn="0"/>
                       </pic:nvPicPr>
                       <pic:blipFill>
-                        <a:blip r:embed="rId31"/>
+                        <a:blip r:embed="rId34"/>
                         <a:stretch/>
                       </pic:blipFill>
                       <pic:spPr bwMode="auto">
@@ -8779,8 +9610,8 @@
                 <v:path o:extrusionok="f" gradientshapeok="t" o:connecttype="rect"/>
                 <o:lock v:ext="edit" aspectratio="t"/>
               </v:shapetype>
-              <v:shape id="_x0000_i19" o:spid="_x0000_s19" type="#_x0000_t75" style="width:377.25pt;height:173.25pt;mso-wrap-distance-left:0.00pt;mso-wrap-distance-top:0.00pt;mso-wrap-distance-right:0.00pt;mso-wrap-distance-bottom:0.00pt;z-index:1;" stroked="false">
-                <v:imagedata r:id="rId31" o:title=""/>
+              <v:shape id="_x0000_i22" o:spid="_x0000_s22" type="#_x0000_t75" style="width:377.25pt;height:173.25pt;mso-wrap-distance-left:0.00pt;mso-wrap-distance-top:0.00pt;mso-wrap-distance-right:0.00pt;mso-wrap-distance-bottom:0.00pt;z-index:1;" stroked="false">
+                <v:imagedata r:id="rId34" o:title=""/>
                 <o:lock v:ext="edit" rotation="t"/>
               </v:shape>
             </w:pict>
@@ -9039,7 +9870,7 @@
               <wp:inline xmlns:wp="http://schemas.openxmlformats.org/drawingml/2006/wordprocessingDrawing" distT="0" distB="0" distL="0" distR="0">
                 <wp:extent cx="4010025" cy="314325"/>
                 <wp:effectExtent l="0" t="0" r="0" b="0"/>
-                <wp:docPr id="21" name="" hidden="0"/>
+                <wp:docPr id="24" name="" hidden="0"/>
                 <wp:cNvGraphicFramePr>
                   <a:graphicFrameLocks xmlns:a="http://schemas.openxmlformats.org/drawingml/2006/main" noChangeAspect="1"/>
                 </wp:cNvGraphicFramePr>
@@ -9054,7 +9885,7 @@
                         <pic:nvPr isPhoto="0" userDrawn="0"/>
                       </pic:nvPicPr>
                       <pic:blipFill>
-                        <a:blip r:embed="rId32"/>
+                        <a:blip r:embed="rId35"/>
                         <a:stretch/>
                       </pic:blipFill>
                       <pic:spPr bwMode="auto">
@@ -9093,8 +9924,8 @@
                 <v:path o:extrusionok="f" gradientshapeok="t" o:connecttype="rect"/>
                 <o:lock v:ext="edit" aspectratio="t"/>
               </v:shapetype>
-              <v:shape id="_x0000_i20" o:spid="_x0000_s20" type="#_x0000_t75" style="width:315.75pt;height:24.75pt;mso-wrap-distance-left:0.00pt;mso-wrap-distance-top:0.00pt;mso-wrap-distance-right:0.00pt;mso-wrap-distance-bottom:0.00pt;z-index:1;" stroked="false">
-                <v:imagedata r:id="rId32" o:title=""/>
+              <v:shape id="_x0000_i23" o:spid="_x0000_s23" type="#_x0000_t75" style="width:315.75pt;height:24.75pt;mso-wrap-distance-left:0.00pt;mso-wrap-distance-top:0.00pt;mso-wrap-distance-right:0.00pt;mso-wrap-distance-bottom:0.00pt;z-index:1;" stroked="false">
+                <v:imagedata r:id="rId35" o:title=""/>
                 <o:lock v:ext="edit" rotation="t"/>
               </v:shape>
             </w:pict>

</xml_diff>

<commit_message>
Tiny bit more writing on classes.
</commit_message>
<xml_diff>
--- a/Design.docx
+++ b/Design.docx
@@ -955,7 +955,7 @@
       <w:hyperlink r:id="rId11" w:tooltip="https://ssd.jpl.nasa.gov/api/horizons.api?format=text&amp;COMMAND='&quot;+target+&quot;'&amp;OBJ_DATA='YES'&amp;MAKE_EPHEM='YES'&amp;EPHEM_TYPE='VECTORS'&amp;START_TIME='&quot;+startTime+&quot;'&amp;STOP_TIME='&quot;+stopTime+&quot;'&amp;CENTER='500@0'&amp;STEP_SIZE='1 d'&amp;QUANTITIES='1,9,20,23,24,29'" w:history="1">
         <w:r>
           <w:rPr>
-            <w:rStyle w:val="869"/>
+            <w:rStyle w:val="834"/>
             <w:color w:val="000000" w:themeColor="text1"/>
             <w:sz w:val="22"/>
             <w:szCs w:val="18"/>
@@ -965,7 +965,7 @@
         </w:r>
         <w:r>
           <w:rPr>
-            <w:rStyle w:val="869"/>
+            <w:rStyle w:val="834"/>
             <w:color w:val="000000" w:themeColor="text1"/>
             <w:sz w:val="22"/>
             <w:szCs w:val="18"/>
@@ -974,7 +974,7 @@
         </w:r>
         <w:r>
           <w:rPr>
-            <w:rStyle w:val="869"/>
+            <w:rStyle w:val="834"/>
             <w:color w:val="000000" w:themeColor="text1"/>
             <w:sz w:val="22"/>
             <w:szCs w:val="18"/>
@@ -1115,7 +1115,7 @@
       <w:hyperlink r:id="rId12" w:tooltip="https://ssd-api.jpl.nasa.gov/doc/horizons.html#ephem_type" w:history="1">
         <w:r>
           <w:rPr>
-            <w:rStyle w:val="869"/>
+            <w:rStyle w:val="834"/>
             <w:color w:val="000000" w:themeColor="text1"/>
             <w:sz w:val="22"/>
             <w:szCs w:val="22"/>
@@ -1125,7 +1125,7 @@
         </w:r>
         <w:r>
           <w:rPr>
-            <w:rStyle w:val="869"/>
+            <w:rStyle w:val="834"/>
             <w:color w:val="000000" w:themeColor="text1"/>
             <w:sz w:val="22"/>
             <w:szCs w:val="22"/>
@@ -1134,7 +1134,7 @@
         </w:r>
         <w:r>
           <w:rPr>
-            <w:rStyle w:val="869"/>
+            <w:rStyle w:val="834"/>
             <w:color w:val="000000" w:themeColor="text1"/>
             <w:sz w:val="22"/>
             <w:szCs w:val="22"/>
@@ -2626,7 +2626,7 @@
     </w:p>
     <w:p>
       <w:pPr>
-        <w:pStyle w:val="891"/>
+        <w:pStyle w:val="856"/>
         <w:numPr>
           <w:ilvl w:val="0"/>
           <w:numId w:val="2"/>
@@ -2669,7 +2669,7 @@
     </w:p>
     <w:p>
       <w:pPr>
-        <w:pStyle w:val="891"/>
+        <w:pStyle w:val="856"/>
         <w:numPr>
           <w:ilvl w:val="0"/>
           <w:numId w:val="2"/>
@@ -4076,7 +4076,7 @@
         <w:rPr>
           <w:color w:val="000000" w:themeColor="text1"/>
           <w:sz w:val="22"/>
-          <w:szCs w:val="18"/>
+          <w:szCs w:val="22"/>
           <w:highlight w:val="none"/>
         </w:rPr>
       </w:r>
@@ -4185,7 +4185,7 @@
     </w:p>
     <w:p>
       <w:pPr>
-        <w:pStyle w:val="891"/>
+        <w:pStyle w:val="856"/>
         <w:numPr>
           <w:ilvl w:val="0"/>
           <w:numId w:val="1"/>
@@ -4228,7 +4228,7 @@
     </w:p>
     <w:p>
       <w:pPr>
-        <w:pStyle w:val="891"/>
+        <w:pStyle w:val="856"/>
         <w:numPr>
           <w:ilvl w:val="0"/>
           <w:numId w:val="1"/>
@@ -4271,7 +4271,7 @@
     </w:p>
     <w:p>
       <w:pPr>
-        <w:pStyle w:val="891"/>
+        <w:pStyle w:val="856"/>
         <w:numPr>
           <w:ilvl w:val="0"/>
           <w:numId w:val="1"/>
@@ -4314,7 +4314,7 @@
     </w:p>
     <w:p>
       <w:pPr>
-        <w:pStyle w:val="891"/>
+        <w:pStyle w:val="856"/>
         <w:numPr>
           <w:ilvl w:val="0"/>
           <w:numId w:val="1"/>
@@ -5441,7 +5441,7 @@
       </w:r>
       <w:r>
         <w:rPr>
-          <w:color w:val="5b9bd5"/>
+          <w:color w:val="5b9bd5" w:themeColor="accent1"/>
           <w:sz w:val="32"/>
           <w:szCs w:val="32"/>
           <w:highlight w:val="none"/>
@@ -5585,7 +5585,7 @@
         <w:rPr>
           <w:color w:val="000000" w:themeColor="text1"/>
           <w:sz w:val="22"/>
-          <w:szCs w:val="16"/>
+          <w:szCs w:val="22"/>
           <w:highlight w:val="none"/>
         </w:rPr>
       </w:r>
@@ -5712,7 +5712,7 @@
     </w:p>
     <w:tbl>
       <w:tblPr>
-        <w:tblStyle w:val="743"/>
+        <w:tblStyle w:val="708"/>
         <w:tblW w:w="0" w:type="auto"/>
         <w:tblBorders/>
         <w:tblLook w:val="04A0" w:firstRow="1" w:lastRow="0" w:firstColumn="1" w:lastColumn="0" w:noHBand="0" w:noVBand="1"/>
@@ -7924,6 +7924,14 @@
           <w:highlight w:val="none"/>
         </w:rPr>
       </w:r>
+      <w:r>
+        <w:rPr>
+          <w:color w:val="000000"/>
+          <w:sz w:val="22"/>
+          <w:szCs w:val="22"/>
+          <w:highlight w:val="none"/>
+        </w:rPr>
+      </w:r>
     </w:p>
     <w:p>
       <w:pPr>
@@ -7944,7 +7952,302 @@
           <w:szCs w:val="22"/>
           <w:highlight w:val="none"/>
         </w:rPr>
-      </w:r>
+        <w:t xml:space="preserve">As you can see, here, there aren’t many classes. celestialBody is the main template for every object in the solar system, and has all the basic methods needed by any object. All celestial bodies need to be able to:</w:t>
+      </w:r>
+      <w:r>
+        <w:rPr>
+          <w:color w:val="000000"/>
+          <w:sz w:val="22"/>
+          <w:szCs w:val="22"/>
+          <w:highlight w:val="none"/>
+        </w:rPr>
+      </w:r>
+      <w:r>
+        <w:rPr>
+          <w:color w:val="000000"/>
+          <w:sz w:val="22"/>
+          <w:szCs w:val="22"/>
+          <w:highlight w:val="none"/>
+        </w:rPr>
+      </w:r>
+    </w:p>
+    <w:p>
+      <w:pPr>
+        <w:pStyle w:val="856"/>
+        <w:numPr>
+          <w:ilvl w:val="0"/>
+          <w:numId w:val="4"/>
+        </w:numPr>
+        <w:pBdr/>
+        <w:spacing/>
+        <w:ind/>
+        <w:rPr>
+          <w:color w:val="000000"/>
+          <w:sz w:val="22"/>
+          <w:szCs w:val="22"/>
+          <w:highlight w:val="none"/>
+        </w:rPr>
+      </w:pPr>
+      <w:r>
+        <w:rPr>
+          <w:color w:val="000000"/>
+          <w:sz w:val="22"/>
+          <w:szCs w:val="22"/>
+          <w:highlight w:val="none"/>
+        </w:rPr>
+        <w:t xml:space="preserve">Output their attributes</w:t>
+      </w:r>
+      <w:r>
+        <w:rPr>
+          <w:color w:val="000000"/>
+          <w:sz w:val="22"/>
+          <w:szCs w:val="22"/>
+          <w:highlight w:val="none"/>
+        </w:rPr>
+      </w:r>
+    </w:p>
+    <w:p>
+      <w:pPr>
+        <w:pStyle w:val="856"/>
+        <w:numPr>
+          <w:ilvl w:val="0"/>
+          <w:numId w:val="4"/>
+        </w:numPr>
+        <w:pBdr/>
+        <w:spacing/>
+        <w:ind/>
+        <w:rPr>
+          <w:color w:val="000000"/>
+          <w:sz w:val="22"/>
+          <w:szCs w:val="22"/>
+          <w:highlight w:val="none"/>
+        </w:rPr>
+      </w:pPr>
+      <w:r>
+        <w:rPr>
+          <w:color w:val="000000"/>
+          <w:sz w:val="22"/>
+          <w:szCs w:val="22"/>
+          <w:highlight w:val="none"/>
+        </w:rPr>
+        <w:t xml:space="preserve">Keep a record of their previous positions so that we can draw orbital lines</w:t>
+      </w:r>
+      <w:r>
+        <w:rPr>
+          <w:color w:val="000000"/>
+          <w:sz w:val="22"/>
+          <w:szCs w:val="22"/>
+          <w:highlight w:val="none"/>
+        </w:rPr>
+      </w:r>
+    </w:p>
+    <w:p>
+      <w:pPr>
+        <w:pStyle w:val="856"/>
+        <w:numPr>
+          <w:ilvl w:val="0"/>
+          <w:numId w:val="4"/>
+        </w:numPr>
+        <w:pBdr/>
+        <w:spacing/>
+        <w:ind/>
+        <w:rPr>
+          <w:color w:val="000000"/>
+          <w:sz w:val="22"/>
+          <w:szCs w:val="22"/>
+          <w:highlight w:val="none"/>
+        </w:rPr>
+      </w:pPr>
+      <w:r>
+        <w:rPr>
+          <w:color w:val="000000"/>
+          <w:sz w:val="22"/>
+          <w:szCs w:val="22"/>
+          <w:highlight w:val="none"/>
+        </w:rPr>
+        <w:t xml:space="preserve">If they’re the currently selected planet, keep a record of the forces acting on them so that force arrows can be drawn if the user has them turned on</w:t>
+      </w:r>
+      <w:r>
+        <w:rPr>
+          <w:color w:val="000000"/>
+          <w:sz w:val="22"/>
+          <w:szCs w:val="22"/>
+          <w:highlight w:val="none"/>
+        </w:rPr>
+      </w:r>
+    </w:p>
+    <w:p>
+      <w:pPr>
+        <w:pStyle w:val="856"/>
+        <w:numPr>
+          <w:ilvl w:val="0"/>
+          <w:numId w:val="4"/>
+        </w:numPr>
+        <w:pBdr/>
+        <w:spacing/>
+        <w:ind/>
+        <w:rPr>
+          <w:color w:val="000000"/>
+          <w:sz w:val="22"/>
+          <w:szCs w:val="22"/>
+          <w:highlight w:val="none"/>
+        </w:rPr>
+      </w:pPr>
+      <w:r>
+        <w:rPr>
+          <w:color w:val="000000"/>
+          <w:sz w:val="22"/>
+          <w:szCs w:val="22"/>
+          <w:highlight w:val="none"/>
+        </w:rPr>
+        <w:t xml:space="preserve">Keep a record of their physical properties: Kinetic and potential energy, and momentum, so that these can be summed up across all bodies and displayed to demonstrate conservation of energy and momentum</w:t>
+      </w:r>
+      <w:r>
+        <w:rPr>
+          <w:color w:val="000000"/>
+          <w:sz w:val="22"/>
+          <w:szCs w:val="22"/>
+          <w:highlight w:val="none"/>
+        </w:rPr>
+      </w:r>
+    </w:p>
+    <w:p>
+      <w:pPr>
+        <w:pStyle w:val="856"/>
+        <w:numPr>
+          <w:ilvl w:val="0"/>
+          <w:numId w:val="4"/>
+        </w:numPr>
+        <w:pBdr/>
+        <w:spacing/>
+        <w:ind/>
+        <w:rPr>
+          <w:color w:val="000000"/>
+          <w:sz w:val="22"/>
+          <w:szCs w:val="22"/>
+          <w:highlight w:val="none"/>
+        </w:rPr>
+      </w:pPr>
+      <w:r>
+        <w:rPr>
+          <w:color w:val="000000"/>
+          <w:sz w:val="22"/>
+          <w:szCs w:val="22"/>
+          <w:highlight w:val="none"/>
+        </w:rPr>
+        <w:t xml:space="preserve">Have methods that facilitate physical simulation so that the program accurately represents the solar system.</w:t>
+      </w:r>
+      <w:r>
+        <w:rPr>
+          <w:color w:val="000000"/>
+          <w:sz w:val="22"/>
+          <w:szCs w:val="22"/>
+          <w:highlight w:val="none"/>
+        </w:rPr>
+      </w:r>
+    </w:p>
+    <w:p>
+      <w:pPr>
+        <w:pBdr/>
+        <w:spacing/>
+        <w:ind/>
+        <w:rPr>
+          <w:color w:val="000000"/>
+          <w:sz w:val="22"/>
+          <w:szCs w:val="22"/>
+          <w:highlight w:val="none"/>
+        </w:rPr>
+      </w:pPr>
+      <w:r>
+        <w:rPr>
+          <w:color w:val="000000"/>
+          <w:sz w:val="22"/>
+          <w:szCs w:val="22"/>
+          <w:highlight w:val="none"/>
+        </w:rPr>
+        <w:t xml:space="preserve">The methods that are related to physical simulation will be covered in the section on physics. So let’s cover the rest.</w:t>
+      </w:r>
+      <w:r>
+        <w:rPr>
+          <w:color w:val="000000"/>
+          <w:sz w:val="22"/>
+          <w:szCs w:val="22"/>
+          <w:highlight w:val="none"/>
+        </w:rPr>
+      </w:r>
+    </w:p>
+    <w:p>
+      <w:pPr>
+        <w:pBdr/>
+        <w:spacing/>
+        <w:ind/>
+        <w:rPr>
+          <w:color w:val="000000"/>
+          <w:sz w:val="22"/>
+          <w:szCs w:val="22"/>
+          <w:highlight w:val="none"/>
+        </w:rPr>
+      </w:pPr>
+      <w:r>
+        <w:rPr>
+          <w:color w:val="000000"/>
+          <w:sz w:val="22"/>
+          <w:szCs w:val="22"/>
+          <w:highlight w:val="none"/>
+        </w:rPr>
+        <w:t xml:space="preserve">First, outputting their attributes. This is all done with “getter” functions. You can see a function is a getter function because it starts with a get. Every get function in the class diagram returns the attribute in its name, i.e. getVel() returns vel (velocity) and getKE returns ke (kinetic energy.) I do this rather than just using planet.pos or planet.vel so that I can implement encapsulation, which improves security. It also means I can edit the output before it’s returned, which is used in the satellite subclass to change the way its orbital lines look to make them look better. Making everything a getter leaves room open for further editing in the future if needed, and makes the program more robust.</w:t>
+      </w:r>
+      <w:r>
+        <w:rPr>
+          <w:color w:val="000000"/>
+          <w:sz w:val="22"/>
+          <w:szCs w:val="22"/>
+          <w:highlight w:val="none"/>
+        </w:rPr>
+      </w:r>
+    </w:p>
+    <w:p>
+      <w:pPr>
+        <w:pBdr/>
+        <w:spacing/>
+        <w:ind/>
+        <w:rPr>
+          <w:color w:val="000000"/>
+          <w:sz w:val="22"/>
+          <w:szCs w:val="22"/>
+          <w:highlight w:val="none"/>
+        </w:rPr>
+      </w:pPr>
+      <w:r>
+        <w:rPr>
+          <w:color w:val="000000"/>
+          <w:sz w:val="22"/>
+          <w:szCs w:val="22"/>
+          <w:highlight w:val="none"/>
+        </w:rPr>
+        <w:t xml:space="preserve">Next, keeping a record of their previous positions. This is quite simple, as we’ll see later I’ll just add their position to a list of all their positions while simulating the tick. This list is “records”, which you can see in the attributes in the class diagram. To add a record to it, we’ll have a function, addRecord(). This is important, because having a function do it means we can get rid of the oldest entries in the list whenever we add a record, so that the list of positions doesn’t grow indefinitely. addRecord() will use the line length to shorten the list whenever it gets too long. Here is a pseudocode snippet that demonstrates how that might work:</w:t>
+      </w:r>
+      <w:r>
+        <w:rPr>
+          <w:color w:val="000000"/>
+          <w:sz w:val="22"/>
+          <w:szCs w:val="22"/>
+          <w:highlight w:val="none"/>
+        </w:rPr>
+      </w:r>
+    </w:p>
+    <w:p>
+      <w:pPr>
+        <w:pBdr/>
+        <w:spacing/>
+        <w:ind/>
+        <w:rPr>
+          <w:color w:val="000000"/>
+          <w:sz w:val="22"/>
+          <w:szCs w:val="22"/>
+          <w:highlight w:val="none"/>
+        </w:rPr>
+      </w:pPr>
       <w:r>
         <w:rPr>
           <w:color w:val="000000"/>
@@ -8255,20 +8558,20 @@
       </w:r>
       <w:r>
         <w:rPr>
-          <w:color w:val="5b9bd5"/>
-          <w:sz w:val="32"/>
-          <w:szCs w:val="32"/>
-          <w:highlight w:val="none"/>
-        </w:rPr>
-      </w:r>
-      <w:r>
-        <w:rPr>
           <w:color w:val="5b9bd5" w:themeColor="accent1"/>
           <w:sz w:val="32"/>
           <w:szCs w:val="32"/>
           <w:highlight w:val="none"/>
         </w:rPr>
       </w:r>
+      <w:r>
+        <w:rPr>
+          <w:color w:val="5b9bd5" w:themeColor="accent1"/>
+          <w:sz w:val="32"/>
+          <w:szCs w:val="32"/>
+          <w:highlight w:val="none"/>
+        </w:rPr>
+      </w:r>
     </w:p>
     <w:p>
       <w:pPr>
@@ -8351,7 +8654,7 @@
         <w:rPr>
           <w:color w:val="000000" w:themeColor="text1"/>
           <w:sz w:val="22"/>
-          <w:szCs w:val="16"/>
+          <w:szCs w:val="22"/>
           <w:highlight w:val="none"/>
         </w:rPr>
       </w:r>
@@ -8388,7 +8691,7 @@
         <w:rPr>
           <w:color w:val="000000" w:themeColor="text1"/>
           <w:sz w:val="22"/>
-          <w:szCs w:val="16"/>
+          <w:szCs w:val="22"/>
           <w:highlight w:val="none"/>
         </w:rPr>
       </w:r>
@@ -8482,7 +8785,7 @@
         <w:rPr>
           <w:color w:val="000000" w:themeColor="text1"/>
           <w:sz w:val="22"/>
-          <w:szCs w:val="16"/>
+          <w:szCs w:val="22"/>
           <w:highlight w:val="none"/>
         </w:rPr>
       </w:r>
@@ -8529,7 +8832,7 @@
         <w:rPr>
           <w:color w:val="000000" w:themeColor="text1"/>
           <w:sz w:val="22"/>
-          <w:szCs w:val="16"/>
+          <w:szCs w:val="22"/>
           <w:highlight w:val="none"/>
         </w:rPr>
       </w:r>
@@ -8585,7 +8888,7 @@
         <w:rPr>
           <w:color w:val="000000" w:themeColor="text1"/>
           <w:sz w:val="22"/>
-          <w:szCs w:val="16"/>
+          <w:szCs w:val="22"/>
           <w:highlight w:val="none"/>
         </w:rPr>
       </w:r>
@@ -8640,7 +8943,7 @@
         <w:rPr>
           <w:color w:val="000000" w:themeColor="text1"/>
           <w:sz w:val="22"/>
-          <w:szCs w:val="16"/>
+          <w:szCs w:val="22"/>
           <w:highlight w:val="none"/>
         </w:rPr>
       </w:r>
@@ -8725,7 +9028,7 @@
         <w:rPr>
           <w:color w:val="000000" w:themeColor="text1"/>
           <w:sz w:val="22"/>
-          <w:szCs w:val="16"/>
+          <w:szCs w:val="22"/>
           <w:highlight w:val="none"/>
         </w:rPr>
       </w:r>
@@ -8818,7 +9121,7 @@
         <w:rPr>
           <w:color w:val="000000" w:themeColor="text1"/>
           <w:sz w:val="22"/>
-          <w:szCs w:val="16"/>
+          <w:szCs w:val="22"/>
           <w:highlight w:val="none"/>
         </w:rPr>
       </w:r>
@@ -8903,7 +9206,7 @@
         <w:rPr>
           <w:color w:val="000000" w:themeColor="text1"/>
           <w:sz w:val="22"/>
-          <w:szCs w:val="16"/>
+          <w:szCs w:val="22"/>
           <w:highlight w:val="none"/>
         </w:rPr>
       </w:r>
@@ -9009,7 +9312,7 @@
         <w:rPr>
           <w:color w:val="000000" w:themeColor="text1"/>
           <w:sz w:val="22"/>
-          <w:szCs w:val="16"/>
+          <w:szCs w:val="22"/>
           <w:highlight w:val="none"/>
         </w:rPr>
       </w:r>
@@ -9151,8 +9454,8 @@
       <w:r>
         <w:rPr>
           <w:color w:val="2f5496" w:themeColor="accent5" w:themeShade="BF"/>
-          <w:sz w:val="24"/>
-          <w:szCs w:val="20"/>
+          <w:sz w:val="22"/>
+          <w:szCs w:val="22"/>
           <w:highlight w:val="none"/>
         </w:rPr>
       </w:r>
@@ -9189,8 +9492,8 @@
       <w:r>
         <w:rPr>
           <w:color w:val="2f5496" w:themeColor="accent5" w:themeShade="BF"/>
-          <w:sz w:val="22"/>
-          <w:szCs w:val="18"/>
+          <w:sz w:val="24"/>
+          <w:szCs w:val="24"/>
           <w:highlight w:val="none"/>
         </w:rPr>
       </w:r>
@@ -14748,7 +15051,7 @@
       <w:footnotePr/>
       <w:endnotePr/>
       <w:type w:val="nextPage"/>
-      <w:pgSz w:h="16838" w:orient="portrait" w:w="11906"/>
+      <w:pgSz w:h="16838" w:orient="landscape" w:w="11906"/>
       <w:pgMar w:top="1134" w:right="850" w:bottom="1134" w:left="1701" w:header="709" w:footer="709" w:gutter="0"/>
       <w:cols w:num="1" w:sep="0" w:space="708" w:equalWidth="1"/>
     </w:sectPr>
@@ -14826,7 +15129,7 @@
 <w:hdr xmlns:wpc="http://schemas.microsoft.com/office/word/2010/wordprocessingCanvas" xmlns:mc="http://schemas.openxmlformats.org/markup-compatibility/2006" xmlns:o="urn:schemas-microsoft-com:office:office" xmlns:r="http://schemas.openxmlformats.org/officeDocument/2006/relationships" xmlns:m="http://schemas.openxmlformats.org/officeDocument/2006/math" xmlns:v="urn:schemas-microsoft-com:vml" xmlns:wp14="http://schemas.microsoft.com/office/word/2010/wordprocessingDrawing" xmlns:wp="http://schemas.openxmlformats.org/drawingml/2006/wordprocessingDrawing" xmlns:w10="urn:schemas-microsoft-com:office:word" xmlns:w="http://schemas.openxmlformats.org/wordprocessingml/2006/main" xmlns:w14="http://schemas.microsoft.com/office/word/2010/wordml" xmlns:w15="http://schemas.microsoft.com/office/word/2012/wordml" xmlns:wpg="http://schemas.microsoft.com/office/word/2010/wordprocessingGroup" xmlns:wpi="http://schemas.microsoft.com/office/word/2010/wordprocessingInk" xmlns:wne="http://schemas.microsoft.com/office/word/2006/wordml" xmlns:a="http://schemas.openxmlformats.org/drawingml/2006/main" xmlns:wps="http://schemas.microsoft.com/office/word/2010/wordprocessingShape" mc:Ignorable="w14 w15 wp14">
   <w:p>
     <w:pPr>
-      <w:pStyle w:val="737"/>
+      <w:pStyle w:val="702"/>
       <w:pBdr/>
       <w:spacing/>
       <w:ind/>
@@ -15112,11 +15415,309 @@
       <w:suff w:val="tab"/>
     </w:lvl>
   </w:abstractNum>
+  <w:abstractNum w:abstractNumId="2">
+    <w:lvl w:ilvl="0">
+      <w:isLgl w:val="false"/>
+      <w:lvlJc w:val="left"/>
+      <w:lvlText w:val="–"/>
+      <w:numFmt w:val="bullet"/>
+      <w:pPr>
+        <w:pBdr/>
+        <w:spacing/>
+        <w:ind w:hanging="360" w:left="709"/>
+      </w:pPr>
+      <w:rPr>
+        <w:rFonts w:hint="default" w:ascii="Arial" w:hAnsi="Arial" w:eastAsia="Arial" w:cs="Arial"/>
+      </w:rPr>
+      <w:start w:val="1"/>
+      <w:suff w:val="tab"/>
+    </w:lvl>
+    <w:lvl w:ilvl="1">
+      <w:isLgl w:val="false"/>
+      <w:lvlJc w:val="left"/>
+      <w:lvlText w:val="o"/>
+      <w:numFmt w:val="bullet"/>
+      <w:pPr>
+        <w:pBdr/>
+        <w:spacing/>
+        <w:ind w:hanging="360" w:left="1429"/>
+      </w:pPr>
+      <w:rPr>
+        <w:rFonts w:hint="default" w:ascii="Courier New" w:hAnsi="Courier New" w:eastAsia="Courier New" w:cs="Courier New"/>
+      </w:rPr>
+      <w:start w:val="1"/>
+      <w:suff w:val="tab"/>
+    </w:lvl>
+    <w:lvl w:ilvl="2">
+      <w:isLgl w:val="false"/>
+      <w:lvlJc w:val="left"/>
+      <w:lvlText w:val="§"/>
+      <w:numFmt w:val="bullet"/>
+      <w:pPr>
+        <w:pBdr/>
+        <w:spacing/>
+        <w:ind w:hanging="360" w:left="2149"/>
+      </w:pPr>
+      <w:rPr>
+        <w:rFonts w:hint="default" w:ascii="Wingdings" w:hAnsi="Wingdings" w:eastAsia="Wingdings" w:cs="Wingdings"/>
+      </w:rPr>
+      <w:start w:val="1"/>
+      <w:suff w:val="tab"/>
+    </w:lvl>
+    <w:lvl w:ilvl="3">
+      <w:isLgl w:val="false"/>
+      <w:lvlJc w:val="left"/>
+      <w:lvlText w:val="·"/>
+      <w:numFmt w:val="bullet"/>
+      <w:pPr>
+        <w:pBdr/>
+        <w:spacing/>
+        <w:ind w:hanging="360" w:left="2869"/>
+      </w:pPr>
+      <w:rPr>
+        <w:rFonts w:hint="default" w:ascii="Symbol" w:hAnsi="Symbol" w:eastAsia="Symbol" w:cs="Symbol"/>
+      </w:rPr>
+      <w:start w:val="1"/>
+      <w:suff w:val="tab"/>
+    </w:lvl>
+    <w:lvl w:ilvl="4">
+      <w:isLgl w:val="false"/>
+      <w:lvlJc w:val="left"/>
+      <w:lvlText w:val="o"/>
+      <w:numFmt w:val="bullet"/>
+      <w:pPr>
+        <w:pBdr/>
+        <w:spacing/>
+        <w:ind w:hanging="360" w:left="3589"/>
+      </w:pPr>
+      <w:rPr>
+        <w:rFonts w:hint="default" w:ascii="Courier New" w:hAnsi="Courier New" w:eastAsia="Courier New" w:cs="Courier New"/>
+      </w:rPr>
+      <w:start w:val="1"/>
+      <w:suff w:val="tab"/>
+    </w:lvl>
+    <w:lvl w:ilvl="5">
+      <w:isLgl w:val="false"/>
+      <w:lvlJc w:val="left"/>
+      <w:lvlText w:val="§"/>
+      <w:numFmt w:val="bullet"/>
+      <w:pPr>
+        <w:pBdr/>
+        <w:spacing/>
+        <w:ind w:hanging="360" w:left="4309"/>
+      </w:pPr>
+      <w:rPr>
+        <w:rFonts w:hint="default" w:ascii="Wingdings" w:hAnsi="Wingdings" w:eastAsia="Wingdings" w:cs="Wingdings"/>
+      </w:rPr>
+      <w:start w:val="1"/>
+      <w:suff w:val="tab"/>
+    </w:lvl>
+    <w:lvl w:ilvl="6">
+      <w:isLgl w:val="false"/>
+      <w:lvlJc w:val="left"/>
+      <w:lvlText w:val="·"/>
+      <w:numFmt w:val="bullet"/>
+      <w:pPr>
+        <w:pBdr/>
+        <w:spacing/>
+        <w:ind w:hanging="360" w:left="5029"/>
+      </w:pPr>
+      <w:rPr>
+        <w:rFonts w:hint="default" w:ascii="Symbol" w:hAnsi="Symbol" w:eastAsia="Symbol" w:cs="Symbol"/>
+      </w:rPr>
+      <w:start w:val="1"/>
+      <w:suff w:val="tab"/>
+    </w:lvl>
+    <w:lvl w:ilvl="7">
+      <w:isLgl w:val="false"/>
+      <w:lvlJc w:val="left"/>
+      <w:lvlText w:val="o"/>
+      <w:numFmt w:val="bullet"/>
+      <w:pPr>
+        <w:pBdr/>
+        <w:spacing/>
+        <w:ind w:hanging="360" w:left="5749"/>
+      </w:pPr>
+      <w:rPr>
+        <w:rFonts w:hint="default" w:ascii="Courier New" w:hAnsi="Courier New" w:eastAsia="Courier New" w:cs="Courier New"/>
+      </w:rPr>
+      <w:start w:val="1"/>
+      <w:suff w:val="tab"/>
+    </w:lvl>
+    <w:lvl w:ilvl="8">
+      <w:isLgl w:val="false"/>
+      <w:lvlJc w:val="left"/>
+      <w:lvlText w:val="§"/>
+      <w:numFmt w:val="bullet"/>
+      <w:pPr>
+        <w:pBdr/>
+        <w:spacing/>
+        <w:ind w:hanging="360" w:left="6469"/>
+      </w:pPr>
+      <w:rPr>
+        <w:rFonts w:hint="default" w:ascii="Wingdings" w:hAnsi="Wingdings" w:eastAsia="Wingdings" w:cs="Wingdings"/>
+      </w:rPr>
+      <w:start w:val="1"/>
+      <w:suff w:val="tab"/>
+    </w:lvl>
+  </w:abstractNum>
+  <w:abstractNum w:abstractNumId="3">
+    <w:lvl w:ilvl="0">
+      <w:isLgl w:val="false"/>
+      <w:lvlJc w:val="left"/>
+      <w:lvlText w:val="·"/>
+      <w:numFmt w:val="bullet"/>
+      <w:pPr>
+        <w:pBdr/>
+        <w:spacing/>
+        <w:ind w:hanging="360" w:left="709"/>
+      </w:pPr>
+      <w:rPr>
+        <w:rFonts w:hint="default" w:ascii="Symbol" w:hAnsi="Symbol" w:eastAsia="Symbol" w:cs="Symbol"/>
+      </w:rPr>
+      <w:start w:val="1"/>
+      <w:suff w:val="tab"/>
+    </w:lvl>
+    <w:lvl w:ilvl="1">
+      <w:isLgl w:val="false"/>
+      <w:lvlJc w:val="left"/>
+      <w:lvlText w:val="o"/>
+      <w:numFmt w:val="bullet"/>
+      <w:pPr>
+        <w:pBdr/>
+        <w:spacing/>
+        <w:ind w:hanging="360" w:left="1429"/>
+      </w:pPr>
+      <w:rPr>
+        <w:rFonts w:hint="default" w:ascii="Courier New" w:hAnsi="Courier New" w:eastAsia="Courier New" w:cs="Courier New"/>
+      </w:rPr>
+      <w:start w:val="1"/>
+      <w:suff w:val="tab"/>
+    </w:lvl>
+    <w:lvl w:ilvl="2">
+      <w:isLgl w:val="false"/>
+      <w:lvlJc w:val="left"/>
+      <w:lvlText w:val="§"/>
+      <w:numFmt w:val="bullet"/>
+      <w:pPr>
+        <w:pBdr/>
+        <w:spacing/>
+        <w:ind w:hanging="360" w:left="2149"/>
+      </w:pPr>
+      <w:rPr>
+        <w:rFonts w:hint="default" w:ascii="Wingdings" w:hAnsi="Wingdings" w:eastAsia="Wingdings" w:cs="Wingdings"/>
+      </w:rPr>
+      <w:start w:val="1"/>
+      <w:suff w:val="tab"/>
+    </w:lvl>
+    <w:lvl w:ilvl="3">
+      <w:isLgl w:val="false"/>
+      <w:lvlJc w:val="left"/>
+      <w:lvlText w:val="·"/>
+      <w:numFmt w:val="bullet"/>
+      <w:pPr>
+        <w:pBdr/>
+        <w:spacing/>
+        <w:ind w:hanging="360" w:left="2869"/>
+      </w:pPr>
+      <w:rPr>
+        <w:rFonts w:hint="default" w:ascii="Symbol" w:hAnsi="Symbol" w:eastAsia="Symbol" w:cs="Symbol"/>
+      </w:rPr>
+      <w:start w:val="1"/>
+      <w:suff w:val="tab"/>
+    </w:lvl>
+    <w:lvl w:ilvl="4">
+      <w:isLgl w:val="false"/>
+      <w:lvlJc w:val="left"/>
+      <w:lvlText w:val="o"/>
+      <w:numFmt w:val="bullet"/>
+      <w:pPr>
+        <w:pBdr/>
+        <w:spacing/>
+        <w:ind w:hanging="360" w:left="3589"/>
+      </w:pPr>
+      <w:rPr>
+        <w:rFonts w:hint="default" w:ascii="Courier New" w:hAnsi="Courier New" w:eastAsia="Courier New" w:cs="Courier New"/>
+      </w:rPr>
+      <w:start w:val="1"/>
+      <w:suff w:val="tab"/>
+    </w:lvl>
+    <w:lvl w:ilvl="5">
+      <w:isLgl w:val="false"/>
+      <w:lvlJc w:val="left"/>
+      <w:lvlText w:val="§"/>
+      <w:numFmt w:val="bullet"/>
+      <w:pPr>
+        <w:pBdr/>
+        <w:spacing/>
+        <w:ind w:hanging="360" w:left="4309"/>
+      </w:pPr>
+      <w:rPr>
+        <w:rFonts w:hint="default" w:ascii="Wingdings" w:hAnsi="Wingdings" w:eastAsia="Wingdings" w:cs="Wingdings"/>
+      </w:rPr>
+      <w:start w:val="1"/>
+      <w:suff w:val="tab"/>
+    </w:lvl>
+    <w:lvl w:ilvl="6">
+      <w:isLgl w:val="false"/>
+      <w:lvlJc w:val="left"/>
+      <w:lvlText w:val="·"/>
+      <w:numFmt w:val="bullet"/>
+      <w:pPr>
+        <w:pBdr/>
+        <w:spacing/>
+        <w:ind w:hanging="360" w:left="5029"/>
+      </w:pPr>
+      <w:rPr>
+        <w:rFonts w:hint="default" w:ascii="Symbol" w:hAnsi="Symbol" w:eastAsia="Symbol" w:cs="Symbol"/>
+      </w:rPr>
+      <w:start w:val="1"/>
+      <w:suff w:val="tab"/>
+    </w:lvl>
+    <w:lvl w:ilvl="7">
+      <w:isLgl w:val="false"/>
+      <w:lvlJc w:val="left"/>
+      <w:lvlText w:val="o"/>
+      <w:numFmt w:val="bullet"/>
+      <w:pPr>
+        <w:pBdr/>
+        <w:spacing/>
+        <w:ind w:hanging="360" w:left="5749"/>
+      </w:pPr>
+      <w:rPr>
+        <w:rFonts w:hint="default" w:ascii="Courier New" w:hAnsi="Courier New" w:eastAsia="Courier New" w:cs="Courier New"/>
+      </w:rPr>
+      <w:start w:val="1"/>
+      <w:suff w:val="tab"/>
+    </w:lvl>
+    <w:lvl w:ilvl="8">
+      <w:isLgl w:val="false"/>
+      <w:lvlJc w:val="left"/>
+      <w:lvlText w:val="§"/>
+      <w:numFmt w:val="bullet"/>
+      <w:pPr>
+        <w:pBdr/>
+        <w:spacing/>
+        <w:ind w:hanging="360" w:left="6469"/>
+      </w:pPr>
+      <w:rPr>
+        <w:rFonts w:hint="default" w:ascii="Wingdings" w:hAnsi="Wingdings" w:eastAsia="Wingdings" w:cs="Wingdings"/>
+      </w:rPr>
+      <w:start w:val="1"/>
+      <w:suff w:val="tab"/>
+    </w:lvl>
+  </w:abstractNum>
   <w:num w:numId="1">
     <w:abstractNumId w:val="0"/>
   </w:num>
   <w:num w:numId="2">
     <w:abstractNumId w:val="1"/>
+  </w:num>
+  <w:num w:numId="3">
+    <w:abstractNumId w:val="2"/>
+  </w:num>
+  <w:num w:numId="4">
+    <w:abstractNumId w:val="3"/>
   </w:num>
 </w:numbering>
 </file>
@@ -15279,9 +15880,9 @@
     <w:lsdException w:name="Bibliography" w:uiPriority="37"/>
     <w:lsdException w:name="TOC Heading" w:uiPriority="39" w:qFormat="1"/>
   </w:latentStyles>
-  <w:style w:type="character" w:styleId="165">
+  <w:style w:type="character" w:styleId="668">
     <w:name w:val="Intense Emphasis"/>
-    <w:basedOn w:val="892"/>
+    <w:basedOn w:val="857"/>
     <w:uiPriority w:val="21"/>
     <w:qFormat/>
     <w:pPr>
@@ -15295,9 +15896,9 @@
       <w:color w:val="0f4761" w:themeColor="accent1" w:themeShade="BF"/>
     </w:rPr>
   </w:style>
-  <w:style w:type="character" w:styleId="168">
+  <w:style w:type="character" w:styleId="669">
     <w:name w:val="Intense Reference"/>
-    <w:basedOn w:val="892"/>
+    <w:basedOn w:val="857"/>
     <w:uiPriority w:val="32"/>
     <w:qFormat/>
     <w:pPr>
@@ -15313,9 +15914,9 @@
       <w:spacing w:val="5"/>
     </w:rPr>
   </w:style>
-  <w:style w:type="character" w:styleId="170">
+  <w:style w:type="character" w:styleId="670">
     <w:name w:val="Subtle Emphasis"/>
-    <w:basedOn w:val="892"/>
+    <w:basedOn w:val="857"/>
     <w:uiPriority w:val="19"/>
     <w:qFormat/>
     <w:pPr>
@@ -15329,9 +15930,9 @@
       <w:color w:val="404040" w:themeColor="text1" w:themeTint="BF"/>
     </w:rPr>
   </w:style>
-  <w:style w:type="character" w:styleId="171">
+  <w:style w:type="character" w:styleId="671">
     <w:name w:val="Emphasis"/>
-    <w:basedOn w:val="892"/>
+    <w:basedOn w:val="857"/>
     <w:uiPriority w:val="20"/>
     <w:qFormat/>
     <w:pPr>
@@ -15344,9 +15945,9 @@
       <w:iCs/>
     </w:rPr>
   </w:style>
-  <w:style w:type="character" w:styleId="172">
+  <w:style w:type="character" w:styleId="672">
     <w:name w:val="Strong"/>
-    <w:basedOn w:val="892"/>
+    <w:basedOn w:val="857"/>
     <w:uiPriority w:val="22"/>
     <w:qFormat/>
     <w:pPr>
@@ -15359,9 +15960,9 @@
       <w:bCs/>
     </w:rPr>
   </w:style>
-  <w:style w:type="character" w:styleId="173">
+  <w:style w:type="character" w:styleId="673">
     <w:name w:val="Subtle Reference"/>
-    <w:basedOn w:val="892"/>
+    <w:basedOn w:val="857"/>
     <w:uiPriority w:val="31"/>
     <w:qFormat/>
     <w:pPr>
@@ -15374,9 +15975,9 @@
       <w:color w:val="5a5a5a" w:themeColor="text1" w:themeTint="A5"/>
     </w:rPr>
   </w:style>
-  <w:style w:type="character" w:styleId="174">
+  <w:style w:type="character" w:styleId="674">
     <w:name w:val="Book Title"/>
-    <w:basedOn w:val="892"/>
+    <w:basedOn w:val="857"/>
     <w:uiPriority w:val="33"/>
     <w:qFormat/>
     <w:pPr>
@@ -15392,9 +15993,9 @@
       <w:spacing w:val="5"/>
     </w:rPr>
   </w:style>
-  <w:style w:type="character" w:styleId="187">
+  <w:style w:type="character" w:styleId="675">
     <w:name w:val="FollowedHyperlink"/>
-    <w:basedOn w:val="892"/>
+    <w:basedOn w:val="857"/>
     <w:uiPriority w:val="99"/>
     <w:semiHidden/>
     <w:unhideWhenUsed/>
@@ -15408,11 +16009,11 @@
       <w:u w:val="single"/>
     </w:rPr>
   </w:style>
-  <w:style w:type="paragraph" w:styleId="711">
+  <w:style w:type="paragraph" w:styleId="676">
     <w:name w:val="Heading 1"/>
-    <w:basedOn w:val="887"/>
-    <w:next w:val="887"/>
-    <w:link w:val="712"/>
+    <w:basedOn w:val="852"/>
+    <w:next w:val="852"/>
+    <w:link w:val="677"/>
     <w:uiPriority w:val="9"/>
     <w:qFormat/>
     <w:pPr>
@@ -15429,9 +16030,9 @@
       <w:szCs w:val="40"/>
     </w:rPr>
   </w:style>
-  <w:style w:type="character" w:styleId="712">
+  <w:style w:type="character" w:styleId="677">
     <w:name w:val="Heading 1 Char"/>
-    <w:link w:val="711"/>
+    <w:link w:val="676"/>
     <w:uiPriority w:val="9"/>
     <w:pPr>
       <w:pBdr/>
@@ -15444,11 +16045,11 @@
       <w:szCs w:val="40"/>
     </w:rPr>
   </w:style>
-  <w:style w:type="paragraph" w:styleId="713">
+  <w:style w:type="paragraph" w:styleId="678">
     <w:name w:val="Heading 2"/>
-    <w:basedOn w:val="887"/>
-    <w:next w:val="887"/>
-    <w:link w:val="714"/>
+    <w:basedOn w:val="852"/>
+    <w:next w:val="852"/>
+    <w:link w:val="679"/>
     <w:uiPriority w:val="9"/>
     <w:unhideWhenUsed/>
     <w:qFormat/>
@@ -15465,9 +16066,9 @@
       <w:sz w:val="34"/>
     </w:rPr>
   </w:style>
-  <w:style w:type="character" w:styleId="714">
+  <w:style w:type="character" w:styleId="679">
     <w:name w:val="Heading 2 Char"/>
-    <w:link w:val="713"/>
+    <w:link w:val="678"/>
     <w:uiPriority w:val="9"/>
     <w:pPr>
       <w:pBdr/>
@@ -15479,11 +16080,11 @@
       <w:sz w:val="34"/>
     </w:rPr>
   </w:style>
-  <w:style w:type="paragraph" w:styleId="715">
+  <w:style w:type="paragraph" w:styleId="680">
     <w:name w:val="Heading 3"/>
-    <w:basedOn w:val="887"/>
-    <w:next w:val="887"/>
-    <w:link w:val="716"/>
+    <w:basedOn w:val="852"/>
+    <w:next w:val="852"/>
+    <w:link w:val="681"/>
     <w:uiPriority w:val="9"/>
     <w:unhideWhenUsed/>
     <w:qFormat/>
@@ -15501,9 +16102,9 @@
       <w:szCs w:val="30"/>
     </w:rPr>
   </w:style>
-  <w:style w:type="character" w:styleId="716">
+  <w:style w:type="character" w:styleId="681">
     <w:name w:val="Heading 3 Char"/>
-    <w:link w:val="715"/>
+    <w:link w:val="680"/>
     <w:uiPriority w:val="9"/>
     <w:pPr>
       <w:pBdr/>
@@ -15516,11 +16117,11 @@
       <w:szCs w:val="30"/>
     </w:rPr>
   </w:style>
-  <w:style w:type="paragraph" w:styleId="717">
+  <w:style w:type="paragraph" w:styleId="682">
     <w:name w:val="Heading 4"/>
-    <w:basedOn w:val="887"/>
-    <w:next w:val="887"/>
-    <w:link w:val="718"/>
+    <w:basedOn w:val="852"/>
+    <w:next w:val="852"/>
+    <w:link w:val="683"/>
     <w:uiPriority w:val="9"/>
     <w:unhideWhenUsed/>
     <w:qFormat/>
@@ -15540,9 +16141,9 @@
       <w:szCs w:val="26"/>
     </w:rPr>
   </w:style>
-  <w:style w:type="character" w:styleId="718">
+  <w:style w:type="character" w:styleId="683">
     <w:name w:val="Heading 4 Char"/>
-    <w:link w:val="717"/>
+    <w:link w:val="682"/>
     <w:uiPriority w:val="9"/>
     <w:pPr>
       <w:pBdr/>
@@ -15557,11 +16158,11 @@
       <w:szCs w:val="26"/>
     </w:rPr>
   </w:style>
-  <w:style w:type="paragraph" w:styleId="719">
+  <w:style w:type="paragraph" w:styleId="684">
     <w:name w:val="Heading 5"/>
-    <w:basedOn w:val="887"/>
-    <w:next w:val="887"/>
-    <w:link w:val="720"/>
+    <w:basedOn w:val="852"/>
+    <w:next w:val="852"/>
+    <w:link w:val="685"/>
     <w:uiPriority w:val="9"/>
     <w:unhideWhenUsed/>
     <w:qFormat/>
@@ -15581,9 +16182,9 @@
       <w:szCs w:val="24"/>
     </w:rPr>
   </w:style>
-  <w:style w:type="character" w:styleId="720">
+  <w:style w:type="character" w:styleId="685">
     <w:name w:val="Heading 5 Char"/>
-    <w:link w:val="719"/>
+    <w:link w:val="684"/>
     <w:uiPriority w:val="9"/>
     <w:pPr>
       <w:pBdr/>
@@ -15598,11 +16199,11 @@
       <w:szCs w:val="24"/>
     </w:rPr>
   </w:style>
-  <w:style w:type="paragraph" w:styleId="721">
+  <w:style w:type="paragraph" w:styleId="686">
     <w:name w:val="Heading 6"/>
-    <w:basedOn w:val="887"/>
-    <w:next w:val="887"/>
-    <w:link w:val="722"/>
+    <w:basedOn w:val="852"/>
+    <w:next w:val="852"/>
+    <w:link w:val="687"/>
     <w:uiPriority w:val="9"/>
     <w:unhideWhenUsed/>
     <w:qFormat/>
@@ -15622,9 +16223,9 @@
       <w:szCs w:val="22"/>
     </w:rPr>
   </w:style>
-  <w:style w:type="character" w:styleId="722">
+  <w:style w:type="character" w:styleId="687">
     <w:name w:val="Heading 6 Char"/>
-    <w:link w:val="721"/>
+    <w:link w:val="686"/>
     <w:uiPriority w:val="9"/>
     <w:pPr>
       <w:pBdr/>
@@ -15639,11 +16240,11 @@
       <w:szCs w:val="22"/>
     </w:rPr>
   </w:style>
-  <w:style w:type="paragraph" w:styleId="723">
+  <w:style w:type="paragraph" w:styleId="688">
     <w:name w:val="Heading 7"/>
-    <w:basedOn w:val="887"/>
-    <w:next w:val="887"/>
-    <w:link w:val="724"/>
+    <w:basedOn w:val="852"/>
+    <w:next w:val="852"/>
+    <w:link w:val="689"/>
     <w:uiPriority w:val="9"/>
     <w:unhideWhenUsed/>
     <w:qFormat/>
@@ -15665,9 +16266,9 @@
       <w:szCs w:val="22"/>
     </w:rPr>
   </w:style>
-  <w:style w:type="character" w:styleId="724">
+  <w:style w:type="character" w:styleId="689">
     <w:name w:val="Heading 7 Char"/>
-    <w:link w:val="723"/>
+    <w:link w:val="688"/>
     <w:uiPriority w:val="9"/>
     <w:pPr>
       <w:pBdr/>
@@ -15684,11 +16285,11 @@
       <w:szCs w:val="22"/>
     </w:rPr>
   </w:style>
-  <w:style w:type="paragraph" w:styleId="725">
+  <w:style w:type="paragraph" w:styleId="690">
     <w:name w:val="Heading 8"/>
-    <w:basedOn w:val="887"/>
-    <w:next w:val="887"/>
-    <w:link w:val="726"/>
+    <w:basedOn w:val="852"/>
+    <w:next w:val="852"/>
+    <w:link w:val="691"/>
     <w:uiPriority w:val="9"/>
     <w:unhideWhenUsed/>
     <w:qFormat/>
@@ -15708,9 +16309,9 @@
       <w:szCs w:val="22"/>
     </w:rPr>
   </w:style>
-  <w:style w:type="character" w:styleId="726">
+  <w:style w:type="character" w:styleId="691">
     <w:name w:val="Heading 8 Char"/>
-    <w:link w:val="725"/>
+    <w:link w:val="690"/>
     <w:uiPriority w:val="9"/>
     <w:pPr>
       <w:pBdr/>
@@ -15725,11 +16326,11 @@
       <w:szCs w:val="22"/>
     </w:rPr>
   </w:style>
-  <w:style w:type="paragraph" w:styleId="727">
+  <w:style w:type="paragraph" w:styleId="692">
     <w:name w:val="Heading 9"/>
-    <w:basedOn w:val="887"/>
-    <w:next w:val="887"/>
-    <w:link w:val="728"/>
+    <w:basedOn w:val="852"/>
+    <w:next w:val="852"/>
+    <w:link w:val="693"/>
     <w:uiPriority w:val="9"/>
     <w:unhideWhenUsed/>
     <w:qFormat/>
@@ -15749,9 +16350,9 @@
       <w:szCs w:val="21"/>
     </w:rPr>
   </w:style>
-  <w:style w:type="character" w:styleId="728">
+  <w:style w:type="character" w:styleId="693">
     <w:name w:val="Heading 9 Char"/>
-    <w:link w:val="727"/>
+    <w:link w:val="692"/>
     <w:uiPriority w:val="9"/>
     <w:pPr>
       <w:pBdr/>
@@ -15766,11 +16367,11 @@
       <w:szCs w:val="21"/>
     </w:rPr>
   </w:style>
-  <w:style w:type="paragraph" w:styleId="729">
+  <w:style w:type="paragraph" w:styleId="694">
     <w:name w:val="Title"/>
-    <w:basedOn w:val="887"/>
-    <w:next w:val="887"/>
-    <w:link w:val="730"/>
+    <w:basedOn w:val="852"/>
+    <w:next w:val="852"/>
+    <w:link w:val="695"/>
     <w:uiPriority w:val="10"/>
     <w:qFormat/>
     <w:pPr>
@@ -15784,9 +16385,9 @@
       <w:szCs w:val="48"/>
     </w:rPr>
   </w:style>
-  <w:style w:type="character" w:styleId="730">
+  <w:style w:type="character" w:styleId="695">
     <w:name w:val="Title Char"/>
-    <w:link w:val="729"/>
+    <w:link w:val="694"/>
     <w:uiPriority w:val="10"/>
     <w:pPr>
       <w:pBdr/>
@@ -15798,11 +16399,11 @@
       <w:szCs w:val="48"/>
     </w:rPr>
   </w:style>
-  <w:style w:type="paragraph" w:styleId="731">
+  <w:style w:type="paragraph" w:styleId="696">
     <w:name w:val="Subtitle"/>
-    <w:basedOn w:val="887"/>
-    <w:next w:val="887"/>
-    <w:link w:val="732"/>
+    <w:basedOn w:val="852"/>
+    <w:next w:val="852"/>
+    <w:link w:val="697"/>
     <w:uiPriority w:val="11"/>
     <w:qFormat/>
     <w:pPr>
@@ -15815,9 +16416,9 @@
       <w:szCs w:val="24"/>
     </w:rPr>
   </w:style>
-  <w:style w:type="character" w:styleId="732">
+  <w:style w:type="character" w:styleId="697">
     <w:name w:val="Subtitle Char"/>
-    <w:link w:val="731"/>
+    <w:link w:val="696"/>
     <w:uiPriority w:val="11"/>
     <w:pPr>
       <w:pBdr/>
@@ -15829,11 +16430,11 @@
       <w:szCs w:val="24"/>
     </w:rPr>
   </w:style>
-  <w:style w:type="paragraph" w:styleId="733">
+  <w:style w:type="paragraph" w:styleId="698">
     <w:name w:val="Quote"/>
-    <w:basedOn w:val="887"/>
-    <w:next w:val="887"/>
-    <w:link w:val="734"/>
+    <w:basedOn w:val="852"/>
+    <w:next w:val="852"/>
+    <w:link w:val="699"/>
     <w:uiPriority w:val="29"/>
     <w:qFormat/>
     <w:pPr>
@@ -15845,9 +16446,9 @@
       <w:i/>
     </w:rPr>
   </w:style>
-  <w:style w:type="character" w:styleId="734">
+  <w:style w:type="character" w:styleId="699">
     <w:name w:val="Quote Char"/>
-    <w:link w:val="733"/>
+    <w:link w:val="698"/>
     <w:uiPriority w:val="29"/>
     <w:pPr>
       <w:pBdr/>
@@ -15858,11 +16459,11 @@
       <w:i/>
     </w:rPr>
   </w:style>
-  <w:style w:type="paragraph" w:styleId="735">
+  <w:style w:type="paragraph" w:styleId="700">
     <w:name w:val="Intense Quote"/>
-    <w:basedOn w:val="887"/>
-    <w:next w:val="887"/>
-    <w:link w:val="736"/>
+    <w:basedOn w:val="852"/>
+    <w:next w:val="852"/>
+    <w:link w:val="701"/>
     <w:uiPriority w:val="30"/>
     <w:qFormat/>
     <w:pPr>
@@ -15881,9 +16482,9 @@
       <w:i/>
     </w:rPr>
   </w:style>
-  <w:style w:type="character" w:styleId="736">
+  <w:style w:type="character" w:styleId="701">
     <w:name w:val="Intense Quote Char"/>
-    <w:link w:val="735"/>
+    <w:link w:val="700"/>
     <w:uiPriority w:val="30"/>
     <w:pPr>
       <w:pBdr/>
@@ -15894,10 +16495,10 @@
       <w:i/>
     </w:rPr>
   </w:style>
-  <w:style w:type="paragraph" w:styleId="737">
+  <w:style w:type="paragraph" w:styleId="702">
     <w:name w:val="Header"/>
-    <w:basedOn w:val="887"/>
-    <w:link w:val="738"/>
+    <w:basedOn w:val="852"/>
+    <w:link w:val="703"/>
     <w:uiPriority w:val="99"/>
     <w:unhideWhenUsed/>
     <w:pPr>
@@ -15910,9 +16511,9 @@
       <w:ind/>
     </w:pPr>
   </w:style>
-  <w:style w:type="character" w:styleId="738">
+  <w:style w:type="character" w:styleId="703">
     <w:name w:val="Header Char"/>
-    <w:link w:val="737"/>
+    <w:link w:val="702"/>
     <w:uiPriority w:val="99"/>
     <w:pPr>
       <w:pBdr/>
@@ -15920,10 +16521,10 @@
       <w:ind/>
     </w:pPr>
   </w:style>
-  <w:style w:type="paragraph" w:styleId="739">
+  <w:style w:type="paragraph" w:styleId="704">
     <w:name w:val="Footer"/>
-    <w:basedOn w:val="887"/>
-    <w:link w:val="742"/>
+    <w:basedOn w:val="852"/>
+    <w:link w:val="707"/>
     <w:uiPriority w:val="99"/>
     <w:unhideWhenUsed/>
     <w:pPr>
@@ -15936,9 +16537,9 @@
       <w:ind/>
     </w:pPr>
   </w:style>
-  <w:style w:type="character" w:styleId="740">
+  <w:style w:type="character" w:styleId="705">
     <w:name w:val="Footer Char"/>
-    <w:link w:val="739"/>
+    <w:link w:val="704"/>
     <w:uiPriority w:val="99"/>
     <w:pPr>
       <w:pBdr/>
@@ -15946,10 +16547,10 @@
       <w:ind/>
     </w:pPr>
   </w:style>
-  <w:style w:type="paragraph" w:styleId="741">
+  <w:style w:type="paragraph" w:styleId="706">
     <w:name w:val="Caption"/>
-    <w:basedOn w:val="887"/>
-    <w:next w:val="887"/>
+    <w:basedOn w:val="852"/>
+    <w:next w:val="852"/>
     <w:uiPriority w:val="35"/>
     <w:semiHidden/>
     <w:unhideWhenUsed/>
@@ -15967,10 +16568,10 @@
       <w:szCs w:val="18"/>
     </w:rPr>
   </w:style>
-  <w:style w:type="character" w:styleId="742">
+  <w:style w:type="character" w:styleId="707">
     <w:name w:val="Caption Char"/>
-    <w:basedOn w:val="741"/>
-    <w:link w:val="739"/>
+    <w:basedOn w:val="706"/>
+    <w:link w:val="704"/>
     <w:uiPriority w:val="99"/>
     <w:pPr>
       <w:pBdr/>
@@ -15978,9 +16579,9 @@
       <w:ind/>
     </w:pPr>
   </w:style>
-  <w:style w:type="table" w:styleId="743">
+  <w:style w:type="table" w:styleId="708">
     <w:name w:val="Table Grid"/>
-    <w:basedOn w:val="888"/>
+    <w:basedOn w:val="853"/>
     <w:uiPriority w:val="59"/>
     <w:pPr>
       <w:pBdr/>
@@ -16177,9 +16778,9 @@
       </w:tcPr>
     </w:tblStylePr>
   </w:style>
-  <w:style w:type="table" w:styleId="744">
+  <w:style w:type="table" w:styleId="709">
     <w:name w:val="Table Grid Light"/>
-    <w:basedOn w:val="888"/>
+    <w:basedOn w:val="853"/>
     <w:uiPriority w:val="59"/>
     <w:pPr>
       <w:pBdr/>
@@ -16376,9 +16977,9 @@
       </w:tcPr>
     </w:tblStylePr>
   </w:style>
-  <w:style w:type="table" w:styleId="745">
+  <w:style w:type="table" w:styleId="710">
     <w:name w:val="Plain Table 1"/>
-    <w:basedOn w:val="888"/>
+    <w:basedOn w:val="853"/>
     <w:uiPriority w:val="59"/>
     <w:pPr>
       <w:pBdr/>
@@ -16601,9 +17202,9 @@
       </w:tcPr>
     </w:tblStylePr>
   </w:style>
-  <w:style w:type="table" w:styleId="746">
+  <w:style w:type="table" w:styleId="711">
     <w:name w:val="Plain Table 2"/>
-    <w:basedOn w:val="888"/>
+    <w:basedOn w:val="853"/>
     <w:uiPriority w:val="59"/>
     <w:pPr>
       <w:pBdr/>
@@ -16834,9 +17435,9 @@
       </w:tcPr>
     </w:tblStylePr>
   </w:style>
-  <w:style w:type="table" w:styleId="747">
+  <w:style w:type="table" w:styleId="712">
     <w:name w:val="Plain Table 3"/>
-    <w:basedOn w:val="888"/>
+    <w:basedOn w:val="853"/>
     <w:uiPriority w:val="99"/>
     <w:pPr>
       <w:pBdr/>
@@ -17064,9 +17665,9 @@
       </w:tcPr>
     </w:tblStylePr>
   </w:style>
-  <w:style w:type="table" w:styleId="748">
+  <w:style w:type="table" w:styleId="713">
     <w:name w:val="Plain Table 4"/>
-    <w:basedOn w:val="888"/>
+    <w:basedOn w:val="853"/>
     <w:uiPriority w:val="99"/>
     <w:pPr>
       <w:pBdr/>
@@ -17280,9 +17881,9 @@
       </w:tcPr>
     </w:tblStylePr>
   </w:style>
-  <w:style w:type="table" w:styleId="749">
+  <w:style w:type="table" w:styleId="714">
     <w:name w:val="Plain Table 5"/>
-    <w:basedOn w:val="888"/>
+    <w:basedOn w:val="853"/>
     <w:uiPriority w:val="99"/>
     <w:pPr>
       <w:pBdr/>
@@ -17513,9 +18114,9 @@
       </w:tcPr>
     </w:tblStylePr>
   </w:style>
-  <w:style w:type="table" w:styleId="750">
+  <w:style w:type="table" w:styleId="715">
     <w:name w:val="Grid Table 1 Light"/>
-    <w:basedOn w:val="888"/>
+    <w:basedOn w:val="853"/>
     <w:uiPriority w:val="99"/>
     <w:pPr>
       <w:pBdr/>
@@ -17736,9 +18337,9 @@
       </w:tcPr>
     </w:tblStylePr>
   </w:style>
-  <w:style w:type="table" w:styleId="751">
+  <w:style w:type="table" w:styleId="716">
     <w:name w:val="Grid Table 1 Light - Accent 1"/>
-    <w:basedOn w:val="888"/>
+    <w:basedOn w:val="853"/>
     <w:uiPriority w:val="99"/>
     <w:pPr>
       <w:pBdr/>
@@ -17959,9 +18560,9 @@
       </w:tcPr>
     </w:tblStylePr>
   </w:style>
-  <w:style w:type="table" w:styleId="752">
+  <w:style w:type="table" w:styleId="717">
     <w:name w:val="Grid Table 1 Light - Accent 2"/>
-    <w:basedOn w:val="888"/>
+    <w:basedOn w:val="853"/>
     <w:uiPriority w:val="99"/>
     <w:pPr>
       <w:pBdr/>
@@ -18182,9 +18783,9 @@
       </w:tcPr>
     </w:tblStylePr>
   </w:style>
-  <w:style w:type="table" w:styleId="753">
+  <w:style w:type="table" w:styleId="718">
     <w:name w:val="Grid Table 1 Light - Accent 3"/>
-    <w:basedOn w:val="888"/>
+    <w:basedOn w:val="853"/>
     <w:uiPriority w:val="99"/>
     <w:pPr>
       <w:pBdr/>
@@ -18405,9 +19006,9 @@
       </w:tcPr>
     </w:tblStylePr>
   </w:style>
-  <w:style w:type="table" w:styleId="754">
+  <w:style w:type="table" w:styleId="719">
     <w:name w:val="Grid Table 1 Light - Accent 4"/>
-    <w:basedOn w:val="888"/>
+    <w:basedOn w:val="853"/>
     <w:uiPriority w:val="99"/>
     <w:pPr>
       <w:pBdr/>
@@ -18628,9 +19229,9 @@
       </w:tcPr>
     </w:tblStylePr>
   </w:style>
-  <w:style w:type="table" w:styleId="755">
+  <w:style w:type="table" w:styleId="720">
     <w:name w:val="Grid Table 1 Light - Accent 5"/>
-    <w:basedOn w:val="888"/>
+    <w:basedOn w:val="853"/>
     <w:uiPriority w:val="99"/>
     <w:pPr>
       <w:pBdr/>
@@ -18851,9 +19452,9 @@
       </w:tcPr>
     </w:tblStylePr>
   </w:style>
-  <w:style w:type="table" w:styleId="756">
+  <w:style w:type="table" w:styleId="721">
     <w:name w:val="Grid Table 1 Light - Accent 6"/>
-    <w:basedOn w:val="888"/>
+    <w:basedOn w:val="853"/>
     <w:uiPriority w:val="99"/>
     <w:pPr>
       <w:pBdr/>
@@ -19074,9 +19675,9 @@
       </w:tcPr>
     </w:tblStylePr>
   </w:style>
-  <w:style w:type="table" w:styleId="757">
+  <w:style w:type="table" w:styleId="722">
     <w:name w:val="Grid Table 2"/>
-    <w:basedOn w:val="888"/>
+    <w:basedOn w:val="853"/>
     <w:uiPriority w:val="99"/>
     <w:pPr>
       <w:pBdr/>
@@ -19306,9 +19907,9 @@
       </w:tcPr>
     </w:tblStylePr>
   </w:style>
-  <w:style w:type="table" w:styleId="758">
+  <w:style w:type="table" w:styleId="723">
     <w:name w:val="Grid Table 2 - Accent 1"/>
-    <w:basedOn w:val="888"/>
+    <w:basedOn w:val="853"/>
     <w:uiPriority w:val="99"/>
     <w:pPr>
       <w:pBdr/>
@@ -19538,9 +20139,9 @@
       </w:tcPr>
     </w:tblStylePr>
   </w:style>
-  <w:style w:type="table" w:styleId="759">
+  <w:style w:type="table" w:styleId="724">
     <w:name w:val="Grid Table 2 - Accent 2"/>
-    <w:basedOn w:val="888"/>
+    <w:basedOn w:val="853"/>
     <w:uiPriority w:val="99"/>
     <w:pPr>
       <w:pBdr/>
@@ -19770,9 +20371,9 @@
       </w:tcPr>
     </w:tblStylePr>
   </w:style>
-  <w:style w:type="table" w:styleId="760">
+  <w:style w:type="table" w:styleId="725">
     <w:name w:val="Grid Table 2 - Accent 3"/>
-    <w:basedOn w:val="888"/>
+    <w:basedOn w:val="853"/>
     <w:uiPriority w:val="99"/>
     <w:pPr>
       <w:pBdr/>
@@ -20002,9 +20603,9 @@
       </w:tcPr>
     </w:tblStylePr>
   </w:style>
-  <w:style w:type="table" w:styleId="761">
+  <w:style w:type="table" w:styleId="726">
     <w:name w:val="Grid Table 2 - Accent 4"/>
-    <w:basedOn w:val="888"/>
+    <w:basedOn w:val="853"/>
     <w:uiPriority w:val="99"/>
     <w:pPr>
       <w:pBdr/>
@@ -20234,9 +20835,9 @@
       </w:tcPr>
     </w:tblStylePr>
   </w:style>
-  <w:style w:type="table" w:styleId="762">
+  <w:style w:type="table" w:styleId="727">
     <w:name w:val="Grid Table 2 - Accent 5"/>
-    <w:basedOn w:val="888"/>
+    <w:basedOn w:val="853"/>
     <w:uiPriority w:val="99"/>
     <w:pPr>
       <w:pBdr/>
@@ -20466,9 +21067,9 @@
       </w:tcPr>
     </w:tblStylePr>
   </w:style>
-  <w:style w:type="table" w:styleId="763">
+  <w:style w:type="table" w:styleId="728">
     <w:name w:val="Grid Table 2 - Accent 6"/>
-    <w:basedOn w:val="888"/>
+    <w:basedOn w:val="853"/>
     <w:uiPriority w:val="99"/>
     <w:pPr>
       <w:pBdr/>
@@ -20698,9 +21299,9 @@
       </w:tcPr>
     </w:tblStylePr>
   </w:style>
-  <w:style w:type="table" w:styleId="764">
+  <w:style w:type="table" w:styleId="729">
     <w:name w:val="Grid Table 3"/>
-    <w:basedOn w:val="888"/>
+    <w:basedOn w:val="853"/>
     <w:uiPriority w:val="99"/>
     <w:pPr>
       <w:pBdr/>
@@ -20943,9 +21544,9 @@
       </w:tcPr>
     </w:tblStylePr>
   </w:style>
-  <w:style w:type="table" w:styleId="765">
+  <w:style w:type="table" w:styleId="730">
     <w:name w:val="Grid Table 3 - Accent 1"/>
-    <w:basedOn w:val="888"/>
+    <w:basedOn w:val="853"/>
     <w:uiPriority w:val="99"/>
     <w:pPr>
       <w:pBdr/>
@@ -21188,9 +21789,9 @@
       </w:tcPr>
     </w:tblStylePr>
   </w:style>
-  <w:style w:type="table" w:styleId="766">
+  <w:style w:type="table" w:styleId="731">
     <w:name w:val="Grid Table 3 - Accent 2"/>
-    <w:basedOn w:val="888"/>
+    <w:basedOn w:val="853"/>
     <w:uiPriority w:val="99"/>
     <w:pPr>
       <w:pBdr/>
@@ -21433,9 +22034,9 @@
       </w:tcPr>
     </w:tblStylePr>
   </w:style>
-  <w:style w:type="table" w:styleId="767">
+  <w:style w:type="table" w:styleId="732">
     <w:name w:val="Grid Table 3 - Accent 3"/>
-    <w:basedOn w:val="888"/>
+    <w:basedOn w:val="853"/>
     <w:uiPriority w:val="99"/>
     <w:pPr>
       <w:pBdr/>
@@ -21678,9 +22279,9 @@
       </w:tcPr>
     </w:tblStylePr>
   </w:style>
-  <w:style w:type="table" w:styleId="768">
+  <w:style w:type="table" w:styleId="733">
     <w:name w:val="Grid Table 3 - Accent 4"/>
-    <w:basedOn w:val="888"/>
+    <w:basedOn w:val="853"/>
     <w:uiPriority w:val="99"/>
     <w:pPr>
       <w:pBdr/>
@@ -21923,9 +22524,9 @@
       </w:tcPr>
     </w:tblStylePr>
   </w:style>
-  <w:style w:type="table" w:styleId="769">
+  <w:style w:type="table" w:styleId="734">
     <w:name w:val="Grid Table 3 - Accent 5"/>
-    <w:basedOn w:val="888"/>
+    <w:basedOn w:val="853"/>
     <w:uiPriority w:val="99"/>
     <w:pPr>
       <w:pBdr/>
@@ -22168,9 +22769,9 @@
       </w:tcPr>
     </w:tblStylePr>
   </w:style>
-  <w:style w:type="table" w:styleId="770">
+  <w:style w:type="table" w:styleId="735">
     <w:name w:val="Grid Table 3 - Accent 6"/>
-    <w:basedOn w:val="888"/>
+    <w:basedOn w:val="853"/>
     <w:uiPriority w:val="99"/>
     <w:pPr>
       <w:pBdr/>
@@ -22413,9 +23014,9 @@
       </w:tcPr>
     </w:tblStylePr>
   </w:style>
-  <w:style w:type="table" w:styleId="771">
+  <w:style w:type="table" w:styleId="736">
     <w:name w:val="Grid Table 4"/>
-    <w:basedOn w:val="888"/>
+    <w:basedOn w:val="853"/>
     <w:uiPriority w:val="59"/>
     <w:pPr>
       <w:pBdr/>
@@ -22646,9 +23247,9 @@
       </w:tcPr>
     </w:tblStylePr>
   </w:style>
-  <w:style w:type="table" w:styleId="772">
+  <w:style w:type="table" w:styleId="737">
     <w:name w:val="Grid Table 4 - Accent 1"/>
-    <w:basedOn w:val="888"/>
+    <w:basedOn w:val="853"/>
     <w:uiPriority w:val="59"/>
     <w:pPr>
       <w:pBdr/>
@@ -22879,9 +23480,9 @@
       </w:tcPr>
     </w:tblStylePr>
   </w:style>
-  <w:style w:type="table" w:styleId="773">
+  <w:style w:type="table" w:styleId="738">
     <w:name w:val="Grid Table 4 - Accent 2"/>
-    <w:basedOn w:val="888"/>
+    <w:basedOn w:val="853"/>
     <w:uiPriority w:val="59"/>
     <w:pPr>
       <w:pBdr/>
@@ -23112,9 +23713,9 @@
       </w:tcPr>
     </w:tblStylePr>
   </w:style>
-  <w:style w:type="table" w:styleId="774">
+  <w:style w:type="table" w:styleId="739">
     <w:name w:val="Grid Table 4 - Accent 3"/>
-    <w:basedOn w:val="888"/>
+    <w:basedOn w:val="853"/>
     <w:uiPriority w:val="59"/>
     <w:pPr>
       <w:pBdr/>
@@ -23345,9 +23946,9 @@
       </w:tcPr>
     </w:tblStylePr>
   </w:style>
-  <w:style w:type="table" w:styleId="775">
+  <w:style w:type="table" w:styleId="740">
     <w:name w:val="Grid Table 4 - Accent 4"/>
-    <w:basedOn w:val="888"/>
+    <w:basedOn w:val="853"/>
     <w:uiPriority w:val="59"/>
     <w:pPr>
       <w:pBdr/>
@@ -23578,9 +24179,9 @@
       </w:tcPr>
     </w:tblStylePr>
   </w:style>
-  <w:style w:type="table" w:styleId="776">
+  <w:style w:type="table" w:styleId="741">
     <w:name w:val="Grid Table 4 - Accent 5"/>
-    <w:basedOn w:val="888"/>
+    <w:basedOn w:val="853"/>
     <w:uiPriority w:val="59"/>
     <w:pPr>
       <w:pBdr/>
@@ -23811,9 +24412,9 @@
       </w:tcPr>
     </w:tblStylePr>
   </w:style>
-  <w:style w:type="table" w:styleId="777">
+  <w:style w:type="table" w:styleId="742">
     <w:name w:val="Grid Table 4 - Accent 6"/>
-    <w:basedOn w:val="888"/>
+    <w:basedOn w:val="853"/>
     <w:uiPriority w:val="59"/>
     <w:pPr>
       <w:pBdr/>
@@ -24044,9 +24645,9 @@
       </w:tcPr>
     </w:tblStylePr>
   </w:style>
-  <w:style w:type="table" w:styleId="778">
+  <w:style w:type="table" w:styleId="743">
     <w:name w:val="Grid Table 5 Dark"/>
-    <w:basedOn w:val="888"/>
+    <w:basedOn w:val="853"/>
     <w:uiPriority w:val="99"/>
     <w:pPr>
       <w:pBdr/>
@@ -24272,9 +24873,9 @@
       </w:tcPr>
     </w:tblStylePr>
   </w:style>
-  <w:style w:type="table" w:styleId="779">
+  <w:style w:type="table" w:styleId="744">
     <w:name w:val="Grid Table 5 Dark- Accent 1"/>
-    <w:basedOn w:val="888"/>
+    <w:basedOn w:val="853"/>
     <w:uiPriority w:val="99"/>
     <w:pPr>
       <w:pBdr/>
@@ -24500,9 +25101,9 @@
       </w:tcPr>
     </w:tblStylePr>
   </w:style>
-  <w:style w:type="table" w:styleId="780">
+  <w:style w:type="table" w:styleId="745">
     <w:name w:val="Grid Table 5 Dark - Accent 2"/>
-    <w:basedOn w:val="888"/>
+    <w:basedOn w:val="853"/>
     <w:uiPriority w:val="99"/>
     <w:pPr>
       <w:pBdr/>
@@ -24728,9 +25329,9 @@
       </w:tcPr>
     </w:tblStylePr>
   </w:style>
-  <w:style w:type="table" w:styleId="781">
+  <w:style w:type="table" w:styleId="746">
     <w:name w:val="Grid Table 5 Dark - Accent 3"/>
-    <w:basedOn w:val="888"/>
+    <w:basedOn w:val="853"/>
     <w:uiPriority w:val="99"/>
     <w:pPr>
       <w:pBdr/>
@@ -24956,9 +25557,9 @@
       </w:tcPr>
     </w:tblStylePr>
   </w:style>
-  <w:style w:type="table" w:styleId="782">
+  <w:style w:type="table" w:styleId="747">
     <w:name w:val="Grid Table 5 Dark- Accent 4"/>
-    <w:basedOn w:val="888"/>
+    <w:basedOn w:val="853"/>
     <w:uiPriority w:val="99"/>
     <w:pPr>
       <w:pBdr/>
@@ -25184,9 +25785,9 @@
       </w:tcPr>
     </w:tblStylePr>
   </w:style>
-  <w:style w:type="table" w:styleId="783">
+  <w:style w:type="table" w:styleId="748">
     <w:name w:val="Grid Table 5 Dark - Accent 5"/>
-    <w:basedOn w:val="888"/>
+    <w:basedOn w:val="853"/>
     <w:uiPriority w:val="99"/>
     <w:pPr>
       <w:pBdr/>
@@ -25412,9 +26013,9 @@
       </w:tcPr>
     </w:tblStylePr>
   </w:style>
-  <w:style w:type="table" w:styleId="784">
+  <w:style w:type="table" w:styleId="749">
     <w:name w:val="Grid Table 5 Dark - Accent 6"/>
-    <w:basedOn w:val="888"/>
+    <w:basedOn w:val="853"/>
     <w:uiPriority w:val="99"/>
     <w:pPr>
       <w:pBdr/>
@@ -25640,9 +26241,9 @@
       </w:tcPr>
     </w:tblStylePr>
   </w:style>
-  <w:style w:type="table" w:styleId="785">
+  <w:style w:type="table" w:styleId="750">
     <w:name w:val="Grid Table 6 Colorful"/>
-    <w:basedOn w:val="888"/>
+    <w:basedOn w:val="853"/>
     <w:uiPriority w:val="99"/>
     <w:pPr>
       <w:pBdr/>
@@ -25870,9 +26471,9 @@
       </w:tcPr>
     </w:tblStylePr>
   </w:style>
-  <w:style w:type="table" w:styleId="786">
+  <w:style w:type="table" w:styleId="751">
     <w:name w:val="Grid Table 6 Colorful - Accent 1"/>
-    <w:basedOn w:val="888"/>
+    <w:basedOn w:val="853"/>
     <w:uiPriority w:val="99"/>
     <w:pPr>
       <w:pBdr/>
@@ -26100,9 +26701,9 @@
       </w:tcPr>
     </w:tblStylePr>
   </w:style>
-  <w:style w:type="table" w:styleId="787">
+  <w:style w:type="table" w:styleId="752">
     <w:name w:val="Grid Table 6 Colorful - Accent 2"/>
-    <w:basedOn w:val="888"/>
+    <w:basedOn w:val="853"/>
     <w:uiPriority w:val="99"/>
     <w:pPr>
       <w:pBdr/>
@@ -26330,9 +26931,9 @@
       </w:tcPr>
     </w:tblStylePr>
   </w:style>
-  <w:style w:type="table" w:styleId="788">
+  <w:style w:type="table" w:styleId="753">
     <w:name w:val="Grid Table 6 Colorful - Accent 3"/>
-    <w:basedOn w:val="888"/>
+    <w:basedOn w:val="853"/>
     <w:uiPriority w:val="99"/>
     <w:pPr>
       <w:pBdr/>
@@ -26560,9 +27161,9 @@
       </w:tcPr>
     </w:tblStylePr>
   </w:style>
-  <w:style w:type="table" w:styleId="789">
+  <w:style w:type="table" w:styleId="754">
     <w:name w:val="Grid Table 6 Colorful - Accent 4"/>
-    <w:basedOn w:val="888"/>
+    <w:basedOn w:val="853"/>
     <w:uiPriority w:val="99"/>
     <w:pPr>
       <w:pBdr/>
@@ -26790,9 +27391,9 @@
       </w:tcPr>
     </w:tblStylePr>
   </w:style>
-  <w:style w:type="table" w:styleId="790">
+  <w:style w:type="table" w:styleId="755">
     <w:name w:val="Grid Table 6 Colorful - Accent 5"/>
-    <w:basedOn w:val="888"/>
+    <w:basedOn w:val="853"/>
     <w:uiPriority w:val="99"/>
     <w:pPr>
       <w:pBdr/>
@@ -27020,9 +27621,9 @@
       </w:tcPr>
     </w:tblStylePr>
   </w:style>
-  <w:style w:type="table" w:styleId="791">
+  <w:style w:type="table" w:styleId="756">
     <w:name w:val="Grid Table 6 Colorful - Accent 6"/>
-    <w:basedOn w:val="888"/>
+    <w:basedOn w:val="853"/>
     <w:uiPriority w:val="99"/>
     <w:pPr>
       <w:pBdr/>
@@ -27250,9 +27851,9 @@
       </w:tcPr>
     </w:tblStylePr>
   </w:style>
-  <w:style w:type="table" w:styleId="792">
+  <w:style w:type="table" w:styleId="757">
     <w:name w:val="Grid Table 7 Colorful"/>
-    <w:basedOn w:val="888"/>
+    <w:basedOn w:val="853"/>
     <w:uiPriority w:val="99"/>
     <w:pPr>
       <w:pBdr/>
@@ -27504,9 +28105,9 @@
       </w:tcPr>
     </w:tblStylePr>
   </w:style>
-  <w:style w:type="table" w:styleId="793">
+  <w:style w:type="table" w:styleId="758">
     <w:name w:val="Grid Table 7 Colorful - Accent 1"/>
-    <w:basedOn w:val="888"/>
+    <w:basedOn w:val="853"/>
     <w:uiPriority w:val="99"/>
     <w:pPr>
       <w:pBdr/>
@@ -27758,9 +28359,9 @@
       </w:tcPr>
     </w:tblStylePr>
   </w:style>
-  <w:style w:type="table" w:styleId="794">
+  <w:style w:type="table" w:styleId="759">
     <w:name w:val="Grid Table 7 Colorful - Accent 2"/>
-    <w:basedOn w:val="888"/>
+    <w:basedOn w:val="853"/>
     <w:uiPriority w:val="99"/>
     <w:pPr>
       <w:pBdr/>
@@ -28012,9 +28613,9 @@
       </w:tcPr>
     </w:tblStylePr>
   </w:style>
-  <w:style w:type="table" w:styleId="795">
+  <w:style w:type="table" w:styleId="760">
     <w:name w:val="Grid Table 7 Colorful - Accent 3"/>
-    <w:basedOn w:val="888"/>
+    <w:basedOn w:val="853"/>
     <w:uiPriority w:val="99"/>
     <w:pPr>
       <w:pBdr/>
@@ -28266,9 +28867,9 @@
       </w:tcPr>
     </w:tblStylePr>
   </w:style>
-  <w:style w:type="table" w:styleId="796">
+  <w:style w:type="table" w:styleId="761">
     <w:name w:val="Grid Table 7 Colorful - Accent 4"/>
-    <w:basedOn w:val="888"/>
+    <w:basedOn w:val="853"/>
     <w:uiPriority w:val="99"/>
     <w:pPr>
       <w:pBdr/>
@@ -28520,9 +29121,9 @@
       </w:tcPr>
     </w:tblStylePr>
   </w:style>
-  <w:style w:type="table" w:styleId="797">
+  <w:style w:type="table" w:styleId="762">
     <w:name w:val="Grid Table 7 Colorful - Accent 5"/>
-    <w:basedOn w:val="888"/>
+    <w:basedOn w:val="853"/>
     <w:uiPriority w:val="99"/>
     <w:pPr>
       <w:pBdr/>
@@ -28774,9 +29375,9 @@
       </w:tcPr>
     </w:tblStylePr>
   </w:style>
-  <w:style w:type="table" w:styleId="798">
+  <w:style w:type="table" w:styleId="763">
     <w:name w:val="Grid Table 7 Colorful - Accent 6"/>
-    <w:basedOn w:val="888"/>
+    <w:basedOn w:val="853"/>
     <w:uiPriority w:val="99"/>
     <w:pPr>
       <w:pBdr/>
@@ -29028,9 +29629,9 @@
       </w:tcPr>
     </w:tblStylePr>
   </w:style>
-  <w:style w:type="table" w:styleId="799">
+  <w:style w:type="table" w:styleId="764">
     <w:name w:val="List Table 1 Light"/>
-    <w:basedOn w:val="888"/>
+    <w:basedOn w:val="853"/>
     <w:uiPriority w:val="99"/>
     <w:pPr>
       <w:pBdr/>
@@ -29244,9 +29845,9 @@
       </w:tcPr>
     </w:tblStylePr>
   </w:style>
-  <w:style w:type="table" w:styleId="800">
+  <w:style w:type="table" w:styleId="765">
     <w:name w:val="List Table 1 Light - Accent 1"/>
-    <w:basedOn w:val="888"/>
+    <w:basedOn w:val="853"/>
     <w:uiPriority w:val="99"/>
     <w:pPr>
       <w:pBdr/>
@@ -29460,9 +30061,9 @@
       </w:tcPr>
     </w:tblStylePr>
   </w:style>
-  <w:style w:type="table" w:styleId="801">
+  <w:style w:type="table" w:styleId="766">
     <w:name w:val="List Table 1 Light - Accent 2"/>
-    <w:basedOn w:val="888"/>
+    <w:basedOn w:val="853"/>
     <w:uiPriority w:val="99"/>
     <w:pPr>
       <w:pBdr/>
@@ -29676,9 +30277,9 @@
       </w:tcPr>
     </w:tblStylePr>
   </w:style>
-  <w:style w:type="table" w:styleId="802">
+  <w:style w:type="table" w:styleId="767">
     <w:name w:val="List Table 1 Light - Accent 3"/>
-    <w:basedOn w:val="888"/>
+    <w:basedOn w:val="853"/>
     <w:uiPriority w:val="99"/>
     <w:pPr>
       <w:pBdr/>
@@ -29892,9 +30493,9 @@
       </w:tcPr>
     </w:tblStylePr>
   </w:style>
-  <w:style w:type="table" w:styleId="803">
+  <w:style w:type="table" w:styleId="768">
     <w:name w:val="List Table 1 Light - Accent 4"/>
-    <w:basedOn w:val="888"/>
+    <w:basedOn w:val="853"/>
     <w:uiPriority w:val="99"/>
     <w:pPr>
       <w:pBdr/>
@@ -30108,9 +30709,9 @@
       </w:tcPr>
     </w:tblStylePr>
   </w:style>
-  <w:style w:type="table" w:styleId="804">
+  <w:style w:type="table" w:styleId="769">
     <w:name w:val="List Table 1 Light - Accent 5"/>
-    <w:basedOn w:val="888"/>
+    <w:basedOn w:val="853"/>
     <w:uiPriority w:val="99"/>
     <w:pPr>
       <w:pBdr/>
@@ -30324,9 +30925,9 @@
       </w:tcPr>
     </w:tblStylePr>
   </w:style>
-  <w:style w:type="table" w:styleId="805">
+  <w:style w:type="table" w:styleId="770">
     <w:name w:val="List Table 1 Light - Accent 6"/>
-    <w:basedOn w:val="888"/>
+    <w:basedOn w:val="853"/>
     <w:uiPriority w:val="99"/>
     <w:pPr>
       <w:pBdr/>
@@ -30540,9 +31141,9 @@
       </w:tcPr>
     </w:tblStylePr>
   </w:style>
-  <w:style w:type="table" w:styleId="806">
+  <w:style w:type="table" w:styleId="771">
     <w:name w:val="List Table 2"/>
-    <w:basedOn w:val="888"/>
+    <w:basedOn w:val="853"/>
     <w:uiPriority w:val="99"/>
     <w:pPr>
       <w:pBdr/>
@@ -30778,9 +31379,9 @@
       </w:tcPr>
     </w:tblStylePr>
   </w:style>
-  <w:style w:type="table" w:styleId="807">
+  <w:style w:type="table" w:styleId="772">
     <w:name w:val="List Table 2 - Accent 1"/>
-    <w:basedOn w:val="888"/>
+    <w:basedOn w:val="853"/>
     <w:uiPriority w:val="99"/>
     <w:pPr>
       <w:pBdr/>
@@ -31016,9 +31617,9 @@
       </w:tcPr>
     </w:tblStylePr>
   </w:style>
-  <w:style w:type="table" w:styleId="808">
+  <w:style w:type="table" w:styleId="773">
     <w:name w:val="List Table 2 - Accent 2"/>
-    <w:basedOn w:val="888"/>
+    <w:basedOn w:val="853"/>
     <w:uiPriority w:val="99"/>
     <w:pPr>
       <w:pBdr/>
@@ -31254,9 +31855,9 @@
       </w:tcPr>
     </w:tblStylePr>
   </w:style>
-  <w:style w:type="table" w:styleId="809">
+  <w:style w:type="table" w:styleId="774">
     <w:name w:val="List Table 2 - Accent 3"/>
-    <w:basedOn w:val="888"/>
+    <w:basedOn w:val="853"/>
     <w:uiPriority w:val="99"/>
     <w:pPr>
       <w:pBdr/>
@@ -31492,9 +32093,9 @@
       </w:tcPr>
     </w:tblStylePr>
   </w:style>
-  <w:style w:type="table" w:styleId="810">
+  <w:style w:type="table" w:styleId="775">
     <w:name w:val="List Table 2 - Accent 4"/>
-    <w:basedOn w:val="888"/>
+    <w:basedOn w:val="853"/>
     <w:uiPriority w:val="99"/>
     <w:pPr>
       <w:pBdr/>
@@ -31730,9 +32331,9 @@
       </w:tcPr>
     </w:tblStylePr>
   </w:style>
-  <w:style w:type="table" w:styleId="811">
+  <w:style w:type="table" w:styleId="776">
     <w:name w:val="List Table 2 - Accent 5"/>
-    <w:basedOn w:val="888"/>
+    <w:basedOn w:val="853"/>
     <w:uiPriority w:val="99"/>
     <w:pPr>
       <w:pBdr/>
@@ -31968,9 +32569,9 @@
       </w:tcPr>
     </w:tblStylePr>
   </w:style>
-  <w:style w:type="table" w:styleId="812">
+  <w:style w:type="table" w:styleId="777">
     <w:name w:val="List Table 2 - Accent 6"/>
-    <w:basedOn w:val="888"/>
+    <w:basedOn w:val="853"/>
     <w:uiPriority w:val="99"/>
     <w:pPr>
       <w:pBdr/>
@@ -32206,9 +32807,9 @@
       </w:tcPr>
     </w:tblStylePr>
   </w:style>
-  <w:style w:type="table" w:styleId="813">
+  <w:style w:type="table" w:styleId="778">
     <w:name w:val="List Table 3"/>
-    <w:basedOn w:val="888"/>
+    <w:basedOn w:val="853"/>
     <w:uiPriority w:val="99"/>
     <w:pPr>
       <w:pBdr/>
@@ -32434,9 +33035,9 @@
       </w:tcPr>
     </w:tblStylePr>
   </w:style>
-  <w:style w:type="table" w:styleId="814">
+  <w:style w:type="table" w:styleId="779">
     <w:name w:val="List Table 3 - Accent 1"/>
-    <w:basedOn w:val="888"/>
+    <w:basedOn w:val="853"/>
     <w:uiPriority w:val="99"/>
     <w:pPr>
       <w:pBdr/>
@@ -32662,9 +33263,9 @@
       </w:tcPr>
     </w:tblStylePr>
   </w:style>
-  <w:style w:type="table" w:styleId="815">
+  <w:style w:type="table" w:styleId="780">
     <w:name w:val="List Table 3 - Accent 2"/>
-    <w:basedOn w:val="888"/>
+    <w:basedOn w:val="853"/>
     <w:uiPriority w:val="99"/>
     <w:pPr>
       <w:pBdr/>
@@ -32890,9 +33491,9 @@
       </w:tcPr>
     </w:tblStylePr>
   </w:style>
-  <w:style w:type="table" w:styleId="816">
+  <w:style w:type="table" w:styleId="781">
     <w:name w:val="List Table 3 - Accent 3"/>
-    <w:basedOn w:val="888"/>
+    <w:basedOn w:val="853"/>
     <w:uiPriority w:val="99"/>
     <w:pPr>
       <w:pBdr/>
@@ -33118,9 +33719,9 @@
       </w:tcPr>
     </w:tblStylePr>
   </w:style>
-  <w:style w:type="table" w:styleId="817">
+  <w:style w:type="table" w:styleId="782">
     <w:name w:val="List Table 3 - Accent 4"/>
-    <w:basedOn w:val="888"/>
+    <w:basedOn w:val="853"/>
     <w:uiPriority w:val="99"/>
     <w:pPr>
       <w:pBdr/>
@@ -33346,9 +33947,9 @@
       </w:tcPr>
     </w:tblStylePr>
   </w:style>
-  <w:style w:type="table" w:styleId="818">
+  <w:style w:type="table" w:styleId="783">
     <w:name w:val="List Table 3 - Accent 5"/>
-    <w:basedOn w:val="888"/>
+    <w:basedOn w:val="853"/>
     <w:uiPriority w:val="99"/>
     <w:pPr>
       <w:pBdr/>
@@ -33574,9 +34175,9 @@
       </w:tcPr>
     </w:tblStylePr>
   </w:style>
-  <w:style w:type="table" w:styleId="819">
+  <w:style w:type="table" w:styleId="784">
     <w:name w:val="List Table 3 - Accent 6"/>
-    <w:basedOn w:val="888"/>
+    <w:basedOn w:val="853"/>
     <w:uiPriority w:val="99"/>
     <w:pPr>
       <w:pBdr/>
@@ -33802,9 +34403,9 @@
       </w:tcPr>
     </w:tblStylePr>
   </w:style>
-  <w:style w:type="table" w:styleId="820">
+  <w:style w:type="table" w:styleId="785">
     <w:name w:val="List Table 4"/>
-    <w:basedOn w:val="888"/>
+    <w:basedOn w:val="853"/>
     <w:uiPriority w:val="99"/>
     <w:pPr>
       <w:pBdr/>
@@ -34027,9 +34628,9 @@
       </w:tcPr>
     </w:tblStylePr>
   </w:style>
-  <w:style w:type="table" w:styleId="821">
+  <w:style w:type="table" w:styleId="786">
     <w:name w:val="List Table 4 - Accent 1"/>
-    <w:basedOn w:val="888"/>
+    <w:basedOn w:val="853"/>
     <w:uiPriority w:val="99"/>
     <w:pPr>
       <w:pBdr/>
@@ -34252,9 +34853,9 @@
       </w:tcPr>
     </w:tblStylePr>
   </w:style>
-  <w:style w:type="table" w:styleId="822">
+  <w:style w:type="table" w:styleId="787">
     <w:name w:val="List Table 4 - Accent 2"/>
-    <w:basedOn w:val="888"/>
+    <w:basedOn w:val="853"/>
     <w:uiPriority w:val="99"/>
     <w:pPr>
       <w:pBdr/>
@@ -34477,9 +35078,9 @@
       </w:tcPr>
     </w:tblStylePr>
   </w:style>
-  <w:style w:type="table" w:styleId="823">
+  <w:style w:type="table" w:styleId="788">
     <w:name w:val="List Table 4 - Accent 3"/>
-    <w:basedOn w:val="888"/>
+    <w:basedOn w:val="853"/>
     <w:uiPriority w:val="99"/>
     <w:pPr>
       <w:pBdr/>
@@ -34702,9 +35303,9 @@
       </w:tcPr>
     </w:tblStylePr>
   </w:style>
-  <w:style w:type="table" w:styleId="824">
+  <w:style w:type="table" w:styleId="789">
     <w:name w:val="List Table 4 - Accent 4"/>
-    <w:basedOn w:val="888"/>
+    <w:basedOn w:val="853"/>
     <w:uiPriority w:val="99"/>
     <w:pPr>
       <w:pBdr/>
@@ -34927,9 +35528,9 @@
       </w:tcPr>
     </w:tblStylePr>
   </w:style>
-  <w:style w:type="table" w:styleId="825">
+  <w:style w:type="table" w:styleId="790">
     <w:name w:val="List Table 4 - Accent 5"/>
-    <w:basedOn w:val="888"/>
+    <w:basedOn w:val="853"/>
     <w:uiPriority w:val="99"/>
     <w:pPr>
       <w:pBdr/>
@@ -35152,9 +35753,9 @@
       </w:tcPr>
     </w:tblStylePr>
   </w:style>
-  <w:style w:type="table" w:styleId="826">
+  <w:style w:type="table" w:styleId="791">
     <w:name w:val="List Table 4 - Accent 6"/>
-    <w:basedOn w:val="888"/>
+    <w:basedOn w:val="853"/>
     <w:uiPriority w:val="99"/>
     <w:pPr>
       <w:pBdr/>
@@ -35377,9 +35978,9 @@
       </w:tcPr>
     </w:tblStylePr>
   </w:style>
-  <w:style w:type="table" w:styleId="827">
+  <w:style w:type="table" w:styleId="792">
     <w:name w:val="List Table 5 Dark"/>
-    <w:basedOn w:val="888"/>
+    <w:basedOn w:val="853"/>
     <w:uiPriority w:val="99"/>
     <w:pPr>
       <w:pBdr/>
@@ -35619,9 +36220,9 @@
       </w:tcPr>
     </w:tblStylePr>
   </w:style>
-  <w:style w:type="table" w:styleId="828">
+  <w:style w:type="table" w:styleId="793">
     <w:name w:val="List Table 5 Dark - Accent 1"/>
-    <w:basedOn w:val="888"/>
+    <w:basedOn w:val="853"/>
     <w:uiPriority w:val="99"/>
     <w:pPr>
       <w:pBdr/>
@@ -35861,9 +36462,9 @@
       </w:tcPr>
     </w:tblStylePr>
   </w:style>
-  <w:style w:type="table" w:styleId="829">
+  <w:style w:type="table" w:styleId="794">
     <w:name w:val="List Table 5 Dark - Accent 2"/>
-    <w:basedOn w:val="888"/>
+    <w:basedOn w:val="853"/>
     <w:uiPriority w:val="99"/>
     <w:pPr>
       <w:pBdr/>
@@ -36103,9 +36704,9 @@
       </w:tcPr>
     </w:tblStylePr>
   </w:style>
-  <w:style w:type="table" w:styleId="830">
+  <w:style w:type="table" w:styleId="795">
     <w:name w:val="List Table 5 Dark - Accent 3"/>
-    <w:basedOn w:val="888"/>
+    <w:basedOn w:val="853"/>
     <w:uiPriority w:val="99"/>
     <w:pPr>
       <w:pBdr/>
@@ -36345,9 +36946,9 @@
       </w:tcPr>
     </w:tblStylePr>
   </w:style>
-  <w:style w:type="table" w:styleId="831">
+  <w:style w:type="table" w:styleId="796">
     <w:name w:val="List Table 5 Dark - Accent 4"/>
-    <w:basedOn w:val="888"/>
+    <w:basedOn w:val="853"/>
     <w:uiPriority w:val="99"/>
     <w:pPr>
       <w:pBdr/>
@@ -36587,9 +37188,9 @@
       </w:tcPr>
     </w:tblStylePr>
   </w:style>
-  <w:style w:type="table" w:styleId="832">
+  <w:style w:type="table" w:styleId="797">
     <w:name w:val="List Table 5 Dark - Accent 5"/>
-    <w:basedOn w:val="888"/>
+    <w:basedOn w:val="853"/>
     <w:uiPriority w:val="99"/>
     <w:pPr>
       <w:pBdr/>
@@ -36829,9 +37430,9 @@
       </w:tcPr>
     </w:tblStylePr>
   </w:style>
-  <w:style w:type="table" w:styleId="833">
+  <w:style w:type="table" w:styleId="798">
     <w:name w:val="List Table 5 Dark - Accent 6"/>
-    <w:basedOn w:val="888"/>
+    <w:basedOn w:val="853"/>
     <w:uiPriority w:val="99"/>
     <w:pPr>
       <w:pBdr/>
@@ -37071,9 +37672,9 @@
       </w:tcPr>
     </w:tblStylePr>
   </w:style>
-  <w:style w:type="table" w:styleId="834">
+  <w:style w:type="table" w:styleId="799">
     <w:name w:val="List Table 6 Colorful"/>
-    <w:basedOn w:val="888"/>
+    <w:basedOn w:val="853"/>
     <w:uiPriority w:val="99"/>
     <w:pPr>
       <w:pBdr/>
@@ -37294,9 +37895,9 @@
       </w:tcPr>
     </w:tblStylePr>
   </w:style>
-  <w:style w:type="table" w:styleId="835">
+  <w:style w:type="table" w:styleId="800">
     <w:name w:val="List Table 6 Colorful - Accent 1"/>
-    <w:basedOn w:val="888"/>
+    <w:basedOn w:val="853"/>
     <w:uiPriority w:val="99"/>
     <w:pPr>
       <w:pBdr/>
@@ -37517,9 +38118,9 @@
       </w:tcPr>
     </w:tblStylePr>
   </w:style>
-  <w:style w:type="table" w:styleId="836">
+  <w:style w:type="table" w:styleId="801">
     <w:name w:val="List Table 6 Colorful - Accent 2"/>
-    <w:basedOn w:val="888"/>
+    <w:basedOn w:val="853"/>
     <w:uiPriority w:val="99"/>
     <w:pPr>
       <w:pBdr/>
@@ -37740,9 +38341,9 @@
       </w:tcPr>
     </w:tblStylePr>
   </w:style>
-  <w:style w:type="table" w:styleId="837">
+  <w:style w:type="table" w:styleId="802">
     <w:name w:val="List Table 6 Colorful - Accent 3"/>
-    <w:basedOn w:val="888"/>
+    <w:basedOn w:val="853"/>
     <w:uiPriority w:val="99"/>
     <w:pPr>
       <w:pBdr/>
@@ -37963,9 +38564,9 @@
       </w:tcPr>
     </w:tblStylePr>
   </w:style>
-  <w:style w:type="table" w:styleId="838">
+  <w:style w:type="table" w:styleId="803">
     <w:name w:val="List Table 6 Colorful - Accent 4"/>
-    <w:basedOn w:val="888"/>
+    <w:basedOn w:val="853"/>
     <w:uiPriority w:val="99"/>
     <w:pPr>
       <w:pBdr/>
@@ -38186,9 +38787,9 @@
       </w:tcPr>
     </w:tblStylePr>
   </w:style>
-  <w:style w:type="table" w:styleId="839">
+  <w:style w:type="table" w:styleId="804">
     <w:name w:val="List Table 6 Colorful - Accent 5"/>
-    <w:basedOn w:val="888"/>
+    <w:basedOn w:val="853"/>
     <w:uiPriority w:val="99"/>
     <w:pPr>
       <w:pBdr/>
@@ -38409,9 +39010,9 @@
       </w:tcPr>
     </w:tblStylePr>
   </w:style>
-  <w:style w:type="table" w:styleId="840">
+  <w:style w:type="table" w:styleId="805">
     <w:name w:val="List Table 6 Colorful - Accent 6"/>
-    <w:basedOn w:val="888"/>
+    <w:basedOn w:val="853"/>
     <w:uiPriority w:val="99"/>
     <w:pPr>
       <w:pBdr/>
@@ -38632,9 +39233,9 @@
       </w:tcPr>
     </w:tblStylePr>
   </w:style>
-  <w:style w:type="table" w:styleId="841">
+  <w:style w:type="table" w:styleId="806">
     <w:name w:val="List Table 7 Colorful"/>
-    <w:basedOn w:val="888"/>
+    <w:basedOn w:val="853"/>
     <w:uiPriority w:val="99"/>
     <w:pPr>
       <w:pBdr/>
@@ -38888,9 +39489,9 @@
       </w:tcPr>
     </w:tblStylePr>
   </w:style>
-  <w:style w:type="table" w:styleId="842">
+  <w:style w:type="table" w:styleId="807">
     <w:name w:val="List Table 7 Colorful - Accent 1"/>
-    <w:basedOn w:val="888"/>
+    <w:basedOn w:val="853"/>
     <w:uiPriority w:val="99"/>
     <w:pPr>
       <w:pBdr/>
@@ -39144,9 +39745,9 @@
       </w:tcPr>
     </w:tblStylePr>
   </w:style>
-  <w:style w:type="table" w:styleId="843">
+  <w:style w:type="table" w:styleId="808">
     <w:name w:val="List Table 7 Colorful - Accent 2"/>
-    <w:basedOn w:val="888"/>
+    <w:basedOn w:val="853"/>
     <w:uiPriority w:val="99"/>
     <w:pPr>
       <w:pBdr/>
@@ -39400,9 +40001,9 @@
       </w:tcPr>
     </w:tblStylePr>
   </w:style>
-  <w:style w:type="table" w:styleId="844">
+  <w:style w:type="table" w:styleId="809">
     <w:name w:val="List Table 7 Colorful - Accent 3"/>
-    <w:basedOn w:val="888"/>
+    <w:basedOn w:val="853"/>
     <w:uiPriority w:val="99"/>
     <w:pPr>
       <w:pBdr/>
@@ -39656,9 +40257,9 @@
       </w:tcPr>
     </w:tblStylePr>
   </w:style>
-  <w:style w:type="table" w:styleId="845">
+  <w:style w:type="table" w:styleId="810">
     <w:name w:val="List Table 7 Colorful - Accent 4"/>
-    <w:basedOn w:val="888"/>
+    <w:basedOn w:val="853"/>
     <w:uiPriority w:val="99"/>
     <w:pPr>
       <w:pBdr/>
@@ -39912,9 +40513,9 @@
       </w:tcPr>
     </w:tblStylePr>
   </w:style>
-  <w:style w:type="table" w:styleId="846">
+  <w:style w:type="table" w:styleId="811">
     <w:name w:val="List Table 7 Colorful - Accent 5"/>
-    <w:basedOn w:val="888"/>
+    <w:basedOn w:val="853"/>
     <w:uiPriority w:val="99"/>
     <w:pPr>
       <w:pBdr/>
@@ -40168,9 +40769,9 @@
       </w:tcPr>
     </w:tblStylePr>
   </w:style>
-  <w:style w:type="table" w:styleId="847">
+  <w:style w:type="table" w:styleId="812">
     <w:name w:val="List Table 7 Colorful - Accent 6"/>
-    <w:basedOn w:val="888"/>
+    <w:basedOn w:val="853"/>
     <w:uiPriority w:val="99"/>
     <w:pPr>
       <w:pBdr/>
@@ -40424,9 +41025,9 @@
       </w:tcPr>
     </w:tblStylePr>
   </w:style>
-  <w:style w:type="table" w:styleId="848">
+  <w:style w:type="table" w:styleId="813">
     <w:name w:val="Lined - Accent"/>
-    <w:basedOn w:val="888"/>
+    <w:basedOn w:val="853"/>
     <w:uiPriority w:val="99"/>
     <w:pPr>
       <w:pBdr/>
@@ -40661,9 +41262,9 @@
       </w:tcPr>
     </w:tblStylePr>
   </w:style>
-  <w:style w:type="table" w:styleId="849">
+  <w:style w:type="table" w:styleId="814">
     <w:name w:val="Lined - Accent 1"/>
-    <w:basedOn w:val="888"/>
+    <w:basedOn w:val="853"/>
     <w:uiPriority w:val="99"/>
     <w:pPr>
       <w:pBdr/>
@@ -40898,9 +41499,9 @@
       </w:tcPr>
     </w:tblStylePr>
   </w:style>
-  <w:style w:type="table" w:styleId="850">
+  <w:style w:type="table" w:styleId="815">
     <w:name w:val="Lined - Accent 2"/>
-    <w:basedOn w:val="888"/>
+    <w:basedOn w:val="853"/>
     <w:uiPriority w:val="99"/>
     <w:pPr>
       <w:pBdr/>
@@ -41135,9 +41736,9 @@
       </w:tcPr>
     </w:tblStylePr>
   </w:style>
-  <w:style w:type="table" w:styleId="851">
+  <w:style w:type="table" w:styleId="816">
     <w:name w:val="Lined - Accent 3"/>
-    <w:basedOn w:val="888"/>
+    <w:basedOn w:val="853"/>
     <w:uiPriority w:val="99"/>
     <w:pPr>
       <w:pBdr/>
@@ -41372,9 +41973,9 @@
       </w:tcPr>
     </w:tblStylePr>
   </w:style>
-  <w:style w:type="table" w:styleId="852">
+  <w:style w:type="table" w:styleId="817">
     <w:name w:val="Lined - Accent 4"/>
-    <w:basedOn w:val="888"/>
+    <w:basedOn w:val="853"/>
     <w:uiPriority w:val="99"/>
     <w:pPr>
       <w:pBdr/>
@@ -41609,9 +42210,9 @@
       </w:tcPr>
     </w:tblStylePr>
   </w:style>
-  <w:style w:type="table" w:styleId="853">
+  <w:style w:type="table" w:styleId="818">
     <w:name w:val="Lined - Accent 5"/>
-    <w:basedOn w:val="888"/>
+    <w:basedOn w:val="853"/>
     <w:uiPriority w:val="99"/>
     <w:pPr>
       <w:pBdr/>
@@ -41846,9 +42447,9 @@
       </w:tcPr>
     </w:tblStylePr>
   </w:style>
-  <w:style w:type="table" w:styleId="854">
+  <w:style w:type="table" w:styleId="819">
     <w:name w:val="Lined - Accent 6"/>
-    <w:basedOn w:val="888"/>
+    <w:basedOn w:val="853"/>
     <w:uiPriority w:val="99"/>
     <w:pPr>
       <w:pBdr/>
@@ -42083,9 +42684,9 @@
       </w:tcPr>
     </w:tblStylePr>
   </w:style>
-  <w:style w:type="table" w:styleId="855">
+  <w:style w:type="table" w:styleId="820">
     <w:name w:val="Bordered &amp; Lined - Accent"/>
-    <w:basedOn w:val="888"/>
+    <w:basedOn w:val="853"/>
     <w:uiPriority w:val="99"/>
     <w:pPr>
       <w:pBdr/>
@@ -42327,9 +42928,9 @@
       </w:tcPr>
     </w:tblStylePr>
   </w:style>
-  <w:style w:type="table" w:styleId="856">
+  <w:style w:type="table" w:styleId="821">
     <w:name w:val="Bordered &amp; Lined - Accent 1"/>
-    <w:basedOn w:val="888"/>
+    <w:basedOn w:val="853"/>
     <w:uiPriority w:val="99"/>
     <w:pPr>
       <w:pBdr/>
@@ -42571,9 +43172,9 @@
       </w:tcPr>
     </w:tblStylePr>
   </w:style>
-  <w:style w:type="table" w:styleId="857">
+  <w:style w:type="table" w:styleId="822">
     <w:name w:val="Bordered &amp; Lined - Accent 2"/>
-    <w:basedOn w:val="888"/>
+    <w:basedOn w:val="853"/>
     <w:uiPriority w:val="99"/>
     <w:pPr>
       <w:pBdr/>
@@ -42815,9 +43416,9 @@
       </w:tcPr>
     </w:tblStylePr>
   </w:style>
-  <w:style w:type="table" w:styleId="858">
+  <w:style w:type="table" w:styleId="823">
     <w:name w:val="Bordered &amp; Lined - Accent 3"/>
-    <w:basedOn w:val="888"/>
+    <w:basedOn w:val="853"/>
     <w:uiPriority w:val="99"/>
     <w:pPr>
       <w:pBdr/>
@@ -43059,9 +43660,9 @@
       </w:tcPr>
     </w:tblStylePr>
   </w:style>
-  <w:style w:type="table" w:styleId="859">
+  <w:style w:type="table" w:styleId="824">
     <w:name w:val="Bordered &amp; Lined - Accent 4"/>
-    <w:basedOn w:val="888"/>
+    <w:basedOn w:val="853"/>
     <w:uiPriority w:val="99"/>
     <w:pPr>
       <w:pBdr/>
@@ -43303,9 +43904,9 @@
       </w:tcPr>
     </w:tblStylePr>
   </w:style>
-  <w:style w:type="table" w:styleId="860">
+  <w:style w:type="table" w:styleId="825">
     <w:name w:val="Bordered &amp; Lined - Accent 5"/>
-    <w:basedOn w:val="888"/>
+    <w:basedOn w:val="853"/>
     <w:uiPriority w:val="99"/>
     <w:pPr>
       <w:pBdr/>
@@ -43547,9 +44148,9 @@
       </w:tcPr>
     </w:tblStylePr>
   </w:style>
-  <w:style w:type="table" w:styleId="861">
+  <w:style w:type="table" w:styleId="826">
     <w:name w:val="Bordered &amp; Lined - Accent 6"/>
-    <w:basedOn w:val="888"/>
+    <w:basedOn w:val="853"/>
     <w:uiPriority w:val="99"/>
     <w:pPr>
       <w:pBdr/>
@@ -43791,9 +44392,9 @@
       </w:tcPr>
     </w:tblStylePr>
   </w:style>
-  <w:style w:type="table" w:styleId="862">
+  <w:style w:type="table" w:styleId="827">
     <w:name w:val="Bordered"/>
-    <w:basedOn w:val="888"/>
+    <w:basedOn w:val="853"/>
     <w:uiPriority w:val="99"/>
     <w:pPr>
       <w:pBdr/>
@@ -44022,9 +44623,9 @@
       </w:tcPr>
     </w:tblStylePr>
   </w:style>
-  <w:style w:type="table" w:styleId="863">
+  <w:style w:type="table" w:styleId="828">
     <w:name w:val="Bordered - Accent 1"/>
-    <w:basedOn w:val="888"/>
+    <w:basedOn w:val="853"/>
     <w:uiPriority w:val="99"/>
     <w:pPr>
       <w:pBdr/>
@@ -44253,9 +44854,9 @@
       </w:tcPr>
     </w:tblStylePr>
   </w:style>
-  <w:style w:type="table" w:styleId="864">
+  <w:style w:type="table" w:styleId="829">
     <w:name w:val="Bordered - Accent 2"/>
-    <w:basedOn w:val="888"/>
+    <w:basedOn w:val="853"/>
     <w:uiPriority w:val="99"/>
     <w:pPr>
       <w:pBdr/>
@@ -44484,9 +45085,9 @@
       </w:tcPr>
     </w:tblStylePr>
   </w:style>
-  <w:style w:type="table" w:styleId="865">
+  <w:style w:type="table" w:styleId="830">
     <w:name w:val="Bordered - Accent 3"/>
-    <w:basedOn w:val="888"/>
+    <w:basedOn w:val="853"/>
     <w:uiPriority w:val="99"/>
     <w:pPr>
       <w:pBdr/>
@@ -44715,9 +45316,9 @@
       </w:tcPr>
     </w:tblStylePr>
   </w:style>
-  <w:style w:type="table" w:styleId="866">
+  <w:style w:type="table" w:styleId="831">
     <w:name w:val="Bordered - Accent 4"/>
-    <w:basedOn w:val="888"/>
+    <w:basedOn w:val="853"/>
     <w:uiPriority w:val="99"/>
     <w:pPr>
       <w:pBdr/>
@@ -44946,9 +45547,9 @@
       </w:tcPr>
     </w:tblStylePr>
   </w:style>
-  <w:style w:type="table" w:styleId="867">
+  <w:style w:type="table" w:styleId="832">
     <w:name w:val="Bordered - Accent 5"/>
-    <w:basedOn w:val="888"/>
+    <w:basedOn w:val="853"/>
     <w:uiPriority w:val="99"/>
     <w:pPr>
       <w:pBdr/>
@@ -45177,9 +45778,9 @@
       </w:tcPr>
     </w:tblStylePr>
   </w:style>
-  <w:style w:type="table" w:styleId="868">
+  <w:style w:type="table" w:styleId="833">
     <w:name w:val="Bordered - Accent 6"/>
-    <w:basedOn w:val="888"/>
+    <w:basedOn w:val="853"/>
     <w:uiPriority w:val="99"/>
     <w:pPr>
       <w:pBdr/>
@@ -45408,7 +46009,7 @@
       </w:tcPr>
     </w:tblStylePr>
   </w:style>
-  <w:style w:type="character" w:styleId="869">
+  <w:style w:type="character" w:styleId="834">
     <w:name w:val="Hyperlink"/>
     <w:uiPriority w:val="99"/>
     <w:unhideWhenUsed/>
@@ -45422,10 +46023,10 @@
       <w:u w:val="single"/>
     </w:rPr>
   </w:style>
-  <w:style w:type="paragraph" w:styleId="870">
+  <w:style w:type="paragraph" w:styleId="835">
     <w:name w:val="footnote text"/>
-    <w:basedOn w:val="887"/>
-    <w:link w:val="871"/>
+    <w:basedOn w:val="852"/>
+    <w:link w:val="836"/>
     <w:uiPriority w:val="99"/>
     <w:semiHidden/>
     <w:unhideWhenUsed/>
@@ -45438,9 +46039,9 @@
       <w:sz w:val="18"/>
     </w:rPr>
   </w:style>
-  <w:style w:type="character" w:styleId="871">
+  <w:style w:type="character" w:styleId="836">
     <w:name w:val="Footnote Text Char"/>
-    <w:link w:val="870"/>
+    <w:link w:val="835"/>
     <w:uiPriority w:val="99"/>
     <w:pPr>
       <w:pBdr/>
@@ -45451,7 +46052,7 @@
       <w:sz w:val="18"/>
     </w:rPr>
   </w:style>
-  <w:style w:type="character" w:styleId="872">
+  <w:style w:type="character" w:styleId="837">
     <w:name w:val="footnote reference"/>
     <w:uiPriority w:val="99"/>
     <w:unhideWhenUsed/>
@@ -45464,10 +46065,10 @@
       <w:vertAlign w:val="superscript"/>
     </w:rPr>
   </w:style>
-  <w:style w:type="paragraph" w:styleId="873">
+  <w:style w:type="paragraph" w:styleId="838">
     <w:name w:val="endnote text"/>
-    <w:basedOn w:val="887"/>
-    <w:link w:val="874"/>
+    <w:basedOn w:val="852"/>
+    <w:link w:val="839"/>
     <w:uiPriority w:val="99"/>
     <w:semiHidden/>
     <w:unhideWhenUsed/>
@@ -45480,9 +46081,9 @@
       <w:sz w:val="20"/>
     </w:rPr>
   </w:style>
-  <w:style w:type="character" w:styleId="874">
+  <w:style w:type="character" w:styleId="839">
     <w:name w:val="Endnote Text Char"/>
-    <w:link w:val="873"/>
+    <w:link w:val="838"/>
     <w:uiPriority w:val="99"/>
     <w:pPr>
       <w:pBdr/>
@@ -45493,7 +46094,7 @@
       <w:sz w:val="20"/>
     </w:rPr>
   </w:style>
-  <w:style w:type="character" w:styleId="875">
+  <w:style w:type="character" w:styleId="840">
     <w:name w:val="endnote reference"/>
     <w:uiPriority w:val="99"/>
     <w:semiHidden/>
@@ -45507,10 +46108,10 @@
       <w:vertAlign w:val="superscript"/>
     </w:rPr>
   </w:style>
-  <w:style w:type="paragraph" w:styleId="876">
+  <w:style w:type="paragraph" w:styleId="841">
     <w:name w:val="toc 1"/>
-    <w:basedOn w:val="887"/>
-    <w:next w:val="887"/>
+    <w:basedOn w:val="852"/>
+    <w:next w:val="852"/>
     <w:uiPriority w:val="39"/>
     <w:unhideWhenUsed/>
     <w:pPr>
@@ -45519,10 +46120,10 @@
       <w:ind w:right="0" w:firstLine="0" w:left="0"/>
     </w:pPr>
   </w:style>
-  <w:style w:type="paragraph" w:styleId="877">
+  <w:style w:type="paragraph" w:styleId="842">
     <w:name w:val="toc 2"/>
-    <w:basedOn w:val="887"/>
-    <w:next w:val="887"/>
+    <w:basedOn w:val="852"/>
+    <w:next w:val="852"/>
     <w:uiPriority w:val="39"/>
     <w:unhideWhenUsed/>
     <w:pPr>
@@ -45531,10 +46132,10 @@
       <w:ind w:right="0" w:firstLine="0" w:left="283"/>
     </w:pPr>
   </w:style>
-  <w:style w:type="paragraph" w:styleId="878">
+  <w:style w:type="paragraph" w:styleId="843">
     <w:name w:val="toc 3"/>
-    <w:basedOn w:val="887"/>
-    <w:next w:val="887"/>
+    <w:basedOn w:val="852"/>
+    <w:next w:val="852"/>
     <w:uiPriority w:val="39"/>
     <w:unhideWhenUsed/>
     <w:pPr>
@@ -45543,10 +46144,10 @@
       <w:ind w:right="0" w:firstLine="0" w:left="567"/>
     </w:pPr>
   </w:style>
-  <w:style w:type="paragraph" w:styleId="879">
+  <w:style w:type="paragraph" w:styleId="844">
     <w:name w:val="toc 4"/>
-    <w:basedOn w:val="887"/>
-    <w:next w:val="887"/>
+    <w:basedOn w:val="852"/>
+    <w:next w:val="852"/>
     <w:uiPriority w:val="39"/>
     <w:unhideWhenUsed/>
     <w:pPr>
@@ -45555,10 +46156,10 @@
       <w:ind w:right="0" w:firstLine="0" w:left="850"/>
     </w:pPr>
   </w:style>
-  <w:style w:type="paragraph" w:styleId="880">
+  <w:style w:type="paragraph" w:styleId="845">
     <w:name w:val="toc 5"/>
-    <w:basedOn w:val="887"/>
-    <w:next w:val="887"/>
+    <w:basedOn w:val="852"/>
+    <w:next w:val="852"/>
     <w:uiPriority w:val="39"/>
     <w:unhideWhenUsed/>
     <w:pPr>
@@ -45567,10 +46168,10 @@
       <w:ind w:right="0" w:firstLine="0" w:left="1134"/>
     </w:pPr>
   </w:style>
-  <w:style w:type="paragraph" w:styleId="881">
+  <w:style w:type="paragraph" w:styleId="846">
     <w:name w:val="toc 6"/>
-    <w:basedOn w:val="887"/>
-    <w:next w:val="887"/>
+    <w:basedOn w:val="852"/>
+    <w:next w:val="852"/>
     <w:uiPriority w:val="39"/>
     <w:unhideWhenUsed/>
     <w:pPr>
@@ -45579,10 +46180,10 @@
       <w:ind w:right="0" w:firstLine="0" w:left="1417"/>
     </w:pPr>
   </w:style>
-  <w:style w:type="paragraph" w:styleId="882">
+  <w:style w:type="paragraph" w:styleId="847">
     <w:name w:val="toc 7"/>
-    <w:basedOn w:val="887"/>
-    <w:next w:val="887"/>
+    <w:basedOn w:val="852"/>
+    <w:next w:val="852"/>
     <w:uiPriority w:val="39"/>
     <w:unhideWhenUsed/>
     <w:pPr>
@@ -45591,10 +46192,10 @@
       <w:ind w:right="0" w:firstLine="0" w:left="1701"/>
     </w:pPr>
   </w:style>
-  <w:style w:type="paragraph" w:styleId="883">
+  <w:style w:type="paragraph" w:styleId="848">
     <w:name w:val="toc 8"/>
-    <w:basedOn w:val="887"/>
-    <w:next w:val="887"/>
+    <w:basedOn w:val="852"/>
+    <w:next w:val="852"/>
     <w:uiPriority w:val="39"/>
     <w:unhideWhenUsed/>
     <w:pPr>
@@ -45603,10 +46204,10 @@
       <w:ind w:right="0" w:firstLine="0" w:left="1984"/>
     </w:pPr>
   </w:style>
-  <w:style w:type="paragraph" w:styleId="884">
+  <w:style w:type="paragraph" w:styleId="849">
     <w:name w:val="toc 9"/>
-    <w:basedOn w:val="887"/>
-    <w:next w:val="887"/>
+    <w:basedOn w:val="852"/>
+    <w:next w:val="852"/>
     <w:uiPriority w:val="39"/>
     <w:unhideWhenUsed/>
     <w:pPr>
@@ -45615,7 +46216,7 @@
       <w:ind w:right="0" w:firstLine="0" w:left="2268"/>
     </w:pPr>
   </w:style>
-  <w:style w:type="paragraph" w:styleId="885">
+  <w:style w:type="paragraph" w:styleId="850">
     <w:name w:val="TOC Heading"/>
     <w:uiPriority w:val="39"/>
     <w:unhideWhenUsed/>
@@ -45625,10 +46226,10 @@
       <w:ind/>
     </w:pPr>
   </w:style>
-  <w:style w:type="paragraph" w:styleId="886">
+  <w:style w:type="paragraph" w:styleId="851">
     <w:name w:val="table of figures"/>
-    <w:basedOn w:val="887"/>
-    <w:next w:val="887"/>
+    <w:basedOn w:val="852"/>
+    <w:next w:val="852"/>
     <w:uiPriority w:val="99"/>
     <w:unhideWhenUsed/>
     <w:pPr>
@@ -45637,7 +46238,7 @@
       <w:ind/>
     </w:pPr>
   </w:style>
-  <w:style w:type="paragraph" w:styleId="887" w:default="1">
+  <w:style w:type="paragraph" w:styleId="852" w:default="1">
     <w:name w:val="Normal"/>
     <w:qFormat/>
     <w:pPr>
@@ -45646,7 +46247,7 @@
       <w:ind/>
     </w:pPr>
   </w:style>
-  <w:style w:type="table" w:styleId="888" w:default="1">
+  <w:style w:type="table" w:styleId="853" w:default="1">
     <w:name w:val="Normal Table"/>
     <w:uiPriority w:val="99"/>
     <w:semiHidden/>
@@ -45839,7 +46440,7 @@
       </w:tcPr>
     </w:tblStylePr>
   </w:style>
-  <w:style w:type="numbering" w:styleId="889" w:default="1">
+  <w:style w:type="numbering" w:styleId="854" w:default="1">
     <w:name w:val="No List"/>
     <w:uiPriority w:val="99"/>
     <w:semiHidden/>
@@ -45850,9 +46451,9 @@
       <w:ind/>
     </w:pPr>
   </w:style>
-  <w:style w:type="paragraph" w:styleId="890">
+  <w:style w:type="paragraph" w:styleId="855">
     <w:name w:val="No Spacing"/>
-    <w:basedOn w:val="887"/>
+    <w:basedOn w:val="852"/>
     <w:uiPriority w:val="1"/>
     <w:qFormat/>
     <w:pPr>
@@ -45861,9 +46462,9 @@
       <w:ind/>
     </w:pPr>
   </w:style>
-  <w:style w:type="paragraph" w:styleId="891">
+  <w:style w:type="paragraph" w:styleId="856">
     <w:name w:val="List Paragraph"/>
-    <w:basedOn w:val="887"/>
+    <w:basedOn w:val="852"/>
     <w:uiPriority w:val="34"/>
     <w:qFormat/>
     <w:pPr>
@@ -45873,7 +46474,7 @@
       <w:contextualSpacing w:val="true"/>
     </w:pPr>
   </w:style>
-  <w:style w:type="character" w:styleId="892" w:default="1">
+  <w:style w:type="character" w:styleId="857" w:default="1">
     <w:name w:val="Default Paragraph Font"/>
     <w:uiPriority w:val="1"/>
     <w:semiHidden/>

</xml_diff>

<commit_message>
Code is pretty much DONE!
</commit_message>
<xml_diff>
--- a/Design.docx
+++ b/Design.docx
@@ -955,7 +955,7 @@
       <w:hyperlink r:id="rId11" w:tooltip="https://ssd.jpl.nasa.gov/api/horizons.api?format=text&amp;COMMAND='&quot;+target+&quot;'&amp;OBJ_DATA='YES'&amp;MAKE_EPHEM='YES'&amp;EPHEM_TYPE='VECTORS'&amp;START_TIME='&quot;+startTime+&quot;'&amp;STOP_TIME='&quot;+stopTime+&quot;'&amp;CENTER='500@0'&amp;STEP_SIZE='1 d'&amp;QUANTITIES='1,9,20,23,24,29'" w:history="1">
         <w:r>
           <w:rPr>
-            <w:rStyle w:val="834"/>
+            <w:rStyle w:val="838"/>
             <w:color w:val="000000" w:themeColor="text1"/>
             <w:sz w:val="22"/>
             <w:szCs w:val="18"/>
@@ -965,7 +965,7 @@
         </w:r>
         <w:r>
           <w:rPr>
-            <w:rStyle w:val="834"/>
+            <w:rStyle w:val="838"/>
             <w:color w:val="000000" w:themeColor="text1"/>
             <w:sz w:val="22"/>
             <w:szCs w:val="18"/>
@@ -974,7 +974,7 @@
         </w:r>
         <w:r>
           <w:rPr>
-            <w:rStyle w:val="834"/>
+            <w:rStyle w:val="838"/>
             <w:color w:val="000000" w:themeColor="text1"/>
             <w:sz w:val="22"/>
             <w:szCs w:val="18"/>
@@ -1115,7 +1115,7 @@
       <w:hyperlink r:id="rId12" w:tooltip="https://ssd-api.jpl.nasa.gov/doc/horizons.html#ephem_type" w:history="1">
         <w:r>
           <w:rPr>
-            <w:rStyle w:val="834"/>
+            <w:rStyle w:val="838"/>
             <w:color w:val="000000" w:themeColor="text1"/>
             <w:sz w:val="22"/>
             <w:szCs w:val="22"/>
@@ -1125,7 +1125,7 @@
         </w:r>
         <w:r>
           <w:rPr>
-            <w:rStyle w:val="834"/>
+            <w:rStyle w:val="838"/>
             <w:color w:val="000000" w:themeColor="text1"/>
             <w:sz w:val="22"/>
             <w:szCs w:val="22"/>
@@ -1134,7 +1134,7 @@
         </w:r>
         <w:r>
           <w:rPr>
-            <w:rStyle w:val="834"/>
+            <w:rStyle w:val="838"/>
             <w:color w:val="000000" w:themeColor="text1"/>
             <w:sz w:val="22"/>
             <w:szCs w:val="22"/>
@@ -2626,7 +2626,7 @@
     </w:p>
     <w:p>
       <w:pPr>
-        <w:pStyle w:val="856"/>
+        <w:pStyle w:val="860"/>
         <w:numPr>
           <w:ilvl w:val="0"/>
           <w:numId w:val="2"/>
@@ -2669,7 +2669,7 @@
     </w:p>
     <w:p>
       <w:pPr>
-        <w:pStyle w:val="856"/>
+        <w:pStyle w:val="860"/>
         <w:numPr>
           <w:ilvl w:val="0"/>
           <w:numId w:val="2"/>
@@ -3864,7 +3864,7 @@
           <w:szCs w:val="22"/>
           <w:highlight w:val="none"/>
         </w:rPr>
-        <w:t xml:space="preserve">s worse for readability and makes it less clear what the code is doing.) I also need to calculate logarithms for non-linear scaling when drawing force arrows (this will be explained more in the display section), for which I definitely need the math module.</w:t>
+        <w:t xml:space="preserve">s worse for readability and makes it less clear what the code is doing.) I also need to calculate logarithms for non-linear scaling when drawing force arrows (this will be explained more in the display section), for which I definitely need the math module. Logs will also be used at one point for changing the value of G, so that the changes are always relative to the order of magnitude at G at that point (explained later down in input section.)</w:t>
       </w:r>
       <w:r>
         <w:rPr>
@@ -4185,7 +4185,7 @@
     </w:p>
     <w:p>
       <w:pPr>
-        <w:pStyle w:val="856"/>
+        <w:pStyle w:val="860"/>
         <w:numPr>
           <w:ilvl w:val="0"/>
           <w:numId w:val="1"/>
@@ -4228,7 +4228,7 @@
     </w:p>
     <w:p>
       <w:pPr>
-        <w:pStyle w:val="856"/>
+        <w:pStyle w:val="860"/>
         <w:numPr>
           <w:ilvl w:val="0"/>
           <w:numId w:val="1"/>
@@ -4271,7 +4271,7 @@
     </w:p>
     <w:p>
       <w:pPr>
-        <w:pStyle w:val="856"/>
+        <w:pStyle w:val="860"/>
         <w:numPr>
           <w:ilvl w:val="0"/>
           <w:numId w:val="1"/>
@@ -4314,7 +4314,7 @@
     </w:p>
     <w:p>
       <w:pPr>
-        <w:pStyle w:val="856"/>
+        <w:pStyle w:val="860"/>
         <w:numPr>
           <w:ilvl w:val="0"/>
           <w:numId w:val="1"/>
@@ -5712,7 +5712,7 @@
     </w:p>
     <w:tbl>
       <w:tblPr>
-        <w:tblStyle w:val="708"/>
+        <w:tblStyle w:val="712"/>
         <w:tblW w:w="0" w:type="auto"/>
         <w:tblBorders/>
         <w:tblLook w:val="04A0" w:firstRow="1" w:lastRow="0" w:firstColumn="1" w:lastColumn="0" w:noHBand="0" w:noVBand="1"/>
@@ -7973,7 +7973,7 @@
     </w:p>
     <w:p>
       <w:pPr>
-        <w:pStyle w:val="856"/>
+        <w:pStyle w:val="860"/>
         <w:numPr>
           <w:ilvl w:val="0"/>
           <w:numId w:val="4"/>
@@ -8005,10 +8005,18 @@
           <w:highlight w:val="none"/>
         </w:rPr>
       </w:r>
+      <w:r>
+        <w:rPr>
+          <w:color w:val="000000"/>
+          <w:sz w:val="22"/>
+          <w:szCs w:val="22"/>
+          <w:highlight w:val="none"/>
+        </w:rPr>
+      </w:r>
     </w:p>
     <w:p>
       <w:pPr>
-        <w:pStyle w:val="856"/>
+        <w:pStyle w:val="860"/>
         <w:numPr>
           <w:ilvl w:val="0"/>
           <w:numId w:val="4"/>
@@ -8040,10 +8048,18 @@
           <w:highlight w:val="none"/>
         </w:rPr>
       </w:r>
+      <w:r>
+        <w:rPr>
+          <w:color w:val="000000"/>
+          <w:sz w:val="22"/>
+          <w:szCs w:val="22"/>
+          <w:highlight w:val="none"/>
+        </w:rPr>
+      </w:r>
     </w:p>
     <w:p>
       <w:pPr>
-        <w:pStyle w:val="856"/>
+        <w:pStyle w:val="860"/>
         <w:numPr>
           <w:ilvl w:val="0"/>
           <w:numId w:val="4"/>
@@ -8075,10 +8091,18 @@
           <w:highlight w:val="none"/>
         </w:rPr>
       </w:r>
+      <w:r>
+        <w:rPr>
+          <w:color w:val="000000"/>
+          <w:sz w:val="22"/>
+          <w:szCs w:val="22"/>
+          <w:highlight w:val="none"/>
+        </w:rPr>
+      </w:r>
     </w:p>
     <w:p>
       <w:pPr>
-        <w:pStyle w:val="856"/>
+        <w:pStyle w:val="860"/>
         <w:numPr>
           <w:ilvl w:val="0"/>
           <w:numId w:val="4"/>
@@ -8110,10 +8134,18 @@
           <w:highlight w:val="none"/>
         </w:rPr>
       </w:r>
+      <w:r>
+        <w:rPr>
+          <w:color w:val="000000"/>
+          <w:sz w:val="22"/>
+          <w:szCs w:val="22"/>
+          <w:highlight w:val="none"/>
+        </w:rPr>
+      </w:r>
     </w:p>
     <w:p>
       <w:pPr>
-        <w:pStyle w:val="856"/>
+        <w:pStyle w:val="860"/>
         <w:numPr>
           <w:ilvl w:val="0"/>
           <w:numId w:val="4"/>
@@ -8145,6 +8177,14 @@
           <w:highlight w:val="none"/>
         </w:rPr>
       </w:r>
+      <w:r>
+        <w:rPr>
+          <w:color w:val="000000"/>
+          <w:sz w:val="22"/>
+          <w:szCs w:val="22"/>
+          <w:highlight w:val="none"/>
+        </w:rPr>
+      </w:r>
     </w:p>
     <w:p>
       <w:pPr>
@@ -8175,6 +8215,14 @@
           <w:highlight w:val="none"/>
         </w:rPr>
       </w:r>
+      <w:r>
+        <w:rPr>
+          <w:color w:val="000000"/>
+          <w:sz w:val="22"/>
+          <w:szCs w:val="22"/>
+          <w:highlight w:val="none"/>
+        </w:rPr>
+      </w:r>
     </w:p>
     <w:p>
       <w:pPr>
@@ -8195,7 +8243,33 @@
           <w:szCs w:val="22"/>
           <w:highlight w:val="none"/>
         </w:rPr>
-        <w:t xml:space="preserve">First, outputting their attributes. This is all done with “getter” functions. You can see a function is a getter function because it starts with a get. Every get function in the class diagram returns the attribute in its name, i.e. getVel() returns vel (velocity) and getKE returns ke (kinetic energy.) I do this rather than just using planet.pos or planet.vel so that I can implement encapsulation, which improves security. It also means I can edit the output before it’s returned, which is used in the satellite subclass to change the way its orbital lines look to make them look better. Making everything a getter leaves room open for further editing in the future if needed, and makes the program more robust.</w:t>
+        <w:t xml:space="preserve">First, outputting their attributes. This is all done with “getter” functions. You can see a function is a getter function because it starts with a get. Every get function in the class diagram returns t</w:t>
+      </w:r>
+      <w:r>
+        <w:rPr>
+          <w:color w:val="000000"/>
+          <w:sz w:val="22"/>
+          <w:szCs w:val="22"/>
+          <w:highlight w:val="none"/>
+        </w:rPr>
+        <w:t xml:space="preserve">he attribute in its name, i.e. getVel() returns vel (velocity) and getKE returns ke (kinetic energy.) I do this rather than just using planet.pos or planet.vel so that I can implement encapsulation, which improves security. It also means I can edit the out</w:t>
+      </w:r>
+      <w:r>
+        <w:rPr>
+          <w:color w:val="000000"/>
+          <w:sz w:val="22"/>
+          <w:szCs w:val="22"/>
+          <w:highlight w:val="none"/>
+        </w:rPr>
+        <w:t xml:space="preserve">put before it’s returned, which is used in the satellite subclass to change the way its orbital lines look to make them look better. Making everything a getter leaves room open for further editing in the future if needed, and makes the program more robust.</w:t>
+      </w:r>
+      <w:r>
+        <w:rPr>
+          <w:color w:val="000000"/>
+          <w:sz w:val="22"/>
+          <w:szCs w:val="22"/>
+          <w:highlight w:val="none"/>
+        </w:rPr>
       </w:r>
       <w:r>
         <w:rPr>
@@ -8225,7 +8299,33 @@
           <w:szCs w:val="22"/>
           <w:highlight w:val="none"/>
         </w:rPr>
-        <w:t xml:space="preserve">Next, keeping a record of their previous positions. This is quite simple, as we’ll see later I’ll just add their position to a list of all their positions while simulating the tick. This list is “records”, which you can see in the attributes in the class diagram. To add a record to it, we’ll have a function, addRecord(). This is important, because having a function do it means we can get rid of the oldest entries in the list whenever we add a record, so that the list of positions doesn’t grow indefinitely. addRecord() will use the line length to shorten the list whenever it gets too long. Here is a pseudocode snippet that demonstrates how that might work:</w:t>
+        <w:t xml:space="preserve">Next, keeping a record of their previous positions. This is quite simple, as we’ll see later I’ll just add their position to a list of all their positi</w:t>
+      </w:r>
+      <w:r>
+        <w:rPr>
+          <w:color w:val="000000"/>
+          <w:sz w:val="22"/>
+          <w:szCs w:val="22"/>
+          <w:highlight w:val="none"/>
+        </w:rPr>
+        <w:t xml:space="preserve">ons while simulating the tick. This list is “records”, which you can see in the attributes in the class diagram. To add a record to it, we’ll have a function, addRecord(). This is important, because having a function do it means we can get rid of the oldes</w:t>
+      </w:r>
+      <w:r>
+        <w:rPr>
+          <w:color w:val="000000"/>
+          <w:sz w:val="22"/>
+          <w:szCs w:val="22"/>
+          <w:highlight w:val="none"/>
+        </w:rPr>
+        <w:t xml:space="preserve">t entries in the list whenever we add a record, so that the list of positions doesn’t grow indefinitely. addRecord() will use the line length to shorten the list whenever it gets too long. Here is a pseudocode snippet that demonstrates how that might work:</w:t>
+      </w:r>
+      <w:r>
+        <w:rPr>
+          <w:color w:val="000000"/>
+          <w:sz w:val="22"/>
+          <w:szCs w:val="22"/>
+          <w:highlight w:val="none"/>
+        </w:rPr>
       </w:r>
       <w:r>
         <w:rPr>
@@ -8248,6 +8348,14 @@
           <w:highlight w:val="none"/>
         </w:rPr>
       </w:pPr>
+      <w:r>
+        <w:rPr>
+          <w:color w:val="000000"/>
+          <w:sz w:val="22"/>
+          <w:szCs w:val="22"/>
+          <w:highlight w:val="none"/>
+        </w:rPr>
+      </w:r>
       <w:r>
         <w:rPr>
           <w:color w:val="000000"/>
@@ -15129,7 +15237,7 @@
 <w:hdr xmlns:wpc="http://schemas.microsoft.com/office/word/2010/wordprocessingCanvas" xmlns:mc="http://schemas.openxmlformats.org/markup-compatibility/2006" xmlns:o="urn:schemas-microsoft-com:office:office" xmlns:r="http://schemas.openxmlformats.org/officeDocument/2006/relationships" xmlns:m="http://schemas.openxmlformats.org/officeDocument/2006/math" xmlns:v="urn:schemas-microsoft-com:vml" xmlns:wp14="http://schemas.microsoft.com/office/word/2010/wordprocessingDrawing" xmlns:wp="http://schemas.openxmlformats.org/drawingml/2006/wordprocessingDrawing" xmlns:w10="urn:schemas-microsoft-com:office:word" xmlns:w="http://schemas.openxmlformats.org/wordprocessingml/2006/main" xmlns:w14="http://schemas.microsoft.com/office/word/2010/wordml" xmlns:w15="http://schemas.microsoft.com/office/word/2012/wordml" xmlns:wpg="http://schemas.microsoft.com/office/word/2010/wordprocessingGroup" xmlns:wpi="http://schemas.microsoft.com/office/word/2010/wordprocessingInk" xmlns:wne="http://schemas.microsoft.com/office/word/2006/wordml" xmlns:a="http://schemas.openxmlformats.org/drawingml/2006/main" xmlns:wps="http://schemas.microsoft.com/office/word/2010/wordprocessingShape" mc:Ignorable="w14 w15 wp14">
   <w:p>
     <w:pPr>
-      <w:pStyle w:val="702"/>
+      <w:pStyle w:val="706"/>
       <w:pBdr/>
       <w:spacing/>
       <w:ind/>
@@ -15880,9 +15988,9 @@
     <w:lsdException w:name="Bibliography" w:uiPriority="37"/>
     <w:lsdException w:name="TOC Heading" w:uiPriority="39" w:qFormat="1"/>
   </w:latentStyles>
-  <w:style w:type="character" w:styleId="668">
+  <w:style w:type="character" w:styleId="672">
     <w:name w:val="Intense Emphasis"/>
-    <w:basedOn w:val="857"/>
+    <w:basedOn w:val="861"/>
     <w:uiPriority w:val="21"/>
     <w:qFormat/>
     <w:pPr>
@@ -15896,9 +16004,9 @@
       <w:color w:val="0f4761" w:themeColor="accent1" w:themeShade="BF"/>
     </w:rPr>
   </w:style>
-  <w:style w:type="character" w:styleId="669">
+  <w:style w:type="character" w:styleId="673">
     <w:name w:val="Intense Reference"/>
-    <w:basedOn w:val="857"/>
+    <w:basedOn w:val="861"/>
     <w:uiPriority w:val="32"/>
     <w:qFormat/>
     <w:pPr>
@@ -15914,9 +16022,9 @@
       <w:spacing w:val="5"/>
     </w:rPr>
   </w:style>
-  <w:style w:type="character" w:styleId="670">
+  <w:style w:type="character" w:styleId="674">
     <w:name w:val="Subtle Emphasis"/>
-    <w:basedOn w:val="857"/>
+    <w:basedOn w:val="861"/>
     <w:uiPriority w:val="19"/>
     <w:qFormat/>
     <w:pPr>
@@ -15930,9 +16038,9 @@
       <w:color w:val="404040" w:themeColor="text1" w:themeTint="BF"/>
     </w:rPr>
   </w:style>
-  <w:style w:type="character" w:styleId="671">
+  <w:style w:type="character" w:styleId="675">
     <w:name w:val="Emphasis"/>
-    <w:basedOn w:val="857"/>
+    <w:basedOn w:val="861"/>
     <w:uiPriority w:val="20"/>
     <w:qFormat/>
     <w:pPr>
@@ -15945,9 +16053,9 @@
       <w:iCs/>
     </w:rPr>
   </w:style>
-  <w:style w:type="character" w:styleId="672">
+  <w:style w:type="character" w:styleId="676">
     <w:name w:val="Strong"/>
-    <w:basedOn w:val="857"/>
+    <w:basedOn w:val="861"/>
     <w:uiPriority w:val="22"/>
     <w:qFormat/>
     <w:pPr>
@@ -15960,9 +16068,9 @@
       <w:bCs/>
     </w:rPr>
   </w:style>
-  <w:style w:type="character" w:styleId="673">
+  <w:style w:type="character" w:styleId="677">
     <w:name w:val="Subtle Reference"/>
-    <w:basedOn w:val="857"/>
+    <w:basedOn w:val="861"/>
     <w:uiPriority w:val="31"/>
     <w:qFormat/>
     <w:pPr>
@@ -15975,9 +16083,9 @@
       <w:color w:val="5a5a5a" w:themeColor="text1" w:themeTint="A5"/>
     </w:rPr>
   </w:style>
-  <w:style w:type="character" w:styleId="674">
+  <w:style w:type="character" w:styleId="678">
     <w:name w:val="Book Title"/>
-    <w:basedOn w:val="857"/>
+    <w:basedOn w:val="861"/>
     <w:uiPriority w:val="33"/>
     <w:qFormat/>
     <w:pPr>
@@ -15993,9 +16101,9 @@
       <w:spacing w:val="5"/>
     </w:rPr>
   </w:style>
-  <w:style w:type="character" w:styleId="675">
+  <w:style w:type="character" w:styleId="679">
     <w:name w:val="FollowedHyperlink"/>
-    <w:basedOn w:val="857"/>
+    <w:basedOn w:val="861"/>
     <w:uiPriority w:val="99"/>
     <w:semiHidden/>
     <w:unhideWhenUsed/>
@@ -16009,11 +16117,11 @@
       <w:u w:val="single"/>
     </w:rPr>
   </w:style>
-  <w:style w:type="paragraph" w:styleId="676">
+  <w:style w:type="paragraph" w:styleId="680">
     <w:name w:val="Heading 1"/>
-    <w:basedOn w:val="852"/>
-    <w:next w:val="852"/>
-    <w:link w:val="677"/>
+    <w:basedOn w:val="856"/>
+    <w:next w:val="856"/>
+    <w:link w:val="681"/>
     <w:uiPriority w:val="9"/>
     <w:qFormat/>
     <w:pPr>
@@ -16030,9 +16138,9 @@
       <w:szCs w:val="40"/>
     </w:rPr>
   </w:style>
-  <w:style w:type="character" w:styleId="677">
+  <w:style w:type="character" w:styleId="681">
     <w:name w:val="Heading 1 Char"/>
-    <w:link w:val="676"/>
+    <w:link w:val="680"/>
     <w:uiPriority w:val="9"/>
     <w:pPr>
       <w:pBdr/>
@@ -16045,11 +16153,11 @@
       <w:szCs w:val="40"/>
     </w:rPr>
   </w:style>
-  <w:style w:type="paragraph" w:styleId="678">
+  <w:style w:type="paragraph" w:styleId="682">
     <w:name w:val="Heading 2"/>
-    <w:basedOn w:val="852"/>
-    <w:next w:val="852"/>
-    <w:link w:val="679"/>
+    <w:basedOn w:val="856"/>
+    <w:next w:val="856"/>
+    <w:link w:val="683"/>
     <w:uiPriority w:val="9"/>
     <w:unhideWhenUsed/>
     <w:qFormat/>
@@ -16066,9 +16174,9 @@
       <w:sz w:val="34"/>
     </w:rPr>
   </w:style>
-  <w:style w:type="character" w:styleId="679">
+  <w:style w:type="character" w:styleId="683">
     <w:name w:val="Heading 2 Char"/>
-    <w:link w:val="678"/>
+    <w:link w:val="682"/>
     <w:uiPriority w:val="9"/>
     <w:pPr>
       <w:pBdr/>
@@ -16080,11 +16188,11 @@
       <w:sz w:val="34"/>
     </w:rPr>
   </w:style>
-  <w:style w:type="paragraph" w:styleId="680">
+  <w:style w:type="paragraph" w:styleId="684">
     <w:name w:val="Heading 3"/>
-    <w:basedOn w:val="852"/>
-    <w:next w:val="852"/>
-    <w:link w:val="681"/>
+    <w:basedOn w:val="856"/>
+    <w:next w:val="856"/>
+    <w:link w:val="685"/>
     <w:uiPriority w:val="9"/>
     <w:unhideWhenUsed/>
     <w:qFormat/>
@@ -16102,9 +16210,9 @@
       <w:szCs w:val="30"/>
     </w:rPr>
   </w:style>
-  <w:style w:type="character" w:styleId="681">
+  <w:style w:type="character" w:styleId="685">
     <w:name w:val="Heading 3 Char"/>
-    <w:link w:val="680"/>
+    <w:link w:val="684"/>
     <w:uiPriority w:val="9"/>
     <w:pPr>
       <w:pBdr/>
@@ -16117,11 +16225,11 @@
       <w:szCs w:val="30"/>
     </w:rPr>
   </w:style>
-  <w:style w:type="paragraph" w:styleId="682">
+  <w:style w:type="paragraph" w:styleId="686">
     <w:name w:val="Heading 4"/>
-    <w:basedOn w:val="852"/>
-    <w:next w:val="852"/>
-    <w:link w:val="683"/>
+    <w:basedOn w:val="856"/>
+    <w:next w:val="856"/>
+    <w:link w:val="687"/>
     <w:uiPriority w:val="9"/>
     <w:unhideWhenUsed/>
     <w:qFormat/>
@@ -16141,9 +16249,9 @@
       <w:szCs w:val="26"/>
     </w:rPr>
   </w:style>
-  <w:style w:type="character" w:styleId="683">
+  <w:style w:type="character" w:styleId="687">
     <w:name w:val="Heading 4 Char"/>
-    <w:link w:val="682"/>
+    <w:link w:val="686"/>
     <w:uiPriority w:val="9"/>
     <w:pPr>
       <w:pBdr/>
@@ -16158,11 +16266,11 @@
       <w:szCs w:val="26"/>
     </w:rPr>
   </w:style>
-  <w:style w:type="paragraph" w:styleId="684">
+  <w:style w:type="paragraph" w:styleId="688">
     <w:name w:val="Heading 5"/>
-    <w:basedOn w:val="852"/>
-    <w:next w:val="852"/>
-    <w:link w:val="685"/>
+    <w:basedOn w:val="856"/>
+    <w:next w:val="856"/>
+    <w:link w:val="689"/>
     <w:uiPriority w:val="9"/>
     <w:unhideWhenUsed/>
     <w:qFormat/>
@@ -16182,9 +16290,9 @@
       <w:szCs w:val="24"/>
     </w:rPr>
   </w:style>
-  <w:style w:type="character" w:styleId="685">
+  <w:style w:type="character" w:styleId="689">
     <w:name w:val="Heading 5 Char"/>
-    <w:link w:val="684"/>
+    <w:link w:val="688"/>
     <w:uiPriority w:val="9"/>
     <w:pPr>
       <w:pBdr/>
@@ -16199,11 +16307,11 @@
       <w:szCs w:val="24"/>
     </w:rPr>
   </w:style>
-  <w:style w:type="paragraph" w:styleId="686">
+  <w:style w:type="paragraph" w:styleId="690">
     <w:name w:val="Heading 6"/>
-    <w:basedOn w:val="852"/>
-    <w:next w:val="852"/>
-    <w:link w:val="687"/>
+    <w:basedOn w:val="856"/>
+    <w:next w:val="856"/>
+    <w:link w:val="691"/>
     <w:uiPriority w:val="9"/>
     <w:unhideWhenUsed/>
     <w:qFormat/>
@@ -16223,9 +16331,9 @@
       <w:szCs w:val="22"/>
     </w:rPr>
   </w:style>
-  <w:style w:type="character" w:styleId="687">
+  <w:style w:type="character" w:styleId="691">
     <w:name w:val="Heading 6 Char"/>
-    <w:link w:val="686"/>
+    <w:link w:val="690"/>
     <w:uiPriority w:val="9"/>
     <w:pPr>
       <w:pBdr/>
@@ -16240,11 +16348,11 @@
       <w:szCs w:val="22"/>
     </w:rPr>
   </w:style>
-  <w:style w:type="paragraph" w:styleId="688">
+  <w:style w:type="paragraph" w:styleId="692">
     <w:name w:val="Heading 7"/>
-    <w:basedOn w:val="852"/>
-    <w:next w:val="852"/>
-    <w:link w:val="689"/>
+    <w:basedOn w:val="856"/>
+    <w:next w:val="856"/>
+    <w:link w:val="693"/>
     <w:uiPriority w:val="9"/>
     <w:unhideWhenUsed/>
     <w:qFormat/>
@@ -16266,9 +16374,9 @@
       <w:szCs w:val="22"/>
     </w:rPr>
   </w:style>
-  <w:style w:type="character" w:styleId="689">
+  <w:style w:type="character" w:styleId="693">
     <w:name w:val="Heading 7 Char"/>
-    <w:link w:val="688"/>
+    <w:link w:val="692"/>
     <w:uiPriority w:val="9"/>
     <w:pPr>
       <w:pBdr/>
@@ -16285,11 +16393,11 @@
       <w:szCs w:val="22"/>
     </w:rPr>
   </w:style>
-  <w:style w:type="paragraph" w:styleId="690">
+  <w:style w:type="paragraph" w:styleId="694">
     <w:name w:val="Heading 8"/>
-    <w:basedOn w:val="852"/>
-    <w:next w:val="852"/>
-    <w:link w:val="691"/>
+    <w:basedOn w:val="856"/>
+    <w:next w:val="856"/>
+    <w:link w:val="695"/>
     <w:uiPriority w:val="9"/>
     <w:unhideWhenUsed/>
     <w:qFormat/>
@@ -16309,9 +16417,9 @@
       <w:szCs w:val="22"/>
     </w:rPr>
   </w:style>
-  <w:style w:type="character" w:styleId="691">
+  <w:style w:type="character" w:styleId="695">
     <w:name w:val="Heading 8 Char"/>
-    <w:link w:val="690"/>
+    <w:link w:val="694"/>
     <w:uiPriority w:val="9"/>
     <w:pPr>
       <w:pBdr/>
@@ -16326,11 +16434,11 @@
       <w:szCs w:val="22"/>
     </w:rPr>
   </w:style>
-  <w:style w:type="paragraph" w:styleId="692">
+  <w:style w:type="paragraph" w:styleId="696">
     <w:name w:val="Heading 9"/>
-    <w:basedOn w:val="852"/>
-    <w:next w:val="852"/>
-    <w:link w:val="693"/>
+    <w:basedOn w:val="856"/>
+    <w:next w:val="856"/>
+    <w:link w:val="697"/>
     <w:uiPriority w:val="9"/>
     <w:unhideWhenUsed/>
     <w:qFormat/>
@@ -16350,9 +16458,9 @@
       <w:szCs w:val="21"/>
     </w:rPr>
   </w:style>
-  <w:style w:type="character" w:styleId="693">
+  <w:style w:type="character" w:styleId="697">
     <w:name w:val="Heading 9 Char"/>
-    <w:link w:val="692"/>
+    <w:link w:val="696"/>
     <w:uiPriority w:val="9"/>
     <w:pPr>
       <w:pBdr/>
@@ -16367,11 +16475,11 @@
       <w:szCs w:val="21"/>
     </w:rPr>
   </w:style>
-  <w:style w:type="paragraph" w:styleId="694">
+  <w:style w:type="paragraph" w:styleId="698">
     <w:name w:val="Title"/>
-    <w:basedOn w:val="852"/>
-    <w:next w:val="852"/>
-    <w:link w:val="695"/>
+    <w:basedOn w:val="856"/>
+    <w:next w:val="856"/>
+    <w:link w:val="699"/>
     <w:uiPriority w:val="10"/>
     <w:qFormat/>
     <w:pPr>
@@ -16385,9 +16493,9 @@
       <w:szCs w:val="48"/>
     </w:rPr>
   </w:style>
-  <w:style w:type="character" w:styleId="695">
+  <w:style w:type="character" w:styleId="699">
     <w:name w:val="Title Char"/>
-    <w:link w:val="694"/>
+    <w:link w:val="698"/>
     <w:uiPriority w:val="10"/>
     <w:pPr>
       <w:pBdr/>
@@ -16399,11 +16507,11 @@
       <w:szCs w:val="48"/>
     </w:rPr>
   </w:style>
-  <w:style w:type="paragraph" w:styleId="696">
+  <w:style w:type="paragraph" w:styleId="700">
     <w:name w:val="Subtitle"/>
-    <w:basedOn w:val="852"/>
-    <w:next w:val="852"/>
-    <w:link w:val="697"/>
+    <w:basedOn w:val="856"/>
+    <w:next w:val="856"/>
+    <w:link w:val="701"/>
     <w:uiPriority w:val="11"/>
     <w:qFormat/>
     <w:pPr>
@@ -16416,9 +16524,9 @@
       <w:szCs w:val="24"/>
     </w:rPr>
   </w:style>
-  <w:style w:type="character" w:styleId="697">
+  <w:style w:type="character" w:styleId="701">
     <w:name w:val="Subtitle Char"/>
-    <w:link w:val="696"/>
+    <w:link w:val="700"/>
     <w:uiPriority w:val="11"/>
     <w:pPr>
       <w:pBdr/>
@@ -16430,11 +16538,11 @@
       <w:szCs w:val="24"/>
     </w:rPr>
   </w:style>
-  <w:style w:type="paragraph" w:styleId="698">
+  <w:style w:type="paragraph" w:styleId="702">
     <w:name w:val="Quote"/>
-    <w:basedOn w:val="852"/>
-    <w:next w:val="852"/>
-    <w:link w:val="699"/>
+    <w:basedOn w:val="856"/>
+    <w:next w:val="856"/>
+    <w:link w:val="703"/>
     <w:uiPriority w:val="29"/>
     <w:qFormat/>
     <w:pPr>
@@ -16446,9 +16554,9 @@
       <w:i/>
     </w:rPr>
   </w:style>
-  <w:style w:type="character" w:styleId="699">
+  <w:style w:type="character" w:styleId="703">
     <w:name w:val="Quote Char"/>
-    <w:link w:val="698"/>
+    <w:link w:val="702"/>
     <w:uiPriority w:val="29"/>
     <w:pPr>
       <w:pBdr/>
@@ -16459,11 +16567,11 @@
       <w:i/>
     </w:rPr>
   </w:style>
-  <w:style w:type="paragraph" w:styleId="700">
+  <w:style w:type="paragraph" w:styleId="704">
     <w:name w:val="Intense Quote"/>
-    <w:basedOn w:val="852"/>
-    <w:next w:val="852"/>
-    <w:link w:val="701"/>
+    <w:basedOn w:val="856"/>
+    <w:next w:val="856"/>
+    <w:link w:val="705"/>
     <w:uiPriority w:val="30"/>
     <w:qFormat/>
     <w:pPr>
@@ -16482,9 +16590,9 @@
       <w:i/>
     </w:rPr>
   </w:style>
-  <w:style w:type="character" w:styleId="701">
+  <w:style w:type="character" w:styleId="705">
     <w:name w:val="Intense Quote Char"/>
-    <w:link w:val="700"/>
+    <w:link w:val="704"/>
     <w:uiPriority w:val="30"/>
     <w:pPr>
       <w:pBdr/>
@@ -16495,35 +16603,9 @@
       <w:i/>
     </w:rPr>
   </w:style>
-  <w:style w:type="paragraph" w:styleId="702">
+  <w:style w:type="paragraph" w:styleId="706">
     <w:name w:val="Header"/>
-    <w:basedOn w:val="852"/>
-    <w:link w:val="703"/>
-    <w:uiPriority w:val="99"/>
-    <w:unhideWhenUsed/>
-    <w:pPr>
-      <w:pBdr/>
-      <w:tabs>
-        <w:tab w:val="center" w:leader="none" w:pos="7143"/>
-        <w:tab w:val="right" w:leader="none" w:pos="14287"/>
-      </w:tabs>
-      <w:spacing w:after="0" w:line="240" w:lineRule="auto"/>
-      <w:ind/>
-    </w:pPr>
-  </w:style>
-  <w:style w:type="character" w:styleId="703">
-    <w:name w:val="Header Char"/>
-    <w:link w:val="702"/>
-    <w:uiPriority w:val="99"/>
-    <w:pPr>
-      <w:pBdr/>
-      <w:spacing/>
-      <w:ind/>
-    </w:pPr>
-  </w:style>
-  <w:style w:type="paragraph" w:styleId="704">
-    <w:name w:val="Footer"/>
-    <w:basedOn w:val="852"/>
+    <w:basedOn w:val="856"/>
     <w:link w:val="707"/>
     <w:uiPriority w:val="99"/>
     <w:unhideWhenUsed/>
@@ -16537,9 +16619,9 @@
       <w:ind/>
     </w:pPr>
   </w:style>
-  <w:style w:type="character" w:styleId="705">
-    <w:name w:val="Footer Char"/>
-    <w:link w:val="704"/>
+  <w:style w:type="character" w:styleId="707">
+    <w:name w:val="Header Char"/>
+    <w:link w:val="706"/>
     <w:uiPriority w:val="99"/>
     <w:pPr>
       <w:pBdr/>
@@ -16547,10 +16629,36 @@
       <w:ind/>
     </w:pPr>
   </w:style>
-  <w:style w:type="paragraph" w:styleId="706">
+  <w:style w:type="paragraph" w:styleId="708">
+    <w:name w:val="Footer"/>
+    <w:basedOn w:val="856"/>
+    <w:link w:val="711"/>
+    <w:uiPriority w:val="99"/>
+    <w:unhideWhenUsed/>
+    <w:pPr>
+      <w:pBdr/>
+      <w:tabs>
+        <w:tab w:val="center" w:leader="none" w:pos="7143"/>
+        <w:tab w:val="right" w:leader="none" w:pos="14287"/>
+      </w:tabs>
+      <w:spacing w:after="0" w:line="240" w:lineRule="auto"/>
+      <w:ind/>
+    </w:pPr>
+  </w:style>
+  <w:style w:type="character" w:styleId="709">
+    <w:name w:val="Footer Char"/>
+    <w:link w:val="708"/>
+    <w:uiPriority w:val="99"/>
+    <w:pPr>
+      <w:pBdr/>
+      <w:spacing/>
+      <w:ind/>
+    </w:pPr>
+  </w:style>
+  <w:style w:type="paragraph" w:styleId="710">
     <w:name w:val="Caption"/>
-    <w:basedOn w:val="852"/>
-    <w:next w:val="852"/>
+    <w:basedOn w:val="856"/>
+    <w:next w:val="856"/>
     <w:uiPriority w:val="35"/>
     <w:semiHidden/>
     <w:unhideWhenUsed/>
@@ -16568,10 +16676,10 @@
       <w:szCs w:val="18"/>
     </w:rPr>
   </w:style>
-  <w:style w:type="character" w:styleId="707">
+  <w:style w:type="character" w:styleId="711">
     <w:name w:val="Caption Char"/>
-    <w:basedOn w:val="706"/>
-    <w:link w:val="704"/>
+    <w:basedOn w:val="710"/>
+    <w:link w:val="708"/>
     <w:uiPriority w:val="99"/>
     <w:pPr>
       <w:pBdr/>
@@ -16579,9 +16687,9 @@
       <w:ind/>
     </w:pPr>
   </w:style>
-  <w:style w:type="table" w:styleId="708">
+  <w:style w:type="table" w:styleId="712">
     <w:name w:val="Table Grid"/>
-    <w:basedOn w:val="853"/>
+    <w:basedOn w:val="857"/>
     <w:uiPriority w:val="59"/>
     <w:pPr>
       <w:pBdr/>
@@ -16778,9 +16886,9 @@
       </w:tcPr>
     </w:tblStylePr>
   </w:style>
-  <w:style w:type="table" w:styleId="709">
+  <w:style w:type="table" w:styleId="713">
     <w:name w:val="Table Grid Light"/>
-    <w:basedOn w:val="853"/>
+    <w:basedOn w:val="857"/>
     <w:uiPriority w:val="59"/>
     <w:pPr>
       <w:pBdr/>
@@ -16977,9 +17085,9 @@
       </w:tcPr>
     </w:tblStylePr>
   </w:style>
-  <w:style w:type="table" w:styleId="710">
+  <w:style w:type="table" w:styleId="714">
     <w:name w:val="Plain Table 1"/>
-    <w:basedOn w:val="853"/>
+    <w:basedOn w:val="857"/>
     <w:uiPriority w:val="59"/>
     <w:pPr>
       <w:pBdr/>
@@ -17202,9 +17310,9 @@
       </w:tcPr>
     </w:tblStylePr>
   </w:style>
-  <w:style w:type="table" w:styleId="711">
+  <w:style w:type="table" w:styleId="715">
     <w:name w:val="Plain Table 2"/>
-    <w:basedOn w:val="853"/>
+    <w:basedOn w:val="857"/>
     <w:uiPriority w:val="59"/>
     <w:pPr>
       <w:pBdr/>
@@ -17435,9 +17543,9 @@
       </w:tcPr>
     </w:tblStylePr>
   </w:style>
-  <w:style w:type="table" w:styleId="712">
+  <w:style w:type="table" w:styleId="716">
     <w:name w:val="Plain Table 3"/>
-    <w:basedOn w:val="853"/>
+    <w:basedOn w:val="857"/>
     <w:uiPriority w:val="99"/>
     <w:pPr>
       <w:pBdr/>
@@ -17665,9 +17773,9 @@
       </w:tcPr>
     </w:tblStylePr>
   </w:style>
-  <w:style w:type="table" w:styleId="713">
+  <w:style w:type="table" w:styleId="717">
     <w:name w:val="Plain Table 4"/>
-    <w:basedOn w:val="853"/>
+    <w:basedOn w:val="857"/>
     <w:uiPriority w:val="99"/>
     <w:pPr>
       <w:pBdr/>
@@ -17881,9 +17989,9 @@
       </w:tcPr>
     </w:tblStylePr>
   </w:style>
-  <w:style w:type="table" w:styleId="714">
+  <w:style w:type="table" w:styleId="718">
     <w:name w:val="Plain Table 5"/>
-    <w:basedOn w:val="853"/>
+    <w:basedOn w:val="857"/>
     <w:uiPriority w:val="99"/>
     <w:pPr>
       <w:pBdr/>
@@ -18114,9 +18222,9 @@
       </w:tcPr>
     </w:tblStylePr>
   </w:style>
-  <w:style w:type="table" w:styleId="715">
+  <w:style w:type="table" w:styleId="719">
     <w:name w:val="Grid Table 1 Light"/>
-    <w:basedOn w:val="853"/>
+    <w:basedOn w:val="857"/>
     <w:uiPriority w:val="99"/>
     <w:pPr>
       <w:pBdr/>
@@ -18337,9 +18445,9 @@
       </w:tcPr>
     </w:tblStylePr>
   </w:style>
-  <w:style w:type="table" w:styleId="716">
+  <w:style w:type="table" w:styleId="720">
     <w:name w:val="Grid Table 1 Light - Accent 1"/>
-    <w:basedOn w:val="853"/>
+    <w:basedOn w:val="857"/>
     <w:uiPriority w:val="99"/>
     <w:pPr>
       <w:pBdr/>
@@ -18560,9 +18668,9 @@
       </w:tcPr>
     </w:tblStylePr>
   </w:style>
-  <w:style w:type="table" w:styleId="717">
+  <w:style w:type="table" w:styleId="721">
     <w:name w:val="Grid Table 1 Light - Accent 2"/>
-    <w:basedOn w:val="853"/>
+    <w:basedOn w:val="857"/>
     <w:uiPriority w:val="99"/>
     <w:pPr>
       <w:pBdr/>
@@ -18783,9 +18891,9 @@
       </w:tcPr>
     </w:tblStylePr>
   </w:style>
-  <w:style w:type="table" w:styleId="718">
+  <w:style w:type="table" w:styleId="722">
     <w:name w:val="Grid Table 1 Light - Accent 3"/>
-    <w:basedOn w:val="853"/>
+    <w:basedOn w:val="857"/>
     <w:uiPriority w:val="99"/>
     <w:pPr>
       <w:pBdr/>
@@ -19006,9 +19114,9 @@
       </w:tcPr>
     </w:tblStylePr>
   </w:style>
-  <w:style w:type="table" w:styleId="719">
+  <w:style w:type="table" w:styleId="723">
     <w:name w:val="Grid Table 1 Light - Accent 4"/>
-    <w:basedOn w:val="853"/>
+    <w:basedOn w:val="857"/>
     <w:uiPriority w:val="99"/>
     <w:pPr>
       <w:pBdr/>
@@ -19229,9 +19337,9 @@
       </w:tcPr>
     </w:tblStylePr>
   </w:style>
-  <w:style w:type="table" w:styleId="720">
+  <w:style w:type="table" w:styleId="724">
     <w:name w:val="Grid Table 1 Light - Accent 5"/>
-    <w:basedOn w:val="853"/>
+    <w:basedOn w:val="857"/>
     <w:uiPriority w:val="99"/>
     <w:pPr>
       <w:pBdr/>
@@ -19452,9 +19560,9 @@
       </w:tcPr>
     </w:tblStylePr>
   </w:style>
-  <w:style w:type="table" w:styleId="721">
+  <w:style w:type="table" w:styleId="725">
     <w:name w:val="Grid Table 1 Light - Accent 6"/>
-    <w:basedOn w:val="853"/>
+    <w:basedOn w:val="857"/>
     <w:uiPriority w:val="99"/>
     <w:pPr>
       <w:pBdr/>
@@ -19675,9 +19783,9 @@
       </w:tcPr>
     </w:tblStylePr>
   </w:style>
-  <w:style w:type="table" w:styleId="722">
+  <w:style w:type="table" w:styleId="726">
     <w:name w:val="Grid Table 2"/>
-    <w:basedOn w:val="853"/>
+    <w:basedOn w:val="857"/>
     <w:uiPriority w:val="99"/>
     <w:pPr>
       <w:pBdr/>
@@ -19907,9 +20015,9 @@
       </w:tcPr>
     </w:tblStylePr>
   </w:style>
-  <w:style w:type="table" w:styleId="723">
+  <w:style w:type="table" w:styleId="727">
     <w:name w:val="Grid Table 2 - Accent 1"/>
-    <w:basedOn w:val="853"/>
+    <w:basedOn w:val="857"/>
     <w:uiPriority w:val="99"/>
     <w:pPr>
       <w:pBdr/>
@@ -20139,9 +20247,9 @@
       </w:tcPr>
     </w:tblStylePr>
   </w:style>
-  <w:style w:type="table" w:styleId="724">
+  <w:style w:type="table" w:styleId="728">
     <w:name w:val="Grid Table 2 - Accent 2"/>
-    <w:basedOn w:val="853"/>
+    <w:basedOn w:val="857"/>
     <w:uiPriority w:val="99"/>
     <w:pPr>
       <w:pBdr/>
@@ -20371,9 +20479,9 @@
       </w:tcPr>
     </w:tblStylePr>
   </w:style>
-  <w:style w:type="table" w:styleId="725">
+  <w:style w:type="table" w:styleId="729">
     <w:name w:val="Grid Table 2 - Accent 3"/>
-    <w:basedOn w:val="853"/>
+    <w:basedOn w:val="857"/>
     <w:uiPriority w:val="99"/>
     <w:pPr>
       <w:pBdr/>
@@ -20603,9 +20711,9 @@
       </w:tcPr>
     </w:tblStylePr>
   </w:style>
-  <w:style w:type="table" w:styleId="726">
+  <w:style w:type="table" w:styleId="730">
     <w:name w:val="Grid Table 2 - Accent 4"/>
-    <w:basedOn w:val="853"/>
+    <w:basedOn w:val="857"/>
     <w:uiPriority w:val="99"/>
     <w:pPr>
       <w:pBdr/>
@@ -20835,9 +20943,9 @@
       </w:tcPr>
     </w:tblStylePr>
   </w:style>
-  <w:style w:type="table" w:styleId="727">
+  <w:style w:type="table" w:styleId="731">
     <w:name w:val="Grid Table 2 - Accent 5"/>
-    <w:basedOn w:val="853"/>
+    <w:basedOn w:val="857"/>
     <w:uiPriority w:val="99"/>
     <w:pPr>
       <w:pBdr/>
@@ -21067,9 +21175,9 @@
       </w:tcPr>
     </w:tblStylePr>
   </w:style>
-  <w:style w:type="table" w:styleId="728">
+  <w:style w:type="table" w:styleId="732">
     <w:name w:val="Grid Table 2 - Accent 6"/>
-    <w:basedOn w:val="853"/>
+    <w:basedOn w:val="857"/>
     <w:uiPriority w:val="99"/>
     <w:pPr>
       <w:pBdr/>
@@ -21299,9 +21407,9 @@
       </w:tcPr>
     </w:tblStylePr>
   </w:style>
-  <w:style w:type="table" w:styleId="729">
+  <w:style w:type="table" w:styleId="733">
     <w:name w:val="Grid Table 3"/>
-    <w:basedOn w:val="853"/>
+    <w:basedOn w:val="857"/>
     <w:uiPriority w:val="99"/>
     <w:pPr>
       <w:pBdr/>
@@ -21544,9 +21652,9 @@
       </w:tcPr>
     </w:tblStylePr>
   </w:style>
-  <w:style w:type="table" w:styleId="730">
+  <w:style w:type="table" w:styleId="734">
     <w:name w:val="Grid Table 3 - Accent 1"/>
-    <w:basedOn w:val="853"/>
+    <w:basedOn w:val="857"/>
     <w:uiPriority w:val="99"/>
     <w:pPr>
       <w:pBdr/>
@@ -21789,9 +21897,9 @@
       </w:tcPr>
     </w:tblStylePr>
   </w:style>
-  <w:style w:type="table" w:styleId="731">
+  <w:style w:type="table" w:styleId="735">
     <w:name w:val="Grid Table 3 - Accent 2"/>
-    <w:basedOn w:val="853"/>
+    <w:basedOn w:val="857"/>
     <w:uiPriority w:val="99"/>
     <w:pPr>
       <w:pBdr/>
@@ -22034,9 +22142,9 @@
       </w:tcPr>
     </w:tblStylePr>
   </w:style>
-  <w:style w:type="table" w:styleId="732">
+  <w:style w:type="table" w:styleId="736">
     <w:name w:val="Grid Table 3 - Accent 3"/>
-    <w:basedOn w:val="853"/>
+    <w:basedOn w:val="857"/>
     <w:uiPriority w:val="99"/>
     <w:pPr>
       <w:pBdr/>
@@ -22279,9 +22387,9 @@
       </w:tcPr>
     </w:tblStylePr>
   </w:style>
-  <w:style w:type="table" w:styleId="733">
+  <w:style w:type="table" w:styleId="737">
     <w:name w:val="Grid Table 3 - Accent 4"/>
-    <w:basedOn w:val="853"/>
+    <w:basedOn w:val="857"/>
     <w:uiPriority w:val="99"/>
     <w:pPr>
       <w:pBdr/>
@@ -22524,9 +22632,9 @@
       </w:tcPr>
     </w:tblStylePr>
   </w:style>
-  <w:style w:type="table" w:styleId="734">
+  <w:style w:type="table" w:styleId="738">
     <w:name w:val="Grid Table 3 - Accent 5"/>
-    <w:basedOn w:val="853"/>
+    <w:basedOn w:val="857"/>
     <w:uiPriority w:val="99"/>
     <w:pPr>
       <w:pBdr/>
@@ -22769,9 +22877,9 @@
       </w:tcPr>
     </w:tblStylePr>
   </w:style>
-  <w:style w:type="table" w:styleId="735">
+  <w:style w:type="table" w:styleId="739">
     <w:name w:val="Grid Table 3 - Accent 6"/>
-    <w:basedOn w:val="853"/>
+    <w:basedOn w:val="857"/>
     <w:uiPriority w:val="99"/>
     <w:pPr>
       <w:pBdr/>
@@ -23014,9 +23122,9 @@
       </w:tcPr>
     </w:tblStylePr>
   </w:style>
-  <w:style w:type="table" w:styleId="736">
+  <w:style w:type="table" w:styleId="740">
     <w:name w:val="Grid Table 4"/>
-    <w:basedOn w:val="853"/>
+    <w:basedOn w:val="857"/>
     <w:uiPriority w:val="59"/>
     <w:pPr>
       <w:pBdr/>
@@ -23247,9 +23355,9 @@
       </w:tcPr>
     </w:tblStylePr>
   </w:style>
-  <w:style w:type="table" w:styleId="737">
+  <w:style w:type="table" w:styleId="741">
     <w:name w:val="Grid Table 4 - Accent 1"/>
-    <w:basedOn w:val="853"/>
+    <w:basedOn w:val="857"/>
     <w:uiPriority w:val="59"/>
     <w:pPr>
       <w:pBdr/>
@@ -23480,9 +23588,9 @@
       </w:tcPr>
     </w:tblStylePr>
   </w:style>
-  <w:style w:type="table" w:styleId="738">
+  <w:style w:type="table" w:styleId="742">
     <w:name w:val="Grid Table 4 - Accent 2"/>
-    <w:basedOn w:val="853"/>
+    <w:basedOn w:val="857"/>
     <w:uiPriority w:val="59"/>
     <w:pPr>
       <w:pBdr/>
@@ -23713,9 +23821,9 @@
       </w:tcPr>
     </w:tblStylePr>
   </w:style>
-  <w:style w:type="table" w:styleId="739">
+  <w:style w:type="table" w:styleId="743">
     <w:name w:val="Grid Table 4 - Accent 3"/>
-    <w:basedOn w:val="853"/>
+    <w:basedOn w:val="857"/>
     <w:uiPriority w:val="59"/>
     <w:pPr>
       <w:pBdr/>
@@ -23946,9 +24054,9 @@
       </w:tcPr>
     </w:tblStylePr>
   </w:style>
-  <w:style w:type="table" w:styleId="740">
+  <w:style w:type="table" w:styleId="744">
     <w:name w:val="Grid Table 4 - Accent 4"/>
-    <w:basedOn w:val="853"/>
+    <w:basedOn w:val="857"/>
     <w:uiPriority w:val="59"/>
     <w:pPr>
       <w:pBdr/>
@@ -24179,9 +24287,9 @@
       </w:tcPr>
     </w:tblStylePr>
   </w:style>
-  <w:style w:type="table" w:styleId="741">
+  <w:style w:type="table" w:styleId="745">
     <w:name w:val="Grid Table 4 - Accent 5"/>
-    <w:basedOn w:val="853"/>
+    <w:basedOn w:val="857"/>
     <w:uiPriority w:val="59"/>
     <w:pPr>
       <w:pBdr/>
@@ -24412,9 +24520,9 @@
       </w:tcPr>
     </w:tblStylePr>
   </w:style>
-  <w:style w:type="table" w:styleId="742">
+  <w:style w:type="table" w:styleId="746">
     <w:name w:val="Grid Table 4 - Accent 6"/>
-    <w:basedOn w:val="853"/>
+    <w:basedOn w:val="857"/>
     <w:uiPriority w:val="59"/>
     <w:pPr>
       <w:pBdr/>
@@ -24645,9 +24753,9 @@
       </w:tcPr>
     </w:tblStylePr>
   </w:style>
-  <w:style w:type="table" w:styleId="743">
+  <w:style w:type="table" w:styleId="747">
     <w:name w:val="Grid Table 5 Dark"/>
-    <w:basedOn w:val="853"/>
+    <w:basedOn w:val="857"/>
     <w:uiPriority w:val="99"/>
     <w:pPr>
       <w:pBdr/>
@@ -24873,9 +24981,9 @@
       </w:tcPr>
     </w:tblStylePr>
   </w:style>
-  <w:style w:type="table" w:styleId="744">
+  <w:style w:type="table" w:styleId="748">
     <w:name w:val="Grid Table 5 Dark- Accent 1"/>
-    <w:basedOn w:val="853"/>
+    <w:basedOn w:val="857"/>
     <w:uiPriority w:val="99"/>
     <w:pPr>
       <w:pBdr/>
@@ -25101,9 +25209,9 @@
       </w:tcPr>
     </w:tblStylePr>
   </w:style>
-  <w:style w:type="table" w:styleId="745">
+  <w:style w:type="table" w:styleId="749">
     <w:name w:val="Grid Table 5 Dark - Accent 2"/>
-    <w:basedOn w:val="853"/>
+    <w:basedOn w:val="857"/>
     <w:uiPriority w:val="99"/>
     <w:pPr>
       <w:pBdr/>
@@ -25329,9 +25437,9 @@
       </w:tcPr>
     </w:tblStylePr>
   </w:style>
-  <w:style w:type="table" w:styleId="746">
+  <w:style w:type="table" w:styleId="750">
     <w:name w:val="Grid Table 5 Dark - Accent 3"/>
-    <w:basedOn w:val="853"/>
+    <w:basedOn w:val="857"/>
     <w:uiPriority w:val="99"/>
     <w:pPr>
       <w:pBdr/>
@@ -25557,9 +25665,9 @@
       </w:tcPr>
     </w:tblStylePr>
   </w:style>
-  <w:style w:type="table" w:styleId="747">
+  <w:style w:type="table" w:styleId="751">
     <w:name w:val="Grid Table 5 Dark- Accent 4"/>
-    <w:basedOn w:val="853"/>
+    <w:basedOn w:val="857"/>
     <w:uiPriority w:val="99"/>
     <w:pPr>
       <w:pBdr/>
@@ -25785,9 +25893,9 @@
       </w:tcPr>
     </w:tblStylePr>
   </w:style>
-  <w:style w:type="table" w:styleId="748">
+  <w:style w:type="table" w:styleId="752">
     <w:name w:val="Grid Table 5 Dark - Accent 5"/>
-    <w:basedOn w:val="853"/>
+    <w:basedOn w:val="857"/>
     <w:uiPriority w:val="99"/>
     <w:pPr>
       <w:pBdr/>
@@ -26013,9 +26121,9 @@
       </w:tcPr>
     </w:tblStylePr>
   </w:style>
-  <w:style w:type="table" w:styleId="749">
+  <w:style w:type="table" w:styleId="753">
     <w:name w:val="Grid Table 5 Dark - Accent 6"/>
-    <w:basedOn w:val="853"/>
+    <w:basedOn w:val="857"/>
     <w:uiPriority w:val="99"/>
     <w:pPr>
       <w:pBdr/>
@@ -26241,9 +26349,9 @@
       </w:tcPr>
     </w:tblStylePr>
   </w:style>
-  <w:style w:type="table" w:styleId="750">
+  <w:style w:type="table" w:styleId="754">
     <w:name w:val="Grid Table 6 Colorful"/>
-    <w:basedOn w:val="853"/>
+    <w:basedOn w:val="857"/>
     <w:uiPriority w:val="99"/>
     <w:pPr>
       <w:pBdr/>
@@ -26471,9 +26579,9 @@
       </w:tcPr>
     </w:tblStylePr>
   </w:style>
-  <w:style w:type="table" w:styleId="751">
+  <w:style w:type="table" w:styleId="755">
     <w:name w:val="Grid Table 6 Colorful - Accent 1"/>
-    <w:basedOn w:val="853"/>
+    <w:basedOn w:val="857"/>
     <w:uiPriority w:val="99"/>
     <w:pPr>
       <w:pBdr/>
@@ -26701,9 +26809,9 @@
       </w:tcPr>
     </w:tblStylePr>
   </w:style>
-  <w:style w:type="table" w:styleId="752">
+  <w:style w:type="table" w:styleId="756">
     <w:name w:val="Grid Table 6 Colorful - Accent 2"/>
-    <w:basedOn w:val="853"/>
+    <w:basedOn w:val="857"/>
     <w:uiPriority w:val="99"/>
     <w:pPr>
       <w:pBdr/>
@@ -26931,9 +27039,9 @@
       </w:tcPr>
     </w:tblStylePr>
   </w:style>
-  <w:style w:type="table" w:styleId="753">
+  <w:style w:type="table" w:styleId="757">
     <w:name w:val="Grid Table 6 Colorful - Accent 3"/>
-    <w:basedOn w:val="853"/>
+    <w:basedOn w:val="857"/>
     <w:uiPriority w:val="99"/>
     <w:pPr>
       <w:pBdr/>
@@ -27161,9 +27269,9 @@
       </w:tcPr>
     </w:tblStylePr>
   </w:style>
-  <w:style w:type="table" w:styleId="754">
+  <w:style w:type="table" w:styleId="758">
     <w:name w:val="Grid Table 6 Colorful - Accent 4"/>
-    <w:basedOn w:val="853"/>
+    <w:basedOn w:val="857"/>
     <w:uiPriority w:val="99"/>
     <w:pPr>
       <w:pBdr/>
@@ -27391,9 +27499,9 @@
       </w:tcPr>
     </w:tblStylePr>
   </w:style>
-  <w:style w:type="table" w:styleId="755">
+  <w:style w:type="table" w:styleId="759">
     <w:name w:val="Grid Table 6 Colorful - Accent 5"/>
-    <w:basedOn w:val="853"/>
+    <w:basedOn w:val="857"/>
     <w:uiPriority w:val="99"/>
     <w:pPr>
       <w:pBdr/>
@@ -27621,9 +27729,9 @@
       </w:tcPr>
     </w:tblStylePr>
   </w:style>
-  <w:style w:type="table" w:styleId="756">
+  <w:style w:type="table" w:styleId="760">
     <w:name w:val="Grid Table 6 Colorful - Accent 6"/>
-    <w:basedOn w:val="853"/>
+    <w:basedOn w:val="857"/>
     <w:uiPriority w:val="99"/>
     <w:pPr>
       <w:pBdr/>
@@ -27851,9 +27959,9 @@
       </w:tcPr>
     </w:tblStylePr>
   </w:style>
-  <w:style w:type="table" w:styleId="757">
+  <w:style w:type="table" w:styleId="761">
     <w:name w:val="Grid Table 7 Colorful"/>
-    <w:basedOn w:val="853"/>
+    <w:basedOn w:val="857"/>
     <w:uiPriority w:val="99"/>
     <w:pPr>
       <w:pBdr/>
@@ -28105,9 +28213,9 @@
       </w:tcPr>
     </w:tblStylePr>
   </w:style>
-  <w:style w:type="table" w:styleId="758">
+  <w:style w:type="table" w:styleId="762">
     <w:name w:val="Grid Table 7 Colorful - Accent 1"/>
-    <w:basedOn w:val="853"/>
+    <w:basedOn w:val="857"/>
     <w:uiPriority w:val="99"/>
     <w:pPr>
       <w:pBdr/>
@@ -28359,9 +28467,9 @@
       </w:tcPr>
     </w:tblStylePr>
   </w:style>
-  <w:style w:type="table" w:styleId="759">
+  <w:style w:type="table" w:styleId="763">
     <w:name w:val="Grid Table 7 Colorful - Accent 2"/>
-    <w:basedOn w:val="853"/>
+    <w:basedOn w:val="857"/>
     <w:uiPriority w:val="99"/>
     <w:pPr>
       <w:pBdr/>
@@ -28613,9 +28721,9 @@
       </w:tcPr>
     </w:tblStylePr>
   </w:style>
-  <w:style w:type="table" w:styleId="760">
+  <w:style w:type="table" w:styleId="764">
     <w:name w:val="Grid Table 7 Colorful - Accent 3"/>
-    <w:basedOn w:val="853"/>
+    <w:basedOn w:val="857"/>
     <w:uiPriority w:val="99"/>
     <w:pPr>
       <w:pBdr/>
@@ -28867,9 +28975,9 @@
       </w:tcPr>
     </w:tblStylePr>
   </w:style>
-  <w:style w:type="table" w:styleId="761">
+  <w:style w:type="table" w:styleId="765">
     <w:name w:val="Grid Table 7 Colorful - Accent 4"/>
-    <w:basedOn w:val="853"/>
+    <w:basedOn w:val="857"/>
     <w:uiPriority w:val="99"/>
     <w:pPr>
       <w:pBdr/>
@@ -29121,9 +29229,9 @@
       </w:tcPr>
     </w:tblStylePr>
   </w:style>
-  <w:style w:type="table" w:styleId="762">
+  <w:style w:type="table" w:styleId="766">
     <w:name w:val="Grid Table 7 Colorful - Accent 5"/>
-    <w:basedOn w:val="853"/>
+    <w:basedOn w:val="857"/>
     <w:uiPriority w:val="99"/>
     <w:pPr>
       <w:pBdr/>
@@ -29375,9 +29483,9 @@
       </w:tcPr>
     </w:tblStylePr>
   </w:style>
-  <w:style w:type="table" w:styleId="763">
+  <w:style w:type="table" w:styleId="767">
     <w:name w:val="Grid Table 7 Colorful - Accent 6"/>
-    <w:basedOn w:val="853"/>
+    <w:basedOn w:val="857"/>
     <w:uiPriority w:val="99"/>
     <w:pPr>
       <w:pBdr/>
@@ -29629,9 +29737,9 @@
       </w:tcPr>
     </w:tblStylePr>
   </w:style>
-  <w:style w:type="table" w:styleId="764">
+  <w:style w:type="table" w:styleId="768">
     <w:name w:val="List Table 1 Light"/>
-    <w:basedOn w:val="853"/>
+    <w:basedOn w:val="857"/>
     <w:uiPriority w:val="99"/>
     <w:pPr>
       <w:pBdr/>
@@ -29845,9 +29953,9 @@
       </w:tcPr>
     </w:tblStylePr>
   </w:style>
-  <w:style w:type="table" w:styleId="765">
+  <w:style w:type="table" w:styleId="769">
     <w:name w:val="List Table 1 Light - Accent 1"/>
-    <w:basedOn w:val="853"/>
+    <w:basedOn w:val="857"/>
     <w:uiPriority w:val="99"/>
     <w:pPr>
       <w:pBdr/>
@@ -30061,9 +30169,9 @@
       </w:tcPr>
     </w:tblStylePr>
   </w:style>
-  <w:style w:type="table" w:styleId="766">
+  <w:style w:type="table" w:styleId="770">
     <w:name w:val="List Table 1 Light - Accent 2"/>
-    <w:basedOn w:val="853"/>
+    <w:basedOn w:val="857"/>
     <w:uiPriority w:val="99"/>
     <w:pPr>
       <w:pBdr/>
@@ -30277,9 +30385,9 @@
       </w:tcPr>
     </w:tblStylePr>
   </w:style>
-  <w:style w:type="table" w:styleId="767">
+  <w:style w:type="table" w:styleId="771">
     <w:name w:val="List Table 1 Light - Accent 3"/>
-    <w:basedOn w:val="853"/>
+    <w:basedOn w:val="857"/>
     <w:uiPriority w:val="99"/>
     <w:pPr>
       <w:pBdr/>
@@ -30493,9 +30601,9 @@
       </w:tcPr>
     </w:tblStylePr>
   </w:style>
-  <w:style w:type="table" w:styleId="768">
+  <w:style w:type="table" w:styleId="772">
     <w:name w:val="List Table 1 Light - Accent 4"/>
-    <w:basedOn w:val="853"/>
+    <w:basedOn w:val="857"/>
     <w:uiPriority w:val="99"/>
     <w:pPr>
       <w:pBdr/>
@@ -30709,9 +30817,9 @@
       </w:tcPr>
     </w:tblStylePr>
   </w:style>
-  <w:style w:type="table" w:styleId="769">
+  <w:style w:type="table" w:styleId="773">
     <w:name w:val="List Table 1 Light - Accent 5"/>
-    <w:basedOn w:val="853"/>
+    <w:basedOn w:val="857"/>
     <w:uiPriority w:val="99"/>
     <w:pPr>
       <w:pBdr/>
@@ -30925,9 +31033,9 @@
       </w:tcPr>
     </w:tblStylePr>
   </w:style>
-  <w:style w:type="table" w:styleId="770">
+  <w:style w:type="table" w:styleId="774">
     <w:name w:val="List Table 1 Light - Accent 6"/>
-    <w:basedOn w:val="853"/>
+    <w:basedOn w:val="857"/>
     <w:uiPriority w:val="99"/>
     <w:pPr>
       <w:pBdr/>
@@ -31141,9 +31249,9 @@
       </w:tcPr>
     </w:tblStylePr>
   </w:style>
-  <w:style w:type="table" w:styleId="771">
+  <w:style w:type="table" w:styleId="775">
     <w:name w:val="List Table 2"/>
-    <w:basedOn w:val="853"/>
+    <w:basedOn w:val="857"/>
     <w:uiPriority w:val="99"/>
     <w:pPr>
       <w:pBdr/>
@@ -31379,9 +31487,9 @@
       </w:tcPr>
     </w:tblStylePr>
   </w:style>
-  <w:style w:type="table" w:styleId="772">
+  <w:style w:type="table" w:styleId="776">
     <w:name w:val="List Table 2 - Accent 1"/>
-    <w:basedOn w:val="853"/>
+    <w:basedOn w:val="857"/>
     <w:uiPriority w:val="99"/>
     <w:pPr>
       <w:pBdr/>
@@ -31617,9 +31725,9 @@
       </w:tcPr>
     </w:tblStylePr>
   </w:style>
-  <w:style w:type="table" w:styleId="773">
+  <w:style w:type="table" w:styleId="777">
     <w:name w:val="List Table 2 - Accent 2"/>
-    <w:basedOn w:val="853"/>
+    <w:basedOn w:val="857"/>
     <w:uiPriority w:val="99"/>
     <w:pPr>
       <w:pBdr/>
@@ -31855,9 +31963,9 @@
       </w:tcPr>
     </w:tblStylePr>
   </w:style>
-  <w:style w:type="table" w:styleId="774">
+  <w:style w:type="table" w:styleId="778">
     <w:name w:val="List Table 2 - Accent 3"/>
-    <w:basedOn w:val="853"/>
+    <w:basedOn w:val="857"/>
     <w:uiPriority w:val="99"/>
     <w:pPr>
       <w:pBdr/>
@@ -32093,9 +32201,9 @@
       </w:tcPr>
     </w:tblStylePr>
   </w:style>
-  <w:style w:type="table" w:styleId="775">
+  <w:style w:type="table" w:styleId="779">
     <w:name w:val="List Table 2 - Accent 4"/>
-    <w:basedOn w:val="853"/>
+    <w:basedOn w:val="857"/>
     <w:uiPriority w:val="99"/>
     <w:pPr>
       <w:pBdr/>
@@ -32331,9 +32439,9 @@
       </w:tcPr>
     </w:tblStylePr>
   </w:style>
-  <w:style w:type="table" w:styleId="776">
+  <w:style w:type="table" w:styleId="780">
     <w:name w:val="List Table 2 - Accent 5"/>
-    <w:basedOn w:val="853"/>
+    <w:basedOn w:val="857"/>
     <w:uiPriority w:val="99"/>
     <w:pPr>
       <w:pBdr/>
@@ -32569,9 +32677,9 @@
       </w:tcPr>
     </w:tblStylePr>
   </w:style>
-  <w:style w:type="table" w:styleId="777">
+  <w:style w:type="table" w:styleId="781">
     <w:name w:val="List Table 2 - Accent 6"/>
-    <w:basedOn w:val="853"/>
+    <w:basedOn w:val="857"/>
     <w:uiPriority w:val="99"/>
     <w:pPr>
       <w:pBdr/>
@@ -32807,9 +32915,9 @@
       </w:tcPr>
     </w:tblStylePr>
   </w:style>
-  <w:style w:type="table" w:styleId="778">
+  <w:style w:type="table" w:styleId="782">
     <w:name w:val="List Table 3"/>
-    <w:basedOn w:val="853"/>
+    <w:basedOn w:val="857"/>
     <w:uiPriority w:val="99"/>
     <w:pPr>
       <w:pBdr/>
@@ -33035,9 +33143,9 @@
       </w:tcPr>
     </w:tblStylePr>
   </w:style>
-  <w:style w:type="table" w:styleId="779">
+  <w:style w:type="table" w:styleId="783">
     <w:name w:val="List Table 3 - Accent 1"/>
-    <w:basedOn w:val="853"/>
+    <w:basedOn w:val="857"/>
     <w:uiPriority w:val="99"/>
     <w:pPr>
       <w:pBdr/>
@@ -33263,9 +33371,9 @@
       </w:tcPr>
     </w:tblStylePr>
   </w:style>
-  <w:style w:type="table" w:styleId="780">
+  <w:style w:type="table" w:styleId="784">
     <w:name w:val="List Table 3 - Accent 2"/>
-    <w:basedOn w:val="853"/>
+    <w:basedOn w:val="857"/>
     <w:uiPriority w:val="99"/>
     <w:pPr>
       <w:pBdr/>
@@ -33491,9 +33599,9 @@
       </w:tcPr>
     </w:tblStylePr>
   </w:style>
-  <w:style w:type="table" w:styleId="781">
+  <w:style w:type="table" w:styleId="785">
     <w:name w:val="List Table 3 - Accent 3"/>
-    <w:basedOn w:val="853"/>
+    <w:basedOn w:val="857"/>
     <w:uiPriority w:val="99"/>
     <w:pPr>
       <w:pBdr/>
@@ -33719,9 +33827,9 @@
       </w:tcPr>
     </w:tblStylePr>
   </w:style>
-  <w:style w:type="table" w:styleId="782">
+  <w:style w:type="table" w:styleId="786">
     <w:name w:val="List Table 3 - Accent 4"/>
-    <w:basedOn w:val="853"/>
+    <w:basedOn w:val="857"/>
     <w:uiPriority w:val="99"/>
     <w:pPr>
       <w:pBdr/>
@@ -33947,9 +34055,9 @@
       </w:tcPr>
     </w:tblStylePr>
   </w:style>
-  <w:style w:type="table" w:styleId="783">
+  <w:style w:type="table" w:styleId="787">
     <w:name w:val="List Table 3 - Accent 5"/>
-    <w:basedOn w:val="853"/>
+    <w:basedOn w:val="857"/>
     <w:uiPriority w:val="99"/>
     <w:pPr>
       <w:pBdr/>
@@ -34175,9 +34283,9 @@
       </w:tcPr>
     </w:tblStylePr>
   </w:style>
-  <w:style w:type="table" w:styleId="784">
+  <w:style w:type="table" w:styleId="788">
     <w:name w:val="List Table 3 - Accent 6"/>
-    <w:basedOn w:val="853"/>
+    <w:basedOn w:val="857"/>
     <w:uiPriority w:val="99"/>
     <w:pPr>
       <w:pBdr/>
@@ -34403,9 +34511,9 @@
       </w:tcPr>
     </w:tblStylePr>
   </w:style>
-  <w:style w:type="table" w:styleId="785">
+  <w:style w:type="table" w:styleId="789">
     <w:name w:val="List Table 4"/>
-    <w:basedOn w:val="853"/>
+    <w:basedOn w:val="857"/>
     <w:uiPriority w:val="99"/>
     <w:pPr>
       <w:pBdr/>
@@ -34628,9 +34736,9 @@
       </w:tcPr>
     </w:tblStylePr>
   </w:style>
-  <w:style w:type="table" w:styleId="786">
+  <w:style w:type="table" w:styleId="790">
     <w:name w:val="List Table 4 - Accent 1"/>
-    <w:basedOn w:val="853"/>
+    <w:basedOn w:val="857"/>
     <w:uiPriority w:val="99"/>
     <w:pPr>
       <w:pBdr/>
@@ -34853,9 +34961,9 @@
       </w:tcPr>
     </w:tblStylePr>
   </w:style>
-  <w:style w:type="table" w:styleId="787">
+  <w:style w:type="table" w:styleId="791">
     <w:name w:val="List Table 4 - Accent 2"/>
-    <w:basedOn w:val="853"/>
+    <w:basedOn w:val="857"/>
     <w:uiPriority w:val="99"/>
     <w:pPr>
       <w:pBdr/>
@@ -35078,9 +35186,9 @@
       </w:tcPr>
     </w:tblStylePr>
   </w:style>
-  <w:style w:type="table" w:styleId="788">
+  <w:style w:type="table" w:styleId="792">
     <w:name w:val="List Table 4 - Accent 3"/>
-    <w:basedOn w:val="853"/>
+    <w:basedOn w:val="857"/>
     <w:uiPriority w:val="99"/>
     <w:pPr>
       <w:pBdr/>
@@ -35303,9 +35411,9 @@
       </w:tcPr>
     </w:tblStylePr>
   </w:style>
-  <w:style w:type="table" w:styleId="789">
+  <w:style w:type="table" w:styleId="793">
     <w:name w:val="List Table 4 - Accent 4"/>
-    <w:basedOn w:val="853"/>
+    <w:basedOn w:val="857"/>
     <w:uiPriority w:val="99"/>
     <w:pPr>
       <w:pBdr/>
@@ -35528,9 +35636,9 @@
       </w:tcPr>
     </w:tblStylePr>
   </w:style>
-  <w:style w:type="table" w:styleId="790">
+  <w:style w:type="table" w:styleId="794">
     <w:name w:val="List Table 4 - Accent 5"/>
-    <w:basedOn w:val="853"/>
+    <w:basedOn w:val="857"/>
     <w:uiPriority w:val="99"/>
     <w:pPr>
       <w:pBdr/>
@@ -35753,9 +35861,9 @@
       </w:tcPr>
     </w:tblStylePr>
   </w:style>
-  <w:style w:type="table" w:styleId="791">
+  <w:style w:type="table" w:styleId="795">
     <w:name w:val="List Table 4 - Accent 6"/>
-    <w:basedOn w:val="853"/>
+    <w:basedOn w:val="857"/>
     <w:uiPriority w:val="99"/>
     <w:pPr>
       <w:pBdr/>
@@ -35978,9 +36086,9 @@
       </w:tcPr>
     </w:tblStylePr>
   </w:style>
-  <w:style w:type="table" w:styleId="792">
+  <w:style w:type="table" w:styleId="796">
     <w:name w:val="List Table 5 Dark"/>
-    <w:basedOn w:val="853"/>
+    <w:basedOn w:val="857"/>
     <w:uiPriority w:val="99"/>
     <w:pPr>
       <w:pBdr/>
@@ -36220,9 +36328,9 @@
       </w:tcPr>
     </w:tblStylePr>
   </w:style>
-  <w:style w:type="table" w:styleId="793">
+  <w:style w:type="table" w:styleId="797">
     <w:name w:val="List Table 5 Dark - Accent 1"/>
-    <w:basedOn w:val="853"/>
+    <w:basedOn w:val="857"/>
     <w:uiPriority w:val="99"/>
     <w:pPr>
       <w:pBdr/>
@@ -36462,9 +36570,9 @@
       </w:tcPr>
     </w:tblStylePr>
   </w:style>
-  <w:style w:type="table" w:styleId="794">
+  <w:style w:type="table" w:styleId="798">
     <w:name w:val="List Table 5 Dark - Accent 2"/>
-    <w:basedOn w:val="853"/>
+    <w:basedOn w:val="857"/>
     <w:uiPriority w:val="99"/>
     <w:pPr>
       <w:pBdr/>
@@ -36704,9 +36812,9 @@
       </w:tcPr>
     </w:tblStylePr>
   </w:style>
-  <w:style w:type="table" w:styleId="795">
+  <w:style w:type="table" w:styleId="799">
     <w:name w:val="List Table 5 Dark - Accent 3"/>
-    <w:basedOn w:val="853"/>
+    <w:basedOn w:val="857"/>
     <w:uiPriority w:val="99"/>
     <w:pPr>
       <w:pBdr/>
@@ -36946,9 +37054,9 @@
       </w:tcPr>
     </w:tblStylePr>
   </w:style>
-  <w:style w:type="table" w:styleId="796">
+  <w:style w:type="table" w:styleId="800">
     <w:name w:val="List Table 5 Dark - Accent 4"/>
-    <w:basedOn w:val="853"/>
+    <w:basedOn w:val="857"/>
     <w:uiPriority w:val="99"/>
     <w:pPr>
       <w:pBdr/>
@@ -37188,9 +37296,9 @@
       </w:tcPr>
     </w:tblStylePr>
   </w:style>
-  <w:style w:type="table" w:styleId="797">
+  <w:style w:type="table" w:styleId="801">
     <w:name w:val="List Table 5 Dark - Accent 5"/>
-    <w:basedOn w:val="853"/>
+    <w:basedOn w:val="857"/>
     <w:uiPriority w:val="99"/>
     <w:pPr>
       <w:pBdr/>
@@ -37430,9 +37538,9 @@
       </w:tcPr>
     </w:tblStylePr>
   </w:style>
-  <w:style w:type="table" w:styleId="798">
+  <w:style w:type="table" w:styleId="802">
     <w:name w:val="List Table 5 Dark - Accent 6"/>
-    <w:basedOn w:val="853"/>
+    <w:basedOn w:val="857"/>
     <w:uiPriority w:val="99"/>
     <w:pPr>
       <w:pBdr/>
@@ -37672,9 +37780,9 @@
       </w:tcPr>
     </w:tblStylePr>
   </w:style>
-  <w:style w:type="table" w:styleId="799">
+  <w:style w:type="table" w:styleId="803">
     <w:name w:val="List Table 6 Colorful"/>
-    <w:basedOn w:val="853"/>
+    <w:basedOn w:val="857"/>
     <w:uiPriority w:val="99"/>
     <w:pPr>
       <w:pBdr/>
@@ -37895,9 +38003,9 @@
       </w:tcPr>
     </w:tblStylePr>
   </w:style>
-  <w:style w:type="table" w:styleId="800">
+  <w:style w:type="table" w:styleId="804">
     <w:name w:val="List Table 6 Colorful - Accent 1"/>
-    <w:basedOn w:val="853"/>
+    <w:basedOn w:val="857"/>
     <w:uiPriority w:val="99"/>
     <w:pPr>
       <w:pBdr/>
@@ -38118,9 +38226,9 @@
       </w:tcPr>
     </w:tblStylePr>
   </w:style>
-  <w:style w:type="table" w:styleId="801">
+  <w:style w:type="table" w:styleId="805">
     <w:name w:val="List Table 6 Colorful - Accent 2"/>
-    <w:basedOn w:val="853"/>
+    <w:basedOn w:val="857"/>
     <w:uiPriority w:val="99"/>
     <w:pPr>
       <w:pBdr/>
@@ -38341,9 +38449,9 @@
       </w:tcPr>
     </w:tblStylePr>
   </w:style>
-  <w:style w:type="table" w:styleId="802">
+  <w:style w:type="table" w:styleId="806">
     <w:name w:val="List Table 6 Colorful - Accent 3"/>
-    <w:basedOn w:val="853"/>
+    <w:basedOn w:val="857"/>
     <w:uiPriority w:val="99"/>
     <w:pPr>
       <w:pBdr/>
@@ -38564,9 +38672,9 @@
       </w:tcPr>
     </w:tblStylePr>
   </w:style>
-  <w:style w:type="table" w:styleId="803">
+  <w:style w:type="table" w:styleId="807">
     <w:name w:val="List Table 6 Colorful - Accent 4"/>
-    <w:basedOn w:val="853"/>
+    <w:basedOn w:val="857"/>
     <w:uiPriority w:val="99"/>
     <w:pPr>
       <w:pBdr/>
@@ -38787,9 +38895,9 @@
       </w:tcPr>
     </w:tblStylePr>
   </w:style>
-  <w:style w:type="table" w:styleId="804">
+  <w:style w:type="table" w:styleId="808">
     <w:name w:val="List Table 6 Colorful - Accent 5"/>
-    <w:basedOn w:val="853"/>
+    <w:basedOn w:val="857"/>
     <w:uiPriority w:val="99"/>
     <w:pPr>
       <w:pBdr/>
@@ -39010,9 +39118,9 @@
       </w:tcPr>
     </w:tblStylePr>
   </w:style>
-  <w:style w:type="table" w:styleId="805">
+  <w:style w:type="table" w:styleId="809">
     <w:name w:val="List Table 6 Colorful - Accent 6"/>
-    <w:basedOn w:val="853"/>
+    <w:basedOn w:val="857"/>
     <w:uiPriority w:val="99"/>
     <w:pPr>
       <w:pBdr/>
@@ -39233,9 +39341,9 @@
       </w:tcPr>
     </w:tblStylePr>
   </w:style>
-  <w:style w:type="table" w:styleId="806">
+  <w:style w:type="table" w:styleId="810">
     <w:name w:val="List Table 7 Colorful"/>
-    <w:basedOn w:val="853"/>
+    <w:basedOn w:val="857"/>
     <w:uiPriority w:val="99"/>
     <w:pPr>
       <w:pBdr/>
@@ -39489,9 +39597,9 @@
       </w:tcPr>
     </w:tblStylePr>
   </w:style>
-  <w:style w:type="table" w:styleId="807">
+  <w:style w:type="table" w:styleId="811">
     <w:name w:val="List Table 7 Colorful - Accent 1"/>
-    <w:basedOn w:val="853"/>
+    <w:basedOn w:val="857"/>
     <w:uiPriority w:val="99"/>
     <w:pPr>
       <w:pBdr/>
@@ -39745,9 +39853,9 @@
       </w:tcPr>
     </w:tblStylePr>
   </w:style>
-  <w:style w:type="table" w:styleId="808">
+  <w:style w:type="table" w:styleId="812">
     <w:name w:val="List Table 7 Colorful - Accent 2"/>
-    <w:basedOn w:val="853"/>
+    <w:basedOn w:val="857"/>
     <w:uiPriority w:val="99"/>
     <w:pPr>
       <w:pBdr/>
@@ -40001,9 +40109,9 @@
       </w:tcPr>
     </w:tblStylePr>
   </w:style>
-  <w:style w:type="table" w:styleId="809">
+  <w:style w:type="table" w:styleId="813">
     <w:name w:val="List Table 7 Colorful - Accent 3"/>
-    <w:basedOn w:val="853"/>
+    <w:basedOn w:val="857"/>
     <w:uiPriority w:val="99"/>
     <w:pPr>
       <w:pBdr/>
@@ -40257,9 +40365,9 @@
       </w:tcPr>
     </w:tblStylePr>
   </w:style>
-  <w:style w:type="table" w:styleId="810">
+  <w:style w:type="table" w:styleId="814">
     <w:name w:val="List Table 7 Colorful - Accent 4"/>
-    <w:basedOn w:val="853"/>
+    <w:basedOn w:val="857"/>
     <w:uiPriority w:val="99"/>
     <w:pPr>
       <w:pBdr/>
@@ -40513,9 +40621,9 @@
       </w:tcPr>
     </w:tblStylePr>
   </w:style>
-  <w:style w:type="table" w:styleId="811">
+  <w:style w:type="table" w:styleId="815">
     <w:name w:val="List Table 7 Colorful - Accent 5"/>
-    <w:basedOn w:val="853"/>
+    <w:basedOn w:val="857"/>
     <w:uiPriority w:val="99"/>
     <w:pPr>
       <w:pBdr/>
@@ -40769,9 +40877,9 @@
       </w:tcPr>
     </w:tblStylePr>
   </w:style>
-  <w:style w:type="table" w:styleId="812">
+  <w:style w:type="table" w:styleId="816">
     <w:name w:val="List Table 7 Colorful - Accent 6"/>
-    <w:basedOn w:val="853"/>
+    <w:basedOn w:val="857"/>
     <w:uiPriority w:val="99"/>
     <w:pPr>
       <w:pBdr/>
@@ -41025,9 +41133,9 @@
       </w:tcPr>
     </w:tblStylePr>
   </w:style>
-  <w:style w:type="table" w:styleId="813">
+  <w:style w:type="table" w:styleId="817">
     <w:name w:val="Lined - Accent"/>
-    <w:basedOn w:val="853"/>
+    <w:basedOn w:val="857"/>
     <w:uiPriority w:val="99"/>
     <w:pPr>
       <w:pBdr/>
@@ -41262,9 +41370,9 @@
       </w:tcPr>
     </w:tblStylePr>
   </w:style>
-  <w:style w:type="table" w:styleId="814">
+  <w:style w:type="table" w:styleId="818">
     <w:name w:val="Lined - Accent 1"/>
-    <w:basedOn w:val="853"/>
+    <w:basedOn w:val="857"/>
     <w:uiPriority w:val="99"/>
     <w:pPr>
       <w:pBdr/>
@@ -41499,9 +41607,9 @@
       </w:tcPr>
     </w:tblStylePr>
   </w:style>
-  <w:style w:type="table" w:styleId="815">
+  <w:style w:type="table" w:styleId="819">
     <w:name w:val="Lined - Accent 2"/>
-    <w:basedOn w:val="853"/>
+    <w:basedOn w:val="857"/>
     <w:uiPriority w:val="99"/>
     <w:pPr>
       <w:pBdr/>
@@ -41736,9 +41844,9 @@
       </w:tcPr>
     </w:tblStylePr>
   </w:style>
-  <w:style w:type="table" w:styleId="816">
+  <w:style w:type="table" w:styleId="820">
     <w:name w:val="Lined - Accent 3"/>
-    <w:basedOn w:val="853"/>
+    <w:basedOn w:val="857"/>
     <w:uiPriority w:val="99"/>
     <w:pPr>
       <w:pBdr/>
@@ -41973,9 +42081,9 @@
       </w:tcPr>
     </w:tblStylePr>
   </w:style>
-  <w:style w:type="table" w:styleId="817">
+  <w:style w:type="table" w:styleId="821">
     <w:name w:val="Lined - Accent 4"/>
-    <w:basedOn w:val="853"/>
+    <w:basedOn w:val="857"/>
     <w:uiPriority w:val="99"/>
     <w:pPr>
       <w:pBdr/>
@@ -42210,9 +42318,9 @@
       </w:tcPr>
     </w:tblStylePr>
   </w:style>
-  <w:style w:type="table" w:styleId="818">
+  <w:style w:type="table" w:styleId="822">
     <w:name w:val="Lined - Accent 5"/>
-    <w:basedOn w:val="853"/>
+    <w:basedOn w:val="857"/>
     <w:uiPriority w:val="99"/>
     <w:pPr>
       <w:pBdr/>
@@ -42447,9 +42555,9 @@
       </w:tcPr>
     </w:tblStylePr>
   </w:style>
-  <w:style w:type="table" w:styleId="819">
+  <w:style w:type="table" w:styleId="823">
     <w:name w:val="Lined - Accent 6"/>
-    <w:basedOn w:val="853"/>
+    <w:basedOn w:val="857"/>
     <w:uiPriority w:val="99"/>
     <w:pPr>
       <w:pBdr/>
@@ -42684,9 +42792,9 @@
       </w:tcPr>
     </w:tblStylePr>
   </w:style>
-  <w:style w:type="table" w:styleId="820">
+  <w:style w:type="table" w:styleId="824">
     <w:name w:val="Bordered &amp; Lined - Accent"/>
-    <w:basedOn w:val="853"/>
+    <w:basedOn w:val="857"/>
     <w:uiPriority w:val="99"/>
     <w:pPr>
       <w:pBdr/>
@@ -42928,9 +43036,9 @@
       </w:tcPr>
     </w:tblStylePr>
   </w:style>
-  <w:style w:type="table" w:styleId="821">
+  <w:style w:type="table" w:styleId="825">
     <w:name w:val="Bordered &amp; Lined - Accent 1"/>
-    <w:basedOn w:val="853"/>
+    <w:basedOn w:val="857"/>
     <w:uiPriority w:val="99"/>
     <w:pPr>
       <w:pBdr/>
@@ -43172,9 +43280,9 @@
       </w:tcPr>
     </w:tblStylePr>
   </w:style>
-  <w:style w:type="table" w:styleId="822">
+  <w:style w:type="table" w:styleId="826">
     <w:name w:val="Bordered &amp; Lined - Accent 2"/>
-    <w:basedOn w:val="853"/>
+    <w:basedOn w:val="857"/>
     <w:uiPriority w:val="99"/>
     <w:pPr>
       <w:pBdr/>
@@ -43416,9 +43524,9 @@
       </w:tcPr>
     </w:tblStylePr>
   </w:style>
-  <w:style w:type="table" w:styleId="823">
+  <w:style w:type="table" w:styleId="827">
     <w:name w:val="Bordered &amp; Lined - Accent 3"/>
-    <w:basedOn w:val="853"/>
+    <w:basedOn w:val="857"/>
     <w:uiPriority w:val="99"/>
     <w:pPr>
       <w:pBdr/>
@@ -43660,9 +43768,9 @@
       </w:tcPr>
     </w:tblStylePr>
   </w:style>
-  <w:style w:type="table" w:styleId="824">
+  <w:style w:type="table" w:styleId="828">
     <w:name w:val="Bordered &amp; Lined - Accent 4"/>
-    <w:basedOn w:val="853"/>
+    <w:basedOn w:val="857"/>
     <w:uiPriority w:val="99"/>
     <w:pPr>
       <w:pBdr/>
@@ -43904,9 +44012,9 @@
       </w:tcPr>
     </w:tblStylePr>
   </w:style>
-  <w:style w:type="table" w:styleId="825">
+  <w:style w:type="table" w:styleId="829">
     <w:name w:val="Bordered &amp; Lined - Accent 5"/>
-    <w:basedOn w:val="853"/>
+    <w:basedOn w:val="857"/>
     <w:uiPriority w:val="99"/>
     <w:pPr>
       <w:pBdr/>
@@ -44148,9 +44256,9 @@
       </w:tcPr>
     </w:tblStylePr>
   </w:style>
-  <w:style w:type="table" w:styleId="826">
+  <w:style w:type="table" w:styleId="830">
     <w:name w:val="Bordered &amp; Lined - Accent 6"/>
-    <w:basedOn w:val="853"/>
+    <w:basedOn w:val="857"/>
     <w:uiPriority w:val="99"/>
     <w:pPr>
       <w:pBdr/>
@@ -44392,9 +44500,9 @@
       </w:tcPr>
     </w:tblStylePr>
   </w:style>
-  <w:style w:type="table" w:styleId="827">
+  <w:style w:type="table" w:styleId="831">
     <w:name w:val="Bordered"/>
-    <w:basedOn w:val="853"/>
+    <w:basedOn w:val="857"/>
     <w:uiPriority w:val="99"/>
     <w:pPr>
       <w:pBdr/>
@@ -44623,9 +44731,9 @@
       </w:tcPr>
     </w:tblStylePr>
   </w:style>
-  <w:style w:type="table" w:styleId="828">
+  <w:style w:type="table" w:styleId="832">
     <w:name w:val="Bordered - Accent 1"/>
-    <w:basedOn w:val="853"/>
+    <w:basedOn w:val="857"/>
     <w:uiPriority w:val="99"/>
     <w:pPr>
       <w:pBdr/>
@@ -44854,9 +44962,9 @@
       </w:tcPr>
     </w:tblStylePr>
   </w:style>
-  <w:style w:type="table" w:styleId="829">
+  <w:style w:type="table" w:styleId="833">
     <w:name w:val="Bordered - Accent 2"/>
-    <w:basedOn w:val="853"/>
+    <w:basedOn w:val="857"/>
     <w:uiPriority w:val="99"/>
     <w:pPr>
       <w:pBdr/>
@@ -45085,9 +45193,9 @@
       </w:tcPr>
     </w:tblStylePr>
   </w:style>
-  <w:style w:type="table" w:styleId="830">
+  <w:style w:type="table" w:styleId="834">
     <w:name w:val="Bordered - Accent 3"/>
-    <w:basedOn w:val="853"/>
+    <w:basedOn w:val="857"/>
     <w:uiPriority w:val="99"/>
     <w:pPr>
       <w:pBdr/>
@@ -45316,9 +45424,9 @@
       </w:tcPr>
     </w:tblStylePr>
   </w:style>
-  <w:style w:type="table" w:styleId="831">
+  <w:style w:type="table" w:styleId="835">
     <w:name w:val="Bordered - Accent 4"/>
-    <w:basedOn w:val="853"/>
+    <w:basedOn w:val="857"/>
     <w:uiPriority w:val="99"/>
     <w:pPr>
       <w:pBdr/>
@@ -45547,9 +45655,9 @@
       </w:tcPr>
     </w:tblStylePr>
   </w:style>
-  <w:style w:type="table" w:styleId="832">
+  <w:style w:type="table" w:styleId="836">
     <w:name w:val="Bordered - Accent 5"/>
-    <w:basedOn w:val="853"/>
+    <w:basedOn w:val="857"/>
     <w:uiPriority w:val="99"/>
     <w:pPr>
       <w:pBdr/>
@@ -45778,9 +45886,9 @@
       </w:tcPr>
     </w:tblStylePr>
   </w:style>
-  <w:style w:type="table" w:styleId="833">
+  <w:style w:type="table" w:styleId="837">
     <w:name w:val="Bordered - Accent 6"/>
-    <w:basedOn w:val="853"/>
+    <w:basedOn w:val="857"/>
     <w:uiPriority w:val="99"/>
     <w:pPr>
       <w:pBdr/>
@@ -46009,7 +46117,7 @@
       </w:tcPr>
     </w:tblStylePr>
   </w:style>
-  <w:style w:type="character" w:styleId="834">
+  <w:style w:type="character" w:styleId="838">
     <w:name w:val="Hyperlink"/>
     <w:uiPriority w:val="99"/>
     <w:unhideWhenUsed/>
@@ -46023,10 +46131,10 @@
       <w:u w:val="single"/>
     </w:rPr>
   </w:style>
-  <w:style w:type="paragraph" w:styleId="835">
+  <w:style w:type="paragraph" w:styleId="839">
     <w:name w:val="footnote text"/>
-    <w:basedOn w:val="852"/>
-    <w:link w:val="836"/>
+    <w:basedOn w:val="856"/>
+    <w:link w:val="840"/>
     <w:uiPriority w:val="99"/>
     <w:semiHidden/>
     <w:unhideWhenUsed/>
@@ -46039,9 +46147,9 @@
       <w:sz w:val="18"/>
     </w:rPr>
   </w:style>
-  <w:style w:type="character" w:styleId="836">
+  <w:style w:type="character" w:styleId="840">
     <w:name w:val="Footnote Text Char"/>
-    <w:link w:val="835"/>
+    <w:link w:val="839"/>
     <w:uiPriority w:val="99"/>
     <w:pPr>
       <w:pBdr/>
@@ -46052,7 +46160,7 @@
       <w:sz w:val="18"/>
     </w:rPr>
   </w:style>
-  <w:style w:type="character" w:styleId="837">
+  <w:style w:type="character" w:styleId="841">
     <w:name w:val="footnote reference"/>
     <w:uiPriority w:val="99"/>
     <w:unhideWhenUsed/>
@@ -46065,10 +46173,10 @@
       <w:vertAlign w:val="superscript"/>
     </w:rPr>
   </w:style>
-  <w:style w:type="paragraph" w:styleId="838">
+  <w:style w:type="paragraph" w:styleId="842">
     <w:name w:val="endnote text"/>
-    <w:basedOn w:val="852"/>
-    <w:link w:val="839"/>
+    <w:basedOn w:val="856"/>
+    <w:link w:val="843"/>
     <w:uiPriority w:val="99"/>
     <w:semiHidden/>
     <w:unhideWhenUsed/>
@@ -46081,9 +46189,9 @@
       <w:sz w:val="20"/>
     </w:rPr>
   </w:style>
-  <w:style w:type="character" w:styleId="839">
+  <w:style w:type="character" w:styleId="843">
     <w:name w:val="Endnote Text Char"/>
-    <w:link w:val="838"/>
+    <w:link w:val="842"/>
     <w:uiPriority w:val="99"/>
     <w:pPr>
       <w:pBdr/>
@@ -46094,7 +46202,7 @@
       <w:sz w:val="20"/>
     </w:rPr>
   </w:style>
-  <w:style w:type="character" w:styleId="840">
+  <w:style w:type="character" w:styleId="844">
     <w:name w:val="endnote reference"/>
     <w:uiPriority w:val="99"/>
     <w:semiHidden/>
@@ -46108,10 +46216,10 @@
       <w:vertAlign w:val="superscript"/>
     </w:rPr>
   </w:style>
-  <w:style w:type="paragraph" w:styleId="841">
+  <w:style w:type="paragraph" w:styleId="845">
     <w:name w:val="toc 1"/>
-    <w:basedOn w:val="852"/>
-    <w:next w:val="852"/>
+    <w:basedOn w:val="856"/>
+    <w:next w:val="856"/>
     <w:uiPriority w:val="39"/>
     <w:unhideWhenUsed/>
     <w:pPr>
@@ -46120,10 +46228,10 @@
       <w:ind w:right="0" w:firstLine="0" w:left="0"/>
     </w:pPr>
   </w:style>
-  <w:style w:type="paragraph" w:styleId="842">
+  <w:style w:type="paragraph" w:styleId="846">
     <w:name w:val="toc 2"/>
-    <w:basedOn w:val="852"/>
-    <w:next w:val="852"/>
+    <w:basedOn w:val="856"/>
+    <w:next w:val="856"/>
     <w:uiPriority w:val="39"/>
     <w:unhideWhenUsed/>
     <w:pPr>
@@ -46132,10 +46240,10 @@
       <w:ind w:right="0" w:firstLine="0" w:left="283"/>
     </w:pPr>
   </w:style>
-  <w:style w:type="paragraph" w:styleId="843">
+  <w:style w:type="paragraph" w:styleId="847">
     <w:name w:val="toc 3"/>
-    <w:basedOn w:val="852"/>
-    <w:next w:val="852"/>
+    <w:basedOn w:val="856"/>
+    <w:next w:val="856"/>
     <w:uiPriority w:val="39"/>
     <w:unhideWhenUsed/>
     <w:pPr>
@@ -46144,10 +46252,10 @@
       <w:ind w:right="0" w:firstLine="0" w:left="567"/>
     </w:pPr>
   </w:style>
-  <w:style w:type="paragraph" w:styleId="844">
+  <w:style w:type="paragraph" w:styleId="848">
     <w:name w:val="toc 4"/>
-    <w:basedOn w:val="852"/>
-    <w:next w:val="852"/>
+    <w:basedOn w:val="856"/>
+    <w:next w:val="856"/>
     <w:uiPriority w:val="39"/>
     <w:unhideWhenUsed/>
     <w:pPr>
@@ -46156,10 +46264,10 @@
       <w:ind w:right="0" w:firstLine="0" w:left="850"/>
     </w:pPr>
   </w:style>
-  <w:style w:type="paragraph" w:styleId="845">
+  <w:style w:type="paragraph" w:styleId="849">
     <w:name w:val="toc 5"/>
-    <w:basedOn w:val="852"/>
-    <w:next w:val="852"/>
+    <w:basedOn w:val="856"/>
+    <w:next w:val="856"/>
     <w:uiPriority w:val="39"/>
     <w:unhideWhenUsed/>
     <w:pPr>
@@ -46168,10 +46276,10 @@
       <w:ind w:right="0" w:firstLine="0" w:left="1134"/>
     </w:pPr>
   </w:style>
-  <w:style w:type="paragraph" w:styleId="846">
+  <w:style w:type="paragraph" w:styleId="850">
     <w:name w:val="toc 6"/>
-    <w:basedOn w:val="852"/>
-    <w:next w:val="852"/>
+    <w:basedOn w:val="856"/>
+    <w:next w:val="856"/>
     <w:uiPriority w:val="39"/>
     <w:unhideWhenUsed/>
     <w:pPr>
@@ -46180,10 +46288,10 @@
       <w:ind w:right="0" w:firstLine="0" w:left="1417"/>
     </w:pPr>
   </w:style>
-  <w:style w:type="paragraph" w:styleId="847">
+  <w:style w:type="paragraph" w:styleId="851">
     <w:name w:val="toc 7"/>
-    <w:basedOn w:val="852"/>
-    <w:next w:val="852"/>
+    <w:basedOn w:val="856"/>
+    <w:next w:val="856"/>
     <w:uiPriority w:val="39"/>
     <w:unhideWhenUsed/>
     <w:pPr>
@@ -46192,10 +46300,10 @@
       <w:ind w:right="0" w:firstLine="0" w:left="1701"/>
     </w:pPr>
   </w:style>
-  <w:style w:type="paragraph" w:styleId="848">
+  <w:style w:type="paragraph" w:styleId="852">
     <w:name w:val="toc 8"/>
-    <w:basedOn w:val="852"/>
-    <w:next w:val="852"/>
+    <w:basedOn w:val="856"/>
+    <w:next w:val="856"/>
     <w:uiPriority w:val="39"/>
     <w:unhideWhenUsed/>
     <w:pPr>
@@ -46204,10 +46312,10 @@
       <w:ind w:right="0" w:firstLine="0" w:left="1984"/>
     </w:pPr>
   </w:style>
-  <w:style w:type="paragraph" w:styleId="849">
+  <w:style w:type="paragraph" w:styleId="853">
     <w:name w:val="toc 9"/>
-    <w:basedOn w:val="852"/>
-    <w:next w:val="852"/>
+    <w:basedOn w:val="856"/>
+    <w:next w:val="856"/>
     <w:uiPriority w:val="39"/>
     <w:unhideWhenUsed/>
     <w:pPr>
@@ -46216,7 +46324,7 @@
       <w:ind w:right="0" w:firstLine="0" w:left="2268"/>
     </w:pPr>
   </w:style>
-  <w:style w:type="paragraph" w:styleId="850">
+  <w:style w:type="paragraph" w:styleId="854">
     <w:name w:val="TOC Heading"/>
     <w:uiPriority w:val="39"/>
     <w:unhideWhenUsed/>
@@ -46226,10 +46334,10 @@
       <w:ind/>
     </w:pPr>
   </w:style>
-  <w:style w:type="paragraph" w:styleId="851">
+  <w:style w:type="paragraph" w:styleId="855">
     <w:name w:val="table of figures"/>
-    <w:basedOn w:val="852"/>
-    <w:next w:val="852"/>
+    <w:basedOn w:val="856"/>
+    <w:next w:val="856"/>
     <w:uiPriority w:val="99"/>
     <w:unhideWhenUsed/>
     <w:pPr>
@@ -46238,7 +46346,7 @@
       <w:ind/>
     </w:pPr>
   </w:style>
-  <w:style w:type="paragraph" w:styleId="852" w:default="1">
+  <w:style w:type="paragraph" w:styleId="856" w:default="1">
     <w:name w:val="Normal"/>
     <w:qFormat/>
     <w:pPr>
@@ -46247,7 +46355,7 @@
       <w:ind/>
     </w:pPr>
   </w:style>
-  <w:style w:type="table" w:styleId="853" w:default="1">
+  <w:style w:type="table" w:styleId="857" w:default="1">
     <w:name w:val="Normal Table"/>
     <w:uiPriority w:val="99"/>
     <w:semiHidden/>
@@ -46440,7 +46548,7 @@
       </w:tcPr>
     </w:tblStylePr>
   </w:style>
-  <w:style w:type="numbering" w:styleId="854" w:default="1">
+  <w:style w:type="numbering" w:styleId="858" w:default="1">
     <w:name w:val="No List"/>
     <w:uiPriority w:val="99"/>
     <w:semiHidden/>
@@ -46451,9 +46559,9 @@
       <w:ind/>
     </w:pPr>
   </w:style>
-  <w:style w:type="paragraph" w:styleId="855">
+  <w:style w:type="paragraph" w:styleId="859">
     <w:name w:val="No Spacing"/>
-    <w:basedOn w:val="852"/>
+    <w:basedOn w:val="856"/>
     <w:uiPriority w:val="1"/>
     <w:qFormat/>
     <w:pPr>
@@ -46462,9 +46570,9 @@
       <w:ind/>
     </w:pPr>
   </w:style>
-  <w:style w:type="paragraph" w:styleId="856">
+  <w:style w:type="paragraph" w:styleId="860">
     <w:name w:val="List Paragraph"/>
-    <w:basedOn w:val="852"/>
+    <w:basedOn w:val="856"/>
     <w:uiPriority w:val="34"/>
     <w:qFormat/>
     <w:pPr>
@@ -46474,7 +46582,7 @@
       <w:contextualSpacing w:val="true"/>
     </w:pPr>
   </w:style>
-  <w:style w:type="character" w:styleId="857" w:default="1">
+  <w:style w:type="character" w:styleId="861" w:default="1">
     <w:name w:val="Default Paragraph Font"/>
     <w:uiPriority w:val="1"/>
     <w:semiHidden/>

</xml_diff>

<commit_message>
A bit more on design, need to finish explanation of satellites / planets and then done with classes
</commit_message>
<xml_diff>
--- a/Design.docx
+++ b/Design.docx
@@ -955,7 +955,7 @@
       <w:hyperlink r:id="rId11" w:tooltip="https://ssd.jpl.nasa.gov/api/horizons.api?format=text&amp;COMMAND='&quot;+target+&quot;'&amp;OBJ_DATA='YES'&amp;MAKE_EPHEM='YES'&amp;EPHEM_TYPE='VECTORS'&amp;START_TIME='&quot;+startTime+&quot;'&amp;STOP_TIME='&quot;+stopTime+&quot;'&amp;CENTER='500@0'&amp;STEP_SIZE='1 d'&amp;QUANTITIES='1,9,20,23,24,29'" w:history="1">
         <w:r>
           <w:rPr>
-            <w:rStyle w:val="838"/>
+            <w:rStyle w:val="881"/>
             <w:color w:val="000000" w:themeColor="text1"/>
             <w:sz w:val="22"/>
             <w:szCs w:val="18"/>
@@ -965,7 +965,7 @@
         </w:r>
         <w:r>
           <w:rPr>
-            <w:rStyle w:val="838"/>
+            <w:rStyle w:val="881"/>
             <w:color w:val="000000" w:themeColor="text1"/>
             <w:sz w:val="22"/>
             <w:szCs w:val="18"/>
@@ -974,7 +974,7 @@
         </w:r>
         <w:r>
           <w:rPr>
-            <w:rStyle w:val="838"/>
+            <w:rStyle w:val="881"/>
             <w:color w:val="000000" w:themeColor="text1"/>
             <w:sz w:val="22"/>
             <w:szCs w:val="18"/>
@@ -1115,7 +1115,7 @@
       <w:hyperlink r:id="rId12" w:tooltip="https://ssd-api.jpl.nasa.gov/doc/horizons.html#ephem_type" w:history="1">
         <w:r>
           <w:rPr>
-            <w:rStyle w:val="838"/>
+            <w:rStyle w:val="881"/>
             <w:color w:val="000000" w:themeColor="text1"/>
             <w:sz w:val="22"/>
             <w:szCs w:val="22"/>
@@ -1125,7 +1125,7 @@
         </w:r>
         <w:r>
           <w:rPr>
-            <w:rStyle w:val="838"/>
+            <w:rStyle w:val="881"/>
             <w:color w:val="000000" w:themeColor="text1"/>
             <w:sz w:val="22"/>
             <w:szCs w:val="22"/>
@@ -1134,7 +1134,7 @@
         </w:r>
         <w:r>
           <w:rPr>
-            <w:rStyle w:val="838"/>
+            <w:rStyle w:val="881"/>
             <w:color w:val="000000" w:themeColor="text1"/>
             <w:sz w:val="22"/>
             <w:szCs w:val="22"/>
@@ -2626,7 +2626,7 @@
     </w:p>
     <w:p>
       <w:pPr>
-        <w:pStyle w:val="860"/>
+        <w:pStyle w:val="903"/>
         <w:numPr>
           <w:ilvl w:val="0"/>
           <w:numId w:val="2"/>
@@ -2669,7 +2669,7 @@
     </w:p>
     <w:p>
       <w:pPr>
-        <w:pStyle w:val="860"/>
+        <w:pStyle w:val="903"/>
         <w:numPr>
           <w:ilvl w:val="0"/>
           <w:numId w:val="2"/>
@@ -3864,7 +3864,16 @@
           <w:szCs w:val="22"/>
           <w:highlight w:val="none"/>
         </w:rPr>
-        <w:t xml:space="preserve">s worse for readability and makes it less clear what the code is doing.) I also need to calculate logarithms for non-linear scaling when drawing force arrows (this will be explained more in the display section), for which I definitely need the math module. Logs will also be used at one point for changing the value of G, so that the changes are always relative to the order of magnitude at G at that point (explained later down in input section.)</w:t>
+        <w:t xml:space="preserve">s worse for readability and makes it less clear what the code is doing.) I also need to calculate logarithms for non-linear scaling when drawing force arrows (this will be explained more in t</w:t>
+      </w:r>
+      <w:r>
+        <w:rPr>
+          <w:color w:val="000000" w:themeColor="text1"/>
+          <w:sz w:val="22"/>
+          <w:szCs w:val="22"/>
+          <w:highlight w:val="none"/>
+        </w:rPr>
+        <w:t xml:space="preserve">he display section), for which I definitely need the math module. Logs will also be used at one point for changing the value of G, so that the changes are always relative to the order of magnitude at G at that point (explained later down in input section.)</w:t>
       </w:r>
       <w:r>
         <w:rPr>
@@ -4185,7 +4194,7 @@
     </w:p>
     <w:p>
       <w:pPr>
-        <w:pStyle w:val="860"/>
+        <w:pStyle w:val="903"/>
         <w:numPr>
           <w:ilvl w:val="0"/>
           <w:numId w:val="1"/>
@@ -4228,7 +4237,7 @@
     </w:p>
     <w:p>
       <w:pPr>
-        <w:pStyle w:val="860"/>
+        <w:pStyle w:val="903"/>
         <w:numPr>
           <w:ilvl w:val="0"/>
           <w:numId w:val="1"/>
@@ -4271,7 +4280,7 @@
     </w:p>
     <w:p>
       <w:pPr>
-        <w:pStyle w:val="860"/>
+        <w:pStyle w:val="903"/>
         <w:numPr>
           <w:ilvl w:val="0"/>
           <w:numId w:val="1"/>
@@ -4314,7 +4323,7 @@
     </w:p>
     <w:p>
       <w:pPr>
-        <w:pStyle w:val="860"/>
+        <w:pStyle w:val="903"/>
         <w:numPr>
           <w:ilvl w:val="0"/>
           <w:numId w:val="1"/>
@@ -5712,7 +5721,7 @@
     </w:p>
     <w:tbl>
       <w:tblPr>
-        <w:tblStyle w:val="712"/>
+        <w:tblStyle w:val="755"/>
         <w:tblW w:w="0" w:type="auto"/>
         <w:tblBorders/>
         <w:tblLook w:val="04A0" w:firstRow="1" w:lastRow="0" w:firstColumn="1" w:lastColumn="0" w:noHBand="0" w:noVBand="1"/>
@@ -7973,7 +7982,7 @@
     </w:p>
     <w:p>
       <w:pPr>
-        <w:pStyle w:val="860"/>
+        <w:pStyle w:val="903"/>
         <w:numPr>
           <w:ilvl w:val="0"/>
           <w:numId w:val="4"/>
@@ -8016,7 +8025,7 @@
     </w:p>
     <w:p>
       <w:pPr>
-        <w:pStyle w:val="860"/>
+        <w:pStyle w:val="903"/>
         <w:numPr>
           <w:ilvl w:val="0"/>
           <w:numId w:val="4"/>
@@ -8059,7 +8068,7 @@
     </w:p>
     <w:p>
       <w:pPr>
-        <w:pStyle w:val="860"/>
+        <w:pStyle w:val="903"/>
         <w:numPr>
           <w:ilvl w:val="0"/>
           <w:numId w:val="4"/>
@@ -8102,7 +8111,7 @@
     </w:p>
     <w:p>
       <w:pPr>
-        <w:pStyle w:val="860"/>
+        <w:pStyle w:val="903"/>
         <w:numPr>
           <w:ilvl w:val="0"/>
           <w:numId w:val="4"/>
@@ -8145,7 +8154,7 @@
     </w:p>
     <w:p>
       <w:pPr>
-        <w:pStyle w:val="860"/>
+        <w:pStyle w:val="903"/>
         <w:numPr>
           <w:ilvl w:val="0"/>
           <w:numId w:val="4"/>
@@ -8319,6 +8328,656 @@
         </w:rPr>
         <w:t xml:space="preserve">t entries in the list whenever we add a record, so that the list of positions doesn’t grow indefinitely. addRecord() will use the line length to shorten the list whenever it gets too long. Here is a pseudocode snippet that demonstrates how that might work:</w:t>
       </w:r>
+      <w:r>
+        <w:rPr>
+          <w:color w:val="000000"/>
+          <w:sz w:val="22"/>
+          <w:szCs w:val="22"/>
+          <w:highlight w:val="none"/>
+        </w:rPr>
+      </w:r>
+      <w:r>
+        <w:rPr>
+          <w:color w:val="000000"/>
+          <w:sz w:val="22"/>
+          <w:szCs w:val="22"/>
+          <w:highlight w:val="none"/>
+        </w:rPr>
+      </w:r>
+    </w:p>
+    <w:p>
+      <w:pPr>
+        <w:pBdr/>
+        <w:spacing/>
+        <w:ind/>
+        <w:rPr>
+          <w:color w:val="000000"/>
+          <w:sz w:val="22"/>
+          <w:szCs w:val="22"/>
+          <w:highlight w:val="none"/>
+        </w:rPr>
+      </w:pPr>
+      <w:r>
+        <w:rPr>
+          <w:color w:val="000000"/>
+          <w:sz w:val="22"/>
+          <w:szCs w:val="22"/>
+          <w:highlight w:val="none"/>
+        </w:rPr>
+      </w:r>
+      <w:r>
+        <mc:AlternateContent>
+          <mc:Choice Requires="wpg">
+            <w:drawing>
+              <wp:inline xmlns:wp="http://schemas.openxmlformats.org/drawingml/2006/wordprocessingDrawing" distT="0" distB="0" distL="0" distR="0">
+                <wp:extent cx="5940425" cy="1051470"/>
+                <wp:effectExtent l="0" t="0" r="0" b="0"/>
+                <wp:docPr id="16" name=""/>
+                <wp:cNvGraphicFramePr>
+                  <a:graphicFrameLocks xmlns:a="http://schemas.openxmlformats.org/drawingml/2006/main" noChangeAspect="1"/>
+                </wp:cNvGraphicFramePr>
+                <a:graphic xmlns:a="http://schemas.openxmlformats.org/drawingml/2006/main">
+                  <a:graphicData uri="http://schemas.openxmlformats.org/drawingml/2006/picture">
+                    <pic:pic xmlns:pic="http://schemas.openxmlformats.org/drawingml/2006/picture">
+                      <pic:nvPicPr>
+                        <pic:cNvPr id="1816764814" name=""/>
+                        <pic:cNvPicPr>
+                          <a:picLocks noChangeAspect="1"/>
+                        </pic:cNvPicPr>
+                        <pic:nvPr/>
+                      </pic:nvPicPr>
+                      <pic:blipFill>
+                        <a:blip r:embed="rId27"/>
+                        <a:stretch/>
+                      </pic:blipFill>
+                      <pic:spPr bwMode="auto">
+                        <a:xfrm>
+                          <a:off x="0" y="0"/>
+                          <a:ext cx="5940424" cy="1051470"/>
+                        </a:xfrm>
+                        <a:prstGeom prst="rect">
+                          <a:avLst/>
+                        </a:prstGeom>
+                      </pic:spPr>
+                    </pic:pic>
+                  </a:graphicData>
+                </a:graphic>
+              </wp:inline>
+            </w:drawing>
+          </mc:Choice>
+          <mc:Fallback>
+            <w:pict>
+              <v:shapetype id="_x0000_t75" coordsize="21600,21600" o:spt="75" o:preferrelative="t" path="m@4@5l@4@11@9@11@9@5xe" filled="f" stroked="f">
+                <v:stroke joinstyle="miter"/>
+                <v:formulas>
+                  <v:f eqn="if lineDrawn pixelLineWidth 0"/>
+                  <v:f eqn="sum @0 1 0"/>
+                  <v:f eqn="sum 0 0 @1"/>
+                  <v:f eqn="prod @2 1 2"/>
+                  <v:f eqn="prod @3 21600 pixelWidth"/>
+                  <v:f eqn="prod @3 21600 pixelHeight"/>
+                  <v:f eqn="sum @0 0 1"/>
+                  <v:f eqn="prod @6 1 2"/>
+                  <v:f eqn="prod @7 21600 pixelWidth"/>
+                  <v:f eqn="sum @8 21600 0"/>
+                  <v:f eqn="prod @7 21600 pixelHeight"/>
+                  <v:f eqn="sum @10 21600 0"/>
+                </v:formulas>
+                <v:path o:extrusionok="f" gradientshapeok="t" o:connecttype="rect"/>
+                <o:lock v:ext="edit" aspectratio="t"/>
+              </v:shapetype>
+              <v:shape id="_x0000_i15" o:spid="_x0000_s15" type="#_x0000_t75" style="width:467.75pt;height:82.79pt;mso-wrap-distance-left:0.00pt;mso-wrap-distance-top:0.00pt;mso-wrap-distance-right:0.00pt;mso-wrap-distance-bottom:0.00pt;z-index:1;" stroked="false">
+                <v:imagedata r:id="rId27" o:title=""/>
+                <o:lock v:ext="edit" rotation="t"/>
+              </v:shape>
+            </w:pict>
+          </mc:Fallback>
+        </mc:AlternateContent>
+      </w:r>
+      <w:r>
+        <w:rPr>
+          <w:color w:val="000000"/>
+          <w:sz w:val="22"/>
+          <w:szCs w:val="22"/>
+          <w:highlight w:val="none"/>
+        </w:rPr>
+      </w:r>
+      <w:r>
+        <w:rPr>
+          <w:color w:val="000000"/>
+          <w:sz w:val="22"/>
+          <w:szCs w:val="22"/>
+          <w:highlight w:val="none"/>
+        </w:rPr>
+      </w:r>
+    </w:p>
+    <w:p>
+      <w:pPr>
+        <w:pBdr/>
+        <w:spacing/>
+        <w:ind/>
+        <w:rPr>
+          <w:color w:val="000000"/>
+          <w:sz w:val="22"/>
+          <w:szCs w:val="22"/>
+          <w:highlight w:val="none"/>
+        </w:rPr>
+      </w:pPr>
+      <w:r>
+        <w:rPr>
+          <w:color w:val="000000"/>
+          <w:sz w:val="22"/>
+          <w:szCs w:val="22"/>
+          <w:highlight w:val="none"/>
+        </w:rPr>
+        <w:t xml:space="preserve">So e.g. if LINE_LENGTH was 10 and records was 11 long, then it would set records to be records[11-10:] which means all but the first element of records, so it would be back to 10 elements like we wanted.</w:t>
+      </w:r>
+      <w:r>
+        <w:rPr>
+          <w:color w:val="000000"/>
+          <w:sz w:val="22"/>
+          <w:szCs w:val="22"/>
+          <w:highlight w:val="none"/>
+        </w:rPr>
+      </w:r>
+    </w:p>
+    <w:p>
+      <w:pPr>
+        <w:pBdr/>
+        <w:spacing/>
+        <w:ind/>
+        <w:rPr>
+          <w:color w:val="000000"/>
+          <w:sz w:val="22"/>
+          <w:szCs w:val="22"/>
+          <w:highlight w:val="none"/>
+        </w:rPr>
+      </w:pPr>
+      <w:r>
+        <w:rPr>
+          <w:color w:val="000000"/>
+          <w:sz w:val="22"/>
+          <w:szCs w:val="22"/>
+          <w:highlight w:val="none"/>
+        </w:rPr>
+      </w:r>
+      <w:r>
+        <w:rPr>
+          <w:color w:val="000000"/>
+          <w:sz w:val="22"/>
+          <w:szCs w:val="22"/>
+          <w:highlight w:val="none"/>
+        </w:rPr>
+      </w:r>
+    </w:p>
+    <w:p>
+      <w:pPr>
+        <w:pBdr/>
+        <w:spacing/>
+        <w:ind/>
+        <w:rPr>
+          <w:color w:val="000000"/>
+          <w:sz w:val="22"/>
+          <w:szCs w:val="22"/>
+          <w:highlight w:val="none"/>
+        </w:rPr>
+      </w:pPr>
+      <w:r>
+        <w:rPr>
+          <w:color w:val="000000"/>
+          <w:sz w:val="22"/>
+          <w:szCs w:val="22"/>
+          <w:highlight w:val="none"/>
+        </w:rPr>
+        <w:t xml:space="preserve">Keeping a record of the arrows is fairly similar. We want to draw arrows from one planet displaying the forces on it from the other planets, and also an arrow displaying the resultant force. This means we need to draw one arrow for every planet in the system except the one we’ve selected, as well as an arrow displaying the resultant force. This means overall the amount of arrows drawn should be the same as the amount of planets in the system, so we can use the same kind of code as with records to reset the length, we just replace LINE_LENGTH with len(planets).</w:t>
+      </w:r>
+      <w:r>
+        <w:rPr>
+          <w:color w:val="000000"/>
+          <w:sz w:val="22"/>
+          <w:szCs w:val="22"/>
+          <w:highlight w:val="none"/>
+        </w:rPr>
+      </w:r>
+    </w:p>
+    <w:p>
+      <w:pPr>
+        <w:pBdr/>
+        <w:spacing/>
+        <w:ind/>
+        <w:rPr>
+          <w:color w:val="000000"/>
+          <w:sz w:val="22"/>
+          <w:szCs w:val="22"/>
+          <w:highlight w:val="none"/>
+        </w:rPr>
+      </w:pPr>
+      <w:r>
+        <w:rPr>
+          <w:color w:val="000000"/>
+          <w:sz w:val="22"/>
+          <w:szCs w:val="22"/>
+          <w:highlight w:val="none"/>
+        </w:rPr>
+      </w:r>
+      <w:r>
+        <w:rPr>
+          <w:color w:val="000000"/>
+          <w:sz w:val="22"/>
+          <w:szCs w:val="22"/>
+          <w:highlight w:val="none"/>
+        </w:rPr>
+      </w:r>
+    </w:p>
+    <w:p>
+      <w:pPr>
+        <w:pBdr/>
+        <w:spacing/>
+        <w:ind/>
+        <w:rPr>
+          <w:color w:val="000000"/>
+          <w:sz w:val="22"/>
+          <w:szCs w:val="22"/>
+          <w:highlight w:val="none"/>
+        </w:rPr>
+      </w:pPr>
+      <w:r>
+        <w:rPr>
+          <w:color w:val="000000"/>
+          <w:sz w:val="22"/>
+          <w:szCs w:val="22"/>
+          <w:highlight w:val="none"/>
+        </w:rPr>
+        <w:t xml:space="preserve">Keeping a record of their physical attributes like kinetic energy and momentum will be done by having an attribute for each property we want to measure, resetting all the attributes to 0 at the start of a tick and then calculating the attributes during the tick. This will be explained in the physics section as they are done at the same time as working out all the physics</w:t>
+      </w:r>
+      <w:r>
+        <w:rPr>
+          <w:color w:val="000000"/>
+          <w:sz w:val="22"/>
+          <w:szCs w:val="22"/>
+          <w:highlight w:val="none"/>
+        </w:rPr>
+      </w:r>
+    </w:p>
+    <w:p>
+      <w:pPr>
+        <w:pBdr/>
+        <w:spacing/>
+        <w:ind/>
+        <w:rPr>
+          <w:color w:val="000000"/>
+          <w:sz w:val="22"/>
+          <w:szCs w:val="22"/>
+          <w:highlight w:val="none"/>
+        </w:rPr>
+      </w:pPr>
+      <w:r>
+        <w:rPr>
+          <w:color w:val="000000"/>
+          <w:sz w:val="22"/>
+          <w:szCs w:val="22"/>
+          <w:highlight w:val="none"/>
+        </w:rPr>
+      </w:r>
+      <w:r>
+        <w:rPr>
+          <w:color w:val="000000"/>
+          <w:sz w:val="22"/>
+          <w:szCs w:val="22"/>
+          <w:highlight w:val="none"/>
+        </w:rPr>
+      </w:r>
+    </w:p>
+    <w:p>
+      <w:pPr>
+        <w:pBdr/>
+        <w:spacing/>
+        <w:ind/>
+        <w:rPr>
+          <w:color w:val="2f5496" w:themeColor="accent5" w:themeShade="BF"/>
+          <w:sz w:val="22"/>
+          <w:szCs w:val="22"/>
+          <w:highlight w:val="none"/>
+        </w:rPr>
+      </w:pPr>
+      <w:r>
+        <w:rPr>
+          <w:color w:val="2f5496" w:themeColor="accent5" w:themeShade="BF"/>
+          <w:sz w:val="24"/>
+          <w:szCs w:val="20"/>
+          <w:highlight w:val="none"/>
+        </w:rPr>
+        <w:t xml:space="preserve">Satellite / planet</w:t>
+      </w:r>
+      <w:r>
+        <w:rPr>
+          <w:color w:val="000000"/>
+          <w:sz w:val="22"/>
+          <w:szCs w:val="22"/>
+          <w:highlight w:val="none"/>
+        </w:rPr>
+      </w:r>
+      <w:r>
+        <w:rPr>
+          <w:color w:val="2f5496" w:themeColor="accent5" w:themeShade="BF"/>
+          <w:sz w:val="22"/>
+          <w:szCs w:val="22"/>
+          <w:highlight w:val="none"/>
+        </w:rPr>
+      </w:r>
+    </w:p>
+    <w:p>
+      <w:pPr>
+        <w:pBdr/>
+        <w:spacing/>
+        <w:ind/>
+        <w:rPr>
+          <w:color w:val="000000"/>
+          <w:sz w:val="22"/>
+          <w:szCs w:val="22"/>
+          <w:highlight w:val="none"/>
+        </w:rPr>
+      </w:pPr>
+      <w:r>
+        <w:rPr>
+          <w:color w:val="000000"/>
+          <w:sz w:val="22"/>
+          <w:szCs w:val="22"/>
+          <w:highlight w:val="none"/>
+        </w:rPr>
+        <w:t xml:space="preserve">These classes are both subclasses of celestialBody. The distinction between planet and satellite in my program is a bit different than how the words are used in normal life.</w:t>
+      </w:r>
+      <w:r>
+        <w:rPr>
+          <w:color w:val="000000"/>
+          <w:sz w:val="22"/>
+          <w:szCs w:val="22"/>
+          <w:highlight w:val="none"/>
+        </w:rPr>
+      </w:r>
+    </w:p>
+    <w:p>
+      <w:pPr>
+        <w:pBdr/>
+        <w:spacing/>
+        <w:ind/>
+        <w:rPr>
+          <w:color w:val="000000"/>
+          <w:sz w:val="22"/>
+          <w:szCs w:val="22"/>
+          <w:highlight w:val="none"/>
+        </w:rPr>
+      </w:pPr>
+      <w:r>
+        <w:rPr>
+          <w:color w:val="000000"/>
+          <w:sz w:val="22"/>
+          <w:szCs w:val="22"/>
+          <w:highlight w:val="none"/>
+        </w:rPr>
+      </w:r>
+      <w:r>
+        <w:rPr>
+          <w:color w:val="000000"/>
+          <w:sz w:val="22"/>
+          <w:szCs w:val="22"/>
+          <w:highlight w:val="none"/>
+        </w:rPr>
+      </w:r>
+    </w:p>
+    <w:p>
+      <w:pPr>
+        <w:pBdr/>
+        <w:spacing/>
+        <w:ind/>
+        <w:rPr>
+          <w:color w:val="000000"/>
+          <w:sz w:val="22"/>
+          <w:szCs w:val="22"/>
+          <w:highlight w:val="none"/>
+        </w:rPr>
+      </w:pPr>
+      <w:r>
+        <w:rPr>
+          <w:highlight w:val="none"/>
+        </w:rPr>
+      </w:r>
+      <w:r>
+        <w:rPr>
+          <w:highlight w:val="none"/>
+        </w:rPr>
+      </w:r>
+    </w:p>
+    <w:p>
+      <w:pPr>
+        <w:pBdr/>
+        <w:spacing/>
+        <w:ind/>
+        <w:rPr>
+          <w:highlight w:val="none"/>
+        </w:rPr>
+      </w:pPr>
+      <w:r>
+        <w:rPr>
+          <w:color w:val="000000"/>
+          <w:sz w:val="22"/>
+          <w:szCs w:val="22"/>
+          <w:highlight w:val="none"/>
+        </w:rPr>
+      </w:r>
+      <w:r>
+        <mc:AlternateContent>
+          <mc:Choice Requires="wpg">
+            <w:drawing>
+              <wp:inline xmlns:wp="http://schemas.openxmlformats.org/drawingml/2006/wordprocessingDrawing" distT="0" distB="0" distL="0" distR="0">
+                <wp:extent cx="5940425" cy="4131895"/>
+                <wp:effectExtent l="0" t="0" r="0" b="0"/>
+                <wp:docPr id="17" name=""/>
+                <wp:cNvGraphicFramePr>
+                  <a:graphicFrameLocks xmlns:a="http://schemas.openxmlformats.org/drawingml/2006/main" noChangeAspect="1"/>
+                </wp:cNvGraphicFramePr>
+                <a:graphic xmlns:a="http://schemas.openxmlformats.org/drawingml/2006/main">
+                  <a:graphicData uri="http://schemas.openxmlformats.org/drawingml/2006/picture">
+                    <pic:pic xmlns:pic="http://schemas.openxmlformats.org/drawingml/2006/picture">
+                      <pic:nvPicPr>
+                        <pic:cNvPr id="1701633401" name=""/>
+                        <pic:cNvPicPr>
+                          <a:picLocks noChangeAspect="1"/>
+                        </pic:cNvPicPr>
+                        <pic:nvPr/>
+                      </pic:nvPicPr>
+                      <pic:blipFill>
+                        <a:blip r:embed="rId28"/>
+                        <a:stretch/>
+                      </pic:blipFill>
+                      <pic:spPr bwMode="auto">
+                        <a:xfrm>
+                          <a:off x="0" y="0"/>
+                          <a:ext cx="5940424" cy="4131895"/>
+                        </a:xfrm>
+                        <a:prstGeom prst="rect">
+                          <a:avLst/>
+                        </a:prstGeom>
+                      </pic:spPr>
+                    </pic:pic>
+                  </a:graphicData>
+                </a:graphic>
+              </wp:inline>
+            </w:drawing>
+          </mc:Choice>
+          <mc:Fallback>
+            <w:pict>
+              <v:shapetype id="_x0000_t75" coordsize="21600,21600" o:spt="75" o:preferrelative="t" path="m@4@5l@4@11@9@11@9@5xe" filled="f" stroked="f">
+                <v:stroke joinstyle="miter"/>
+                <v:formulas>
+                  <v:f eqn="if lineDrawn pixelLineWidth 0"/>
+                  <v:f eqn="sum @0 1 0"/>
+                  <v:f eqn="sum 0 0 @1"/>
+                  <v:f eqn="prod @2 1 2"/>
+                  <v:f eqn="prod @3 21600 pixelWidth"/>
+                  <v:f eqn="prod @3 21600 pixelHeight"/>
+                  <v:f eqn="sum @0 0 1"/>
+                  <v:f eqn="prod @6 1 2"/>
+                  <v:f eqn="prod @7 21600 pixelWidth"/>
+                  <v:f eqn="sum @8 21600 0"/>
+                  <v:f eqn="prod @7 21600 pixelHeight"/>
+                  <v:f eqn="sum @10 21600 0"/>
+                </v:formulas>
+                <v:path o:extrusionok="f" gradientshapeok="t" o:connecttype="rect"/>
+                <o:lock v:ext="edit" aspectratio="t"/>
+              </v:shapetype>
+              <v:shape id="_x0000_i16" o:spid="_x0000_s16" type="#_x0000_t75" style="width:467.75pt;height:325.35pt;mso-wrap-distance-left:0.00pt;mso-wrap-distance-top:0.00pt;mso-wrap-distance-right:0.00pt;mso-wrap-distance-bottom:0.00pt;z-index:1;" stroked="false">
+                <v:imagedata r:id="rId28" o:title=""/>
+                <o:lock v:ext="edit" rotation="t"/>
+              </v:shape>
+            </w:pict>
+          </mc:Fallback>
+        </mc:AlternateContent>
+      </w:r>
+      <w:r>
+        <w:rPr>
+          <w:color w:val="000000"/>
+          <w:sz w:val="22"/>
+          <w:szCs w:val="22"/>
+          <w:highlight w:val="none"/>
+        </w:rPr>
+      </w:r>
+      <w:r>
+        <w:rPr>
+          <w:color w:val="000000"/>
+          <w:sz w:val="22"/>
+          <w:szCs w:val="22"/>
+          <w:highlight w:val="none"/>
+        </w:rPr>
+      </w:r>
+    </w:p>
+    <w:p>
+      <w:pPr>
+        <w:pBdr/>
+        <w:spacing/>
+        <w:ind/>
+        <w:rPr>
+          <w:color w:val="000000"/>
+          <w:sz w:val="22"/>
+          <w:szCs w:val="22"/>
+          <w:highlight w:val="none"/>
+        </w:rPr>
+      </w:pPr>
+      <w:r>
+        <w:rPr>
+          <w:color w:val="000000"/>
+          <w:sz w:val="22"/>
+          <w:szCs w:val="22"/>
+          <w:highlight w:val="none"/>
+        </w:rPr>
+      </w:r>
+      <w:r>
+        <w:rPr>
+          <w:color w:val="000000"/>
+          <w:sz w:val="22"/>
+          <w:szCs w:val="22"/>
+          <w:highlight w:val="none"/>
+        </w:rPr>
+      </w:r>
+    </w:p>
+    <w:p>
+      <w:pPr>
+        <w:pBdr/>
+        <w:spacing/>
+        <w:ind/>
+        <w:rPr>
+          <w:color w:val="000000"/>
+          <w:sz w:val="22"/>
+          <w:szCs w:val="22"/>
+          <w:highlight w:val="none"/>
+        </w:rPr>
+      </w:pPr>
+      <w:r>
+        <w:rPr>
+          <w:color w:val="000000"/>
+          <w:sz w:val="22"/>
+          <w:szCs w:val="22"/>
+          <w:highlight w:val="none"/>
+        </w:rPr>
+      </w:r>
+      <w:r>
+        <mc:AlternateContent>
+          <mc:Choice Requires="wpg">
+            <w:drawing>
+              <wp:inline xmlns:wp="http://schemas.openxmlformats.org/drawingml/2006/wordprocessingDrawing" distT="0" distB="0" distL="0" distR="0">
+                <wp:extent cx="5940425" cy="6449433"/>
+                <wp:effectExtent l="0" t="0" r="0" b="0"/>
+                <wp:docPr id="18" name=""/>
+                <wp:cNvGraphicFramePr>
+                  <a:graphicFrameLocks xmlns:a="http://schemas.openxmlformats.org/drawingml/2006/main" noChangeAspect="1"/>
+                </wp:cNvGraphicFramePr>
+                <a:graphic xmlns:a="http://schemas.openxmlformats.org/drawingml/2006/main">
+                  <a:graphicData uri="http://schemas.openxmlformats.org/drawingml/2006/picture">
+                    <pic:pic xmlns:pic="http://schemas.openxmlformats.org/drawingml/2006/picture">
+                      <pic:nvPicPr>
+                        <pic:cNvPr id="1593683200" name=""/>
+                        <pic:cNvPicPr>
+                          <a:picLocks noChangeAspect="1"/>
+                        </pic:cNvPicPr>
+                        <pic:nvPr/>
+                      </pic:nvPicPr>
+                      <pic:blipFill>
+                        <a:blip r:embed="rId29"/>
+                        <a:stretch/>
+                      </pic:blipFill>
+                      <pic:spPr bwMode="auto">
+                        <a:xfrm>
+                          <a:off x="0" y="0"/>
+                          <a:ext cx="5940424" cy="6449433"/>
+                        </a:xfrm>
+                        <a:prstGeom prst="rect">
+                          <a:avLst/>
+                        </a:prstGeom>
+                      </pic:spPr>
+                    </pic:pic>
+                  </a:graphicData>
+                </a:graphic>
+              </wp:inline>
+            </w:drawing>
+          </mc:Choice>
+          <mc:Fallback>
+            <w:pict>
+              <v:shapetype id="_x0000_t75" coordsize="21600,21600" o:spt="75" o:preferrelative="t" path="m@4@5l@4@11@9@11@9@5xe" filled="f" stroked="f">
+                <v:stroke joinstyle="miter"/>
+                <v:formulas>
+                  <v:f eqn="if lineDrawn pixelLineWidth 0"/>
+                  <v:f eqn="sum @0 1 0"/>
+                  <v:f eqn="sum 0 0 @1"/>
+                  <v:f eqn="prod @2 1 2"/>
+                  <v:f eqn="prod @3 21600 pixelWidth"/>
+                  <v:f eqn="prod @3 21600 pixelHeight"/>
+                  <v:f eqn="sum @0 0 1"/>
+                  <v:f eqn="prod @6 1 2"/>
+                  <v:f eqn="prod @7 21600 pixelWidth"/>
+                  <v:f eqn="sum @8 21600 0"/>
+                  <v:f eqn="prod @7 21600 pixelHeight"/>
+                  <v:f eqn="sum @10 21600 0"/>
+                </v:formulas>
+                <v:path o:extrusionok="f" gradientshapeok="t" o:connecttype="rect"/>
+                <o:lock v:ext="edit" aspectratio="t"/>
+              </v:shapetype>
+              <v:shape id="_x0000_i17" o:spid="_x0000_s17" type="#_x0000_t75" style="width:467.75pt;height:507.83pt;mso-wrap-distance-left:0.00pt;mso-wrap-distance-top:0.00pt;mso-wrap-distance-right:0.00pt;mso-wrap-distance-bottom:0.00pt;z-index:1;" stroked="false">
+                <v:imagedata r:id="rId29" o:title=""/>
+                <o:lock v:ext="edit" rotation="t"/>
+              </v:shape>
+            </w:pict>
+          </mc:Fallback>
+        </mc:AlternateContent>
+      </w:r>
+      <w:r>
+        <w:rPr>
+          <w:color w:val="000000"/>
+          <w:sz w:val="22"/>
+          <w:szCs w:val="22"/>
+          <w:highlight w:val="none"/>
+        </w:rPr>
+      </w:r>
+      <w:r/>
       <w:r>
         <w:rPr>
           <w:color w:val="000000"/>
@@ -8444,7 +9103,7 @@
               <wp:inline xmlns:wp="http://schemas.openxmlformats.org/drawingml/2006/wordprocessingDrawing" distT="0" distB="0" distL="0" distR="0">
                 <wp:extent cx="5225415" cy="3346555"/>
                 <wp:effectExtent l="0" t="0" r="0" b="0"/>
-                <wp:docPr id="16" name="" hidden="0"/>
+                <wp:docPr id="19" name="" hidden="0"/>
                 <wp:cNvGraphicFramePr>
                   <a:graphicFrameLocks xmlns:a="http://schemas.openxmlformats.org/drawingml/2006/main" noChangeAspect="1"/>
                 </wp:cNvGraphicFramePr>
@@ -8459,7 +9118,7 @@
                         <pic:nvPr isPhoto="0" userDrawn="0"/>
                       </pic:nvPicPr>
                       <pic:blipFill>
-                        <a:blip r:embed="rId27"/>
+                        <a:blip r:embed="rId30"/>
                         <a:stretch/>
                       </pic:blipFill>
                       <pic:spPr bwMode="auto">
@@ -8498,8 +9157,8 @@
                 <v:path o:extrusionok="f" gradientshapeok="t" o:connecttype="rect"/>
                 <o:lock v:ext="edit" aspectratio="t"/>
               </v:shapetype>
-              <v:shape id="_x0000_i15" o:spid="_x0000_s15" type="#_x0000_t75" style="width:411.45pt;height:263.51pt;mso-wrap-distance-left:0.00pt;mso-wrap-distance-top:0.00pt;mso-wrap-distance-right:0.00pt;mso-wrap-distance-bottom:0.00pt;rotation:0;z-index:1;" stroked="false">
-                <v:imagedata r:id="rId27" o:title=""/>
+              <v:shape id="_x0000_i18" o:spid="_x0000_s18" type="#_x0000_t75" style="width:411.45pt;height:263.51pt;mso-wrap-distance-left:0.00pt;mso-wrap-distance-top:0.00pt;mso-wrap-distance-right:0.00pt;mso-wrap-distance-bottom:0.00pt;rotation:0;z-index:1;" stroked="false">
+                <v:imagedata r:id="rId30" o:title=""/>
                 <o:lock v:ext="edit" rotation="t"/>
               </v:shape>
             </w:pict>
@@ -9354,7 +10013,7 @@
               <wp:inline xmlns:wp="http://schemas.openxmlformats.org/drawingml/2006/wordprocessingDrawing" distT="0" distB="0" distL="0" distR="0">
                 <wp:extent cx="5940425" cy="5188838"/>
                 <wp:effectExtent l="0" t="0" r="0" b="0"/>
-                <wp:docPr id="17" name=""/>
+                <wp:docPr id="20" name=""/>
                 <wp:cNvGraphicFramePr>
                   <a:graphicFrameLocks xmlns:a="http://schemas.openxmlformats.org/drawingml/2006/main" noChangeAspect="1"/>
                 </wp:cNvGraphicFramePr>
@@ -9369,7 +10028,7 @@
                         <pic:nvPr/>
                       </pic:nvPicPr>
                       <pic:blipFill>
-                        <a:blip r:embed="rId28"/>
+                        <a:blip r:embed="rId31"/>
                         <a:stretch/>
                       </pic:blipFill>
                       <pic:spPr bwMode="auto">
@@ -9408,8 +10067,8 @@
                 <v:path o:extrusionok="f" gradientshapeok="t" o:connecttype="rect"/>
                 <o:lock v:ext="edit" aspectratio="t"/>
               </v:shapetype>
-              <v:shape id="_x0000_i16" o:spid="_x0000_s16" type="#_x0000_t75" style="width:467.75pt;height:408.57pt;mso-wrap-distance-left:0.00pt;mso-wrap-distance-top:0.00pt;mso-wrap-distance-right:0.00pt;mso-wrap-distance-bottom:0.00pt;z-index:1;" stroked="false">
-                <v:imagedata r:id="rId28" o:title=""/>
+              <v:shape id="_x0000_i19" o:spid="_x0000_s19" type="#_x0000_t75" style="width:467.75pt;height:408.57pt;mso-wrap-distance-left:0.00pt;mso-wrap-distance-top:0.00pt;mso-wrap-distance-right:0.00pt;mso-wrap-distance-bottom:0.00pt;z-index:1;" stroked="false">
+                <v:imagedata r:id="rId31" o:title=""/>
                 <o:lock v:ext="edit" rotation="t"/>
               </v:shape>
             </w:pict>
@@ -9460,7 +10119,7 @@
               <wp:inline xmlns:wp="http://schemas.openxmlformats.org/drawingml/2006/wordprocessingDrawing" distT="0" distB="0" distL="0" distR="0">
                 <wp:extent cx="5940425" cy="1809567"/>
                 <wp:effectExtent l="0" t="0" r="0" b="0"/>
-                <wp:docPr id="18" name=""/>
+                <wp:docPr id="21" name=""/>
                 <wp:cNvGraphicFramePr>
                   <a:graphicFrameLocks xmlns:a="http://schemas.openxmlformats.org/drawingml/2006/main" noChangeAspect="1"/>
                 </wp:cNvGraphicFramePr>
@@ -9475,7 +10134,7 @@
                         <pic:nvPr/>
                       </pic:nvPicPr>
                       <pic:blipFill>
-                        <a:blip r:embed="rId29"/>
+                        <a:blip r:embed="rId32"/>
                         <a:stretch/>
                       </pic:blipFill>
                       <pic:spPr bwMode="auto">
@@ -9514,8 +10173,8 @@
                 <v:path o:extrusionok="f" gradientshapeok="t" o:connecttype="rect"/>
                 <o:lock v:ext="edit" aspectratio="t"/>
               </v:shapetype>
-              <v:shape id="_x0000_i17" o:spid="_x0000_s17" type="#_x0000_t75" style="width:467.75pt;height:142.49pt;mso-wrap-distance-left:0.00pt;mso-wrap-distance-top:0.00pt;mso-wrap-distance-right:0.00pt;mso-wrap-distance-bottom:0.00pt;z-index:1;" stroked="false">
-                <v:imagedata r:id="rId29" o:title=""/>
+              <v:shape id="_x0000_i20" o:spid="_x0000_s20" type="#_x0000_t75" style="width:467.75pt;height:142.49pt;mso-wrap-distance-left:0.00pt;mso-wrap-distance-top:0.00pt;mso-wrap-distance-right:0.00pt;mso-wrap-distance-bottom:0.00pt;z-index:1;" stroked="false">
+                <v:imagedata r:id="rId32" o:title=""/>
                 <o:lock v:ext="edit" rotation="t"/>
               </v:shape>
             </w:pict>
@@ -10286,7 +10945,7 @@
               <wp:inline xmlns:wp="http://schemas.openxmlformats.org/drawingml/2006/wordprocessingDrawing" distT="0" distB="0" distL="0" distR="0">
                 <wp:extent cx="6086607" cy="5966460"/>
                 <wp:effectExtent l="0" t="0" r="0" b="0"/>
-                <wp:docPr id="19" name="" hidden="0"/>
+                <wp:docPr id="22" name="" hidden="0"/>
                 <wp:cNvGraphicFramePr>
                   <a:graphicFrameLocks xmlns:a="http://schemas.openxmlformats.org/drawingml/2006/main" noChangeAspect="1"/>
                 </wp:cNvGraphicFramePr>
@@ -10301,7 +10960,7 @@
                         <pic:nvPr isPhoto="0" userDrawn="0"/>
                       </pic:nvPicPr>
                       <pic:blipFill>
-                        <a:blip r:embed="rId30"/>
+                        <a:blip r:embed="rId33"/>
                         <a:stretch/>
                       </pic:blipFill>
                       <pic:spPr bwMode="auto">
@@ -10340,8 +10999,8 @@
                 <v:path o:extrusionok="f" gradientshapeok="t" o:connecttype="rect"/>
                 <o:lock v:ext="edit" aspectratio="t"/>
               </v:shapetype>
-              <v:shape id="_x0000_i18" o:spid="_x0000_s18" type="#_x0000_t75" style="width:479.26pt;height:469.80pt;mso-wrap-distance-left:0.00pt;mso-wrap-distance-top:0.00pt;mso-wrap-distance-right:0.00pt;mso-wrap-distance-bottom:0.00pt;rotation:0;z-index:1;" stroked="false">
-                <v:imagedata r:id="rId30" o:title=""/>
+              <v:shape id="_x0000_i21" o:spid="_x0000_s21" type="#_x0000_t75" style="width:479.26pt;height:469.80pt;mso-wrap-distance-left:0.00pt;mso-wrap-distance-top:0.00pt;mso-wrap-distance-right:0.00pt;mso-wrap-distance-bottom:0.00pt;rotation:0;z-index:1;" stroked="false">
+                <v:imagedata r:id="rId33" o:title=""/>
                 <o:lock v:ext="edit" rotation="t"/>
               </v:shape>
             </w:pict>
@@ -10597,7 +11256,7 @@
               <wp:inline xmlns:wp="http://schemas.openxmlformats.org/drawingml/2006/wordprocessingDrawing" distT="0" distB="0" distL="0" distR="0">
                 <wp:extent cx="4618588" cy="6662610"/>
                 <wp:effectExtent l="0" t="0" r="0" b="0"/>
-                <wp:docPr id="20" name="" hidden="0"/>
+                <wp:docPr id="23" name="" hidden="0"/>
                 <wp:cNvGraphicFramePr>
                   <a:graphicFrameLocks xmlns:a="http://schemas.openxmlformats.org/drawingml/2006/main" noChangeAspect="1"/>
                 </wp:cNvGraphicFramePr>
@@ -10612,7 +11271,7 @@
                         <pic:nvPr isPhoto="0" userDrawn="0"/>
                       </pic:nvPicPr>
                       <pic:blipFill>
-                        <a:blip r:embed="rId31"/>
+                        <a:blip r:embed="rId34"/>
                         <a:stretch/>
                       </pic:blipFill>
                       <pic:spPr bwMode="auto">
@@ -10651,8 +11310,8 @@
                 <v:path o:extrusionok="f" gradientshapeok="t" o:connecttype="rect"/>
                 <o:lock v:ext="edit" aspectratio="t"/>
               </v:shapetype>
-              <v:shape id="_x0000_i19" o:spid="_x0000_s19" type="#_x0000_t75" style="width:363.67pt;height:524.61pt;mso-wrap-distance-left:0.00pt;mso-wrap-distance-top:0.00pt;mso-wrap-distance-right:0.00pt;mso-wrap-distance-bottom:0.00pt;rotation:0;z-index:1;" stroked="false">
-                <v:imagedata r:id="rId31" o:title=""/>
+              <v:shape id="_x0000_i22" o:spid="_x0000_s22" type="#_x0000_t75" style="width:363.67pt;height:524.61pt;mso-wrap-distance-left:0.00pt;mso-wrap-distance-top:0.00pt;mso-wrap-distance-right:0.00pt;mso-wrap-distance-bottom:0.00pt;rotation:0;z-index:1;" stroked="false">
+                <v:imagedata r:id="rId34" o:title=""/>
                 <o:lock v:ext="edit" rotation="t"/>
               </v:shape>
             </w:pict>
@@ -10845,7 +11504,7 @@
               <wp:inline xmlns:wp="http://schemas.openxmlformats.org/drawingml/2006/wordprocessingDrawing" distT="0" distB="0" distL="0" distR="0">
                 <wp:extent cx="5940425" cy="5454591"/>
                 <wp:effectExtent l="0" t="0" r="0" b="0"/>
-                <wp:docPr id="21" name=""/>
+                <wp:docPr id="24" name=""/>
                 <wp:cNvGraphicFramePr>
                   <a:graphicFrameLocks xmlns:a="http://schemas.openxmlformats.org/drawingml/2006/main" noChangeAspect="1"/>
                 </wp:cNvGraphicFramePr>
@@ -10860,7 +11519,7 @@
                         <pic:nvPr/>
                       </pic:nvPicPr>
                       <pic:blipFill>
-                        <a:blip r:embed="rId32"/>
+                        <a:blip r:embed="rId35"/>
                         <a:stretch/>
                       </pic:blipFill>
                       <pic:spPr bwMode="auto">
@@ -10899,8 +11558,8 @@
                 <v:path o:extrusionok="f" gradientshapeok="t" o:connecttype="rect"/>
                 <o:lock v:ext="edit" aspectratio="t"/>
               </v:shapetype>
-              <v:shape id="_x0000_i20" o:spid="_x0000_s20" type="#_x0000_t75" style="width:467.75pt;height:429.50pt;mso-wrap-distance-left:0.00pt;mso-wrap-distance-top:0.00pt;mso-wrap-distance-right:0.00pt;mso-wrap-distance-bottom:0.00pt;z-index:1;" stroked="false">
-                <v:imagedata r:id="rId32" o:title=""/>
+              <v:shape id="_x0000_i23" o:spid="_x0000_s23" type="#_x0000_t75" style="width:467.75pt;height:429.50pt;mso-wrap-distance-left:0.00pt;mso-wrap-distance-top:0.00pt;mso-wrap-distance-right:0.00pt;mso-wrap-distance-bottom:0.00pt;z-index:1;" stroked="false">
+                <v:imagedata r:id="rId35" o:title=""/>
                 <o:lock v:ext="edit" rotation="t"/>
               </v:shape>
             </w:pict>
@@ -12305,7 +12964,7 @@
               <wp:inline xmlns:wp="http://schemas.openxmlformats.org/drawingml/2006/wordprocessingDrawing" distT="0" distB="0" distL="0" distR="0">
                 <wp:extent cx="5940425" cy="1654572"/>
                 <wp:effectExtent l="0" t="0" r="0" b="0"/>
-                <wp:docPr id="22" name=""/>
+                <wp:docPr id="25" name=""/>
                 <wp:cNvGraphicFramePr>
                   <a:graphicFrameLocks xmlns:a="http://schemas.openxmlformats.org/drawingml/2006/main" noChangeAspect="1"/>
                 </wp:cNvGraphicFramePr>
@@ -12320,7 +12979,7 @@
                         <pic:nvPr/>
                       </pic:nvPicPr>
                       <pic:blipFill>
-                        <a:blip r:embed="rId33"/>
+                        <a:blip r:embed="rId36"/>
                         <a:stretch/>
                       </pic:blipFill>
                       <pic:spPr bwMode="auto">
@@ -12359,8 +13018,8 @@
                 <v:path o:extrusionok="f" gradientshapeok="t" o:connecttype="rect"/>
                 <o:lock v:ext="edit" aspectratio="t"/>
               </v:shapetype>
-              <v:shape id="_x0000_i21" o:spid="_x0000_s21" type="#_x0000_t75" style="width:467.75pt;height:130.28pt;mso-wrap-distance-left:0.00pt;mso-wrap-distance-top:0.00pt;mso-wrap-distance-right:0.00pt;mso-wrap-distance-bottom:0.00pt;z-index:1;" stroked="false">
-                <v:imagedata r:id="rId33" o:title=""/>
+              <v:shape id="_x0000_i24" o:spid="_x0000_s24" type="#_x0000_t75" style="width:467.75pt;height:130.28pt;mso-wrap-distance-left:0.00pt;mso-wrap-distance-top:0.00pt;mso-wrap-distance-right:0.00pt;mso-wrap-distance-bottom:0.00pt;z-index:1;" stroked="false">
+                <v:imagedata r:id="rId36" o:title=""/>
                 <o:lock v:ext="edit" rotation="t"/>
               </v:shape>
             </w:pict>
@@ -13417,7 +14076,7 @@
               <wp:inline xmlns:wp="http://schemas.openxmlformats.org/drawingml/2006/wordprocessingDrawing" distT="0" distB="0" distL="0" distR="0">
                 <wp:extent cx="5940425" cy="1330714"/>
                 <wp:effectExtent l="0" t="0" r="0" b="0"/>
-                <wp:docPr id="23" name=""/>
+                <wp:docPr id="26" name=""/>
                 <wp:cNvGraphicFramePr>
                   <a:graphicFrameLocks xmlns:a="http://schemas.openxmlformats.org/drawingml/2006/main" noChangeAspect="1"/>
                 </wp:cNvGraphicFramePr>
@@ -13432,7 +14091,7 @@
                         <pic:nvPr/>
                       </pic:nvPicPr>
                       <pic:blipFill>
-                        <a:blip r:embed="rId34"/>
+                        <a:blip r:embed="rId37"/>
                         <a:stretch/>
                       </pic:blipFill>
                       <pic:spPr bwMode="auto">
@@ -13471,8 +14130,8 @@
                 <v:path o:extrusionok="f" gradientshapeok="t" o:connecttype="rect"/>
                 <o:lock v:ext="edit" aspectratio="t"/>
               </v:shapetype>
-              <v:shape id="_x0000_i22" o:spid="_x0000_s22" type="#_x0000_t75" style="width:467.75pt;height:104.78pt;mso-wrap-distance-left:0.00pt;mso-wrap-distance-top:0.00pt;mso-wrap-distance-right:0.00pt;mso-wrap-distance-bottom:0.00pt;z-index:1;" stroked="false">
-                <v:imagedata r:id="rId34" o:title=""/>
+              <v:shape id="_x0000_i25" o:spid="_x0000_s25" type="#_x0000_t75" style="width:467.75pt;height:104.78pt;mso-wrap-distance-left:0.00pt;mso-wrap-distance-top:0.00pt;mso-wrap-distance-right:0.00pt;mso-wrap-distance-bottom:0.00pt;z-index:1;" stroked="false">
+                <v:imagedata r:id="rId37" o:title=""/>
                 <o:lock v:ext="edit" rotation="t"/>
               </v:shape>
             </w:pict>
@@ -13727,7 +14386,7 @@
               <wp:inline xmlns:wp="http://schemas.openxmlformats.org/drawingml/2006/wordprocessingDrawing" distT="0" distB="0" distL="0" distR="0">
                 <wp:extent cx="3786834" cy="9690735"/>
                 <wp:effectExtent l="0" t="0" r="0" b="0"/>
-                <wp:docPr id="24" name="" hidden="0"/>
+                <wp:docPr id="27" name="" hidden="0"/>
                 <wp:cNvGraphicFramePr>
                   <a:graphicFrameLocks xmlns:a="http://schemas.openxmlformats.org/drawingml/2006/main" noChangeAspect="1"/>
                 </wp:cNvGraphicFramePr>
@@ -13742,7 +14401,7 @@
                         <pic:nvPr isPhoto="0" userDrawn="0"/>
                       </pic:nvPicPr>
                       <pic:blipFill>
-                        <a:blip r:embed="rId35"/>
+                        <a:blip r:embed="rId38"/>
                         <a:stretch/>
                       </pic:blipFill>
                       <pic:spPr bwMode="auto">
@@ -13781,8 +14440,8 @@
                 <v:path o:extrusionok="f" gradientshapeok="t" o:connecttype="rect"/>
                 <o:lock v:ext="edit" aspectratio="t"/>
               </v:shapetype>
-              <v:shape id="_x0000_i23" o:spid="_x0000_s23" type="#_x0000_t75" style="width:298.18pt;height:763.05pt;mso-wrap-distance-left:0.00pt;mso-wrap-distance-top:0.00pt;mso-wrap-distance-right:0.00pt;mso-wrap-distance-bottom:0.00pt;rotation:0;z-index:1;" stroked="false">
-                <v:imagedata r:id="rId35" o:title=""/>
+              <v:shape id="_x0000_i26" o:spid="_x0000_s26" type="#_x0000_t75" style="width:298.18pt;height:763.05pt;mso-wrap-distance-left:0.00pt;mso-wrap-distance-top:0.00pt;mso-wrap-distance-right:0.00pt;mso-wrap-distance-bottom:0.00pt;rotation:0;z-index:1;" stroked="false">
+                <v:imagedata r:id="rId38" o:title=""/>
                 <o:lock v:ext="edit" rotation="t"/>
               </v:shape>
             </w:pict>
@@ -14147,7 +14806,7 @@
               <wp:inline xmlns:wp="http://schemas.openxmlformats.org/drawingml/2006/wordprocessingDrawing" distT="0" distB="0" distL="0" distR="0">
                 <wp:extent cx="5940425" cy="868688"/>
                 <wp:effectExtent l="0" t="0" r="0" b="0"/>
-                <wp:docPr id="25" name="" hidden="0"/>
+                <wp:docPr id="28" name="" hidden="0"/>
                 <wp:cNvGraphicFramePr>
                   <a:graphicFrameLocks xmlns:a="http://schemas.openxmlformats.org/drawingml/2006/main" noChangeAspect="1"/>
                 </wp:cNvGraphicFramePr>
@@ -14162,7 +14821,7 @@
                         <pic:nvPr isPhoto="0" userDrawn="0"/>
                       </pic:nvPicPr>
                       <pic:blipFill>
-                        <a:blip r:embed="rId36"/>
+                        <a:blip r:embed="rId39"/>
                         <a:stretch/>
                       </pic:blipFill>
                       <pic:spPr bwMode="auto">
@@ -14201,8 +14860,8 @@
                 <v:path o:extrusionok="f" gradientshapeok="t" o:connecttype="rect"/>
                 <o:lock v:ext="edit" aspectratio="t"/>
               </v:shapetype>
-              <v:shape id="_x0000_i24" o:spid="_x0000_s24" type="#_x0000_t75" style="width:467.75pt;height:68.40pt;mso-wrap-distance-left:0.00pt;mso-wrap-distance-top:0.00pt;mso-wrap-distance-right:0.00pt;mso-wrap-distance-bottom:0.00pt;z-index:1;" stroked="false">
-                <v:imagedata r:id="rId36" o:title=""/>
+              <v:shape id="_x0000_i27" o:spid="_x0000_s27" type="#_x0000_t75" style="width:467.75pt;height:68.40pt;mso-wrap-distance-left:0.00pt;mso-wrap-distance-top:0.00pt;mso-wrap-distance-right:0.00pt;mso-wrap-distance-bottom:0.00pt;z-index:1;" stroked="false">
+                <v:imagedata r:id="rId39" o:title=""/>
                 <o:lock v:ext="edit" rotation="t"/>
               </v:shape>
             </w:pict>
@@ -14374,7 +15033,7 @@
               <wp:inline xmlns:wp="http://schemas.openxmlformats.org/drawingml/2006/wordprocessingDrawing" distT="0" distB="0" distL="0" distR="0">
                 <wp:extent cx="4543425" cy="428625"/>
                 <wp:effectExtent l="0" t="0" r="0" b="0"/>
-                <wp:docPr id="26" name="" hidden="0"/>
+                <wp:docPr id="29" name="" hidden="0"/>
                 <wp:cNvGraphicFramePr>
                   <a:graphicFrameLocks xmlns:a="http://schemas.openxmlformats.org/drawingml/2006/main" noChangeAspect="1"/>
                 </wp:cNvGraphicFramePr>
@@ -14389,7 +15048,7 @@
                         <pic:nvPr isPhoto="0" userDrawn="0"/>
                       </pic:nvPicPr>
                       <pic:blipFill>
-                        <a:blip r:embed="rId37"/>
+                        <a:blip r:embed="rId40"/>
                         <a:stretch/>
                       </pic:blipFill>
                       <pic:spPr bwMode="auto">
@@ -14428,8 +15087,8 @@
                 <v:path o:extrusionok="f" gradientshapeok="t" o:connecttype="rect"/>
                 <o:lock v:ext="edit" aspectratio="t"/>
               </v:shapetype>
-              <v:shape id="_x0000_i25" o:spid="_x0000_s25" type="#_x0000_t75" style="width:357.75pt;height:33.75pt;mso-wrap-distance-left:0.00pt;mso-wrap-distance-top:0.00pt;mso-wrap-distance-right:0.00pt;mso-wrap-distance-bottom:0.00pt;z-index:1;" stroked="false">
-                <v:imagedata r:id="rId37" o:title=""/>
+              <v:shape id="_x0000_i28" o:spid="_x0000_s28" type="#_x0000_t75" style="width:357.75pt;height:33.75pt;mso-wrap-distance-left:0.00pt;mso-wrap-distance-top:0.00pt;mso-wrap-distance-right:0.00pt;mso-wrap-distance-bottom:0.00pt;z-index:1;" stroked="false">
+                <v:imagedata r:id="rId40" o:title=""/>
                 <o:lock v:ext="edit" rotation="t"/>
               </v:shape>
             </w:pict>
@@ -14588,7 +15247,7 @@
               <wp:inline xmlns:wp="http://schemas.openxmlformats.org/drawingml/2006/wordprocessingDrawing" distT="0" distB="0" distL="0" distR="0">
                 <wp:extent cx="4791075" cy="2200275"/>
                 <wp:effectExtent l="0" t="0" r="0" b="0"/>
-                <wp:docPr id="27" name="" hidden="0"/>
+                <wp:docPr id="30" name="" hidden="0"/>
                 <wp:cNvGraphicFramePr>
                   <a:graphicFrameLocks xmlns:a="http://schemas.openxmlformats.org/drawingml/2006/main" noChangeAspect="1"/>
                 </wp:cNvGraphicFramePr>
@@ -14603,7 +15262,7 @@
                         <pic:nvPr isPhoto="0" userDrawn="0"/>
                       </pic:nvPicPr>
                       <pic:blipFill>
-                        <a:blip r:embed="rId38"/>
+                        <a:blip r:embed="rId41"/>
                         <a:stretch/>
                       </pic:blipFill>
                       <pic:spPr bwMode="auto">
@@ -14642,8 +15301,8 @@
                 <v:path o:extrusionok="f" gradientshapeok="t" o:connecttype="rect"/>
                 <o:lock v:ext="edit" aspectratio="t"/>
               </v:shapetype>
-              <v:shape id="_x0000_i26" o:spid="_x0000_s26" type="#_x0000_t75" style="width:377.25pt;height:173.25pt;mso-wrap-distance-left:0.00pt;mso-wrap-distance-top:0.00pt;mso-wrap-distance-right:0.00pt;mso-wrap-distance-bottom:0.00pt;z-index:1;" stroked="false">
-                <v:imagedata r:id="rId38" o:title=""/>
+              <v:shape id="_x0000_i29" o:spid="_x0000_s29" type="#_x0000_t75" style="width:377.25pt;height:173.25pt;mso-wrap-distance-left:0.00pt;mso-wrap-distance-top:0.00pt;mso-wrap-distance-right:0.00pt;mso-wrap-distance-bottom:0.00pt;z-index:1;" stroked="false">
+                <v:imagedata r:id="rId41" o:title=""/>
                 <o:lock v:ext="edit" rotation="t"/>
               </v:shape>
             </w:pict>
@@ -14902,7 +15561,7 @@
               <wp:inline xmlns:wp="http://schemas.openxmlformats.org/drawingml/2006/wordprocessingDrawing" distT="0" distB="0" distL="0" distR="0">
                 <wp:extent cx="4010025" cy="314325"/>
                 <wp:effectExtent l="0" t="0" r="0" b="0"/>
-                <wp:docPr id="28" name="" hidden="0"/>
+                <wp:docPr id="31" name="" hidden="0"/>
                 <wp:cNvGraphicFramePr>
                   <a:graphicFrameLocks xmlns:a="http://schemas.openxmlformats.org/drawingml/2006/main" noChangeAspect="1"/>
                 </wp:cNvGraphicFramePr>
@@ -14917,7 +15576,7 @@
                         <pic:nvPr isPhoto="0" userDrawn="0"/>
                       </pic:nvPicPr>
                       <pic:blipFill>
-                        <a:blip r:embed="rId39"/>
+                        <a:blip r:embed="rId42"/>
                         <a:stretch/>
                       </pic:blipFill>
                       <pic:spPr bwMode="auto">
@@ -14956,8 +15615,8 @@
                 <v:path o:extrusionok="f" gradientshapeok="t" o:connecttype="rect"/>
                 <o:lock v:ext="edit" aspectratio="t"/>
               </v:shapetype>
-              <v:shape id="_x0000_i27" o:spid="_x0000_s27" type="#_x0000_t75" style="width:315.75pt;height:24.75pt;mso-wrap-distance-left:0.00pt;mso-wrap-distance-top:0.00pt;mso-wrap-distance-right:0.00pt;mso-wrap-distance-bottom:0.00pt;z-index:1;" stroked="false">
-                <v:imagedata r:id="rId39" o:title=""/>
+              <v:shape id="_x0000_i30" o:spid="_x0000_s30" type="#_x0000_t75" style="width:315.75pt;height:24.75pt;mso-wrap-distance-left:0.00pt;mso-wrap-distance-top:0.00pt;mso-wrap-distance-right:0.00pt;mso-wrap-distance-bottom:0.00pt;z-index:1;" stroked="false">
+                <v:imagedata r:id="rId42" o:title=""/>
                 <o:lock v:ext="edit" rotation="t"/>
               </v:shape>
             </w:pict>
@@ -15159,7 +15818,7 @@
       <w:footnotePr/>
       <w:endnotePr/>
       <w:type w:val="nextPage"/>
-      <w:pgSz w:h="16838" w:orient="landscape" w:w="11906"/>
+      <w:pgSz w:h="16838" w:orient="portrait" w:w="11906"/>
       <w:pgMar w:top="1134" w:right="850" w:bottom="1134" w:left="1701" w:header="709" w:footer="709" w:gutter="0"/>
       <w:cols w:num="1" w:sep="0" w:space="708" w:equalWidth="1"/>
     </w:sectPr>
@@ -15237,7 +15896,7 @@
 <w:hdr xmlns:wpc="http://schemas.microsoft.com/office/word/2010/wordprocessingCanvas" xmlns:mc="http://schemas.openxmlformats.org/markup-compatibility/2006" xmlns:o="urn:schemas-microsoft-com:office:office" xmlns:r="http://schemas.openxmlformats.org/officeDocument/2006/relationships" xmlns:m="http://schemas.openxmlformats.org/officeDocument/2006/math" xmlns:v="urn:schemas-microsoft-com:vml" xmlns:wp14="http://schemas.microsoft.com/office/word/2010/wordprocessingDrawing" xmlns:wp="http://schemas.openxmlformats.org/drawingml/2006/wordprocessingDrawing" xmlns:w10="urn:schemas-microsoft-com:office:word" xmlns:w="http://schemas.openxmlformats.org/wordprocessingml/2006/main" xmlns:w14="http://schemas.microsoft.com/office/word/2010/wordml" xmlns:w15="http://schemas.microsoft.com/office/word/2012/wordml" xmlns:wpg="http://schemas.microsoft.com/office/word/2010/wordprocessingGroup" xmlns:wpi="http://schemas.microsoft.com/office/word/2010/wordprocessingInk" xmlns:wne="http://schemas.microsoft.com/office/word/2006/wordml" xmlns:a="http://schemas.openxmlformats.org/drawingml/2006/main" xmlns:wps="http://schemas.microsoft.com/office/word/2010/wordprocessingShape" mc:Ignorable="w14 w15 wp14">
   <w:p>
     <w:pPr>
-      <w:pStyle w:val="706"/>
+      <w:pStyle w:val="749"/>
       <w:pBdr/>
       <w:spacing/>
       <w:ind/>
@@ -15988,9 +16647,9 @@
     <w:lsdException w:name="Bibliography" w:uiPriority="37"/>
     <w:lsdException w:name="TOC Heading" w:uiPriority="39" w:qFormat="1"/>
   </w:latentStyles>
-  <w:style w:type="character" w:styleId="672">
+  <w:style w:type="character" w:styleId="715">
     <w:name w:val="Intense Emphasis"/>
-    <w:basedOn w:val="861"/>
+    <w:basedOn w:val="904"/>
     <w:uiPriority w:val="21"/>
     <w:qFormat/>
     <w:pPr>
@@ -16004,9 +16663,9 @@
       <w:color w:val="0f4761" w:themeColor="accent1" w:themeShade="BF"/>
     </w:rPr>
   </w:style>
-  <w:style w:type="character" w:styleId="673">
+  <w:style w:type="character" w:styleId="716">
     <w:name w:val="Intense Reference"/>
-    <w:basedOn w:val="861"/>
+    <w:basedOn w:val="904"/>
     <w:uiPriority w:val="32"/>
     <w:qFormat/>
     <w:pPr>
@@ -16022,9 +16681,9 @@
       <w:spacing w:val="5"/>
     </w:rPr>
   </w:style>
-  <w:style w:type="character" w:styleId="674">
+  <w:style w:type="character" w:styleId="717">
     <w:name w:val="Subtle Emphasis"/>
-    <w:basedOn w:val="861"/>
+    <w:basedOn w:val="904"/>
     <w:uiPriority w:val="19"/>
     <w:qFormat/>
     <w:pPr>
@@ -16038,9 +16697,9 @@
       <w:color w:val="404040" w:themeColor="text1" w:themeTint="BF"/>
     </w:rPr>
   </w:style>
-  <w:style w:type="character" w:styleId="675">
+  <w:style w:type="character" w:styleId="718">
     <w:name w:val="Emphasis"/>
-    <w:basedOn w:val="861"/>
+    <w:basedOn w:val="904"/>
     <w:uiPriority w:val="20"/>
     <w:qFormat/>
     <w:pPr>
@@ -16053,9 +16712,9 @@
       <w:iCs/>
     </w:rPr>
   </w:style>
-  <w:style w:type="character" w:styleId="676">
+  <w:style w:type="character" w:styleId="719">
     <w:name w:val="Strong"/>
-    <w:basedOn w:val="861"/>
+    <w:basedOn w:val="904"/>
     <w:uiPriority w:val="22"/>
     <w:qFormat/>
     <w:pPr>
@@ -16068,9 +16727,9 @@
       <w:bCs/>
     </w:rPr>
   </w:style>
-  <w:style w:type="character" w:styleId="677">
+  <w:style w:type="character" w:styleId="720">
     <w:name w:val="Subtle Reference"/>
-    <w:basedOn w:val="861"/>
+    <w:basedOn w:val="904"/>
     <w:uiPriority w:val="31"/>
     <w:qFormat/>
     <w:pPr>
@@ -16083,9 +16742,9 @@
       <w:color w:val="5a5a5a" w:themeColor="text1" w:themeTint="A5"/>
     </w:rPr>
   </w:style>
-  <w:style w:type="character" w:styleId="678">
+  <w:style w:type="character" w:styleId="721">
     <w:name w:val="Book Title"/>
-    <w:basedOn w:val="861"/>
+    <w:basedOn w:val="904"/>
     <w:uiPriority w:val="33"/>
     <w:qFormat/>
     <w:pPr>
@@ -16101,9 +16760,9 @@
       <w:spacing w:val="5"/>
     </w:rPr>
   </w:style>
-  <w:style w:type="character" w:styleId="679">
+  <w:style w:type="character" w:styleId="722">
     <w:name w:val="FollowedHyperlink"/>
-    <w:basedOn w:val="861"/>
+    <w:basedOn w:val="904"/>
     <w:uiPriority w:val="99"/>
     <w:semiHidden/>
     <w:unhideWhenUsed/>
@@ -16117,11 +16776,11 @@
       <w:u w:val="single"/>
     </w:rPr>
   </w:style>
-  <w:style w:type="paragraph" w:styleId="680">
+  <w:style w:type="paragraph" w:styleId="723">
     <w:name w:val="Heading 1"/>
-    <w:basedOn w:val="856"/>
-    <w:next w:val="856"/>
-    <w:link w:val="681"/>
+    <w:basedOn w:val="899"/>
+    <w:next w:val="899"/>
+    <w:link w:val="724"/>
     <w:uiPriority w:val="9"/>
     <w:qFormat/>
     <w:pPr>
@@ -16138,9 +16797,9 @@
       <w:szCs w:val="40"/>
     </w:rPr>
   </w:style>
-  <w:style w:type="character" w:styleId="681">
+  <w:style w:type="character" w:styleId="724">
     <w:name w:val="Heading 1 Char"/>
-    <w:link w:val="680"/>
+    <w:link w:val="723"/>
     <w:uiPriority w:val="9"/>
     <w:pPr>
       <w:pBdr/>
@@ -16153,11 +16812,11 @@
       <w:szCs w:val="40"/>
     </w:rPr>
   </w:style>
-  <w:style w:type="paragraph" w:styleId="682">
+  <w:style w:type="paragraph" w:styleId="725">
     <w:name w:val="Heading 2"/>
-    <w:basedOn w:val="856"/>
-    <w:next w:val="856"/>
-    <w:link w:val="683"/>
+    <w:basedOn w:val="899"/>
+    <w:next w:val="899"/>
+    <w:link w:val="726"/>
     <w:uiPriority w:val="9"/>
     <w:unhideWhenUsed/>
     <w:qFormat/>
@@ -16174,9 +16833,9 @@
       <w:sz w:val="34"/>
     </w:rPr>
   </w:style>
-  <w:style w:type="character" w:styleId="683">
+  <w:style w:type="character" w:styleId="726">
     <w:name w:val="Heading 2 Char"/>
-    <w:link w:val="682"/>
+    <w:link w:val="725"/>
     <w:uiPriority w:val="9"/>
     <w:pPr>
       <w:pBdr/>
@@ -16188,11 +16847,11 @@
       <w:sz w:val="34"/>
     </w:rPr>
   </w:style>
-  <w:style w:type="paragraph" w:styleId="684">
+  <w:style w:type="paragraph" w:styleId="727">
     <w:name w:val="Heading 3"/>
-    <w:basedOn w:val="856"/>
-    <w:next w:val="856"/>
-    <w:link w:val="685"/>
+    <w:basedOn w:val="899"/>
+    <w:next w:val="899"/>
+    <w:link w:val="728"/>
     <w:uiPriority w:val="9"/>
     <w:unhideWhenUsed/>
     <w:qFormat/>
@@ -16210,9 +16869,9 @@
       <w:szCs w:val="30"/>
     </w:rPr>
   </w:style>
-  <w:style w:type="character" w:styleId="685">
+  <w:style w:type="character" w:styleId="728">
     <w:name w:val="Heading 3 Char"/>
-    <w:link w:val="684"/>
+    <w:link w:val="727"/>
     <w:uiPriority w:val="9"/>
     <w:pPr>
       <w:pBdr/>
@@ -16225,11 +16884,11 @@
       <w:szCs w:val="30"/>
     </w:rPr>
   </w:style>
-  <w:style w:type="paragraph" w:styleId="686">
+  <w:style w:type="paragraph" w:styleId="729">
     <w:name w:val="Heading 4"/>
-    <w:basedOn w:val="856"/>
-    <w:next w:val="856"/>
-    <w:link w:val="687"/>
+    <w:basedOn w:val="899"/>
+    <w:next w:val="899"/>
+    <w:link w:val="730"/>
     <w:uiPriority w:val="9"/>
     <w:unhideWhenUsed/>
     <w:qFormat/>
@@ -16249,9 +16908,9 @@
       <w:szCs w:val="26"/>
     </w:rPr>
   </w:style>
-  <w:style w:type="character" w:styleId="687">
+  <w:style w:type="character" w:styleId="730">
     <w:name w:val="Heading 4 Char"/>
-    <w:link w:val="686"/>
+    <w:link w:val="729"/>
     <w:uiPriority w:val="9"/>
     <w:pPr>
       <w:pBdr/>
@@ -16266,11 +16925,11 @@
       <w:szCs w:val="26"/>
     </w:rPr>
   </w:style>
-  <w:style w:type="paragraph" w:styleId="688">
+  <w:style w:type="paragraph" w:styleId="731">
     <w:name w:val="Heading 5"/>
-    <w:basedOn w:val="856"/>
-    <w:next w:val="856"/>
-    <w:link w:val="689"/>
+    <w:basedOn w:val="899"/>
+    <w:next w:val="899"/>
+    <w:link w:val="732"/>
     <w:uiPriority w:val="9"/>
     <w:unhideWhenUsed/>
     <w:qFormat/>
@@ -16290,9 +16949,9 @@
       <w:szCs w:val="24"/>
     </w:rPr>
   </w:style>
-  <w:style w:type="character" w:styleId="689">
+  <w:style w:type="character" w:styleId="732">
     <w:name w:val="Heading 5 Char"/>
-    <w:link w:val="688"/>
+    <w:link w:val="731"/>
     <w:uiPriority w:val="9"/>
     <w:pPr>
       <w:pBdr/>
@@ -16307,11 +16966,11 @@
       <w:szCs w:val="24"/>
     </w:rPr>
   </w:style>
-  <w:style w:type="paragraph" w:styleId="690">
+  <w:style w:type="paragraph" w:styleId="733">
     <w:name w:val="Heading 6"/>
-    <w:basedOn w:val="856"/>
-    <w:next w:val="856"/>
-    <w:link w:val="691"/>
+    <w:basedOn w:val="899"/>
+    <w:next w:val="899"/>
+    <w:link w:val="734"/>
     <w:uiPriority w:val="9"/>
     <w:unhideWhenUsed/>
     <w:qFormat/>
@@ -16331,9 +16990,9 @@
       <w:szCs w:val="22"/>
     </w:rPr>
   </w:style>
-  <w:style w:type="character" w:styleId="691">
+  <w:style w:type="character" w:styleId="734">
     <w:name w:val="Heading 6 Char"/>
-    <w:link w:val="690"/>
+    <w:link w:val="733"/>
     <w:uiPriority w:val="9"/>
     <w:pPr>
       <w:pBdr/>
@@ -16348,11 +17007,11 @@
       <w:szCs w:val="22"/>
     </w:rPr>
   </w:style>
-  <w:style w:type="paragraph" w:styleId="692">
+  <w:style w:type="paragraph" w:styleId="735">
     <w:name w:val="Heading 7"/>
-    <w:basedOn w:val="856"/>
-    <w:next w:val="856"/>
-    <w:link w:val="693"/>
+    <w:basedOn w:val="899"/>
+    <w:next w:val="899"/>
+    <w:link w:val="736"/>
     <w:uiPriority w:val="9"/>
     <w:unhideWhenUsed/>
     <w:qFormat/>
@@ -16374,9 +17033,9 @@
       <w:szCs w:val="22"/>
     </w:rPr>
   </w:style>
-  <w:style w:type="character" w:styleId="693">
+  <w:style w:type="character" w:styleId="736">
     <w:name w:val="Heading 7 Char"/>
-    <w:link w:val="692"/>
+    <w:link w:val="735"/>
     <w:uiPriority w:val="9"/>
     <w:pPr>
       <w:pBdr/>
@@ -16393,11 +17052,11 @@
       <w:szCs w:val="22"/>
     </w:rPr>
   </w:style>
-  <w:style w:type="paragraph" w:styleId="694">
+  <w:style w:type="paragraph" w:styleId="737">
     <w:name w:val="Heading 8"/>
-    <w:basedOn w:val="856"/>
-    <w:next w:val="856"/>
-    <w:link w:val="695"/>
+    <w:basedOn w:val="899"/>
+    <w:next w:val="899"/>
+    <w:link w:val="738"/>
     <w:uiPriority w:val="9"/>
     <w:unhideWhenUsed/>
     <w:qFormat/>
@@ -16417,9 +17076,9 @@
       <w:szCs w:val="22"/>
     </w:rPr>
   </w:style>
-  <w:style w:type="character" w:styleId="695">
+  <w:style w:type="character" w:styleId="738">
     <w:name w:val="Heading 8 Char"/>
-    <w:link w:val="694"/>
+    <w:link w:val="737"/>
     <w:uiPriority w:val="9"/>
     <w:pPr>
       <w:pBdr/>
@@ -16434,11 +17093,11 @@
       <w:szCs w:val="22"/>
     </w:rPr>
   </w:style>
-  <w:style w:type="paragraph" w:styleId="696">
+  <w:style w:type="paragraph" w:styleId="739">
     <w:name w:val="Heading 9"/>
-    <w:basedOn w:val="856"/>
-    <w:next w:val="856"/>
-    <w:link w:val="697"/>
+    <w:basedOn w:val="899"/>
+    <w:next w:val="899"/>
+    <w:link w:val="740"/>
     <w:uiPriority w:val="9"/>
     <w:unhideWhenUsed/>
     <w:qFormat/>
@@ -16458,9 +17117,9 @@
       <w:szCs w:val="21"/>
     </w:rPr>
   </w:style>
-  <w:style w:type="character" w:styleId="697">
+  <w:style w:type="character" w:styleId="740">
     <w:name w:val="Heading 9 Char"/>
-    <w:link w:val="696"/>
+    <w:link w:val="739"/>
     <w:uiPriority w:val="9"/>
     <w:pPr>
       <w:pBdr/>
@@ -16475,11 +17134,11 @@
       <w:szCs w:val="21"/>
     </w:rPr>
   </w:style>
-  <w:style w:type="paragraph" w:styleId="698">
+  <w:style w:type="paragraph" w:styleId="741">
     <w:name w:val="Title"/>
-    <w:basedOn w:val="856"/>
-    <w:next w:val="856"/>
-    <w:link w:val="699"/>
+    <w:basedOn w:val="899"/>
+    <w:next w:val="899"/>
+    <w:link w:val="742"/>
     <w:uiPriority w:val="10"/>
     <w:qFormat/>
     <w:pPr>
@@ -16493,9 +17152,9 @@
       <w:szCs w:val="48"/>
     </w:rPr>
   </w:style>
-  <w:style w:type="character" w:styleId="699">
+  <w:style w:type="character" w:styleId="742">
     <w:name w:val="Title Char"/>
-    <w:link w:val="698"/>
+    <w:link w:val="741"/>
     <w:uiPriority w:val="10"/>
     <w:pPr>
       <w:pBdr/>
@@ -16507,11 +17166,11 @@
       <w:szCs w:val="48"/>
     </w:rPr>
   </w:style>
-  <w:style w:type="paragraph" w:styleId="700">
+  <w:style w:type="paragraph" w:styleId="743">
     <w:name w:val="Subtitle"/>
-    <w:basedOn w:val="856"/>
-    <w:next w:val="856"/>
-    <w:link w:val="701"/>
+    <w:basedOn w:val="899"/>
+    <w:next w:val="899"/>
+    <w:link w:val="744"/>
     <w:uiPriority w:val="11"/>
     <w:qFormat/>
     <w:pPr>
@@ -16524,9 +17183,9 @@
       <w:szCs w:val="24"/>
     </w:rPr>
   </w:style>
-  <w:style w:type="character" w:styleId="701">
+  <w:style w:type="character" w:styleId="744">
     <w:name w:val="Subtitle Char"/>
-    <w:link w:val="700"/>
+    <w:link w:val="743"/>
     <w:uiPriority w:val="11"/>
     <w:pPr>
       <w:pBdr/>
@@ -16538,11 +17197,11 @@
       <w:szCs w:val="24"/>
     </w:rPr>
   </w:style>
-  <w:style w:type="paragraph" w:styleId="702">
+  <w:style w:type="paragraph" w:styleId="745">
     <w:name w:val="Quote"/>
-    <w:basedOn w:val="856"/>
-    <w:next w:val="856"/>
-    <w:link w:val="703"/>
+    <w:basedOn w:val="899"/>
+    <w:next w:val="899"/>
+    <w:link w:val="746"/>
     <w:uiPriority w:val="29"/>
     <w:qFormat/>
     <w:pPr>
@@ -16554,9 +17213,9 @@
       <w:i/>
     </w:rPr>
   </w:style>
-  <w:style w:type="character" w:styleId="703">
+  <w:style w:type="character" w:styleId="746">
     <w:name w:val="Quote Char"/>
-    <w:link w:val="702"/>
+    <w:link w:val="745"/>
     <w:uiPriority w:val="29"/>
     <w:pPr>
       <w:pBdr/>
@@ -16567,11 +17226,11 @@
       <w:i/>
     </w:rPr>
   </w:style>
-  <w:style w:type="paragraph" w:styleId="704">
+  <w:style w:type="paragraph" w:styleId="747">
     <w:name w:val="Intense Quote"/>
-    <w:basedOn w:val="856"/>
-    <w:next w:val="856"/>
-    <w:link w:val="705"/>
+    <w:basedOn w:val="899"/>
+    <w:next w:val="899"/>
+    <w:link w:val="748"/>
     <w:uiPriority w:val="30"/>
     <w:qFormat/>
     <w:pPr>
@@ -16590,9 +17249,9 @@
       <w:i/>
     </w:rPr>
   </w:style>
-  <w:style w:type="character" w:styleId="705">
+  <w:style w:type="character" w:styleId="748">
     <w:name w:val="Intense Quote Char"/>
-    <w:link w:val="704"/>
+    <w:link w:val="747"/>
     <w:uiPriority w:val="30"/>
     <w:pPr>
       <w:pBdr/>
@@ -16603,10 +17262,10 @@
       <w:i/>
     </w:rPr>
   </w:style>
-  <w:style w:type="paragraph" w:styleId="706">
+  <w:style w:type="paragraph" w:styleId="749">
     <w:name w:val="Header"/>
-    <w:basedOn w:val="856"/>
-    <w:link w:val="707"/>
+    <w:basedOn w:val="899"/>
+    <w:link w:val="750"/>
     <w:uiPriority w:val="99"/>
     <w:unhideWhenUsed/>
     <w:pPr>
@@ -16619,9 +17278,9 @@
       <w:ind/>
     </w:pPr>
   </w:style>
-  <w:style w:type="character" w:styleId="707">
+  <w:style w:type="character" w:styleId="750">
     <w:name w:val="Header Char"/>
-    <w:link w:val="706"/>
+    <w:link w:val="749"/>
     <w:uiPriority w:val="99"/>
     <w:pPr>
       <w:pBdr/>
@@ -16629,10 +17288,10 @@
       <w:ind/>
     </w:pPr>
   </w:style>
-  <w:style w:type="paragraph" w:styleId="708">
+  <w:style w:type="paragraph" w:styleId="751">
     <w:name w:val="Footer"/>
-    <w:basedOn w:val="856"/>
-    <w:link w:val="711"/>
+    <w:basedOn w:val="899"/>
+    <w:link w:val="754"/>
     <w:uiPriority w:val="99"/>
     <w:unhideWhenUsed/>
     <w:pPr>
@@ -16645,9 +17304,9 @@
       <w:ind/>
     </w:pPr>
   </w:style>
-  <w:style w:type="character" w:styleId="709">
+  <w:style w:type="character" w:styleId="752">
     <w:name w:val="Footer Char"/>
-    <w:link w:val="708"/>
+    <w:link w:val="751"/>
     <w:uiPriority w:val="99"/>
     <w:pPr>
       <w:pBdr/>
@@ -16655,10 +17314,10 @@
       <w:ind/>
     </w:pPr>
   </w:style>
-  <w:style w:type="paragraph" w:styleId="710">
+  <w:style w:type="paragraph" w:styleId="753">
     <w:name w:val="Caption"/>
-    <w:basedOn w:val="856"/>
-    <w:next w:val="856"/>
+    <w:basedOn w:val="899"/>
+    <w:next w:val="899"/>
     <w:uiPriority w:val="35"/>
     <w:semiHidden/>
     <w:unhideWhenUsed/>
@@ -16676,10 +17335,10 @@
       <w:szCs w:val="18"/>
     </w:rPr>
   </w:style>
-  <w:style w:type="character" w:styleId="711">
+  <w:style w:type="character" w:styleId="754">
     <w:name w:val="Caption Char"/>
-    <w:basedOn w:val="710"/>
-    <w:link w:val="708"/>
+    <w:basedOn w:val="753"/>
+    <w:link w:val="751"/>
     <w:uiPriority w:val="99"/>
     <w:pPr>
       <w:pBdr/>
@@ -16687,9 +17346,9 @@
       <w:ind/>
     </w:pPr>
   </w:style>
-  <w:style w:type="table" w:styleId="712">
+  <w:style w:type="table" w:styleId="755">
     <w:name w:val="Table Grid"/>
-    <w:basedOn w:val="857"/>
+    <w:basedOn w:val="900"/>
     <w:uiPriority w:val="59"/>
     <w:pPr>
       <w:pBdr/>
@@ -16886,9 +17545,9 @@
       </w:tcPr>
     </w:tblStylePr>
   </w:style>
-  <w:style w:type="table" w:styleId="713">
+  <w:style w:type="table" w:styleId="756">
     <w:name w:val="Table Grid Light"/>
-    <w:basedOn w:val="857"/>
+    <w:basedOn w:val="900"/>
     <w:uiPriority w:val="59"/>
     <w:pPr>
       <w:pBdr/>
@@ -17085,9 +17744,9 @@
       </w:tcPr>
     </w:tblStylePr>
   </w:style>
-  <w:style w:type="table" w:styleId="714">
+  <w:style w:type="table" w:styleId="757">
     <w:name w:val="Plain Table 1"/>
-    <w:basedOn w:val="857"/>
+    <w:basedOn w:val="900"/>
     <w:uiPriority w:val="59"/>
     <w:pPr>
       <w:pBdr/>
@@ -17310,9 +17969,9 @@
       </w:tcPr>
     </w:tblStylePr>
   </w:style>
-  <w:style w:type="table" w:styleId="715">
+  <w:style w:type="table" w:styleId="758">
     <w:name w:val="Plain Table 2"/>
-    <w:basedOn w:val="857"/>
+    <w:basedOn w:val="900"/>
     <w:uiPriority w:val="59"/>
     <w:pPr>
       <w:pBdr/>
@@ -17543,9 +18202,9 @@
       </w:tcPr>
     </w:tblStylePr>
   </w:style>
-  <w:style w:type="table" w:styleId="716">
+  <w:style w:type="table" w:styleId="759">
     <w:name w:val="Plain Table 3"/>
-    <w:basedOn w:val="857"/>
+    <w:basedOn w:val="900"/>
     <w:uiPriority w:val="99"/>
     <w:pPr>
       <w:pBdr/>
@@ -17773,9 +18432,9 @@
       </w:tcPr>
     </w:tblStylePr>
   </w:style>
-  <w:style w:type="table" w:styleId="717">
+  <w:style w:type="table" w:styleId="760">
     <w:name w:val="Plain Table 4"/>
-    <w:basedOn w:val="857"/>
+    <w:basedOn w:val="900"/>
     <w:uiPriority w:val="99"/>
     <w:pPr>
       <w:pBdr/>
@@ -17989,9 +18648,9 @@
       </w:tcPr>
     </w:tblStylePr>
   </w:style>
-  <w:style w:type="table" w:styleId="718">
+  <w:style w:type="table" w:styleId="761">
     <w:name w:val="Plain Table 5"/>
-    <w:basedOn w:val="857"/>
+    <w:basedOn w:val="900"/>
     <w:uiPriority w:val="99"/>
     <w:pPr>
       <w:pBdr/>
@@ -18222,9 +18881,9 @@
       </w:tcPr>
     </w:tblStylePr>
   </w:style>
-  <w:style w:type="table" w:styleId="719">
+  <w:style w:type="table" w:styleId="762">
     <w:name w:val="Grid Table 1 Light"/>
-    <w:basedOn w:val="857"/>
+    <w:basedOn w:val="900"/>
     <w:uiPriority w:val="99"/>
     <w:pPr>
       <w:pBdr/>
@@ -18445,9 +19104,9 @@
       </w:tcPr>
     </w:tblStylePr>
   </w:style>
-  <w:style w:type="table" w:styleId="720">
+  <w:style w:type="table" w:styleId="763">
     <w:name w:val="Grid Table 1 Light - Accent 1"/>
-    <w:basedOn w:val="857"/>
+    <w:basedOn w:val="900"/>
     <w:uiPriority w:val="99"/>
     <w:pPr>
       <w:pBdr/>
@@ -18668,9 +19327,9 @@
       </w:tcPr>
     </w:tblStylePr>
   </w:style>
-  <w:style w:type="table" w:styleId="721">
+  <w:style w:type="table" w:styleId="764">
     <w:name w:val="Grid Table 1 Light - Accent 2"/>
-    <w:basedOn w:val="857"/>
+    <w:basedOn w:val="900"/>
     <w:uiPriority w:val="99"/>
     <w:pPr>
       <w:pBdr/>
@@ -18891,9 +19550,9 @@
       </w:tcPr>
     </w:tblStylePr>
   </w:style>
-  <w:style w:type="table" w:styleId="722">
+  <w:style w:type="table" w:styleId="765">
     <w:name w:val="Grid Table 1 Light - Accent 3"/>
-    <w:basedOn w:val="857"/>
+    <w:basedOn w:val="900"/>
     <w:uiPriority w:val="99"/>
     <w:pPr>
       <w:pBdr/>
@@ -19114,9 +19773,9 @@
       </w:tcPr>
     </w:tblStylePr>
   </w:style>
-  <w:style w:type="table" w:styleId="723">
+  <w:style w:type="table" w:styleId="766">
     <w:name w:val="Grid Table 1 Light - Accent 4"/>
-    <w:basedOn w:val="857"/>
+    <w:basedOn w:val="900"/>
     <w:uiPriority w:val="99"/>
     <w:pPr>
       <w:pBdr/>
@@ -19337,9 +19996,9 @@
       </w:tcPr>
     </w:tblStylePr>
   </w:style>
-  <w:style w:type="table" w:styleId="724">
+  <w:style w:type="table" w:styleId="767">
     <w:name w:val="Grid Table 1 Light - Accent 5"/>
-    <w:basedOn w:val="857"/>
+    <w:basedOn w:val="900"/>
     <w:uiPriority w:val="99"/>
     <w:pPr>
       <w:pBdr/>
@@ -19560,9 +20219,9 @@
       </w:tcPr>
     </w:tblStylePr>
   </w:style>
-  <w:style w:type="table" w:styleId="725">
+  <w:style w:type="table" w:styleId="768">
     <w:name w:val="Grid Table 1 Light - Accent 6"/>
-    <w:basedOn w:val="857"/>
+    <w:basedOn w:val="900"/>
     <w:uiPriority w:val="99"/>
     <w:pPr>
       <w:pBdr/>
@@ -19783,9 +20442,9 @@
       </w:tcPr>
     </w:tblStylePr>
   </w:style>
-  <w:style w:type="table" w:styleId="726">
+  <w:style w:type="table" w:styleId="769">
     <w:name w:val="Grid Table 2"/>
-    <w:basedOn w:val="857"/>
+    <w:basedOn w:val="900"/>
     <w:uiPriority w:val="99"/>
     <w:pPr>
       <w:pBdr/>
@@ -20015,9 +20674,9 @@
       </w:tcPr>
     </w:tblStylePr>
   </w:style>
-  <w:style w:type="table" w:styleId="727">
+  <w:style w:type="table" w:styleId="770">
     <w:name w:val="Grid Table 2 - Accent 1"/>
-    <w:basedOn w:val="857"/>
+    <w:basedOn w:val="900"/>
     <w:uiPriority w:val="99"/>
     <w:pPr>
       <w:pBdr/>
@@ -20247,9 +20906,9 @@
       </w:tcPr>
     </w:tblStylePr>
   </w:style>
-  <w:style w:type="table" w:styleId="728">
+  <w:style w:type="table" w:styleId="771">
     <w:name w:val="Grid Table 2 - Accent 2"/>
-    <w:basedOn w:val="857"/>
+    <w:basedOn w:val="900"/>
     <w:uiPriority w:val="99"/>
     <w:pPr>
       <w:pBdr/>
@@ -20479,9 +21138,9 @@
       </w:tcPr>
     </w:tblStylePr>
   </w:style>
-  <w:style w:type="table" w:styleId="729">
+  <w:style w:type="table" w:styleId="772">
     <w:name w:val="Grid Table 2 - Accent 3"/>
-    <w:basedOn w:val="857"/>
+    <w:basedOn w:val="900"/>
     <w:uiPriority w:val="99"/>
     <w:pPr>
       <w:pBdr/>
@@ -20711,9 +21370,9 @@
       </w:tcPr>
     </w:tblStylePr>
   </w:style>
-  <w:style w:type="table" w:styleId="730">
+  <w:style w:type="table" w:styleId="773">
     <w:name w:val="Grid Table 2 - Accent 4"/>
-    <w:basedOn w:val="857"/>
+    <w:basedOn w:val="900"/>
     <w:uiPriority w:val="99"/>
     <w:pPr>
       <w:pBdr/>
@@ -20943,9 +21602,9 @@
       </w:tcPr>
     </w:tblStylePr>
   </w:style>
-  <w:style w:type="table" w:styleId="731">
+  <w:style w:type="table" w:styleId="774">
     <w:name w:val="Grid Table 2 - Accent 5"/>
-    <w:basedOn w:val="857"/>
+    <w:basedOn w:val="900"/>
     <w:uiPriority w:val="99"/>
     <w:pPr>
       <w:pBdr/>
@@ -21175,9 +21834,9 @@
       </w:tcPr>
     </w:tblStylePr>
   </w:style>
-  <w:style w:type="table" w:styleId="732">
+  <w:style w:type="table" w:styleId="775">
     <w:name w:val="Grid Table 2 - Accent 6"/>
-    <w:basedOn w:val="857"/>
+    <w:basedOn w:val="900"/>
     <w:uiPriority w:val="99"/>
     <w:pPr>
       <w:pBdr/>
@@ -21407,9 +22066,9 @@
       </w:tcPr>
     </w:tblStylePr>
   </w:style>
-  <w:style w:type="table" w:styleId="733">
+  <w:style w:type="table" w:styleId="776">
     <w:name w:val="Grid Table 3"/>
-    <w:basedOn w:val="857"/>
+    <w:basedOn w:val="900"/>
     <w:uiPriority w:val="99"/>
     <w:pPr>
       <w:pBdr/>
@@ -21652,9 +22311,9 @@
       </w:tcPr>
     </w:tblStylePr>
   </w:style>
-  <w:style w:type="table" w:styleId="734">
+  <w:style w:type="table" w:styleId="777">
     <w:name w:val="Grid Table 3 - Accent 1"/>
-    <w:basedOn w:val="857"/>
+    <w:basedOn w:val="900"/>
     <w:uiPriority w:val="99"/>
     <w:pPr>
       <w:pBdr/>
@@ -21897,9 +22556,9 @@
       </w:tcPr>
     </w:tblStylePr>
   </w:style>
-  <w:style w:type="table" w:styleId="735">
+  <w:style w:type="table" w:styleId="778">
     <w:name w:val="Grid Table 3 - Accent 2"/>
-    <w:basedOn w:val="857"/>
+    <w:basedOn w:val="900"/>
     <w:uiPriority w:val="99"/>
     <w:pPr>
       <w:pBdr/>
@@ -22142,9 +22801,9 @@
       </w:tcPr>
     </w:tblStylePr>
   </w:style>
-  <w:style w:type="table" w:styleId="736">
+  <w:style w:type="table" w:styleId="779">
     <w:name w:val="Grid Table 3 - Accent 3"/>
-    <w:basedOn w:val="857"/>
+    <w:basedOn w:val="900"/>
     <w:uiPriority w:val="99"/>
     <w:pPr>
       <w:pBdr/>
@@ -22387,9 +23046,9 @@
       </w:tcPr>
     </w:tblStylePr>
   </w:style>
-  <w:style w:type="table" w:styleId="737">
+  <w:style w:type="table" w:styleId="780">
     <w:name w:val="Grid Table 3 - Accent 4"/>
-    <w:basedOn w:val="857"/>
+    <w:basedOn w:val="900"/>
     <w:uiPriority w:val="99"/>
     <w:pPr>
       <w:pBdr/>
@@ -22632,9 +23291,9 @@
       </w:tcPr>
     </w:tblStylePr>
   </w:style>
-  <w:style w:type="table" w:styleId="738">
+  <w:style w:type="table" w:styleId="781">
     <w:name w:val="Grid Table 3 - Accent 5"/>
-    <w:basedOn w:val="857"/>
+    <w:basedOn w:val="900"/>
     <w:uiPriority w:val="99"/>
     <w:pPr>
       <w:pBdr/>
@@ -22877,9 +23536,9 @@
       </w:tcPr>
     </w:tblStylePr>
   </w:style>
-  <w:style w:type="table" w:styleId="739">
+  <w:style w:type="table" w:styleId="782">
     <w:name w:val="Grid Table 3 - Accent 6"/>
-    <w:basedOn w:val="857"/>
+    <w:basedOn w:val="900"/>
     <w:uiPriority w:val="99"/>
     <w:pPr>
       <w:pBdr/>
@@ -23122,9 +23781,9 @@
       </w:tcPr>
     </w:tblStylePr>
   </w:style>
-  <w:style w:type="table" w:styleId="740">
+  <w:style w:type="table" w:styleId="783">
     <w:name w:val="Grid Table 4"/>
-    <w:basedOn w:val="857"/>
+    <w:basedOn w:val="900"/>
     <w:uiPriority w:val="59"/>
     <w:pPr>
       <w:pBdr/>
@@ -23355,9 +24014,9 @@
       </w:tcPr>
     </w:tblStylePr>
   </w:style>
-  <w:style w:type="table" w:styleId="741">
+  <w:style w:type="table" w:styleId="784">
     <w:name w:val="Grid Table 4 - Accent 1"/>
-    <w:basedOn w:val="857"/>
+    <w:basedOn w:val="900"/>
     <w:uiPriority w:val="59"/>
     <w:pPr>
       <w:pBdr/>
@@ -23588,9 +24247,9 @@
       </w:tcPr>
     </w:tblStylePr>
   </w:style>
-  <w:style w:type="table" w:styleId="742">
+  <w:style w:type="table" w:styleId="785">
     <w:name w:val="Grid Table 4 - Accent 2"/>
-    <w:basedOn w:val="857"/>
+    <w:basedOn w:val="900"/>
     <w:uiPriority w:val="59"/>
     <w:pPr>
       <w:pBdr/>
@@ -23821,9 +24480,9 @@
       </w:tcPr>
     </w:tblStylePr>
   </w:style>
-  <w:style w:type="table" w:styleId="743">
+  <w:style w:type="table" w:styleId="786">
     <w:name w:val="Grid Table 4 - Accent 3"/>
-    <w:basedOn w:val="857"/>
+    <w:basedOn w:val="900"/>
     <w:uiPriority w:val="59"/>
     <w:pPr>
       <w:pBdr/>
@@ -24054,9 +24713,9 @@
       </w:tcPr>
     </w:tblStylePr>
   </w:style>
-  <w:style w:type="table" w:styleId="744">
+  <w:style w:type="table" w:styleId="787">
     <w:name w:val="Grid Table 4 - Accent 4"/>
-    <w:basedOn w:val="857"/>
+    <w:basedOn w:val="900"/>
     <w:uiPriority w:val="59"/>
     <w:pPr>
       <w:pBdr/>
@@ -24287,9 +24946,9 @@
       </w:tcPr>
     </w:tblStylePr>
   </w:style>
-  <w:style w:type="table" w:styleId="745">
+  <w:style w:type="table" w:styleId="788">
     <w:name w:val="Grid Table 4 - Accent 5"/>
-    <w:basedOn w:val="857"/>
+    <w:basedOn w:val="900"/>
     <w:uiPriority w:val="59"/>
     <w:pPr>
       <w:pBdr/>
@@ -24520,9 +25179,9 @@
       </w:tcPr>
     </w:tblStylePr>
   </w:style>
-  <w:style w:type="table" w:styleId="746">
+  <w:style w:type="table" w:styleId="789">
     <w:name w:val="Grid Table 4 - Accent 6"/>
-    <w:basedOn w:val="857"/>
+    <w:basedOn w:val="900"/>
     <w:uiPriority w:val="59"/>
     <w:pPr>
       <w:pBdr/>
@@ -24753,9 +25412,9 @@
       </w:tcPr>
     </w:tblStylePr>
   </w:style>
-  <w:style w:type="table" w:styleId="747">
+  <w:style w:type="table" w:styleId="790">
     <w:name w:val="Grid Table 5 Dark"/>
-    <w:basedOn w:val="857"/>
+    <w:basedOn w:val="900"/>
     <w:uiPriority w:val="99"/>
     <w:pPr>
       <w:pBdr/>
@@ -24981,9 +25640,9 @@
       </w:tcPr>
     </w:tblStylePr>
   </w:style>
-  <w:style w:type="table" w:styleId="748">
+  <w:style w:type="table" w:styleId="791">
     <w:name w:val="Grid Table 5 Dark- Accent 1"/>
-    <w:basedOn w:val="857"/>
+    <w:basedOn w:val="900"/>
     <w:uiPriority w:val="99"/>
     <w:pPr>
       <w:pBdr/>
@@ -25209,9 +25868,9 @@
       </w:tcPr>
     </w:tblStylePr>
   </w:style>
-  <w:style w:type="table" w:styleId="749">
+  <w:style w:type="table" w:styleId="792">
     <w:name w:val="Grid Table 5 Dark - Accent 2"/>
-    <w:basedOn w:val="857"/>
+    <w:basedOn w:val="900"/>
     <w:uiPriority w:val="99"/>
     <w:pPr>
       <w:pBdr/>
@@ -25437,9 +26096,9 @@
       </w:tcPr>
     </w:tblStylePr>
   </w:style>
-  <w:style w:type="table" w:styleId="750">
+  <w:style w:type="table" w:styleId="793">
     <w:name w:val="Grid Table 5 Dark - Accent 3"/>
-    <w:basedOn w:val="857"/>
+    <w:basedOn w:val="900"/>
     <w:uiPriority w:val="99"/>
     <w:pPr>
       <w:pBdr/>
@@ -25665,9 +26324,9 @@
       </w:tcPr>
     </w:tblStylePr>
   </w:style>
-  <w:style w:type="table" w:styleId="751">
+  <w:style w:type="table" w:styleId="794">
     <w:name w:val="Grid Table 5 Dark- Accent 4"/>
-    <w:basedOn w:val="857"/>
+    <w:basedOn w:val="900"/>
     <w:uiPriority w:val="99"/>
     <w:pPr>
       <w:pBdr/>
@@ -25893,9 +26552,9 @@
       </w:tcPr>
     </w:tblStylePr>
   </w:style>
-  <w:style w:type="table" w:styleId="752">
+  <w:style w:type="table" w:styleId="795">
     <w:name w:val="Grid Table 5 Dark - Accent 5"/>
-    <w:basedOn w:val="857"/>
+    <w:basedOn w:val="900"/>
     <w:uiPriority w:val="99"/>
     <w:pPr>
       <w:pBdr/>
@@ -26121,9 +26780,9 @@
       </w:tcPr>
     </w:tblStylePr>
   </w:style>
-  <w:style w:type="table" w:styleId="753">
+  <w:style w:type="table" w:styleId="796">
     <w:name w:val="Grid Table 5 Dark - Accent 6"/>
-    <w:basedOn w:val="857"/>
+    <w:basedOn w:val="900"/>
     <w:uiPriority w:val="99"/>
     <w:pPr>
       <w:pBdr/>
@@ -26349,9 +27008,9 @@
       </w:tcPr>
     </w:tblStylePr>
   </w:style>
-  <w:style w:type="table" w:styleId="754">
+  <w:style w:type="table" w:styleId="797">
     <w:name w:val="Grid Table 6 Colorful"/>
-    <w:basedOn w:val="857"/>
+    <w:basedOn w:val="900"/>
     <w:uiPriority w:val="99"/>
     <w:pPr>
       <w:pBdr/>
@@ -26579,9 +27238,9 @@
       </w:tcPr>
     </w:tblStylePr>
   </w:style>
-  <w:style w:type="table" w:styleId="755">
+  <w:style w:type="table" w:styleId="798">
     <w:name w:val="Grid Table 6 Colorful - Accent 1"/>
-    <w:basedOn w:val="857"/>
+    <w:basedOn w:val="900"/>
     <w:uiPriority w:val="99"/>
     <w:pPr>
       <w:pBdr/>
@@ -26809,9 +27468,9 @@
       </w:tcPr>
     </w:tblStylePr>
   </w:style>
-  <w:style w:type="table" w:styleId="756">
+  <w:style w:type="table" w:styleId="799">
     <w:name w:val="Grid Table 6 Colorful - Accent 2"/>
-    <w:basedOn w:val="857"/>
+    <w:basedOn w:val="900"/>
     <w:uiPriority w:val="99"/>
     <w:pPr>
       <w:pBdr/>
@@ -27039,9 +27698,9 @@
       </w:tcPr>
     </w:tblStylePr>
   </w:style>
-  <w:style w:type="table" w:styleId="757">
+  <w:style w:type="table" w:styleId="800">
     <w:name w:val="Grid Table 6 Colorful - Accent 3"/>
-    <w:basedOn w:val="857"/>
+    <w:basedOn w:val="900"/>
     <w:uiPriority w:val="99"/>
     <w:pPr>
       <w:pBdr/>
@@ -27269,9 +27928,9 @@
       </w:tcPr>
     </w:tblStylePr>
   </w:style>
-  <w:style w:type="table" w:styleId="758">
+  <w:style w:type="table" w:styleId="801">
     <w:name w:val="Grid Table 6 Colorful - Accent 4"/>
-    <w:basedOn w:val="857"/>
+    <w:basedOn w:val="900"/>
     <w:uiPriority w:val="99"/>
     <w:pPr>
       <w:pBdr/>
@@ -27499,9 +28158,9 @@
       </w:tcPr>
     </w:tblStylePr>
   </w:style>
-  <w:style w:type="table" w:styleId="759">
+  <w:style w:type="table" w:styleId="802">
     <w:name w:val="Grid Table 6 Colorful - Accent 5"/>
-    <w:basedOn w:val="857"/>
+    <w:basedOn w:val="900"/>
     <w:uiPriority w:val="99"/>
     <w:pPr>
       <w:pBdr/>
@@ -27729,9 +28388,9 @@
       </w:tcPr>
     </w:tblStylePr>
   </w:style>
-  <w:style w:type="table" w:styleId="760">
+  <w:style w:type="table" w:styleId="803">
     <w:name w:val="Grid Table 6 Colorful - Accent 6"/>
-    <w:basedOn w:val="857"/>
+    <w:basedOn w:val="900"/>
     <w:uiPriority w:val="99"/>
     <w:pPr>
       <w:pBdr/>
@@ -27959,9 +28618,9 @@
       </w:tcPr>
     </w:tblStylePr>
   </w:style>
-  <w:style w:type="table" w:styleId="761">
+  <w:style w:type="table" w:styleId="804">
     <w:name w:val="Grid Table 7 Colorful"/>
-    <w:basedOn w:val="857"/>
+    <w:basedOn w:val="900"/>
     <w:uiPriority w:val="99"/>
     <w:pPr>
       <w:pBdr/>
@@ -28213,9 +28872,9 @@
       </w:tcPr>
     </w:tblStylePr>
   </w:style>
-  <w:style w:type="table" w:styleId="762">
+  <w:style w:type="table" w:styleId="805">
     <w:name w:val="Grid Table 7 Colorful - Accent 1"/>
-    <w:basedOn w:val="857"/>
+    <w:basedOn w:val="900"/>
     <w:uiPriority w:val="99"/>
     <w:pPr>
       <w:pBdr/>
@@ -28467,9 +29126,9 @@
       </w:tcPr>
     </w:tblStylePr>
   </w:style>
-  <w:style w:type="table" w:styleId="763">
+  <w:style w:type="table" w:styleId="806">
     <w:name w:val="Grid Table 7 Colorful - Accent 2"/>
-    <w:basedOn w:val="857"/>
+    <w:basedOn w:val="900"/>
     <w:uiPriority w:val="99"/>
     <w:pPr>
       <w:pBdr/>
@@ -28721,9 +29380,9 @@
       </w:tcPr>
     </w:tblStylePr>
   </w:style>
-  <w:style w:type="table" w:styleId="764">
+  <w:style w:type="table" w:styleId="807">
     <w:name w:val="Grid Table 7 Colorful - Accent 3"/>
-    <w:basedOn w:val="857"/>
+    <w:basedOn w:val="900"/>
     <w:uiPriority w:val="99"/>
     <w:pPr>
       <w:pBdr/>
@@ -28975,9 +29634,9 @@
       </w:tcPr>
     </w:tblStylePr>
   </w:style>
-  <w:style w:type="table" w:styleId="765">
+  <w:style w:type="table" w:styleId="808">
     <w:name w:val="Grid Table 7 Colorful - Accent 4"/>
-    <w:basedOn w:val="857"/>
+    <w:basedOn w:val="900"/>
     <w:uiPriority w:val="99"/>
     <w:pPr>
       <w:pBdr/>
@@ -29229,9 +29888,9 @@
       </w:tcPr>
     </w:tblStylePr>
   </w:style>
-  <w:style w:type="table" w:styleId="766">
+  <w:style w:type="table" w:styleId="809">
     <w:name w:val="Grid Table 7 Colorful - Accent 5"/>
-    <w:basedOn w:val="857"/>
+    <w:basedOn w:val="900"/>
     <w:uiPriority w:val="99"/>
     <w:pPr>
       <w:pBdr/>
@@ -29483,9 +30142,9 @@
       </w:tcPr>
     </w:tblStylePr>
   </w:style>
-  <w:style w:type="table" w:styleId="767">
+  <w:style w:type="table" w:styleId="810">
     <w:name w:val="Grid Table 7 Colorful - Accent 6"/>
-    <w:basedOn w:val="857"/>
+    <w:basedOn w:val="900"/>
     <w:uiPriority w:val="99"/>
     <w:pPr>
       <w:pBdr/>
@@ -29737,9 +30396,9 @@
       </w:tcPr>
     </w:tblStylePr>
   </w:style>
-  <w:style w:type="table" w:styleId="768">
+  <w:style w:type="table" w:styleId="811">
     <w:name w:val="List Table 1 Light"/>
-    <w:basedOn w:val="857"/>
+    <w:basedOn w:val="900"/>
     <w:uiPriority w:val="99"/>
     <w:pPr>
       <w:pBdr/>
@@ -29953,9 +30612,9 @@
       </w:tcPr>
     </w:tblStylePr>
   </w:style>
-  <w:style w:type="table" w:styleId="769">
+  <w:style w:type="table" w:styleId="812">
     <w:name w:val="List Table 1 Light - Accent 1"/>
-    <w:basedOn w:val="857"/>
+    <w:basedOn w:val="900"/>
     <w:uiPriority w:val="99"/>
     <w:pPr>
       <w:pBdr/>
@@ -30169,9 +30828,9 @@
       </w:tcPr>
     </w:tblStylePr>
   </w:style>
-  <w:style w:type="table" w:styleId="770">
+  <w:style w:type="table" w:styleId="813">
     <w:name w:val="List Table 1 Light - Accent 2"/>
-    <w:basedOn w:val="857"/>
+    <w:basedOn w:val="900"/>
     <w:uiPriority w:val="99"/>
     <w:pPr>
       <w:pBdr/>
@@ -30385,9 +31044,9 @@
       </w:tcPr>
     </w:tblStylePr>
   </w:style>
-  <w:style w:type="table" w:styleId="771">
+  <w:style w:type="table" w:styleId="814">
     <w:name w:val="List Table 1 Light - Accent 3"/>
-    <w:basedOn w:val="857"/>
+    <w:basedOn w:val="900"/>
     <w:uiPriority w:val="99"/>
     <w:pPr>
       <w:pBdr/>
@@ -30601,9 +31260,9 @@
       </w:tcPr>
     </w:tblStylePr>
   </w:style>
-  <w:style w:type="table" w:styleId="772">
+  <w:style w:type="table" w:styleId="815">
     <w:name w:val="List Table 1 Light - Accent 4"/>
-    <w:basedOn w:val="857"/>
+    <w:basedOn w:val="900"/>
     <w:uiPriority w:val="99"/>
     <w:pPr>
       <w:pBdr/>
@@ -30817,9 +31476,9 @@
       </w:tcPr>
     </w:tblStylePr>
   </w:style>
-  <w:style w:type="table" w:styleId="773">
+  <w:style w:type="table" w:styleId="816">
     <w:name w:val="List Table 1 Light - Accent 5"/>
-    <w:basedOn w:val="857"/>
+    <w:basedOn w:val="900"/>
     <w:uiPriority w:val="99"/>
     <w:pPr>
       <w:pBdr/>
@@ -31033,9 +31692,9 @@
       </w:tcPr>
     </w:tblStylePr>
   </w:style>
-  <w:style w:type="table" w:styleId="774">
+  <w:style w:type="table" w:styleId="817">
     <w:name w:val="List Table 1 Light - Accent 6"/>
-    <w:basedOn w:val="857"/>
+    <w:basedOn w:val="900"/>
     <w:uiPriority w:val="99"/>
     <w:pPr>
       <w:pBdr/>
@@ -31249,9 +31908,9 @@
       </w:tcPr>
     </w:tblStylePr>
   </w:style>
-  <w:style w:type="table" w:styleId="775">
+  <w:style w:type="table" w:styleId="818">
     <w:name w:val="List Table 2"/>
-    <w:basedOn w:val="857"/>
+    <w:basedOn w:val="900"/>
     <w:uiPriority w:val="99"/>
     <w:pPr>
       <w:pBdr/>
@@ -31487,9 +32146,9 @@
       </w:tcPr>
     </w:tblStylePr>
   </w:style>
-  <w:style w:type="table" w:styleId="776">
+  <w:style w:type="table" w:styleId="819">
     <w:name w:val="List Table 2 - Accent 1"/>
-    <w:basedOn w:val="857"/>
+    <w:basedOn w:val="900"/>
     <w:uiPriority w:val="99"/>
     <w:pPr>
       <w:pBdr/>
@@ -31725,9 +32384,9 @@
       </w:tcPr>
     </w:tblStylePr>
   </w:style>
-  <w:style w:type="table" w:styleId="777">
+  <w:style w:type="table" w:styleId="820">
     <w:name w:val="List Table 2 - Accent 2"/>
-    <w:basedOn w:val="857"/>
+    <w:basedOn w:val="900"/>
     <w:uiPriority w:val="99"/>
     <w:pPr>
       <w:pBdr/>
@@ -31963,9 +32622,9 @@
       </w:tcPr>
     </w:tblStylePr>
   </w:style>
-  <w:style w:type="table" w:styleId="778">
+  <w:style w:type="table" w:styleId="821">
     <w:name w:val="List Table 2 - Accent 3"/>
-    <w:basedOn w:val="857"/>
+    <w:basedOn w:val="900"/>
     <w:uiPriority w:val="99"/>
     <w:pPr>
       <w:pBdr/>
@@ -32201,9 +32860,9 @@
       </w:tcPr>
     </w:tblStylePr>
   </w:style>
-  <w:style w:type="table" w:styleId="779">
+  <w:style w:type="table" w:styleId="822">
     <w:name w:val="List Table 2 - Accent 4"/>
-    <w:basedOn w:val="857"/>
+    <w:basedOn w:val="900"/>
     <w:uiPriority w:val="99"/>
     <w:pPr>
       <w:pBdr/>
@@ -32439,9 +33098,9 @@
       </w:tcPr>
     </w:tblStylePr>
   </w:style>
-  <w:style w:type="table" w:styleId="780">
+  <w:style w:type="table" w:styleId="823">
     <w:name w:val="List Table 2 - Accent 5"/>
-    <w:basedOn w:val="857"/>
+    <w:basedOn w:val="900"/>
     <w:uiPriority w:val="99"/>
     <w:pPr>
       <w:pBdr/>
@@ -32677,9 +33336,9 @@
       </w:tcPr>
     </w:tblStylePr>
   </w:style>
-  <w:style w:type="table" w:styleId="781">
+  <w:style w:type="table" w:styleId="824">
     <w:name w:val="List Table 2 - Accent 6"/>
-    <w:basedOn w:val="857"/>
+    <w:basedOn w:val="900"/>
     <w:uiPriority w:val="99"/>
     <w:pPr>
       <w:pBdr/>
@@ -32915,9 +33574,9 @@
       </w:tcPr>
     </w:tblStylePr>
   </w:style>
-  <w:style w:type="table" w:styleId="782">
+  <w:style w:type="table" w:styleId="825">
     <w:name w:val="List Table 3"/>
-    <w:basedOn w:val="857"/>
+    <w:basedOn w:val="900"/>
     <w:uiPriority w:val="99"/>
     <w:pPr>
       <w:pBdr/>
@@ -33143,9 +33802,9 @@
       </w:tcPr>
     </w:tblStylePr>
   </w:style>
-  <w:style w:type="table" w:styleId="783">
+  <w:style w:type="table" w:styleId="826">
     <w:name w:val="List Table 3 - Accent 1"/>
-    <w:basedOn w:val="857"/>
+    <w:basedOn w:val="900"/>
     <w:uiPriority w:val="99"/>
     <w:pPr>
       <w:pBdr/>
@@ -33371,9 +34030,9 @@
       </w:tcPr>
     </w:tblStylePr>
   </w:style>
-  <w:style w:type="table" w:styleId="784">
+  <w:style w:type="table" w:styleId="827">
     <w:name w:val="List Table 3 - Accent 2"/>
-    <w:basedOn w:val="857"/>
+    <w:basedOn w:val="900"/>
     <w:uiPriority w:val="99"/>
     <w:pPr>
       <w:pBdr/>
@@ -33599,9 +34258,9 @@
       </w:tcPr>
     </w:tblStylePr>
   </w:style>
-  <w:style w:type="table" w:styleId="785">
+  <w:style w:type="table" w:styleId="828">
     <w:name w:val="List Table 3 - Accent 3"/>
-    <w:basedOn w:val="857"/>
+    <w:basedOn w:val="900"/>
     <w:uiPriority w:val="99"/>
     <w:pPr>
       <w:pBdr/>
@@ -33827,9 +34486,9 @@
       </w:tcPr>
     </w:tblStylePr>
   </w:style>
-  <w:style w:type="table" w:styleId="786">
+  <w:style w:type="table" w:styleId="829">
     <w:name w:val="List Table 3 - Accent 4"/>
-    <w:basedOn w:val="857"/>
+    <w:basedOn w:val="900"/>
     <w:uiPriority w:val="99"/>
     <w:pPr>
       <w:pBdr/>
@@ -34055,9 +34714,9 @@
       </w:tcPr>
     </w:tblStylePr>
   </w:style>
-  <w:style w:type="table" w:styleId="787">
+  <w:style w:type="table" w:styleId="830">
     <w:name w:val="List Table 3 - Accent 5"/>
-    <w:basedOn w:val="857"/>
+    <w:basedOn w:val="900"/>
     <w:uiPriority w:val="99"/>
     <w:pPr>
       <w:pBdr/>
@@ -34283,9 +34942,9 @@
       </w:tcPr>
     </w:tblStylePr>
   </w:style>
-  <w:style w:type="table" w:styleId="788">
+  <w:style w:type="table" w:styleId="831">
     <w:name w:val="List Table 3 - Accent 6"/>
-    <w:basedOn w:val="857"/>
+    <w:basedOn w:val="900"/>
     <w:uiPriority w:val="99"/>
     <w:pPr>
       <w:pBdr/>
@@ -34511,9 +35170,9 @@
       </w:tcPr>
     </w:tblStylePr>
   </w:style>
-  <w:style w:type="table" w:styleId="789">
+  <w:style w:type="table" w:styleId="832">
     <w:name w:val="List Table 4"/>
-    <w:basedOn w:val="857"/>
+    <w:basedOn w:val="900"/>
     <w:uiPriority w:val="99"/>
     <w:pPr>
       <w:pBdr/>
@@ -34736,9 +35395,9 @@
       </w:tcPr>
     </w:tblStylePr>
   </w:style>
-  <w:style w:type="table" w:styleId="790">
+  <w:style w:type="table" w:styleId="833">
     <w:name w:val="List Table 4 - Accent 1"/>
-    <w:basedOn w:val="857"/>
+    <w:basedOn w:val="900"/>
     <w:uiPriority w:val="99"/>
     <w:pPr>
       <w:pBdr/>
@@ -34961,9 +35620,9 @@
       </w:tcPr>
     </w:tblStylePr>
   </w:style>
-  <w:style w:type="table" w:styleId="791">
+  <w:style w:type="table" w:styleId="834">
     <w:name w:val="List Table 4 - Accent 2"/>
-    <w:basedOn w:val="857"/>
+    <w:basedOn w:val="900"/>
     <w:uiPriority w:val="99"/>
     <w:pPr>
       <w:pBdr/>
@@ -35186,9 +35845,9 @@
       </w:tcPr>
     </w:tblStylePr>
   </w:style>
-  <w:style w:type="table" w:styleId="792">
+  <w:style w:type="table" w:styleId="835">
     <w:name w:val="List Table 4 - Accent 3"/>
-    <w:basedOn w:val="857"/>
+    <w:basedOn w:val="900"/>
     <w:uiPriority w:val="99"/>
     <w:pPr>
       <w:pBdr/>
@@ -35411,9 +36070,9 @@
       </w:tcPr>
     </w:tblStylePr>
   </w:style>
-  <w:style w:type="table" w:styleId="793">
+  <w:style w:type="table" w:styleId="836">
     <w:name w:val="List Table 4 - Accent 4"/>
-    <w:basedOn w:val="857"/>
+    <w:basedOn w:val="900"/>
     <w:uiPriority w:val="99"/>
     <w:pPr>
       <w:pBdr/>
@@ -35636,9 +36295,9 @@
       </w:tcPr>
     </w:tblStylePr>
   </w:style>
-  <w:style w:type="table" w:styleId="794">
+  <w:style w:type="table" w:styleId="837">
     <w:name w:val="List Table 4 - Accent 5"/>
-    <w:basedOn w:val="857"/>
+    <w:basedOn w:val="900"/>
     <w:uiPriority w:val="99"/>
     <w:pPr>
       <w:pBdr/>
@@ -35861,9 +36520,9 @@
       </w:tcPr>
     </w:tblStylePr>
   </w:style>
-  <w:style w:type="table" w:styleId="795">
+  <w:style w:type="table" w:styleId="838">
     <w:name w:val="List Table 4 - Accent 6"/>
-    <w:basedOn w:val="857"/>
+    <w:basedOn w:val="900"/>
     <w:uiPriority w:val="99"/>
     <w:pPr>
       <w:pBdr/>
@@ -36086,9 +36745,9 @@
       </w:tcPr>
     </w:tblStylePr>
   </w:style>
-  <w:style w:type="table" w:styleId="796">
+  <w:style w:type="table" w:styleId="839">
     <w:name w:val="List Table 5 Dark"/>
-    <w:basedOn w:val="857"/>
+    <w:basedOn w:val="900"/>
     <w:uiPriority w:val="99"/>
     <w:pPr>
       <w:pBdr/>
@@ -36328,9 +36987,9 @@
       </w:tcPr>
     </w:tblStylePr>
   </w:style>
-  <w:style w:type="table" w:styleId="797">
+  <w:style w:type="table" w:styleId="840">
     <w:name w:val="List Table 5 Dark - Accent 1"/>
-    <w:basedOn w:val="857"/>
+    <w:basedOn w:val="900"/>
     <w:uiPriority w:val="99"/>
     <w:pPr>
       <w:pBdr/>
@@ -36570,9 +37229,9 @@
       </w:tcPr>
     </w:tblStylePr>
   </w:style>
-  <w:style w:type="table" w:styleId="798">
+  <w:style w:type="table" w:styleId="841">
     <w:name w:val="List Table 5 Dark - Accent 2"/>
-    <w:basedOn w:val="857"/>
+    <w:basedOn w:val="900"/>
     <w:uiPriority w:val="99"/>
     <w:pPr>
       <w:pBdr/>
@@ -36812,9 +37471,9 @@
       </w:tcPr>
     </w:tblStylePr>
   </w:style>
-  <w:style w:type="table" w:styleId="799">
+  <w:style w:type="table" w:styleId="842">
     <w:name w:val="List Table 5 Dark - Accent 3"/>
-    <w:basedOn w:val="857"/>
+    <w:basedOn w:val="900"/>
     <w:uiPriority w:val="99"/>
     <w:pPr>
       <w:pBdr/>
@@ -37054,9 +37713,9 @@
       </w:tcPr>
     </w:tblStylePr>
   </w:style>
-  <w:style w:type="table" w:styleId="800">
+  <w:style w:type="table" w:styleId="843">
     <w:name w:val="List Table 5 Dark - Accent 4"/>
-    <w:basedOn w:val="857"/>
+    <w:basedOn w:val="900"/>
     <w:uiPriority w:val="99"/>
     <w:pPr>
       <w:pBdr/>
@@ -37296,9 +37955,9 @@
       </w:tcPr>
     </w:tblStylePr>
   </w:style>
-  <w:style w:type="table" w:styleId="801">
+  <w:style w:type="table" w:styleId="844">
     <w:name w:val="List Table 5 Dark - Accent 5"/>
-    <w:basedOn w:val="857"/>
+    <w:basedOn w:val="900"/>
     <w:uiPriority w:val="99"/>
     <w:pPr>
       <w:pBdr/>
@@ -37538,9 +38197,9 @@
       </w:tcPr>
     </w:tblStylePr>
   </w:style>
-  <w:style w:type="table" w:styleId="802">
+  <w:style w:type="table" w:styleId="845">
     <w:name w:val="List Table 5 Dark - Accent 6"/>
-    <w:basedOn w:val="857"/>
+    <w:basedOn w:val="900"/>
     <w:uiPriority w:val="99"/>
     <w:pPr>
       <w:pBdr/>
@@ -37780,9 +38439,9 @@
       </w:tcPr>
     </w:tblStylePr>
   </w:style>
-  <w:style w:type="table" w:styleId="803">
+  <w:style w:type="table" w:styleId="846">
     <w:name w:val="List Table 6 Colorful"/>
-    <w:basedOn w:val="857"/>
+    <w:basedOn w:val="900"/>
     <w:uiPriority w:val="99"/>
     <w:pPr>
       <w:pBdr/>
@@ -38003,9 +38662,9 @@
       </w:tcPr>
     </w:tblStylePr>
   </w:style>
-  <w:style w:type="table" w:styleId="804">
+  <w:style w:type="table" w:styleId="847">
     <w:name w:val="List Table 6 Colorful - Accent 1"/>
-    <w:basedOn w:val="857"/>
+    <w:basedOn w:val="900"/>
     <w:uiPriority w:val="99"/>
     <w:pPr>
       <w:pBdr/>
@@ -38226,9 +38885,9 @@
       </w:tcPr>
     </w:tblStylePr>
   </w:style>
-  <w:style w:type="table" w:styleId="805">
+  <w:style w:type="table" w:styleId="848">
     <w:name w:val="List Table 6 Colorful - Accent 2"/>
-    <w:basedOn w:val="857"/>
+    <w:basedOn w:val="900"/>
     <w:uiPriority w:val="99"/>
     <w:pPr>
       <w:pBdr/>
@@ -38449,9 +39108,9 @@
       </w:tcPr>
     </w:tblStylePr>
   </w:style>
-  <w:style w:type="table" w:styleId="806">
+  <w:style w:type="table" w:styleId="849">
     <w:name w:val="List Table 6 Colorful - Accent 3"/>
-    <w:basedOn w:val="857"/>
+    <w:basedOn w:val="900"/>
     <w:uiPriority w:val="99"/>
     <w:pPr>
       <w:pBdr/>
@@ -38672,9 +39331,9 @@
       </w:tcPr>
     </w:tblStylePr>
   </w:style>
-  <w:style w:type="table" w:styleId="807">
+  <w:style w:type="table" w:styleId="850">
     <w:name w:val="List Table 6 Colorful - Accent 4"/>
-    <w:basedOn w:val="857"/>
+    <w:basedOn w:val="900"/>
     <w:uiPriority w:val="99"/>
     <w:pPr>
       <w:pBdr/>
@@ -38895,9 +39554,9 @@
       </w:tcPr>
     </w:tblStylePr>
   </w:style>
-  <w:style w:type="table" w:styleId="808">
+  <w:style w:type="table" w:styleId="851">
     <w:name w:val="List Table 6 Colorful - Accent 5"/>
-    <w:basedOn w:val="857"/>
+    <w:basedOn w:val="900"/>
     <w:uiPriority w:val="99"/>
     <w:pPr>
       <w:pBdr/>
@@ -39118,9 +39777,9 @@
       </w:tcPr>
     </w:tblStylePr>
   </w:style>
-  <w:style w:type="table" w:styleId="809">
+  <w:style w:type="table" w:styleId="852">
     <w:name w:val="List Table 6 Colorful - Accent 6"/>
-    <w:basedOn w:val="857"/>
+    <w:basedOn w:val="900"/>
     <w:uiPriority w:val="99"/>
     <w:pPr>
       <w:pBdr/>
@@ -39341,9 +40000,9 @@
       </w:tcPr>
     </w:tblStylePr>
   </w:style>
-  <w:style w:type="table" w:styleId="810">
+  <w:style w:type="table" w:styleId="853">
     <w:name w:val="List Table 7 Colorful"/>
-    <w:basedOn w:val="857"/>
+    <w:basedOn w:val="900"/>
     <w:uiPriority w:val="99"/>
     <w:pPr>
       <w:pBdr/>
@@ -39597,9 +40256,9 @@
       </w:tcPr>
     </w:tblStylePr>
   </w:style>
-  <w:style w:type="table" w:styleId="811">
+  <w:style w:type="table" w:styleId="854">
     <w:name w:val="List Table 7 Colorful - Accent 1"/>
-    <w:basedOn w:val="857"/>
+    <w:basedOn w:val="900"/>
     <w:uiPriority w:val="99"/>
     <w:pPr>
       <w:pBdr/>
@@ -39853,9 +40512,9 @@
       </w:tcPr>
     </w:tblStylePr>
   </w:style>
-  <w:style w:type="table" w:styleId="812">
+  <w:style w:type="table" w:styleId="855">
     <w:name w:val="List Table 7 Colorful - Accent 2"/>
-    <w:basedOn w:val="857"/>
+    <w:basedOn w:val="900"/>
     <w:uiPriority w:val="99"/>
     <w:pPr>
       <w:pBdr/>
@@ -40109,9 +40768,9 @@
       </w:tcPr>
     </w:tblStylePr>
   </w:style>
-  <w:style w:type="table" w:styleId="813">
+  <w:style w:type="table" w:styleId="856">
     <w:name w:val="List Table 7 Colorful - Accent 3"/>
-    <w:basedOn w:val="857"/>
+    <w:basedOn w:val="900"/>
     <w:uiPriority w:val="99"/>
     <w:pPr>
       <w:pBdr/>
@@ -40365,9 +41024,9 @@
       </w:tcPr>
     </w:tblStylePr>
   </w:style>
-  <w:style w:type="table" w:styleId="814">
+  <w:style w:type="table" w:styleId="857">
     <w:name w:val="List Table 7 Colorful - Accent 4"/>
-    <w:basedOn w:val="857"/>
+    <w:basedOn w:val="900"/>
     <w:uiPriority w:val="99"/>
     <w:pPr>
       <w:pBdr/>
@@ -40621,9 +41280,9 @@
       </w:tcPr>
     </w:tblStylePr>
   </w:style>
-  <w:style w:type="table" w:styleId="815">
+  <w:style w:type="table" w:styleId="858">
     <w:name w:val="List Table 7 Colorful - Accent 5"/>
-    <w:basedOn w:val="857"/>
+    <w:basedOn w:val="900"/>
     <w:uiPriority w:val="99"/>
     <w:pPr>
       <w:pBdr/>
@@ -40877,9 +41536,9 @@
       </w:tcPr>
     </w:tblStylePr>
   </w:style>
-  <w:style w:type="table" w:styleId="816">
+  <w:style w:type="table" w:styleId="859">
     <w:name w:val="List Table 7 Colorful - Accent 6"/>
-    <w:basedOn w:val="857"/>
+    <w:basedOn w:val="900"/>
     <w:uiPriority w:val="99"/>
     <w:pPr>
       <w:pBdr/>
@@ -41133,9 +41792,9 @@
       </w:tcPr>
     </w:tblStylePr>
   </w:style>
-  <w:style w:type="table" w:styleId="817">
+  <w:style w:type="table" w:styleId="860">
     <w:name w:val="Lined - Accent"/>
-    <w:basedOn w:val="857"/>
+    <w:basedOn w:val="900"/>
     <w:uiPriority w:val="99"/>
     <w:pPr>
       <w:pBdr/>
@@ -41370,9 +42029,9 @@
       </w:tcPr>
     </w:tblStylePr>
   </w:style>
-  <w:style w:type="table" w:styleId="818">
+  <w:style w:type="table" w:styleId="861">
     <w:name w:val="Lined - Accent 1"/>
-    <w:basedOn w:val="857"/>
+    <w:basedOn w:val="900"/>
     <w:uiPriority w:val="99"/>
     <w:pPr>
       <w:pBdr/>
@@ -41607,9 +42266,9 @@
       </w:tcPr>
     </w:tblStylePr>
   </w:style>
-  <w:style w:type="table" w:styleId="819">
+  <w:style w:type="table" w:styleId="862">
     <w:name w:val="Lined - Accent 2"/>
-    <w:basedOn w:val="857"/>
+    <w:basedOn w:val="900"/>
     <w:uiPriority w:val="99"/>
     <w:pPr>
       <w:pBdr/>
@@ -41844,9 +42503,9 @@
       </w:tcPr>
     </w:tblStylePr>
   </w:style>
-  <w:style w:type="table" w:styleId="820">
+  <w:style w:type="table" w:styleId="863">
     <w:name w:val="Lined - Accent 3"/>
-    <w:basedOn w:val="857"/>
+    <w:basedOn w:val="900"/>
     <w:uiPriority w:val="99"/>
     <w:pPr>
       <w:pBdr/>
@@ -42081,9 +42740,9 @@
       </w:tcPr>
     </w:tblStylePr>
   </w:style>
-  <w:style w:type="table" w:styleId="821">
+  <w:style w:type="table" w:styleId="864">
     <w:name w:val="Lined - Accent 4"/>
-    <w:basedOn w:val="857"/>
+    <w:basedOn w:val="900"/>
     <w:uiPriority w:val="99"/>
     <w:pPr>
       <w:pBdr/>
@@ -42318,9 +42977,9 @@
       </w:tcPr>
     </w:tblStylePr>
   </w:style>
-  <w:style w:type="table" w:styleId="822">
+  <w:style w:type="table" w:styleId="865">
     <w:name w:val="Lined - Accent 5"/>
-    <w:basedOn w:val="857"/>
+    <w:basedOn w:val="900"/>
     <w:uiPriority w:val="99"/>
     <w:pPr>
       <w:pBdr/>
@@ -42555,9 +43214,9 @@
       </w:tcPr>
     </w:tblStylePr>
   </w:style>
-  <w:style w:type="table" w:styleId="823">
+  <w:style w:type="table" w:styleId="866">
     <w:name w:val="Lined - Accent 6"/>
-    <w:basedOn w:val="857"/>
+    <w:basedOn w:val="900"/>
     <w:uiPriority w:val="99"/>
     <w:pPr>
       <w:pBdr/>
@@ -42792,9 +43451,9 @@
       </w:tcPr>
     </w:tblStylePr>
   </w:style>
-  <w:style w:type="table" w:styleId="824">
+  <w:style w:type="table" w:styleId="867">
     <w:name w:val="Bordered &amp; Lined - Accent"/>
-    <w:basedOn w:val="857"/>
+    <w:basedOn w:val="900"/>
     <w:uiPriority w:val="99"/>
     <w:pPr>
       <w:pBdr/>
@@ -43036,9 +43695,9 @@
       </w:tcPr>
     </w:tblStylePr>
   </w:style>
-  <w:style w:type="table" w:styleId="825">
+  <w:style w:type="table" w:styleId="868">
     <w:name w:val="Bordered &amp; Lined - Accent 1"/>
-    <w:basedOn w:val="857"/>
+    <w:basedOn w:val="900"/>
     <w:uiPriority w:val="99"/>
     <w:pPr>
       <w:pBdr/>
@@ -43280,9 +43939,9 @@
       </w:tcPr>
     </w:tblStylePr>
   </w:style>
-  <w:style w:type="table" w:styleId="826">
+  <w:style w:type="table" w:styleId="869">
     <w:name w:val="Bordered &amp; Lined - Accent 2"/>
-    <w:basedOn w:val="857"/>
+    <w:basedOn w:val="900"/>
     <w:uiPriority w:val="99"/>
     <w:pPr>
       <w:pBdr/>
@@ -43524,9 +44183,9 @@
       </w:tcPr>
     </w:tblStylePr>
   </w:style>
-  <w:style w:type="table" w:styleId="827">
+  <w:style w:type="table" w:styleId="870">
     <w:name w:val="Bordered &amp; Lined - Accent 3"/>
-    <w:basedOn w:val="857"/>
+    <w:basedOn w:val="900"/>
     <w:uiPriority w:val="99"/>
     <w:pPr>
       <w:pBdr/>
@@ -43768,9 +44427,9 @@
       </w:tcPr>
     </w:tblStylePr>
   </w:style>
-  <w:style w:type="table" w:styleId="828">
+  <w:style w:type="table" w:styleId="871">
     <w:name w:val="Bordered &amp; Lined - Accent 4"/>
-    <w:basedOn w:val="857"/>
+    <w:basedOn w:val="900"/>
     <w:uiPriority w:val="99"/>
     <w:pPr>
       <w:pBdr/>
@@ -44012,9 +44671,9 @@
       </w:tcPr>
     </w:tblStylePr>
   </w:style>
-  <w:style w:type="table" w:styleId="829">
+  <w:style w:type="table" w:styleId="872">
     <w:name w:val="Bordered &amp; Lined - Accent 5"/>
-    <w:basedOn w:val="857"/>
+    <w:basedOn w:val="900"/>
     <w:uiPriority w:val="99"/>
     <w:pPr>
       <w:pBdr/>
@@ -44256,9 +44915,9 @@
       </w:tcPr>
     </w:tblStylePr>
   </w:style>
-  <w:style w:type="table" w:styleId="830">
+  <w:style w:type="table" w:styleId="873">
     <w:name w:val="Bordered &amp; Lined - Accent 6"/>
-    <w:basedOn w:val="857"/>
+    <w:basedOn w:val="900"/>
     <w:uiPriority w:val="99"/>
     <w:pPr>
       <w:pBdr/>
@@ -44500,9 +45159,9 @@
       </w:tcPr>
     </w:tblStylePr>
   </w:style>
-  <w:style w:type="table" w:styleId="831">
+  <w:style w:type="table" w:styleId="874">
     <w:name w:val="Bordered"/>
-    <w:basedOn w:val="857"/>
+    <w:basedOn w:val="900"/>
     <w:uiPriority w:val="99"/>
     <w:pPr>
       <w:pBdr/>
@@ -44731,9 +45390,9 @@
       </w:tcPr>
     </w:tblStylePr>
   </w:style>
-  <w:style w:type="table" w:styleId="832">
+  <w:style w:type="table" w:styleId="875">
     <w:name w:val="Bordered - Accent 1"/>
-    <w:basedOn w:val="857"/>
+    <w:basedOn w:val="900"/>
     <w:uiPriority w:val="99"/>
     <w:pPr>
       <w:pBdr/>
@@ -44962,9 +45621,9 @@
       </w:tcPr>
     </w:tblStylePr>
   </w:style>
-  <w:style w:type="table" w:styleId="833">
+  <w:style w:type="table" w:styleId="876">
     <w:name w:val="Bordered - Accent 2"/>
-    <w:basedOn w:val="857"/>
+    <w:basedOn w:val="900"/>
     <w:uiPriority w:val="99"/>
     <w:pPr>
       <w:pBdr/>
@@ -45193,9 +45852,9 @@
       </w:tcPr>
     </w:tblStylePr>
   </w:style>
-  <w:style w:type="table" w:styleId="834">
+  <w:style w:type="table" w:styleId="877">
     <w:name w:val="Bordered - Accent 3"/>
-    <w:basedOn w:val="857"/>
+    <w:basedOn w:val="900"/>
     <w:uiPriority w:val="99"/>
     <w:pPr>
       <w:pBdr/>
@@ -45424,9 +46083,9 @@
       </w:tcPr>
     </w:tblStylePr>
   </w:style>
-  <w:style w:type="table" w:styleId="835">
+  <w:style w:type="table" w:styleId="878">
     <w:name w:val="Bordered - Accent 4"/>
-    <w:basedOn w:val="857"/>
+    <w:basedOn w:val="900"/>
     <w:uiPriority w:val="99"/>
     <w:pPr>
       <w:pBdr/>
@@ -45655,9 +46314,9 @@
       </w:tcPr>
     </w:tblStylePr>
   </w:style>
-  <w:style w:type="table" w:styleId="836">
+  <w:style w:type="table" w:styleId="879">
     <w:name w:val="Bordered - Accent 5"/>
-    <w:basedOn w:val="857"/>
+    <w:basedOn w:val="900"/>
     <w:uiPriority w:val="99"/>
     <w:pPr>
       <w:pBdr/>
@@ -45886,9 +46545,9 @@
       </w:tcPr>
     </w:tblStylePr>
   </w:style>
-  <w:style w:type="table" w:styleId="837">
+  <w:style w:type="table" w:styleId="880">
     <w:name w:val="Bordered - Accent 6"/>
-    <w:basedOn w:val="857"/>
+    <w:basedOn w:val="900"/>
     <w:uiPriority w:val="99"/>
     <w:pPr>
       <w:pBdr/>
@@ -46117,7 +46776,7 @@
       </w:tcPr>
     </w:tblStylePr>
   </w:style>
-  <w:style w:type="character" w:styleId="838">
+  <w:style w:type="character" w:styleId="881">
     <w:name w:val="Hyperlink"/>
     <w:uiPriority w:val="99"/>
     <w:unhideWhenUsed/>
@@ -46131,10 +46790,10 @@
       <w:u w:val="single"/>
     </w:rPr>
   </w:style>
-  <w:style w:type="paragraph" w:styleId="839">
+  <w:style w:type="paragraph" w:styleId="882">
     <w:name w:val="footnote text"/>
-    <w:basedOn w:val="856"/>
-    <w:link w:val="840"/>
+    <w:basedOn w:val="899"/>
+    <w:link w:val="883"/>
     <w:uiPriority w:val="99"/>
     <w:semiHidden/>
     <w:unhideWhenUsed/>
@@ -46147,9 +46806,9 @@
       <w:sz w:val="18"/>
     </w:rPr>
   </w:style>
-  <w:style w:type="character" w:styleId="840">
+  <w:style w:type="character" w:styleId="883">
     <w:name w:val="Footnote Text Char"/>
-    <w:link w:val="839"/>
+    <w:link w:val="882"/>
     <w:uiPriority w:val="99"/>
     <w:pPr>
       <w:pBdr/>
@@ -46160,7 +46819,7 @@
       <w:sz w:val="18"/>
     </w:rPr>
   </w:style>
-  <w:style w:type="character" w:styleId="841">
+  <w:style w:type="character" w:styleId="884">
     <w:name w:val="footnote reference"/>
     <w:uiPriority w:val="99"/>
     <w:unhideWhenUsed/>
@@ -46173,10 +46832,10 @@
       <w:vertAlign w:val="superscript"/>
     </w:rPr>
   </w:style>
-  <w:style w:type="paragraph" w:styleId="842">
+  <w:style w:type="paragraph" w:styleId="885">
     <w:name w:val="endnote text"/>
-    <w:basedOn w:val="856"/>
-    <w:link w:val="843"/>
+    <w:basedOn w:val="899"/>
+    <w:link w:val="886"/>
     <w:uiPriority w:val="99"/>
     <w:semiHidden/>
     <w:unhideWhenUsed/>
@@ -46189,9 +46848,9 @@
       <w:sz w:val="20"/>
     </w:rPr>
   </w:style>
-  <w:style w:type="character" w:styleId="843">
+  <w:style w:type="character" w:styleId="886">
     <w:name w:val="Endnote Text Char"/>
-    <w:link w:val="842"/>
+    <w:link w:val="885"/>
     <w:uiPriority w:val="99"/>
     <w:pPr>
       <w:pBdr/>
@@ -46202,7 +46861,7 @@
       <w:sz w:val="20"/>
     </w:rPr>
   </w:style>
-  <w:style w:type="character" w:styleId="844">
+  <w:style w:type="character" w:styleId="887">
     <w:name w:val="endnote reference"/>
     <w:uiPriority w:val="99"/>
     <w:semiHidden/>
@@ -46216,10 +46875,10 @@
       <w:vertAlign w:val="superscript"/>
     </w:rPr>
   </w:style>
-  <w:style w:type="paragraph" w:styleId="845">
+  <w:style w:type="paragraph" w:styleId="888">
     <w:name w:val="toc 1"/>
-    <w:basedOn w:val="856"/>
-    <w:next w:val="856"/>
+    <w:basedOn w:val="899"/>
+    <w:next w:val="899"/>
     <w:uiPriority w:val="39"/>
     <w:unhideWhenUsed/>
     <w:pPr>
@@ -46228,10 +46887,10 @@
       <w:ind w:right="0" w:firstLine="0" w:left="0"/>
     </w:pPr>
   </w:style>
-  <w:style w:type="paragraph" w:styleId="846">
+  <w:style w:type="paragraph" w:styleId="889">
     <w:name w:val="toc 2"/>
-    <w:basedOn w:val="856"/>
-    <w:next w:val="856"/>
+    <w:basedOn w:val="899"/>
+    <w:next w:val="899"/>
     <w:uiPriority w:val="39"/>
     <w:unhideWhenUsed/>
     <w:pPr>
@@ -46240,10 +46899,10 @@
       <w:ind w:right="0" w:firstLine="0" w:left="283"/>
     </w:pPr>
   </w:style>
-  <w:style w:type="paragraph" w:styleId="847">
+  <w:style w:type="paragraph" w:styleId="890">
     <w:name w:val="toc 3"/>
-    <w:basedOn w:val="856"/>
-    <w:next w:val="856"/>
+    <w:basedOn w:val="899"/>
+    <w:next w:val="899"/>
     <w:uiPriority w:val="39"/>
     <w:unhideWhenUsed/>
     <w:pPr>
@@ -46252,10 +46911,10 @@
       <w:ind w:right="0" w:firstLine="0" w:left="567"/>
     </w:pPr>
   </w:style>
-  <w:style w:type="paragraph" w:styleId="848">
+  <w:style w:type="paragraph" w:styleId="891">
     <w:name w:val="toc 4"/>
-    <w:basedOn w:val="856"/>
-    <w:next w:val="856"/>
+    <w:basedOn w:val="899"/>
+    <w:next w:val="899"/>
     <w:uiPriority w:val="39"/>
     <w:unhideWhenUsed/>
     <w:pPr>
@@ -46264,10 +46923,10 @@
       <w:ind w:right="0" w:firstLine="0" w:left="850"/>
     </w:pPr>
   </w:style>
-  <w:style w:type="paragraph" w:styleId="849">
+  <w:style w:type="paragraph" w:styleId="892">
     <w:name w:val="toc 5"/>
-    <w:basedOn w:val="856"/>
-    <w:next w:val="856"/>
+    <w:basedOn w:val="899"/>
+    <w:next w:val="899"/>
     <w:uiPriority w:val="39"/>
     <w:unhideWhenUsed/>
     <w:pPr>
@@ -46276,10 +46935,10 @@
       <w:ind w:right="0" w:firstLine="0" w:left="1134"/>
     </w:pPr>
   </w:style>
-  <w:style w:type="paragraph" w:styleId="850">
+  <w:style w:type="paragraph" w:styleId="893">
     <w:name w:val="toc 6"/>
-    <w:basedOn w:val="856"/>
-    <w:next w:val="856"/>
+    <w:basedOn w:val="899"/>
+    <w:next w:val="899"/>
     <w:uiPriority w:val="39"/>
     <w:unhideWhenUsed/>
     <w:pPr>
@@ -46288,10 +46947,10 @@
       <w:ind w:right="0" w:firstLine="0" w:left="1417"/>
     </w:pPr>
   </w:style>
-  <w:style w:type="paragraph" w:styleId="851">
+  <w:style w:type="paragraph" w:styleId="894">
     <w:name w:val="toc 7"/>
-    <w:basedOn w:val="856"/>
-    <w:next w:val="856"/>
+    <w:basedOn w:val="899"/>
+    <w:next w:val="899"/>
     <w:uiPriority w:val="39"/>
     <w:unhideWhenUsed/>
     <w:pPr>
@@ -46300,10 +46959,10 @@
       <w:ind w:right="0" w:firstLine="0" w:left="1701"/>
     </w:pPr>
   </w:style>
-  <w:style w:type="paragraph" w:styleId="852">
+  <w:style w:type="paragraph" w:styleId="895">
     <w:name w:val="toc 8"/>
-    <w:basedOn w:val="856"/>
-    <w:next w:val="856"/>
+    <w:basedOn w:val="899"/>
+    <w:next w:val="899"/>
     <w:uiPriority w:val="39"/>
     <w:unhideWhenUsed/>
     <w:pPr>
@@ -46312,10 +46971,10 @@
       <w:ind w:right="0" w:firstLine="0" w:left="1984"/>
     </w:pPr>
   </w:style>
-  <w:style w:type="paragraph" w:styleId="853">
+  <w:style w:type="paragraph" w:styleId="896">
     <w:name w:val="toc 9"/>
-    <w:basedOn w:val="856"/>
-    <w:next w:val="856"/>
+    <w:basedOn w:val="899"/>
+    <w:next w:val="899"/>
     <w:uiPriority w:val="39"/>
     <w:unhideWhenUsed/>
     <w:pPr>
@@ -46324,7 +46983,7 @@
       <w:ind w:right="0" w:firstLine="0" w:left="2268"/>
     </w:pPr>
   </w:style>
-  <w:style w:type="paragraph" w:styleId="854">
+  <w:style w:type="paragraph" w:styleId="897">
     <w:name w:val="TOC Heading"/>
     <w:uiPriority w:val="39"/>
     <w:unhideWhenUsed/>
@@ -46334,10 +46993,10 @@
       <w:ind/>
     </w:pPr>
   </w:style>
-  <w:style w:type="paragraph" w:styleId="855">
+  <w:style w:type="paragraph" w:styleId="898">
     <w:name w:val="table of figures"/>
-    <w:basedOn w:val="856"/>
-    <w:next w:val="856"/>
+    <w:basedOn w:val="899"/>
+    <w:next w:val="899"/>
     <w:uiPriority w:val="99"/>
     <w:unhideWhenUsed/>
     <w:pPr>
@@ -46346,7 +47005,7 @@
       <w:ind/>
     </w:pPr>
   </w:style>
-  <w:style w:type="paragraph" w:styleId="856" w:default="1">
+  <w:style w:type="paragraph" w:styleId="899" w:default="1">
     <w:name w:val="Normal"/>
     <w:qFormat/>
     <w:pPr>
@@ -46355,7 +47014,7 @@
       <w:ind/>
     </w:pPr>
   </w:style>
-  <w:style w:type="table" w:styleId="857" w:default="1">
+  <w:style w:type="table" w:styleId="900" w:default="1">
     <w:name w:val="Normal Table"/>
     <w:uiPriority w:val="99"/>
     <w:semiHidden/>
@@ -46548,7 +47207,7 @@
       </w:tcPr>
     </w:tblStylePr>
   </w:style>
-  <w:style w:type="numbering" w:styleId="858" w:default="1">
+  <w:style w:type="numbering" w:styleId="901" w:default="1">
     <w:name w:val="No List"/>
     <w:uiPriority w:val="99"/>
     <w:semiHidden/>
@@ -46559,9 +47218,9 @@
       <w:ind/>
     </w:pPr>
   </w:style>
-  <w:style w:type="paragraph" w:styleId="859">
+  <w:style w:type="paragraph" w:styleId="902">
     <w:name w:val="No Spacing"/>
-    <w:basedOn w:val="856"/>
+    <w:basedOn w:val="899"/>
     <w:uiPriority w:val="1"/>
     <w:qFormat/>
     <w:pPr>
@@ -46570,9 +47229,9 @@
       <w:ind/>
     </w:pPr>
   </w:style>
-  <w:style w:type="paragraph" w:styleId="860">
+  <w:style w:type="paragraph" w:styleId="903">
     <w:name w:val="List Paragraph"/>
-    <w:basedOn w:val="856"/>
+    <w:basedOn w:val="899"/>
     <w:uiPriority w:val="34"/>
     <w:qFormat/>
     <w:pPr>
@@ -46582,7 +47241,7 @@
       <w:contextualSpacing w:val="true"/>
     </w:pPr>
   </w:style>
-  <w:style w:type="character" w:styleId="861" w:default="1">
+  <w:style w:type="character" w:styleId="904" w:default="1">
     <w:name w:val="Default Paragraph Font"/>
     <w:uiPriority w:val="1"/>
     <w:semiHidden/>

</xml_diff>

<commit_message>
A bit more design, this time on satellites
</commit_message>
<xml_diff>
--- a/Design.docx
+++ b/Design.docx
@@ -4173,7 +4173,7 @@
           <w:szCs w:val="22"/>
           <w:highlight w:val="none"/>
         </w:rPr>
-        <w:t xml:space="preserve">hat my program needs, these will be implemented in a separate file from the main one and imported as a module. The module will be imported as “vec” which is why you will see things like “vec.mag(vector)” in later pseudocode. The four operations needed are:</w:t>
+        <w:t xml:space="preserve">hat my program needs, these will be implemented in a separate file from the main one and imported as a module. The module will be imported as “vec” which is why you will see things like “vec.mag(vector)” in later pseudocode. The thrree operations needed are:</w:t>
       </w:r>
       <w:r>
         <w:rPr>
@@ -4216,7 +4216,7 @@
           <w:szCs w:val="22"/>
           <w:highlight w:val="none"/>
         </w:rPr>
-        <w:t xml:space="preserve">The dot product</w:t>
+        <w:t xml:space="preserve">Finding the magnitude of a vector</w:t>
       </w:r>
       <w:r>
         <w:rPr>
@@ -4259,7 +4259,7 @@
           <w:szCs w:val="22"/>
           <w:highlight w:val="none"/>
         </w:rPr>
-        <w:t xml:space="preserve">Finding the magnitude of a vector</w:t>
+        <w:t xml:space="preserve">Finding the unit vector for a vector</w:t>
       </w:r>
       <w:r>
         <w:rPr>
@@ -4302,7 +4302,7 @@
           <w:szCs w:val="22"/>
           <w:highlight w:val="none"/>
         </w:rPr>
-        <w:t xml:space="preserve">Finding the unit vector for a vector</w:t>
+        <w:t xml:space="preserve">Finding a normal to a vector</w:t>
       </w:r>
       <w:r>
         <w:rPr>
@@ -4323,59 +4323,25 @@
     </w:p>
     <w:p>
       <w:pPr>
-        <w:pStyle w:val="903"/>
-        <w:numPr>
-          <w:ilvl w:val="0"/>
-          <w:numId w:val="1"/>
-        </w:numPr>
-        <w:pBdr/>
-        <w:spacing/>
-        <w:ind/>
-        <w:rPr>
-          <w:color w:val="000000"/>
-          <w:sz w:val="22"/>
-          <w:szCs w:val="22"/>
-          <w:highlight w:val="none"/>
-        </w:rPr>
-      </w:pPr>
-      <w:r>
+        <w:pBdr/>
+        <w:spacing/>
+        <w:ind/>
         <w:rPr>
           <w:color w:val="000000" w:themeColor="text1"/>
           <w:sz w:val="22"/>
           <w:szCs w:val="22"/>
           <w:highlight w:val="none"/>
         </w:rPr>
-        <w:t xml:space="preserve">Finding a normal to a vector</w:t>
-      </w:r>
-      <w:r>
-        <w:rPr>
-          <w:color w:val="000000"/>
-          <w:sz w:val="22"/>
-          <w:szCs w:val="22"/>
-          <w:highlight w:val="none"/>
-        </w:rPr>
-      </w:r>
-      <w:r>
-        <w:rPr>
-          <w:color w:val="000000"/>
-          <w:sz w:val="22"/>
-          <w:szCs w:val="22"/>
-          <w:highlight w:val="none"/>
-        </w:rPr>
-      </w:r>
-    </w:p>
-    <w:p>
-      <w:pPr>
-        <w:pBdr/>
-        <w:spacing/>
-        <w:ind/>
+      </w:pPr>
+      <w:r>
         <w:rPr>
           <w:color w:val="000000" w:themeColor="text1"/>
           <w:sz w:val="22"/>
           <w:szCs w:val="22"/>
           <w:highlight w:val="none"/>
         </w:rPr>
-      </w:pPr>
+        <w:t xml:space="preserve">Luckily these are all relatively simple to implement.</w:t>
+      </w:r>
       <w:r>
         <w:rPr>
           <w:color w:val="000000" w:themeColor="text1"/>
@@ -4383,510 +4349,10 @@
           <w:szCs w:val="22"/>
           <w:highlight w:val="none"/>
         </w:rPr>
-        <w:t xml:space="preserve">Luckily these are all relatively simple to implement.</w:t>
       </w:r>
       <w:r>
         <w:rPr>
           <w:color w:val="000000" w:themeColor="text1"/>
-          <w:sz w:val="22"/>
-          <w:szCs w:val="22"/>
-          <w:highlight w:val="none"/>
-        </w:rPr>
-      </w:r>
-      <w:r>
-        <w:rPr>
-          <w:color w:val="000000" w:themeColor="text1"/>
-          <w:sz w:val="22"/>
-          <w:szCs w:val="22"/>
-          <w:highlight w:val="none"/>
-        </w:rPr>
-      </w:r>
-    </w:p>
-    <w:p>
-      <w:pPr>
-        <w:pBdr/>
-        <w:spacing/>
-        <w:ind/>
-        <w:rPr>
-          <w:color w:val="2f5496" w:themeColor="accent5" w:themeShade="BF"/>
-          <w:sz w:val="22"/>
-          <w:szCs w:val="18"/>
-          <w:highlight w:val="none"/>
-        </w:rPr>
-      </w:pPr>
-      <w:r>
-        <w:rPr>
-          <w:color w:val="2f5496" w:themeColor="accent5" w:themeShade="BF"/>
-          <w:sz w:val="24"/>
-          <w:szCs w:val="20"/>
-          <w:highlight w:val="none"/>
-        </w:rPr>
-        <w:t xml:space="preserve">Dot product</w:t>
-      </w:r>
-      <w:r>
-        <w:rPr>
-          <w:color w:val="2f5496" w:themeColor="accent5" w:themeShade="BF"/>
-          <w:sz w:val="22"/>
-          <w:szCs w:val="18"/>
-          <w:highlight w:val="none"/>
-        </w:rPr>
-      </w:r>
-      <w:r>
-        <w:rPr>
-          <w:color w:val="2f5496" w:themeColor="accent5" w:themeShade="BF"/>
-          <w:sz w:val="22"/>
-          <w:szCs w:val="18"/>
-          <w:highlight w:val="none"/>
-        </w:rPr>
-      </w:r>
-    </w:p>
-    <w:p>
-      <w:pPr>
-        <w:pBdr/>
-        <w:spacing/>
-        <w:ind/>
-        <w:rPr>
-          <w:color w:val="000000" w:themeColor="text1"/>
-          <w:sz w:val="22"/>
-          <w:szCs w:val="22"/>
-          <w:highlight w:val="none"/>
-        </w:rPr>
-      </w:pPr>
-      <w:r>
-        <w:rPr>
-          <w:color w:val="000000" w:themeColor="text1"/>
-          <w:sz w:val="22"/>
-          <w:szCs w:val="22"/>
-          <w:highlight w:val="none"/>
-        </w:rPr>
-        <w:t xml:space="preserve">The dot product between two dimensional vectors is defined as follow</w:t>
-      </w:r>
-      <w:r>
-        <w:rPr>
-          <w:color w:val="000000" w:themeColor="text1"/>
-          <w:sz w:val="22"/>
-          <w:szCs w:val="22"/>
-          <w:highlight w:val="none"/>
-        </w:rPr>
-        <w:t xml:space="preserve">s:</w:t>
-      </w:r>
-      <w:r>
-        <w:rPr>
-          <w:color w:val="000000" w:themeColor="text1"/>
-          <w:sz w:val="22"/>
-          <w:szCs w:val="22"/>
-          <w:highlight w:val="none"/>
-        </w:rPr>
-      </w:r>
-      <w:r>
-        <w:rPr>
-          <w:color w:val="000000" w:themeColor="text1"/>
-          <w:sz w:val="22"/>
-          <w:szCs w:val="22"/>
-          <w:highlight w:val="none"/>
-        </w:rPr>
-      </w:r>
-    </w:p>
-    <w:p>
-      <w:pPr>
-        <w:pBdr/>
-        <w:spacing/>
-        <w:ind/>
-        <w:rPr>
-          <w:color w:val="000000"/>
-          <w:sz w:val="22"/>
-          <w:szCs w:val="22"/>
-          <w:highlight w:val="none"/>
-        </w:rPr>
-      </w:pPr>
-      <w:r>
-        <w:rPr>
-          <w:color w:val="000000" w:themeColor="text1"/>
-          <w:sz w:val="22"/>
-          <w:szCs w:val="22"/>
-          <w:highlight w:val="none"/>
-        </w:rPr>
-      </w:r>
-      <m:oMathPara>
-        <m:oMathParaPr/>
-        <m:oMath>
-          <m:d>
-            <m:dPr>
-              <m:ctrlPr>
-                <w:rPr>
-                  <w:rFonts w:ascii="Cambria Math" w:hAnsi="Cambria Math" w:eastAsia="Cambria Math" w:cs="Cambria Math"/>
-                  <w:i/>
-                  <w:color w:val="000000" w:themeColor="text1"/>
-                  <w:sz w:val="22"/>
-                  <w:highlight w:val="none"/>
-                </w:rPr>
-              </m:ctrlPr>
-            </m:dPr>
-            <m:e>
-              <m:f>
-                <m:fPr>
-                  <m:type m:val="noBar"/>
-                  <m:ctrlPr>
-                    <w:rPr>
-                      <w:rFonts w:ascii="Cambria Math" w:hAnsi="Cambria Math" w:eastAsia="Cambria Math" w:cs="Cambria Math"/>
-                      <w:i/>
-                      <w:color w:val="000000" w:themeColor="text1"/>
-                      <w:sz w:val="22"/>
-                      <w:highlight w:val="none"/>
-                    </w:rPr>
-                  </m:ctrlPr>
-                </m:fPr>
-                <m:num>
-                  <m:r>
-                    <w:rPr>
-                      <w:rFonts w:hint="default" w:ascii="Cambria Math" w:hAnsi="Cambria Math" w:eastAsia="Cambria Math" w:cs="Cambria Math"/>
-                      <w:color w:val="000000" w:themeColor="text1"/>
-                      <w:sz w:val="22"/>
-                      <w:szCs w:val="22"/>
-                      <w:highlight w:val="none"/>
-                    </w:rPr>
-                    <m:rPr>
-                      <m:sty m:val="i"/>
-                    </m:rPr>
-                    <m:t>a</m:t>
-                  </m:r>
-                </m:num>
-                <m:den>
-                  <m:r>
-                    <w:rPr>
-                      <w:rFonts w:hint="default" w:ascii="Cambria Math" w:hAnsi="Cambria Math" w:eastAsia="Cambria Math" w:cs="Cambria Math"/>
-                      <w:color w:val="000000" w:themeColor="text1"/>
-                      <w:sz w:val="22"/>
-                      <w:szCs w:val="22"/>
-                      <w:highlight w:val="none"/>
-                    </w:rPr>
-                    <m:rPr>
-                      <m:sty m:val="i"/>
-                    </m:rPr>
-                    <m:t>b</m:t>
-                  </m:r>
-                </m:den>
-              </m:f>
-            </m:e>
-          </m:d>
-          <m:r>
-            <w:rPr>
-              <w:rFonts w:hint="default" w:ascii="Cambria Math" w:hAnsi="Cambria Math" w:eastAsia="Cambria Math" w:cs="Cambria Math"/>
-              <w:color w:val="000000" w:themeColor="text1"/>
-              <w:sz w:val="22"/>
-              <w:szCs w:val="22"/>
-              <w:highlight w:val="none"/>
-            </w:rPr>
-            <m:rPr>
-              <m:sty m:val="i"/>
-            </m:rPr>
-            <m:t>∙</m:t>
-          </m:r>
-          <m:d>
-            <m:dPr>
-              <m:ctrlPr>
-                <w:rPr>
-                  <w:rFonts w:ascii="Cambria Math" w:hAnsi="Cambria Math" w:eastAsia="Cambria Math" w:cs="Cambria Math"/>
-                  <w:i/>
-                  <w:color w:val="000000" w:themeColor="text1"/>
-                  <w:sz w:val="22"/>
-                  <w:highlight w:val="none"/>
-                </w:rPr>
-              </m:ctrlPr>
-            </m:dPr>
-            <m:e>
-              <m:f>
-                <m:fPr>
-                  <m:type m:val="noBar"/>
-                  <m:ctrlPr>
-                    <w:rPr>
-                      <w:rFonts w:ascii="Cambria Math" w:hAnsi="Cambria Math" w:eastAsia="Cambria Math" w:cs="Cambria Math"/>
-                      <w:i/>
-                      <w:color w:val="000000" w:themeColor="text1"/>
-                      <w:sz w:val="22"/>
-                      <w:highlight w:val="none"/>
-                    </w:rPr>
-                  </m:ctrlPr>
-                </m:fPr>
-                <m:num>
-                  <m:r>
-                    <w:rPr>
-                      <w:rFonts w:hint="default" w:ascii="Cambria Math" w:hAnsi="Cambria Math" w:eastAsia="Cambria Math" w:cs="Cambria Math"/>
-                      <w:color w:val="000000" w:themeColor="text1"/>
-                      <w:sz w:val="22"/>
-                      <w:szCs w:val="22"/>
-                      <w:highlight w:val="none"/>
-                    </w:rPr>
-                    <m:rPr>
-                      <m:sty m:val="i"/>
-                    </m:rPr>
-                    <m:t>c</m:t>
-                  </m:r>
-                </m:num>
-                <m:den>
-                  <m:r>
-                    <w:rPr>
-                      <w:rFonts w:hint="default" w:ascii="Cambria Math" w:hAnsi="Cambria Math" w:eastAsia="Cambria Math" w:cs="Cambria Math"/>
-                      <w:color w:val="000000" w:themeColor="text1"/>
-                      <w:sz w:val="22"/>
-                      <w:szCs w:val="22"/>
-                      <w:highlight w:val="none"/>
-                    </w:rPr>
-                    <m:rPr>
-                      <m:sty m:val="i"/>
-                    </m:rPr>
-                    <m:t>d</m:t>
-                  </m:r>
-                </m:den>
-              </m:f>
-            </m:e>
-          </m:d>
-          <m:r>
-            <w:rPr>
-              <w:rFonts w:hint="default" w:ascii="Cambria Math" w:hAnsi="Cambria Math" w:eastAsia="Cambria Math" w:cs="Cambria Math"/>
-              <w:color w:val="000000" w:themeColor="text1"/>
-              <w:sz w:val="22"/>
-              <w:szCs w:val="22"/>
-              <w:highlight w:val="none"/>
-            </w:rPr>
-            <m:rPr>
-              <m:sty m:val="i"/>
-            </m:rPr>
-            <m:t>=ac+bd</m:t>
-          </m:r>
-        </m:oMath>
-      </m:oMathPara>
-      <w:r>
-        <w:rPr>
-          <w:color w:val="000000"/>
-          <w:sz w:val="22"/>
-          <w:szCs w:val="22"/>
-          <w:highlight w:val="none"/>
-        </w:rPr>
-      </w:r>
-      <w:r>
-        <w:rPr>
-          <w:color w:val="000000"/>
-          <w:sz w:val="22"/>
-          <w:szCs w:val="22"/>
-          <w:highlight w:val="none"/>
-        </w:rPr>
-      </w:r>
-    </w:p>
-    <w:p>
-      <w:pPr>
-        <w:pBdr/>
-        <w:spacing/>
-        <w:ind/>
-        <w:rPr>
-          <w:color w:val="000000"/>
-          <w:sz w:val="22"/>
-          <w:szCs w:val="22"/>
-          <w:highlight w:val="none"/>
-        </w:rPr>
-      </w:pPr>
-      <w:r>
-        <w:rPr>
-          <w:color w:val="000000" w:themeColor="text1"/>
-          <w:sz w:val="22"/>
-          <w:szCs w:val="22"/>
-          <w:highlight w:val="none"/>
-        </w:rPr>
-        <w:t xml:space="preserve">It’s the first element * first element + second element * second element. This pattern continues for higher dimensional vectors as well.</w:t>
-      </w:r>
-      <w:r>
-        <w:rPr>
-          <w:color w:val="000000"/>
-          <w:sz w:val="22"/>
-          <w:szCs w:val="22"/>
-          <w:highlight w:val="none"/>
-        </w:rPr>
-      </w:r>
-      <w:r>
-        <w:rPr>
-          <w:color w:val="000000"/>
-          <w:sz w:val="22"/>
-          <w:szCs w:val="22"/>
-          <w:highlight w:val="none"/>
-        </w:rPr>
-      </w:r>
-    </w:p>
-    <w:p>
-      <w:pPr>
-        <w:pBdr/>
-        <w:spacing/>
-        <w:ind/>
-        <w:rPr>
-          <w:color w:val="000000"/>
-          <w:sz w:val="22"/>
-          <w:szCs w:val="22"/>
-          <w:highlight w:val="none"/>
-        </w:rPr>
-      </w:pPr>
-      <w:r>
-        <w:rPr>
-          <w:color w:val="000000" w:themeColor="text1"/>
-          <w:sz w:val="22"/>
-          <w:szCs w:val="22"/>
-          <w:highlight w:val="none"/>
-        </w:rPr>
-        <w:t xml:space="preserve">The dot product between vectors of different lengths is not defined, hence an if statement should be used to check the vectors are the same length and output an error if not.</w:t>
-      </w:r>
-      <w:r>
-        <w:rPr>
-          <w:color w:val="000000"/>
-          <w:sz w:val="22"/>
-          <w:szCs w:val="22"/>
-          <w:highlight w:val="none"/>
-        </w:rPr>
-      </w:r>
-      <w:r>
-        <w:rPr>
-          <w:color w:val="000000"/>
-          <w:sz w:val="22"/>
-          <w:szCs w:val="22"/>
-          <w:highlight w:val="none"/>
-        </w:rPr>
-      </w:r>
-    </w:p>
-    <w:p>
-      <w:pPr>
-        <w:pBdr/>
-        <w:spacing/>
-        <w:ind/>
-        <w:rPr>
-          <w:color w:val="000000"/>
-          <w:sz w:val="22"/>
-          <w:szCs w:val="22"/>
-          <w:highlight w:val="none"/>
-        </w:rPr>
-      </w:pPr>
-      <w:r>
-        <w:rPr>
-          <w:color w:val="000000" w:themeColor="text1"/>
-          <w:sz w:val="22"/>
-          <w:szCs w:val="22"/>
-          <w:highlight w:val="none"/>
-        </w:rPr>
-        <w:t xml:space="preserve">Here is pseudocode for calculating the dot product:</w:t>
-      </w:r>
-      <w:r>
-        <w:rPr>
-          <w:color w:val="000000"/>
-          <w:sz w:val="22"/>
-          <w:szCs w:val="22"/>
-          <w:highlight w:val="none"/>
-        </w:rPr>
-      </w:r>
-      <w:r>
-        <w:rPr>
-          <w:color w:val="000000"/>
-          <w:sz w:val="22"/>
-          <w:szCs w:val="22"/>
-          <w:highlight w:val="none"/>
-        </w:rPr>
-      </w:r>
-    </w:p>
-    <w:p>
-      <w:pPr>
-        <w:pBdr/>
-        <w:spacing/>
-        <w:ind/>
-        <w:rPr>
-          <w:color w:val="000000"/>
-          <w:sz w:val="22"/>
-          <w:szCs w:val="22"/>
-          <w:highlight w:val="none"/>
-        </w:rPr>
-      </w:pPr>
-      <w:r>
-        <w:rPr>
-          <w:color w:val="000000" w:themeColor="text1"/>
-          <w:sz w:val="22"/>
-          <w:szCs w:val="22"/>
-          <w:highlight w:val="none"/>
-        </w:rPr>
-      </w:r>
-      <w:r>
-        <mc:AlternateContent>
-          <mc:Choice Requires="wpg">
-            <w:drawing>
-              <wp:inline xmlns:wp="http://schemas.openxmlformats.org/drawingml/2006/wordprocessingDrawing" distT="0" distB="0" distL="0" distR="0">
-                <wp:extent cx="5940425" cy="2024308"/>
-                <wp:effectExtent l="0" t="0" r="0" b="0"/>
-                <wp:docPr id="12" name=""/>
-                <wp:cNvGraphicFramePr>
-                  <a:graphicFrameLocks xmlns:a="http://schemas.openxmlformats.org/drawingml/2006/main" noChangeAspect="1"/>
-                </wp:cNvGraphicFramePr>
-                <a:graphic xmlns:a="http://schemas.openxmlformats.org/drawingml/2006/main">
-                  <a:graphicData uri="http://schemas.openxmlformats.org/drawingml/2006/picture">
-                    <pic:pic xmlns:pic="http://schemas.openxmlformats.org/drawingml/2006/picture">
-                      <pic:nvPicPr>
-                        <pic:cNvPr id="240713866" name=""/>
-                        <pic:cNvPicPr>
-                          <a:picLocks noChangeAspect="1"/>
-                        </pic:cNvPicPr>
-                        <pic:nvPr/>
-                      </pic:nvPicPr>
-                      <pic:blipFill>
-                        <a:blip r:embed="rId23"/>
-                        <a:stretch/>
-                      </pic:blipFill>
-                      <pic:spPr bwMode="auto">
-                        <a:xfrm>
-                          <a:off x="0" y="0"/>
-                          <a:ext cx="5940424" cy="2024307"/>
-                        </a:xfrm>
-                        <a:prstGeom prst="rect">
-                          <a:avLst/>
-                        </a:prstGeom>
-                      </pic:spPr>
-                    </pic:pic>
-                  </a:graphicData>
-                </a:graphic>
-              </wp:inline>
-            </w:drawing>
-          </mc:Choice>
-          <mc:Fallback>
-            <w:pict>
-              <v:shapetype id="_x0000_t75" coordsize="21600,21600" o:spt="75" o:preferrelative="t" path="m@4@5l@4@11@9@11@9@5xe" filled="f" stroked="f">
-                <v:stroke joinstyle="miter"/>
-                <v:formulas>
-                  <v:f eqn="if lineDrawn pixelLineWidth 0"/>
-                  <v:f eqn="sum @0 1 0"/>
-                  <v:f eqn="sum 0 0 @1"/>
-                  <v:f eqn="prod @2 1 2"/>
-                  <v:f eqn="prod @3 21600 pixelWidth"/>
-                  <v:f eqn="prod @3 21600 pixelHeight"/>
-                  <v:f eqn="sum @0 0 1"/>
-                  <v:f eqn="prod @6 1 2"/>
-                  <v:f eqn="prod @7 21600 pixelWidth"/>
-                  <v:f eqn="sum @8 21600 0"/>
-                  <v:f eqn="prod @7 21600 pixelHeight"/>
-                  <v:f eqn="sum @10 21600 0"/>
-                </v:formulas>
-                <v:path o:extrusionok="f" gradientshapeok="t" o:connecttype="rect"/>
-                <o:lock v:ext="edit" aspectratio="t"/>
-              </v:shapetype>
-              <v:shape id="_x0000_i11" o:spid="_x0000_s11" type="#_x0000_t75" style="width:467.75pt;height:159.39pt;mso-wrap-distance-left:0.00pt;mso-wrap-distance-top:0.00pt;mso-wrap-distance-right:0.00pt;mso-wrap-distance-bottom:0.00pt;z-index:1;" stroked="false">
-                <v:imagedata r:id="rId23" o:title=""/>
-                <o:lock v:ext="edit" rotation="t"/>
-              </v:shape>
-            </w:pict>
-          </mc:Fallback>
-        </mc:AlternateContent>
-      </w:r>
-      <w:r>
-        <w:rPr>
-          <w:color w:val="000000"/>
-          <w:sz w:val="22"/>
-          <w:szCs w:val="22"/>
-          <w:highlight w:val="none"/>
-        </w:rPr>
-      </w:r>
-      <w:r>
-        <w:rPr>
-          <w:color w:val="000000"/>
           <w:sz w:val="22"/>
           <w:szCs w:val="22"/>
           <w:highlight w:val="none"/>
@@ -5029,7 +4495,7 @@
               <wp:inline xmlns:wp="http://schemas.openxmlformats.org/drawingml/2006/wordprocessingDrawing" distT="0" distB="0" distL="0" distR="0">
                 <wp:extent cx="2838450" cy="1924050"/>
                 <wp:effectExtent l="0" t="0" r="0" b="0"/>
-                <wp:docPr id="13" name=""/>
+                <wp:docPr id="12" name=""/>
                 <wp:cNvGraphicFramePr>
                   <a:graphicFrameLocks xmlns:a="http://schemas.openxmlformats.org/drawingml/2006/main" noChangeAspect="1"/>
                 </wp:cNvGraphicFramePr>
@@ -5044,7 +4510,7 @@
                         <pic:nvPr/>
                       </pic:nvPicPr>
                       <pic:blipFill>
-                        <a:blip r:embed="rId24"/>
+                        <a:blip r:embed="rId23"/>
                         <a:stretch/>
                       </pic:blipFill>
                       <pic:spPr bwMode="auto">
@@ -5083,8 +4549,8 @@
                 <v:path o:extrusionok="f" gradientshapeok="t" o:connecttype="rect"/>
                 <o:lock v:ext="edit" aspectratio="t"/>
               </v:shapetype>
-              <v:shape id="_x0000_i12" o:spid="_x0000_s12" type="#_x0000_t75" style="width:223.50pt;height:151.50pt;mso-wrap-distance-left:0.00pt;mso-wrap-distance-top:0.00pt;mso-wrap-distance-right:0.00pt;mso-wrap-distance-bottom:0.00pt;z-index:1;" stroked="false">
-                <v:imagedata r:id="rId24" o:title=""/>
+              <v:shape id="_x0000_i11" o:spid="_x0000_s11" type="#_x0000_t75" style="width:223.50pt;height:151.50pt;mso-wrap-distance-left:0.00pt;mso-wrap-distance-top:0.00pt;mso-wrap-distance-right:0.00pt;mso-wrap-distance-bottom:0.00pt;z-index:1;" stroked="false">
+                <v:imagedata r:id="rId23" o:title=""/>
                 <o:lock v:ext="edit" rotation="t"/>
               </v:shape>
             </w:pict>
@@ -5528,7 +4994,7 @@
               <wp:inline xmlns:wp="http://schemas.openxmlformats.org/drawingml/2006/wordprocessingDrawing" distT="0" distB="0" distL="0" distR="0">
                 <wp:extent cx="5940425" cy="4304439"/>
                 <wp:effectExtent l="0" t="0" r="0" b="0"/>
-                <wp:docPr id="14" name=""/>
+                <wp:docPr id="13" name=""/>
                 <wp:cNvGraphicFramePr>
                   <a:graphicFrameLocks xmlns:a="http://schemas.openxmlformats.org/drawingml/2006/main" noChangeAspect="1"/>
                 </wp:cNvGraphicFramePr>
@@ -5543,7 +5009,7 @@
                         <pic:nvPr/>
                       </pic:nvPicPr>
                       <pic:blipFill>
-                        <a:blip r:embed="rId25"/>
+                        <a:blip r:embed="rId24"/>
                         <a:stretch/>
                       </pic:blipFill>
                       <pic:spPr bwMode="auto">
@@ -5582,8 +5048,8 @@
                 <v:path o:extrusionok="f" gradientshapeok="t" o:connecttype="rect"/>
                 <o:lock v:ext="edit" aspectratio="t"/>
               </v:shapetype>
-              <v:shape id="_x0000_i13" o:spid="_x0000_s13" type="#_x0000_t75" style="width:467.75pt;height:338.93pt;mso-wrap-distance-left:0.00pt;mso-wrap-distance-top:0.00pt;mso-wrap-distance-right:0.00pt;mso-wrap-distance-bottom:0.00pt;z-index:1;" stroked="false">
-                <v:imagedata r:id="rId25" o:title=""/>
+              <v:shape id="_x0000_i12" o:spid="_x0000_s12" type="#_x0000_t75" style="width:467.75pt;height:338.93pt;mso-wrap-distance-left:0.00pt;mso-wrap-distance-top:0.00pt;mso-wrap-distance-right:0.00pt;mso-wrap-distance-bottom:0.00pt;z-index:1;" stroked="false">
+                <v:imagedata r:id="rId24" o:title=""/>
                 <o:lock v:ext="edit" rotation="t"/>
               </v:shape>
             </w:pict>
@@ -7863,7 +7329,7 @@
               <wp:inline xmlns:wp="http://schemas.openxmlformats.org/drawingml/2006/wordprocessingDrawing" distT="0" distB="0" distL="0" distR="0">
                 <wp:extent cx="5940425" cy="5451213"/>
                 <wp:effectExtent l="0" t="0" r="0" b="0"/>
-                <wp:docPr id="15" name=""/>
+                <wp:docPr id="14" name=""/>
                 <wp:cNvGraphicFramePr>
                   <a:graphicFrameLocks xmlns:a="http://schemas.openxmlformats.org/drawingml/2006/main" noChangeAspect="1"/>
                 </wp:cNvGraphicFramePr>
@@ -7878,7 +7344,7 @@
                         <pic:nvPr/>
                       </pic:nvPicPr>
                       <pic:blipFill>
-                        <a:blip r:embed="rId26"/>
+                        <a:blip r:embed="rId25"/>
                         <a:stretch/>
                       </pic:blipFill>
                       <pic:spPr bwMode="auto">
@@ -7917,8 +7383,8 @@
                 <v:path o:extrusionok="f" gradientshapeok="t" o:connecttype="rect"/>
                 <o:lock v:ext="edit" aspectratio="t"/>
               </v:shapetype>
-              <v:shape id="_x0000_i14" o:spid="_x0000_s14" type="#_x0000_t75" style="width:467.75pt;height:429.23pt;mso-wrap-distance-left:0.00pt;mso-wrap-distance-top:0.00pt;mso-wrap-distance-right:0.00pt;mso-wrap-distance-bottom:0.00pt;z-index:1;" stroked="false">
-                <v:imagedata r:id="rId26" o:title=""/>
+              <v:shape id="_x0000_i13" o:spid="_x0000_s13" type="#_x0000_t75" style="width:467.75pt;height:429.23pt;mso-wrap-distance-left:0.00pt;mso-wrap-distance-top:0.00pt;mso-wrap-distance-right:0.00pt;mso-wrap-distance-bottom:0.00pt;z-index:1;" stroked="false">
+                <v:imagedata r:id="rId25" o:title=""/>
                 <o:lock v:ext="edit" rotation="t"/>
               </v:shape>
             </w:pict>
@@ -8270,7 +7736,7 @@
           <w:szCs w:val="22"/>
           <w:highlight w:val="none"/>
         </w:rPr>
-        <w:t xml:space="preserve">put before it’s returned, which is used in the satellite subclass to change the way its orbital lines look to make them look better. Making everything a getter leaves room open for further editing in the future if needed, and makes the program more robust.</w:t>
+        <w:t xml:space="preserve">put before it’s returned, which is used in the satellite subclass to change the way its orbital lines look to make them look better. Making everything a getter leaves room open for further editing in the future if needed, and makes the program more robust. Note that there is a getHost() function even though the host attribute is always null and never used by the celestialBody class. This is to ensure compatibility with the satellite subclass, we can run getHost() on an object without having to worry about if it’s a satellite or planet, and if the host is null then we just ignore it.</w:t>
       </w:r>
       <w:r>
         <w:rPr>
@@ -8372,7 +7838,7 @@
               <wp:inline xmlns:wp="http://schemas.openxmlformats.org/drawingml/2006/wordprocessingDrawing" distT="0" distB="0" distL="0" distR="0">
                 <wp:extent cx="5940425" cy="1051470"/>
                 <wp:effectExtent l="0" t="0" r="0" b="0"/>
-                <wp:docPr id="16" name=""/>
+                <wp:docPr id="15" name=""/>
                 <wp:cNvGraphicFramePr>
                   <a:graphicFrameLocks xmlns:a="http://schemas.openxmlformats.org/drawingml/2006/main" noChangeAspect="1"/>
                 </wp:cNvGraphicFramePr>
@@ -8387,7 +7853,7 @@
                         <pic:nvPr/>
                       </pic:nvPicPr>
                       <pic:blipFill>
-                        <a:blip r:embed="rId27"/>
+                        <a:blip r:embed="rId26"/>
                         <a:stretch/>
                       </pic:blipFill>
                       <pic:spPr bwMode="auto">
@@ -8426,8 +7892,8 @@
                 <v:path o:extrusionok="f" gradientshapeok="t" o:connecttype="rect"/>
                 <o:lock v:ext="edit" aspectratio="t"/>
               </v:shapetype>
-              <v:shape id="_x0000_i15" o:spid="_x0000_s15" type="#_x0000_t75" style="width:467.75pt;height:82.79pt;mso-wrap-distance-left:0.00pt;mso-wrap-distance-top:0.00pt;mso-wrap-distance-right:0.00pt;mso-wrap-distance-bottom:0.00pt;z-index:1;" stroked="false">
-                <v:imagedata r:id="rId27" o:title=""/>
+              <v:shape id="_x0000_i14" o:spid="_x0000_s14" type="#_x0000_t75" style="width:467.75pt;height:82.79pt;mso-wrap-distance-left:0.00pt;mso-wrap-distance-top:0.00pt;mso-wrap-distance-right:0.00pt;mso-wrap-distance-bottom:0.00pt;z-index:1;" stroked="false">
+                <v:imagedata r:id="rId26" o:title=""/>
                 <o:lock v:ext="edit" rotation="t"/>
               </v:shape>
             </w:pict>
@@ -8480,6 +7946,14 @@
           <w:highlight w:val="none"/>
         </w:rPr>
       </w:r>
+      <w:r>
+        <w:rPr>
+          <w:color w:val="000000"/>
+          <w:sz w:val="22"/>
+          <w:szCs w:val="22"/>
+          <w:highlight w:val="none"/>
+        </w:rPr>
+      </w:r>
     </w:p>
     <w:p>
       <w:pPr>
@@ -8509,6 +7983,14 @@
           <w:highlight w:val="none"/>
         </w:rPr>
       </w:r>
+      <w:r>
+        <w:rPr>
+          <w:color w:val="000000"/>
+          <w:sz w:val="22"/>
+          <w:szCs w:val="22"/>
+          <w:highlight w:val="none"/>
+        </w:rPr>
+      </w:r>
     </w:p>
     <w:p>
       <w:pPr>
@@ -8529,7 +8011,33 @@
           <w:szCs w:val="22"/>
           <w:highlight w:val="none"/>
         </w:rPr>
-        <w:t xml:space="preserve">Keeping a record of the arrows is fairly similar. We want to draw arrows from one planet displaying the forces on it from the other planets, and also an arrow displaying the resultant force. This means we need to draw one arrow for every planet in the system except the one we’ve selected, as well as an arrow displaying the resultant force. This means overall the amount of arrows drawn should be the same as the amount of planets in the system, so we can use the same kind of code as with records to reset the length, we just replace LINE_LENGTH with len(planets).</w:t>
+        <w:t xml:space="preserve">Keeping a record of the arrows is fairly similar. We w</w:t>
+      </w:r>
+      <w:r>
+        <w:rPr>
+          <w:color w:val="000000"/>
+          <w:sz w:val="22"/>
+          <w:szCs w:val="22"/>
+          <w:highlight w:val="none"/>
+        </w:rPr>
+        <w:t xml:space="preserve">ant to draw arrows from one planet displaying the forces on it from the other planets, and also an arrow displaying the resultant force. This means we need to draw one arrow for every planet in the system except the one we’ve selected, as well as an arrow </w:t>
+      </w:r>
+      <w:r>
+        <w:rPr>
+          <w:color w:val="000000"/>
+          <w:sz w:val="22"/>
+          <w:szCs w:val="22"/>
+          <w:highlight w:val="none"/>
+        </w:rPr>
+        <w:t xml:space="preserve">displaying the resultant force. This means overall the amount of arrows drawn should be the same as the amount of planets in the system, so we can use the same kind of code as with records to reset the length, we just replace LINE_LENGTH with len(planets).</w:t>
+      </w:r>
+      <w:r>
+        <w:rPr>
+          <w:color w:val="000000"/>
+          <w:sz w:val="22"/>
+          <w:szCs w:val="22"/>
+          <w:highlight w:val="none"/>
+        </w:rPr>
       </w:r>
       <w:r>
         <w:rPr>
@@ -8568,6 +8076,14 @@
           <w:highlight w:val="none"/>
         </w:rPr>
       </w:r>
+      <w:r>
+        <w:rPr>
+          <w:color w:val="000000"/>
+          <w:sz w:val="22"/>
+          <w:szCs w:val="22"/>
+          <w:highlight w:val="none"/>
+        </w:rPr>
+      </w:r>
     </w:p>
     <w:p>
       <w:pPr>
@@ -8588,7 +8104,24 @@
           <w:szCs w:val="22"/>
           <w:highlight w:val="none"/>
         </w:rPr>
-        <w:t xml:space="preserve">Keeping a record of their physical attributes like kinetic energy and momentum will be done by having an attribute for each property we want to measure, resetting all the attributes to 0 at the start of a tick and then calculating the attributes during the tick. This will be explained in the physics section as they are done at the same time as working out all the physics</w:t>
+        <w:t xml:space="preserve">Keeping a record of their physical attributes like kinetic energy and momentum will be done by having an attribute fo</w:t>
+      </w:r>
+      <w:r>
+        <w:rPr>
+          <w:color w:val="000000"/>
+          <w:sz w:val="22"/>
+          <w:szCs w:val="22"/>
+          <w:highlight w:val="none"/>
+        </w:rPr>
+        <w:t xml:space="preserve">r each property we want to measure, resetting all the attributes to 0 at the start of a tick and then calculating the attributes during the tick. This will be explained in the physics section as they are done at the same time as working out all the physics</w:t>
+      </w:r>
+      <w:r>
+        <w:rPr>
+          <w:color w:val="000000"/>
+          <w:sz w:val="22"/>
+          <w:szCs w:val="22"/>
+          <w:highlight w:val="none"/>
+        </w:rPr>
       </w:r>
       <w:r>
         <w:rPr>
@@ -8611,6 +8144,14 @@
           <w:highlight w:val="none"/>
         </w:rPr>
       </w:pPr>
+      <w:r>
+        <w:rPr>
+          <w:color w:val="000000"/>
+          <w:sz w:val="22"/>
+          <w:szCs w:val="22"/>
+          <w:highlight w:val="none"/>
+        </w:rPr>
+      </w:r>
       <w:r>
         <w:rPr>
           <w:color w:val="000000"/>
@@ -8651,7 +8192,7 @@
       </w:r>
       <w:r>
         <w:rPr>
-          <w:color w:val="000000"/>
+          <w:color w:val="2f5496" w:themeColor="accent5" w:themeShade="BF"/>
           <w:sz w:val="22"/>
           <w:szCs w:val="22"/>
           <w:highlight w:val="none"/>
@@ -8685,7 +8226,15 @@
           <w:szCs w:val="22"/>
           <w:highlight w:val="none"/>
         </w:rPr>
-        <w:t xml:space="preserve">These classes are both subclasses of celestialBody. The distinction between planet and satellite in my program is a bit different than how the words are used in normal life.</w:t>
+        <w:t xml:space="preserve">These classes are both subclasses of celestialBody. The distinction between planet and satellite in my program is a bit different than how the words are used in normal life. In my program, a satellite has a host object, and its orbital lines are drawn relative to the motion of the host object. This is why it’s called a satellite, as the proper, physical definition of a satellite is just an object orbiting another object, e.g. the moon is a satellite of Earth. A planet will not have changes from the parent class, celestialBody, but the class is there to make clear the distinction between planet and satellite.</w:t>
+      </w:r>
+      <w:r>
+        <w:rPr>
+          <w:color w:val="000000"/>
+          <w:sz w:val="22"/>
+          <w:szCs w:val="22"/>
+          <w:highlight w:val="none"/>
+        </w:rPr>
       </w:r>
       <w:r>
         <w:rPr>
@@ -8715,6 +8264,7 @@
           <w:szCs w:val="22"/>
           <w:highlight w:val="none"/>
         </w:rPr>
+        <w:t xml:space="preserve">Since the only thing the satellite class needs to do differently is change how the orbital lines are drawn, there are only a few things we need to change. First, getHost() should return something other than null. We will use composition to set the host attributes, the host attribute should be the object that the satellite has as a host. This object will be another planet. Satellites orbiting satellites is possible, but there is no instance of that in our solar system, so in the class diagram I just showed satellite as composing with planets, you could compose it with another satellite if you really wanted to. Secondly, addRecord() and getRecords() should be edited so that the path they display is relative to the motion of the host, how this is done will be explained later in this section.</w:t>
       </w:r>
       <w:r>
         <w:rPr>
@@ -8739,11 +8289,44 @@
       </w:pPr>
       <w:r>
         <w:rPr>
-          <w:highlight w:val="none"/>
-        </w:rPr>
-      </w:r>
-      <w:r>
-        <w:rPr>
+          <w:color w:val="000000"/>
+          <w:sz w:val="22"/>
+          <w:szCs w:val="22"/>
+          <w:highlight w:val="none"/>
+        </w:rPr>
+        <w:t xml:space="preserve">But why do the orbital lines need to be drawn relative to the motion of the host? Well, this is what the moon’s path looks like if its path is not drawn relative to Earth’s motion:</w:t>
+      </w:r>
+      <w:r>
+        <w:rPr>
+          <w:color w:val="000000"/>
+          <w:sz w:val="22"/>
+          <w:szCs w:val="22"/>
+          <w:highlight w:val="none"/>
+        </w:rPr>
+      </w:r>
+      <w:r>
+        <w:rPr>
+          <w:highlight w:val="none"/>
+        </w:rPr>
+      </w:r>
+      <w:r>
+        <w:rPr>
+          <w:highlight w:val="none"/>
+        </w:rPr>
+      </w:r>
+      <w:r>
+        <w:rPr>
+          <w:color w:val="000000"/>
+          <w:sz w:val="22"/>
+          <w:szCs w:val="22"/>
+          <w:highlight w:val="none"/>
+        </w:rPr>
+      </w:r>
+      <w:r>
+        <w:rPr>
+          <w:color w:val="000000"/>
+          <w:sz w:val="22"/>
+          <w:szCs w:val="22"/>
           <w:highlight w:val="none"/>
         </w:rPr>
       </w:r>
@@ -8772,7 +8355,7 @@
               <wp:inline xmlns:wp="http://schemas.openxmlformats.org/drawingml/2006/wordprocessingDrawing" distT="0" distB="0" distL="0" distR="0">
                 <wp:extent cx="5940425" cy="4131895"/>
                 <wp:effectExtent l="0" t="0" r="0" b="0"/>
-                <wp:docPr id="17" name=""/>
+                <wp:docPr id="16" name=""/>
                 <wp:cNvGraphicFramePr>
                   <a:graphicFrameLocks xmlns:a="http://schemas.openxmlformats.org/drawingml/2006/main" noChangeAspect="1"/>
                 </wp:cNvGraphicFramePr>
@@ -8787,7 +8370,7 @@
                         <pic:nvPr/>
                       </pic:nvPicPr>
                       <pic:blipFill>
-                        <a:blip r:embed="rId28"/>
+                        <a:blip r:embed="rId27"/>
                         <a:stretch/>
                       </pic:blipFill>
                       <pic:spPr bwMode="auto">
@@ -8826,8 +8409,8 @@
                 <v:path o:extrusionok="f" gradientshapeok="t" o:connecttype="rect"/>
                 <o:lock v:ext="edit" aspectratio="t"/>
               </v:shapetype>
-              <v:shape id="_x0000_i16" o:spid="_x0000_s16" type="#_x0000_t75" style="width:467.75pt;height:325.35pt;mso-wrap-distance-left:0.00pt;mso-wrap-distance-top:0.00pt;mso-wrap-distance-right:0.00pt;mso-wrap-distance-bottom:0.00pt;z-index:1;" stroked="false">
-                <v:imagedata r:id="rId28" o:title=""/>
+              <v:shape id="_x0000_i15" o:spid="_x0000_s15" type="#_x0000_t75" style="width:467.75pt;height:325.35pt;mso-wrap-distance-left:0.00pt;mso-wrap-distance-top:0.00pt;mso-wrap-distance-right:0.00pt;mso-wrap-distance-bottom:0.00pt;z-index:1;" stroked="false">
+                <v:imagedata r:id="rId27" o:title=""/>
                 <o:lock v:ext="edit" rotation="t"/>
               </v:shape>
             </w:pict>
@@ -8844,9 +8427,6 @@
       </w:r>
       <w:r>
         <w:rPr>
-          <w:color w:val="000000"/>
-          <w:sz w:val="22"/>
-          <w:szCs w:val="22"/>
           <w:highlight w:val="none"/>
         </w:rPr>
       </w:r>
@@ -8870,6 +8450,44 @@
           <w:szCs w:val="22"/>
           <w:highlight w:val="none"/>
         </w:rPr>
+      </w:r>
+      <w:r>
+        <w:rPr>
+          <w:color w:val="000000"/>
+          <w:sz w:val="22"/>
+          <w:szCs w:val="22"/>
+          <w:highlight w:val="none"/>
+        </w:rPr>
+      </w:r>
+    </w:p>
+    <w:p>
+      <w:pPr>
+        <w:pBdr/>
+        <w:spacing/>
+        <w:ind/>
+        <w:rPr>
+          <w:color w:val="000000"/>
+          <w:sz w:val="22"/>
+          <w:szCs w:val="22"/>
+          <w:highlight w:val="none"/>
+        </w:rPr>
+      </w:pPr>
+      <w:r>
+        <w:rPr>
+          <w:color w:val="000000"/>
+          <w:sz w:val="22"/>
+          <w:szCs w:val="22"/>
+          <w:highlight w:val="none"/>
+        </w:rPr>
+      </w:r>
+      <w:r>
+        <w:rPr>
+          <w:color w:val="000000"/>
+          <w:sz w:val="22"/>
+          <w:szCs w:val="22"/>
+          <w:highlight w:val="none"/>
+        </w:rPr>
+        <w:t xml:space="preserve">The moon is orbiting Earth, but it’s also orbiting around the sun. The path the moon follows just makes it look like it orbits the sun, with very slight wiggle because of its orbit around the Earth. This is not very illustrative and will confuse students as they might not get how the moon is technically orbiting both the Earth and the Sun. When we talk about the moon’s orbit, we mean its orbit around Earth. What this means physically is the motion of the moon relative to the motion of Earth. If we draw its path relative to Earth’s motion, we get this:</w:t>
       </w:r>
       <w:r>
         <w:rPr>
@@ -8905,9 +8523,9 @@
           <mc:Choice Requires="wpg">
             <w:drawing>
               <wp:inline xmlns:wp="http://schemas.openxmlformats.org/drawingml/2006/wordprocessingDrawing" distT="0" distB="0" distL="0" distR="0">
-                <wp:extent cx="5940425" cy="6449433"/>
+                <wp:extent cx="5649481" cy="6133560"/>
                 <wp:effectExtent l="0" t="0" r="0" b="0"/>
-                <wp:docPr id="18" name=""/>
+                <wp:docPr id="17" name=""/>
                 <wp:cNvGraphicFramePr>
                   <a:graphicFrameLocks xmlns:a="http://schemas.openxmlformats.org/drawingml/2006/main" noChangeAspect="1"/>
                 </wp:cNvGraphicFramePr>
@@ -8922,13 +8540,13 @@
                         <pic:nvPr/>
                       </pic:nvPicPr>
                       <pic:blipFill>
-                        <a:blip r:embed="rId29"/>
+                        <a:blip r:embed="rId28"/>
                         <a:stretch/>
                       </pic:blipFill>
                       <pic:spPr bwMode="auto">
-                        <a:xfrm>
+                        <a:xfrm flipH="0" flipV="1">
                           <a:off x="0" y="0"/>
-                          <a:ext cx="5940424" cy="6449433"/>
+                          <a:ext cx="5649481" cy="6133559"/>
                         </a:xfrm>
                         <a:prstGeom prst="rect">
                           <a:avLst/>
@@ -8961,7 +8579,242 @@
                 <v:path o:extrusionok="f" gradientshapeok="t" o:connecttype="rect"/>
                 <o:lock v:ext="edit" aspectratio="t"/>
               </v:shapetype>
-              <v:shape id="_x0000_i17" o:spid="_x0000_s17" type="#_x0000_t75" style="width:467.75pt;height:507.83pt;mso-wrap-distance-left:0.00pt;mso-wrap-distance-top:0.00pt;mso-wrap-distance-right:0.00pt;mso-wrap-distance-bottom:0.00pt;z-index:1;" stroked="false">
+              <v:shape id="_x0000_i16" o:spid="_x0000_s16" type="#_x0000_t75" style="width:444.84pt;height:482.96pt;mso-wrap-distance-left:0.00pt;mso-wrap-distance-top:0.00pt;mso-wrap-distance-right:0.00pt;mso-wrap-distance-bottom:0.00pt;flip:y;z-index:1;" stroked="false">
+                <v:imagedata r:id="rId28" o:title=""/>
+                <o:lock v:ext="edit" rotation="t"/>
+              </v:shape>
+            </w:pict>
+          </mc:Fallback>
+        </mc:AlternateContent>
+      </w:r>
+      <w:r>
+        <w:rPr>
+          <w:color w:val="000000"/>
+          <w:sz w:val="22"/>
+          <w:szCs w:val="22"/>
+          <w:highlight w:val="none"/>
+        </w:rPr>
+      </w:r>
+      <w:r>
+        <w:rPr>
+          <w:color w:val="000000"/>
+          <w:sz w:val="22"/>
+          <w:szCs w:val="22"/>
+          <w:highlight w:val="none"/>
+        </w:rPr>
+      </w:r>
+    </w:p>
+    <w:p>
+      <w:pPr>
+        <w:pBdr/>
+        <w:spacing/>
+        <w:ind/>
+        <w:rPr>
+          <w:color w:val="000000"/>
+          <w:sz w:val="22"/>
+          <w:szCs w:val="22"/>
+          <w:highlight w:val="none"/>
+        </w:rPr>
+      </w:pPr>
+      <w:r>
+        <w:rPr>
+          <w:color w:val="000000"/>
+          <w:sz w:val="22"/>
+          <w:szCs w:val="22"/>
+          <w:highlight w:val="none"/>
+        </w:rPr>
+        <w:t xml:space="preserve">The path drawn is the arc of a circle around Earth, exactly as it should be. This is much better.</w:t>
+      </w:r>
+      <w:r>
+        <w:rPr>
+          <w:color w:val="000000"/>
+          <w:sz w:val="22"/>
+          <w:szCs w:val="22"/>
+          <w:highlight w:val="none"/>
+        </w:rPr>
+      </w:r>
+    </w:p>
+    <w:p>
+      <w:pPr>
+        <w:pBdr/>
+        <w:spacing/>
+        <w:ind/>
+        <w:rPr>
+          <w:color w:val="000000"/>
+          <w:sz w:val="22"/>
+          <w:szCs w:val="22"/>
+          <w:highlight w:val="none"/>
+        </w:rPr>
+      </w:pPr>
+      <w:r>
+        <w:rPr>
+          <w:color w:val="000000"/>
+          <w:sz w:val="22"/>
+          <w:szCs w:val="22"/>
+          <w:highlight w:val="none"/>
+        </w:rPr>
+        <w:t xml:space="preserve">How do we achieve this in code? Well, for a normal celestialBody object, its records is a list of displacements from the origin. We can think about displacements as a vector pointing from the origin to another point in space, like this:</w:t>
+      </w:r>
+      <w:r>
+        <w:rPr>
+          <w:color w:val="000000"/>
+          <w:sz w:val="22"/>
+          <w:szCs w:val="22"/>
+          <w:highlight w:val="none"/>
+        </w:rPr>
+      </w:r>
+    </w:p>
+    <w:p>
+      <w:pPr>
+        <w:pBdr/>
+        <w:spacing/>
+        <w:ind/>
+        <w:rPr>
+          <w:color w:val="000000"/>
+          <w:sz w:val="22"/>
+          <w:szCs w:val="22"/>
+          <w:highlight w:val="none"/>
+        </w:rPr>
+      </w:pPr>
+      <w:r>
+        <w:rPr>
+          <w:color w:val="000000"/>
+          <w:sz w:val="22"/>
+          <w:szCs w:val="22"/>
+          <w:highlight w:val="none"/>
+        </w:rPr>
+      </w:r>
+      <w:r>
+        <w:rPr>
+          <w:color w:val="000000"/>
+          <w:sz w:val="22"/>
+          <w:szCs w:val="22"/>
+          <w:highlight w:val="none"/>
+        </w:rPr>
+      </w:r>
+    </w:p>
+    <w:p>
+      <w:pPr>
+        <w:pBdr/>
+        <w:spacing/>
+        <w:ind/>
+        <w:rPr>
+          <w:color w:val="000000"/>
+          <w:sz w:val="22"/>
+          <w:szCs w:val="22"/>
+          <w:highlight w:val="none"/>
+        </w:rPr>
+      </w:pPr>
+      <w:r>
+        <w:rPr>
+          <w:highlight w:val="none"/>
+        </w:rPr>
+      </w:r>
+      <w:r>
+        <w:rPr>
+          <w:highlight w:val="none"/>
+        </w:rPr>
+      </w:r>
+    </w:p>
+    <w:p>
+      <w:pPr>
+        <w:pBdr/>
+        <w:spacing/>
+        <w:ind/>
+        <w:rPr>
+          <w:highlight w:val="none"/>
+        </w:rPr>
+      </w:pPr>
+      <w:r>
+        <w:rPr>
+          <w:highlight w:val="none"/>
+        </w:rPr>
+      </w:r>
+      <w:r>
+        <w:rPr>
+          <w:highlight w:val="none"/>
+        </w:rPr>
+      </w:r>
+    </w:p>
+    <w:p>
+      <w:pPr>
+        <w:pBdr/>
+        <w:spacing/>
+        <w:ind/>
+        <w:rPr>
+          <w:highlight w:val="none"/>
+        </w:rPr>
+      </w:pPr>
+      <w:r>
+        <w:rPr>
+          <w:color w:val="000000"/>
+          <w:sz w:val="22"/>
+          <w:szCs w:val="22"/>
+          <w:highlight w:val="none"/>
+        </w:rPr>
+      </w:r>
+      <w:r>
+        <mc:AlternateContent>
+          <mc:Choice Requires="wpg">
+            <w:drawing>
+              <wp:inline xmlns:wp="http://schemas.openxmlformats.org/drawingml/2006/wordprocessingDrawing" distT="0" distB="0" distL="0" distR="0">
+                <wp:extent cx="5940425" cy="5167952"/>
+                <wp:effectExtent l="0" t="0" r="0" b="0"/>
+                <wp:docPr id="18" name=""/>
+                <wp:cNvGraphicFramePr>
+                  <a:graphicFrameLocks xmlns:a="http://schemas.openxmlformats.org/drawingml/2006/main" noChangeAspect="1"/>
+                </wp:cNvGraphicFramePr>
+                <a:graphic xmlns:a="http://schemas.openxmlformats.org/drawingml/2006/main">
+                  <a:graphicData uri="http://schemas.openxmlformats.org/drawingml/2006/picture">
+                    <pic:pic xmlns:pic="http://schemas.openxmlformats.org/drawingml/2006/picture">
+                      <pic:nvPicPr>
+                        <pic:cNvPr id="2104799214" name=""/>
+                        <pic:cNvPicPr>
+                          <a:picLocks noChangeAspect="1"/>
+                        </pic:cNvPicPr>
+                        <pic:nvPr/>
+                      </pic:nvPicPr>
+                      <pic:blipFill>
+                        <a:blip r:embed="rId29"/>
+                        <a:stretch/>
+                      </pic:blipFill>
+                      <pic:spPr bwMode="auto">
+                        <a:xfrm>
+                          <a:off x="0" y="0"/>
+                          <a:ext cx="5940424" cy="5167951"/>
+                        </a:xfrm>
+                        <a:prstGeom prst="rect">
+                          <a:avLst/>
+                        </a:prstGeom>
+                      </pic:spPr>
+                    </pic:pic>
+                  </a:graphicData>
+                </a:graphic>
+              </wp:inline>
+            </w:drawing>
+          </mc:Choice>
+          <mc:Fallback>
+            <w:pict>
+              <v:shapetype id="_x0000_t75" coordsize="21600,21600" o:spt="75" o:preferrelative="t" path="m@4@5l@4@11@9@11@9@5xe" filled="f" stroked="f">
+                <v:stroke joinstyle="miter"/>
+                <v:formulas>
+                  <v:f eqn="if lineDrawn pixelLineWidth 0"/>
+                  <v:f eqn="sum @0 1 0"/>
+                  <v:f eqn="sum 0 0 @1"/>
+                  <v:f eqn="prod @2 1 2"/>
+                  <v:f eqn="prod @3 21600 pixelWidth"/>
+                  <v:f eqn="prod @3 21600 pixelHeight"/>
+                  <v:f eqn="sum @0 0 1"/>
+                  <v:f eqn="prod @6 1 2"/>
+                  <v:f eqn="prod @7 21600 pixelWidth"/>
+                  <v:f eqn="sum @8 21600 0"/>
+                  <v:f eqn="prod @7 21600 pixelHeight"/>
+                  <v:f eqn="sum @10 21600 0"/>
+                </v:formulas>
+                <v:path o:extrusionok="f" gradientshapeok="t" o:connecttype="rect"/>
+                <o:lock v:ext="edit" aspectratio="t"/>
+              </v:shapetype>
+              <v:shape id="_x0000_i17" o:spid="_x0000_s17" type="#_x0000_t75" style="width:467.75pt;height:406.93pt;mso-wrap-distance-left:0.00pt;mso-wrap-distance-top:0.00pt;mso-wrap-distance-right:0.00pt;mso-wrap-distance-bottom:0.00pt;z-index:1;" stroked="false">
                 <v:imagedata r:id="rId29" o:title=""/>
                 <o:lock v:ext="edit" rotation="t"/>
               </v:shape>
@@ -8986,6 +8839,367 @@
           <w:highlight w:val="none"/>
         </w:rPr>
       </w:r>
+      <w:r/>
+      <w:r>
+        <w:rPr>
+          <w:color w:val="000000"/>
+          <w:sz w:val="22"/>
+          <w:szCs w:val="22"/>
+          <w:highlight w:val="none"/>
+        </w:rPr>
+      </w:r>
+      <w:r/>
+      <w:r>
+        <w:rPr>
+          <w:color w:val="000000"/>
+          <w:sz w:val="22"/>
+          <w:szCs w:val="22"/>
+          <w:highlight w:val="none"/>
+        </w:rPr>
+      </w:r>
+      <w:r>
+        <w:rPr>
+          <w:color w:val="000000"/>
+          <w:sz w:val="22"/>
+          <w:szCs w:val="22"/>
+          <w:highlight w:val="none"/>
+        </w:rPr>
+      </w:r>
+    </w:p>
+    <w:p>
+      <w:pPr>
+        <w:pBdr/>
+        <w:spacing/>
+        <w:ind/>
+        <w:rPr>
+          <w:color w:val="000000"/>
+          <w:sz w:val="22"/>
+          <w:szCs w:val="22"/>
+          <w:highlight w:val="none"/>
+        </w:rPr>
+      </w:pPr>
+      <w:r>
+        <w:rPr>
+          <w:color w:val="000000"/>
+          <w:sz w:val="22"/>
+          <w:szCs w:val="22"/>
+          <w:highlight w:val="none"/>
+        </w:rPr>
+        <w:t xml:space="preserve">We want to instead have the moon’s displacement relative to Earth, i.e. an arrow pointing from Earth to the moon, like the purple arrow in this diagram:</w:t>
+      </w:r>
+      <w:r>
+        <w:rPr>
+          <w:color w:val="000000"/>
+          <w:sz w:val="22"/>
+          <w:szCs w:val="22"/>
+          <w:highlight w:val="none"/>
+        </w:rPr>
+      </w:r>
+      <w:r>
+        <w:rPr>
+          <w:color w:val="000000"/>
+          <w:sz w:val="22"/>
+          <w:szCs w:val="22"/>
+          <w:highlight w:val="none"/>
+        </w:rPr>
+      </w:r>
+      <w:r/>
+      <w:r>
+        <w:rPr>
+          <w:color w:val="000000"/>
+          <w:sz w:val="22"/>
+          <w:szCs w:val="22"/>
+          <w:highlight w:val="none"/>
+        </w:rPr>
+      </w:r>
+      <w:r>
+        <w:rPr>
+          <w:color w:val="000000"/>
+          <w:sz w:val="22"/>
+          <w:szCs w:val="22"/>
+          <w:highlight w:val="none"/>
+        </w:rPr>
+      </w:r>
+      <w:r>
+        <w:rPr>
+          <w:color w:val="000000"/>
+          <w:sz w:val="22"/>
+          <w:szCs w:val="22"/>
+          <w:highlight w:val="none"/>
+        </w:rPr>
+      </w:r>
+    </w:p>
+    <w:p>
+      <w:pPr>
+        <w:pBdr/>
+        <w:spacing/>
+        <w:ind/>
+        <w:rPr>
+          <w:color w:val="000000"/>
+          <w:sz w:val="22"/>
+          <w:szCs w:val="22"/>
+          <w:highlight w:val="none"/>
+        </w:rPr>
+      </w:pPr>
+      <w:r>
+        <w:rPr>
+          <w:highlight w:val="none"/>
+        </w:rPr>
+      </w:r>
+      <w:r>
+        <w:rPr>
+          <w:highlight w:val="none"/>
+        </w:rPr>
+      </w:r>
+    </w:p>
+    <w:p>
+      <w:pPr>
+        <w:pBdr/>
+        <w:spacing/>
+        <w:ind/>
+        <w:rPr>
+          <w:highlight w:val="none"/>
+        </w:rPr>
+      </w:pPr>
+      <w:r>
+        <w:rPr>
+          <w:color w:val="000000"/>
+          <w:sz w:val="22"/>
+          <w:szCs w:val="22"/>
+          <w:highlight w:val="none"/>
+        </w:rPr>
+      </w:r>
+      <w:r>
+        <mc:AlternateContent>
+          <mc:Choice Requires="wpg">
+            <w:drawing>
+              <wp:inline xmlns:wp="http://schemas.openxmlformats.org/drawingml/2006/wordprocessingDrawing" distT="0" distB="0" distL="0" distR="0">
+                <wp:extent cx="5940425" cy="5167952"/>
+                <wp:effectExtent l="0" t="0" r="0" b="0"/>
+                <wp:docPr id="19" name=""/>
+                <wp:cNvGraphicFramePr>
+                  <a:graphicFrameLocks xmlns:a="http://schemas.openxmlformats.org/drawingml/2006/main" noChangeAspect="1"/>
+                </wp:cNvGraphicFramePr>
+                <a:graphic xmlns:a="http://schemas.openxmlformats.org/drawingml/2006/main">
+                  <a:graphicData uri="http://schemas.openxmlformats.org/drawingml/2006/picture">
+                    <pic:pic xmlns:pic="http://schemas.openxmlformats.org/drawingml/2006/picture">
+                      <pic:nvPicPr>
+                        <pic:cNvPr id="865809406" name=""/>
+                        <pic:cNvPicPr>
+                          <a:picLocks noChangeAspect="1"/>
+                        </pic:cNvPicPr>
+                        <pic:nvPr/>
+                      </pic:nvPicPr>
+                      <pic:blipFill>
+                        <a:blip r:embed="rId30"/>
+                        <a:stretch/>
+                      </pic:blipFill>
+                      <pic:spPr bwMode="auto">
+                        <a:xfrm>
+                          <a:off x="0" y="0"/>
+                          <a:ext cx="5940424" cy="5167951"/>
+                        </a:xfrm>
+                        <a:prstGeom prst="rect">
+                          <a:avLst/>
+                        </a:prstGeom>
+                      </pic:spPr>
+                    </pic:pic>
+                  </a:graphicData>
+                </a:graphic>
+              </wp:inline>
+            </w:drawing>
+          </mc:Choice>
+          <mc:Fallback>
+            <w:pict>
+              <v:shapetype id="_x0000_t75" coordsize="21600,21600" o:spt="75" o:preferrelative="t" path="m@4@5l@4@11@9@11@9@5xe" filled="f" stroked="f">
+                <v:stroke joinstyle="miter"/>
+                <v:formulas>
+                  <v:f eqn="if lineDrawn pixelLineWidth 0"/>
+                  <v:f eqn="sum @0 1 0"/>
+                  <v:f eqn="sum 0 0 @1"/>
+                  <v:f eqn="prod @2 1 2"/>
+                  <v:f eqn="prod @3 21600 pixelWidth"/>
+                  <v:f eqn="prod @3 21600 pixelHeight"/>
+                  <v:f eqn="sum @0 0 1"/>
+                  <v:f eqn="prod @6 1 2"/>
+                  <v:f eqn="prod @7 21600 pixelWidth"/>
+                  <v:f eqn="sum @8 21600 0"/>
+                  <v:f eqn="prod @7 21600 pixelHeight"/>
+                  <v:f eqn="sum @10 21600 0"/>
+                </v:formulas>
+                <v:path o:extrusionok="f" gradientshapeok="t" o:connecttype="rect"/>
+                <o:lock v:ext="edit" aspectratio="t"/>
+              </v:shapetype>
+              <v:shape id="_x0000_i18" o:spid="_x0000_s18" type="#_x0000_t75" style="width:467.75pt;height:406.93pt;mso-wrap-distance-left:0.00pt;mso-wrap-distance-top:0.00pt;mso-wrap-distance-right:0.00pt;mso-wrap-distance-bottom:0.00pt;z-index:1;" stroked="false">
+                <v:imagedata r:id="rId30" o:title=""/>
+                <o:lock v:ext="edit" rotation="t"/>
+              </v:shape>
+            </w:pict>
+          </mc:Fallback>
+        </mc:AlternateContent>
+      </w:r>
+      <w:r>
+        <w:rPr>
+          <w:color w:val="000000"/>
+          <w:sz w:val="22"/>
+          <w:szCs w:val="22"/>
+          <w:highlight w:val="none"/>
+        </w:rPr>
+      </w:r>
+      <w:r>
+        <w:rPr>
+          <w:color w:val="000000"/>
+          <w:sz w:val="22"/>
+          <w:szCs w:val="22"/>
+          <w:highlight w:val="none"/>
+        </w:rPr>
+      </w:r>
+    </w:p>
+    <w:p>
+      <w:pPr>
+        <w:pBdr/>
+        <w:spacing/>
+        <w:ind/>
+        <w:rPr>
+          <w:color w:val="000000"/>
+          <w:sz w:val="22"/>
+          <w:szCs w:val="22"/>
+          <w:highlight w:val="none"/>
+        </w:rPr>
+      </w:pPr>
+      <w:r>
+        <w:rPr>
+          <w:color w:val="000000"/>
+          <w:sz w:val="22"/>
+          <w:szCs w:val="22"/>
+          <w:highlight w:val="none"/>
+        </w:rPr>
+        <w:t xml:space="preserve">It turns out, rather conveniently, that the purple arrow there is just the vectors moonPos - earthPos. So we can just subtract one position from the other to get the relative position. This is how addRecord() will work for satellites, it will find the host’s current position and then add record – hostPosition instead of just adding record to the array of records, this way we have a history of all the *relative* positions of the satellite, not the actual positions.</w:t>
+      </w:r>
+      <w:r>
+        <w:rPr>
+          <w:color w:val="000000"/>
+          <w:sz w:val="22"/>
+          <w:szCs w:val="22"/>
+          <w:highlight w:val="none"/>
+        </w:rPr>
+      </w:r>
+      <w:r>
+        <w:rPr>
+          <w:color w:val="000000"/>
+          <w:sz w:val="22"/>
+          <w:szCs w:val="22"/>
+          <w:highlight w:val="none"/>
+        </w:rPr>
+      </w:r>
+      <w:r>
+        <w:rPr>
+          <w:color w:val="000000"/>
+          <w:sz w:val="22"/>
+          <w:szCs w:val="22"/>
+          <w:highlight w:val="none"/>
+        </w:rPr>
+      </w:r>
+      <w:r>
+        <w:rPr>
+          <w:color w:val="000000"/>
+          <w:sz w:val="22"/>
+          <w:szCs w:val="22"/>
+          <w:highlight w:val="none"/>
+        </w:rPr>
+      </w:r>
+    </w:p>
+    <w:p>
+      <w:pPr>
+        <w:pBdr/>
+        <w:spacing/>
+        <w:ind/>
+        <w:rPr>
+          <w:color w:val="000000"/>
+          <w:sz w:val="22"/>
+          <w:szCs w:val="22"/>
+          <w:highlight w:val="none"/>
+        </w:rPr>
+      </w:pPr>
+      <w:r>
+        <w:rPr>
+          <w:color w:val="000000"/>
+          <w:sz w:val="22"/>
+          <w:szCs w:val="22"/>
+          <w:highlight w:val="none"/>
+        </w:rPr>
+        <w:t xml:space="preserve">addRecord() will use the same trick as earlier to ensure that the list of records does not exceed the desired length.</w:t>
+      </w:r>
+      <w:r>
+        <w:rPr>
+          <w:color w:val="000000"/>
+          <w:sz w:val="22"/>
+          <w:szCs w:val="22"/>
+          <w:highlight w:val="none"/>
+        </w:rPr>
+      </w:r>
+      <w:r>
+        <w:rPr>
+          <w:color w:val="000000"/>
+          <w:sz w:val="22"/>
+          <w:szCs w:val="22"/>
+          <w:highlight w:val="none"/>
+        </w:rPr>
+      </w:r>
+      <w:r>
+        <w:rPr>
+          <w:color w:val="000000"/>
+          <w:sz w:val="22"/>
+          <w:szCs w:val="22"/>
+          <w:highlight w:val="none"/>
+        </w:rPr>
+      </w:r>
+      <w:r>
+        <w:rPr>
+          <w:color w:val="000000"/>
+          <w:sz w:val="22"/>
+          <w:szCs w:val="22"/>
+          <w:highlight w:val="none"/>
+        </w:rPr>
+      </w:r>
+      <w:r>
+        <w:rPr>
+          <w:color w:val="000000"/>
+          <w:sz w:val="22"/>
+          <w:szCs w:val="22"/>
+          <w:highlight w:val="none"/>
+        </w:rPr>
+      </w:r>
+      <w:r>
+        <w:rPr>
+          <w:color w:val="000000"/>
+          <w:sz w:val="22"/>
+          <w:szCs w:val="22"/>
+          <w:highlight w:val="none"/>
+        </w:rPr>
+      </w:r>
+    </w:p>
+    <w:p>
+      <w:pPr>
+        <w:pBdr/>
+        <w:spacing/>
+        <w:ind/>
+        <w:rPr>
+          <w:color w:val="000000"/>
+          <w:sz w:val="22"/>
+          <w:szCs w:val="22"/>
+          <w:highlight w:val="none"/>
+        </w:rPr>
+      </w:pPr>
+      <w:r>
+        <w:rPr>
+          <w:color w:val="000000"/>
+          <w:sz w:val="22"/>
+          <w:szCs w:val="22"/>
+          <w:highlight w:val="none"/>
+        </w:rPr>
+        <w:t xml:space="preserve">Here is pseudocode explaining how it will all work:</w:t>
+      </w:r>
       <w:r>
         <w:rPr>
           <w:color w:val="000000"/>
@@ -9103,7 +9317,7 @@
               <wp:inline xmlns:wp="http://schemas.openxmlformats.org/drawingml/2006/wordprocessingDrawing" distT="0" distB="0" distL="0" distR="0">
                 <wp:extent cx="5225415" cy="3346555"/>
                 <wp:effectExtent l="0" t="0" r="0" b="0"/>
-                <wp:docPr id="19" name="" hidden="0"/>
+                <wp:docPr id="20" name="" hidden="0"/>
                 <wp:cNvGraphicFramePr>
                   <a:graphicFrameLocks xmlns:a="http://schemas.openxmlformats.org/drawingml/2006/main" noChangeAspect="1"/>
                 </wp:cNvGraphicFramePr>
@@ -9118,7 +9332,7 @@
                         <pic:nvPr isPhoto="0" userDrawn="0"/>
                       </pic:nvPicPr>
                       <pic:blipFill>
-                        <a:blip r:embed="rId30"/>
+                        <a:blip r:embed="rId31"/>
                         <a:stretch/>
                       </pic:blipFill>
                       <pic:spPr bwMode="auto">
@@ -9157,8 +9371,8 @@
                 <v:path o:extrusionok="f" gradientshapeok="t" o:connecttype="rect"/>
                 <o:lock v:ext="edit" aspectratio="t"/>
               </v:shapetype>
-              <v:shape id="_x0000_i18" o:spid="_x0000_s18" type="#_x0000_t75" style="width:411.45pt;height:263.51pt;mso-wrap-distance-left:0.00pt;mso-wrap-distance-top:0.00pt;mso-wrap-distance-right:0.00pt;mso-wrap-distance-bottom:0.00pt;rotation:0;z-index:1;" stroked="false">
-                <v:imagedata r:id="rId30" o:title=""/>
+              <v:shape id="_x0000_i19" o:spid="_x0000_s19" type="#_x0000_t75" style="width:411.45pt;height:263.51pt;mso-wrap-distance-left:0.00pt;mso-wrap-distance-top:0.00pt;mso-wrap-distance-right:0.00pt;mso-wrap-distance-bottom:0.00pt;rotation:0;z-index:1;" stroked="false">
+                <v:imagedata r:id="rId31" o:title=""/>
                 <o:lock v:ext="edit" rotation="t"/>
               </v:shape>
             </w:pict>
@@ -10013,7 +10227,7 @@
               <wp:inline xmlns:wp="http://schemas.openxmlformats.org/drawingml/2006/wordprocessingDrawing" distT="0" distB="0" distL="0" distR="0">
                 <wp:extent cx="5940425" cy="5188838"/>
                 <wp:effectExtent l="0" t="0" r="0" b="0"/>
-                <wp:docPr id="20" name=""/>
+                <wp:docPr id="21" name=""/>
                 <wp:cNvGraphicFramePr>
                   <a:graphicFrameLocks xmlns:a="http://schemas.openxmlformats.org/drawingml/2006/main" noChangeAspect="1"/>
                 </wp:cNvGraphicFramePr>
@@ -10028,7 +10242,7 @@
                         <pic:nvPr/>
                       </pic:nvPicPr>
                       <pic:blipFill>
-                        <a:blip r:embed="rId31"/>
+                        <a:blip r:embed="rId32"/>
                         <a:stretch/>
                       </pic:blipFill>
                       <pic:spPr bwMode="auto">
@@ -10067,8 +10281,8 @@
                 <v:path o:extrusionok="f" gradientshapeok="t" o:connecttype="rect"/>
                 <o:lock v:ext="edit" aspectratio="t"/>
               </v:shapetype>
-              <v:shape id="_x0000_i19" o:spid="_x0000_s19" type="#_x0000_t75" style="width:467.75pt;height:408.57pt;mso-wrap-distance-left:0.00pt;mso-wrap-distance-top:0.00pt;mso-wrap-distance-right:0.00pt;mso-wrap-distance-bottom:0.00pt;z-index:1;" stroked="false">
-                <v:imagedata r:id="rId31" o:title=""/>
+              <v:shape id="_x0000_i20" o:spid="_x0000_s20" type="#_x0000_t75" style="width:467.75pt;height:408.57pt;mso-wrap-distance-left:0.00pt;mso-wrap-distance-top:0.00pt;mso-wrap-distance-right:0.00pt;mso-wrap-distance-bottom:0.00pt;z-index:1;" stroked="false">
+                <v:imagedata r:id="rId32" o:title=""/>
                 <o:lock v:ext="edit" rotation="t"/>
               </v:shape>
             </w:pict>
@@ -10119,7 +10333,7 @@
               <wp:inline xmlns:wp="http://schemas.openxmlformats.org/drawingml/2006/wordprocessingDrawing" distT="0" distB="0" distL="0" distR="0">
                 <wp:extent cx="5940425" cy="1809567"/>
                 <wp:effectExtent l="0" t="0" r="0" b="0"/>
-                <wp:docPr id="21" name=""/>
+                <wp:docPr id="22" name=""/>
                 <wp:cNvGraphicFramePr>
                   <a:graphicFrameLocks xmlns:a="http://schemas.openxmlformats.org/drawingml/2006/main" noChangeAspect="1"/>
                 </wp:cNvGraphicFramePr>
@@ -10134,7 +10348,7 @@
                         <pic:nvPr/>
                       </pic:nvPicPr>
                       <pic:blipFill>
-                        <a:blip r:embed="rId32"/>
+                        <a:blip r:embed="rId33"/>
                         <a:stretch/>
                       </pic:blipFill>
                       <pic:spPr bwMode="auto">
@@ -10173,8 +10387,8 @@
                 <v:path o:extrusionok="f" gradientshapeok="t" o:connecttype="rect"/>
                 <o:lock v:ext="edit" aspectratio="t"/>
               </v:shapetype>
-              <v:shape id="_x0000_i20" o:spid="_x0000_s20" type="#_x0000_t75" style="width:467.75pt;height:142.49pt;mso-wrap-distance-left:0.00pt;mso-wrap-distance-top:0.00pt;mso-wrap-distance-right:0.00pt;mso-wrap-distance-bottom:0.00pt;z-index:1;" stroked="false">
-                <v:imagedata r:id="rId32" o:title=""/>
+              <v:shape id="_x0000_i21" o:spid="_x0000_s21" type="#_x0000_t75" style="width:467.75pt;height:142.49pt;mso-wrap-distance-left:0.00pt;mso-wrap-distance-top:0.00pt;mso-wrap-distance-right:0.00pt;mso-wrap-distance-bottom:0.00pt;z-index:1;" stroked="false">
+                <v:imagedata r:id="rId33" o:title=""/>
                 <o:lock v:ext="edit" rotation="t"/>
               </v:shape>
             </w:pict>
@@ -10945,7 +11159,7 @@
               <wp:inline xmlns:wp="http://schemas.openxmlformats.org/drawingml/2006/wordprocessingDrawing" distT="0" distB="0" distL="0" distR="0">
                 <wp:extent cx="6086607" cy="5966460"/>
                 <wp:effectExtent l="0" t="0" r="0" b="0"/>
-                <wp:docPr id="22" name="" hidden="0"/>
+                <wp:docPr id="23" name="" hidden="0"/>
                 <wp:cNvGraphicFramePr>
                   <a:graphicFrameLocks xmlns:a="http://schemas.openxmlformats.org/drawingml/2006/main" noChangeAspect="1"/>
                 </wp:cNvGraphicFramePr>
@@ -10960,7 +11174,7 @@
                         <pic:nvPr isPhoto="0" userDrawn="0"/>
                       </pic:nvPicPr>
                       <pic:blipFill>
-                        <a:blip r:embed="rId33"/>
+                        <a:blip r:embed="rId34"/>
                         <a:stretch/>
                       </pic:blipFill>
                       <pic:spPr bwMode="auto">
@@ -10999,8 +11213,8 @@
                 <v:path o:extrusionok="f" gradientshapeok="t" o:connecttype="rect"/>
                 <o:lock v:ext="edit" aspectratio="t"/>
               </v:shapetype>
-              <v:shape id="_x0000_i21" o:spid="_x0000_s21" type="#_x0000_t75" style="width:479.26pt;height:469.80pt;mso-wrap-distance-left:0.00pt;mso-wrap-distance-top:0.00pt;mso-wrap-distance-right:0.00pt;mso-wrap-distance-bottom:0.00pt;rotation:0;z-index:1;" stroked="false">
-                <v:imagedata r:id="rId33" o:title=""/>
+              <v:shape id="_x0000_i22" o:spid="_x0000_s22" type="#_x0000_t75" style="width:479.26pt;height:469.80pt;mso-wrap-distance-left:0.00pt;mso-wrap-distance-top:0.00pt;mso-wrap-distance-right:0.00pt;mso-wrap-distance-bottom:0.00pt;rotation:0;z-index:1;" stroked="false">
+                <v:imagedata r:id="rId34" o:title=""/>
                 <o:lock v:ext="edit" rotation="t"/>
               </v:shape>
             </w:pict>
@@ -11256,7 +11470,7 @@
               <wp:inline xmlns:wp="http://schemas.openxmlformats.org/drawingml/2006/wordprocessingDrawing" distT="0" distB="0" distL="0" distR="0">
                 <wp:extent cx="4618588" cy="6662610"/>
                 <wp:effectExtent l="0" t="0" r="0" b="0"/>
-                <wp:docPr id="23" name="" hidden="0"/>
+                <wp:docPr id="24" name="" hidden="0"/>
                 <wp:cNvGraphicFramePr>
                   <a:graphicFrameLocks xmlns:a="http://schemas.openxmlformats.org/drawingml/2006/main" noChangeAspect="1"/>
                 </wp:cNvGraphicFramePr>
@@ -11271,7 +11485,7 @@
                         <pic:nvPr isPhoto="0" userDrawn="0"/>
                       </pic:nvPicPr>
                       <pic:blipFill>
-                        <a:blip r:embed="rId34"/>
+                        <a:blip r:embed="rId35"/>
                         <a:stretch/>
                       </pic:blipFill>
                       <pic:spPr bwMode="auto">
@@ -11310,8 +11524,8 @@
                 <v:path o:extrusionok="f" gradientshapeok="t" o:connecttype="rect"/>
                 <o:lock v:ext="edit" aspectratio="t"/>
               </v:shapetype>
-              <v:shape id="_x0000_i22" o:spid="_x0000_s22" type="#_x0000_t75" style="width:363.67pt;height:524.61pt;mso-wrap-distance-left:0.00pt;mso-wrap-distance-top:0.00pt;mso-wrap-distance-right:0.00pt;mso-wrap-distance-bottom:0.00pt;rotation:0;z-index:1;" stroked="false">
-                <v:imagedata r:id="rId34" o:title=""/>
+              <v:shape id="_x0000_i23" o:spid="_x0000_s23" type="#_x0000_t75" style="width:363.67pt;height:524.61pt;mso-wrap-distance-left:0.00pt;mso-wrap-distance-top:0.00pt;mso-wrap-distance-right:0.00pt;mso-wrap-distance-bottom:0.00pt;rotation:0;z-index:1;" stroked="false">
+                <v:imagedata r:id="rId35" o:title=""/>
                 <o:lock v:ext="edit" rotation="t"/>
               </v:shape>
             </w:pict>
@@ -11504,7 +11718,7 @@
               <wp:inline xmlns:wp="http://schemas.openxmlformats.org/drawingml/2006/wordprocessingDrawing" distT="0" distB="0" distL="0" distR="0">
                 <wp:extent cx="5940425" cy="5454591"/>
                 <wp:effectExtent l="0" t="0" r="0" b="0"/>
-                <wp:docPr id="24" name=""/>
+                <wp:docPr id="25" name=""/>
                 <wp:cNvGraphicFramePr>
                   <a:graphicFrameLocks xmlns:a="http://schemas.openxmlformats.org/drawingml/2006/main" noChangeAspect="1"/>
                 </wp:cNvGraphicFramePr>
@@ -11519,7 +11733,7 @@
                         <pic:nvPr/>
                       </pic:nvPicPr>
                       <pic:blipFill>
-                        <a:blip r:embed="rId35"/>
+                        <a:blip r:embed="rId36"/>
                         <a:stretch/>
                       </pic:blipFill>
                       <pic:spPr bwMode="auto">
@@ -11558,8 +11772,8 @@
                 <v:path o:extrusionok="f" gradientshapeok="t" o:connecttype="rect"/>
                 <o:lock v:ext="edit" aspectratio="t"/>
               </v:shapetype>
-              <v:shape id="_x0000_i23" o:spid="_x0000_s23" type="#_x0000_t75" style="width:467.75pt;height:429.50pt;mso-wrap-distance-left:0.00pt;mso-wrap-distance-top:0.00pt;mso-wrap-distance-right:0.00pt;mso-wrap-distance-bottom:0.00pt;z-index:1;" stroked="false">
-                <v:imagedata r:id="rId35" o:title=""/>
+              <v:shape id="_x0000_i24" o:spid="_x0000_s24" type="#_x0000_t75" style="width:467.75pt;height:429.50pt;mso-wrap-distance-left:0.00pt;mso-wrap-distance-top:0.00pt;mso-wrap-distance-right:0.00pt;mso-wrap-distance-bottom:0.00pt;z-index:1;" stroked="false">
+                <v:imagedata r:id="rId36" o:title=""/>
                 <o:lock v:ext="edit" rotation="t"/>
               </v:shape>
             </w:pict>
@@ -12964,7 +13178,7 @@
               <wp:inline xmlns:wp="http://schemas.openxmlformats.org/drawingml/2006/wordprocessingDrawing" distT="0" distB="0" distL="0" distR="0">
                 <wp:extent cx="5940425" cy="1654572"/>
                 <wp:effectExtent l="0" t="0" r="0" b="0"/>
-                <wp:docPr id="25" name=""/>
+                <wp:docPr id="26" name=""/>
                 <wp:cNvGraphicFramePr>
                   <a:graphicFrameLocks xmlns:a="http://schemas.openxmlformats.org/drawingml/2006/main" noChangeAspect="1"/>
                 </wp:cNvGraphicFramePr>
@@ -12979,7 +13193,7 @@
                         <pic:nvPr/>
                       </pic:nvPicPr>
                       <pic:blipFill>
-                        <a:blip r:embed="rId36"/>
+                        <a:blip r:embed="rId37"/>
                         <a:stretch/>
                       </pic:blipFill>
                       <pic:spPr bwMode="auto">
@@ -13018,8 +13232,8 @@
                 <v:path o:extrusionok="f" gradientshapeok="t" o:connecttype="rect"/>
                 <o:lock v:ext="edit" aspectratio="t"/>
               </v:shapetype>
-              <v:shape id="_x0000_i24" o:spid="_x0000_s24" type="#_x0000_t75" style="width:467.75pt;height:130.28pt;mso-wrap-distance-left:0.00pt;mso-wrap-distance-top:0.00pt;mso-wrap-distance-right:0.00pt;mso-wrap-distance-bottom:0.00pt;z-index:1;" stroked="false">
-                <v:imagedata r:id="rId36" o:title=""/>
+              <v:shape id="_x0000_i25" o:spid="_x0000_s25" type="#_x0000_t75" style="width:467.75pt;height:130.28pt;mso-wrap-distance-left:0.00pt;mso-wrap-distance-top:0.00pt;mso-wrap-distance-right:0.00pt;mso-wrap-distance-bottom:0.00pt;z-index:1;" stroked="false">
+                <v:imagedata r:id="rId37" o:title=""/>
                 <o:lock v:ext="edit" rotation="t"/>
               </v:shape>
             </w:pict>
@@ -14076,7 +14290,7 @@
               <wp:inline xmlns:wp="http://schemas.openxmlformats.org/drawingml/2006/wordprocessingDrawing" distT="0" distB="0" distL="0" distR="0">
                 <wp:extent cx="5940425" cy="1330714"/>
                 <wp:effectExtent l="0" t="0" r="0" b="0"/>
-                <wp:docPr id="26" name=""/>
+                <wp:docPr id="27" name=""/>
                 <wp:cNvGraphicFramePr>
                   <a:graphicFrameLocks xmlns:a="http://schemas.openxmlformats.org/drawingml/2006/main" noChangeAspect="1"/>
                 </wp:cNvGraphicFramePr>
@@ -14091,7 +14305,7 @@
                         <pic:nvPr/>
                       </pic:nvPicPr>
                       <pic:blipFill>
-                        <a:blip r:embed="rId37"/>
+                        <a:blip r:embed="rId38"/>
                         <a:stretch/>
                       </pic:blipFill>
                       <pic:spPr bwMode="auto">
@@ -14130,8 +14344,8 @@
                 <v:path o:extrusionok="f" gradientshapeok="t" o:connecttype="rect"/>
                 <o:lock v:ext="edit" aspectratio="t"/>
               </v:shapetype>
-              <v:shape id="_x0000_i25" o:spid="_x0000_s25" type="#_x0000_t75" style="width:467.75pt;height:104.78pt;mso-wrap-distance-left:0.00pt;mso-wrap-distance-top:0.00pt;mso-wrap-distance-right:0.00pt;mso-wrap-distance-bottom:0.00pt;z-index:1;" stroked="false">
-                <v:imagedata r:id="rId37" o:title=""/>
+              <v:shape id="_x0000_i26" o:spid="_x0000_s26" type="#_x0000_t75" style="width:467.75pt;height:104.78pt;mso-wrap-distance-left:0.00pt;mso-wrap-distance-top:0.00pt;mso-wrap-distance-right:0.00pt;mso-wrap-distance-bottom:0.00pt;z-index:1;" stroked="false">
+                <v:imagedata r:id="rId38" o:title=""/>
                 <o:lock v:ext="edit" rotation="t"/>
               </v:shape>
             </w:pict>
@@ -14386,7 +14600,7 @@
               <wp:inline xmlns:wp="http://schemas.openxmlformats.org/drawingml/2006/wordprocessingDrawing" distT="0" distB="0" distL="0" distR="0">
                 <wp:extent cx="3786834" cy="9690735"/>
                 <wp:effectExtent l="0" t="0" r="0" b="0"/>
-                <wp:docPr id="27" name="" hidden="0"/>
+                <wp:docPr id="28" name="" hidden="0"/>
                 <wp:cNvGraphicFramePr>
                   <a:graphicFrameLocks xmlns:a="http://schemas.openxmlformats.org/drawingml/2006/main" noChangeAspect="1"/>
                 </wp:cNvGraphicFramePr>
@@ -14401,7 +14615,7 @@
                         <pic:nvPr isPhoto="0" userDrawn="0"/>
                       </pic:nvPicPr>
                       <pic:blipFill>
-                        <a:blip r:embed="rId38"/>
+                        <a:blip r:embed="rId39"/>
                         <a:stretch/>
                       </pic:blipFill>
                       <pic:spPr bwMode="auto">
@@ -14440,8 +14654,8 @@
                 <v:path o:extrusionok="f" gradientshapeok="t" o:connecttype="rect"/>
                 <o:lock v:ext="edit" aspectratio="t"/>
               </v:shapetype>
-              <v:shape id="_x0000_i26" o:spid="_x0000_s26" type="#_x0000_t75" style="width:298.18pt;height:763.05pt;mso-wrap-distance-left:0.00pt;mso-wrap-distance-top:0.00pt;mso-wrap-distance-right:0.00pt;mso-wrap-distance-bottom:0.00pt;rotation:0;z-index:1;" stroked="false">
-                <v:imagedata r:id="rId38" o:title=""/>
+              <v:shape id="_x0000_i27" o:spid="_x0000_s27" type="#_x0000_t75" style="width:298.18pt;height:763.05pt;mso-wrap-distance-left:0.00pt;mso-wrap-distance-top:0.00pt;mso-wrap-distance-right:0.00pt;mso-wrap-distance-bottom:0.00pt;rotation:0;z-index:1;" stroked="false">
+                <v:imagedata r:id="rId39" o:title=""/>
                 <o:lock v:ext="edit" rotation="t"/>
               </v:shape>
             </w:pict>
@@ -14806,7 +15020,7 @@
               <wp:inline xmlns:wp="http://schemas.openxmlformats.org/drawingml/2006/wordprocessingDrawing" distT="0" distB="0" distL="0" distR="0">
                 <wp:extent cx="5940425" cy="868688"/>
                 <wp:effectExtent l="0" t="0" r="0" b="0"/>
-                <wp:docPr id="28" name="" hidden="0"/>
+                <wp:docPr id="29" name="" hidden="0"/>
                 <wp:cNvGraphicFramePr>
                   <a:graphicFrameLocks xmlns:a="http://schemas.openxmlformats.org/drawingml/2006/main" noChangeAspect="1"/>
                 </wp:cNvGraphicFramePr>
@@ -14821,7 +15035,7 @@
                         <pic:nvPr isPhoto="0" userDrawn="0"/>
                       </pic:nvPicPr>
                       <pic:blipFill>
-                        <a:blip r:embed="rId39"/>
+                        <a:blip r:embed="rId40"/>
                         <a:stretch/>
                       </pic:blipFill>
                       <pic:spPr bwMode="auto">
@@ -14860,8 +15074,8 @@
                 <v:path o:extrusionok="f" gradientshapeok="t" o:connecttype="rect"/>
                 <o:lock v:ext="edit" aspectratio="t"/>
               </v:shapetype>
-              <v:shape id="_x0000_i27" o:spid="_x0000_s27" type="#_x0000_t75" style="width:467.75pt;height:68.40pt;mso-wrap-distance-left:0.00pt;mso-wrap-distance-top:0.00pt;mso-wrap-distance-right:0.00pt;mso-wrap-distance-bottom:0.00pt;z-index:1;" stroked="false">
-                <v:imagedata r:id="rId39" o:title=""/>
+              <v:shape id="_x0000_i28" o:spid="_x0000_s28" type="#_x0000_t75" style="width:467.75pt;height:68.40pt;mso-wrap-distance-left:0.00pt;mso-wrap-distance-top:0.00pt;mso-wrap-distance-right:0.00pt;mso-wrap-distance-bottom:0.00pt;z-index:1;" stroked="false">
+                <v:imagedata r:id="rId40" o:title=""/>
                 <o:lock v:ext="edit" rotation="t"/>
               </v:shape>
             </w:pict>
@@ -15033,7 +15247,7 @@
               <wp:inline xmlns:wp="http://schemas.openxmlformats.org/drawingml/2006/wordprocessingDrawing" distT="0" distB="0" distL="0" distR="0">
                 <wp:extent cx="4543425" cy="428625"/>
                 <wp:effectExtent l="0" t="0" r="0" b="0"/>
-                <wp:docPr id="29" name="" hidden="0"/>
+                <wp:docPr id="30" name="" hidden="0"/>
                 <wp:cNvGraphicFramePr>
                   <a:graphicFrameLocks xmlns:a="http://schemas.openxmlformats.org/drawingml/2006/main" noChangeAspect="1"/>
                 </wp:cNvGraphicFramePr>
@@ -15048,7 +15262,7 @@
                         <pic:nvPr isPhoto="0" userDrawn="0"/>
                       </pic:nvPicPr>
                       <pic:blipFill>
-                        <a:blip r:embed="rId40"/>
+                        <a:blip r:embed="rId41"/>
                         <a:stretch/>
                       </pic:blipFill>
                       <pic:spPr bwMode="auto">
@@ -15087,8 +15301,8 @@
                 <v:path o:extrusionok="f" gradientshapeok="t" o:connecttype="rect"/>
                 <o:lock v:ext="edit" aspectratio="t"/>
               </v:shapetype>
-              <v:shape id="_x0000_i28" o:spid="_x0000_s28" type="#_x0000_t75" style="width:357.75pt;height:33.75pt;mso-wrap-distance-left:0.00pt;mso-wrap-distance-top:0.00pt;mso-wrap-distance-right:0.00pt;mso-wrap-distance-bottom:0.00pt;z-index:1;" stroked="false">
-                <v:imagedata r:id="rId40" o:title=""/>
+              <v:shape id="_x0000_i29" o:spid="_x0000_s29" type="#_x0000_t75" style="width:357.75pt;height:33.75pt;mso-wrap-distance-left:0.00pt;mso-wrap-distance-top:0.00pt;mso-wrap-distance-right:0.00pt;mso-wrap-distance-bottom:0.00pt;z-index:1;" stroked="false">
+                <v:imagedata r:id="rId41" o:title=""/>
                 <o:lock v:ext="edit" rotation="t"/>
               </v:shape>
             </w:pict>
@@ -15247,7 +15461,7 @@
               <wp:inline xmlns:wp="http://schemas.openxmlformats.org/drawingml/2006/wordprocessingDrawing" distT="0" distB="0" distL="0" distR="0">
                 <wp:extent cx="4791075" cy="2200275"/>
                 <wp:effectExtent l="0" t="0" r="0" b="0"/>
-                <wp:docPr id="30" name="" hidden="0"/>
+                <wp:docPr id="31" name="" hidden="0"/>
                 <wp:cNvGraphicFramePr>
                   <a:graphicFrameLocks xmlns:a="http://schemas.openxmlformats.org/drawingml/2006/main" noChangeAspect="1"/>
                 </wp:cNvGraphicFramePr>
@@ -15262,7 +15476,7 @@
                         <pic:nvPr isPhoto="0" userDrawn="0"/>
                       </pic:nvPicPr>
                       <pic:blipFill>
-                        <a:blip r:embed="rId41"/>
+                        <a:blip r:embed="rId42"/>
                         <a:stretch/>
                       </pic:blipFill>
                       <pic:spPr bwMode="auto">
@@ -15301,8 +15515,8 @@
                 <v:path o:extrusionok="f" gradientshapeok="t" o:connecttype="rect"/>
                 <o:lock v:ext="edit" aspectratio="t"/>
               </v:shapetype>
-              <v:shape id="_x0000_i29" o:spid="_x0000_s29" type="#_x0000_t75" style="width:377.25pt;height:173.25pt;mso-wrap-distance-left:0.00pt;mso-wrap-distance-top:0.00pt;mso-wrap-distance-right:0.00pt;mso-wrap-distance-bottom:0.00pt;z-index:1;" stroked="false">
-                <v:imagedata r:id="rId41" o:title=""/>
+              <v:shape id="_x0000_i30" o:spid="_x0000_s30" type="#_x0000_t75" style="width:377.25pt;height:173.25pt;mso-wrap-distance-left:0.00pt;mso-wrap-distance-top:0.00pt;mso-wrap-distance-right:0.00pt;mso-wrap-distance-bottom:0.00pt;z-index:1;" stroked="false">
+                <v:imagedata r:id="rId42" o:title=""/>
                 <o:lock v:ext="edit" rotation="t"/>
               </v:shape>
             </w:pict>
@@ -15561,7 +15775,7 @@
               <wp:inline xmlns:wp="http://schemas.openxmlformats.org/drawingml/2006/wordprocessingDrawing" distT="0" distB="0" distL="0" distR="0">
                 <wp:extent cx="4010025" cy="314325"/>
                 <wp:effectExtent l="0" t="0" r="0" b="0"/>
-                <wp:docPr id="31" name="" hidden="0"/>
+                <wp:docPr id="32" name="" hidden="0"/>
                 <wp:cNvGraphicFramePr>
                   <a:graphicFrameLocks xmlns:a="http://schemas.openxmlformats.org/drawingml/2006/main" noChangeAspect="1"/>
                 </wp:cNvGraphicFramePr>
@@ -15576,7 +15790,7 @@
                         <pic:nvPr isPhoto="0" userDrawn="0"/>
                       </pic:nvPicPr>
                       <pic:blipFill>
-                        <a:blip r:embed="rId42"/>
+                        <a:blip r:embed="rId43"/>
                         <a:stretch/>
                       </pic:blipFill>
                       <pic:spPr bwMode="auto">
@@ -15615,8 +15829,8 @@
                 <v:path o:extrusionok="f" gradientshapeok="t" o:connecttype="rect"/>
                 <o:lock v:ext="edit" aspectratio="t"/>
               </v:shapetype>
-              <v:shape id="_x0000_i30" o:spid="_x0000_s30" type="#_x0000_t75" style="width:315.75pt;height:24.75pt;mso-wrap-distance-left:0.00pt;mso-wrap-distance-top:0.00pt;mso-wrap-distance-right:0.00pt;mso-wrap-distance-bottom:0.00pt;z-index:1;" stroked="false">
-                <v:imagedata r:id="rId42" o:title=""/>
+              <v:shape id="_x0000_i31" o:spid="_x0000_s31" type="#_x0000_t75" style="width:315.75pt;height:24.75pt;mso-wrap-distance-left:0.00pt;mso-wrap-distance-top:0.00pt;mso-wrap-distance-right:0.00pt;mso-wrap-distance-bottom:0.00pt;z-index:1;" stroked="false">
+                <v:imagedata r:id="rId43" o:title=""/>
                 <o:lock v:ext="edit" rotation="t"/>
               </v:shape>
             </w:pict>

</xml_diff>

<commit_message>
Just structure chart and display left to write.
</commit_message>
<xml_diff>
--- a/Design.docx
+++ b/Design.docx
@@ -4173,7 +4173,16 @@
           <w:szCs w:val="22"/>
           <w:highlight w:val="none"/>
         </w:rPr>
-        <w:t xml:space="preserve">hat my program needs, these will be implemented in a separate file from the main one and imported as a module. The module will be imported as “vec” which is why you will see things like “vec.mag(vector)” in later pseudocode. The thrree operations needed are:</w:t>
+        <w:t xml:space="preserve">ha</w:t>
+      </w:r>
+      <w:r>
+        <w:rPr>
+          <w:color w:val="000000" w:themeColor="text1"/>
+          <w:sz w:val="22"/>
+          <w:szCs w:val="22"/>
+          <w:highlight w:val="none"/>
+        </w:rPr>
+        <w:t xml:space="preserve">t my program needs, these will be implemented in a separate file from the main one and imported as a module. The module will be imported as “vec” which is why you will see things like “vec.mag(vector)” in later pseudocode. The thrree operations needed are:</w:t>
       </w:r>
       <w:r>
         <w:rPr>
@@ -7736,7 +7745,25 @@
           <w:szCs w:val="22"/>
           <w:highlight w:val="none"/>
         </w:rPr>
-        <w:t xml:space="preserve">put before it’s returned, which is used in the satellite subclass to change the way its orbital lines look to make them look better. Making everything a getter leaves room open for further editing in the future if needed, and makes the program more robust. Note that there is a getHost() function even though the host attribute is always null and never used by the celestialBody class. This is to ensure compatibility with the satellite subclass, we can run getHost() on an object without having to worry about if it’s a satellite or planet, and if the host is null then we just ignore it.</w:t>
+        <w:t xml:space="preserve">put before it’s returned, which is used in the satellite subclass to change t</w:t>
+      </w:r>
+      <w:r>
+        <w:rPr>
+          <w:color w:val="000000"/>
+          <w:sz w:val="22"/>
+          <w:szCs w:val="22"/>
+          <w:highlight w:val="none"/>
+        </w:rPr>
+        <w:t xml:space="preserve">he way its orbital lines look to make them look better. Making everything a getter leaves room open for further editing in the future if needed, and makes the program more robust. Note that there is a getHost() function even though the host attribute is al</w:t>
+      </w:r>
+      <w:r>
+        <w:rPr>
+          <w:color w:val="000000"/>
+          <w:sz w:val="22"/>
+          <w:szCs w:val="22"/>
+          <w:highlight w:val="none"/>
+        </w:rPr>
+        <w:t xml:space="preserve">ways null and never used by the celestialBody class. This is to ensure compatibility with the satellite subclass, we can run getHost() on an object without having to worry about if it’s a satellite or planet, and if the host is null then we just ignore it.</w:t>
       </w:r>
       <w:r>
         <w:rPr>
@@ -7836,7 +7863,7 @@
           <mc:Choice Requires="wpg">
             <w:drawing>
               <wp:inline xmlns:wp="http://schemas.openxmlformats.org/drawingml/2006/wordprocessingDrawing" distT="0" distB="0" distL="0" distR="0">
-                <wp:extent cx="5940425" cy="1051470"/>
+                <wp:extent cx="5940425" cy="1163429"/>
                 <wp:effectExtent l="0" t="0" r="0" b="0"/>
                 <wp:docPr id="15" name=""/>
                 <wp:cNvGraphicFramePr>
@@ -7846,7 +7873,7 @@
                   <a:graphicData uri="http://schemas.openxmlformats.org/drawingml/2006/picture">
                     <pic:pic xmlns:pic="http://schemas.openxmlformats.org/drawingml/2006/picture">
                       <pic:nvPicPr>
-                        <pic:cNvPr id="1816764814" name=""/>
+                        <pic:cNvPr id="245800511" name=""/>
                         <pic:cNvPicPr>
                           <a:picLocks noChangeAspect="1"/>
                         </pic:cNvPicPr>
@@ -7859,7 +7886,7 @@
                       <pic:spPr bwMode="auto">
                         <a:xfrm>
                           <a:off x="0" y="0"/>
-                          <a:ext cx="5940424" cy="1051470"/>
+                          <a:ext cx="5940424" cy="1163429"/>
                         </a:xfrm>
                         <a:prstGeom prst="rect">
                           <a:avLst/>
@@ -7892,7 +7919,7 @@
                 <v:path o:extrusionok="f" gradientshapeok="t" o:connecttype="rect"/>
                 <o:lock v:ext="edit" aspectratio="t"/>
               </v:shapetype>
-              <v:shape id="_x0000_i14" o:spid="_x0000_s14" type="#_x0000_t75" style="width:467.75pt;height:82.79pt;mso-wrap-distance-left:0.00pt;mso-wrap-distance-top:0.00pt;mso-wrap-distance-right:0.00pt;mso-wrap-distance-bottom:0.00pt;z-index:1;" stroked="false">
+              <v:shape id="_x0000_i14" o:spid="_x0000_s14" type="#_x0000_t75" style="width:467.75pt;height:91.61pt;mso-wrap-distance-left:0.00pt;mso-wrap-distance-top:0.00pt;mso-wrap-distance-right:0.00pt;mso-wrap-distance-bottom:0.00pt;z-index:1;" stroked="false">
                 <v:imagedata r:id="rId26" o:title=""/>
                 <o:lock v:ext="edit" rotation="t"/>
               </v:shape>
@@ -7908,6 +7935,15 @@
           <w:highlight w:val="none"/>
         </w:rPr>
       </w:r>
+      <w:r/>
+      <w:r>
+        <w:rPr>
+          <w:color w:val="000000"/>
+          <w:sz w:val="22"/>
+          <w:szCs w:val="22"/>
+          <w:highlight w:val="none"/>
+        </w:rPr>
+      </w:r>
       <w:r>
         <w:rPr>
           <w:color w:val="000000"/>
@@ -8226,7 +8262,25 @@
           <w:szCs w:val="22"/>
           <w:highlight w:val="none"/>
         </w:rPr>
-        <w:t xml:space="preserve">These classes are both subclasses of celestialBody. The distinction between planet and satellite in my program is a bit different than how the words are used in normal life. In my program, a satellite has a host object, and its orbital lines are drawn relative to the motion of the host object. This is why it’s called a satellite, as the proper, physical definition of a satellite is just an object orbiting another object, e.g. the moon is a satellite of Earth. A planet will not have changes from the parent class, celestialBody, but the class is there to make clear the distinction between planet and satellite.</w:t>
+        <w:t xml:space="preserve">These classes are both subclasses of celestialBody. The distinction between planet and satellite in my </w:t>
+      </w:r>
+      <w:r>
+        <w:rPr>
+          <w:color w:val="000000"/>
+          <w:sz w:val="22"/>
+          <w:szCs w:val="22"/>
+          <w:highlight w:val="none"/>
+        </w:rPr>
+        <w:t xml:space="preserve">program is a bit different than how the words are used in normal life. In my program, a satellite has a host object, and its orbital lines are drawn relative to the motion of the host object. This is why it’s called a satellite, as the proper, physical def</w:t>
+      </w:r>
+      <w:r>
+        <w:rPr>
+          <w:color w:val="000000"/>
+          <w:sz w:val="22"/>
+          <w:szCs w:val="22"/>
+          <w:highlight w:val="none"/>
+        </w:rPr>
+        <w:t xml:space="preserve">inition of a satellite is just an object orbiting another object, e.g. the moon is a satellite of Earth. A planet will not have changes from the parent class, celestialBody, but the class is there to make clear the distinction between planet and satellite.</w:t>
       </w:r>
       <w:r>
         <w:rPr>
@@ -8264,7 +8318,34 @@
           <w:szCs w:val="22"/>
           <w:highlight w:val="none"/>
         </w:rPr>
-        <w:t xml:space="preserve">Since the only thing the satellite class needs to do differently is change how the orbital lines are drawn, there are only a few things we need to change. First, getHost() should return something other than null. We will use composition to set the host attributes, the host attribute should be the object that the satellite has as a host. This object will be another planet. Satellites orbiting satellites is possible, but there is no instance of that in our solar system, so in the class diagram I just showed satellite as composing with planets, you could compose it with another satellite if you really wanted to. Secondly, addRecord() and getRecords() should be edited so that the path they display is relative to the motion of the host, how this is done will be explained later in this section.</w:t>
+        <w:t xml:space="preserve">Since the only thing the satell</w:t>
+      </w:r>
+      <w:r>
+        <w:rPr>
+          <w:color w:val="000000"/>
+          <w:sz w:val="22"/>
+          <w:szCs w:val="22"/>
+          <w:highlight w:val="none"/>
+        </w:rPr>
+        <w:t xml:space="preserve">ite class needs to do differently is change how the orbital lines are drawn, there are only a few things we need to change. First, we should make the host attribute something other than null. We will use composition to set the host attributes, the host attribute sho</w:t>
+      </w:r>
+      <w:r>
+        <w:rPr>
+          <w:color w:val="000000"/>
+          <w:sz w:val="22"/>
+          <w:szCs w:val="22"/>
+          <w:highlight w:val="none"/>
+        </w:rPr>
+        <w:t xml:space="preserve">uld be the object that the satellite has as a host. This object will be another planet. Satellites orbiting satellites is possible, but there is no instance of that in our solar system, so in the class diagram I just showed satellite as composing with plan</w:t>
+      </w:r>
+      <w:r>
+        <w:rPr>
+          <w:color w:val="000000"/>
+          <w:sz w:val="22"/>
+          <w:szCs w:val="22"/>
+          <w:highlight w:val="none"/>
+        </w:rPr>
+        <w:t xml:space="preserve">ets, you could compose it with another satellite if you really wanted to. getHost() will now return an object instead of null.</w:t>
       </w:r>
       <w:r>
         <w:rPr>
@@ -8294,25 +8375,38 @@
           <w:szCs w:val="22"/>
           <w:highlight w:val="none"/>
         </w:rPr>
+        <w:t xml:space="preserve">Secondly, addRecord() and getRecords() should be edited so that the path they display is relative to the motion of the host.</w:t>
+      </w:r>
+      <w:r>
+        <w:rPr>
+          <w:color w:val="000000"/>
+          <w:sz w:val="22"/>
+          <w:szCs w:val="22"/>
+          <w:highlight w:val="none"/>
+        </w:rPr>
+      </w:r>
+      <w:r/>
+    </w:p>
+    <w:p>
+      <w:pPr>
+        <w:pBdr/>
+        <w:spacing/>
+        <w:ind/>
+        <w:rPr>
+          <w:color w:val="000000"/>
+          <w:sz w:val="22"/>
+          <w:szCs w:val="22"/>
+          <w:highlight w:val="none"/>
+        </w:rPr>
+      </w:pPr>
+      <w:r>
+        <w:rPr>
+          <w:color w:val="000000"/>
+          <w:sz w:val="22"/>
+          <w:szCs w:val="22"/>
+          <w:highlight w:val="none"/>
+        </w:rPr>
         <w:t xml:space="preserve">But why do the orbital lines need to be drawn relative to the motion of the host? Well, this is what the moon’s path looks like if its path is not drawn relative to Earth’s motion:</w:t>
-      </w:r>
-      <w:r>
-        <w:rPr>
-          <w:color w:val="000000"/>
-          <w:sz w:val="22"/>
-          <w:szCs w:val="22"/>
-          <w:highlight w:val="none"/>
-        </w:rPr>
-      </w:r>
-      <w:r>
-        <w:rPr>
-          <w:highlight w:val="none"/>
-        </w:rPr>
-      </w:r>
-      <w:r>
-        <w:rPr>
-          <w:highlight w:val="none"/>
-        </w:rPr>
       </w:r>
       <w:r>
         <w:rPr>
@@ -8419,9 +8513,6 @@
       </w:r>
       <w:r>
         <w:rPr>
-          <w:color w:val="000000"/>
-          <w:sz w:val="22"/>
-          <w:szCs w:val="22"/>
           <w:highlight w:val="none"/>
         </w:rPr>
       </w:r>
@@ -8459,6 +8550,14 @@
           <w:highlight w:val="none"/>
         </w:rPr>
       </w:r>
+      <w:r>
+        <w:rPr>
+          <w:color w:val="000000"/>
+          <w:sz w:val="22"/>
+          <w:szCs w:val="22"/>
+          <w:highlight w:val="none"/>
+        </w:rPr>
+      </w:r>
     </w:p>
     <w:p>
       <w:pPr>
@@ -8487,7 +8586,33 @@
           <w:szCs w:val="22"/>
           <w:highlight w:val="none"/>
         </w:rPr>
-        <w:t xml:space="preserve">The moon is orbiting Earth, but it’s also orbiting around the sun. The path the moon follows just makes it look like it orbits the sun, with very slight wiggle because of its orbit around the Earth. This is not very illustrative and will confuse students as they might not get how the moon is technically orbiting both the Earth and the Sun. When we talk about the moon’s orbit, we mean its orbit around Earth. What this means physically is the motion of the moon relative to the motion of Earth. If we draw its path relative to Earth’s motion, we get this:</w:t>
+        <w:t xml:space="preserve">The moon is orbiting Earth, but it’s also orb</w:t>
+      </w:r>
+      <w:r>
+        <w:rPr>
+          <w:color w:val="000000"/>
+          <w:sz w:val="22"/>
+          <w:szCs w:val="22"/>
+          <w:highlight w:val="none"/>
+        </w:rPr>
+        <w:t xml:space="preserve">iting around the sun. The path the moon follows just makes it look like it orbits the sun, with very slight wiggle because of its orbit around the Earth. This is not very illustrative and will confuse students as they might not get how the moon is technica</w:t>
+      </w:r>
+      <w:r>
+        <w:rPr>
+          <w:color w:val="000000"/>
+          <w:sz w:val="22"/>
+          <w:szCs w:val="22"/>
+          <w:highlight w:val="none"/>
+        </w:rPr>
+        <w:t xml:space="preserve">lly orbiting both the Earth and the Sun. When we talk about the moon’s orbit, we mean its orbit around Earth. What this means physically is the motion of the moon relative to the motion of Earth. If we draw its path relative to Earth’s motion, we get this:</w:t>
+      </w:r>
+      <w:r>
+        <w:rPr>
+          <w:color w:val="000000"/>
+          <w:sz w:val="22"/>
+          <w:szCs w:val="22"/>
+          <w:highlight w:val="none"/>
+        </w:rPr>
       </w:r>
       <w:r>
         <w:rPr>
@@ -8633,6 +8758,14 @@
           <w:highlight w:val="none"/>
         </w:rPr>
       </w:r>
+      <w:r>
+        <w:rPr>
+          <w:color w:val="000000"/>
+          <w:sz w:val="22"/>
+          <w:szCs w:val="22"/>
+          <w:highlight w:val="none"/>
+        </w:rPr>
+      </w:r>
     </w:p>
     <w:p>
       <w:pPr>
@@ -8663,6 +8796,14 @@
           <w:highlight w:val="none"/>
         </w:rPr>
       </w:r>
+      <w:r>
+        <w:rPr>
+          <w:color w:val="000000"/>
+          <w:sz w:val="22"/>
+          <w:szCs w:val="22"/>
+          <w:highlight w:val="none"/>
+        </w:rPr>
+      </w:r>
     </w:p>
     <w:p>
       <w:pPr>
@@ -8692,6 +8833,14 @@
           <w:highlight w:val="none"/>
         </w:rPr>
       </w:r>
+      <w:r>
+        <w:rPr>
+          <w:color w:val="000000"/>
+          <w:sz w:val="22"/>
+          <w:szCs w:val="22"/>
+          <w:highlight w:val="none"/>
+        </w:rPr>
+      </w:r>
     </w:p>
     <w:p>
       <w:pPr>
@@ -8715,6 +8864,14 @@
           <w:highlight w:val="none"/>
         </w:rPr>
       </w:r>
+      <w:r>
+        <w:rPr>
+          <w:color w:val="000000"/>
+          <w:sz w:val="22"/>
+          <w:szCs w:val="22"/>
+          <w:highlight w:val="none"/>
+        </w:rPr>
+      </w:r>
     </w:p>
     <w:p>
       <w:pPr>
@@ -8725,6 +8882,11 @@
           <w:highlight w:val="none"/>
         </w:rPr>
       </w:pPr>
+      <w:r>
+        <w:rPr>
+          <w:highlight w:val="none"/>
+        </w:rPr>
+      </w:r>
       <w:r>
         <w:rPr>
           <w:highlight w:val="none"/>
@@ -8830,38 +8992,8 @@
           <w:highlight w:val="none"/>
         </w:rPr>
       </w:r>
-      <w:r/>
-      <w:r>
-        <w:rPr>
-          <w:color w:val="000000"/>
-          <w:sz w:val="22"/>
-          <w:szCs w:val="22"/>
-          <w:highlight w:val="none"/>
-        </w:rPr>
-      </w:r>
-      <w:r/>
-      <w:r>
-        <w:rPr>
-          <w:color w:val="000000"/>
-          <w:sz w:val="22"/>
-          <w:szCs w:val="22"/>
-          <w:highlight w:val="none"/>
-        </w:rPr>
-      </w:r>
-      <w:r/>
-      <w:r>
-        <w:rPr>
-          <w:color w:val="000000"/>
-          <w:sz w:val="22"/>
-          <w:szCs w:val="22"/>
-          <w:highlight w:val="none"/>
-        </w:rPr>
-      </w:r>
-      <w:r>
-        <w:rPr>
-          <w:color w:val="000000"/>
-          <w:sz w:val="22"/>
-          <w:szCs w:val="22"/>
+      <w:r>
+        <w:rPr>
           <w:highlight w:val="none"/>
         </w:rPr>
       </w:r>
@@ -8903,31 +9035,6 @@
           <w:highlight w:val="none"/>
         </w:rPr>
       </w:r>
-      <w:r/>
-      <w:r>
-        <w:rPr>
-          <w:color w:val="000000"/>
-          <w:sz w:val="22"/>
-          <w:szCs w:val="22"/>
-          <w:highlight w:val="none"/>
-        </w:rPr>
-      </w:r>
-      <w:r>
-        <w:rPr>
-          <w:color w:val="000000"/>
-          <w:sz w:val="22"/>
-          <w:szCs w:val="22"/>
-          <w:highlight w:val="none"/>
-        </w:rPr>
-      </w:r>
-      <w:r>
-        <w:rPr>
-          <w:color w:val="000000"/>
-          <w:sz w:val="22"/>
-          <w:szCs w:val="22"/>
-          <w:highlight w:val="none"/>
-        </w:rPr>
-      </w:r>
     </w:p>
     <w:p>
       <w:pPr>
@@ -8948,6 +9055,14 @@
       </w:r>
       <w:r>
         <w:rPr>
+          <w:highlight w:val="none"/>
+        </w:rPr>
+      </w:r>
+      <w:r>
+        <w:rPr>
+          <w:color w:val="000000"/>
+          <w:sz w:val="22"/>
+          <w:szCs w:val="22"/>
           <w:highlight w:val="none"/>
         </w:rPr>
       </w:r>
@@ -9048,9 +9163,6 @@
       </w:r>
       <w:r>
         <w:rPr>
-          <w:color w:val="000000"/>
-          <w:sz w:val="22"/>
-          <w:szCs w:val="22"/>
           <w:highlight w:val="none"/>
         </w:rPr>
       </w:r>
@@ -9074,7 +9186,7 @@
           <w:szCs w:val="22"/>
           <w:highlight w:val="none"/>
         </w:rPr>
-        <w:t xml:space="preserve">It turns out, rather conveniently, that the purple arrow there is just the vectors moonPos - earthPos. So we can just subtract one position from the other to get the relative position. This is how addRecord() will work for satellites, it will find the host’s current position and then add record – hostPosition instead of just adding record to the array of records, this way we have a history of all the *relative* positions of the satellite, not the actual positions.</w:t>
+        <w:t xml:space="preserve">It turns out, rather conveniently, that the purple arrow there is just the vectors moonPos - earthPos. So we can just subtract one position from the other to get the relative position. This is how addRecord() wil</w:t>
       </w:r>
       <w:r>
         <w:rPr>
@@ -9083,14 +9195,7 @@
           <w:szCs w:val="22"/>
           <w:highlight w:val="none"/>
         </w:rPr>
-      </w:r>
-      <w:r>
-        <w:rPr>
-          <w:color w:val="000000"/>
-          <w:sz w:val="22"/>
-          <w:szCs w:val="22"/>
-          <w:highlight w:val="none"/>
-        </w:rPr>
+        <w:t xml:space="preserve">l work for satellites, it will find the host’s current position and then add record – hostPosition instead of just adding record to the array of records, this way we have a history of all the *relative* positions of the satellite, not the actual positions.</w:t>
       </w:r>
       <w:r>
         <w:rPr>
@@ -9128,39 +9233,7 @@
           <w:szCs w:val="22"/>
           <w:highlight w:val="none"/>
         </w:rPr>
-        <w:t xml:space="preserve">addRecord() will use the same trick as earlier to ensure that the list of records does not exceed the desired length.</w:t>
-      </w:r>
-      <w:r>
-        <w:rPr>
-          <w:color w:val="000000"/>
-          <w:sz w:val="22"/>
-          <w:szCs w:val="22"/>
-          <w:highlight w:val="none"/>
-        </w:rPr>
-      </w:r>
-      <w:r>
-        <w:rPr>
-          <w:color w:val="000000"/>
-          <w:sz w:val="22"/>
-          <w:szCs w:val="22"/>
-          <w:highlight w:val="none"/>
-        </w:rPr>
-      </w:r>
-      <w:r>
-        <w:rPr>
-          <w:color w:val="000000"/>
-          <w:sz w:val="22"/>
-          <w:szCs w:val="22"/>
-          <w:highlight w:val="none"/>
-        </w:rPr>
-      </w:r>
-      <w:r>
-        <w:rPr>
-          <w:color w:val="000000"/>
-          <w:sz w:val="22"/>
-          <w:szCs w:val="22"/>
-          <w:highlight w:val="none"/>
-        </w:rPr>
+        <w:t xml:space="preserve">addRecord() will use the same trick as in celestialBody to ensure that the list of records does not exceed the desired length.</w:t>
       </w:r>
       <w:r>
         <w:rPr>
@@ -9199,6 +9272,547 @@
           <w:highlight w:val="none"/>
         </w:rPr>
         <w:t xml:space="preserve">Here is pseudocode explaining how it will all work:</w:t>
+      </w:r>
+      <w:r>
+        <w:rPr>
+          <w:color w:val="000000"/>
+          <w:sz w:val="22"/>
+          <w:szCs w:val="22"/>
+          <w:highlight w:val="none"/>
+        </w:rPr>
+      </w:r>
+      <w:r>
+        <w:rPr>
+          <w:color w:val="000000"/>
+          <w:sz w:val="22"/>
+          <w:szCs w:val="22"/>
+          <w:highlight w:val="none"/>
+        </w:rPr>
+      </w:r>
+    </w:p>
+    <w:p>
+      <w:pPr>
+        <w:pBdr/>
+        <w:spacing/>
+        <w:ind/>
+        <w:rPr>
+          <w:color w:val="000000"/>
+          <w:sz w:val="22"/>
+          <w:szCs w:val="22"/>
+          <w:highlight w:val="none"/>
+        </w:rPr>
+      </w:pPr>
+      <w:r>
+        <w:rPr>
+          <w:color w:val="000000"/>
+          <w:sz w:val="22"/>
+          <w:szCs w:val="22"/>
+          <w:highlight w:val="none"/>
+        </w:rPr>
+      </w:r>
+      <w:r>
+        <mc:AlternateContent>
+          <mc:Choice Requires="wpg">
+            <w:drawing>
+              <wp:inline xmlns:wp="http://schemas.openxmlformats.org/drawingml/2006/wordprocessingDrawing" distT="0" distB="0" distL="0" distR="0">
+                <wp:extent cx="5940425" cy="1423864"/>
+                <wp:effectExtent l="0" t="0" r="0" b="0"/>
+                <wp:docPr id="20" name=""/>
+                <wp:cNvGraphicFramePr>
+                  <a:graphicFrameLocks xmlns:a="http://schemas.openxmlformats.org/drawingml/2006/main" noChangeAspect="1"/>
+                </wp:cNvGraphicFramePr>
+                <a:graphic xmlns:a="http://schemas.openxmlformats.org/drawingml/2006/main">
+                  <a:graphicData uri="http://schemas.openxmlformats.org/drawingml/2006/picture">
+                    <pic:pic xmlns:pic="http://schemas.openxmlformats.org/drawingml/2006/picture">
+                      <pic:nvPicPr>
+                        <pic:cNvPr id="1661549681" name=""/>
+                        <pic:cNvPicPr>
+                          <a:picLocks noChangeAspect="1"/>
+                        </pic:cNvPicPr>
+                        <pic:nvPr/>
+                      </pic:nvPicPr>
+                      <pic:blipFill>
+                        <a:blip r:embed="rId31"/>
+                        <a:stretch/>
+                      </pic:blipFill>
+                      <pic:spPr bwMode="auto">
+                        <a:xfrm>
+                          <a:off x="0" y="0"/>
+                          <a:ext cx="5940424" cy="1423864"/>
+                        </a:xfrm>
+                        <a:prstGeom prst="rect">
+                          <a:avLst/>
+                        </a:prstGeom>
+                      </pic:spPr>
+                    </pic:pic>
+                  </a:graphicData>
+                </a:graphic>
+              </wp:inline>
+            </w:drawing>
+          </mc:Choice>
+          <mc:Fallback>
+            <w:pict>
+              <v:shapetype id="_x0000_t75" coordsize="21600,21600" o:spt="75" o:preferrelative="t" path="m@4@5l@4@11@9@11@9@5xe" filled="f" stroked="f">
+                <v:stroke joinstyle="miter"/>
+                <v:formulas>
+                  <v:f eqn="if lineDrawn pixelLineWidth 0"/>
+                  <v:f eqn="sum @0 1 0"/>
+                  <v:f eqn="sum 0 0 @1"/>
+                  <v:f eqn="prod @2 1 2"/>
+                  <v:f eqn="prod @3 21600 pixelWidth"/>
+                  <v:f eqn="prod @3 21600 pixelHeight"/>
+                  <v:f eqn="sum @0 0 1"/>
+                  <v:f eqn="prod @6 1 2"/>
+                  <v:f eqn="prod @7 21600 pixelWidth"/>
+                  <v:f eqn="sum @8 21600 0"/>
+                  <v:f eqn="prod @7 21600 pixelHeight"/>
+                  <v:f eqn="sum @10 21600 0"/>
+                </v:formulas>
+                <v:path o:extrusionok="f" gradientshapeok="t" o:connecttype="rect"/>
+                <o:lock v:ext="edit" aspectratio="t"/>
+              </v:shapetype>
+              <v:shape id="_x0000_i19" o:spid="_x0000_s19" type="#_x0000_t75" style="width:467.75pt;height:112.12pt;mso-wrap-distance-left:0.00pt;mso-wrap-distance-top:0.00pt;mso-wrap-distance-right:0.00pt;mso-wrap-distance-bottom:0.00pt;z-index:1;" stroked="false">
+                <v:imagedata r:id="rId31" o:title=""/>
+                <o:lock v:ext="edit" rotation="t"/>
+              </v:shape>
+            </w:pict>
+          </mc:Fallback>
+        </mc:AlternateContent>
+      </w:r>
+      <w:r>
+        <w:rPr>
+          <w:color w:val="000000"/>
+          <w:sz w:val="22"/>
+          <w:szCs w:val="22"/>
+          <w:highlight w:val="none"/>
+        </w:rPr>
+      </w:r>
+      <w:r/>
+      <w:r/>
+      <w:r/>
+      <w:r>
+        <w:rPr>
+          <w:color w:val="000000"/>
+          <w:sz w:val="22"/>
+          <w:szCs w:val="22"/>
+          <w:highlight w:val="none"/>
+        </w:rPr>
+      </w:r>
+      <w:r>
+        <w:rPr>
+          <w:color w:val="000000"/>
+          <w:sz w:val="22"/>
+          <w:szCs w:val="22"/>
+          <w:highlight w:val="none"/>
+        </w:rPr>
+      </w:r>
+    </w:p>
+    <w:p>
+      <w:pPr>
+        <w:pBdr/>
+        <w:spacing/>
+        <w:ind/>
+        <w:rPr>
+          <w:color w:val="000000"/>
+          <w:sz w:val="22"/>
+          <w:szCs w:val="22"/>
+          <w:highlight w:val="none"/>
+        </w:rPr>
+      </w:pPr>
+      <w:r>
+        <w:rPr>
+          <w:color w:val="000000"/>
+          <w:sz w:val="22"/>
+          <w:szCs w:val="22"/>
+          <w:highlight w:val="none"/>
+        </w:rPr>
+      </w:r>
+      <w:r>
+        <w:rPr>
+          <w:color w:val="000000"/>
+          <w:sz w:val="22"/>
+          <w:szCs w:val="22"/>
+          <w:highlight w:val="none"/>
+        </w:rPr>
+      </w:r>
+    </w:p>
+    <w:p>
+      <w:pPr>
+        <w:pBdr/>
+        <w:spacing/>
+        <w:ind/>
+        <w:jc w:val="both"/>
+        <w:rPr>
+          <w:color w:val="000000"/>
+          <w:sz w:val="22"/>
+          <w:szCs w:val="22"/>
+          <w:highlight w:val="none"/>
+        </w:rPr>
+      </w:pPr>
+      <w:r>
+        <w:rPr>
+          <w:color w:val="000000"/>
+          <w:sz w:val="22"/>
+          <w:szCs w:val="22"/>
+          <w:highlight w:val="none"/>
+        </w:rPr>
+        <w:t xml:space="preserve">Next, we need to consider how getRecord() will work. If we just return the records as is, the vectors from the Earth to moon, and try and draw them, we have a problem. The program doesn’t know to start at the Earth and then follow the vector to get to the point where the line is supposed to be drawn. It will instead start at the origin and then follow the vector. For example, if we use the same purple arrow as in the previous diagram, we’d get this:</w:t>
+      </w:r>
+      <w:r>
+        <w:rPr>
+          <w:color w:val="000000"/>
+          <w:sz w:val="22"/>
+          <w:szCs w:val="22"/>
+          <w:highlight w:val="none"/>
+        </w:rPr>
+      </w:r>
+    </w:p>
+    <w:p>
+      <w:pPr>
+        <w:pBdr/>
+        <w:spacing/>
+        <w:ind/>
+        <w:jc w:val="both"/>
+        <w:rPr>
+          <w:color w:val="000000"/>
+          <w:sz w:val="22"/>
+          <w:szCs w:val="22"/>
+          <w:highlight w:val="none"/>
+        </w:rPr>
+      </w:pPr>
+      <w:r>
+        <w:rPr>
+          <w:color w:val="000000"/>
+          <w:sz w:val="22"/>
+          <w:szCs w:val="22"/>
+          <w:highlight w:val="none"/>
+        </w:rPr>
+      </w:r>
+      <w:r>
+        <mc:AlternateContent>
+          <mc:Choice Requires="wpg">
+            <w:drawing>
+              <wp:inline xmlns:wp="http://schemas.openxmlformats.org/drawingml/2006/wordprocessingDrawing" distT="0" distB="0" distL="0" distR="0">
+                <wp:extent cx="5940425" cy="3515307"/>
+                <wp:effectExtent l="0" t="0" r="0" b="0"/>
+                <wp:docPr id="21" name=""/>
+                <wp:cNvGraphicFramePr>
+                  <a:graphicFrameLocks xmlns:a="http://schemas.openxmlformats.org/drawingml/2006/main" noChangeAspect="1"/>
+                </wp:cNvGraphicFramePr>
+                <a:graphic xmlns:a="http://schemas.openxmlformats.org/drawingml/2006/main">
+                  <a:graphicData uri="http://schemas.openxmlformats.org/drawingml/2006/picture">
+                    <pic:pic xmlns:pic="http://schemas.openxmlformats.org/drawingml/2006/picture">
+                      <pic:nvPicPr>
+                        <pic:cNvPr id="216372463" name=""/>
+                        <pic:cNvPicPr>
+                          <a:picLocks noChangeAspect="1"/>
+                        </pic:cNvPicPr>
+                        <pic:nvPr/>
+                      </pic:nvPicPr>
+                      <pic:blipFill>
+                        <a:blip r:embed="rId32"/>
+                        <a:stretch/>
+                      </pic:blipFill>
+                      <pic:spPr bwMode="auto">
+                        <a:xfrm>
+                          <a:off x="0" y="0"/>
+                          <a:ext cx="5940424" cy="3515307"/>
+                        </a:xfrm>
+                        <a:prstGeom prst="rect">
+                          <a:avLst/>
+                        </a:prstGeom>
+                      </pic:spPr>
+                    </pic:pic>
+                  </a:graphicData>
+                </a:graphic>
+              </wp:inline>
+            </w:drawing>
+          </mc:Choice>
+          <mc:Fallback>
+            <w:pict>
+              <v:shapetype id="_x0000_t75" coordsize="21600,21600" o:spt="75" o:preferrelative="t" path="m@4@5l@4@11@9@11@9@5xe" filled="f" stroked="f">
+                <v:stroke joinstyle="miter"/>
+                <v:formulas>
+                  <v:f eqn="if lineDrawn pixelLineWidth 0"/>
+                  <v:f eqn="sum @0 1 0"/>
+                  <v:f eqn="sum 0 0 @1"/>
+                  <v:f eqn="prod @2 1 2"/>
+                  <v:f eqn="prod @3 21600 pixelWidth"/>
+                  <v:f eqn="prod @3 21600 pixelHeight"/>
+                  <v:f eqn="sum @0 0 1"/>
+                  <v:f eqn="prod @6 1 2"/>
+                  <v:f eqn="prod @7 21600 pixelWidth"/>
+                  <v:f eqn="sum @8 21600 0"/>
+                  <v:f eqn="prod @7 21600 pixelHeight"/>
+                  <v:f eqn="sum @10 21600 0"/>
+                </v:formulas>
+                <v:path o:extrusionok="f" gradientshapeok="t" o:connecttype="rect"/>
+                <o:lock v:ext="edit" aspectratio="t"/>
+              </v:shapetype>
+              <v:shape id="_x0000_i20" o:spid="_x0000_s20" type="#_x0000_t75" style="width:467.75pt;height:276.80pt;mso-wrap-distance-left:0.00pt;mso-wrap-distance-top:0.00pt;mso-wrap-distance-right:0.00pt;mso-wrap-distance-bottom:0.00pt;z-index:1;" stroked="false">
+                <v:imagedata r:id="rId32" o:title=""/>
+                <o:lock v:ext="edit" rotation="t"/>
+              </v:shape>
+            </w:pict>
+          </mc:Fallback>
+        </mc:AlternateContent>
+      </w:r>
+      <w:r>
+        <w:rPr>
+          <w:color w:val="000000"/>
+          <w:sz w:val="22"/>
+          <w:szCs w:val="22"/>
+          <w:highlight w:val="none"/>
+        </w:rPr>
+      </w:r>
+      <w:r>
+        <w:rPr>
+          <w:color w:val="000000"/>
+          <w:sz w:val="22"/>
+          <w:szCs w:val="22"/>
+          <w:highlight w:val="none"/>
+        </w:rPr>
+      </w:r>
+    </w:p>
+    <w:p>
+      <w:pPr>
+        <w:pBdr/>
+        <w:spacing/>
+        <w:ind/>
+        <w:rPr>
+          <w:color w:val="000000"/>
+          <w:sz w:val="22"/>
+          <w:szCs w:val="22"/>
+          <w:highlight w:val="none"/>
+        </w:rPr>
+      </w:pPr>
+      <w:r>
+        <w:rPr>
+          <w:color w:val="000000"/>
+          <w:sz w:val="22"/>
+          <w:szCs w:val="22"/>
+          <w:highlight w:val="none"/>
+        </w:rPr>
+      </w:r>
+      <w:r>
+        <w:rPr>
+          <w:color w:val="000000"/>
+          <w:sz w:val="22"/>
+          <w:szCs w:val="22"/>
+          <w:highlight w:val="none"/>
+        </w:rPr>
+      </w:r>
+    </w:p>
+    <w:p>
+      <w:pPr>
+        <w:pBdr/>
+        <w:spacing/>
+        <w:ind/>
+        <w:rPr>
+          <w:color w:val="000000"/>
+          <w:sz w:val="22"/>
+          <w:szCs w:val="22"/>
+          <w:highlight w:val="none"/>
+        </w:rPr>
+      </w:pPr>
+      <w:r>
+        <w:rPr>
+          <w:color w:val="000000"/>
+          <w:sz w:val="22"/>
+          <w:szCs w:val="22"/>
+          <w:highlight w:val="none"/>
+        </w:rPr>
+        <w:t xml:space="preserve">Which is not good, as that is nowhere near the Earth.</w:t>
+      </w:r>
+      <w:r>
+        <w:rPr>
+          <w:color w:val="000000"/>
+          <w:sz w:val="22"/>
+          <w:szCs w:val="22"/>
+          <w:highlight w:val="none"/>
+        </w:rPr>
+      </w:r>
+    </w:p>
+    <w:p>
+      <w:pPr>
+        <w:pBdr/>
+        <w:spacing/>
+        <w:ind/>
+        <w:rPr>
+          <w:color w:val="000000"/>
+          <w:sz w:val="22"/>
+          <w:szCs w:val="22"/>
+          <w:highlight w:val="none"/>
+        </w:rPr>
+      </w:pPr>
+      <w:r>
+        <w:rPr>
+          <w:color w:val="000000"/>
+          <w:sz w:val="22"/>
+          <w:szCs w:val="22"/>
+          <w:highlight w:val="none"/>
+        </w:rPr>
+        <w:t xml:space="preserve">There is a very simple fix though, all we need to do is add the Earth’s current position to all the records. This can be done with a for loop, like this: </w:t>
+      </w:r>
+      <w:r>
+        <w:rPr>
+          <w:color w:val="000000"/>
+          <w:sz w:val="22"/>
+          <w:szCs w:val="22"/>
+          <w:highlight w:val="none"/>
+        </w:rPr>
+      </w:r>
+      <w:r>
+        <w:rPr>
+          <w:color w:val="000000"/>
+          <w:sz w:val="22"/>
+          <w:szCs w:val="22"/>
+          <w:highlight w:val="none"/>
+        </w:rPr>
+      </w:r>
+      <w:r>
+        <w:rPr>
+          <w:color w:val="000000"/>
+          <w:sz w:val="22"/>
+          <w:szCs w:val="22"/>
+          <w:highlight w:val="none"/>
+        </w:rPr>
+      </w:r>
+      <w:r>
+        <w:rPr>
+          <w:color w:val="000000"/>
+          <w:sz w:val="22"/>
+          <w:szCs w:val="22"/>
+          <w:highlight w:val="none"/>
+        </w:rPr>
+      </w:r>
+    </w:p>
+    <w:p>
+      <w:pPr>
+        <w:pBdr/>
+        <w:spacing/>
+        <w:ind/>
+        <w:rPr>
+          <w:color w:val="000000"/>
+          <w:sz w:val="22"/>
+          <w:szCs w:val="22"/>
+          <w:highlight w:val="none"/>
+        </w:rPr>
+      </w:pPr>
+      <w:r>
+        <w:rPr>
+          <w:color w:val="000000"/>
+          <w:sz w:val="22"/>
+          <w:szCs w:val="22"/>
+          <w:highlight w:val="none"/>
+        </w:rPr>
+      </w:r>
+      <w:r>
+        <mc:AlternateContent>
+          <mc:Choice Requires="wpg">
+            <w:drawing>
+              <wp:inline xmlns:wp="http://schemas.openxmlformats.org/drawingml/2006/wordprocessingDrawing" distT="0" distB="0" distL="0" distR="0">
+                <wp:extent cx="4762500" cy="1990725"/>
+                <wp:effectExtent l="0" t="0" r="0" b="0"/>
+                <wp:docPr id="22" name=""/>
+                <wp:cNvGraphicFramePr>
+                  <a:graphicFrameLocks xmlns:a="http://schemas.openxmlformats.org/drawingml/2006/main" noChangeAspect="1"/>
+                </wp:cNvGraphicFramePr>
+                <a:graphic xmlns:a="http://schemas.openxmlformats.org/drawingml/2006/main">
+                  <a:graphicData uri="http://schemas.openxmlformats.org/drawingml/2006/picture">
+                    <pic:pic xmlns:pic="http://schemas.openxmlformats.org/drawingml/2006/picture">
+                      <pic:nvPicPr>
+                        <pic:cNvPr id="1085647884" name=""/>
+                        <pic:cNvPicPr>
+                          <a:picLocks noChangeAspect="1"/>
+                        </pic:cNvPicPr>
+                        <pic:nvPr/>
+                      </pic:nvPicPr>
+                      <pic:blipFill>
+                        <a:blip r:embed="rId33"/>
+                        <a:stretch/>
+                      </pic:blipFill>
+                      <pic:spPr bwMode="auto">
+                        <a:xfrm>
+                          <a:off x="0" y="0"/>
+                          <a:ext cx="4762499" cy="1990724"/>
+                        </a:xfrm>
+                        <a:prstGeom prst="rect">
+                          <a:avLst/>
+                        </a:prstGeom>
+                      </pic:spPr>
+                    </pic:pic>
+                  </a:graphicData>
+                </a:graphic>
+              </wp:inline>
+            </w:drawing>
+          </mc:Choice>
+          <mc:Fallback>
+            <w:pict>
+              <v:shapetype id="_x0000_t75" coordsize="21600,21600" o:spt="75" o:preferrelative="t" path="m@4@5l@4@11@9@11@9@5xe" filled="f" stroked="f">
+                <v:stroke joinstyle="miter"/>
+                <v:formulas>
+                  <v:f eqn="if lineDrawn pixelLineWidth 0"/>
+                  <v:f eqn="sum @0 1 0"/>
+                  <v:f eqn="sum 0 0 @1"/>
+                  <v:f eqn="prod @2 1 2"/>
+                  <v:f eqn="prod @3 21600 pixelWidth"/>
+                  <v:f eqn="prod @3 21600 pixelHeight"/>
+                  <v:f eqn="sum @0 0 1"/>
+                  <v:f eqn="prod @6 1 2"/>
+                  <v:f eqn="prod @7 21600 pixelWidth"/>
+                  <v:f eqn="sum @8 21600 0"/>
+                  <v:f eqn="prod @7 21600 pixelHeight"/>
+                  <v:f eqn="sum @10 21600 0"/>
+                </v:formulas>
+                <v:path o:extrusionok="f" gradientshapeok="t" o:connecttype="rect"/>
+                <o:lock v:ext="edit" aspectratio="t"/>
+              </v:shapetype>
+              <v:shape id="_x0000_i21" o:spid="_x0000_s21" type="#_x0000_t75" style="width:375.00pt;height:156.75pt;mso-wrap-distance-left:0.00pt;mso-wrap-distance-top:0.00pt;mso-wrap-distance-right:0.00pt;mso-wrap-distance-bottom:0.00pt;z-index:1;" stroked="false">
+                <v:imagedata r:id="rId33" o:title=""/>
+                <o:lock v:ext="edit" rotation="t"/>
+              </v:shape>
+            </w:pict>
+          </mc:Fallback>
+        </mc:AlternateContent>
+      </w:r>
+      <w:r>
+        <w:rPr>
+          <w:color w:val="000000"/>
+          <w:sz w:val="22"/>
+          <w:szCs w:val="22"/>
+          <w:highlight w:val="none"/>
+        </w:rPr>
+      </w:r>
+      <w:r>
+        <w:rPr>
+          <w:color w:val="000000"/>
+          <w:sz w:val="22"/>
+          <w:szCs w:val="22"/>
+          <w:highlight w:val="none"/>
+        </w:rPr>
+      </w:r>
+    </w:p>
+    <w:p>
+      <w:pPr>
+        <w:pBdr/>
+        <w:spacing/>
+        <w:ind/>
+        <w:rPr>
+          <w:color w:val="000000"/>
+          <w:sz w:val="22"/>
+          <w:szCs w:val="22"/>
+          <w:highlight w:val="none"/>
+        </w:rPr>
+      </w:pPr>
+      <w:r>
+        <w:rPr>
+          <w:color w:val="000000"/>
+          <w:sz w:val="22"/>
+          <w:szCs w:val="22"/>
+          <w:highlight w:val="none"/>
+        </w:rPr>
+        <w:t xml:space="preserve">Note that this will be done with list comprehension when I implement it in python to make the code more pythonic.</w:t>
       </w:r>
       <w:r>
         <w:rPr>
@@ -9317,7 +9931,7 @@
               <wp:inline xmlns:wp="http://schemas.openxmlformats.org/drawingml/2006/wordprocessingDrawing" distT="0" distB="0" distL="0" distR="0">
                 <wp:extent cx="5225415" cy="3346555"/>
                 <wp:effectExtent l="0" t="0" r="0" b="0"/>
-                <wp:docPr id="20" name="" hidden="0"/>
+                <wp:docPr id="23" name="" hidden="0"/>
                 <wp:cNvGraphicFramePr>
                   <a:graphicFrameLocks xmlns:a="http://schemas.openxmlformats.org/drawingml/2006/main" noChangeAspect="1"/>
                 </wp:cNvGraphicFramePr>
@@ -9332,7 +9946,7 @@
                         <pic:nvPr isPhoto="0" userDrawn="0"/>
                       </pic:nvPicPr>
                       <pic:blipFill>
-                        <a:blip r:embed="rId31"/>
+                        <a:blip r:embed="rId34"/>
                         <a:stretch/>
                       </pic:blipFill>
                       <pic:spPr bwMode="auto">
@@ -9371,8 +9985,8 @@
                 <v:path o:extrusionok="f" gradientshapeok="t" o:connecttype="rect"/>
                 <o:lock v:ext="edit" aspectratio="t"/>
               </v:shapetype>
-              <v:shape id="_x0000_i19" o:spid="_x0000_s19" type="#_x0000_t75" style="width:411.45pt;height:263.51pt;mso-wrap-distance-left:0.00pt;mso-wrap-distance-top:0.00pt;mso-wrap-distance-right:0.00pt;mso-wrap-distance-bottom:0.00pt;rotation:0;z-index:1;" stroked="false">
-                <v:imagedata r:id="rId31" o:title=""/>
+              <v:shape id="_x0000_i22" o:spid="_x0000_s22" type="#_x0000_t75" style="width:411.45pt;height:263.51pt;mso-wrap-distance-left:0.00pt;mso-wrap-distance-top:0.00pt;mso-wrap-distance-right:0.00pt;mso-wrap-distance-bottom:0.00pt;rotation:0;z-index:1;" stroked="false">
+                <v:imagedata r:id="rId34" o:title=""/>
                 <o:lock v:ext="edit" rotation="t"/>
               </v:shape>
             </w:pict>
@@ -10227,7 +10841,7 @@
               <wp:inline xmlns:wp="http://schemas.openxmlformats.org/drawingml/2006/wordprocessingDrawing" distT="0" distB="0" distL="0" distR="0">
                 <wp:extent cx="5940425" cy="5188838"/>
                 <wp:effectExtent l="0" t="0" r="0" b="0"/>
-                <wp:docPr id="21" name=""/>
+                <wp:docPr id="24" name=""/>
                 <wp:cNvGraphicFramePr>
                   <a:graphicFrameLocks xmlns:a="http://schemas.openxmlformats.org/drawingml/2006/main" noChangeAspect="1"/>
                 </wp:cNvGraphicFramePr>
@@ -10242,7 +10856,7 @@
                         <pic:nvPr/>
                       </pic:nvPicPr>
                       <pic:blipFill>
-                        <a:blip r:embed="rId32"/>
+                        <a:blip r:embed="rId35"/>
                         <a:stretch/>
                       </pic:blipFill>
                       <pic:spPr bwMode="auto">
@@ -10281,8 +10895,8 @@
                 <v:path o:extrusionok="f" gradientshapeok="t" o:connecttype="rect"/>
                 <o:lock v:ext="edit" aspectratio="t"/>
               </v:shapetype>
-              <v:shape id="_x0000_i20" o:spid="_x0000_s20" type="#_x0000_t75" style="width:467.75pt;height:408.57pt;mso-wrap-distance-left:0.00pt;mso-wrap-distance-top:0.00pt;mso-wrap-distance-right:0.00pt;mso-wrap-distance-bottom:0.00pt;z-index:1;" stroked="false">
-                <v:imagedata r:id="rId32" o:title=""/>
+              <v:shape id="_x0000_i23" o:spid="_x0000_s23" type="#_x0000_t75" style="width:467.75pt;height:408.57pt;mso-wrap-distance-left:0.00pt;mso-wrap-distance-top:0.00pt;mso-wrap-distance-right:0.00pt;mso-wrap-distance-bottom:0.00pt;z-index:1;" stroked="false">
+                <v:imagedata r:id="rId35" o:title=""/>
                 <o:lock v:ext="edit" rotation="t"/>
               </v:shape>
             </w:pict>
@@ -10333,7 +10947,7 @@
               <wp:inline xmlns:wp="http://schemas.openxmlformats.org/drawingml/2006/wordprocessingDrawing" distT="0" distB="0" distL="0" distR="0">
                 <wp:extent cx="5940425" cy="1809567"/>
                 <wp:effectExtent l="0" t="0" r="0" b="0"/>
-                <wp:docPr id="22" name=""/>
+                <wp:docPr id="25" name=""/>
                 <wp:cNvGraphicFramePr>
                   <a:graphicFrameLocks xmlns:a="http://schemas.openxmlformats.org/drawingml/2006/main" noChangeAspect="1"/>
                 </wp:cNvGraphicFramePr>
@@ -10348,7 +10962,7 @@
                         <pic:nvPr/>
                       </pic:nvPicPr>
                       <pic:blipFill>
-                        <a:blip r:embed="rId33"/>
+                        <a:blip r:embed="rId36"/>
                         <a:stretch/>
                       </pic:blipFill>
                       <pic:spPr bwMode="auto">
@@ -10387,8 +11001,8 @@
                 <v:path o:extrusionok="f" gradientshapeok="t" o:connecttype="rect"/>
                 <o:lock v:ext="edit" aspectratio="t"/>
               </v:shapetype>
-              <v:shape id="_x0000_i21" o:spid="_x0000_s21" type="#_x0000_t75" style="width:467.75pt;height:142.49pt;mso-wrap-distance-left:0.00pt;mso-wrap-distance-top:0.00pt;mso-wrap-distance-right:0.00pt;mso-wrap-distance-bottom:0.00pt;z-index:1;" stroked="false">
-                <v:imagedata r:id="rId33" o:title=""/>
+              <v:shape id="_x0000_i24" o:spid="_x0000_s24" type="#_x0000_t75" style="width:467.75pt;height:142.49pt;mso-wrap-distance-left:0.00pt;mso-wrap-distance-top:0.00pt;mso-wrap-distance-right:0.00pt;mso-wrap-distance-bottom:0.00pt;z-index:1;" stroked="false">
+                <v:imagedata r:id="rId36" o:title=""/>
                 <o:lock v:ext="edit" rotation="t"/>
               </v:shape>
             </w:pict>
@@ -11159,7 +11773,7 @@
               <wp:inline xmlns:wp="http://schemas.openxmlformats.org/drawingml/2006/wordprocessingDrawing" distT="0" distB="0" distL="0" distR="0">
                 <wp:extent cx="6086607" cy="5966460"/>
                 <wp:effectExtent l="0" t="0" r="0" b="0"/>
-                <wp:docPr id="23" name="" hidden="0"/>
+                <wp:docPr id="26" name="" hidden="0"/>
                 <wp:cNvGraphicFramePr>
                   <a:graphicFrameLocks xmlns:a="http://schemas.openxmlformats.org/drawingml/2006/main" noChangeAspect="1"/>
                 </wp:cNvGraphicFramePr>
@@ -11174,7 +11788,7 @@
                         <pic:nvPr isPhoto="0" userDrawn="0"/>
                       </pic:nvPicPr>
                       <pic:blipFill>
-                        <a:blip r:embed="rId34"/>
+                        <a:blip r:embed="rId37"/>
                         <a:stretch/>
                       </pic:blipFill>
                       <pic:spPr bwMode="auto">
@@ -11213,8 +11827,8 @@
                 <v:path o:extrusionok="f" gradientshapeok="t" o:connecttype="rect"/>
                 <o:lock v:ext="edit" aspectratio="t"/>
               </v:shapetype>
-              <v:shape id="_x0000_i22" o:spid="_x0000_s22" type="#_x0000_t75" style="width:479.26pt;height:469.80pt;mso-wrap-distance-left:0.00pt;mso-wrap-distance-top:0.00pt;mso-wrap-distance-right:0.00pt;mso-wrap-distance-bottom:0.00pt;rotation:0;z-index:1;" stroked="false">
-                <v:imagedata r:id="rId34" o:title=""/>
+              <v:shape id="_x0000_i25" o:spid="_x0000_s25" type="#_x0000_t75" style="width:479.26pt;height:469.80pt;mso-wrap-distance-left:0.00pt;mso-wrap-distance-top:0.00pt;mso-wrap-distance-right:0.00pt;mso-wrap-distance-bottom:0.00pt;rotation:0;z-index:1;" stroked="false">
+                <v:imagedata r:id="rId37" o:title=""/>
                 <o:lock v:ext="edit" rotation="t"/>
               </v:shape>
             </w:pict>
@@ -11470,7 +12084,7 @@
               <wp:inline xmlns:wp="http://schemas.openxmlformats.org/drawingml/2006/wordprocessingDrawing" distT="0" distB="0" distL="0" distR="0">
                 <wp:extent cx="4618588" cy="6662610"/>
                 <wp:effectExtent l="0" t="0" r="0" b="0"/>
-                <wp:docPr id="24" name="" hidden="0"/>
+                <wp:docPr id="27" name="" hidden="0"/>
                 <wp:cNvGraphicFramePr>
                   <a:graphicFrameLocks xmlns:a="http://schemas.openxmlformats.org/drawingml/2006/main" noChangeAspect="1"/>
                 </wp:cNvGraphicFramePr>
@@ -11485,7 +12099,7 @@
                         <pic:nvPr isPhoto="0" userDrawn="0"/>
                       </pic:nvPicPr>
                       <pic:blipFill>
-                        <a:blip r:embed="rId35"/>
+                        <a:blip r:embed="rId38"/>
                         <a:stretch/>
                       </pic:blipFill>
                       <pic:spPr bwMode="auto">
@@ -11524,8 +12138,8 @@
                 <v:path o:extrusionok="f" gradientshapeok="t" o:connecttype="rect"/>
                 <o:lock v:ext="edit" aspectratio="t"/>
               </v:shapetype>
-              <v:shape id="_x0000_i23" o:spid="_x0000_s23" type="#_x0000_t75" style="width:363.67pt;height:524.61pt;mso-wrap-distance-left:0.00pt;mso-wrap-distance-top:0.00pt;mso-wrap-distance-right:0.00pt;mso-wrap-distance-bottom:0.00pt;rotation:0;z-index:1;" stroked="false">
-                <v:imagedata r:id="rId35" o:title=""/>
+              <v:shape id="_x0000_i26" o:spid="_x0000_s26" type="#_x0000_t75" style="width:363.67pt;height:524.61pt;mso-wrap-distance-left:0.00pt;mso-wrap-distance-top:0.00pt;mso-wrap-distance-right:0.00pt;mso-wrap-distance-bottom:0.00pt;rotation:0;z-index:1;" stroked="false">
+                <v:imagedata r:id="rId38" o:title=""/>
                 <o:lock v:ext="edit" rotation="t"/>
               </v:shape>
             </w:pict>
@@ -11718,7 +12332,7 @@
               <wp:inline xmlns:wp="http://schemas.openxmlformats.org/drawingml/2006/wordprocessingDrawing" distT="0" distB="0" distL="0" distR="0">
                 <wp:extent cx="5940425" cy="5454591"/>
                 <wp:effectExtent l="0" t="0" r="0" b="0"/>
-                <wp:docPr id="25" name=""/>
+                <wp:docPr id="28" name=""/>
                 <wp:cNvGraphicFramePr>
                   <a:graphicFrameLocks xmlns:a="http://schemas.openxmlformats.org/drawingml/2006/main" noChangeAspect="1"/>
                 </wp:cNvGraphicFramePr>
@@ -11733,7 +12347,7 @@
                         <pic:nvPr/>
                       </pic:nvPicPr>
                       <pic:blipFill>
-                        <a:blip r:embed="rId36"/>
+                        <a:blip r:embed="rId39"/>
                         <a:stretch/>
                       </pic:blipFill>
                       <pic:spPr bwMode="auto">
@@ -11772,8 +12386,8 @@
                 <v:path o:extrusionok="f" gradientshapeok="t" o:connecttype="rect"/>
                 <o:lock v:ext="edit" aspectratio="t"/>
               </v:shapetype>
-              <v:shape id="_x0000_i24" o:spid="_x0000_s24" type="#_x0000_t75" style="width:467.75pt;height:429.50pt;mso-wrap-distance-left:0.00pt;mso-wrap-distance-top:0.00pt;mso-wrap-distance-right:0.00pt;mso-wrap-distance-bottom:0.00pt;z-index:1;" stroked="false">
-                <v:imagedata r:id="rId36" o:title=""/>
+              <v:shape id="_x0000_i27" o:spid="_x0000_s27" type="#_x0000_t75" style="width:467.75pt;height:429.50pt;mso-wrap-distance-left:0.00pt;mso-wrap-distance-top:0.00pt;mso-wrap-distance-right:0.00pt;mso-wrap-distance-bottom:0.00pt;z-index:1;" stroked="false">
+                <v:imagedata r:id="rId39" o:title=""/>
                 <o:lock v:ext="edit" rotation="t"/>
               </v:shape>
             </w:pict>
@@ -13178,7 +13792,7 @@
               <wp:inline xmlns:wp="http://schemas.openxmlformats.org/drawingml/2006/wordprocessingDrawing" distT="0" distB="0" distL="0" distR="0">
                 <wp:extent cx="5940425" cy="1654572"/>
                 <wp:effectExtent l="0" t="0" r="0" b="0"/>
-                <wp:docPr id="26" name=""/>
+                <wp:docPr id="29" name=""/>
                 <wp:cNvGraphicFramePr>
                   <a:graphicFrameLocks xmlns:a="http://schemas.openxmlformats.org/drawingml/2006/main" noChangeAspect="1"/>
                 </wp:cNvGraphicFramePr>
@@ -13193,7 +13807,7 @@
                         <pic:nvPr/>
                       </pic:nvPicPr>
                       <pic:blipFill>
-                        <a:blip r:embed="rId37"/>
+                        <a:blip r:embed="rId40"/>
                         <a:stretch/>
                       </pic:blipFill>
                       <pic:spPr bwMode="auto">
@@ -13232,8 +13846,8 @@
                 <v:path o:extrusionok="f" gradientshapeok="t" o:connecttype="rect"/>
                 <o:lock v:ext="edit" aspectratio="t"/>
               </v:shapetype>
-              <v:shape id="_x0000_i25" o:spid="_x0000_s25" type="#_x0000_t75" style="width:467.75pt;height:130.28pt;mso-wrap-distance-left:0.00pt;mso-wrap-distance-top:0.00pt;mso-wrap-distance-right:0.00pt;mso-wrap-distance-bottom:0.00pt;z-index:1;" stroked="false">
-                <v:imagedata r:id="rId37" o:title=""/>
+              <v:shape id="_x0000_i28" o:spid="_x0000_s28" type="#_x0000_t75" style="width:467.75pt;height:130.28pt;mso-wrap-distance-left:0.00pt;mso-wrap-distance-top:0.00pt;mso-wrap-distance-right:0.00pt;mso-wrap-distance-bottom:0.00pt;z-index:1;" stroked="false">
+                <v:imagedata r:id="rId40" o:title=""/>
                 <o:lock v:ext="edit" rotation="t"/>
               </v:shape>
             </w:pict>
@@ -14290,7 +14904,7 @@
               <wp:inline xmlns:wp="http://schemas.openxmlformats.org/drawingml/2006/wordprocessingDrawing" distT="0" distB="0" distL="0" distR="0">
                 <wp:extent cx="5940425" cy="1330714"/>
                 <wp:effectExtent l="0" t="0" r="0" b="0"/>
-                <wp:docPr id="27" name=""/>
+                <wp:docPr id="30" name=""/>
                 <wp:cNvGraphicFramePr>
                   <a:graphicFrameLocks xmlns:a="http://schemas.openxmlformats.org/drawingml/2006/main" noChangeAspect="1"/>
                 </wp:cNvGraphicFramePr>
@@ -14305,7 +14919,7 @@
                         <pic:nvPr/>
                       </pic:nvPicPr>
                       <pic:blipFill>
-                        <a:blip r:embed="rId38"/>
+                        <a:blip r:embed="rId41"/>
                         <a:stretch/>
                       </pic:blipFill>
                       <pic:spPr bwMode="auto">
@@ -14344,8 +14958,8 @@
                 <v:path o:extrusionok="f" gradientshapeok="t" o:connecttype="rect"/>
                 <o:lock v:ext="edit" aspectratio="t"/>
               </v:shapetype>
-              <v:shape id="_x0000_i26" o:spid="_x0000_s26" type="#_x0000_t75" style="width:467.75pt;height:104.78pt;mso-wrap-distance-left:0.00pt;mso-wrap-distance-top:0.00pt;mso-wrap-distance-right:0.00pt;mso-wrap-distance-bottom:0.00pt;z-index:1;" stroked="false">
-                <v:imagedata r:id="rId38" o:title=""/>
+              <v:shape id="_x0000_i29" o:spid="_x0000_s29" type="#_x0000_t75" style="width:467.75pt;height:104.78pt;mso-wrap-distance-left:0.00pt;mso-wrap-distance-top:0.00pt;mso-wrap-distance-right:0.00pt;mso-wrap-distance-bottom:0.00pt;z-index:1;" stroked="false">
+                <v:imagedata r:id="rId41" o:title=""/>
                 <o:lock v:ext="edit" rotation="t"/>
               </v:shape>
             </w:pict>
@@ -14600,7 +15214,7 @@
               <wp:inline xmlns:wp="http://schemas.openxmlformats.org/drawingml/2006/wordprocessingDrawing" distT="0" distB="0" distL="0" distR="0">
                 <wp:extent cx="3786834" cy="9690735"/>
                 <wp:effectExtent l="0" t="0" r="0" b="0"/>
-                <wp:docPr id="28" name="" hidden="0"/>
+                <wp:docPr id="31" name="" hidden="0"/>
                 <wp:cNvGraphicFramePr>
                   <a:graphicFrameLocks xmlns:a="http://schemas.openxmlformats.org/drawingml/2006/main" noChangeAspect="1"/>
                 </wp:cNvGraphicFramePr>
@@ -14615,7 +15229,7 @@
                         <pic:nvPr isPhoto="0" userDrawn="0"/>
                       </pic:nvPicPr>
                       <pic:blipFill>
-                        <a:blip r:embed="rId39"/>
+                        <a:blip r:embed="rId42"/>
                         <a:stretch/>
                       </pic:blipFill>
                       <pic:spPr bwMode="auto">
@@ -14654,8 +15268,8 @@
                 <v:path o:extrusionok="f" gradientshapeok="t" o:connecttype="rect"/>
                 <o:lock v:ext="edit" aspectratio="t"/>
               </v:shapetype>
-              <v:shape id="_x0000_i27" o:spid="_x0000_s27" type="#_x0000_t75" style="width:298.18pt;height:763.05pt;mso-wrap-distance-left:0.00pt;mso-wrap-distance-top:0.00pt;mso-wrap-distance-right:0.00pt;mso-wrap-distance-bottom:0.00pt;rotation:0;z-index:1;" stroked="false">
-                <v:imagedata r:id="rId39" o:title=""/>
+              <v:shape id="_x0000_i30" o:spid="_x0000_s30" type="#_x0000_t75" style="width:298.18pt;height:763.05pt;mso-wrap-distance-left:0.00pt;mso-wrap-distance-top:0.00pt;mso-wrap-distance-right:0.00pt;mso-wrap-distance-bottom:0.00pt;rotation:0;z-index:1;" stroked="false">
+                <v:imagedata r:id="rId42" o:title=""/>
                 <o:lock v:ext="edit" rotation="t"/>
               </v:shape>
             </w:pict>
@@ -15020,7 +15634,7 @@
               <wp:inline xmlns:wp="http://schemas.openxmlformats.org/drawingml/2006/wordprocessingDrawing" distT="0" distB="0" distL="0" distR="0">
                 <wp:extent cx="5940425" cy="868688"/>
                 <wp:effectExtent l="0" t="0" r="0" b="0"/>
-                <wp:docPr id="29" name="" hidden="0"/>
+                <wp:docPr id="32" name="" hidden="0"/>
                 <wp:cNvGraphicFramePr>
                   <a:graphicFrameLocks xmlns:a="http://schemas.openxmlformats.org/drawingml/2006/main" noChangeAspect="1"/>
                 </wp:cNvGraphicFramePr>
@@ -15035,7 +15649,7 @@
                         <pic:nvPr isPhoto="0" userDrawn="0"/>
                       </pic:nvPicPr>
                       <pic:blipFill>
-                        <a:blip r:embed="rId40"/>
+                        <a:blip r:embed="rId43"/>
                         <a:stretch/>
                       </pic:blipFill>
                       <pic:spPr bwMode="auto">
@@ -15074,8 +15688,8 @@
                 <v:path o:extrusionok="f" gradientshapeok="t" o:connecttype="rect"/>
                 <o:lock v:ext="edit" aspectratio="t"/>
               </v:shapetype>
-              <v:shape id="_x0000_i28" o:spid="_x0000_s28" type="#_x0000_t75" style="width:467.75pt;height:68.40pt;mso-wrap-distance-left:0.00pt;mso-wrap-distance-top:0.00pt;mso-wrap-distance-right:0.00pt;mso-wrap-distance-bottom:0.00pt;z-index:1;" stroked="false">
-                <v:imagedata r:id="rId40" o:title=""/>
+              <v:shape id="_x0000_i31" o:spid="_x0000_s31" type="#_x0000_t75" style="width:467.75pt;height:68.40pt;mso-wrap-distance-left:0.00pt;mso-wrap-distance-top:0.00pt;mso-wrap-distance-right:0.00pt;mso-wrap-distance-bottom:0.00pt;z-index:1;" stroked="false">
+                <v:imagedata r:id="rId43" o:title=""/>
                 <o:lock v:ext="edit" rotation="t"/>
               </v:shape>
             </w:pict>
@@ -15247,7 +15861,7 @@
               <wp:inline xmlns:wp="http://schemas.openxmlformats.org/drawingml/2006/wordprocessingDrawing" distT="0" distB="0" distL="0" distR="0">
                 <wp:extent cx="4543425" cy="428625"/>
                 <wp:effectExtent l="0" t="0" r="0" b="0"/>
-                <wp:docPr id="30" name="" hidden="0"/>
+                <wp:docPr id="33" name="" hidden="0"/>
                 <wp:cNvGraphicFramePr>
                   <a:graphicFrameLocks xmlns:a="http://schemas.openxmlformats.org/drawingml/2006/main" noChangeAspect="1"/>
                 </wp:cNvGraphicFramePr>
@@ -15262,7 +15876,7 @@
                         <pic:nvPr isPhoto="0" userDrawn="0"/>
                       </pic:nvPicPr>
                       <pic:blipFill>
-                        <a:blip r:embed="rId41"/>
+                        <a:blip r:embed="rId44"/>
                         <a:stretch/>
                       </pic:blipFill>
                       <pic:spPr bwMode="auto">
@@ -15301,8 +15915,8 @@
                 <v:path o:extrusionok="f" gradientshapeok="t" o:connecttype="rect"/>
                 <o:lock v:ext="edit" aspectratio="t"/>
               </v:shapetype>
-              <v:shape id="_x0000_i29" o:spid="_x0000_s29" type="#_x0000_t75" style="width:357.75pt;height:33.75pt;mso-wrap-distance-left:0.00pt;mso-wrap-distance-top:0.00pt;mso-wrap-distance-right:0.00pt;mso-wrap-distance-bottom:0.00pt;z-index:1;" stroked="false">
-                <v:imagedata r:id="rId41" o:title=""/>
+              <v:shape id="_x0000_i32" o:spid="_x0000_s32" type="#_x0000_t75" style="width:357.75pt;height:33.75pt;mso-wrap-distance-left:0.00pt;mso-wrap-distance-top:0.00pt;mso-wrap-distance-right:0.00pt;mso-wrap-distance-bottom:0.00pt;z-index:1;" stroked="false">
+                <v:imagedata r:id="rId44" o:title=""/>
                 <o:lock v:ext="edit" rotation="t"/>
               </v:shape>
             </w:pict>
@@ -15461,7 +16075,7 @@
               <wp:inline xmlns:wp="http://schemas.openxmlformats.org/drawingml/2006/wordprocessingDrawing" distT="0" distB="0" distL="0" distR="0">
                 <wp:extent cx="4791075" cy="2200275"/>
                 <wp:effectExtent l="0" t="0" r="0" b="0"/>
-                <wp:docPr id="31" name="" hidden="0"/>
+                <wp:docPr id="34" name="" hidden="0"/>
                 <wp:cNvGraphicFramePr>
                   <a:graphicFrameLocks xmlns:a="http://schemas.openxmlformats.org/drawingml/2006/main" noChangeAspect="1"/>
                 </wp:cNvGraphicFramePr>
@@ -15476,7 +16090,7 @@
                         <pic:nvPr isPhoto="0" userDrawn="0"/>
                       </pic:nvPicPr>
                       <pic:blipFill>
-                        <a:blip r:embed="rId42"/>
+                        <a:blip r:embed="rId45"/>
                         <a:stretch/>
                       </pic:blipFill>
                       <pic:spPr bwMode="auto">
@@ -15515,8 +16129,8 @@
                 <v:path o:extrusionok="f" gradientshapeok="t" o:connecttype="rect"/>
                 <o:lock v:ext="edit" aspectratio="t"/>
               </v:shapetype>
-              <v:shape id="_x0000_i30" o:spid="_x0000_s30" type="#_x0000_t75" style="width:377.25pt;height:173.25pt;mso-wrap-distance-left:0.00pt;mso-wrap-distance-top:0.00pt;mso-wrap-distance-right:0.00pt;mso-wrap-distance-bottom:0.00pt;z-index:1;" stroked="false">
-                <v:imagedata r:id="rId42" o:title=""/>
+              <v:shape id="_x0000_i33" o:spid="_x0000_s33" type="#_x0000_t75" style="width:377.25pt;height:173.25pt;mso-wrap-distance-left:0.00pt;mso-wrap-distance-top:0.00pt;mso-wrap-distance-right:0.00pt;mso-wrap-distance-bottom:0.00pt;z-index:1;" stroked="false">
+                <v:imagedata r:id="rId45" o:title=""/>
                 <o:lock v:ext="edit" rotation="t"/>
               </v:shape>
             </w:pict>
@@ -15775,7 +16389,7 @@
               <wp:inline xmlns:wp="http://schemas.openxmlformats.org/drawingml/2006/wordprocessingDrawing" distT="0" distB="0" distL="0" distR="0">
                 <wp:extent cx="4010025" cy="314325"/>
                 <wp:effectExtent l="0" t="0" r="0" b="0"/>
-                <wp:docPr id="32" name="" hidden="0"/>
+                <wp:docPr id="35" name="" hidden="0"/>
                 <wp:cNvGraphicFramePr>
                   <a:graphicFrameLocks xmlns:a="http://schemas.openxmlformats.org/drawingml/2006/main" noChangeAspect="1"/>
                 </wp:cNvGraphicFramePr>
@@ -15790,7 +16404,7 @@
                         <pic:nvPr isPhoto="0" userDrawn="0"/>
                       </pic:nvPicPr>
                       <pic:blipFill>
-                        <a:blip r:embed="rId43"/>
+                        <a:blip r:embed="rId46"/>
                         <a:stretch/>
                       </pic:blipFill>
                       <pic:spPr bwMode="auto">
@@ -15829,8 +16443,8 @@
                 <v:path o:extrusionok="f" gradientshapeok="t" o:connecttype="rect"/>
                 <o:lock v:ext="edit" aspectratio="t"/>
               </v:shapetype>
-              <v:shape id="_x0000_i31" o:spid="_x0000_s31" type="#_x0000_t75" style="width:315.75pt;height:24.75pt;mso-wrap-distance-left:0.00pt;mso-wrap-distance-top:0.00pt;mso-wrap-distance-right:0.00pt;mso-wrap-distance-bottom:0.00pt;z-index:1;" stroked="false">
-                <v:imagedata r:id="rId43" o:title=""/>
+              <v:shape id="_x0000_i34" o:spid="_x0000_s34" type="#_x0000_t75" style="width:315.75pt;height:24.75pt;mso-wrap-distance-left:0.00pt;mso-wrap-distance-top:0.00pt;mso-wrap-distance-right:0.00pt;mso-wrap-distance-bottom:0.00pt;z-index:1;" stroked="false">
+                <v:imagedata r:id="rId46" o:title=""/>
                 <o:lock v:ext="edit" rotation="t"/>
               </v:shape>
             </w:pict>

</xml_diff>

<commit_message>
Did a tiiiinyyyy bit more design lol
</commit_message>
<xml_diff>
--- a/Design.docx
+++ b/Design.docx
@@ -7160,6 +7160,189 @@
                 <w:highlight w:val="none"/>
               </w:rPr>
             </w:r>
+            <w:r>
+              <w:rPr>
+                <w:color w:val="000000"/>
+                <w:sz w:val="22"/>
+                <w:szCs w:val="22"/>
+                <w:highlight w:val="none"/>
+              </w:rPr>
+            </w:r>
+            <w:r>
+              <w:rPr>
+                <w:color w:val="000000"/>
+                <w:sz w:val="22"/>
+                <w:szCs w:val="22"/>
+                <w:highlight w:val="none"/>
+              </w:rPr>
+            </w:r>
+            <w:r>
+              <w:rPr>
+                <w:color w:val="000000"/>
+                <w:sz w:val="22"/>
+                <w:szCs w:val="22"/>
+                <w:highlight w:val="none"/>
+              </w:rPr>
+            </w:r>
+          </w:p>
+        </w:tc>
+      </w:tr>
+      <w:tr>
+        <w:trPr/>
+        <w:tc>
+          <w:tcPr>
+            <w:tcBorders/>
+            <w:tcW w:w="2339" w:type="dxa"/>
+            <w:vMerge w:val="restart"/>
+            <w:textDirection w:val="lrTb"/>
+            <w:noWrap w:val="false"/>
+          </w:tcPr>
+          <w:p>
+            <w:pPr>
+              <w:pBdr/>
+              <w:spacing/>
+              <w:ind/>
+              <w:rPr>
+                <w:color w:val="000000"/>
+                <w:sz w:val="22"/>
+                <w:szCs w:val="22"/>
+                <w:highlight w:val="none"/>
+              </w:rPr>
+            </w:pPr>
+            <w:r>
+              <w:rPr>
+                <w:color w:val="000000"/>
+                <w:sz w:val="22"/>
+                <w:szCs w:val="22"/>
+                <w:highlight w:val="none"/>
+              </w:rPr>
+              <w:t xml:space="preserve">started</w:t>
+            </w:r>
+            <w:r>
+              <w:rPr>
+                <w:color w:val="000000"/>
+                <w:sz w:val="22"/>
+                <w:szCs w:val="22"/>
+                <w:highlight w:val="none"/>
+              </w:rPr>
+            </w:r>
+          </w:p>
+        </w:tc>
+        <w:tc>
+          <w:tcPr>
+            <w:tcBorders/>
+            <w:tcW w:w="2339" w:type="dxa"/>
+            <w:vMerge w:val="restart"/>
+            <w:textDirection w:val="lrTb"/>
+            <w:noWrap w:val="false"/>
+          </w:tcPr>
+          <w:p>
+            <w:pPr>
+              <w:pBdr/>
+              <w:spacing/>
+              <w:ind/>
+              <w:rPr>
+                <w:color w:val="000000"/>
+                <w:sz w:val="22"/>
+                <w:szCs w:val="22"/>
+                <w:highlight w:val="none"/>
+              </w:rPr>
+            </w:pPr>
+            <w:r>
+              <w:rPr>
+                <w:color w:val="000000"/>
+                <w:sz w:val="22"/>
+                <w:szCs w:val="22"/>
+                <w:highlight w:val="none"/>
+              </w:rPr>
+              <w:t xml:space="preserve">bool</w:t>
+            </w:r>
+            <w:r>
+              <w:rPr>
+                <w:color w:val="000000"/>
+                <w:sz w:val="22"/>
+                <w:szCs w:val="22"/>
+                <w:highlight w:val="none"/>
+              </w:rPr>
+            </w:r>
+          </w:p>
+        </w:tc>
+        <w:tc>
+          <w:tcPr>
+            <w:tcBorders/>
+            <w:tcW w:w="2339" w:type="dxa"/>
+            <w:vMerge w:val="restart"/>
+            <w:textDirection w:val="lrTb"/>
+            <w:noWrap w:val="false"/>
+          </w:tcPr>
+          <w:p>
+            <w:pPr>
+              <w:pBdr/>
+              <w:spacing/>
+              <w:ind/>
+              <w:rPr>
+                <w:color w:val="000000"/>
+                <w:sz w:val="22"/>
+                <w:szCs w:val="22"/>
+                <w:highlight w:val="none"/>
+              </w:rPr>
+            </w:pPr>
+            <w:r>
+              <w:rPr>
+                <w:color w:val="000000"/>
+                <w:sz w:val="22"/>
+                <w:szCs w:val="22"/>
+                <w:highlight w:val="none"/>
+              </w:rPr>
+              <w:t xml:space="preserve">False</w:t>
+            </w:r>
+            <w:r>
+              <w:rPr>
+                <w:color w:val="000000"/>
+                <w:sz w:val="22"/>
+                <w:szCs w:val="22"/>
+                <w:highlight w:val="none"/>
+              </w:rPr>
+            </w:r>
+          </w:p>
+        </w:tc>
+        <w:tc>
+          <w:tcPr>
+            <w:tcBorders/>
+            <w:tcW w:w="2339" w:type="dxa"/>
+            <w:vMerge w:val="restart"/>
+            <w:textDirection w:val="lrTb"/>
+            <w:noWrap w:val="false"/>
+          </w:tcPr>
+          <w:p>
+            <w:pPr>
+              <w:pBdr/>
+              <w:spacing/>
+              <w:ind/>
+              <w:rPr>
+                <w:color w:val="000000"/>
+                <w:sz w:val="22"/>
+                <w:szCs w:val="22"/>
+                <w:highlight w:val="none"/>
+              </w:rPr>
+            </w:pPr>
+            <w:r>
+              <w:rPr>
+                <w:color w:val="000000"/>
+                <w:sz w:val="22"/>
+                <w:szCs w:val="22"/>
+                <w:highlight w:val="none"/>
+              </w:rPr>
+              <w:t xml:space="preserve">Used in the loop displaying the start screen, once the user starts the program started is set to true and the loop is therefore exited</w:t>
+            </w:r>
+            <w:r>
+              <w:rPr>
+                <w:color w:val="000000"/>
+                <w:sz w:val="22"/>
+                <w:szCs w:val="22"/>
+                <w:highlight w:val="none"/>
+              </w:rPr>
+            </w:r>
           </w:p>
         </w:tc>
       </w:tr>
@@ -7935,15 +8118,6 @@
           <w:highlight w:val="none"/>
         </w:rPr>
       </w:r>
-      <w:r/>
-      <w:r>
-        <w:rPr>
-          <w:color w:val="000000"/>
-          <w:sz w:val="22"/>
-          <w:szCs w:val="22"/>
-          <w:highlight w:val="none"/>
-        </w:rPr>
-      </w:r>
       <w:r>
         <w:rPr>
           <w:color w:val="000000"/>
@@ -8327,7 +8501,7 @@
           <w:szCs w:val="22"/>
           <w:highlight w:val="none"/>
         </w:rPr>
-        <w:t xml:space="preserve">ite class needs to do differently is change how the orbital lines are drawn, there are only a few things we need to change. First, we should make the host attribute something other than null. We will use composition to set the host attributes, the host attribute sho</w:t>
+        <w:t xml:space="preserve">ite class </w:t>
       </w:r>
       <w:r>
         <w:rPr>
@@ -8336,6 +8510,15 @@
           <w:szCs w:val="22"/>
           <w:highlight w:val="none"/>
         </w:rPr>
+        <w:t xml:space="preserve">needs to do differently is change how the orbital lines are drawn, there are only a few things we need to change. First, we should make the host attribute something other than null. We will use composition to set the host attributes, the host attribute sho</w:t>
+      </w:r>
+      <w:r>
+        <w:rPr>
+          <w:color w:val="000000"/>
+          <w:sz w:val="22"/>
+          <w:szCs w:val="22"/>
+          <w:highlight w:val="none"/>
+        </w:rPr>
         <w:t xml:space="preserve">uld be the object that the satellite has as a host. This object will be another planet. Satellites orbiting satellites is possible, but there is no instance of that in our solar system, so in the class diagram I just showed satellite as composing with plan</w:t>
       </w:r>
       <w:r>
@@ -8346,6 +8529,14 @@
           <w:highlight w:val="none"/>
         </w:rPr>
         <w:t xml:space="preserve">ets, you could compose it with another satellite if you really wanted to. getHost() will now return an object instead of null.</w:t>
+      </w:r>
+      <w:r>
+        <w:rPr>
+          <w:color w:val="000000"/>
+          <w:sz w:val="22"/>
+          <w:szCs w:val="22"/>
+          <w:highlight w:val="none"/>
+        </w:rPr>
       </w:r>
       <w:r>
         <w:rPr>
@@ -8385,7 +8576,14 @@
           <w:highlight w:val="none"/>
         </w:rPr>
       </w:r>
-      <w:r/>
+      <w:r>
+        <w:rPr>
+          <w:color w:val="000000"/>
+          <w:sz w:val="22"/>
+          <w:szCs w:val="22"/>
+          <w:highlight w:val="none"/>
+        </w:rPr>
+      </w:r>
     </w:p>
     <w:p>
       <w:pPr>
@@ -8861,6 +9059,9 @@
       </w:r>
       <w:r>
         <w:rPr>
+          <w:color w:val="000000"/>
+          <w:sz w:val="22"/>
+          <w:szCs w:val="22"/>
           <w:highlight w:val="none"/>
         </w:rPr>
       </w:r>
@@ -8986,9 +9187,6 @@
       </w:r>
       <w:r>
         <w:rPr>
-          <w:color w:val="000000"/>
-          <w:sz w:val="22"/>
-          <w:szCs w:val="22"/>
           <w:highlight w:val="none"/>
         </w:rPr>
       </w:r>
@@ -9055,6 +9253,9 @@
       </w:r>
       <w:r>
         <w:rPr>
+          <w:color w:val="000000"/>
+          <w:sz w:val="22"/>
+          <w:szCs w:val="22"/>
           <w:highlight w:val="none"/>
         </w:rPr>
       </w:r>
@@ -9155,9 +9356,6 @@
       </w:r>
       <w:r>
         <w:rPr>
-          <w:color w:val="000000"/>
-          <w:sz w:val="22"/>
-          <w:szCs w:val="22"/>
           <w:highlight w:val="none"/>
         </w:rPr>
       </w:r>
@@ -9387,17 +9585,6 @@
           <w:highlight w:val="none"/>
         </w:rPr>
       </w:r>
-      <w:r/>
-      <w:r/>
-      <w:r/>
-      <w:r>
-        <w:rPr>
-          <w:color w:val="000000"/>
-          <w:sz w:val="22"/>
-          <w:szCs w:val="22"/>
-          <w:highlight w:val="none"/>
-        </w:rPr>
-      </w:r>
       <w:r>
         <w:rPr>
           <w:color w:val="000000"/>
@@ -9435,6 +9622,14 @@
           <w:highlight w:val="none"/>
         </w:rPr>
       </w:r>
+      <w:r>
+        <w:rPr>
+          <w:color w:val="000000"/>
+          <w:sz w:val="22"/>
+          <w:szCs w:val="22"/>
+          <w:highlight w:val="none"/>
+        </w:rPr>
+      </w:r>
     </w:p>
     <w:p>
       <w:pPr>
@@ -9456,7 +9651,24 @@
           <w:szCs w:val="22"/>
           <w:highlight w:val="none"/>
         </w:rPr>
-        <w:t xml:space="preserve">Next, we need to consider how getRecord() will work. If we just return the records as is, the vectors from the Earth to moon, and try and draw them, we have a problem. The program doesn’t know to start at the Earth and then follow the vector to get to the point where the line is supposed to be drawn. It will instead start at the origin and then follow the vector. For example, if we use the same purple arrow as in the previous diagram, we’d get this:</w:t>
+        <w:t xml:space="preserve">Next, we need to consider how getRecord() will work. If we just return the records as is, the vectors from the Earth to moon, and try and draw them, we have a problem. The program doesn’t know to s</w:t>
+      </w:r>
+      <w:r>
+        <w:rPr>
+          <w:color w:val="000000"/>
+          <w:sz w:val="22"/>
+          <w:szCs w:val="22"/>
+          <w:highlight w:val="none"/>
+        </w:rPr>
+        <w:t xml:space="preserve">tart at the Earth and then follow the vector to get to the point where the line is supposed to be drawn. It will instead start at the origin and then follow the vector. For example, if we use the same purple arrow as in the previous diagram, we’d get this:</w:t>
+      </w:r>
+      <w:r>
+        <w:rPr>
+          <w:color w:val="000000"/>
+          <w:sz w:val="22"/>
+          <w:szCs w:val="22"/>
+          <w:highlight w:val="none"/>
+        </w:rPr>
       </w:r>
       <w:r>
         <w:rPr>
@@ -9602,6 +9814,14 @@
           <w:highlight w:val="none"/>
         </w:rPr>
       </w:r>
+      <w:r>
+        <w:rPr>
+          <w:color w:val="000000"/>
+          <w:sz w:val="22"/>
+          <w:szCs w:val="22"/>
+          <w:highlight w:val="none"/>
+        </w:rPr>
+      </w:r>
     </w:p>
     <w:p>
       <w:pPr>
@@ -9632,6 +9852,14 @@
           <w:highlight w:val="none"/>
         </w:rPr>
       </w:r>
+      <w:r>
+        <w:rPr>
+          <w:color w:val="000000"/>
+          <w:sz w:val="22"/>
+          <w:szCs w:val="22"/>
+          <w:highlight w:val="none"/>
+        </w:rPr>
+      </w:r>
     </w:p>
     <w:p>
       <w:pPr>
@@ -9653,22 +9881,6 @@
           <w:highlight w:val="none"/>
         </w:rPr>
         <w:t xml:space="preserve">There is a very simple fix though, all we need to do is add the Earth’s current position to all the records. This can be done with a for loop, like this: </w:t>
-      </w:r>
-      <w:r>
-        <w:rPr>
-          <w:color w:val="000000"/>
-          <w:sz w:val="22"/>
-          <w:szCs w:val="22"/>
-          <w:highlight w:val="none"/>
-        </w:rPr>
-      </w:r>
-      <w:r>
-        <w:rPr>
-          <w:color w:val="000000"/>
-          <w:sz w:val="22"/>
-          <w:szCs w:val="22"/>
-          <w:highlight w:val="none"/>
-        </w:rPr>
       </w:r>
       <w:r>
         <w:rPr>
@@ -9822,6 +10034,14 @@
           <w:highlight w:val="none"/>
         </w:rPr>
       </w:r>
+      <w:r>
+        <w:rPr>
+          <w:color w:val="000000"/>
+          <w:sz w:val="22"/>
+          <w:szCs w:val="22"/>
+          <w:highlight w:val="none"/>
+        </w:rPr>
+      </w:r>
     </w:p>
     <w:p>
       <w:pPr>
@@ -11413,7 +11633,7 @@
           <w:szCs w:val="22"/>
           <w:highlight w:val="none"/>
         </w:rPr>
-        <w:t xml:space="preserve">And finally, we need to create the interface. This means selecting a font (I use codenewroman at size 18) and creating two menu surfaces for the text to be displayed on.</w:t>
+        <w:t xml:space="preserve">And finally, we need to create the interface. This means selecting a font (I use codenewroman at size 18, and the same font at size 32 for the start menu) and creating two menu surfaces for the text to be displayed on.</w:t>
       </w:r>
       <w:r>
         <w:rPr>
@@ -15032,35 +15252,332 @@
         <w:spacing/>
         <w:ind/>
         <w:rPr>
+          <w:color w:val="4472c4" w:themeColor="accent5"/>
+          <w:sz w:val="28"/>
+          <w:szCs w:val="28"/>
+          <w:highlight w:val="none"/>
+          <w:vertAlign w:val="baseline"/>
+        </w:rPr>
+      </w:pPr>
+      <w:r>
+        <w:rPr>
+          <w:color w:val="4472c4" w:themeColor="accent5"/>
+          <w:sz w:val="28"/>
+          <w:highlight w:val="none"/>
+          <w:vertAlign w:val="baseline"/>
+        </w:rPr>
+        <w:t xml:space="preserve">Display</w:t>
+      </w:r>
+      <w:r>
+        <w:rPr>
           <w:color w:val="4472c4"/>
           <w:sz w:val="28"/>
           <w:highlight w:val="none"/>
           <w:vertAlign w:val="baseline"/>
         </w:rPr>
-      </w:pPr>
-      <w:r>
+      </w:r>
+      <w:r>
+        <w:rPr>
+          <w:color w:val="4472c4"/>
+          <w:sz w:val="28"/>
+          <w:highlight w:val="none"/>
+          <w:vertAlign w:val="baseline"/>
+        </w:rPr>
+      </w:r>
+    </w:p>
+    <w:p>
+      <w:pPr>
+        <w:pBdr/>
+        <w:spacing/>
+        <w:ind/>
+        <w:rPr>
+          <w:color w:val="000000" w:themeColor="text1"/>
+          <w:sz w:val="22"/>
+          <w:szCs w:val="22"/>
+          <w:highlight w:val="none"/>
+          <w:vertAlign w:val="baseline"/>
+        </w:rPr>
+      </w:pPr>
+      <w:r>
+        <w:rPr>
+          <w:color w:val="000000" w:themeColor="text1"/>
+          <w:sz w:val="22"/>
+          <w:szCs w:val="18"/>
+          <w:highlight w:val="none"/>
+          <w:vertAlign w:val="baseline"/>
+        </w:rPr>
+        <w:t xml:space="preserve">There are three states the display can be in. When the program is first launched it will enter a loop where it displays the start screen. Once the user presses enter to start the simulation a boolean variable, started, will be set to true, so that the program can exit the loop. The display wil thenl either show the solar system or show two planets side-by-side so their size can be compared. Which it does will be dependent on whether or not a boolean variable, comparison, is true. Here is a flowchart demonstrating how the state of the display is decided:</w:t>
+      </w:r>
+      <w:r>
+        <w:rPr>
+          <w:color w:val="000000" w:themeColor="text1"/>
+          <w:sz w:val="22"/>
+          <w:szCs w:val="22"/>
+          <w:highlight w:val="none"/>
+          <w:vertAlign w:val="baseline"/>
+        </w:rPr>
+      </w:r>
+    </w:p>
+    <w:p>
+      <w:pPr>
+        <w:pBdr/>
+        <w:spacing/>
+        <w:ind/>
+        <w:rPr>
+          <w:color w:val="000000" w:themeColor="text1"/>
+          <w:sz w:val="22"/>
+          <w:szCs w:val="22"/>
+          <w:highlight w:val="none"/>
+          <w:vertAlign w:val="baseline"/>
+        </w:rPr>
+      </w:pPr>
+      <w:r>
+        <w:rPr>
+          <w:color w:val="000000" w:themeColor="text1"/>
+          <w:sz w:val="22"/>
+          <w:szCs w:val="18"/>
+          <w:highlight w:val="none"/>
+          <w:vertAlign w:val="baseline"/>
+        </w:rPr>
+        <mc:AlternateContent>
+          <mc:Choice Requires="wpg">
+            <w:drawing>
+              <wp:inline xmlns:wp="http://schemas.openxmlformats.org/drawingml/2006/wordprocessingDrawing" distT="0" distB="0" distL="0" distR="0">
+                <wp:extent cx="4626390" cy="7952835"/>
+                <wp:effectExtent l="0" t="0" r="0" b="0"/>
+                <wp:docPr id="31" name=""/>
+                <wp:cNvGraphicFramePr>
+                  <a:graphicFrameLocks xmlns:a="http://schemas.openxmlformats.org/drawingml/2006/main" noChangeAspect="1"/>
+                </wp:cNvGraphicFramePr>
+                <a:graphic xmlns:a="http://schemas.openxmlformats.org/drawingml/2006/main">
+                  <a:graphicData uri="http://schemas.openxmlformats.org/drawingml/2006/picture">
+                    <pic:pic xmlns:pic="http://schemas.openxmlformats.org/drawingml/2006/picture">
+                      <pic:nvPicPr>
+                        <pic:cNvPr id="1617658887" name=""/>
+                        <pic:cNvPicPr>
+                          <a:picLocks noChangeAspect="1"/>
+                        </pic:cNvPicPr>
+                        <pic:nvPr/>
+                      </pic:nvPicPr>
+                      <pic:blipFill>
+                        <a:blip r:embed="rId42"/>
+                        <a:stretch/>
+                      </pic:blipFill>
+                      <pic:spPr bwMode="auto">
+                        <a:xfrm flipH="0" flipV="0">
+                          <a:off x="0" y="0"/>
+                          <a:ext cx="4626389" cy="7952834"/>
+                        </a:xfrm>
+                        <a:prstGeom prst="rect">
+                          <a:avLst/>
+                        </a:prstGeom>
+                      </pic:spPr>
+                    </pic:pic>
+                  </a:graphicData>
+                </a:graphic>
+              </wp:inline>
+            </w:drawing>
+          </mc:Choice>
+          <mc:Fallback>
+            <w:pict>
+              <v:shapetype id="_x0000_t75" coordsize="21600,21600" o:spt="75" o:preferrelative="t" path="m@4@5l@4@11@9@11@9@5xe" filled="f" stroked="f">
+                <v:stroke joinstyle="miter"/>
+                <v:formulas>
+                  <v:f eqn="if lineDrawn pixelLineWidth 0"/>
+                  <v:f eqn="sum @0 1 0"/>
+                  <v:f eqn="sum 0 0 @1"/>
+                  <v:f eqn="prod @2 1 2"/>
+                  <v:f eqn="prod @3 21600 pixelWidth"/>
+                  <v:f eqn="prod @3 21600 pixelHeight"/>
+                  <v:f eqn="sum @0 0 1"/>
+                  <v:f eqn="prod @6 1 2"/>
+                  <v:f eqn="prod @7 21600 pixelWidth"/>
+                  <v:f eqn="sum @8 21600 0"/>
+                  <v:f eqn="prod @7 21600 pixelHeight"/>
+                  <v:f eqn="sum @10 21600 0"/>
+                </v:formulas>
+                <v:path o:extrusionok="f" gradientshapeok="t" o:connecttype="rect"/>
+                <o:lock v:ext="edit" aspectratio="t"/>
+              </v:shapetype>
+              <v:shape id="_x0000_i30" o:spid="_x0000_s30" type="#_x0000_t75" style="width:364.28pt;height:626.21pt;mso-wrap-distance-left:0.00pt;mso-wrap-distance-top:0.00pt;mso-wrap-distance-right:0.00pt;mso-wrap-distance-bottom:0.00pt;z-index:1;" stroked="false">
+                <v:imagedata r:id="rId42" o:title=""/>
+                <o:lock v:ext="edit" rotation="t"/>
+              </v:shape>
+            </w:pict>
+          </mc:Fallback>
+        </mc:AlternateContent>
+      </w:r>
+      <w:r>
+        <w:rPr>
+          <w:color w:val="000000" w:themeColor="text1"/>
+          <w:sz w:val="22"/>
+          <w:szCs w:val="18"/>
+          <w:highlight w:val="none"/>
+          <w:vertAlign w:val="baseline"/>
+        </w:rPr>
+      </w:r>
+    </w:p>
+    <w:p>
+      <w:pPr>
+        <w:pBdr/>
+        <w:spacing/>
+        <w:ind/>
+        <w:rPr>
+          <w:color w:val="000000" w:themeColor="text1"/>
+          <w:sz w:val="22"/>
+          <w:szCs w:val="22"/>
+          <w:highlight w:val="none"/>
+          <w:vertAlign w:val="baseline"/>
+        </w:rPr>
+      </w:pPr>
+      <w:r>
+        <w:rPr>
+          <w:color w:val="000000" w:themeColor="text1"/>
+          <w:sz w:val="22"/>
+          <w:szCs w:val="22"/>
+          <w:highlight w:val="none"/>
+          <w:vertAlign w:val="baseline"/>
+        </w:rPr>
+      </w:r>
+      <w:r>
+        <w:rPr>
+          <w:color w:val="000000" w:themeColor="text1"/>
+          <w:sz w:val="22"/>
+          <w:szCs w:val="22"/>
+          <w:highlight w:val="none"/>
+          <w:vertAlign w:val="baseline"/>
+        </w:rPr>
+      </w:r>
+    </w:p>
+    <w:p>
+      <w:pPr>
+        <w:pBdr/>
+        <w:spacing/>
+        <w:ind/>
+        <w:rPr>
+          <w:color w:val="000000" w:themeColor="text1"/>
+          <w:sz w:val="22"/>
+          <w:szCs w:val="22"/>
+          <w:highlight w:val="none"/>
+          <w:vertAlign w:val="baseline"/>
+        </w:rPr>
+      </w:pPr>
+      <w:r>
+        <w:rPr>
+          <w:color w:val="000000" w:themeColor="text1"/>
+          <w:sz w:val="22"/>
+          <w:szCs w:val="22"/>
+          <w:highlight w:val="none"/>
+          <w:vertAlign w:val="baseline"/>
+        </w:rPr>
+      </w:r>
+      <w:r>
+        <w:rPr>
+          <w:color w:val="000000" w:themeColor="text1"/>
+          <w:sz w:val="22"/>
+          <w:szCs w:val="22"/>
+          <w:highlight w:val="none"/>
+          <w:vertAlign w:val="baseline"/>
+        </w:rPr>
+      </w:r>
+    </w:p>
+    <w:p>
+      <w:pPr>
+        <w:pBdr/>
+        <w:spacing/>
+        <w:ind/>
+        <w:rPr>
+          <w:color w:val="000000" w:themeColor="text1"/>
+          <w:sz w:val="22"/>
+          <w:szCs w:val="22"/>
+          <w:highlight w:val="none"/>
+          <w:vertAlign w:val="baseline"/>
+        </w:rPr>
+      </w:pPr>
+      <w:r>
+        <w:rPr>
+          <w:color w:val="000000" w:themeColor="text1"/>
+          <w:sz w:val="22"/>
+          <w:szCs w:val="18"/>
+          <w:highlight w:val="none"/>
+          <w:vertAlign w:val="baseline"/>
+        </w:rPr>
+      </w:r>
+      <w:r>
+        <w:rPr>
+          <w:color w:val="000000" w:themeColor="text1"/>
+          <w:sz w:val="22"/>
+          <w:szCs w:val="18"/>
+          <w:highlight w:val="none"/>
+          <w:vertAlign w:val="baseline"/>
+        </w:rPr>
+      </w:r>
+    </w:p>
+    <w:p>
+      <w:pPr>
+        <w:pBdr/>
+        <w:spacing/>
+        <w:ind/>
+        <w:rPr>
+          <w:color w:val="000000" w:themeColor="text1"/>
+          <w:sz w:val="22"/>
+          <w:szCs w:val="22"/>
+          <w:highlight w:val="none"/>
+          <w:vertAlign w:val="baseline"/>
+        </w:rPr>
+      </w:pPr>
+      <w:r>
+        <w:rPr>
+          <w:color w:val="000000" w:themeColor="text1"/>
+          <w:sz w:val="22"/>
+          <w:highlight w:val="none"/>
+          <w:vertAlign w:val="baseline"/>
+        </w:rPr>
+        <w:t xml:space="preserve">Let’s look at these states individually.</w:t>
+      </w:r>
+      <w:r>
+        <w:rPr>
+          <w:color w:val="000000" w:themeColor="text1"/>
+          <w:sz w:val="22"/>
+          <w:highlight w:val="none"/>
+          <w:vertAlign w:val="baseline"/>
+        </w:rPr>
+      </w:r>
+    </w:p>
+    <w:p>
+      <w:pPr>
+        <w:pBdr/>
+        <w:spacing/>
+        <w:ind/>
         <w:rPr>
           <w:color w:val="4472c4" w:themeColor="accent5"/>
           <w:sz w:val="28"/>
+          <w:szCs w:val="28"/>
+          <w:highlight w:val="none"/>
+        </w:rPr>
+      </w:pPr>
+      <w:r>
+        <w:rPr>
+          <w:color w:val="4472c4" w:themeColor="accent5"/>
+          <w:sz w:val="28"/>
+          <w:highlight w:val="none"/>
+        </w:rPr>
+        <w:t xml:space="preserve">The start screen</w:t>
+      </w:r>
+      <w:r>
+        <w:rPr>
+          <w:color w:val="000000" w:themeColor="text1"/>
+          <w:sz w:val="22"/>
           <w:highlight w:val="none"/>
           <w:vertAlign w:val="baseline"/>
         </w:rPr>
-        <w:t xml:space="preserve">Display</w:t>
-      </w:r>
-      <w:r>
-        <w:rPr>
-          <w:color w:val="4472c4"/>
+      </w:r>
+      <w:r>
+        <w:rPr>
+          <w:color w:val="4472c4" w:themeColor="accent5"/>
           <w:sz w:val="28"/>
-          <w:highlight w:val="none"/>
-          <w:vertAlign w:val="baseline"/>
-        </w:rPr>
-      </w:r>
-      <w:r>
-        <w:rPr>
-          <w:color w:val="4472c4"/>
-          <w:sz w:val="28"/>
-          <w:highlight w:val="none"/>
-          <w:vertAlign w:val="baseline"/>
+          <w:szCs w:val="28"/>
+          <w:highlight w:val="none"/>
         </w:rPr>
       </w:r>
     </w:p>
@@ -15072,6 +15589,97 @@
         <w:rPr>
           <w:color w:val="000000" w:themeColor="text1"/>
           <w:sz w:val="22"/>
+          <w:szCs w:val="22"/>
+          <w:highlight w:val="none"/>
+          <w:vertAlign w:val="baseline"/>
+        </w:rPr>
+      </w:pPr>
+      <w:r>
+        <w:rPr>
+          <w:color w:val="000000" w:themeColor="text1"/>
+          <w:sz w:val="22"/>
+          <w:highlight w:val="none"/>
+          <w:vertAlign w:val="baseline"/>
+        </w:rPr>
+      </w:r>
+      <w:r>
+        <w:rPr>
+          <w:color w:val="000000" w:themeColor="text1"/>
+          <w:sz w:val="22"/>
+          <w:highlight w:val="none"/>
+          <w:vertAlign w:val="baseline"/>
+        </w:rPr>
+      </w:r>
+    </w:p>
+    <w:p>
+      <w:pPr>
+        <w:pBdr/>
+        <w:spacing/>
+        <w:ind/>
+        <w:rPr>
+          <w:color w:val="000000" w:themeColor="text1"/>
+          <w:sz w:val="22"/>
+          <w:szCs w:val="22"/>
+          <w:highlight w:val="none"/>
+          <w:vertAlign w:val="baseline"/>
+        </w:rPr>
+      </w:pPr>
+      <w:r>
+        <w:rPr>
+          <w:color w:val="000000" w:themeColor="text1"/>
+          <w:sz w:val="22"/>
+          <w:highlight w:val="none"/>
+          <w:vertAlign w:val="baseline"/>
+        </w:rPr>
+      </w:r>
+      <w:r>
+        <w:rPr>
+          <w:color w:val="000000" w:themeColor="text1"/>
+          <w:sz w:val="22"/>
+          <w:highlight w:val="none"/>
+          <w:vertAlign w:val="baseline"/>
+        </w:rPr>
+      </w:r>
+    </w:p>
+    <w:p>
+      <w:pPr>
+        <w:pBdr/>
+        <w:spacing/>
+        <w:ind/>
+        <w:rPr>
+          <w:color w:val="000000" w:themeColor="text1"/>
+          <w:sz w:val="22"/>
+          <w:szCs w:val="22"/>
+          <w:highlight w:val="none"/>
+          <w:vertAlign w:val="baseline"/>
+        </w:rPr>
+      </w:pPr>
+      <w:r>
+        <w:rPr>
+          <w:color w:val="000000" w:themeColor="text1"/>
+          <w:sz w:val="22"/>
+          <w:highlight w:val="none"/>
+          <w:vertAlign w:val="baseline"/>
+        </w:rPr>
+      </w:r>
+      <w:r>
+        <w:rPr>
+          <w:color w:val="000000" w:themeColor="text1"/>
+          <w:sz w:val="22"/>
+          <w:highlight w:val="none"/>
+          <w:vertAlign w:val="baseline"/>
+        </w:rPr>
+      </w:r>
+    </w:p>
+    <w:p>
+      <w:pPr>
+        <w:pBdr/>
+        <w:spacing/>
+        <w:ind/>
+        <w:rPr>
+          <w:color w:val="000000" w:themeColor="text1"/>
+          <w:sz w:val="22"/>
+          <w:szCs w:val="22"/>
           <w:highlight w:val="none"/>
           <w:vertAlign w:val="baseline"/>
         </w:rPr>
@@ -15214,7 +15822,7 @@
               <wp:inline xmlns:wp="http://schemas.openxmlformats.org/drawingml/2006/wordprocessingDrawing" distT="0" distB="0" distL="0" distR="0">
                 <wp:extent cx="3786834" cy="9690735"/>
                 <wp:effectExtent l="0" t="0" r="0" b="0"/>
-                <wp:docPr id="31" name="" hidden="0"/>
+                <wp:docPr id="32" name="" hidden="0"/>
                 <wp:cNvGraphicFramePr>
                   <a:graphicFrameLocks xmlns:a="http://schemas.openxmlformats.org/drawingml/2006/main" noChangeAspect="1"/>
                 </wp:cNvGraphicFramePr>
@@ -15229,7 +15837,7 @@
                         <pic:nvPr isPhoto="0" userDrawn="0"/>
                       </pic:nvPicPr>
                       <pic:blipFill>
-                        <a:blip r:embed="rId42"/>
+                        <a:blip r:embed="rId43"/>
                         <a:stretch/>
                       </pic:blipFill>
                       <pic:spPr bwMode="auto">
@@ -15268,8 +15876,8 @@
                 <v:path o:extrusionok="f" gradientshapeok="t" o:connecttype="rect"/>
                 <o:lock v:ext="edit" aspectratio="t"/>
               </v:shapetype>
-              <v:shape id="_x0000_i30" o:spid="_x0000_s30" type="#_x0000_t75" style="width:298.18pt;height:763.05pt;mso-wrap-distance-left:0.00pt;mso-wrap-distance-top:0.00pt;mso-wrap-distance-right:0.00pt;mso-wrap-distance-bottom:0.00pt;rotation:0;z-index:1;" stroked="false">
-                <v:imagedata r:id="rId42" o:title=""/>
+              <v:shape id="_x0000_i31" o:spid="_x0000_s31" type="#_x0000_t75" style="width:298.18pt;height:763.05pt;mso-wrap-distance-left:0.00pt;mso-wrap-distance-top:0.00pt;mso-wrap-distance-right:0.00pt;mso-wrap-distance-bottom:0.00pt;rotation:0;z-index:1;" stroked="false">
+                <v:imagedata r:id="rId43" o:title=""/>
                 <o:lock v:ext="edit" rotation="t"/>
               </v:shape>
             </w:pict>
@@ -15634,7 +16242,7 @@
               <wp:inline xmlns:wp="http://schemas.openxmlformats.org/drawingml/2006/wordprocessingDrawing" distT="0" distB="0" distL="0" distR="0">
                 <wp:extent cx="5940425" cy="868688"/>
                 <wp:effectExtent l="0" t="0" r="0" b="0"/>
-                <wp:docPr id="32" name="" hidden="0"/>
+                <wp:docPr id="33" name="" hidden="0"/>
                 <wp:cNvGraphicFramePr>
                   <a:graphicFrameLocks xmlns:a="http://schemas.openxmlformats.org/drawingml/2006/main" noChangeAspect="1"/>
                 </wp:cNvGraphicFramePr>
@@ -15649,7 +16257,7 @@
                         <pic:nvPr isPhoto="0" userDrawn="0"/>
                       </pic:nvPicPr>
                       <pic:blipFill>
-                        <a:blip r:embed="rId43"/>
+                        <a:blip r:embed="rId44"/>
                         <a:stretch/>
                       </pic:blipFill>
                       <pic:spPr bwMode="auto">
@@ -15688,8 +16296,8 @@
                 <v:path o:extrusionok="f" gradientshapeok="t" o:connecttype="rect"/>
                 <o:lock v:ext="edit" aspectratio="t"/>
               </v:shapetype>
-              <v:shape id="_x0000_i31" o:spid="_x0000_s31" type="#_x0000_t75" style="width:467.75pt;height:68.40pt;mso-wrap-distance-left:0.00pt;mso-wrap-distance-top:0.00pt;mso-wrap-distance-right:0.00pt;mso-wrap-distance-bottom:0.00pt;z-index:1;" stroked="false">
-                <v:imagedata r:id="rId43" o:title=""/>
+              <v:shape id="_x0000_i32" o:spid="_x0000_s32" type="#_x0000_t75" style="width:467.75pt;height:68.40pt;mso-wrap-distance-left:0.00pt;mso-wrap-distance-top:0.00pt;mso-wrap-distance-right:0.00pt;mso-wrap-distance-bottom:0.00pt;z-index:1;" stroked="false">
+                <v:imagedata r:id="rId44" o:title=""/>
                 <o:lock v:ext="edit" rotation="t"/>
               </v:shape>
             </w:pict>
@@ -15861,7 +16469,7 @@
               <wp:inline xmlns:wp="http://schemas.openxmlformats.org/drawingml/2006/wordprocessingDrawing" distT="0" distB="0" distL="0" distR="0">
                 <wp:extent cx="4543425" cy="428625"/>
                 <wp:effectExtent l="0" t="0" r="0" b="0"/>
-                <wp:docPr id="33" name="" hidden="0"/>
+                <wp:docPr id="34" name="" hidden="0"/>
                 <wp:cNvGraphicFramePr>
                   <a:graphicFrameLocks xmlns:a="http://schemas.openxmlformats.org/drawingml/2006/main" noChangeAspect="1"/>
                 </wp:cNvGraphicFramePr>
@@ -15876,7 +16484,7 @@
                         <pic:nvPr isPhoto="0" userDrawn="0"/>
                       </pic:nvPicPr>
                       <pic:blipFill>
-                        <a:blip r:embed="rId44"/>
+                        <a:blip r:embed="rId45"/>
                         <a:stretch/>
                       </pic:blipFill>
                       <pic:spPr bwMode="auto">
@@ -15915,8 +16523,8 @@
                 <v:path o:extrusionok="f" gradientshapeok="t" o:connecttype="rect"/>
                 <o:lock v:ext="edit" aspectratio="t"/>
               </v:shapetype>
-              <v:shape id="_x0000_i32" o:spid="_x0000_s32" type="#_x0000_t75" style="width:357.75pt;height:33.75pt;mso-wrap-distance-left:0.00pt;mso-wrap-distance-top:0.00pt;mso-wrap-distance-right:0.00pt;mso-wrap-distance-bottom:0.00pt;z-index:1;" stroked="false">
-                <v:imagedata r:id="rId44" o:title=""/>
+              <v:shape id="_x0000_i33" o:spid="_x0000_s33" type="#_x0000_t75" style="width:357.75pt;height:33.75pt;mso-wrap-distance-left:0.00pt;mso-wrap-distance-top:0.00pt;mso-wrap-distance-right:0.00pt;mso-wrap-distance-bottom:0.00pt;z-index:1;" stroked="false">
+                <v:imagedata r:id="rId45" o:title=""/>
                 <o:lock v:ext="edit" rotation="t"/>
               </v:shape>
             </w:pict>
@@ -16075,7 +16683,7 @@
               <wp:inline xmlns:wp="http://schemas.openxmlformats.org/drawingml/2006/wordprocessingDrawing" distT="0" distB="0" distL="0" distR="0">
                 <wp:extent cx="4791075" cy="2200275"/>
                 <wp:effectExtent l="0" t="0" r="0" b="0"/>
-                <wp:docPr id="34" name="" hidden="0"/>
+                <wp:docPr id="35" name="" hidden="0"/>
                 <wp:cNvGraphicFramePr>
                   <a:graphicFrameLocks xmlns:a="http://schemas.openxmlformats.org/drawingml/2006/main" noChangeAspect="1"/>
                 </wp:cNvGraphicFramePr>
@@ -16090,7 +16698,7 @@
                         <pic:nvPr isPhoto="0" userDrawn="0"/>
                       </pic:nvPicPr>
                       <pic:blipFill>
-                        <a:blip r:embed="rId45"/>
+                        <a:blip r:embed="rId46"/>
                         <a:stretch/>
                       </pic:blipFill>
                       <pic:spPr bwMode="auto">
@@ -16129,8 +16737,8 @@
                 <v:path o:extrusionok="f" gradientshapeok="t" o:connecttype="rect"/>
                 <o:lock v:ext="edit" aspectratio="t"/>
               </v:shapetype>
-              <v:shape id="_x0000_i33" o:spid="_x0000_s33" type="#_x0000_t75" style="width:377.25pt;height:173.25pt;mso-wrap-distance-left:0.00pt;mso-wrap-distance-top:0.00pt;mso-wrap-distance-right:0.00pt;mso-wrap-distance-bottom:0.00pt;z-index:1;" stroked="false">
-                <v:imagedata r:id="rId45" o:title=""/>
+              <v:shape id="_x0000_i34" o:spid="_x0000_s34" type="#_x0000_t75" style="width:377.25pt;height:173.25pt;mso-wrap-distance-left:0.00pt;mso-wrap-distance-top:0.00pt;mso-wrap-distance-right:0.00pt;mso-wrap-distance-bottom:0.00pt;z-index:1;" stroked="false">
+                <v:imagedata r:id="rId46" o:title=""/>
                 <o:lock v:ext="edit" rotation="t"/>
               </v:shape>
             </w:pict>
@@ -16389,7 +16997,7 @@
               <wp:inline xmlns:wp="http://schemas.openxmlformats.org/drawingml/2006/wordprocessingDrawing" distT="0" distB="0" distL="0" distR="0">
                 <wp:extent cx="4010025" cy="314325"/>
                 <wp:effectExtent l="0" t="0" r="0" b="0"/>
-                <wp:docPr id="35" name="" hidden="0"/>
+                <wp:docPr id="36" name="" hidden="0"/>
                 <wp:cNvGraphicFramePr>
                   <a:graphicFrameLocks xmlns:a="http://schemas.openxmlformats.org/drawingml/2006/main" noChangeAspect="1"/>
                 </wp:cNvGraphicFramePr>
@@ -16404,7 +17012,7 @@
                         <pic:nvPr isPhoto="0" userDrawn="0"/>
                       </pic:nvPicPr>
                       <pic:blipFill>
-                        <a:blip r:embed="rId46"/>
+                        <a:blip r:embed="rId47"/>
                         <a:stretch/>
                       </pic:blipFill>
                       <pic:spPr bwMode="auto">
@@ -16443,8 +17051,8 @@
                 <v:path o:extrusionok="f" gradientshapeok="t" o:connecttype="rect"/>
                 <o:lock v:ext="edit" aspectratio="t"/>
               </v:shapetype>
-              <v:shape id="_x0000_i34" o:spid="_x0000_s34" type="#_x0000_t75" style="width:315.75pt;height:24.75pt;mso-wrap-distance-left:0.00pt;mso-wrap-distance-top:0.00pt;mso-wrap-distance-right:0.00pt;mso-wrap-distance-bottom:0.00pt;z-index:1;" stroked="false">
-                <v:imagedata r:id="rId46" o:title=""/>
+              <v:shape id="_x0000_i35" o:spid="_x0000_s35" type="#_x0000_t75" style="width:315.75pt;height:24.75pt;mso-wrap-distance-left:0.00pt;mso-wrap-distance-top:0.00pt;mso-wrap-distance-right:0.00pt;mso-wrap-distance-bottom:0.00pt;z-index:1;" stroked="false">
+                <v:imagedata r:id="rId47" o:title=""/>
                 <o:lock v:ext="edit" rotation="t"/>
               </v:shape>
             </w:pict>

</xml_diff>

<commit_message>
Explained adjustment in design.
</commit_message>
<xml_diff>
--- a/Design.docx
+++ b/Design.docx
@@ -16125,6 +16125,7 @@
         <w:rPr>
           <w:color w:val="000000" w:themeColor="text1"/>
           <w:sz w:val="22"/>
+          <w:szCs w:val="22"/>
           <w:highlight w:val="none"/>
           <w:vertAlign w:val="baseline"/>
         </w:rPr>
@@ -16330,12 +16331,31 @@
           <w:highlight w:val="none"/>
           <w:vertAlign w:val="baseline"/>
         </w:rPr>
-        <w:t xml:space="preserve">But the solar system is huge, so how can we display it accurately? This is done by scaling the positions of the planets. Inside the display, instead of using the actual positions of planets we used their scaled positions. This just means we multiply their position vector by a scalar, the distConst. distConst is effectively a conversion from metres to pixel, it’s how many pixels are in a metre. scaledPos(vec) will do this for us, and return that vector*distConst. Doing everything this way will preserve the relative sizes and distances of the system.</w:t>
+        <w:t xml:space="preserve">But the solar system is huge, so how can w</w:t>
       </w:r>
       <w:r>
         <w:rPr>
           <w:color w:val="000000" w:themeColor="text1"/>
           <w:sz w:val="22"/>
+          <w:highlight w:val="none"/>
+          <w:vertAlign w:val="baseline"/>
+        </w:rPr>
+        <w:t xml:space="preserve">e display it accurately? This is done by scaling the positions of the planets. Inside the display, instead of using the actual positions of planets we used their scaled positions. This just means we multiply their position vector by a scalar, the distConst</w:t>
+      </w:r>
+      <w:r>
+        <w:rPr>
+          <w:color w:val="000000" w:themeColor="text1"/>
+          <w:sz w:val="22"/>
+          <w:highlight w:val="none"/>
+          <w:vertAlign w:val="baseline"/>
+        </w:rPr>
+        <w:t xml:space="preserve">. distConst is effectively a conversion from metres to pixel, it’s how many pixels are in a metre. scaledPos(vec) will do this for us, and return that vector*distConst. Doing everything this way will preserve the relative sizes and distances of the system.</w:t>
+      </w:r>
+      <w:r>
+        <w:rPr>
+          <w:color w:val="000000" w:themeColor="text1"/>
+          <w:sz w:val="22"/>
+          <w:szCs w:val="22"/>
           <w:highlight w:val="none"/>
           <w:vertAlign w:val="baseline"/>
         </w:rPr>
@@ -16380,6 +16400,15 @@
           <w:vertAlign w:val="baseline"/>
         </w:rPr>
       </w:r>
+      <w:r>
+        <w:rPr>
+          <w:color w:val="000000" w:themeColor="text1"/>
+          <w:sz w:val="22"/>
+          <w:szCs w:val="22"/>
+          <w:highlight w:val="none"/>
+          <w:vertAlign w:val="baseline"/>
+        </w:rPr>
+      </w:r>
     </w:p>
     <w:p>
       <w:pPr>
@@ -16401,12 +16430,21 @@
           <w:highlight w:val="none"/>
           <w:vertAlign w:val="baseline"/>
         </w:rPr>
-        <w:t xml:space="preserve">Next, we need to make the display be centred on a specific planet. </w:t>
+        <w:t xml:space="preserve">Next, we need to make the display be centred on a specific planet. This means we want the planet in question to be displayed at (w/2, h/2) on the screen where w is the width in pixels of the window and h is the height. This is calculated by using pygame’s get_size() method to get (w, h) and then dividing it by 2. Here is a diagram showing the situation:</w:t>
       </w:r>
       <w:r>
         <w:rPr>
           <w:color w:val="000000" w:themeColor="text1"/>
           <w:sz w:val="22"/>
+          <w:highlight w:val="none"/>
+          <w:vertAlign w:val="baseline"/>
+        </w:rPr>
+      </w:r>
+      <w:r>
+        <w:rPr>
+          <w:color w:val="000000" w:themeColor="text1"/>
+          <w:sz w:val="22"/>
+          <w:szCs w:val="22"/>
           <w:highlight w:val="none"/>
           <w:vertAlign w:val="baseline"/>
         </w:rPr>
@@ -16508,6 +16546,473 @@
           <w:vertAlign w:val="baseline"/>
         </w:rPr>
       </w:r>
+      <w:r>
+        <w:rPr>
+          <w:color w:val="000000" w:themeColor="text1"/>
+          <w:sz w:val="22"/>
+          <w:szCs w:val="22"/>
+          <w:highlight w:val="none"/>
+          <w:vertAlign w:val="baseline"/>
+        </w:rPr>
+      </w:r>
+    </w:p>
+    <w:p>
+      <w:pPr>
+        <w:pBdr/>
+        <w:spacing/>
+        <w:ind/>
+        <w:rPr>
+          <w:b w:val="0"/>
+          <w:bCs w:val="0"/>
+          <w:color w:val="000000" w:themeColor="text1"/>
+          <w:sz w:val="22"/>
+          <w:szCs w:val="22"/>
+          <w:highlight w:val="none"/>
+          <w:u w:val="none"/>
+          <w:vertAlign w:val="baseline"/>
+        </w:rPr>
+      </w:pPr>
+      <w:r>
+        <w:rPr>
+          <w:b w:val="0"/>
+          <w:bCs w:val="0"/>
+          <w:color w:val="000000" w:themeColor="text1"/>
+          <w:sz w:val="22"/>
+          <w:szCs w:val="22"/>
+          <w:highlight w:val="none"/>
+          <w:vertAlign w:val="baseline"/>
+        </w:rPr>
+        <w:t xml:space="preserve">Here </w:t>
+      </w:r>
+      <w:r>
+        <w:rPr>
+          <w:b/>
+          <w:bCs/>
+          <w:color w:val="000000" w:themeColor="text1"/>
+          <w:sz w:val="22"/>
+          <w:szCs w:val="22"/>
+          <w:highlight w:val="none"/>
+          <w:u w:val="single"/>
+          <w:vertAlign w:val="baseline"/>
+        </w:rPr>
+        <w:t xml:space="preserve">a</w:t>
+      </w:r>
+      <w:r>
+        <w:rPr>
+          <w:b w:val="0"/>
+          <w:bCs w:val="0"/>
+          <w:color w:val="000000" w:themeColor="text1"/>
+          <w:sz w:val="22"/>
+          <w:szCs w:val="22"/>
+          <w:highlight w:val="none"/>
+          <w:u w:val="none"/>
+          <w:vertAlign w:val="baseline"/>
+        </w:rPr>
+        <w:t xml:space="preserve"> is the scaled position vector of the sun and </w:t>
+      </w:r>
+      <w:r>
+        <w:rPr>
+          <w:b/>
+          <w:bCs/>
+          <w:color w:val="000000" w:themeColor="text1"/>
+          <w:sz w:val="22"/>
+          <w:szCs w:val="22"/>
+          <w:highlight w:val="none"/>
+          <w:u w:val="single"/>
+          <w:vertAlign w:val="baseline"/>
+        </w:rPr>
+        <w:t xml:space="preserve">b</w:t>
+      </w:r>
+      <w:r>
+        <w:rPr>
+          <w:b w:val="0"/>
+          <w:bCs w:val="0"/>
+          <w:color w:val="000000" w:themeColor="text1"/>
+          <w:sz w:val="22"/>
+          <w:szCs w:val="22"/>
+          <w:highlight w:val="none"/>
+          <w:u w:val="none"/>
+          <w:vertAlign w:val="baseline"/>
+        </w:rPr>
+        <w:t xml:space="preserve"> is the scaled position vector of Earth. </w:t>
+      </w:r>
+      <w:r>
+        <w:rPr>
+          <w:b/>
+          <w:bCs/>
+          <w:color w:val="000000" w:themeColor="text1"/>
+          <w:sz w:val="22"/>
+          <w:szCs w:val="22"/>
+          <w:highlight w:val="none"/>
+          <w:u w:val="single"/>
+          <w:vertAlign w:val="baseline"/>
+        </w:rPr>
+        <w:t xml:space="preserve">c</w:t>
+      </w:r>
+      <w:r>
+        <w:rPr>
+          <w:b w:val="0"/>
+          <w:bCs w:val="0"/>
+          <w:color w:val="000000" w:themeColor="text1"/>
+          <w:sz w:val="22"/>
+          <w:szCs w:val="22"/>
+          <w:highlight w:val="none"/>
+          <w:u w:val="none"/>
+          <w:vertAlign w:val="baseline"/>
+        </w:rPr>
+        <w:t xml:space="preserve"> is the centre of the screen, (960, 540) for a standard 1080p display. The “adjustment” is calculated, the adjustment is the vector pointing from Earth to the centre of the screen, </w:t>
+      </w:r>
+      <w:r>
+        <w:rPr>
+          <w:b/>
+          <w:bCs/>
+          <w:color w:val="000000" w:themeColor="text1"/>
+          <w:sz w:val="22"/>
+          <w:szCs w:val="22"/>
+          <w:highlight w:val="none"/>
+          <w:u w:val="single"/>
+          <w:vertAlign w:val="baseline"/>
+        </w:rPr>
+        <w:t xml:space="preserve">c</w:t>
+      </w:r>
+      <w:r>
+        <w:rPr>
+          <w:b w:val="0"/>
+          <w:bCs w:val="0"/>
+          <w:color w:val="000000" w:themeColor="text1"/>
+          <w:sz w:val="22"/>
+          <w:szCs w:val="22"/>
+          <w:highlight w:val="none"/>
+          <w:u w:val="none"/>
+          <w:vertAlign w:val="baseline"/>
+        </w:rPr>
+        <w:t xml:space="preserve"> - </w:t>
+      </w:r>
+      <w:r>
+        <w:rPr>
+          <w:b/>
+          <w:bCs/>
+          <w:color w:val="000000" w:themeColor="text1"/>
+          <w:sz w:val="22"/>
+          <w:szCs w:val="22"/>
+          <w:highlight w:val="none"/>
+          <w:u w:val="single"/>
+          <w:vertAlign w:val="baseline"/>
+        </w:rPr>
+        <w:t xml:space="preserve">b</w:t>
+      </w:r>
+      <w:r>
+        <w:rPr>
+          <w:b w:val="0"/>
+          <w:bCs w:val="0"/>
+          <w:color w:val="000000" w:themeColor="text1"/>
+          <w:sz w:val="22"/>
+          <w:szCs w:val="22"/>
+          <w:highlight w:val="none"/>
+          <w:u w:val="none"/>
+          <w:vertAlign w:val="baseline"/>
+        </w:rPr>
+        <w:t xml:space="preserve">. If we were to add this adjustment vector to Earth’s position vector, we would just end up with </w:t>
+      </w:r>
+      <w:r>
+        <w:rPr>
+          <w:b/>
+          <w:bCs/>
+          <w:color w:val="000000" w:themeColor="text1"/>
+          <w:sz w:val="22"/>
+          <w:szCs w:val="22"/>
+          <w:highlight w:val="none"/>
+          <w:u w:val="single"/>
+          <w:vertAlign w:val="baseline"/>
+        </w:rPr>
+        <w:t xml:space="preserve">c</w:t>
+      </w:r>
+      <w:r>
+        <w:rPr>
+          <w:b w:val="0"/>
+          <w:bCs w:val="0"/>
+          <w:color w:val="000000" w:themeColor="text1"/>
+          <w:sz w:val="22"/>
+          <w:szCs w:val="22"/>
+          <w:highlight w:val="none"/>
+          <w:u w:val="none"/>
+          <w:vertAlign w:val="baseline"/>
+        </w:rPr>
+        <w:t xml:space="preserve">, the location of the centre:</w:t>
+      </w:r>
+      <w:r>
+        <w:rPr>
+          <w:b w:val="0"/>
+          <w:bCs w:val="0"/>
+          <w:color w:val="000000" w:themeColor="text1"/>
+          <w:sz w:val="22"/>
+          <w:szCs w:val="22"/>
+          <w:highlight w:val="none"/>
+          <w:u w:val="none"/>
+          <w:vertAlign w:val="baseline"/>
+        </w:rPr>
+      </w:r>
+    </w:p>
+    <w:p>
+      <w:pPr>
+        <w:pBdr/>
+        <w:spacing/>
+        <w:ind/>
+        <w:rPr>
+          <w:b w:val="0"/>
+          <w:bCs w:val="0"/>
+          <w:color w:val="000000" w:themeColor="text1"/>
+          <w:sz w:val="22"/>
+          <w:szCs w:val="22"/>
+          <w:highlight w:val="none"/>
+          <w:u w:val="none"/>
+          <w:vertAlign w:val="baseline"/>
+        </w:rPr>
+      </w:pPr>
+      <w:r>
+        <w:rPr>
+          <w:b/>
+          <w:bCs/>
+          <w:color w:val="000000" w:themeColor="text1"/>
+          <w:sz w:val="22"/>
+          <w:szCs w:val="22"/>
+          <w:highlight w:val="none"/>
+          <w:u w:val="single"/>
+          <w:vertAlign w:val="baseline"/>
+        </w:rPr>
+        <w:t xml:space="preserve">b</w:t>
+      </w:r>
+      <w:r>
+        <w:rPr>
+          <w:b w:val="0"/>
+          <w:bCs w:val="0"/>
+          <w:color w:val="000000" w:themeColor="text1"/>
+          <w:sz w:val="22"/>
+          <w:szCs w:val="22"/>
+          <w:highlight w:val="none"/>
+          <w:u w:val="none"/>
+          <w:vertAlign w:val="baseline"/>
+        </w:rPr>
+        <w:t xml:space="preserve"> (Earth’s position) + </w:t>
+      </w:r>
+      <w:r>
+        <w:rPr>
+          <w:b/>
+          <w:bCs/>
+          <w:color w:val="000000" w:themeColor="text1"/>
+          <w:sz w:val="22"/>
+          <w:szCs w:val="22"/>
+          <w:highlight w:val="none"/>
+          <w:u w:val="single"/>
+          <w:vertAlign w:val="baseline"/>
+        </w:rPr>
+        <w:t xml:space="preserve">c</w:t>
+      </w:r>
+      <w:r>
+        <w:rPr>
+          <w:b w:val="0"/>
+          <w:bCs w:val="0"/>
+          <w:color w:val="000000" w:themeColor="text1"/>
+          <w:sz w:val="22"/>
+          <w:szCs w:val="22"/>
+          <w:highlight w:val="none"/>
+          <w:u w:val="none"/>
+          <w:vertAlign w:val="baseline"/>
+        </w:rPr>
+        <w:t xml:space="preserve"> - </w:t>
+      </w:r>
+      <w:r>
+        <w:rPr>
+          <w:b/>
+          <w:bCs/>
+          <w:color w:val="000000" w:themeColor="text1"/>
+          <w:sz w:val="22"/>
+          <w:szCs w:val="22"/>
+          <w:highlight w:val="none"/>
+          <w:u w:val="single"/>
+          <w:vertAlign w:val="baseline"/>
+        </w:rPr>
+        <w:t xml:space="preserve">b</w:t>
+      </w:r>
+      <w:r>
+        <w:rPr>
+          <w:b w:val="0"/>
+          <w:bCs w:val="0"/>
+          <w:color w:val="000000" w:themeColor="text1"/>
+          <w:sz w:val="22"/>
+          <w:szCs w:val="22"/>
+          <w:highlight w:val="none"/>
+          <w:u w:val="none"/>
+          <w:vertAlign w:val="baseline"/>
+        </w:rPr>
+        <w:t xml:space="preserve"> (adjustment) = </w:t>
+      </w:r>
+      <w:r>
+        <w:rPr>
+          <w:b/>
+          <w:bCs/>
+          <w:color w:val="000000" w:themeColor="text1"/>
+          <w:sz w:val="22"/>
+          <w:szCs w:val="22"/>
+          <w:highlight w:val="none"/>
+          <w:u w:val="single"/>
+          <w:vertAlign w:val="baseline"/>
+        </w:rPr>
+        <w:t xml:space="preserve">c</w:t>
+      </w:r>
+      <w:r>
+        <w:rPr>
+          <w:b w:val="0"/>
+          <w:bCs w:val="0"/>
+          <w:color w:val="000000" w:themeColor="text1"/>
+          <w:sz w:val="22"/>
+          <w:szCs w:val="22"/>
+          <w:highlight w:val="none"/>
+          <w:u w:val="none"/>
+          <w:vertAlign w:val="baseline"/>
+        </w:rPr>
+        <w:t xml:space="preserve">.</w:t>
+      </w:r>
+      <w:r>
+        <w:rPr>
+          <w:b w:val="0"/>
+          <w:bCs w:val="0"/>
+          <w:strike/>
+          <w:color w:val="000000" w:themeColor="text1"/>
+          <w:sz w:val="22"/>
+          <w:szCs w:val="22"/>
+          <w:highlight w:val="none"/>
+          <w:u w:val="none"/>
+          <w:vertAlign w:val="baseline"/>
+        </w:rPr>
+      </w:r>
+      <w:r>
+        <w:rPr>
+          <w:b w:val="0"/>
+          <w:bCs w:val="0"/>
+          <w:strike/>
+          <w:color w:val="000000" w:themeColor="text1"/>
+          <w:sz w:val="22"/>
+          <w:szCs w:val="22"/>
+          <w:highlight w:val="none"/>
+          <w:u w:val="none"/>
+          <w:vertAlign w:val="baseline"/>
+        </w:rPr>
+      </w:r>
+    </w:p>
+    <w:p>
+      <w:pPr>
+        <w:pBdr/>
+        <w:spacing/>
+        <w:ind/>
+        <w:rPr>
+          <w:b w:val="0"/>
+          <w:bCs w:val="0"/>
+          <w:color w:val="000000" w:themeColor="text1"/>
+          <w:sz w:val="22"/>
+          <w:szCs w:val="22"/>
+          <w:highlight w:val="none"/>
+          <w:u w:val="none"/>
+          <w:vertAlign w:val="baseline"/>
+        </w:rPr>
+      </w:pPr>
+      <w:r>
+        <w:rPr>
+          <w:b w:val="0"/>
+          <w:bCs w:val="0"/>
+          <w:color w:val="000000" w:themeColor="text1"/>
+          <w:sz w:val="22"/>
+          <w:szCs w:val="22"/>
+          <w:highlight w:val="none"/>
+          <w:u w:val="none"/>
+          <w:vertAlign w:val="baseline"/>
+        </w:rPr>
+        <w:t xml:space="preserve">So if we calculate the adjustment and then add it to Earth’s position, and then display Earth at that location, Earth will be at the centre of the screen.</w:t>
+      </w:r>
+      <w:r>
+        <w:rPr>
+          <w:b w:val="0"/>
+          <w:bCs w:val="0"/>
+          <w:color w:val="000000" w:themeColor="text1"/>
+          <w:sz w:val="22"/>
+          <w:szCs w:val="22"/>
+          <w:highlight w:val="none"/>
+          <w:u w:val="none"/>
+          <w:vertAlign w:val="baseline"/>
+        </w:rPr>
+      </w:r>
+    </w:p>
+    <w:p>
+      <w:pPr>
+        <w:pBdr/>
+        <w:spacing/>
+        <w:ind/>
+        <w:rPr>
+          <w:b w:val="0"/>
+          <w:bCs w:val="0"/>
+          <w:strike/>
+          <w:color w:val="000000" w:themeColor="text1"/>
+          <w:sz w:val="22"/>
+          <w:szCs w:val="22"/>
+          <w:highlight w:val="none"/>
+          <w:u w:val="none"/>
+          <w:vertAlign w:val="baseline"/>
+        </w:rPr>
+      </w:pPr>
+      <w:r>
+        <w:rPr>
+          <w:b w:val="0"/>
+          <w:bCs w:val="0"/>
+          <w:color w:val="000000" w:themeColor="text1"/>
+          <w:sz w:val="22"/>
+          <w:szCs w:val="22"/>
+          <w:highlight w:val="none"/>
+          <w:u w:val="none"/>
+          <w:vertAlign w:val="baseline"/>
+        </w:rPr>
+        <w:t xml:space="preserve">If we want to display the sun we now just add the adjustment to its position vector. This will put the sun at the same position relative to Earth as it was before. The result is this:</w:t>
+      </w:r>
+      <w:r>
+        <w:rPr>
+          <w:b w:val="0"/>
+          <w:bCs w:val="0"/>
+          <w:color w:val="000000" w:themeColor="text1"/>
+          <w:sz w:val="22"/>
+          <w:szCs w:val="22"/>
+          <w:highlight w:val="none"/>
+          <w:u w:val="none"/>
+          <w:vertAlign w:val="baseline"/>
+        </w:rPr>
+      </w:r>
+      <w:r>
+        <w:rPr>
+          <w:color w:val="000000" w:themeColor="text1"/>
+          <w:sz w:val="22"/>
+          <w:highlight w:val="none"/>
+          <w:vertAlign w:val="baseline"/>
+        </w:rPr>
+      </w:r>
+      <w:r>
+        <w:rPr>
+          <w:color w:val="000000" w:themeColor="text1"/>
+          <w:sz w:val="22"/>
+          <w:highlight w:val="none"/>
+          <w:vertAlign w:val="baseline"/>
+        </w:rPr>
+      </w:r>
+      <w:r>
+        <w:rPr>
+          <w:b w:val="0"/>
+          <w:bCs w:val="0"/>
+          <w:strike/>
+          <w:color w:val="000000" w:themeColor="text1"/>
+          <w:sz w:val="22"/>
+          <w:szCs w:val="22"/>
+          <w:highlight w:val="none"/>
+          <w:u w:val="none"/>
+          <w:vertAlign w:val="baseline"/>
+        </w:rPr>
+      </w:r>
     </w:p>
     <w:p>
       <w:pPr>
@@ -16607,6 +17112,158 @@
           <w:vertAlign w:val="baseline"/>
         </w:rPr>
       </w:r>
+      <w:r>
+        <w:rPr>
+          <w:color w:val="auto"/>
+          <w:sz w:val="24"/>
+          <w:szCs w:val="24"/>
+          <w:highlight w:val="none"/>
+          <w:vertAlign w:val="baseline"/>
+        </w:rPr>
+      </w:r>
+    </w:p>
+    <w:p>
+      <w:pPr>
+        <w:pBdr/>
+        <w:spacing/>
+        <w:ind/>
+        <w:rPr>
+          <w:color w:val="auto"/>
+          <w:sz w:val="22"/>
+          <w:szCs w:val="22"/>
+          <w:highlight w:val="none"/>
+          <w:vertAlign w:val="baseline"/>
+        </w:rPr>
+      </w:pPr>
+      <w:r>
+        <w:rPr>
+          <w:color w:val="auto"/>
+          <w:sz w:val="22"/>
+          <w:szCs w:val="24"/>
+          <w:highlight w:val="none"/>
+          <w:vertAlign w:val="baseline"/>
+        </w:rPr>
+        <w:t xml:space="preserve">So Earth would be displayed at the centre of the screen, and the sun would be displayed in the bottom left as it is down and to the left from Earth. We can repeat this process for any planet we want, to display it we just scale its position vector by distConst and then add the adjustment to that vector. We then display a circle at that position on the screen. If we want to focus on the centre of mass instead of a planet, that is very similar, the maths is the exact same except you use the scaled position vector for the c.o.m. Here is pseudocode for focusAdjustment(), the function that calculates the adjustment:</w:t>
+      </w:r>
+      <w:r>
+        <w:rPr>
+          <w:color w:val="auto"/>
+          <w:sz w:val="22"/>
+          <w:szCs w:val="24"/>
+          <w:highlight w:val="none"/>
+          <w:vertAlign w:val="baseline"/>
+        </w:rPr>
+      </w:r>
+    </w:p>
+    <w:p>
+      <w:pPr>
+        <w:pBdr/>
+        <w:spacing/>
+        <w:ind/>
+        <w:rPr>
+          <w:color w:val="auto"/>
+          <w:sz w:val="22"/>
+          <w:szCs w:val="22"/>
+          <w:highlight w:val="none"/>
+          <w:vertAlign w:val="baseline"/>
+        </w:rPr>
+      </w:pPr>
+      <w:r>
+        <w:rPr>
+          <w:color w:val="auto"/>
+          <w:sz w:val="22"/>
+          <w:szCs w:val="24"/>
+          <w:highlight w:val="none"/>
+          <w:vertAlign w:val="baseline"/>
+        </w:rPr>
+      </w:r>
+      <w:r>
+        <mc:AlternateContent>
+          <mc:Choice Requires="wpg">
+            <w:drawing>
+              <wp:inline xmlns:wp="http://schemas.openxmlformats.org/drawingml/2006/wordprocessingDrawing" distT="0" distB="0" distL="0" distR="0">
+                <wp:extent cx="5940425" cy="2150716"/>
+                <wp:effectExtent l="0" t="0" r="0" b="0"/>
+                <wp:docPr id="35" name=""/>
+                <wp:cNvGraphicFramePr>
+                  <a:graphicFrameLocks xmlns:a="http://schemas.openxmlformats.org/drawingml/2006/main" noChangeAspect="1"/>
+                </wp:cNvGraphicFramePr>
+                <a:graphic xmlns:a="http://schemas.openxmlformats.org/drawingml/2006/main">
+                  <a:graphicData uri="http://schemas.openxmlformats.org/drawingml/2006/picture">
+                    <pic:pic xmlns:pic="http://schemas.openxmlformats.org/drawingml/2006/picture">
+                      <pic:nvPicPr>
+                        <pic:cNvPr id="417071430" name=""/>
+                        <pic:cNvPicPr>
+                          <a:picLocks noChangeAspect="1"/>
+                        </pic:cNvPicPr>
+                        <pic:nvPr/>
+                      </pic:nvPicPr>
+                      <pic:blipFill>
+                        <a:blip r:embed="rId46"/>
+                        <a:stretch/>
+                      </pic:blipFill>
+                      <pic:spPr bwMode="auto">
+                        <a:xfrm>
+                          <a:off x="0" y="0"/>
+                          <a:ext cx="5940424" cy="2150715"/>
+                        </a:xfrm>
+                        <a:prstGeom prst="rect">
+                          <a:avLst/>
+                        </a:prstGeom>
+                      </pic:spPr>
+                    </pic:pic>
+                  </a:graphicData>
+                </a:graphic>
+              </wp:inline>
+            </w:drawing>
+          </mc:Choice>
+          <mc:Fallback>
+            <w:pict>
+              <v:shapetype id="_x0000_t75" coordsize="21600,21600" o:spt="75" o:preferrelative="t" path="m@4@5l@4@11@9@11@9@5xe" filled="f" stroked="f">
+                <v:stroke joinstyle="miter"/>
+                <v:formulas>
+                  <v:f eqn="if lineDrawn pixelLineWidth 0"/>
+                  <v:f eqn="sum @0 1 0"/>
+                  <v:f eqn="sum 0 0 @1"/>
+                  <v:f eqn="prod @2 1 2"/>
+                  <v:f eqn="prod @3 21600 pixelWidth"/>
+                  <v:f eqn="prod @3 21600 pixelHeight"/>
+                  <v:f eqn="sum @0 0 1"/>
+                  <v:f eqn="prod @6 1 2"/>
+                  <v:f eqn="prod @7 21600 pixelWidth"/>
+                  <v:f eqn="sum @8 21600 0"/>
+                  <v:f eqn="prod @7 21600 pixelHeight"/>
+                  <v:f eqn="sum @10 21600 0"/>
+                </v:formulas>
+                <v:path o:extrusionok="f" gradientshapeok="t" o:connecttype="rect"/>
+                <o:lock v:ext="edit" aspectratio="t"/>
+              </v:shapetype>
+              <v:shape id="_x0000_i34" o:spid="_x0000_s34" type="#_x0000_t75" style="width:467.75pt;height:169.35pt;mso-wrap-distance-left:0.00pt;mso-wrap-distance-top:0.00pt;mso-wrap-distance-right:0.00pt;mso-wrap-distance-bottom:0.00pt;z-index:1;" stroked="false">
+                <v:imagedata r:id="rId46" o:title=""/>
+                <o:lock v:ext="edit" rotation="t"/>
+              </v:shape>
+            </w:pict>
+          </mc:Fallback>
+        </mc:AlternateContent>
+      </w:r>
+      <w:r>
+        <w:rPr>
+          <w:color w:val="auto"/>
+          <w:sz w:val="22"/>
+          <w:szCs w:val="24"/>
+          <w:highlight w:val="none"/>
+          <w:vertAlign w:val="baseline"/>
+        </w:rPr>
+      </w:r>
+      <w:r>
+        <w:rPr>
+          <w:color w:val="auto"/>
+          <w:sz w:val="22"/>
+          <w:szCs w:val="24"/>
+          <w:highlight w:val="none"/>
+          <w:vertAlign w:val="baseline"/>
+        </w:rPr>
+      </w:r>
     </w:p>
     <w:p>
       <w:pPr>
@@ -16643,8 +17300,8 @@
       <w:r>
         <w:rPr>
           <w:color w:val="auto"/>
-          <w:sz w:val="24"/>
-          <w:szCs w:val="28"/>
+          <w:sz w:val="22"/>
+          <w:szCs w:val="22"/>
           <w:highlight w:val="none"/>
           <w:vertAlign w:val="baseline"/>
         </w:rPr>
@@ -16675,6 +17332,7 @@
         <w:rPr>
           <w:color w:val="auto"/>
           <w:sz w:val="22"/>
+          <w:szCs w:val="22"/>
           <w:highlight w:val="none"/>
           <w:vertAlign w:val="baseline"/>
         </w:rPr>
@@ -16714,6 +17372,7 @@
         <w:rPr>
           <w:color w:val="auto"/>
           <w:sz w:val="22"/>
+          <w:szCs w:val="22"/>
           <w:highlight w:val="none"/>
           <w:vertAlign w:val="baseline"/>
         </w:rPr>
@@ -16754,7 +17413,7 @@
               <wp:inline xmlns:wp="http://schemas.openxmlformats.org/drawingml/2006/wordprocessingDrawing" distT="0" distB="0" distL="0" distR="0">
                 <wp:extent cx="3138412" cy="9513313"/>
                 <wp:effectExtent l="0" t="0" r="0" b="0"/>
-                <wp:docPr id="35" name=""/>
+                <wp:docPr id="36" name=""/>
                 <wp:cNvGraphicFramePr>
                   <a:graphicFrameLocks xmlns:a="http://schemas.openxmlformats.org/drawingml/2006/main" noChangeAspect="1"/>
                 </wp:cNvGraphicFramePr>
@@ -16769,7 +17428,7 @@
                         <pic:nvPr/>
                       </pic:nvPicPr>
                       <pic:blipFill>
-                        <a:blip r:embed="rId46"/>
+                        <a:blip r:embed="rId47"/>
                         <a:stretch/>
                       </pic:blipFill>
                       <pic:spPr bwMode="auto">
@@ -16808,8 +17467,8 @@
                 <v:path o:extrusionok="f" gradientshapeok="t" o:connecttype="rect"/>
                 <o:lock v:ext="edit" aspectratio="t"/>
               </v:shapetype>
-              <v:shape id="_x0000_i34" o:spid="_x0000_s34" type="#_x0000_t75" style="width:247.12pt;height:749.08pt;mso-wrap-distance-left:0.00pt;mso-wrap-distance-top:0.00pt;mso-wrap-distance-right:0.00pt;mso-wrap-distance-bottom:0.00pt;z-index:1;" stroked="false">
-                <v:imagedata r:id="rId46" o:title=""/>
+              <v:shape id="_x0000_i35" o:spid="_x0000_s35" type="#_x0000_t75" style="width:247.12pt;height:749.08pt;mso-wrap-distance-left:0.00pt;mso-wrap-distance-top:0.00pt;mso-wrap-distance-right:0.00pt;mso-wrap-distance-bottom:0.00pt;z-index:1;" stroked="false">
+                <v:imagedata r:id="rId47" o:title=""/>
                 <o:lock v:ext="edit" rotation="t"/>
               </v:shape>
             </w:pict>
@@ -16820,6 +17479,7 @@
         <w:rPr>
           <w:color w:val="auto"/>
           <w:sz w:val="22"/>
+          <w:szCs w:val="22"/>
           <w:highlight w:val="none"/>
           <w:vertAlign w:val="baseline"/>
         </w:rPr>
@@ -16900,8 +17560,9 @@
       </w:r>
       <w:r>
         <w:rPr>
-          <w:color w:val="4472c4"/>
+          <w:color w:val="4472c4" w:themeColor="accent5"/>
           <w:sz w:val="28"/>
+          <w:szCs w:val="28"/>
           <w:highlight w:val="none"/>
           <w:vertAlign w:val="baseline"/>
         </w:rPr>
@@ -17050,7 +17711,7 @@
               <wp:inline xmlns:wp="http://schemas.openxmlformats.org/drawingml/2006/wordprocessingDrawing" distT="0" distB="0" distL="0" distR="0">
                 <wp:extent cx="5940425" cy="868688"/>
                 <wp:effectExtent l="0" t="0" r="0" b="0"/>
-                <wp:docPr id="36" name="" hidden="0"/>
+                <wp:docPr id="37" name="" hidden="0"/>
                 <wp:cNvGraphicFramePr>
                   <a:graphicFrameLocks xmlns:a="http://schemas.openxmlformats.org/drawingml/2006/main" noChangeAspect="1"/>
                 </wp:cNvGraphicFramePr>
@@ -17065,7 +17726,7 @@
                         <pic:nvPr isPhoto="0" userDrawn="0"/>
                       </pic:nvPicPr>
                       <pic:blipFill>
-                        <a:blip r:embed="rId47"/>
+                        <a:blip r:embed="rId48"/>
                         <a:stretch/>
                       </pic:blipFill>
                       <pic:spPr bwMode="auto">
@@ -17104,8 +17765,8 @@
                 <v:path o:extrusionok="f" gradientshapeok="t" o:connecttype="rect"/>
                 <o:lock v:ext="edit" aspectratio="t"/>
               </v:shapetype>
-              <v:shape id="_x0000_i35" o:spid="_x0000_s35" type="#_x0000_t75" style="width:467.75pt;height:68.40pt;mso-wrap-distance-left:0.00pt;mso-wrap-distance-top:0.00pt;mso-wrap-distance-right:0.00pt;mso-wrap-distance-bottom:0.00pt;z-index:1;" stroked="false">
-                <v:imagedata r:id="rId47" o:title=""/>
+              <v:shape id="_x0000_i36" o:spid="_x0000_s36" type="#_x0000_t75" style="width:467.75pt;height:68.40pt;mso-wrap-distance-left:0.00pt;mso-wrap-distance-top:0.00pt;mso-wrap-distance-right:0.00pt;mso-wrap-distance-bottom:0.00pt;z-index:1;" stroked="false">
+                <v:imagedata r:id="rId48" o:title=""/>
                 <o:lock v:ext="edit" rotation="t"/>
               </v:shape>
             </w:pict>
@@ -17277,7 +17938,7 @@
               <wp:inline xmlns:wp="http://schemas.openxmlformats.org/drawingml/2006/wordprocessingDrawing" distT="0" distB="0" distL="0" distR="0">
                 <wp:extent cx="4543425" cy="428625"/>
                 <wp:effectExtent l="0" t="0" r="0" b="0"/>
-                <wp:docPr id="37" name="" hidden="0"/>
+                <wp:docPr id="38" name="" hidden="0"/>
                 <wp:cNvGraphicFramePr>
                   <a:graphicFrameLocks xmlns:a="http://schemas.openxmlformats.org/drawingml/2006/main" noChangeAspect="1"/>
                 </wp:cNvGraphicFramePr>
@@ -17292,7 +17953,7 @@
                         <pic:nvPr isPhoto="0" userDrawn="0"/>
                       </pic:nvPicPr>
                       <pic:blipFill>
-                        <a:blip r:embed="rId48"/>
+                        <a:blip r:embed="rId49"/>
                         <a:stretch/>
                       </pic:blipFill>
                       <pic:spPr bwMode="auto">
@@ -17331,8 +17992,8 @@
                 <v:path o:extrusionok="f" gradientshapeok="t" o:connecttype="rect"/>
                 <o:lock v:ext="edit" aspectratio="t"/>
               </v:shapetype>
-              <v:shape id="_x0000_i36" o:spid="_x0000_s36" type="#_x0000_t75" style="width:357.75pt;height:33.75pt;mso-wrap-distance-left:0.00pt;mso-wrap-distance-top:0.00pt;mso-wrap-distance-right:0.00pt;mso-wrap-distance-bottom:0.00pt;z-index:1;" stroked="false">
-                <v:imagedata r:id="rId48" o:title=""/>
+              <v:shape id="_x0000_i37" o:spid="_x0000_s37" type="#_x0000_t75" style="width:357.75pt;height:33.75pt;mso-wrap-distance-left:0.00pt;mso-wrap-distance-top:0.00pt;mso-wrap-distance-right:0.00pt;mso-wrap-distance-bottom:0.00pt;z-index:1;" stroked="false">
+                <v:imagedata r:id="rId49" o:title=""/>
                 <o:lock v:ext="edit" rotation="t"/>
               </v:shape>
             </w:pict>
@@ -17491,7 +18152,7 @@
               <wp:inline xmlns:wp="http://schemas.openxmlformats.org/drawingml/2006/wordprocessingDrawing" distT="0" distB="0" distL="0" distR="0">
                 <wp:extent cx="4791075" cy="2200275"/>
                 <wp:effectExtent l="0" t="0" r="0" b="0"/>
-                <wp:docPr id="38" name="" hidden="0"/>
+                <wp:docPr id="39" name="" hidden="0"/>
                 <wp:cNvGraphicFramePr>
                   <a:graphicFrameLocks xmlns:a="http://schemas.openxmlformats.org/drawingml/2006/main" noChangeAspect="1"/>
                 </wp:cNvGraphicFramePr>
@@ -17506,7 +18167,7 @@
                         <pic:nvPr isPhoto="0" userDrawn="0"/>
                       </pic:nvPicPr>
                       <pic:blipFill>
-                        <a:blip r:embed="rId49"/>
+                        <a:blip r:embed="rId50"/>
                         <a:stretch/>
                       </pic:blipFill>
                       <pic:spPr bwMode="auto">
@@ -17545,8 +18206,8 @@
                 <v:path o:extrusionok="f" gradientshapeok="t" o:connecttype="rect"/>
                 <o:lock v:ext="edit" aspectratio="t"/>
               </v:shapetype>
-              <v:shape id="_x0000_i37" o:spid="_x0000_s37" type="#_x0000_t75" style="width:377.25pt;height:173.25pt;mso-wrap-distance-left:0.00pt;mso-wrap-distance-top:0.00pt;mso-wrap-distance-right:0.00pt;mso-wrap-distance-bottom:0.00pt;z-index:1;" stroked="false">
-                <v:imagedata r:id="rId49" o:title=""/>
+              <v:shape id="_x0000_i38" o:spid="_x0000_s38" type="#_x0000_t75" style="width:377.25pt;height:173.25pt;mso-wrap-distance-left:0.00pt;mso-wrap-distance-top:0.00pt;mso-wrap-distance-right:0.00pt;mso-wrap-distance-bottom:0.00pt;z-index:1;" stroked="false">
+                <v:imagedata r:id="rId50" o:title=""/>
                 <o:lock v:ext="edit" rotation="t"/>
               </v:shape>
             </w:pict>
@@ -17805,7 +18466,7 @@
               <wp:inline xmlns:wp="http://schemas.openxmlformats.org/drawingml/2006/wordprocessingDrawing" distT="0" distB="0" distL="0" distR="0">
                 <wp:extent cx="4010025" cy="314325"/>
                 <wp:effectExtent l="0" t="0" r="0" b="0"/>
-                <wp:docPr id="39" name="" hidden="0"/>
+                <wp:docPr id="40" name="" hidden="0"/>
                 <wp:cNvGraphicFramePr>
                   <a:graphicFrameLocks xmlns:a="http://schemas.openxmlformats.org/drawingml/2006/main" noChangeAspect="1"/>
                 </wp:cNvGraphicFramePr>
@@ -17820,7 +18481,7 @@
                         <pic:nvPr isPhoto="0" userDrawn="0"/>
                       </pic:nvPicPr>
                       <pic:blipFill>
-                        <a:blip r:embed="rId50"/>
+                        <a:blip r:embed="rId51"/>
                         <a:stretch/>
                       </pic:blipFill>
                       <pic:spPr bwMode="auto">
@@ -17859,8 +18520,8 @@
                 <v:path o:extrusionok="f" gradientshapeok="t" o:connecttype="rect"/>
                 <o:lock v:ext="edit" aspectratio="t"/>
               </v:shapetype>
-              <v:shape id="_x0000_i38" o:spid="_x0000_s38" type="#_x0000_t75" style="width:315.75pt;height:24.75pt;mso-wrap-distance-left:0.00pt;mso-wrap-distance-top:0.00pt;mso-wrap-distance-right:0.00pt;mso-wrap-distance-bottom:0.00pt;z-index:1;" stroked="false">
-                <v:imagedata r:id="rId50" o:title=""/>
+              <v:shape id="_x0000_i39" o:spid="_x0000_s39" type="#_x0000_t75" style="width:315.75pt;height:24.75pt;mso-wrap-distance-left:0.00pt;mso-wrap-distance-top:0.00pt;mso-wrap-distance-right:0.00pt;mso-wrap-distance-bottom:0.00pt;z-index:1;" stroked="false">
+                <v:imagedata r:id="rId51" o:title=""/>
                 <o:lock v:ext="edit" rotation="t"/>
               </v:shape>
             </w:pict>

</xml_diff>

<commit_message>
Explained displaying planets a bit
</commit_message>
<xml_diff>
--- a/Design.docx
+++ b/Design.docx
@@ -10895,7 +10895,7 @@
           <w:szCs w:val="16"/>
           <w:highlight w:val="none"/>
         </w:rPr>
-        <w:t xml:space="preserve">ur of these, the size, mass, position and velocity in their ephemerides, which will be referenced as ephemeris[0], ephemeris[1] etc as getEphemeris() returns a list.. NASA does also provide a name but it’s incredibly hard to extract due to how they present</w:t>
+        <w:t xml:space="preserve">ur of these, the size, mass, position and velocity in their ephemerides, which will be referenced as ephemeris[0], ephemeris[1] etc as getEphemeris() returns a list. NASA does also provide a name but it’s incredibly hard to extract due to how they present</w:t>
       </w:r>
       <w:r>
         <w:rPr>
@@ -16396,6 +16396,7 @@
         <w:rPr>
           <w:color w:val="000000" w:themeColor="text1"/>
           <w:sz w:val="22"/>
+          <w:szCs w:val="22"/>
           <w:highlight w:val="none"/>
           <w:vertAlign w:val="baseline"/>
         </w:rPr>
@@ -16430,12 +16431,22 @@
           <w:highlight w:val="none"/>
           <w:vertAlign w:val="baseline"/>
         </w:rPr>
-        <w:t xml:space="preserve">Next, we need to make the display be centred on a specific planet. This means we want the planet in question to be displayed at (w/2, h/2) on the screen where w is the width in pixels of the window and h is the height. This is calculated by using pygame’s get_size() method to get (w, h) and then dividing it by 2. Here is a diagram showing the situation:</w:t>
+        <w:t xml:space="preserve">Next, we need to make the display be centred on a specific planet. This means we want the planet in</w:t>
       </w:r>
       <w:r>
         <w:rPr>
           <w:color w:val="000000" w:themeColor="text1"/>
           <w:sz w:val="22"/>
+          <w:highlight w:val="none"/>
+          <w:vertAlign w:val="baseline"/>
+        </w:rPr>
+        <w:t xml:space="preserve"> question to be displayed at (w/2, h/2) on the screen where w is the width in pixels of the window and h is the height. This is calculated by using pygame’s get_size() method to get (w, h) and then dividing it by 2. Here is a diagram showing the situation:</w:t>
+      </w:r>
+      <w:r>
+        <w:rPr>
+          <w:color w:val="000000" w:themeColor="text1"/>
+          <w:sz w:val="22"/>
+          <w:szCs w:val="22"/>
           <w:highlight w:val="none"/>
           <w:vertAlign w:val="baseline"/>
         </w:rPr>
@@ -16542,6 +16553,7 @@
         <w:rPr>
           <w:color w:val="000000" w:themeColor="text1"/>
           <w:sz w:val="22"/>
+          <w:szCs w:val="22"/>
           <w:highlight w:val="none"/>
           <w:vertAlign w:val="baseline"/>
         </w:rPr>
@@ -16739,6 +16751,18 @@
           <w:vertAlign w:val="baseline"/>
         </w:rPr>
         <w:t xml:space="preserve">, the location of the centre:</w:t>
+      </w:r>
+      <w:r>
+        <w:rPr>
+          <w:b w:val="0"/>
+          <w:bCs w:val="0"/>
+          <w:color w:val="000000" w:themeColor="text1"/>
+          <w:sz w:val="22"/>
+          <w:szCs w:val="22"/>
+          <w:highlight w:val="none"/>
+          <w:u w:val="none"/>
+          <w:vertAlign w:val="baseline"/>
+        </w:rPr>
       </w:r>
       <w:r>
         <w:rPr>
@@ -16890,7 +16914,6 @@
         <w:rPr>
           <w:b w:val="0"/>
           <w:bCs w:val="0"/>
-          <w:strike/>
           <w:color w:val="000000" w:themeColor="text1"/>
           <w:sz w:val="22"/>
           <w:szCs w:val="22"/>
@@ -16928,6 +16951,18 @@
           <w:vertAlign w:val="baseline"/>
         </w:rPr>
         <w:t xml:space="preserve">So if we calculate the adjustment and then add it to Earth’s position, and then display Earth at that location, Earth will be at the centre of the screen.</w:t>
+      </w:r>
+      <w:r>
+        <w:rPr>
+          <w:b w:val="0"/>
+          <w:bCs w:val="0"/>
+          <w:color w:val="000000" w:themeColor="text1"/>
+          <w:sz w:val="22"/>
+          <w:szCs w:val="22"/>
+          <w:highlight w:val="none"/>
+          <w:u w:val="none"/>
+          <w:vertAlign w:val="baseline"/>
+        </w:rPr>
       </w:r>
       <w:r>
         <w:rPr>
@@ -16976,27 +17011,12 @@
         <w:rPr>
           <w:b w:val="0"/>
           <w:bCs w:val="0"/>
+          <w:strike/>
           <w:color w:val="000000" w:themeColor="text1"/>
           <w:sz w:val="22"/>
           <w:szCs w:val="22"/>
           <w:highlight w:val="none"/>
           <w:u w:val="none"/>
-          <w:vertAlign w:val="baseline"/>
-        </w:rPr>
-      </w:r>
-      <w:r>
-        <w:rPr>
-          <w:color w:val="000000" w:themeColor="text1"/>
-          <w:sz w:val="22"/>
-          <w:highlight w:val="none"/>
-          <w:vertAlign w:val="baseline"/>
-        </w:rPr>
-      </w:r>
-      <w:r>
-        <w:rPr>
-          <w:color w:val="000000" w:themeColor="text1"/>
-          <w:sz w:val="22"/>
-          <w:highlight w:val="none"/>
           <w:vertAlign w:val="baseline"/>
         </w:rPr>
       </w:r>
@@ -17106,7 +17126,7 @@
       <w:r>
         <w:rPr>
           <w:color w:val="auto"/>
-          <w:sz w:val="22"/>
+          <w:sz w:val="24"/>
           <w:szCs w:val="24"/>
           <w:highlight w:val="none"/>
           <w:vertAlign w:val="baseline"/>
@@ -17143,13 +17163,42 @@
           <w:highlight w:val="none"/>
           <w:vertAlign w:val="baseline"/>
         </w:rPr>
-        <w:t xml:space="preserve">So Earth would be displayed at the centre of the screen, and the sun would be displayed in the bottom left as it is down and to the left from Earth. We can repeat this process for any planet we want, to display it we just scale its position vector by distConst and then add the adjustment to that vector. We then display a circle at that position on the screen. If we want to focus on the centre of mass instead of a planet, that is very similar, the maths is the exact same except you use the scaled position vector for the c.o.m. Here is pseudocode for focusAdjustment(), the function that calculates the adjustment:</w:t>
+        <w:t xml:space="preserve">So Earth would be displayed at the centre of the screen, and the sun would be displayed in the bottom left</w:t>
       </w:r>
       <w:r>
         <w:rPr>
           <w:color w:val="auto"/>
           <w:sz w:val="22"/>
           <w:szCs w:val="24"/>
+          <w:highlight w:val="none"/>
+          <w:vertAlign w:val="baseline"/>
+        </w:rPr>
+        <w:t xml:space="preserve"> as it is down and to the left from Earth. We can repeat this process for any planet we want, to display it we just scale its position vector by distConst and then add the adjustment to that vector. We then display a circle at that position on the screen. </w:t>
+      </w:r>
+      <w:r>
+        <w:rPr>
+          <w:color w:val="auto"/>
+          <w:sz w:val="22"/>
+          <w:szCs w:val="24"/>
+          <w:highlight w:val="none"/>
+          <w:vertAlign w:val="baseline"/>
+        </w:rPr>
+        <w:t xml:space="preserve">If we want to focus on the centre of mass instead of a planet, that is very similar, the maths is the exact same except you use the scaled position vector for the c.o.m. Here is pseudocode for focusAdjustment(), the function that calculates the adjustment:</w:t>
+      </w:r>
+      <w:r>
+        <w:rPr>
+          <w:color w:val="auto"/>
+          <w:sz w:val="22"/>
+          <w:szCs w:val="24"/>
+          <w:highlight w:val="none"/>
+          <w:vertAlign w:val="baseline"/>
+        </w:rPr>
+      </w:r>
+      <w:r>
+        <w:rPr>
+          <w:color w:val="auto"/>
+          <w:sz w:val="22"/>
+          <w:szCs w:val="22"/>
           <w:highlight w:val="none"/>
           <w:vertAlign w:val="baseline"/>
         </w:rPr>
@@ -17259,7 +17308,7 @@
         <w:rPr>
           <w:color w:val="auto"/>
           <w:sz w:val="22"/>
-          <w:szCs w:val="24"/>
+          <w:szCs w:val="22"/>
           <w:highlight w:val="none"/>
           <w:vertAlign w:val="baseline"/>
         </w:rPr>
@@ -17286,13 +17335,160 @@
           <w:highlight w:val="none"/>
           <w:vertAlign w:val="baseline"/>
         </w:rPr>
+      </w:r>
+      <w:r>
+        <w:rPr>
+          <w:color w:val="auto"/>
+          <w:sz w:val="22"/>
+          <w:szCs w:val="24"/>
+          <w:highlight w:val="none"/>
+          <w:vertAlign w:val="baseline"/>
+        </w:rPr>
+      </w:r>
+    </w:p>
+    <w:p>
+      <w:pPr>
+        <w:pBdr/>
+        <w:spacing/>
+        <w:ind/>
+        <w:rPr>
+          <w:color w:val="auto"/>
+          <w:sz w:val="22"/>
+          <w:szCs w:val="22"/>
+          <w:highlight w:val="none"/>
+          <w:vertAlign w:val="baseline"/>
+        </w:rPr>
+      </w:pPr>
+      <w:r>
+        <w:rPr>
+          <w:color w:val="auto"/>
+          <w:sz w:val="22"/>
+          <w:szCs w:val="22"/>
+          <w:highlight w:val="none"/>
+          <w:vertAlign w:val="baseline"/>
+        </w:rPr>
+        <w:t xml:space="preserve">So, for every object that I want to draw (orbital lines and planets pretty much), I will take their position, scale it and add the adjustment and draw it at that position. Now that we understand that let’s look at how the solar system is actually displayed.</w:t>
+      </w:r>
+      <w:r>
+        <w:rPr>
+          <w:color w:val="auto"/>
+          <w:sz w:val="22"/>
+          <w:szCs w:val="24"/>
+          <w:highlight w:val="none"/>
+          <w:vertAlign w:val="baseline"/>
+        </w:rPr>
+      </w:r>
+      <w:r>
+        <w:rPr>
+          <w:color w:val="auto"/>
+          <w:sz w:val="22"/>
+          <w:szCs w:val="24"/>
+          <w:highlight w:val="none"/>
+          <w:vertAlign w:val="baseline"/>
+        </w:rPr>
+      </w:r>
+      <w:r>
+        <w:rPr>
+          <w:color w:val="auto"/>
+          <w:sz w:val="22"/>
+          <w:szCs w:val="22"/>
+          <w:highlight w:val="none"/>
+          <w:vertAlign w:val="baseline"/>
+        </w:rPr>
+      </w:r>
+    </w:p>
+    <w:p>
+      <w:pPr>
+        <w:pBdr/>
+        <w:spacing/>
+        <w:ind/>
+        <w:rPr>
+          <w:color w:val="auto"/>
+          <w:sz w:val="22"/>
+          <w:szCs w:val="22"/>
+          <w:highlight w:val="none"/>
+          <w:vertAlign w:val="baseline"/>
+        </w:rPr>
+      </w:pPr>
+      <w:r>
+        <w:rPr>
+          <w:color w:val="auto"/>
+          <w:sz w:val="22"/>
+          <w:szCs w:val="22"/>
+          <w:highlight w:val="none"/>
+          <w:vertAlign w:val="baseline"/>
+        </w:rPr>
+      </w:r>
+      <w:r>
+        <w:rPr>
+          <w:color w:val="auto"/>
+          <w:sz w:val="22"/>
+          <w:szCs w:val="22"/>
+          <w:highlight w:val="none"/>
+          <w:vertAlign w:val="baseline"/>
+        </w:rPr>
+      </w:r>
+    </w:p>
+    <w:p>
+      <w:pPr>
+        <w:pBdr/>
+        <w:spacing/>
+        <w:ind/>
+        <w:rPr>
+          <w:color w:val="auto"/>
+          <w:sz w:val="22"/>
+          <w:szCs w:val="22"/>
+          <w:highlight w:val="none"/>
+          <w:vertAlign w:val="baseline"/>
+        </w:rPr>
+      </w:pPr>
+      <w:r>
+        <w:rPr>
+          <w:color w:val="auto"/>
+          <w:sz w:val="22"/>
+          <w:szCs w:val="22"/>
+          <w:highlight w:val="none"/>
+          <w:vertAlign w:val="baseline"/>
+        </w:rPr>
+      </w:r>
+      <w:r>
+        <w:rPr>
+          <w:color w:val="auto"/>
+          <w:sz w:val="22"/>
+          <w:szCs w:val="22"/>
+          <w:highlight w:val="none"/>
+          <w:vertAlign w:val="baseline"/>
+        </w:rPr>
+      </w:r>
+    </w:p>
+    <w:p>
+      <w:pPr>
+        <w:pBdr/>
+        <w:spacing/>
+        <w:ind/>
+        <w:rPr>
+          <w:color w:val="auto"/>
+          <w:sz w:val="22"/>
+          <w:szCs w:val="22"/>
+          <w:highlight w:val="none"/>
+          <w:vertAlign w:val="baseline"/>
+        </w:rPr>
+      </w:pPr>
+      <w:r>
+        <w:rPr>
+          <w:color w:val="auto"/>
+          <w:sz w:val="22"/>
+          <w:szCs w:val="24"/>
+          <w:highlight w:val="none"/>
+          <w:vertAlign w:val="baseline"/>
+        </w:rPr>
         <w:t xml:space="preserve">This is the render pipeline for displaying the solar system:</w:t>
       </w:r>
       <w:r>
         <w:rPr>
           <w:color w:val="auto"/>
-          <w:sz w:val="24"/>
-          <w:szCs w:val="28"/>
+          <w:sz w:val="22"/>
+          <w:szCs w:val="22"/>
           <w:highlight w:val="none"/>
           <w:vertAlign w:val="baseline"/>
         </w:rPr>
@@ -17484,15 +17680,6 @@
           <w:vertAlign w:val="baseline"/>
         </w:rPr>
       </w:r>
-      <w:r>
-        <w:rPr>
-          <w:color w:val="auto"/>
-          <w:sz w:val="22"/>
-          <w:szCs w:val="22"/>
-          <w:highlight w:val="none"/>
-          <w:vertAlign w:val="baseline"/>
-        </w:rPr>
-      </w:r>
     </w:p>
     <w:p>
       <w:pPr>
@@ -17511,11 +17698,11 @@
         <w:rPr>
           <w:color w:val="000000" w:themeColor="text1"/>
           <w:sz w:val="22"/>
-          <w:szCs w:val="18"/>
+          <w:szCs w:val="22"/>
           <w:highlight w:val="none"/>
           <w:vertAlign w:val="baseline"/>
         </w:rPr>
-        <w:t xml:space="preserve">First the “adjustment” is calculated. This is how the program’s camera works. The adjustment is the vector from the centre </w:t>
+        <w:t xml:space="preserve">First we draw a black background, because space is black so the background should be black. Next the adjustment is calculated as this is needed to draw any object as explained above. Then we draw the objects in the order planets, lines, and if applicable, arrows. This order is chosen as sometimes with objects that don’t move much because they’re very massive (e.g. the sun) will have visible movement, but the orbital path will stay entirely inside the object. Drawing paths after the planets lets that path still be visible. Likewise with arrows, for very small forces the arrow is contained entirely within the planet. Drawing the arrow after drawing the planet lets it still be visible.</w:t>
       </w:r>
       <w:r>
         <w:rPr>
@@ -17526,11 +17713,125 @@
           <w:vertAlign w:val="baseline"/>
         </w:rPr>
       </w:r>
-      <w:r>
+    </w:p>
+    <w:p>
+      <w:pPr>
+        <w:pBdr/>
+        <w:spacing/>
+        <w:ind/>
         <w:rPr>
           <w:color w:val="000000" w:themeColor="text1"/>
           <w:sz w:val="22"/>
           <w:szCs w:val="22"/>
+          <w:highlight w:val="none"/>
+          <w:vertAlign w:val="baseline"/>
+        </w:rPr>
+      </w:pPr>
+      <w:r>
+        <w:rPr>
+          <w:color w:val="000000" w:themeColor="text1"/>
+          <w:sz w:val="22"/>
+          <w:szCs w:val="22"/>
+          <w:highlight w:val="none"/>
+          <w:vertAlign w:val="baseline"/>
+        </w:rPr>
+        <w:t xml:space="preserve">Drawing the planets is done with displayPlanets which runs a for loop iterating over the list planets and uses a method, drawPlanet() to display each one. It only runs drawPlanet() if the planet would be visible to save on resources, no point drawing planets offscreen. drawPlanet() uses pygame.draw.circle() along with the attributes of the planet to draw a circle with the radius of the planet at the position of the planet after having applied the distance scale and added the adjustment.</w:t>
+      </w:r>
+      <w:r>
+        <w:rPr>
+          <w:color w:val="000000" w:themeColor="text1"/>
+          <w:sz w:val="22"/>
+          <w:szCs w:val="22"/>
+          <w:highlight w:val="none"/>
+          <w:vertAlign w:val="baseline"/>
+        </w:rPr>
+      </w:r>
+      <w:r>
+        <w:rPr>
+          <w:color w:val="000000" w:themeColor="text1"/>
+          <w:sz w:val="22"/>
+          <w:szCs w:val="22"/>
+          <w:highlight w:val="none"/>
+          <w:vertAlign w:val="baseline"/>
+        </w:rPr>
+      </w:r>
+      <w:r>
+        <w:rPr>
+          <w:color w:val="000000" w:themeColor="text1"/>
+          <w:sz w:val="22"/>
+          <w:szCs w:val="22"/>
+          <w:highlight w:val="none"/>
+          <w:vertAlign w:val="baseline"/>
+        </w:rPr>
+      </w:r>
+      <w:r>
+        <w:rPr>
+          <w:color w:val="000000" w:themeColor="text1"/>
+          <w:sz w:val="22"/>
+          <w:szCs w:val="22"/>
+          <w:highlight w:val="none"/>
+          <w:vertAlign w:val="baseline"/>
+        </w:rPr>
+      </w:r>
+    </w:p>
+    <w:p>
+      <w:pPr>
+        <w:pBdr/>
+        <w:spacing/>
+        <w:ind/>
+        <w:rPr>
+          <w:color w:val="000000" w:themeColor="text1"/>
+          <w:sz w:val="22"/>
+          <w:szCs w:val="22"/>
+          <w:highlight w:val="none"/>
+          <w:vertAlign w:val="baseline"/>
+        </w:rPr>
+      </w:pPr>
+      <w:r>
+        <w:rPr>
+          <w:color w:val="000000" w:themeColor="text1"/>
+          <w:sz w:val="22"/>
+          <w:szCs w:val="22"/>
+          <w:highlight w:val="none"/>
+          <w:vertAlign w:val="baseline"/>
+        </w:rPr>
+        <w:t xml:space="preserve">Finally the menu is displayed, the text should be visible above everything else which is why the menu is the last part to be shown.</w:t>
+      </w:r>
+      <w:r>
+        <w:rPr>
+          <w:color w:val="000000" w:themeColor="text1"/>
+          <w:sz w:val="22"/>
+          <w:szCs w:val="22"/>
+          <w:highlight w:val="none"/>
+          <w:vertAlign w:val="baseline"/>
+        </w:rPr>
+      </w:r>
+    </w:p>
+    <w:p>
+      <w:pPr>
+        <w:pBdr/>
+        <w:spacing/>
+        <w:ind/>
+        <w:rPr>
+          <w:color w:val="auto"/>
+          <w:sz w:val="22"/>
+          <w:szCs w:val="22"/>
+          <w:highlight w:val="none"/>
+          <w:vertAlign w:val="baseline"/>
+        </w:rPr>
+      </w:pPr>
+      <w:r>
+        <w:rPr>
+          <w:color w:val="4472c4" w:themeColor="accent5"/>
+          <w:sz w:val="28"/>
+          <w:highlight w:val="none"/>
+          <w:vertAlign w:val="baseline"/>
+        </w:rPr>
+      </w:r>
+      <w:r>
+        <w:rPr>
+          <w:color w:val="4472c4" w:themeColor="accent5"/>
+          <w:sz w:val="28"/>
           <w:highlight w:val="none"/>
           <w:vertAlign w:val="baseline"/>
         </w:rPr>
@@ -17551,6 +17852,14 @@
       </w:pPr>
       <w:r>
         <w:rPr>
+          <w:color w:val="auto"/>
+          <w:sz w:val="22"/>
+          <w:highlight w:val="none"/>
+          <w:vertAlign w:val="baseline"/>
+        </w:rPr>
+      </w:r>
+      <w:r>
+        <w:rPr>
           <w:color w:val="4472c4" w:themeColor="accent5"/>
           <w:sz w:val="28"/>
           <w:highlight w:val="none"/>
@@ -17560,22 +17869,14 @@
       </w:r>
       <w:r>
         <w:rPr>
-          <w:color w:val="4472c4" w:themeColor="accent5"/>
-          <w:sz w:val="28"/>
-          <w:szCs w:val="28"/>
+          <w:color w:val="auto"/>
+          <w:sz w:val="22"/>
+          <w:szCs w:val="22"/>
           <w:highlight w:val="none"/>
           <w:vertAlign w:val="baseline"/>
         </w:rPr>
       </w:r>
-      <w:r>
-        <w:rPr>
-          <w:color w:val="4472c4" w:themeColor="accent5"/>
-          <w:sz w:val="28"/>
-          <w:szCs w:val="28"/>
-          <w:highlight w:val="none"/>
-          <w:vertAlign w:val="baseline"/>
-        </w:rPr>
-      </w:r>
+      <w:r/>
     </w:p>
     <w:p>
       <w:pPr>

</xml_diff>

<commit_message>
A bit more on design, started going through methods for display.
</commit_message>
<xml_diff>
--- a/Design.docx
+++ b/Design.docx
@@ -5520,6 +5520,324 @@
               <w:rPr>
                 <w:b/>
                 <w:bCs/>
+                <w:color w:val="000000"/>
+                <w:sz w:val="22"/>
+                <w:szCs w:val="22"/>
+                <w:highlight w:val="none"/>
+              </w:rPr>
+            </w:r>
+          </w:p>
+        </w:tc>
+      </w:tr>
+      <w:tr>
+        <w:trPr/>
+        <w:tc>
+          <w:tcPr>
+            <w:tcBorders/>
+            <w:tcW w:w="2339" w:type="dxa"/>
+            <w:vMerge w:val="restart"/>
+            <w:textDirection w:val="lrTb"/>
+            <w:noWrap w:val="false"/>
+          </w:tcPr>
+          <w:p>
+            <w:pPr>
+              <w:pBdr/>
+              <w:spacing/>
+              <w:ind/>
+              <w:rPr>
+                <w:color w:val="000000"/>
+                <w:sz w:val="22"/>
+                <w:szCs w:val="22"/>
+                <w:highlight w:val="none"/>
+              </w:rPr>
+            </w:pPr>
+            <w:r>
+              <w:rPr>
+                <w:color w:val="000000"/>
+                <w:sz w:val="22"/>
+                <w:szCs w:val="22"/>
+                <w:highlight w:val="none"/>
+              </w:rPr>
+              <w:t xml:space="preserve">x</w:t>
+            </w:r>
+            <w:r>
+              <w:rPr>
+                <w:color w:val="000000"/>
+                <w:sz w:val="22"/>
+                <w:szCs w:val="22"/>
+                <w:highlight w:val="none"/>
+              </w:rPr>
+            </w:r>
+          </w:p>
+        </w:tc>
+        <w:tc>
+          <w:tcPr>
+            <w:tcBorders/>
+            <w:tcW w:w="2339" w:type="dxa"/>
+            <w:vMerge w:val="restart"/>
+            <w:textDirection w:val="lrTb"/>
+            <w:noWrap w:val="false"/>
+          </w:tcPr>
+          <w:p>
+            <w:pPr>
+              <w:pBdr/>
+              <w:spacing/>
+              <w:ind/>
+              <w:rPr>
+                <w:color w:val="000000"/>
+                <w:sz w:val="22"/>
+                <w:szCs w:val="22"/>
+                <w:highlight w:val="none"/>
+              </w:rPr>
+            </w:pPr>
+            <w:r>
+              <w:rPr>
+                <w:color w:val="000000"/>
+                <w:sz w:val="22"/>
+                <w:szCs w:val="22"/>
+                <w:highlight w:val="none"/>
+              </w:rPr>
+              <w:t xml:space="preserve">integer</w:t>
+            </w:r>
+            <w:r>
+              <w:rPr>
+                <w:color w:val="000000"/>
+                <w:sz w:val="22"/>
+                <w:szCs w:val="22"/>
+                <w:highlight w:val="none"/>
+              </w:rPr>
+            </w:r>
+          </w:p>
+        </w:tc>
+        <w:tc>
+          <w:tcPr>
+            <w:tcBorders/>
+            <w:tcW w:w="2339" w:type="dxa"/>
+            <w:vMerge w:val="restart"/>
+            <w:textDirection w:val="lrTb"/>
+            <w:noWrap w:val="false"/>
+          </w:tcPr>
+          <w:p>
+            <w:pPr>
+              <w:pBdr/>
+              <w:spacing/>
+              <w:ind/>
+              <w:rPr>
+                <w:color w:val="000000"/>
+                <w:sz w:val="22"/>
+                <w:szCs w:val="22"/>
+                <w:highlight w:val="none"/>
+              </w:rPr>
+            </w:pPr>
+            <w:r>
+              <w:rPr>
+                <w:color w:val="000000"/>
+                <w:sz w:val="22"/>
+                <w:szCs w:val="22"/>
+                <w:highlight w:val="none"/>
+              </w:rPr>
+              <w:t xml:space="preserve">0</w:t>
+            </w:r>
+            <w:r>
+              <w:rPr>
+                <w:color w:val="000000"/>
+                <w:sz w:val="22"/>
+                <w:szCs w:val="22"/>
+                <w:highlight w:val="none"/>
+              </w:rPr>
+            </w:r>
+          </w:p>
+        </w:tc>
+        <w:tc>
+          <w:tcPr>
+            <w:tcBorders/>
+            <w:tcW w:w="2339" w:type="dxa"/>
+            <w:vMerge w:val="restart"/>
+            <w:textDirection w:val="lrTb"/>
+            <w:noWrap w:val="false"/>
+          </w:tcPr>
+          <w:p>
+            <w:pPr>
+              <w:pBdr/>
+              <w:spacing/>
+              <w:ind/>
+              <w:rPr>
+                <w:color w:val="000000"/>
+                <w:sz w:val="22"/>
+                <w:szCs w:val="22"/>
+                <w:highlight w:val="none"/>
+              </w:rPr>
+            </w:pPr>
+            <w:r>
+              <w:rPr>
+                <w:color w:val="000000"/>
+                <w:sz w:val="22"/>
+                <w:szCs w:val="22"/>
+                <w:highlight w:val="none"/>
+              </w:rPr>
+              <w:t xml:space="preserve">x and y are mapped to 0 and 1 respectively for indexing purposes, this means if I want the x component of a vector I just need to write vector[x], which makes the program a lot more readable.</w:t>
+            </w:r>
+            <w:r>
+              <w:rPr>
+                <w:color w:val="000000"/>
+                <w:sz w:val="22"/>
+                <w:szCs w:val="22"/>
+                <w:highlight w:val="none"/>
+              </w:rPr>
+            </w:r>
+          </w:p>
+        </w:tc>
+      </w:tr>
+      <w:tr>
+        <w:trPr/>
+        <w:tc>
+          <w:tcPr>
+            <w:tcBorders/>
+            <w:tcW w:w="2339" w:type="dxa"/>
+            <w:vMerge w:val="restart"/>
+            <w:textDirection w:val="lrTb"/>
+            <w:noWrap w:val="false"/>
+          </w:tcPr>
+          <w:p>
+            <w:pPr>
+              <w:pBdr/>
+              <w:spacing/>
+              <w:ind/>
+              <w:rPr>
+                <w:color w:val="000000"/>
+                <w:sz w:val="22"/>
+                <w:szCs w:val="22"/>
+                <w:highlight w:val="none"/>
+              </w:rPr>
+            </w:pPr>
+            <w:r>
+              <w:rPr>
+                <w:color w:val="000000"/>
+                <w:sz w:val="22"/>
+                <w:szCs w:val="22"/>
+                <w:highlight w:val="none"/>
+              </w:rPr>
+              <w:t xml:space="preserve">y</w:t>
+            </w:r>
+            <w:r>
+              <w:rPr>
+                <w:color w:val="000000"/>
+                <w:sz w:val="22"/>
+                <w:szCs w:val="22"/>
+                <w:highlight w:val="none"/>
+              </w:rPr>
+            </w:r>
+          </w:p>
+        </w:tc>
+        <w:tc>
+          <w:tcPr>
+            <w:tcBorders/>
+            <w:tcW w:w="2339" w:type="dxa"/>
+            <w:vMerge w:val="restart"/>
+            <w:textDirection w:val="lrTb"/>
+            <w:noWrap w:val="false"/>
+          </w:tcPr>
+          <w:p>
+            <w:pPr>
+              <w:pBdr/>
+              <w:spacing/>
+              <w:ind/>
+              <w:rPr>
+                <w:color w:val="000000"/>
+                <w:sz w:val="22"/>
+                <w:szCs w:val="22"/>
+                <w:highlight w:val="none"/>
+              </w:rPr>
+            </w:pPr>
+            <w:r>
+              <w:rPr>
+                <w:color w:val="000000"/>
+                <w:sz w:val="22"/>
+                <w:szCs w:val="22"/>
+                <w:highlight w:val="none"/>
+              </w:rPr>
+              <w:t xml:space="preserve">integer</w:t>
+            </w:r>
+            <w:r>
+              <w:rPr>
+                <w:color w:val="000000"/>
+                <w:sz w:val="22"/>
+                <w:szCs w:val="22"/>
+                <w:highlight w:val="none"/>
+              </w:rPr>
+            </w:r>
+          </w:p>
+        </w:tc>
+        <w:tc>
+          <w:tcPr>
+            <w:tcBorders/>
+            <w:tcW w:w="2339" w:type="dxa"/>
+            <w:vMerge w:val="restart"/>
+            <w:textDirection w:val="lrTb"/>
+            <w:noWrap w:val="false"/>
+          </w:tcPr>
+          <w:p>
+            <w:pPr>
+              <w:pBdr/>
+              <w:spacing/>
+              <w:ind/>
+              <w:rPr>
+                <w:color w:val="000000"/>
+                <w:sz w:val="22"/>
+                <w:szCs w:val="22"/>
+                <w:highlight w:val="none"/>
+              </w:rPr>
+            </w:pPr>
+            <w:r>
+              <w:rPr>
+                <w:color w:val="000000"/>
+                <w:sz w:val="22"/>
+                <w:szCs w:val="22"/>
+                <w:highlight w:val="none"/>
+              </w:rPr>
+              <w:t xml:space="preserve">1</w:t>
+            </w:r>
+            <w:r>
+              <w:rPr>
+                <w:color w:val="000000"/>
+                <w:sz w:val="22"/>
+                <w:szCs w:val="22"/>
+                <w:highlight w:val="none"/>
+              </w:rPr>
+            </w:r>
+          </w:p>
+        </w:tc>
+        <w:tc>
+          <w:tcPr>
+            <w:tcBorders/>
+            <w:tcW w:w="2339" w:type="dxa"/>
+            <w:vMerge w:val="restart"/>
+            <w:textDirection w:val="lrTb"/>
+            <w:noWrap w:val="false"/>
+          </w:tcPr>
+          <w:p>
+            <w:pPr>
+              <w:pBdr/>
+              <w:spacing/>
+              <w:ind/>
+              <w:rPr>
+                <w:color w:val="000000"/>
+                <w:sz w:val="22"/>
+                <w:szCs w:val="22"/>
+                <w:highlight w:val="none"/>
+              </w:rPr>
+            </w:pPr>
+            <w:r>
+              <w:rPr>
+                <w:color w:val="000000"/>
+                <w:sz w:val="22"/>
+                <w:szCs w:val="22"/>
+                <w:highlight w:val="none"/>
+              </w:rPr>
+              <w:t xml:space="preserve">See above description.</w:t>
+            </w:r>
+            <w:r>
+              <w:rPr>
                 <w:color w:val="000000"/>
                 <w:sz w:val="22"/>
                 <w:szCs w:val="22"/>
@@ -17768,7 +18086,7 @@
           <w:highlight w:val="none"/>
           <w:vertAlign w:val="baseline"/>
         </w:rPr>
-        <w:t xml:space="preserve">Finally the menu is displayed, the text should be visible above everything else which is why the menu is the last part to be shown. I will now go through each method individually:</w:t>
+        <w:t xml:space="preserve">Finally the menu is displayed, the text should be visible above everything else which is why the menu is the last part to be shown. </w:t>
       </w:r>
       <w:r>
         <w:rPr>
@@ -17779,7 +18097,12 @@
           <w:vertAlign w:val="baseline"/>
         </w:rPr>
       </w:r>
-      <w:r>
+    </w:p>
+    <w:p>
+      <w:pPr>
+        <w:pBdr/>
+        <w:spacing/>
+        <w:ind/>
         <w:rPr>
           <w:color w:val="000000" w:themeColor="text1"/>
           <w:sz w:val="22"/>
@@ -17787,17 +18110,93 @@
           <w:highlight w:val="none"/>
           <w:vertAlign w:val="baseline"/>
         </w:rPr>
+      </w:pPr>
+      <w:r>
+        <w:rPr>
+          <w:color w:val="000000" w:themeColor="text1"/>
+          <w:sz w:val="22"/>
+          <w:szCs w:val="22"/>
+          <w:highlight w:val="none"/>
+          <w:vertAlign w:val="baseline"/>
+        </w:rPr>
+        <w:t xml:space="preserve">To make the program more optimised, objects are not drawn if they’re offscreen, so I have made a function, offscreen(), to check if objects are out of view.</w:t>
+      </w:r>
+      <w:r>
+        <w:rPr>
+          <w:color w:val="000000" w:themeColor="text1"/>
+          <w:sz w:val="22"/>
+          <w:szCs w:val="22"/>
+          <w:highlight w:val="none"/>
+          <w:vertAlign w:val="baseline"/>
+        </w:rPr>
+      </w:r>
+    </w:p>
+    <w:p>
+      <w:pPr>
+        <w:pBdr/>
+        <w:spacing/>
+        <w:ind/>
+        <w:rPr>
+          <w:color w:val="000000" w:themeColor="text1"/>
+          <w:sz w:val="22"/>
+          <w:szCs w:val="22"/>
+          <w:highlight w:val="none"/>
+          <w:vertAlign w:val="baseline"/>
+        </w:rPr>
+      </w:pPr>
+      <w:r>
+        <w:rPr>
+          <w:color w:val="000000" w:themeColor="text1"/>
+          <w:sz w:val="22"/>
+          <w:szCs w:val="22"/>
+          <w:highlight w:val="none"/>
+          <w:vertAlign w:val="baseline"/>
+        </w:rPr>
+        <w:t xml:space="preserve">There is also a function, com(), to find the centre of mass of the system in case it’s selected. c.o.m. is an actual acronym used for the centre of mass by physicists and not something I’ve made up.</w:t>
+      </w:r>
+      <w:r>
+        <w:rPr>
+          <w:color w:val="000000" w:themeColor="text1"/>
+          <w:sz w:val="22"/>
+          <w:szCs w:val="22"/>
+          <w:highlight w:val="none"/>
+          <w:vertAlign w:val="baseline"/>
+        </w:rPr>
+      </w:r>
+    </w:p>
+    <w:p>
+      <w:pPr>
+        <w:pBdr/>
+        <w:spacing/>
+        <w:ind/>
+        <w:rPr>
+          <w:color w:val="000000" w:themeColor="text1"/>
+          <w:sz w:val="22"/>
+          <w:szCs w:val="22"/>
+          <w:highlight w:val="none"/>
+          <w:vertAlign w:val="baseline"/>
+        </w:rPr>
+      </w:pPr>
+      <w:r>
+        <w:rPr>
+          <w:color w:val="000000" w:themeColor="text1"/>
+          <w:sz w:val="22"/>
+          <w:szCs w:val="22"/>
+          <w:highlight w:val="none"/>
+          <w:vertAlign w:val="baseline"/>
+        </w:rPr>
+        <w:t xml:space="preserve">I will now go through each method individually:</w:t>
+      </w:r>
+      <w:r>
+        <w:rPr>
+          <w:color w:val="000000" w:themeColor="text1"/>
+          <w:sz w:val="22"/>
+          <w:szCs w:val="22"/>
+          <w:highlight w:val="none"/>
+          <w:vertAlign w:val="baseline"/>
+        </w:rPr>
       </w:r>
       <w:r/>
-      <w:r>
-        <w:rPr>
-          <w:color w:val="000000" w:themeColor="text1"/>
-          <w:sz w:val="22"/>
-          <w:szCs w:val="22"/>
-          <w:highlight w:val="none"/>
-          <w:vertAlign w:val="baseline"/>
-        </w:rPr>
-      </w:r>
     </w:p>
     <w:p>
       <w:pPr>
@@ -17902,6 +18301,107 @@
           <w:color w:val="4472c4" w:themeColor="accent5"/>
           <w:sz w:val="28"/>
           <w:szCs w:val="28"/>
+          <w:highlight w:val="none"/>
+          <w:vertAlign w:val="baseline"/>
+        </w:rPr>
+      </w:r>
+    </w:p>
+    <w:p>
+      <w:pPr>
+        <w:pBdr/>
+        <w:spacing/>
+        <w:ind/>
+        <w:rPr>
+          <w:color w:val="2f5496" w:themeColor="accent5" w:themeShade="BF"/>
+          <w:sz w:val="22"/>
+          <w:szCs w:val="22"/>
+          <w:highlight w:val="none"/>
+          <w:vertAlign w:val="baseline"/>
+        </w:rPr>
+      </w:pPr>
+      <w:r>
+        <w:rPr>
+          <w:color w:val="2f5696" w:themeColor="accent5" w:themeShade="BF"/>
+          <w:sz w:val="22"/>
+          <w:highlight w:val="none"/>
+          <w:vertAlign w:val="baseline"/>
+        </w:rPr>
+        <w:t xml:space="preserve">offscreen</w:t>
+      </w:r>
+      <w:r>
+        <w:rPr>
+          <w:color w:val="4472c4" w:themeColor="accent5"/>
+          <w:sz w:val="28"/>
+          <w:highlight w:val="none"/>
+          <w:vertAlign w:val="baseline"/>
+        </w:rPr>
+      </w:r>
+      <w:r>
+        <w:rPr>
+          <w:color w:val="2f5696"/>
+          <w:sz w:val="22"/>
+          <w:highlight w:val="none"/>
+          <w:vertAlign w:val="baseline"/>
+        </w:rPr>
+      </w:r>
+    </w:p>
+    <w:p>
+      <w:pPr>
+        <w:pBdr/>
+        <w:spacing/>
+        <w:ind/>
+        <w:rPr>
+          <w:color w:val="000000" w:themeColor="text1"/>
+          <w:sz w:val="22"/>
+          <w:szCs w:val="22"/>
+          <w:highlight w:val="none"/>
+          <w:vertAlign w:val="baseline"/>
+        </w:rPr>
+      </w:pPr>
+      <w:r>
+        <w:rPr>
+          <w:color w:val="000000" w:themeColor="text1"/>
+          <w:sz w:val="22"/>
+          <w:highlight w:val="none"/>
+          <w:vertAlign w:val="baseline"/>
+        </w:rPr>
+        <w:t xml:space="preserve">This is very simple. A vector is offscreen if either its x or y coordinate is less than 0 or greater than the width or height of the screen respectively. So an if statement is just used to check this, here’s pseudocode showing how:</w:t>
+      </w:r>
+      <w:r>
+        <w:rPr>
+          <w:color w:val="000000" w:themeColor="text1"/>
+          <w:sz w:val="22"/>
+          <w:szCs w:val="22"/>
+          <w:highlight w:val="none"/>
+          <w:vertAlign w:val="baseline"/>
+        </w:rPr>
+      </w:r>
+    </w:p>
+    <w:p>
+      <w:pPr>
+        <w:pBdr/>
+        <w:spacing/>
+        <w:ind/>
+        <w:rPr>
+          <w:color w:val="000000" w:themeColor="text1"/>
+          <w:sz w:val="22"/>
+          <w:szCs w:val="22"/>
+          <w:highlight w:val="none"/>
+          <w:vertAlign w:val="baseline"/>
+        </w:rPr>
+      </w:pPr>
+      <w:r>
+        <w:rPr>
+          <w:color w:val="000000" w:themeColor="text1"/>
+          <w:sz w:val="22"/>
+          <w:highlight w:val="none"/>
+          <w:vertAlign w:val="baseline"/>
+        </w:rPr>
+      </w:r>
+      <w:r>
+        <w:rPr>
+          <w:color w:val="000000" w:themeColor="text1"/>
+          <w:sz w:val="22"/>
           <w:highlight w:val="none"/>
           <w:vertAlign w:val="baseline"/>
         </w:rPr>

</xml_diff>

<commit_message>
A bit more design
</commit_message>
<xml_diff>
--- a/Design.docx
+++ b/Design.docx
@@ -12138,7 +12138,7 @@
           <w:szCs w:val="22"/>
           <w:highlight w:val="none"/>
         </w:rPr>
-        <w:t xml:space="preserve">We can also use the window that pygame just created after we made our screen to find the center of the scree</w:t>
+        <w:t xml:space="preserve">We can also use the window that pygame just created after we made our screen to find the centre of the scree</w:t>
       </w:r>
       <w:r>
         <w:rPr>
@@ -12147,7 +12147,7 @@
           <w:szCs w:val="22"/>
           <w:highlight w:val="none"/>
         </w:rPr>
-        <w:t xml:space="preserve">n, which is needed for scaledPos() to scale things accurately so that the focus is always at the center. To do this, we simply get the width and height of the window with pygame.display.get_surface().get_size(), and then divide that by 2 to ge tthe center.</w:t>
+        <w:t xml:space="preserve">n, which is needed for scaledPos() to scale things accurately so that the focus is always at the center. To do this, we simply get the width and height of the window with pygame.display.get_surface().get_size(), and then divide that by 2 to get the centre. This array will be called centre.</w:t>
       </w:r>
       <w:r>
         <w:rPr>
@@ -18394,14 +18394,269 @@
         <w:rPr>
           <w:color w:val="000000" w:themeColor="text1"/>
           <w:sz w:val="22"/>
+          <w:szCs w:val="22"/>
           <w:highlight w:val="none"/>
           <w:vertAlign w:val="baseline"/>
         </w:rPr>
       </w:r>
       <w:r>
+        <mc:AlternateContent>
+          <mc:Choice Requires="wpg">
+            <w:drawing>
+              <wp:inline xmlns:wp="http://schemas.openxmlformats.org/drawingml/2006/wordprocessingDrawing" distT="0" distB="0" distL="0" distR="0">
+                <wp:extent cx="5940425" cy="1287836"/>
+                <wp:effectExtent l="0" t="0" r="0" b="0"/>
+                <wp:docPr id="37" name=""/>
+                <wp:cNvGraphicFramePr>
+                  <a:graphicFrameLocks xmlns:a="http://schemas.openxmlformats.org/drawingml/2006/main" noChangeAspect="1"/>
+                </wp:cNvGraphicFramePr>
+                <a:graphic xmlns:a="http://schemas.openxmlformats.org/drawingml/2006/main">
+                  <a:graphicData uri="http://schemas.openxmlformats.org/drawingml/2006/picture">
+                    <pic:pic xmlns:pic="http://schemas.openxmlformats.org/drawingml/2006/picture">
+                      <pic:nvPicPr>
+                        <pic:cNvPr id="569875705" name=""/>
+                        <pic:cNvPicPr>
+                          <a:picLocks noChangeAspect="1"/>
+                        </pic:cNvPicPr>
+                        <pic:nvPr/>
+                      </pic:nvPicPr>
+                      <pic:blipFill>
+                        <a:blip r:embed="rId48"/>
+                        <a:stretch/>
+                      </pic:blipFill>
+                      <pic:spPr bwMode="auto">
+                        <a:xfrm>
+                          <a:off x="0" y="0"/>
+                          <a:ext cx="5940424" cy="1287836"/>
+                        </a:xfrm>
+                        <a:prstGeom prst="rect">
+                          <a:avLst/>
+                        </a:prstGeom>
+                      </pic:spPr>
+                    </pic:pic>
+                  </a:graphicData>
+                </a:graphic>
+              </wp:inline>
+            </w:drawing>
+          </mc:Choice>
+          <mc:Fallback>
+            <w:pict>
+              <v:shapetype id="_x0000_t75" coordsize="21600,21600" o:spt="75" o:preferrelative="t" path="m@4@5l@4@11@9@11@9@5xe" filled="f" stroked="f">
+                <v:stroke joinstyle="miter"/>
+                <v:formulas>
+                  <v:f eqn="if lineDrawn pixelLineWidth 0"/>
+                  <v:f eqn="sum @0 1 0"/>
+                  <v:f eqn="sum 0 0 @1"/>
+                  <v:f eqn="prod @2 1 2"/>
+                  <v:f eqn="prod @3 21600 pixelWidth"/>
+                  <v:f eqn="prod @3 21600 pixelHeight"/>
+                  <v:f eqn="sum @0 0 1"/>
+                  <v:f eqn="prod @6 1 2"/>
+                  <v:f eqn="prod @7 21600 pixelWidth"/>
+                  <v:f eqn="sum @8 21600 0"/>
+                  <v:f eqn="prod @7 21600 pixelHeight"/>
+                  <v:f eqn="sum @10 21600 0"/>
+                </v:formulas>
+                <v:path o:extrusionok="f" gradientshapeok="t" o:connecttype="rect"/>
+                <o:lock v:ext="edit" aspectratio="t"/>
+              </v:shapetype>
+              <v:shape id="_x0000_i36" o:spid="_x0000_s36" type="#_x0000_t75" style="width:467.75pt;height:101.40pt;mso-wrap-distance-left:0.00pt;mso-wrap-distance-top:0.00pt;mso-wrap-distance-right:0.00pt;mso-wrap-distance-bottom:0.00pt;z-index:1;" stroked="false">
+                <v:imagedata r:id="rId48" o:title=""/>
+                <o:lock v:ext="edit" rotation="t"/>
+              </v:shape>
+            </w:pict>
+          </mc:Fallback>
+        </mc:AlternateContent>
+      </w:r>
+      <w:r>
         <w:rPr>
           <w:color w:val="000000" w:themeColor="text1"/>
           <w:sz w:val="22"/>
+          <w:szCs w:val="22"/>
+          <w:highlight w:val="none"/>
+          <w:vertAlign w:val="baseline"/>
+        </w:rPr>
+      </w:r>
+      <w:r>
+        <w:rPr>
+          <w:color w:val="000000" w:themeColor="text1"/>
+          <w:sz w:val="22"/>
+          <w:szCs w:val="22"/>
+          <w:highlight w:val="none"/>
+          <w:vertAlign w:val="baseline"/>
+        </w:rPr>
+      </w:r>
+    </w:p>
+    <w:p>
+      <w:pPr>
+        <w:pBdr/>
+        <w:spacing/>
+        <w:ind/>
+        <w:rPr>
+          <w:color w:val="000000" w:themeColor="text1"/>
+          <w:sz w:val="22"/>
+          <w:szCs w:val="22"/>
+          <w:highlight w:val="none"/>
+          <w:vertAlign w:val="baseline"/>
+        </w:rPr>
+      </w:pPr>
+      <w:r>
+        <w:rPr>
+          <w:color w:val="000000" w:themeColor="text1"/>
+          <w:sz w:val="22"/>
+          <w:szCs w:val="22"/>
+          <w:highlight w:val="none"/>
+          <w:vertAlign w:val="baseline"/>
+        </w:rPr>
+      </w:r>
+      <w:r>
+        <w:rPr>
+          <w:color w:val="000000" w:themeColor="text1"/>
+          <w:sz w:val="22"/>
+          <w:szCs w:val="22"/>
+          <w:highlight w:val="none"/>
+          <w:vertAlign w:val="baseline"/>
+        </w:rPr>
+      </w:r>
+    </w:p>
+    <w:p>
+      <w:pPr>
+        <w:pBdr/>
+        <w:spacing/>
+        <w:ind/>
+        <w:rPr>
+          <w:color w:val="2f5496" w:themeColor="accent5" w:themeShade="BF"/>
+          <w:sz w:val="22"/>
+          <w:szCs w:val="22"/>
+          <w:highlight w:val="none"/>
+          <w:vertAlign w:val="baseline"/>
+        </w:rPr>
+      </w:pPr>
+      <w:r>
+        <w:rPr>
+          <w:color w:val="2f5696" w:themeColor="accent5" w:themeShade="BF"/>
+          <w:sz w:val="22"/>
+          <w:highlight w:val="none"/>
+          <w:vertAlign w:val="baseline"/>
+        </w:rPr>
+        <w:t xml:space="preserve">focusAdjustment</w:t>
+      </w:r>
+      <w:r>
+        <w:rPr>
+          <w:color w:val="000000" w:themeColor="text1"/>
+          <w:sz w:val="22"/>
+          <w:szCs w:val="22"/>
+          <w:highlight w:val="none"/>
+          <w:vertAlign w:val="baseline"/>
+        </w:rPr>
+      </w:r>
+      <w:r>
+        <w:rPr>
+          <w:color w:val="2f5496" w:themeColor="accent5" w:themeShade="BF"/>
+          <w:sz w:val="22"/>
+          <w:szCs w:val="22"/>
+          <w:highlight w:val="none"/>
+          <w:vertAlign w:val="baseline"/>
+        </w:rPr>
+      </w:r>
+    </w:p>
+    <w:p>
+      <w:pPr>
+        <w:pBdr/>
+        <w:spacing/>
+        <w:ind/>
+        <w:rPr>
+          <w:color w:val="000000" w:themeColor="text1"/>
+          <w:sz w:val="22"/>
+          <w:szCs w:val="22"/>
+          <w:highlight w:val="none"/>
+          <w:vertAlign w:val="baseline"/>
+        </w:rPr>
+      </w:pPr>
+      <w:r>
+        <w:rPr>
+          <w:color w:val="000000" w:themeColor="text1"/>
+          <w:sz w:val="22"/>
+          <w:highlight w:val="none"/>
+          <w:vertAlign w:val="baseline"/>
+        </w:rPr>
+        <w:t xml:space="preserve">This was explained earlier in the section with pseudocode.</w:t>
+      </w:r>
+      <w:r>
+        <w:rPr>
+          <w:color w:val="000000" w:themeColor="text1"/>
+          <w:sz w:val="22"/>
+          <w:highlight w:val="none"/>
+          <w:vertAlign w:val="baseline"/>
+        </w:rPr>
+      </w:r>
+    </w:p>
+    <w:p>
+      <w:pPr>
+        <w:pBdr/>
+        <w:spacing/>
+        <w:ind/>
+        <w:rPr>
+          <w:color w:val="2f5496" w:themeColor="accent5" w:themeShade="BF"/>
+          <w:sz w:val="22"/>
+          <w:szCs w:val="22"/>
+          <w:highlight w:val="none"/>
+          <w:vertAlign w:val="baseline"/>
+        </w:rPr>
+      </w:pPr>
+      <w:r>
+        <w:rPr>
+          <w:color w:val="2f5696" w:themeColor="accent5" w:themeShade="BF"/>
+          <w:sz w:val="22"/>
+          <w:highlight w:val="none"/>
+          <w:vertAlign w:val="baseline"/>
+        </w:rPr>
+        <w:t xml:space="preserve">scaledPos</w:t>
+      </w:r>
+      <w:r>
+        <w:rPr>
+          <w:color w:val="000000" w:themeColor="text1"/>
+          <w:sz w:val="22"/>
+          <w:highlight w:val="none"/>
+          <w:vertAlign w:val="baseline"/>
+        </w:rPr>
+      </w:r>
+      <w:r>
+        <w:rPr>
+          <w:color w:val="2f5496" w:themeColor="accent5" w:themeShade="BF"/>
+          <w:sz w:val="22"/>
+          <w:szCs w:val="22"/>
+          <w:highlight w:val="none"/>
+          <w:vertAlign w:val="baseline"/>
+        </w:rPr>
+      </w:r>
+    </w:p>
+    <w:p>
+      <w:pPr>
+        <w:pBdr/>
+        <w:spacing/>
+        <w:ind/>
+        <w:rPr>
+          <w:color w:val="000000" w:themeColor="text1"/>
+          <w:sz w:val="22"/>
+          <w:szCs w:val="22"/>
+          <w:highlight w:val="none"/>
+          <w:vertAlign w:val="baseline"/>
+        </w:rPr>
+      </w:pPr>
+      <w:r>
+        <w:rPr>
+          <w:color w:val="000000" w:themeColor="text1"/>
+          <w:sz w:val="22"/>
+          <w:highlight w:val="none"/>
+          <w:vertAlign w:val="baseline"/>
+        </w:rPr>
+      </w:r>
+      <w:r>
+        <w:rPr>
+          <w:color w:val="000000" w:themeColor="text1"/>
+          <w:sz w:val="22"/>
+          <w:szCs w:val="22"/>
           <w:highlight w:val="none"/>
           <w:vertAlign w:val="baseline"/>
         </w:rPr>
@@ -18703,7 +18958,7 @@
               <wp:inline xmlns:wp="http://schemas.openxmlformats.org/drawingml/2006/wordprocessingDrawing" distT="0" distB="0" distL="0" distR="0">
                 <wp:extent cx="5940425" cy="868688"/>
                 <wp:effectExtent l="0" t="0" r="0" b="0"/>
-                <wp:docPr id="37" name="" hidden="0"/>
+                <wp:docPr id="38" name="" hidden="0"/>
                 <wp:cNvGraphicFramePr>
                   <a:graphicFrameLocks xmlns:a="http://schemas.openxmlformats.org/drawingml/2006/main" noChangeAspect="1"/>
                 </wp:cNvGraphicFramePr>
@@ -18718,7 +18973,7 @@
                         <pic:nvPr isPhoto="0" userDrawn="0"/>
                       </pic:nvPicPr>
                       <pic:blipFill>
-                        <a:blip r:embed="rId48"/>
+                        <a:blip r:embed="rId49"/>
                         <a:stretch/>
                       </pic:blipFill>
                       <pic:spPr bwMode="auto">
@@ -18757,8 +19012,8 @@
                 <v:path o:extrusionok="f" gradientshapeok="t" o:connecttype="rect"/>
                 <o:lock v:ext="edit" aspectratio="t"/>
               </v:shapetype>
-              <v:shape id="_x0000_i36" o:spid="_x0000_s36" type="#_x0000_t75" style="width:467.75pt;height:68.40pt;mso-wrap-distance-left:0.00pt;mso-wrap-distance-top:0.00pt;mso-wrap-distance-right:0.00pt;mso-wrap-distance-bottom:0.00pt;z-index:1;" stroked="false">
-                <v:imagedata r:id="rId48" o:title=""/>
+              <v:shape id="_x0000_i37" o:spid="_x0000_s37" type="#_x0000_t75" style="width:467.75pt;height:68.40pt;mso-wrap-distance-left:0.00pt;mso-wrap-distance-top:0.00pt;mso-wrap-distance-right:0.00pt;mso-wrap-distance-bottom:0.00pt;z-index:1;" stroked="false">
+                <v:imagedata r:id="rId49" o:title=""/>
                 <o:lock v:ext="edit" rotation="t"/>
               </v:shape>
             </w:pict>
@@ -18930,7 +19185,7 @@
               <wp:inline xmlns:wp="http://schemas.openxmlformats.org/drawingml/2006/wordprocessingDrawing" distT="0" distB="0" distL="0" distR="0">
                 <wp:extent cx="4543425" cy="428625"/>
                 <wp:effectExtent l="0" t="0" r="0" b="0"/>
-                <wp:docPr id="38" name="" hidden="0"/>
+                <wp:docPr id="39" name="" hidden="0"/>
                 <wp:cNvGraphicFramePr>
                   <a:graphicFrameLocks xmlns:a="http://schemas.openxmlformats.org/drawingml/2006/main" noChangeAspect="1"/>
                 </wp:cNvGraphicFramePr>
@@ -18945,7 +19200,7 @@
                         <pic:nvPr isPhoto="0" userDrawn="0"/>
                       </pic:nvPicPr>
                       <pic:blipFill>
-                        <a:blip r:embed="rId49"/>
+                        <a:blip r:embed="rId50"/>
                         <a:stretch/>
                       </pic:blipFill>
                       <pic:spPr bwMode="auto">
@@ -18984,8 +19239,8 @@
                 <v:path o:extrusionok="f" gradientshapeok="t" o:connecttype="rect"/>
                 <o:lock v:ext="edit" aspectratio="t"/>
               </v:shapetype>
-              <v:shape id="_x0000_i37" o:spid="_x0000_s37" type="#_x0000_t75" style="width:357.75pt;height:33.75pt;mso-wrap-distance-left:0.00pt;mso-wrap-distance-top:0.00pt;mso-wrap-distance-right:0.00pt;mso-wrap-distance-bottom:0.00pt;z-index:1;" stroked="false">
-                <v:imagedata r:id="rId49" o:title=""/>
+              <v:shape id="_x0000_i38" o:spid="_x0000_s38" type="#_x0000_t75" style="width:357.75pt;height:33.75pt;mso-wrap-distance-left:0.00pt;mso-wrap-distance-top:0.00pt;mso-wrap-distance-right:0.00pt;mso-wrap-distance-bottom:0.00pt;z-index:1;" stroked="false">
+                <v:imagedata r:id="rId50" o:title=""/>
                 <o:lock v:ext="edit" rotation="t"/>
               </v:shape>
             </w:pict>
@@ -19144,7 +19399,7 @@
               <wp:inline xmlns:wp="http://schemas.openxmlformats.org/drawingml/2006/wordprocessingDrawing" distT="0" distB="0" distL="0" distR="0">
                 <wp:extent cx="4791075" cy="2200275"/>
                 <wp:effectExtent l="0" t="0" r="0" b="0"/>
-                <wp:docPr id="39" name="" hidden="0"/>
+                <wp:docPr id="40" name="" hidden="0"/>
                 <wp:cNvGraphicFramePr>
                   <a:graphicFrameLocks xmlns:a="http://schemas.openxmlformats.org/drawingml/2006/main" noChangeAspect="1"/>
                 </wp:cNvGraphicFramePr>
@@ -19159,7 +19414,7 @@
                         <pic:nvPr isPhoto="0" userDrawn="0"/>
                       </pic:nvPicPr>
                       <pic:blipFill>
-                        <a:blip r:embed="rId50"/>
+                        <a:blip r:embed="rId51"/>
                         <a:stretch/>
                       </pic:blipFill>
                       <pic:spPr bwMode="auto">
@@ -19198,8 +19453,8 @@
                 <v:path o:extrusionok="f" gradientshapeok="t" o:connecttype="rect"/>
                 <o:lock v:ext="edit" aspectratio="t"/>
               </v:shapetype>
-              <v:shape id="_x0000_i38" o:spid="_x0000_s38" type="#_x0000_t75" style="width:377.25pt;height:173.25pt;mso-wrap-distance-left:0.00pt;mso-wrap-distance-top:0.00pt;mso-wrap-distance-right:0.00pt;mso-wrap-distance-bottom:0.00pt;z-index:1;" stroked="false">
-                <v:imagedata r:id="rId50" o:title=""/>
+              <v:shape id="_x0000_i39" o:spid="_x0000_s39" type="#_x0000_t75" style="width:377.25pt;height:173.25pt;mso-wrap-distance-left:0.00pt;mso-wrap-distance-top:0.00pt;mso-wrap-distance-right:0.00pt;mso-wrap-distance-bottom:0.00pt;z-index:1;" stroked="false">
+                <v:imagedata r:id="rId51" o:title=""/>
                 <o:lock v:ext="edit" rotation="t"/>
               </v:shape>
             </w:pict>
@@ -19458,7 +19713,7 @@
               <wp:inline xmlns:wp="http://schemas.openxmlformats.org/drawingml/2006/wordprocessingDrawing" distT="0" distB="0" distL="0" distR="0">
                 <wp:extent cx="4010025" cy="314325"/>
                 <wp:effectExtent l="0" t="0" r="0" b="0"/>
-                <wp:docPr id="40" name="" hidden="0"/>
+                <wp:docPr id="41" name="" hidden="0"/>
                 <wp:cNvGraphicFramePr>
                   <a:graphicFrameLocks xmlns:a="http://schemas.openxmlformats.org/drawingml/2006/main" noChangeAspect="1"/>
                 </wp:cNvGraphicFramePr>
@@ -19473,7 +19728,7 @@
                         <pic:nvPr isPhoto="0" userDrawn="0"/>
                       </pic:nvPicPr>
                       <pic:blipFill>
-                        <a:blip r:embed="rId51"/>
+                        <a:blip r:embed="rId52"/>
                         <a:stretch/>
                       </pic:blipFill>
                       <pic:spPr bwMode="auto">
@@ -19512,8 +19767,8 @@
                 <v:path o:extrusionok="f" gradientshapeok="t" o:connecttype="rect"/>
                 <o:lock v:ext="edit" aspectratio="t"/>
               </v:shapetype>
-              <v:shape id="_x0000_i39" o:spid="_x0000_s39" type="#_x0000_t75" style="width:315.75pt;height:24.75pt;mso-wrap-distance-left:0.00pt;mso-wrap-distance-top:0.00pt;mso-wrap-distance-right:0.00pt;mso-wrap-distance-bottom:0.00pt;z-index:1;" stroked="false">
-                <v:imagedata r:id="rId51" o:title=""/>
+              <v:shape id="_x0000_i40" o:spid="_x0000_s40" type="#_x0000_t75" style="width:315.75pt;height:24.75pt;mso-wrap-distance-left:0.00pt;mso-wrap-distance-top:0.00pt;mso-wrap-distance-right:0.00pt;mso-wrap-distance-bottom:0.00pt;z-index:1;" stroked="false">
+                <v:imagedata r:id="rId52" o:title=""/>
                 <o:lock v:ext="edit" rotation="t"/>
               </v:shape>
             </w:pict>

</xml_diff>

<commit_message>
Yet another bit more design.
</commit_message>
<xml_diff>
--- a/Design.docx
+++ b/Design.docx
@@ -1020,7 +1020,7 @@
       <w:hyperlink r:id="rId11" w:tooltip="https://ssd.jpl.nasa.gov/api/horizons.api?format=text&amp;COMMAND='&quot;+target+&quot;'&amp;OBJ_DATA='YES'&amp;MAKE_EPHEM='YES'&amp;EPHEM_TYPE='VECTORS'&amp;START_TIME='&quot;+startTime+&quot;'&amp;STOP_TIME='&quot;+stopTime+&quot;'&amp;CENTER='500@0'&amp;STEP_SIZE='1 d'&amp;QUANTITIES='1,9,20,23,24,29'" w:history="1">
         <w:r>
           <w:rPr>
-            <w:rStyle w:val="883"/>
+            <w:rStyle w:val="840"/>
             <w:color w:val="000000" w:themeColor="text1"/>
             <w:sz w:val="22"/>
             <w:szCs w:val="18"/>
@@ -1030,7 +1030,7 @@
         </w:r>
         <w:r>
           <w:rPr>
-            <w:rStyle w:val="883"/>
+            <w:rStyle w:val="840"/>
             <w:color w:val="000000" w:themeColor="text1"/>
             <w:sz w:val="22"/>
             <w:szCs w:val="18"/>
@@ -1039,7 +1039,7 @@
         </w:r>
         <w:r>
           <w:rPr>
-            <w:rStyle w:val="883"/>
+            <w:rStyle w:val="840"/>
             <w:color w:val="000000" w:themeColor="text1"/>
             <w:sz w:val="22"/>
             <w:szCs w:val="18"/>
@@ -1180,7 +1180,7 @@
       <w:hyperlink r:id="rId12" w:tooltip="https://ssd-api.jpl.nasa.gov/doc/horizons.html#ephem_type" w:history="1">
         <w:r>
           <w:rPr>
-            <w:rStyle w:val="883"/>
+            <w:rStyle w:val="840"/>
             <w:color w:val="000000" w:themeColor="text1"/>
             <w:sz w:val="22"/>
             <w:szCs w:val="22"/>
@@ -1190,7 +1190,7 @@
         </w:r>
         <w:r>
           <w:rPr>
-            <w:rStyle w:val="883"/>
+            <w:rStyle w:val="840"/>
             <w:color w:val="000000" w:themeColor="text1"/>
             <w:sz w:val="22"/>
             <w:szCs w:val="22"/>
@@ -1199,7 +1199,7 @@
         </w:r>
         <w:r>
           <w:rPr>
-            <w:rStyle w:val="883"/>
+            <w:rStyle w:val="840"/>
             <w:color w:val="000000" w:themeColor="text1"/>
             <w:sz w:val="22"/>
             <w:szCs w:val="22"/>
@@ -2691,7 +2691,7 @@
     </w:p>
     <w:p>
       <w:pPr>
-        <w:pStyle w:val="905"/>
+        <w:pStyle w:val="862"/>
         <w:numPr>
           <w:ilvl w:val="0"/>
           <w:numId w:val="2"/>
@@ -2734,7 +2734,7 @@
     </w:p>
     <w:p>
       <w:pPr>
-        <w:pStyle w:val="905"/>
+        <w:pStyle w:val="862"/>
         <w:numPr>
           <w:ilvl w:val="0"/>
           <w:numId w:val="2"/>
@@ -4306,7 +4306,7 @@
     </w:p>
     <w:p>
       <w:pPr>
-        <w:pStyle w:val="905"/>
+        <w:pStyle w:val="862"/>
         <w:numPr>
           <w:ilvl w:val="0"/>
           <w:numId w:val="1"/>
@@ -4349,7 +4349,7 @@
     </w:p>
     <w:p>
       <w:pPr>
-        <w:pStyle w:val="905"/>
+        <w:pStyle w:val="862"/>
         <w:numPr>
           <w:ilvl w:val="0"/>
           <w:numId w:val="1"/>
@@ -4392,7 +4392,7 @@
     </w:p>
     <w:p>
       <w:pPr>
-        <w:pStyle w:val="905"/>
+        <w:pStyle w:val="862"/>
         <w:numPr>
           <w:ilvl w:val="0"/>
           <w:numId w:val="1"/>
@@ -5299,7 +5299,7 @@
     </w:p>
     <w:tbl>
       <w:tblPr>
-        <w:tblStyle w:val="757"/>
+        <w:tblStyle w:val="714"/>
         <w:tblW w:w="0" w:type="auto"/>
         <w:tblBorders/>
         <w:tblLook w:val="04A0" w:firstRow="1" w:lastRow="0" w:firstColumn="1" w:lastColumn="0" w:noHBand="0" w:noVBand="1"/>
@@ -5568,6 +5568,14 @@
                 <w:highlight w:val="none"/>
               </w:rPr>
             </w:r>
+            <w:r>
+              <w:rPr>
+                <w:color w:val="000000"/>
+                <w:sz w:val="22"/>
+                <w:szCs w:val="22"/>
+                <w:highlight w:val="none"/>
+              </w:rPr>
+            </w:r>
           </w:p>
         </w:tc>
         <w:tc>
@@ -5598,6 +5606,14 @@
                 <w:highlight w:val="none"/>
               </w:rPr>
               <w:t xml:space="preserve">integer</w:t>
+            </w:r>
+            <w:r>
+              <w:rPr>
+                <w:color w:val="000000"/>
+                <w:sz w:val="22"/>
+                <w:szCs w:val="22"/>
+                <w:highlight w:val="none"/>
+              </w:rPr>
             </w:r>
             <w:r>
               <w:rPr>
@@ -5646,6 +5662,14 @@
                 <w:highlight w:val="none"/>
               </w:rPr>
             </w:r>
+            <w:r>
+              <w:rPr>
+                <w:color w:val="000000"/>
+                <w:sz w:val="22"/>
+                <w:szCs w:val="22"/>
+                <w:highlight w:val="none"/>
+              </w:rPr>
+            </w:r>
           </w:p>
         </w:tc>
         <w:tc>
@@ -5676,6 +5700,14 @@
                 <w:highlight w:val="none"/>
               </w:rPr>
               <w:t xml:space="preserve">x and y are mapped to 0 and 1 respectively for indexing purposes, this means if I want the x component of a vector I just need to write vector[x], which makes the program a lot more readable.</w:t>
+            </w:r>
+            <w:r>
+              <w:rPr>
+                <w:color w:val="000000"/>
+                <w:sz w:val="22"/>
+                <w:szCs w:val="22"/>
+                <w:highlight w:val="none"/>
+              </w:rPr>
             </w:r>
             <w:r>
               <w:rPr>
@@ -5727,6 +5759,14 @@
                 <w:highlight w:val="none"/>
               </w:rPr>
             </w:r>
+            <w:r>
+              <w:rPr>
+                <w:color w:val="000000"/>
+                <w:sz w:val="22"/>
+                <w:szCs w:val="22"/>
+                <w:highlight w:val="none"/>
+              </w:rPr>
+            </w:r>
           </w:p>
         </w:tc>
         <w:tc>
@@ -5757,6 +5797,14 @@
                 <w:highlight w:val="none"/>
               </w:rPr>
               <w:t xml:space="preserve">integer</w:t>
+            </w:r>
+            <w:r>
+              <w:rPr>
+                <w:color w:val="000000"/>
+                <w:sz w:val="22"/>
+                <w:szCs w:val="22"/>
+                <w:highlight w:val="none"/>
+              </w:rPr>
             </w:r>
             <w:r>
               <w:rPr>
@@ -5805,6 +5853,14 @@
                 <w:highlight w:val="none"/>
               </w:rPr>
             </w:r>
+            <w:r>
+              <w:rPr>
+                <w:color w:val="000000"/>
+                <w:sz w:val="22"/>
+                <w:szCs w:val="22"/>
+                <w:highlight w:val="none"/>
+              </w:rPr>
+            </w:r>
           </w:p>
         </w:tc>
         <w:tc>
@@ -5835,6 +5891,14 @@
                 <w:highlight w:val="none"/>
               </w:rPr>
               <w:t xml:space="preserve">See above description.</w:t>
+            </w:r>
+            <w:r>
+              <w:rPr>
+                <w:color w:val="000000"/>
+                <w:sz w:val="22"/>
+                <w:szCs w:val="22"/>
+                <w:highlight w:val="none"/>
+              </w:rPr>
             </w:r>
             <w:r>
               <w:rPr>
@@ -8260,7 +8324,7 @@
     </w:p>
     <w:p>
       <w:pPr>
-        <w:pStyle w:val="905"/>
+        <w:pStyle w:val="862"/>
         <w:numPr>
           <w:ilvl w:val="0"/>
           <w:numId w:val="4"/>
@@ -8303,7 +8367,7 @@
     </w:p>
     <w:p>
       <w:pPr>
-        <w:pStyle w:val="905"/>
+        <w:pStyle w:val="862"/>
         <w:numPr>
           <w:ilvl w:val="0"/>
           <w:numId w:val="4"/>
@@ -8346,7 +8410,7 @@
     </w:p>
     <w:p>
       <w:pPr>
-        <w:pStyle w:val="905"/>
+        <w:pStyle w:val="862"/>
         <w:numPr>
           <w:ilvl w:val="0"/>
           <w:numId w:val="4"/>
@@ -8389,7 +8453,7 @@
     </w:p>
     <w:p>
       <w:pPr>
-        <w:pStyle w:val="905"/>
+        <w:pStyle w:val="862"/>
         <w:numPr>
           <w:ilvl w:val="0"/>
           <w:numId w:val="4"/>
@@ -8432,7 +8496,7 @@
     </w:p>
     <w:p>
       <w:pPr>
-        <w:pStyle w:val="905"/>
+        <w:pStyle w:val="862"/>
         <w:numPr>
           <w:ilvl w:val="0"/>
           <w:numId w:val="4"/>
@@ -12147,7 +12211,16 @@
           <w:szCs w:val="22"/>
           <w:highlight w:val="none"/>
         </w:rPr>
-        <w:t xml:space="preserve">n, which is needed for scaledPos() to scale things accurately so that the focus is always at the center. To do this, we simply get the width and height of the window with pygame.display.get_surface().get_size(), and then divide that by 2 to get the centre. This array will be called centre.</w:t>
+        <w:t xml:space="preserve">n, which is needed for scaledPos()</w:t>
+      </w:r>
+      <w:r>
+        <w:rPr>
+          <w:color w:val="000000"/>
+          <w:sz w:val="22"/>
+          <w:szCs w:val="22"/>
+          <w:highlight w:val="none"/>
+        </w:rPr>
+        <w:t xml:space="preserve"> to scale things accurately so that the focus is always at the center. To do this, we simply get the width and height of the window with pygame.display.get_surface().get_size(), and then divide that by 2 to get the centre. This array will be called centre.</w:t>
       </w:r>
       <w:r>
         <w:rPr>
@@ -17657,7 +17730,7 @@
         <w:rPr>
           <w:color w:val="auto"/>
           <w:sz w:val="22"/>
-          <w:szCs w:val="24"/>
+          <w:szCs w:val="22"/>
           <w:highlight w:val="none"/>
           <w:vertAlign w:val="baseline"/>
         </w:rPr>
@@ -18076,7 +18149,7 @@
           <w:highlight w:val="none"/>
           <w:vertAlign w:val="baseline"/>
         </w:rPr>
-        <w:t xml:space="preserve">entirely inside the object. Drawing paths after the planets lets that path still be visible. Likewise with arrows, for very small forces the arrow is contained entirely within the planet. Drawing the arrow after drawing the planet lets it still be visible. </w:t>
+        <w:t xml:space="preserve">e</w:t>
       </w:r>
       <w:r>
         <w:rPr>
@@ -18086,7 +18159,26 @@
           <w:highlight w:val="none"/>
           <w:vertAlign w:val="baseline"/>
         </w:rPr>
+        <w:t xml:space="preserve">ntirely inside the object. Drawing paths after the planets lets that path still be visible. Likewise with arrows, for very small forces the arrow is contained entirely within the planet. Drawing the arrow after drawing the planet lets it still be visible. </w:t>
+      </w:r>
+      <w:r>
+        <w:rPr>
+          <w:color w:val="000000" w:themeColor="text1"/>
+          <w:sz w:val="22"/>
+          <w:szCs w:val="22"/>
+          <w:highlight w:val="none"/>
+          <w:vertAlign w:val="baseline"/>
+        </w:rPr>
         <w:t xml:space="preserve">Finally the menu is displayed, the text should be visible above everything else which is why the menu is the last part to be shown. </w:t>
+      </w:r>
+      <w:r>
+        <w:rPr>
+          <w:color w:val="000000" w:themeColor="text1"/>
+          <w:sz w:val="22"/>
+          <w:szCs w:val="22"/>
+          <w:highlight w:val="none"/>
+          <w:vertAlign w:val="baseline"/>
+        </w:rPr>
       </w:r>
       <w:r>
         <w:rPr>
@@ -18130,6 +18222,15 @@
           <w:vertAlign w:val="baseline"/>
         </w:rPr>
       </w:r>
+      <w:r>
+        <w:rPr>
+          <w:color w:val="000000" w:themeColor="text1"/>
+          <w:sz w:val="22"/>
+          <w:szCs w:val="22"/>
+          <w:highlight w:val="none"/>
+          <w:vertAlign w:val="baseline"/>
+        </w:rPr>
+      </w:r>
     </w:p>
     <w:p>
       <w:pPr>
@@ -18152,7 +18253,7 @@
           <w:highlight w:val="none"/>
           <w:vertAlign w:val="baseline"/>
         </w:rPr>
-        <w:t xml:space="preserve">There is also a function, com(), to find the centre of mass of the system in case it’s selected. c.o.m. is an actual acronym used for the centre of mass by physicists and not something I’ve made up.</w:t>
+        <w:t xml:space="preserve">I will now go through each method individually.</w:t>
       </w:r>
       <w:r>
         <w:rPr>
@@ -18163,12 +18264,7 @@
           <w:vertAlign w:val="baseline"/>
         </w:rPr>
       </w:r>
-    </w:p>
-    <w:p>
-      <w:pPr>
-        <w:pBdr/>
-        <w:spacing/>
-        <w:ind/>
+      <w:r>
         <w:rPr>
           <w:color w:val="000000" w:themeColor="text1"/>
           <w:sz w:val="22"/>
@@ -18176,7 +18272,7 @@
           <w:highlight w:val="none"/>
           <w:vertAlign w:val="baseline"/>
         </w:rPr>
-      </w:pPr>
+      </w:r>
       <w:r>
         <w:rPr>
           <w:color w:val="000000" w:themeColor="text1"/>
@@ -18185,7 +18281,6 @@
           <w:highlight w:val="none"/>
           <w:vertAlign w:val="baseline"/>
         </w:rPr>
-        <w:t xml:space="preserve">I will now go through each method individually:</w:t>
       </w:r>
       <w:r>
         <w:rPr>
@@ -18196,21 +18291,6 @@
           <w:vertAlign w:val="baseline"/>
         </w:rPr>
       </w:r>
-      <w:r/>
-    </w:p>
-    <w:p>
-      <w:pPr>
-        <w:pBdr/>
-        <w:spacing/>
-        <w:ind/>
-        <w:rPr>
-          <w:color w:val="000000" w:themeColor="text1"/>
-          <w:sz w:val="22"/>
-          <w:szCs w:val="22"/>
-          <w:highlight w:val="none"/>
-          <w:vertAlign w:val="baseline"/>
-        </w:rPr>
-      </w:pPr>
       <w:r>
         <w:rPr>
           <w:color w:val="000000" w:themeColor="text1"/>
@@ -18278,33 +18358,6 @@
           <w:vertAlign w:val="baseline"/>
         </w:rPr>
       </w:r>
-      <w:r>
-        <w:rPr>
-          <w:color w:val="000000" w:themeColor="text1"/>
-          <w:sz w:val="22"/>
-          <w:szCs w:val="22"/>
-          <w:highlight w:val="none"/>
-          <w:vertAlign w:val="baseline"/>
-        </w:rPr>
-      </w:r>
-      <w:r>
-        <w:rPr>
-          <w:color w:val="000000" w:themeColor="text1"/>
-          <w:sz w:val="22"/>
-          <w:szCs w:val="22"/>
-          <w:highlight w:val="none"/>
-          <w:vertAlign w:val="baseline"/>
-        </w:rPr>
-      </w:r>
-      <w:r>
-        <w:rPr>
-          <w:color w:val="4472c4" w:themeColor="accent5"/>
-          <w:sz w:val="28"/>
-          <w:szCs w:val="28"/>
-          <w:highlight w:val="none"/>
-          <w:vertAlign w:val="baseline"/>
-        </w:rPr>
-      </w:r>
     </w:p>
     <w:p>
       <w:pPr>
@@ -18330,16 +18383,17 @@
       </w:r>
       <w:r>
         <w:rPr>
-          <w:color w:val="4472c4" w:themeColor="accent5"/>
-          <w:sz w:val="28"/>
+          <w:color w:val="2f5696"/>
+          <w:sz w:val="22"/>
           <w:highlight w:val="none"/>
           <w:vertAlign w:val="baseline"/>
         </w:rPr>
       </w:r>
       <w:r>
         <w:rPr>
-          <w:color w:val="2f5696"/>
-          <w:sz w:val="22"/>
+          <w:color w:val="2f5496" w:themeColor="accent5" w:themeShade="BF"/>
+          <w:sz w:val="22"/>
+          <w:szCs w:val="22"/>
           <w:highlight w:val="none"/>
           <w:vertAlign w:val="baseline"/>
         </w:rPr>
@@ -18366,6 +18420,15 @@
           <w:vertAlign w:val="baseline"/>
         </w:rPr>
         <w:t xml:space="preserve">This is very simple. A vector is offscreen if either its x or y coordinate is less than 0 or greater than the width or height of the screen respectively. So an if statement is just used to check this, here’s pseudocode showing how:</w:t>
+      </w:r>
+      <w:r>
+        <w:rPr>
+          <w:color w:val="000000" w:themeColor="text1"/>
+          <w:sz w:val="22"/>
+          <w:szCs w:val="22"/>
+          <w:highlight w:val="none"/>
+          <w:vertAlign w:val="baseline"/>
+        </w:rPr>
       </w:r>
       <w:r>
         <w:rPr>
@@ -18518,6 +18581,15 @@
           <w:vertAlign w:val="baseline"/>
         </w:rPr>
       </w:r>
+      <w:r>
+        <w:rPr>
+          <w:color w:val="000000" w:themeColor="text1"/>
+          <w:sz w:val="22"/>
+          <w:szCs w:val="22"/>
+          <w:highlight w:val="none"/>
+          <w:vertAlign w:val="baseline"/>
+        </w:rPr>
+      </w:r>
     </w:p>
     <w:p>
       <w:pPr>
@@ -18543,7 +18615,7 @@
       </w:r>
       <w:r>
         <w:rPr>
-          <w:color w:val="000000" w:themeColor="text1"/>
+          <w:color w:val="2f5496" w:themeColor="accent5" w:themeShade="BF"/>
           <w:sz w:val="22"/>
           <w:szCs w:val="22"/>
           <w:highlight w:val="none"/>
@@ -18590,6 +18662,15 @@
           <w:vertAlign w:val="baseline"/>
         </w:rPr>
       </w:r>
+      <w:r>
+        <w:rPr>
+          <w:color w:val="000000" w:themeColor="text1"/>
+          <w:sz w:val="22"/>
+          <w:szCs w:val="22"/>
+          <w:highlight w:val="none"/>
+          <w:vertAlign w:val="baseline"/>
+        </w:rPr>
+      </w:r>
     </w:p>
     <w:p>
       <w:pPr>
@@ -18597,7 +18678,7 @@
         <w:spacing/>
         <w:ind/>
         <w:rPr>
-          <w:color w:val="2f5496" w:themeColor="accent5" w:themeShade="BF"/>
+          <w:color w:val="000000" w:themeColor="text1"/>
           <w:sz w:val="22"/>
           <w:szCs w:val="22"/>
           <w:highlight w:val="none"/>
@@ -18606,26 +18687,16 @@
       </w:pPr>
       <w:r>
         <w:rPr>
-          <w:color w:val="2f5696" w:themeColor="accent5" w:themeShade="BF"/>
+          <w:color w:val="000000" w:themeColor="text1"/>
           <w:sz w:val="22"/>
           <w:highlight w:val="none"/>
           <w:vertAlign w:val="baseline"/>
         </w:rPr>
-        <w:t xml:space="preserve">scaledPos</w:t>
-      </w:r>
-      <w:r>
-        <w:rPr>
-          <w:color w:val="000000" w:themeColor="text1"/>
-          <w:sz w:val="22"/>
-          <w:highlight w:val="none"/>
-          <w:vertAlign w:val="baseline"/>
-        </w:rPr>
-      </w:r>
-      <w:r>
-        <w:rPr>
-          <w:color w:val="2f5496" w:themeColor="accent5" w:themeShade="BF"/>
-          <w:sz w:val="22"/>
-          <w:szCs w:val="22"/>
+      </w:r>
+      <w:r>
+        <w:rPr>
+          <w:color w:val="000000" w:themeColor="text1"/>
+          <w:sz w:val="22"/>
           <w:highlight w:val="none"/>
           <w:vertAlign w:val="baseline"/>
         </w:rPr>
@@ -18637,7 +18708,7 @@
         <w:spacing/>
         <w:ind/>
         <w:rPr>
-          <w:color w:val="000000" w:themeColor="text1"/>
+          <w:color w:val="2f5496" w:themeColor="accent5" w:themeShade="BF"/>
           <w:sz w:val="22"/>
           <w:szCs w:val="22"/>
           <w:highlight w:val="none"/>
@@ -18646,15 +18717,25 @@
       </w:pPr>
       <w:r>
         <w:rPr>
-          <w:color w:val="000000" w:themeColor="text1"/>
+          <w:color w:val="2f5696" w:themeColor="accent5" w:themeShade="BF"/>
           <w:sz w:val="22"/>
           <w:highlight w:val="none"/>
           <w:vertAlign w:val="baseline"/>
         </w:rPr>
-      </w:r>
-      <w:r>
-        <w:rPr>
-          <w:color w:val="000000" w:themeColor="text1"/>
+        <w:t xml:space="preserve">scaledPos</w:t>
+      </w:r>
+      <w:r>
+        <w:rPr>
+          <w:color w:val="2f5496" w:themeColor="accent5" w:themeShade="BF"/>
+          <w:sz w:val="22"/>
+          <w:szCs w:val="22"/>
+          <w:highlight w:val="none"/>
+          <w:vertAlign w:val="baseline"/>
+        </w:rPr>
+      </w:r>
+      <w:r>
+        <w:rPr>
+          <w:color w:val="2f5496" w:themeColor="accent5" w:themeShade="BF"/>
           <w:sz w:val="22"/>
           <w:szCs w:val="22"/>
           <w:highlight w:val="none"/>
@@ -18668,33 +18749,36 @@
         <w:spacing/>
         <w:ind/>
         <w:rPr>
-          <w:color w:val="2f5696"/>
-          <w:sz w:val="22"/>
+          <w:color w:val="000000" w:themeColor="text1"/>
+          <w:sz w:val="22"/>
+          <w:szCs w:val="22"/>
           <w:highlight w:val="none"/>
           <w:vertAlign w:val="baseline"/>
         </w:rPr>
       </w:pPr>
       <w:r>
         <w:rPr>
-          <w:color w:val="2f5696" w:themeColor="accent5" w:themeShade="BF"/>
+          <w:color w:val="000000" w:themeColor="text1"/>
           <w:sz w:val="22"/>
           <w:highlight w:val="none"/>
           <w:vertAlign w:val="baseline"/>
         </w:rPr>
-        <w:t xml:space="preserve">displayPlanets and drawPlanet</w:t>
-      </w:r>
-      <w:r>
-        <w:rPr>
-          <w:color w:val="4472c4" w:themeColor="accent5"/>
-          <w:sz w:val="28"/>
+        <w:t xml:space="preserve">Very simple, literally just multiplies the input by distConst, here is the pseudocode:</w:t>
+      </w:r>
+      <w:r>
+        <w:rPr>
+          <w:color w:val="000000" w:themeColor="text1"/>
+          <w:sz w:val="22"/>
+          <w:szCs w:val="22"/>
           <w:highlight w:val="none"/>
           <w:vertAlign w:val="baseline"/>
         </w:rPr>
       </w:r>
       <w:r>
         <w:rPr>
-          <w:color w:val="2f5696"/>
-          <w:sz w:val="22"/>
+          <w:color w:val="000000" w:themeColor="text1"/>
+          <w:sz w:val="22"/>
+          <w:szCs w:val="22"/>
           <w:highlight w:val="none"/>
           <w:vertAlign w:val="baseline"/>
         </w:rPr>
@@ -18706,247 +18790,13 @@
         <w:spacing/>
         <w:ind/>
         <w:rPr>
-          <w:color w:val="000000" w:themeColor="text1"/>
-          <w:sz w:val="22"/>
-          <w:szCs w:val="22"/>
-          <w:highlight w:val="none"/>
-          <w:vertAlign w:val="baseline"/>
-        </w:rPr>
-      </w:pPr>
-      <w:r>
-        <w:rPr>
-          <w:color w:val="000000" w:themeColor="text1"/>
-          <w:sz w:val="22"/>
-          <w:szCs w:val="22"/>
-          <w:highlight w:val="none"/>
-          <w:vertAlign w:val="baseline"/>
-        </w:rPr>
-        <w:t xml:space="preserve">Drawing the planets is done with displayPlanets which runs a for loop iterating over the list planets and uses a method, drawPlanet() to display each one. It only runs drawPlanet() if the planet would be visible to save on resources, n</w:t>
-      </w:r>
-      <w:r>
-        <w:rPr>
-          <w:color w:val="000000" w:themeColor="text1"/>
-          <w:sz w:val="22"/>
-          <w:szCs w:val="22"/>
-          <w:highlight w:val="none"/>
-          <w:vertAlign w:val="baseline"/>
-        </w:rPr>
-        <w:t xml:space="preserve">o point drawing planets offscreen. drawPlanet() uses pygame.draw.circle() along with the attributes of the planet to draw the planet. It draws a circle of size distConst*p.getSize(), with the colour returned by p.getColour(), and at the position p.getScaledPos()+adjustment.</w:t>
-      </w:r>
-      <w:r>
-        <w:rPr>
-          <w:color w:val="auto"/>
-          <w:sz w:val="22"/>
-          <w:szCs w:val="22"/>
-          <w:highlight w:val="none"/>
-          <w:vertAlign w:val="baseline"/>
-        </w:rPr>
-      </w:r>
-      <w:r>
-        <w:rPr>
-          <w:color w:val="000000" w:themeColor="text1"/>
-          <w:sz w:val="22"/>
-          <w:szCs w:val="22"/>
-          <w:highlight w:val="none"/>
-          <w:vertAlign w:val="baseline"/>
-        </w:rPr>
-      </w:r>
-    </w:p>
-    <w:p>
-      <w:pPr>
-        <w:pBdr/>
-        <w:spacing/>
-        <w:ind/>
-        <w:rPr>
-          <w:color w:val="2f5696"/>
-          <w:sz w:val="22"/>
-          <w:highlight w:val="none"/>
-          <w:vertAlign w:val="baseline"/>
-        </w:rPr>
-      </w:pPr>
-      <w:r>
-        <w:rPr>
-          <w:color w:val="2f5696" w:themeColor="accent5" w:themeShade="BF"/>
-          <w:sz w:val="22"/>
-          <w:highlight w:val="none"/>
-          <w:vertAlign w:val="baseline"/>
-        </w:rPr>
-        <w:t xml:space="preserve">displayLines</w:t>
-      </w:r>
-      <w:r>
-        <w:rPr>
-          <w:color w:val="000000" w:themeColor="text1"/>
-          <w:sz w:val="22"/>
-          <w:szCs w:val="22"/>
-          <w:highlight w:val="none"/>
-          <w:vertAlign w:val="baseline"/>
-        </w:rPr>
-      </w:r>
-      <w:r>
-        <w:rPr>
-          <w:color w:val="2f5696"/>
-          <w:sz w:val="22"/>
-          <w:highlight w:val="none"/>
-          <w:vertAlign w:val="baseline"/>
-        </w:rPr>
-      </w:r>
-    </w:p>
-    <w:p>
-      <w:pPr>
-        <w:pBdr/>
-        <w:spacing/>
-        <w:ind/>
-        <w:rPr>
-          <w:color w:val="000000" w:themeColor="text1"/>
-          <w:sz w:val="22"/>
-          <w:szCs w:val="22"/>
-          <w:highlight w:val="none"/>
-          <w:vertAlign w:val="baseline"/>
-        </w:rPr>
-      </w:pPr>
-      <w:r>
-        <w:rPr>
-          <w:color w:val="000000" w:themeColor="text1"/>
-          <w:sz w:val="22"/>
-          <w:szCs w:val="22"/>
-          <w:highlight w:val="none"/>
-          <w:vertAlign w:val="baseline"/>
-        </w:rPr>
-        <w:t xml:space="preserve">displayLines() works in a similar way with a for loop iterating over planets, but then it also needs to draw a few hundred lines for each planet. It does this by using getRecords() to get a list of the planet’s previous positions. This list will be 300 long in the standard solar system, applying scaledPos() individually to every vector in this list would be very computationally expensive, and a bad idea. Luckily since all scaledPos() is multiply by a scalar, the distConst, we can use numpy arrays to do this operation all in one go, as you can multiply matrices by scalars in numpy. This is a massive performance increase and is the only reason the program runs at a reasonable framerate. At the same time adjustment is added to all of the positions. This list of positions is then put into a new list, lines, which is a 2d array containing pairs of positions. Pygame.draw.aaline() is then used to draw lines between the pairs of positions in this list, and it uses getColour() to draw the lines in the colour of the planet currently being iterated over. The index of the line in lines is used to determine the brightness of the colour, with older lines being drawn darker to produce a fading effect.</w:t>
-      </w:r>
-      <w:r>
-        <w:rPr>
-          <w:color w:val="000000" w:themeColor="text1"/>
-          <w:sz w:val="22"/>
-          <w:szCs w:val="22"/>
-          <w:highlight w:val="none"/>
-          <w:vertAlign w:val="baseline"/>
-        </w:rPr>
-      </w:r>
-    </w:p>
-    <w:p>
-      <w:pPr>
-        <w:pBdr/>
-        <w:spacing/>
-        <w:ind/>
-        <w:rPr>
-          <w:color w:val="2f5696"/>
-          <w:sz w:val="22"/>
-          <w:highlight w:val="none"/>
-          <w:vertAlign w:val="baseline"/>
-        </w:rPr>
-      </w:pPr>
-      <w:r>
-        <w:rPr>
-          <w:color w:val="2f5696" w:themeColor="accent5" w:themeShade="BF"/>
-          <w:sz w:val="22"/>
-          <w:highlight w:val="none"/>
-          <w:vertAlign w:val="baseline"/>
-        </w:rPr>
-        <w:t xml:space="preserve">scaledPos</w:t>
-      </w:r>
-      <w:r>
-        <w:rPr>
-          <w:color w:val="2f5696"/>
-          <w:sz w:val="22"/>
-          <w:highlight w:val="none"/>
-          <w:vertAlign w:val="baseline"/>
-        </w:rPr>
-      </w:r>
-      <w:r>
-        <w:rPr>
-          <w:color w:val="2f5696"/>
-          <w:sz w:val="22"/>
-          <w:highlight w:val="none"/>
-          <w:vertAlign w:val="baseline"/>
-        </w:rPr>
-      </w:r>
-    </w:p>
-    <w:p>
-      <w:pPr>
-        <w:pBdr/>
-        <w:spacing/>
-        <w:ind/>
-        <w:rPr>
-          <w:color w:val="auto"/>
-          <w:sz w:val="24"/>
-          <w:szCs w:val="28"/>
-          <w:highlight w:val="none"/>
-          <w:vertAlign w:val="baseline"/>
-        </w:rPr>
-      </w:pPr>
-      <w:r>
-        <w:rPr>
-          <w:color w:val="auto"/>
-          <w:sz w:val="22"/>
-          <w:szCs w:val="24"/>
-          <w:highlight w:val="none"/>
-          <w:vertAlign w:val="baseline"/>
-        </w:rPr>
-        <w:t xml:space="preserve">Obviously drawing a solar system with a 1:1 pixel to metre scale is not very useful, as you would never be able to see anything. To fix this, the whole system will be scaled by a num</w:t>
-      </w:r>
-      <w:r>
-        <w:rPr>
-          <w:color w:val="auto"/>
-          <w:sz w:val="22"/>
-          <w:szCs w:val="24"/>
-          <w:highlight w:val="none"/>
-          <w:vertAlign w:val="baseline"/>
-        </w:rPr>
-        <w:t xml:space="preserve">ber, distanceScale. Changing distanceScale will change how zoomed in or zoomed out the view is. The scaling will be done relative to the centre of mass of the system, i.e. making it the origin, as it’s the closest thing to an objective reference there is. </w:t>
-      </w:r>
-      <w:r>
-        <w:rPr>
-          <w:color w:val="auto"/>
-          <w:sz w:val="22"/>
-          <w:szCs w:val="24"/>
-          <w:highlight w:val="none"/>
-          <w:vertAlign w:val="baseline"/>
-        </w:rPr>
-        <w:t xml:space="preserve">T</w:t>
-      </w:r>
-      <w:r>
-        <w:rPr>
-          <w:color w:val="auto"/>
-          <w:sz w:val="22"/>
-          <w:szCs w:val="24"/>
-          <w:highlight w:val="none"/>
-          <w:vertAlign w:val="baseline"/>
-        </w:rPr>
-        <w:t xml:space="preserve">his means a vector, comVector, between the centre of mass and the position being scaled will be calculated. Then the position of the centre of mass will be added to the scaled version of comVector to get the scaled position. Here is some pseudocode for it:</w:t>
-      </w:r>
-      <w:r>
-        <w:rPr>
-          <w:color w:val="auto"/>
-          <w:sz w:val="24"/>
-          <w:szCs w:val="28"/>
-          <w:highlight w:val="none"/>
-          <w:vertAlign w:val="baseline"/>
-        </w:rPr>
-      </w:r>
-      <w:r>
-        <w:rPr>
-          <w:color w:val="auto"/>
-          <w:sz w:val="24"/>
-          <w:szCs w:val="28"/>
-          <w:highlight w:val="none"/>
-          <w:vertAlign w:val="baseline"/>
-        </w:rPr>
-      </w:r>
-    </w:p>
-    <w:p>
-      <w:pPr>
-        <w:pBdr/>
-        <w:spacing/>
-        <w:ind/>
-        <w:rPr>
-          <w:highlight w:val="none"/>
-        </w:rPr>
-      </w:pPr>
-      <w:r>
-        <w:rPr>
-          <w:color w:val="4472c4" w:themeColor="accent5"/>
-          <w:sz w:val="28"/>
+          <w:highlight w:val="none"/>
+        </w:rPr>
+      </w:pPr>
+      <w:r>
+        <w:rPr>
+          <w:color w:val="000000" w:themeColor="text1"/>
+          <w:sz w:val="22"/>
           <w:highlight w:val="none"/>
           <w:vertAlign w:val="baseline"/>
         </w:rPr>
@@ -18956,9 +18806,9 @@
           <mc:Choice Requires="wpg">
             <w:drawing>
               <wp:inline xmlns:wp="http://schemas.openxmlformats.org/drawingml/2006/wordprocessingDrawing" distT="0" distB="0" distL="0" distR="0">
-                <wp:extent cx="5940425" cy="868688"/>
+                <wp:extent cx="5940425" cy="928894"/>
                 <wp:effectExtent l="0" t="0" r="0" b="0"/>
-                <wp:docPr id="38" name="" hidden="0"/>
+                <wp:docPr id="38" name=""/>
                 <wp:cNvGraphicFramePr>
                   <a:graphicFrameLocks xmlns:a="http://schemas.openxmlformats.org/drawingml/2006/main" noChangeAspect="1"/>
                 </wp:cNvGraphicFramePr>
@@ -18966,11 +18816,11 @@
                   <a:graphicData uri="http://schemas.openxmlformats.org/drawingml/2006/picture">
                     <pic:pic xmlns:pic="http://schemas.openxmlformats.org/drawingml/2006/picture">
                       <pic:nvPicPr>
-                        <pic:cNvPr id="926161877" name="" hidden="0"/>
+                        <pic:cNvPr id="1644362929" name=""/>
                         <pic:cNvPicPr>
                           <a:picLocks noChangeAspect="1"/>
                         </pic:cNvPicPr>
-                        <pic:nvPr isPhoto="0" userDrawn="0"/>
+                        <pic:nvPr/>
                       </pic:nvPicPr>
                       <pic:blipFill>
                         <a:blip r:embed="rId49"/>
@@ -18979,7 +18829,7 @@
                       <pic:spPr bwMode="auto">
                         <a:xfrm>
                           <a:off x="0" y="0"/>
-                          <a:ext cx="5940424" cy="868688"/>
+                          <a:ext cx="5940424" cy="928893"/>
                         </a:xfrm>
                         <a:prstGeom prst="rect">
                           <a:avLst/>
@@ -19012,7 +18862,7 @@
                 <v:path o:extrusionok="f" gradientshapeok="t" o:connecttype="rect"/>
                 <o:lock v:ext="edit" aspectratio="t"/>
               </v:shapetype>
-              <v:shape id="_x0000_i37" o:spid="_x0000_s37" type="#_x0000_t75" style="width:467.75pt;height:68.40pt;mso-wrap-distance-left:0.00pt;mso-wrap-distance-top:0.00pt;mso-wrap-distance-right:0.00pt;mso-wrap-distance-bottom:0.00pt;z-index:1;" stroked="false">
+              <v:shape id="_x0000_i37" o:spid="_x0000_s37" type="#_x0000_t75" style="width:467.75pt;height:73.14pt;mso-wrap-distance-left:0.00pt;mso-wrap-distance-top:0.00pt;mso-wrap-distance-right:0.00pt;mso-wrap-distance-bottom:0.00pt;z-index:1;" stroked="false">
                 <v:imagedata r:id="rId49" o:title=""/>
                 <o:lock v:ext="edit" rotation="t"/>
               </v:shape>
@@ -19022,12 +18872,27 @@
       </w:r>
       <w:r>
         <w:rPr>
-          <w:highlight w:val="none"/>
-        </w:rPr>
-      </w:r>
-      <w:r>
-        <w:rPr>
-          <w:highlight w:val="none"/>
+          <w:color w:val="000000" w:themeColor="text1"/>
+          <w:sz w:val="22"/>
+          <w:highlight w:val="none"/>
+          <w:vertAlign w:val="baseline"/>
+        </w:rPr>
+      </w:r>
+      <w:r/>
+      <w:r>
+        <w:rPr>
+          <w:color w:val="000000" w:themeColor="text1"/>
+          <w:sz w:val="22"/>
+          <w:highlight w:val="none"/>
+          <w:vertAlign w:val="baseline"/>
+        </w:rPr>
+      </w:r>
+      <w:r>
+        <w:rPr>
+          <w:color w:val="000000" w:themeColor="text1"/>
+          <w:sz w:val="22"/>
+          <w:highlight w:val="none"/>
+          <w:vertAlign w:val="baseline"/>
         </w:rPr>
       </w:r>
     </w:p>
@@ -19044,11 +18909,7 @@
         <w:rPr>
           <w:highlight w:val="none"/>
         </w:rPr>
-      </w:r>
-      <w:r>
-        <w:rPr>
-          <w:highlight w:val="none"/>
-        </w:rPr>
+        <w:t xml:space="preserve">If you’re questioning why this is even a function, it’s to improve the readability of the program. It makes it clear I’m scaling the position.</w:t>
       </w:r>
       <w:r>
         <w:rPr>
@@ -19062,35 +18923,21 @@
         <w:spacing/>
         <w:ind/>
         <w:rPr>
-          <w:color w:val="2f5696"/>
-          <w:sz w:val="22"/>
+          <w:color w:val="000000" w:themeColor="text1"/>
+          <w:sz w:val="22"/>
+          <w:szCs w:val="22"/>
           <w:highlight w:val="none"/>
           <w:vertAlign w:val="baseline"/>
         </w:rPr>
       </w:pPr>
       <w:r>
         <w:rPr>
-          <w:color w:val="2f5696" w:themeColor="accent5" w:themeShade="BF"/>
-          <w:sz w:val="22"/>
-          <w:highlight w:val="none"/>
-          <w:vertAlign w:val="baseline"/>
-        </w:rPr>
-        <w:t xml:space="preserve">focusAdjustment</w:t>
-      </w:r>
-      <w:r>
-        <w:rPr>
-          <w:color w:val="2f5696"/>
-          <w:sz w:val="22"/>
-          <w:highlight w:val="none"/>
-          <w:vertAlign w:val="baseline"/>
-        </w:rPr>
-      </w:r>
-      <w:r>
-        <w:rPr>
-          <w:color w:val="2f5696"/>
-          <w:sz w:val="22"/>
-          <w:highlight w:val="none"/>
-          <w:vertAlign w:val="baseline"/>
+          <w:highlight w:val="none"/>
+        </w:rPr>
+      </w:r>
+      <w:r>
+        <w:rPr>
+          <w:highlight w:val="none"/>
         </w:rPr>
       </w:r>
     </w:p>
@@ -19100,57 +18947,33 @@
         <w:spacing/>
         <w:ind/>
         <w:rPr>
-          <w:color w:val="000000"/>
-          <w:sz w:val="22"/>
-          <w:szCs w:val="22"/>
+          <w:color w:val="2f5696"/>
+          <w:sz w:val="22"/>
           <w:highlight w:val="none"/>
           <w:vertAlign w:val="baseline"/>
         </w:rPr>
       </w:pPr>
       <w:r>
         <w:rPr>
-          <w:color w:val="000000" w:themeColor="text1"/>
-          <w:sz w:val="22"/>
-          <w:szCs w:val="24"/>
+          <w:color w:val="2f5696" w:themeColor="accent5" w:themeShade="BF"/>
+          <w:sz w:val="22"/>
           <w:highlight w:val="none"/>
           <w:vertAlign w:val="baseline"/>
         </w:rPr>
-        <w:t xml:space="preserve">focusAdjustment() is probably the most important part of the display. To make the physics easy, the reference frame for the coordinates never changes. It’s set at the start to be the current position of the centre of mass of the solar system. The solar sy</w:t>
-      </w:r>
-      <w:r>
-        <w:rPr>
-          <w:color w:val="000000" w:themeColor="text1"/>
-          <w:sz w:val="22"/>
-          <w:szCs w:val="24"/>
+        <w:t xml:space="preserve">displayPlanets</w:t>
+      </w:r>
+      <w:r>
+        <w:rPr>
+          <w:color w:val="2f5696"/>
+          <w:sz w:val="22"/>
           <w:highlight w:val="none"/>
           <w:vertAlign w:val="baseline"/>
         </w:rPr>
-        <w:t xml:space="preserve">stem, however, moves over time, which means that if the camera were to stay fixed the solar system would drift out of view. This is not very helpful. To stop this, an adjustment will be calculated, which is the purpose of this function. The adjustment, whi</w:t>
-      </w:r>
-      <w:r>
-        <w:rPr>
-          <w:color w:val="000000" w:themeColor="text1"/>
-          <w:sz w:val="22"/>
-          <w:szCs w:val="24"/>
-          <w:highlight w:val="none"/>
-          <w:vertAlign w:val="baseline"/>
-        </w:rPr>
-        <w:t xml:space="preserve">ch will be called focusDisplacement inside the function as that is the physical definition of it, is a vector from the centre of the screen to the scaled position of the object the camera is currently focused on. Here is pseudocode for how to calculate it:</w:t>
-      </w:r>
-      <w:r>
-        <w:rPr>
-          <w:color w:val="000000"/>
-          <w:sz w:val="22"/>
-          <w:szCs w:val="22"/>
-          <w:highlight w:val="none"/>
-          <w:vertAlign w:val="baseline"/>
-        </w:rPr>
-      </w:r>
-      <w:r>
-        <w:rPr>
-          <w:color w:val="000000"/>
-          <w:sz w:val="22"/>
-          <w:szCs w:val="22"/>
+      </w:r>
+      <w:r>
+        <w:rPr>
+          <w:color w:val="2f5696"/>
+          <w:sz w:val="22"/>
           <w:highlight w:val="none"/>
           <w:vertAlign w:val="baseline"/>
         </w:rPr>
@@ -19162,9 +18985,9 @@
         <w:spacing/>
         <w:ind/>
         <w:rPr>
-          <w:color w:val="000000"/>
-          <w:sz w:val="24"/>
-          <w:szCs w:val="24"/>
+          <w:color w:val="000000" w:themeColor="text1"/>
+          <w:sz w:val="22"/>
+          <w:szCs w:val="22"/>
           <w:highlight w:val="none"/>
           <w:vertAlign w:val="baseline"/>
         </w:rPr>
@@ -19173,7 +18996,69 @@
         <w:rPr>
           <w:color w:val="000000" w:themeColor="text1"/>
           <w:sz w:val="22"/>
-          <w:szCs w:val="24"/>
+          <w:szCs w:val="22"/>
+          <w:highlight w:val="none"/>
+          <w:vertAlign w:val="baseline"/>
+        </w:rPr>
+        <w:t xml:space="preserve">Drawing the planets is done with displayPlanets which runs a for loop iterating over the list planets and uses a method, drawPlanet() to display each one. It only runs drawPlanet() if the planet would be visible to save on resources, n</w:t>
+      </w:r>
+      <w:r>
+        <w:rPr>
+          <w:color w:val="000000" w:themeColor="text1"/>
+          <w:sz w:val="22"/>
+          <w:szCs w:val="22"/>
+          <w:highlight w:val="none"/>
+          <w:vertAlign w:val="baseline"/>
+        </w:rPr>
+        <w:t xml:space="preserve">o point drawing pl</w:t>
+      </w:r>
+      <w:r>
+        <w:rPr>
+          <w:color w:val="000000" w:themeColor="text1"/>
+          <w:sz w:val="22"/>
+          <w:szCs w:val="22"/>
+          <w:highlight w:val="none"/>
+          <w:vertAlign w:val="baseline"/>
+        </w:rPr>
+        <w:t xml:space="preserve">anets offscreen. It uses offscreen() to check this. It passes in the scaled and adjusted position of the planet to drawPlanet() so that the circle is drawn at the correct position. Here is pseudocode showing this:</w:t>
+      </w:r>
+      <w:r>
+        <w:rPr>
+          <w:color w:val="000000" w:themeColor="text1"/>
+          <w:sz w:val="22"/>
+          <w:szCs w:val="22"/>
+          <w:highlight w:val="none"/>
+          <w:vertAlign w:val="baseline"/>
+        </w:rPr>
+      </w:r>
+      <w:r>
+        <w:rPr>
+          <w:color w:val="000000" w:themeColor="text1"/>
+          <w:sz w:val="22"/>
+          <w:szCs w:val="22"/>
+          <w:highlight w:val="none"/>
+          <w:vertAlign w:val="baseline"/>
+        </w:rPr>
+      </w:r>
+    </w:p>
+    <w:p>
+      <w:pPr>
+        <w:pBdr/>
+        <w:spacing/>
+        <w:ind/>
+        <w:rPr>
+          <w:color w:val="000000" w:themeColor="text1"/>
+          <w:sz w:val="22"/>
+          <w:szCs w:val="22"/>
+          <w:highlight w:val="none"/>
+          <w:vertAlign w:val="baseline"/>
+        </w:rPr>
+      </w:pPr>
+      <w:r>
+        <w:rPr>
+          <w:color w:val="000000" w:themeColor="text1"/>
+          <w:sz w:val="22"/>
+          <w:szCs w:val="22"/>
           <w:highlight w:val="none"/>
           <w:vertAlign w:val="baseline"/>
         </w:rPr>
@@ -19183,9 +19068,9 @@
           <mc:Choice Requires="wpg">
             <w:drawing>
               <wp:inline xmlns:wp="http://schemas.openxmlformats.org/drawingml/2006/wordprocessingDrawing" distT="0" distB="0" distL="0" distR="0">
-                <wp:extent cx="4543425" cy="428625"/>
+                <wp:extent cx="5940425" cy="1895717"/>
                 <wp:effectExtent l="0" t="0" r="0" b="0"/>
-                <wp:docPr id="39" name="" hidden="0"/>
+                <wp:docPr id="39" name=""/>
                 <wp:cNvGraphicFramePr>
                   <a:graphicFrameLocks xmlns:a="http://schemas.openxmlformats.org/drawingml/2006/main" noChangeAspect="1"/>
                 </wp:cNvGraphicFramePr>
@@ -19193,11 +19078,11 @@
                   <a:graphicData uri="http://schemas.openxmlformats.org/drawingml/2006/picture">
                     <pic:pic xmlns:pic="http://schemas.openxmlformats.org/drawingml/2006/picture">
                       <pic:nvPicPr>
-                        <pic:cNvPr id="1947947021" name="" hidden="0"/>
+                        <pic:cNvPr id="120807456" name=""/>
                         <pic:cNvPicPr>
                           <a:picLocks noChangeAspect="1"/>
                         </pic:cNvPicPr>
-                        <pic:nvPr isPhoto="0" userDrawn="0"/>
+                        <pic:nvPr/>
                       </pic:nvPicPr>
                       <pic:blipFill>
                         <a:blip r:embed="rId50"/>
@@ -19206,7 +19091,7 @@
                       <pic:spPr bwMode="auto">
                         <a:xfrm>
                           <a:off x="0" y="0"/>
-                          <a:ext cx="4543425" cy="428625"/>
+                          <a:ext cx="5940424" cy="1895716"/>
                         </a:xfrm>
                         <a:prstGeom prst="rect">
                           <a:avLst/>
@@ -19239,7 +19124,7 @@
                 <v:path o:extrusionok="f" gradientshapeok="t" o:connecttype="rect"/>
                 <o:lock v:ext="edit" aspectratio="t"/>
               </v:shapetype>
-              <v:shape id="_x0000_i38" o:spid="_x0000_s38" type="#_x0000_t75" style="width:357.75pt;height:33.75pt;mso-wrap-distance-left:0.00pt;mso-wrap-distance-top:0.00pt;mso-wrap-distance-right:0.00pt;mso-wrap-distance-bottom:0.00pt;z-index:1;" stroked="false">
+              <v:shape id="_x0000_i38" o:spid="_x0000_s38" type="#_x0000_t75" style="width:467.75pt;height:149.27pt;mso-wrap-distance-left:0.00pt;mso-wrap-distance-top:0.00pt;mso-wrap-distance-right:0.00pt;mso-wrap-distance-bottom:0.00pt;z-index:1;" stroked="false">
                 <v:imagedata r:id="rId50" o:title=""/>
                 <o:lock v:ext="edit" rotation="t"/>
               </v:shape>
@@ -19249,18 +19134,82 @@
       </w:r>
       <w:r>
         <w:rPr>
-          <w:color w:val="000000"/>
-          <w:sz w:val="24"/>
-          <w:szCs w:val="24"/>
+          <w:color w:val="000000" w:themeColor="text1"/>
+          <w:sz w:val="22"/>
+          <w:szCs w:val="22"/>
           <w:highlight w:val="none"/>
           <w:vertAlign w:val="baseline"/>
         </w:rPr>
       </w:r>
-      <w:r>
-        <w:rPr>
-          <w:color w:val="000000"/>
-          <w:sz w:val="24"/>
-          <w:szCs w:val="24"/>
+      <w:r/>
+      <w:r/>
+      <w:r/>
+      <w:r>
+        <w:rPr>
+          <w:color w:val="000000" w:themeColor="text1"/>
+          <w:sz w:val="22"/>
+          <w:szCs w:val="22"/>
+          <w:highlight w:val="none"/>
+          <w:vertAlign w:val="baseline"/>
+        </w:rPr>
+      </w:r>
+      <w:r>
+        <w:rPr>
+          <w:color w:val="000000" w:themeColor="text1"/>
+          <w:sz w:val="22"/>
+          <w:szCs w:val="22"/>
+          <w:highlight w:val="none"/>
+          <w:vertAlign w:val="baseline"/>
+        </w:rPr>
+      </w:r>
+      <w:r>
+        <w:rPr>
+          <w:color w:val="000000" w:themeColor="text1"/>
+          <w:sz w:val="22"/>
+          <w:szCs w:val="22"/>
+          <w:highlight w:val="none"/>
+          <w:vertAlign w:val="baseline"/>
+        </w:rPr>
+      </w:r>
+      <w:r>
+        <w:rPr>
+          <w:color w:val="000000" w:themeColor="text1"/>
+          <w:sz w:val="22"/>
+          <w:szCs w:val="22"/>
+          <w:highlight w:val="none"/>
+          <w:vertAlign w:val="baseline"/>
+        </w:rPr>
+      </w:r>
+      <w:r>
+        <w:rPr>
+          <w:color w:val="000000" w:themeColor="text1"/>
+          <w:sz w:val="22"/>
+          <w:szCs w:val="22"/>
+          <w:highlight w:val="none"/>
+          <w:vertAlign w:val="baseline"/>
+        </w:rPr>
+      </w:r>
+      <w:r>
+        <w:rPr>
+          <w:color w:val="2f5696" w:themeColor="accent5" w:themeShade="BF"/>
+          <w:sz w:val="22"/>
+          <w:highlight w:val="none"/>
+          <w:vertAlign w:val="baseline"/>
+        </w:rPr>
+      </w:r>
+      <w:r>
+        <w:rPr>
+          <w:color w:val="2f5696" w:themeColor="accent5" w:themeShade="BF"/>
+          <w:sz w:val="22"/>
+          <w:highlight w:val="none"/>
+          <w:vertAlign w:val="baseline"/>
+        </w:rPr>
+      </w:r>
+      <w:r>
+        <w:rPr>
+          <w:color w:val="000000" w:themeColor="text1"/>
+          <w:sz w:val="22"/>
+          <w:szCs w:val="22"/>
           <w:highlight w:val="none"/>
           <w:vertAlign w:val="baseline"/>
         </w:rPr>
@@ -19272,37 +19221,25 @@
         <w:spacing/>
         <w:ind/>
         <w:rPr>
-          <w:color w:val="000000"/>
-          <w:sz w:val="24"/>
-          <w:szCs w:val="28"/>
+          <w:color w:val="2f5496" w:themeColor="accent5" w:themeShade="BF"/>
+          <w:sz w:val="22"/>
+          <w:szCs w:val="22"/>
           <w:highlight w:val="none"/>
           <w:vertAlign w:val="baseline"/>
         </w:rPr>
       </w:pPr>
       <w:r>
         <w:rPr>
-          <w:color w:val="000000" w:themeColor="text1"/>
-          <w:sz w:val="22"/>
-          <w:szCs w:val="24"/>
+          <w:color w:val="2f5696" w:themeColor="accent5" w:themeShade="BF"/>
+          <w:sz w:val="22"/>
           <w:highlight w:val="none"/>
           <w:vertAlign w:val="baseline"/>
         </w:rPr>
-        <w:t xml:space="preserve">Where centre and scaledPos(currentFocus) are both vectors.</w:t>
-      </w:r>
-      <w:r>
-        <w:rPr>
-          <w:color w:val="000000"/>
-          <w:sz w:val="24"/>
-          <w:szCs w:val="28"/>
-          <w:highlight w:val="none"/>
-          <w:vertAlign w:val="baseline"/>
-        </w:rPr>
-      </w:r>
-      <w:r>
-        <w:rPr>
-          <w:color w:val="000000"/>
-          <w:sz w:val="24"/>
-          <w:szCs w:val="28"/>
+      </w:r>
+      <w:r>
+        <w:rPr>
+          <w:color w:val="2f5696" w:themeColor="accent5" w:themeShade="BF"/>
+          <w:sz w:val="22"/>
           <w:highlight w:val="none"/>
           <w:vertAlign w:val="baseline"/>
         </w:rPr>
@@ -19314,7 +19251,7 @@
         <w:spacing/>
         <w:ind/>
         <w:rPr>
-          <w:color w:val="000000"/>
+          <w:color w:val="2f5496" w:themeColor="accent5" w:themeShade="BF"/>
           <w:sz w:val="22"/>
           <w:szCs w:val="22"/>
           <w:highlight w:val="none"/>
@@ -19323,48 +19260,26 @@
       </w:pPr>
       <w:r>
         <w:rPr>
-          <w:color w:val="000000" w:themeColor="text1"/>
-          <w:sz w:val="22"/>
-          <w:szCs w:val="24"/>
+          <w:color w:val="2f5696" w:themeColor="accent5" w:themeShade="BF"/>
+          <w:sz w:val="22"/>
           <w:highlight w:val="none"/>
           <w:vertAlign w:val="baseline"/>
         </w:rPr>
-        <w:t xml:space="preserve">The program will support following the centre of mass of the system, or one of</w:t>
-      </w:r>
-      <w:r>
-        <w:rPr>
-          <w:color w:val="000000" w:themeColor="text1"/>
-          <w:sz w:val="22"/>
-          <w:szCs w:val="24"/>
+        <w:t xml:space="preserve">drawPlanet</w:t>
+      </w:r>
+      <w:r>
+        <w:rPr>
+          <w:color w:val="000000" w:themeColor="text1"/>
+          <w:sz w:val="22"/>
+          <w:szCs w:val="22"/>
           <w:highlight w:val="none"/>
           <w:vertAlign w:val="baseline"/>
         </w:rPr>
-        <w:t xml:space="preserve"> the celestial bodies (planets). To support this, a numerical value, focus, which represents the current planet being looked at, as well as a boolean, comFocus, which decides whether to look at a planet or the centre of the system, will be passed into the </w:t>
-      </w:r>
-      <w:r>
-        <w:rPr>
-          <w:color w:val="000000" w:themeColor="text1"/>
-          <w:sz w:val="22"/>
-          <w:szCs w:val="24"/>
-          <w:highlight w:val="none"/>
-          <w:vertAlign w:val="baseline"/>
-        </w:rPr>
-        <w:t xml:space="preserve">function as arguments. An if statement will then be used to set currentFocus. Here is the pseudocode for the full thing:</w:t>
-      </w:r>
-      <w:r>
-        <w:rPr>
-          <w:color w:val="000000"/>
-          <w:sz w:val="22"/>
-          <w:szCs w:val="22"/>
-          <w:highlight w:val="none"/>
-          <w:vertAlign w:val="baseline"/>
-        </w:rPr>
-      </w:r>
-      <w:r>
-        <w:rPr>
-          <w:color w:val="000000"/>
-          <w:sz w:val="22"/>
-          <w:szCs w:val="22"/>
+      </w:r>
+      <w:r>
+        <w:rPr>
+          <w:color w:val="2f5696"/>
+          <w:sz w:val="22"/>
           <w:highlight w:val="none"/>
           <w:vertAlign w:val="baseline"/>
         </w:rPr>
@@ -19376,9 +19291,9 @@
         <w:spacing/>
         <w:ind/>
         <w:rPr>
-          <w:color w:val="000000"/>
-          <w:sz w:val="24"/>
-          <w:szCs w:val="24"/>
+          <w:color w:val="000000" w:themeColor="text1"/>
+          <w:sz w:val="22"/>
+          <w:szCs w:val="22"/>
           <w:highlight w:val="none"/>
           <w:vertAlign w:val="baseline"/>
         </w:rPr>
@@ -19387,7 +19302,130 @@
         <w:rPr>
           <w:color w:val="000000" w:themeColor="text1"/>
           <w:sz w:val="22"/>
-          <w:szCs w:val="24"/>
+          <w:highlight w:val="none"/>
+          <w:vertAlign w:val="baseline"/>
+        </w:rPr>
+        <w:t xml:space="preserve">drawPlanet() needs to be able to draw a planet at any place on any surface. This is needed for the comparison mode as in that mode we are drawing planets at specific points that aren’t related to the position of the planet itself, and during the comparison the planets are drawn on surfaces other than the screen surface. It also needs the planet object itself to get the size and colour of the planet. These will all be passed in as arguments to the function.</w:t>
+      </w:r>
+      <w:r>
+        <w:rPr>
+          <w:color w:val="000000" w:themeColor="text1"/>
+          <w:sz w:val="22"/>
+          <w:highlight w:val="none"/>
+          <w:vertAlign w:val="baseline"/>
+        </w:rPr>
+      </w:r>
+    </w:p>
+    <w:p>
+      <w:pPr>
+        <w:pBdr/>
+        <w:spacing/>
+        <w:ind/>
+        <w:rPr>
+          <w:color w:val="000000" w:themeColor="text1"/>
+          <w:sz w:val="22"/>
+          <w:szCs w:val="22"/>
+          <w:highlight w:val="none"/>
+          <w:vertAlign w:val="baseline"/>
+        </w:rPr>
+      </w:pPr>
+      <w:r>
+        <w:rPr>
+          <w:color w:val="000000" w:themeColor="text1"/>
+          <w:sz w:val="22"/>
+          <w:highlight w:val="none"/>
+          <w:vertAlign w:val="baseline"/>
+        </w:rPr>
+        <w:t xml:space="preserve">The pygame.draw.circle() method will be used to draw the planet as a solid coloured circle. It will be given the surface to draw the circle on, get the colour of the circle with p.getColour(), draw the circle at the position given to it, and draw the circle with a radius of the scaled size of the planet, distScale*p.getSize(). </w:t>
+      </w:r>
+      <w:r>
+        <w:rPr>
+          <w:color w:val="000000" w:themeColor="text1"/>
+          <w:sz w:val="22"/>
+          <w:highlight w:val="none"/>
+          <w:vertAlign w:val="baseline"/>
+        </w:rPr>
+      </w:r>
+    </w:p>
+    <w:p>
+      <w:pPr>
+        <w:pBdr/>
+        <w:spacing/>
+        <w:ind/>
+        <w:rPr>
+          <w:color w:val="000000" w:themeColor="text1"/>
+          <w:sz w:val="22"/>
+          <w:szCs w:val="22"/>
+          <w:highlight w:val="none"/>
+          <w:vertAlign w:val="baseline"/>
+        </w:rPr>
+      </w:pPr>
+      <w:r>
+        <w:rPr>
+          <w:color w:val="000000" w:themeColor="text1"/>
+          <w:sz w:val="22"/>
+          <w:highlight w:val="none"/>
+          <w:vertAlign w:val="baseline"/>
+        </w:rPr>
+        <w:t xml:space="preserve">Telling pygame to draw a very large circle (i.e. millions of pixels in diametre) can cause a lot of lag. This would occur in my program if you were very zoomed in on a planet for whatever reason. To avoid this, a check will be done to see if the scaled radius of the planet is larger than the diagonal radius of the screen. This can be done by seeing if distScale*p.getSize() &lt; vec.mag(centre) or not. If this happens, then a circle will not be drawn, and instead the surface will just be filled with the colour of the planet.</w:t>
+      </w:r>
+      <w:r>
+        <w:rPr>
+          <w:color w:val="000000" w:themeColor="text1"/>
+          <w:sz w:val="22"/>
+          <w:highlight w:val="none"/>
+          <w:vertAlign w:val="baseline"/>
+        </w:rPr>
+      </w:r>
+    </w:p>
+    <w:p>
+      <w:pPr>
+        <w:pBdr/>
+        <w:spacing/>
+        <w:ind/>
+        <w:rPr>
+          <w:color w:val="000000" w:themeColor="text1"/>
+          <w:sz w:val="22"/>
+          <w:szCs w:val="22"/>
+          <w:highlight w:val="none"/>
+          <w:vertAlign w:val="baseline"/>
+        </w:rPr>
+      </w:pPr>
+      <w:r>
+        <w:rPr>
+          <w:color w:val="000000" w:themeColor="text1"/>
+          <w:sz w:val="22"/>
+          <w:highlight w:val="none"/>
+          <w:vertAlign w:val="baseline"/>
+        </w:rPr>
+        <w:t xml:space="preserve">Here is pseudocode for all of this:</w:t>
+      </w:r>
+      <w:r>
+        <w:rPr>
+          <w:color w:val="000000" w:themeColor="text1"/>
+          <w:sz w:val="22"/>
+          <w:highlight w:val="none"/>
+          <w:vertAlign w:val="baseline"/>
+        </w:rPr>
+      </w:r>
+    </w:p>
+    <w:p>
+      <w:pPr>
+        <w:pBdr/>
+        <w:spacing/>
+        <w:ind/>
+        <w:rPr>
+          <w:color w:val="000000" w:themeColor="text1"/>
+          <w:sz w:val="22"/>
+          <w:szCs w:val="22"/>
+          <w:highlight w:val="none"/>
+          <w:vertAlign w:val="baseline"/>
+        </w:rPr>
+      </w:pPr>
+      <w:r>
+        <w:rPr>
+          <w:color w:val="000000" w:themeColor="text1"/>
+          <w:sz w:val="22"/>
           <w:highlight w:val="none"/>
           <w:vertAlign w:val="baseline"/>
         </w:rPr>
@@ -19397,9 +19435,9 @@
           <mc:Choice Requires="wpg">
             <w:drawing>
               <wp:inline xmlns:wp="http://schemas.openxmlformats.org/drawingml/2006/wordprocessingDrawing" distT="0" distB="0" distL="0" distR="0">
-                <wp:extent cx="4791075" cy="2200275"/>
+                <wp:extent cx="5940425" cy="1688648"/>
                 <wp:effectExtent l="0" t="0" r="0" b="0"/>
-                <wp:docPr id="40" name="" hidden="0"/>
+                <wp:docPr id="40" name=""/>
                 <wp:cNvGraphicFramePr>
                   <a:graphicFrameLocks xmlns:a="http://schemas.openxmlformats.org/drawingml/2006/main" noChangeAspect="1"/>
                 </wp:cNvGraphicFramePr>
@@ -19407,11 +19445,11 @@
                   <a:graphicData uri="http://schemas.openxmlformats.org/drawingml/2006/picture">
                     <pic:pic xmlns:pic="http://schemas.openxmlformats.org/drawingml/2006/picture">
                       <pic:nvPicPr>
-                        <pic:cNvPr id="1193730252" name="" hidden="0"/>
+                        <pic:cNvPr id="806072209" name=""/>
                         <pic:cNvPicPr>
                           <a:picLocks noChangeAspect="1"/>
                         </pic:cNvPicPr>
-                        <pic:nvPr isPhoto="0" userDrawn="0"/>
+                        <pic:nvPr/>
                       </pic:nvPicPr>
                       <pic:blipFill>
                         <a:blip r:embed="rId51"/>
@@ -19420,7 +19458,7 @@
                       <pic:spPr bwMode="auto">
                         <a:xfrm>
                           <a:off x="0" y="0"/>
-                          <a:ext cx="4791074" cy="2200275"/>
+                          <a:ext cx="5940424" cy="1688648"/>
                         </a:xfrm>
                         <a:prstGeom prst="rect">
                           <a:avLst/>
@@ -19453,7 +19491,7 @@
                 <v:path o:extrusionok="f" gradientshapeok="t" o:connecttype="rect"/>
                 <o:lock v:ext="edit" aspectratio="t"/>
               </v:shapetype>
-              <v:shape id="_x0000_i39" o:spid="_x0000_s39" type="#_x0000_t75" style="width:377.25pt;height:173.25pt;mso-wrap-distance-left:0.00pt;mso-wrap-distance-top:0.00pt;mso-wrap-distance-right:0.00pt;mso-wrap-distance-bottom:0.00pt;z-index:1;" stroked="false">
+              <v:shape id="_x0000_i39" o:spid="_x0000_s39" type="#_x0000_t75" style="width:467.75pt;height:132.96pt;mso-wrap-distance-left:0.00pt;mso-wrap-distance-top:0.00pt;mso-wrap-distance-right:0.00pt;mso-wrap-distance-bottom:0.00pt;z-index:1;" stroked="false">
                 <v:imagedata r:id="rId51" o:title=""/>
                 <o:lock v:ext="edit" rotation="t"/>
               </v:shape>
@@ -19463,18 +19501,16 @@
       </w:r>
       <w:r>
         <w:rPr>
-          <w:color w:val="000000"/>
-          <w:sz w:val="24"/>
-          <w:szCs w:val="24"/>
+          <w:color w:val="000000" w:themeColor="text1"/>
+          <w:sz w:val="22"/>
           <w:highlight w:val="none"/>
           <w:vertAlign w:val="baseline"/>
         </w:rPr>
       </w:r>
       <w:r>
         <w:rPr>
-          <w:color w:val="000000"/>
-          <w:sz w:val="24"/>
-          <w:szCs w:val="24"/>
+          <w:color w:val="000000" w:themeColor="text1"/>
+          <w:sz w:val="22"/>
           <w:highlight w:val="none"/>
           <w:vertAlign w:val="baseline"/>
         </w:rPr>
@@ -19486,9 +19522,9 @@
         <w:spacing/>
         <w:ind/>
         <w:rPr>
-          <w:color w:val="000000"/>
-          <w:sz w:val="24"/>
-          <w:szCs w:val="28"/>
+          <w:color w:val="000000" w:themeColor="text1"/>
+          <w:sz w:val="22"/>
+          <w:szCs w:val="22"/>
           <w:highlight w:val="none"/>
           <w:vertAlign w:val="baseline"/>
         </w:rPr>
@@ -19497,25 +19533,14 @@
         <w:rPr>
           <w:color w:val="000000" w:themeColor="text1"/>
           <w:sz w:val="22"/>
-          <w:szCs w:val="24"/>
           <w:highlight w:val="none"/>
           <w:vertAlign w:val="baseline"/>
         </w:rPr>
       </w:r>
       <w:r>
         <w:rPr>
-          <w:color w:val="000000"/>
-          <w:sz w:val="24"/>
-          <w:szCs w:val="28"/>
-          <w:highlight w:val="none"/>
-          <w:vertAlign w:val="baseline"/>
-        </w:rPr>
-      </w:r>
-      <w:r>
-        <w:rPr>
-          <w:color w:val="000000"/>
-          <w:sz w:val="24"/>
-          <w:szCs w:val="28"/>
+          <w:color w:val="000000" w:themeColor="text1"/>
+          <w:sz w:val="22"/>
           <w:highlight w:val="none"/>
           <w:vertAlign w:val="baseline"/>
         </w:rPr>
@@ -19527,37 +19552,33 @@
         <w:spacing/>
         <w:ind/>
         <w:rPr>
-          <w:color w:val="000000"/>
-          <w:sz w:val="24"/>
-          <w:szCs w:val="28"/>
+          <w:color w:val="2f5696"/>
+          <w:sz w:val="22"/>
           <w:highlight w:val="none"/>
           <w:vertAlign w:val="baseline"/>
         </w:rPr>
       </w:pPr>
       <w:r>
         <w:rPr>
-          <w:color w:val="000000" w:themeColor="text1"/>
-          <w:sz w:val="22"/>
-          <w:szCs w:val="24"/>
+          <w:color w:val="2f5696" w:themeColor="accent5" w:themeShade="BF"/>
+          <w:sz w:val="22"/>
           <w:highlight w:val="none"/>
           <w:vertAlign w:val="baseline"/>
         </w:rPr>
-        <w:t xml:space="preserve">Where com() is a function used to calculate the centre of mass of the system.</w:t>
-      </w:r>
-      <w:r>
-        <w:rPr>
-          <w:color w:val="000000"/>
-          <w:sz w:val="24"/>
-          <w:szCs w:val="28"/>
+        <w:t xml:space="preserve">displayLines</w:t>
+      </w:r>
+      <w:r>
+        <w:rPr>
+          <w:color w:val="2f5696"/>
+          <w:sz w:val="22"/>
           <w:highlight w:val="none"/>
           <w:vertAlign w:val="baseline"/>
         </w:rPr>
       </w:r>
       <w:r>
         <w:rPr>
-          <w:color w:val="000000"/>
-          <w:sz w:val="24"/>
-          <w:szCs w:val="28"/>
+          <w:color w:val="2f5696"/>
+          <w:sz w:val="22"/>
           <w:highlight w:val="none"/>
           <w:vertAlign w:val="baseline"/>
         </w:rPr>
@@ -19569,32 +19590,91 @@
         <w:spacing/>
         <w:ind/>
         <w:rPr>
-          <w:color w:val="4472c4"/>
-          <w:sz w:val="28"/>
+          <w:color w:val="000000" w:themeColor="text1"/>
+          <w:sz w:val="22"/>
+          <w:szCs w:val="22"/>
           <w:highlight w:val="none"/>
           <w:vertAlign w:val="baseline"/>
         </w:rPr>
       </w:pPr>
       <w:r>
         <w:rPr>
-          <w:color w:val="4472c4" w:themeColor="accent5"/>
-          <w:sz w:val="28"/>
+          <w:color w:val="000000" w:themeColor="text1"/>
+          <w:sz w:val="22"/>
+          <w:szCs w:val="22"/>
           <w:highlight w:val="none"/>
           <w:vertAlign w:val="baseline"/>
         </w:rPr>
-      </w:r>
-      <w:r>
-        <w:rPr>
-          <w:color w:val="4472c4"/>
-          <w:sz w:val="28"/>
+        <w:t xml:space="preserve">displayLines() works in a similar way with a for loop iterating over planets, but then it also needs to draw a few hundred lines for each planet. It does this by using getRecords() </w:t>
+      </w:r>
+      <w:r>
+        <w:rPr>
+          <w:color w:val="000000" w:themeColor="text1"/>
+          <w:sz w:val="22"/>
+          <w:szCs w:val="22"/>
           <w:highlight w:val="none"/>
           <w:vertAlign w:val="baseline"/>
         </w:rPr>
-      </w:r>
-      <w:r>
-        <w:rPr>
-          <w:color w:val="4472c4"/>
-          <w:sz w:val="28"/>
+        <w:t xml:space="preserve">to get a list of the planet’s previous positions in chronological order, with the oldest record being the first item in the list. This list will be 300 long in the standard solar system, applying scaledPos() individually to every vector in this list would be very computationally expensive, and a bad idea. Luckily since all scaledPos()</w:t>
+      </w:r>
+      <w:r>
+        <w:rPr>
+          <w:color w:val="000000" w:themeColor="text1"/>
+          <w:sz w:val="22"/>
+          <w:szCs w:val="22"/>
+          <w:highlight w:val="none"/>
+          <w:vertAlign w:val="baseline"/>
+        </w:rPr>
+        <w:t xml:space="preserve"> does is multiply by a scalar, the distConst, we can use numpy arrays to do this operation all in one go, as you can multiply matrices by scalars in numpy. This is a massive performance increase and is the only reason the program runs at a reasonable framerate.</w:t>
+      </w:r>
+      <w:r>
+        <w:rPr>
+          <w:color w:val="000000" w:themeColor="text1"/>
+          <w:sz w:val="22"/>
+          <w:szCs w:val="22"/>
+          <w:highlight w:val="none"/>
+          <w:vertAlign w:val="baseline"/>
+        </w:rPr>
+        <w:t xml:space="preserve"> At the same time adjustment is added to all of the positions. The list created is called orbitalPath.</w:t>
+      </w:r>
+      <w:r>
+        <w:rPr>
+          <w:color w:val="000000" w:themeColor="text1"/>
+          <w:sz w:val="22"/>
+          <w:szCs w:val="22"/>
+          <w:highlight w:val="none"/>
+          <w:vertAlign w:val="baseline"/>
+        </w:rPr>
+      </w:r>
+      <w:r>
+        <w:rPr>
+          <w:color w:val="000000" w:themeColor="text1"/>
+          <w:sz w:val="22"/>
+          <w:szCs w:val="22"/>
+          <w:highlight w:val="none"/>
+          <w:vertAlign w:val="baseline"/>
+        </w:rPr>
+      </w:r>
+      <w:r>
+        <w:rPr>
+          <w:highlight w:val="none"/>
+        </w:rPr>
+      </w:r>
+      <w:r>
+        <w:rPr>
+          <w:highlight w:val="none"/>
+        </w:rPr>
+      </w:r>
+      <w:r>
+        <w:rPr>
+          <w:highlight w:val="none"/>
+        </w:rPr>
+      </w:r>
+      <w:r>
+        <w:rPr>
+          <w:color w:val="000000" w:themeColor="text1"/>
+          <w:sz w:val="22"/>
+          <w:szCs w:val="22"/>
           <w:highlight w:val="none"/>
           <w:vertAlign w:val="baseline"/>
         </w:rPr>
@@ -19606,33 +19686,28 @@
         <w:spacing/>
         <w:ind/>
         <w:rPr>
-          <w:color w:val="2f5696"/>
-          <w:sz w:val="22"/>
+          <w:color w:val="000000" w:themeColor="text1"/>
+          <w:sz w:val="22"/>
+          <w:szCs w:val="22"/>
           <w:highlight w:val="none"/>
           <w:vertAlign w:val="baseline"/>
         </w:rPr>
       </w:pPr>
       <w:r>
         <w:rPr>
-          <w:color w:val="2f5696" w:themeColor="accent5" w:themeShade="BF"/>
-          <w:sz w:val="22"/>
+          <w:color w:val="000000" w:themeColor="text1"/>
+          <w:sz w:val="22"/>
+          <w:szCs w:val="22"/>
           <w:highlight w:val="none"/>
           <w:vertAlign w:val="baseline"/>
         </w:rPr>
-        <w:t xml:space="preserve">displayPlanets</w:t>
-      </w:r>
-      <w:r>
-        <w:rPr>
-          <w:color w:val="2f5696"/>
-          <w:sz w:val="22"/>
-          <w:highlight w:val="none"/>
-          <w:vertAlign w:val="baseline"/>
-        </w:rPr>
-      </w:r>
-      <w:r>
-        <w:rPr>
-          <w:color w:val="2f5696"/>
-          <w:sz w:val="22"/>
+        <w:t xml:space="preserve">A variable, index, is set to -1. This is used to keep track of what line we’re on, as we want to draw older lines with a more faded colour. This will give a visual indicator of where the planet was at what time. If the line was all one solid colour it would not be clear where the planet was recently and where the planet was a while ago.</w:t>
+      </w:r>
+      <w:r>
+        <w:rPr>
+          <w:color w:val="000000" w:themeColor="text1"/>
+          <w:sz w:val="22"/>
+          <w:szCs w:val="22"/>
           <w:highlight w:val="none"/>
           <w:vertAlign w:val="baseline"/>
         </w:rPr>
@@ -19644,47 +19719,28 @@
         <w:spacing/>
         <w:ind/>
         <w:rPr>
-          <w:color w:val="auto"/>
-          <w:sz w:val="24"/>
-          <w:szCs w:val="28"/>
+          <w:color w:val="000000" w:themeColor="text1"/>
+          <w:sz w:val="22"/>
+          <w:szCs w:val="22"/>
           <w:highlight w:val="none"/>
           <w:vertAlign w:val="baseline"/>
         </w:rPr>
       </w:pPr>
       <w:r>
         <w:rPr>
-          <w:color w:val="auto"/>
-          <w:sz w:val="22"/>
-          <w:szCs w:val="24"/>
+          <w:color w:val="000000" w:themeColor="text1"/>
+          <w:sz w:val="22"/>
+          <w:szCs w:val="22"/>
           <w:highlight w:val="none"/>
           <w:vertAlign w:val="baseline"/>
         </w:rPr>
-        <w:t xml:space="preserve">displayPlanets() will</w:t>
-      </w:r>
-      <w:r>
-        <w:rPr>
-          <w:color w:val="auto"/>
-          <w:sz w:val="22"/>
-          <w:szCs w:val="24"/>
-          <w:highlight w:val="none"/>
-          <w:vertAlign w:val="baseline"/>
-        </w:rPr>
-        <w:t xml:space="preserve"> simply run a for loop through the list of planets and draws them all using drawPlanet(). drawPlanet() takes position as an argument, so displayPlanets() will need to give it a position. This position will be calculated like this:</w:t>
-      </w:r>
-      <w:r>
-        <w:rPr>
-          <w:color w:val="auto"/>
-          <w:sz w:val="24"/>
-          <w:szCs w:val="28"/>
-          <w:highlight w:val="none"/>
-          <w:vertAlign w:val="baseline"/>
-        </w:rPr>
-      </w:r>
-      <w:r>
-        <w:rPr>
-          <w:color w:val="auto"/>
-          <w:sz w:val="24"/>
-          <w:szCs w:val="28"/>
+        <w:t xml:space="preserve">A for loop is then used to iterate over orbitalPath, drawing a line between each consecutive pair of positions. Index will be incremented by one each loop and an “indexRatio” is calcuated, this is index/len(orbitalPath). This is used to determine the colour of the line.</w:t>
+      </w:r>
+      <w:r>
+        <w:rPr>
+          <w:color w:val="000000" w:themeColor="text1"/>
+          <w:sz w:val="22"/>
+          <w:szCs w:val="22"/>
           <w:highlight w:val="none"/>
           <w:vertAlign w:val="baseline"/>
         </w:rPr>
@@ -19695,13 +19751,195 @@
         <w:pBdr/>
         <w:spacing/>
         <w:ind/>
-        <w:rPr/>
-      </w:pPr>
-      <w:r>
-        <w:rPr>
-          <w:color w:val="auto"/>
-          <w:sz w:val="22"/>
-          <w:szCs w:val="24"/>
+        <w:rPr>
+          <w:color w:val="000000" w:themeColor="text1"/>
+          <w:sz w:val="22"/>
+          <w:szCs w:val="22"/>
+          <w:highlight w:val="none"/>
+          <w:vertAlign w:val="baseline"/>
+        </w:rPr>
+      </w:pPr>
+      <w:r>
+        <w:rPr>
+          <w:color w:val="000000" w:themeColor="text1"/>
+          <w:sz w:val="22"/>
+          <w:szCs w:val="22"/>
+          <w:highlight w:val="none"/>
+          <w:vertAlign w:val="baseline"/>
+        </w:rPr>
+        <w:t xml:space="preserve">There are two situations where we don’t want to draw a line:</w:t>
+      </w:r>
+      <w:r>
+        <w:rPr>
+          <w:color w:val="000000" w:themeColor="text1"/>
+          <w:sz w:val="22"/>
+          <w:szCs w:val="22"/>
+          <w:highlight w:val="none"/>
+          <w:vertAlign w:val="baseline"/>
+        </w:rPr>
+      </w:r>
+      <w:r/>
+    </w:p>
+    <w:p>
+      <w:pPr>
+        <w:pStyle w:val="862"/>
+        <w:numPr>
+          <w:ilvl w:val="0"/>
+          <w:numId w:val="6"/>
+        </w:numPr>
+        <w:pBdr/>
+        <w:spacing/>
+        <w:ind/>
+        <w:rPr>
+          <w:color w:val="000000" w:themeColor="text1"/>
+          <w:sz w:val="22"/>
+          <w:szCs w:val="22"/>
+          <w:highlight w:val="none"/>
+          <w:vertAlign w:val="baseline"/>
+        </w:rPr>
+      </w:pPr>
+      <w:r>
+        <w:rPr>
+          <w:color w:val="000000" w:themeColor="text1"/>
+          <w:sz w:val="22"/>
+          <w:szCs w:val="22"/>
+          <w:highlight w:val="none"/>
+          <w:vertAlign w:val="baseline"/>
+        </w:rPr>
+        <w:t xml:space="preserve">The line is offscreen so there is no point in drawing it. This is checked with offscreen()</w:t>
+      </w:r>
+      <w:r>
+        <w:rPr>
+          <w:color w:val="000000" w:themeColor="text1"/>
+          <w:sz w:val="22"/>
+          <w:szCs w:val="22"/>
+          <w:highlight w:val="none"/>
+          <w:vertAlign w:val="baseline"/>
+        </w:rPr>
+      </w:r>
+    </w:p>
+    <w:p>
+      <w:pPr>
+        <w:pStyle w:val="862"/>
+        <w:numPr>
+          <w:ilvl w:val="0"/>
+          <w:numId w:val="6"/>
+        </w:numPr>
+        <w:pBdr/>
+        <w:spacing/>
+        <w:ind/>
+        <w:rPr>
+          <w:color w:val="000000" w:themeColor="text1"/>
+          <w:sz w:val="22"/>
+          <w:szCs w:val="22"/>
+          <w:highlight w:val="none"/>
+          <w:vertAlign w:val="baseline"/>
+        </w:rPr>
+      </w:pPr>
+      <w:r>
+        <w:rPr>
+          <w:color w:val="000000" w:themeColor="text1"/>
+          <w:sz w:val="22"/>
+          <w:szCs w:val="22"/>
+          <w:highlight w:val="none"/>
+          <w:vertAlign w:val="baseline"/>
+        </w:rPr>
+        <w:t xml:space="preserve">The line belongs to a satellite who’s host isn’t focused on at the moment and the satellite itself isn’t focused on. If the host is not focused on it’s very unlikely the satellite would be visible as moons are so much smaller than planets, so in this case there’s no point drawing it. To have access to this information displayLines() will be passed focus and comFocus as arguments, we will check first if the current planet is a satellite by seeing if p.getHost() == None or not and then check if the planet is focused on and if the planet’s host is focused on.</w:t>
+      </w:r>
+      <w:r>
+        <w:rPr>
+          <w:color w:val="000000" w:themeColor="text1"/>
+          <w:sz w:val="22"/>
+          <w:szCs w:val="22"/>
+          <w:highlight w:val="none"/>
+          <w:vertAlign w:val="baseline"/>
+        </w:rPr>
+      </w:r>
+    </w:p>
+    <w:p>
+      <w:pPr>
+        <w:pBdr/>
+        <w:spacing/>
+        <w:ind/>
+        <w:rPr>
+          <w:color w:val="000000" w:themeColor="text1"/>
+          <w:sz w:val="22"/>
+          <w:szCs w:val="22"/>
+          <w:highlight w:val="none"/>
+          <w:vertAlign w:val="baseline"/>
+        </w:rPr>
+      </w:pPr>
+      <w:r>
+        <w:rPr>
+          <w:color w:val="000000" w:themeColor="text1"/>
+          <w:sz w:val="22"/>
+          <w:szCs w:val="22"/>
+          <w:highlight w:val="none"/>
+          <w:vertAlign w:val="baseline"/>
+        </w:rPr>
+        <w:t xml:space="preserve">If neither of these criteria are met then the line is drawn. This is done using pygame.draw.aaline() as it produces a smoother result than using pygame.draw.line(). </w:t>
+      </w:r>
+      <w:r>
+        <w:rPr>
+          <w:color w:val="000000" w:themeColor="text1"/>
+          <w:sz w:val="22"/>
+          <w:szCs w:val="22"/>
+          <w:highlight w:val="none"/>
+          <w:vertAlign w:val="baseline"/>
+        </w:rPr>
+      </w:r>
+    </w:p>
+    <w:p>
+      <w:pPr>
+        <w:pBdr/>
+        <w:spacing/>
+        <w:ind/>
+        <w:rPr>
+          <w:color w:val="000000" w:themeColor="text1"/>
+          <w:sz w:val="22"/>
+          <w:szCs w:val="22"/>
+          <w:highlight w:val="none"/>
+          <w:vertAlign w:val="baseline"/>
+        </w:rPr>
+      </w:pPr>
+      <w:r>
+        <w:rPr>
+          <w:color w:val="000000" w:themeColor="text1"/>
+          <w:sz w:val="22"/>
+          <w:szCs w:val="22"/>
+          <w:highlight w:val="none"/>
+          <w:vertAlign w:val="baseline"/>
+        </w:rPr>
+        <w:t xml:space="preserve">Pygame.draw.aaline() needs a surface to draw the line on, the colour of the line and the start and end points for the line. The surface will be given to the function as an argument. The colour will be indexRatio*p.getColour(). This makes it so that older lines are drawn darker, with the darkest ones being drawn as black and completely fading into the background. The start and end points will simply be the current position and the next position in orbitalPath. Here is pseudocode showing all of this:</w:t>
+      </w:r>
+      <w:r>
+        <w:rPr>
+          <w:color w:val="000000" w:themeColor="text1"/>
+          <w:sz w:val="22"/>
+          <w:szCs w:val="22"/>
+          <w:highlight w:val="none"/>
+          <w:vertAlign w:val="baseline"/>
+        </w:rPr>
+      </w:r>
+    </w:p>
+    <w:p>
+      <w:pPr>
+        <w:pBdr/>
+        <w:spacing/>
+        <w:ind/>
+        <w:rPr>
+          <w:color w:val="000000" w:themeColor="text1"/>
+          <w:sz w:val="22"/>
+          <w:szCs w:val="22"/>
+          <w:highlight w:val="none"/>
+          <w:vertAlign w:val="baseline"/>
+        </w:rPr>
+      </w:pPr>
+      <w:r>
+        <w:rPr>
+          <w:color w:val="000000" w:themeColor="text1"/>
+          <w:sz w:val="22"/>
+          <w:szCs w:val="22"/>
           <w:highlight w:val="none"/>
           <w:vertAlign w:val="baseline"/>
         </w:rPr>
@@ -19711,9 +19949,9 @@
           <mc:Choice Requires="wpg">
             <w:drawing>
               <wp:inline xmlns:wp="http://schemas.openxmlformats.org/drawingml/2006/wordprocessingDrawing" distT="0" distB="0" distL="0" distR="0">
-                <wp:extent cx="4010025" cy="314325"/>
+                <wp:extent cx="5940425" cy="5523805"/>
                 <wp:effectExtent l="0" t="0" r="0" b="0"/>
-                <wp:docPr id="41" name="" hidden="0"/>
+                <wp:docPr id="41" name=""/>
                 <wp:cNvGraphicFramePr>
                   <a:graphicFrameLocks xmlns:a="http://schemas.openxmlformats.org/drawingml/2006/main" noChangeAspect="1"/>
                 </wp:cNvGraphicFramePr>
@@ -19721,11 +19959,11 @@
                   <a:graphicData uri="http://schemas.openxmlformats.org/drawingml/2006/picture">
                     <pic:pic xmlns:pic="http://schemas.openxmlformats.org/drawingml/2006/picture">
                       <pic:nvPicPr>
-                        <pic:cNvPr id="1877576364" name="" hidden="0"/>
+                        <pic:cNvPr id="1451044064" name=""/>
                         <pic:cNvPicPr>
                           <a:picLocks noChangeAspect="1"/>
                         </pic:cNvPicPr>
-                        <pic:nvPr isPhoto="0" userDrawn="0"/>
+                        <pic:nvPr/>
                       </pic:nvPicPr>
                       <pic:blipFill>
                         <a:blip r:embed="rId52"/>
@@ -19734,7 +19972,7 @@
                       <pic:spPr bwMode="auto">
                         <a:xfrm>
                           <a:off x="0" y="0"/>
-                          <a:ext cx="4010024" cy="314324"/>
+                          <a:ext cx="5940424" cy="5523805"/>
                         </a:xfrm>
                         <a:prstGeom prst="rect">
                           <a:avLst/>
@@ -19767,7 +20005,7 @@
                 <v:path o:extrusionok="f" gradientshapeok="t" o:connecttype="rect"/>
                 <o:lock v:ext="edit" aspectratio="t"/>
               </v:shapetype>
-              <v:shape id="_x0000_i40" o:spid="_x0000_s40" type="#_x0000_t75" style="width:315.75pt;height:24.75pt;mso-wrap-distance-left:0.00pt;mso-wrap-distance-top:0.00pt;mso-wrap-distance-right:0.00pt;mso-wrap-distance-bottom:0.00pt;z-index:1;" stroked="false">
+              <v:shape id="_x0000_i40" o:spid="_x0000_s40" type="#_x0000_t75" style="width:467.75pt;height:434.95pt;mso-wrap-distance-left:0.00pt;mso-wrap-distance-top:0.00pt;mso-wrap-distance-right:0.00pt;mso-wrap-distance-bottom:0.00pt;z-index:1;" stroked="false">
                 <v:imagedata r:id="rId52" o:title=""/>
                 <o:lock v:ext="edit" rotation="t"/>
               </v:shape>
@@ -19777,189 +20015,18 @@
       </w:r>
       <w:r>
         <w:rPr>
-          <w:color w:val="auto"/>
-          <w:sz w:val="24"/>
-          <w:szCs w:val="28"/>
+          <w:color w:val="000000" w:themeColor="text1"/>
+          <w:sz w:val="22"/>
+          <w:szCs w:val="22"/>
           <w:highlight w:val="none"/>
           <w:vertAlign w:val="baseline"/>
         </w:rPr>
       </w:r>
-      <w:r/>
-    </w:p>
-    <w:p>
-      <w:pPr>
-        <w:pBdr/>
-        <w:spacing/>
-        <w:ind/>
-        <w:rPr>
-          <w:color w:val="auto"/>
-          <w:sz w:val="24"/>
-          <w:szCs w:val="24"/>
-          <w:highlight w:val="none"/>
-          <w:vertAlign w:val="baseline"/>
-        </w:rPr>
-      </w:pPr>
-      <w:r>
-        <w:rPr>
-          <w:color w:val="auto"/>
-          <w:sz w:val="22"/>
-          <w:szCs w:val="24"/>
-          <w:highlight w:val="none"/>
-          <w:vertAlign w:val="baseline"/>
-        </w:rPr>
-        <w:t xml:space="preserve">Wher</w:t>
-      </w:r>
-      <w:r>
-        <w:rPr>
-          <w:color w:val="auto"/>
-          <w:sz w:val="22"/>
-          <w:szCs w:val="24"/>
-          <w:highlight w:val="none"/>
-          <w:vertAlign w:val="baseline"/>
-        </w:rPr>
-        <w:t xml:space="preserve">e p is the planet being drawn. A for loop will be used to iterate through all planets. Adjustment is calculated by focusAdjustment(). Only the first two numbers in the coordinates are selected because the display is done in 2d to reduce computational load.</w:t>
-      </w:r>
-      <w:r>
-        <w:rPr>
-          <w:color w:val="auto"/>
-          <w:sz w:val="24"/>
-          <w:szCs w:val="24"/>
-          <w:highlight w:val="none"/>
-          <w:vertAlign w:val="baseline"/>
-        </w:rPr>
-      </w:r>
-      <w:r>
-        <w:rPr>
-          <w:color w:val="auto"/>
-          <w:sz w:val="24"/>
-          <w:szCs w:val="24"/>
-          <w:highlight w:val="none"/>
-          <w:vertAlign w:val="baseline"/>
-        </w:rPr>
-      </w:r>
-    </w:p>
-    <w:p>
-      <w:pPr>
-        <w:pBdr/>
-        <w:spacing/>
-        <w:ind/>
-        <w:rPr>
-          <w:color w:val="auto"/>
-          <w:sz w:val="20"/>
-          <w:highlight w:val="none"/>
-          <w:vertAlign w:val="baseline"/>
-        </w:rPr>
-      </w:pPr>
-      <w:r>
-        <w:rPr>
-          <w:color w:val="auto"/>
-          <w:sz w:val="20"/>
-          <w:highlight w:val="none"/>
-          <w:vertAlign w:val="baseline"/>
-        </w:rPr>
-      </w:r>
-      <w:r>
-        <w:rPr>
-          <w:color w:val="auto"/>
-          <w:sz w:val="20"/>
-          <w:highlight w:val="none"/>
-          <w:vertAlign w:val="baseline"/>
-        </w:rPr>
-      </w:r>
-      <w:r>
-        <w:rPr>
-          <w:color w:val="auto"/>
-          <w:sz w:val="20"/>
-          <w:highlight w:val="none"/>
-          <w:vertAlign w:val="baseline"/>
-        </w:rPr>
-      </w:r>
-    </w:p>
-    <w:p>
-      <w:pPr>
-        <w:pBdr/>
-        <w:spacing/>
-        <w:ind/>
-        <w:rPr>
-          <w:color w:val="2f5696"/>
-          <w:sz w:val="22"/>
-          <w:highlight w:val="none"/>
-          <w:vertAlign w:val="baseline"/>
-        </w:rPr>
-      </w:pPr>
-      <w:r>
-        <w:rPr>
-          <w:color w:val="2f5696" w:themeColor="accent5" w:themeShade="BF"/>
-          <w:sz w:val="22"/>
-          <w:highlight w:val="none"/>
-          <w:vertAlign w:val="baseline"/>
-        </w:rPr>
-        <w:t xml:space="preserve">drawPlanet</w:t>
-      </w:r>
-      <w:r>
-        <w:rPr>
-          <w:color w:val="2f5696"/>
-          <w:sz w:val="22"/>
-          <w:highlight w:val="none"/>
-          <w:vertAlign w:val="baseline"/>
-        </w:rPr>
-      </w:r>
-      <w:r>
-        <w:rPr>
-          <w:color w:val="2f5696"/>
-          <w:sz w:val="22"/>
-          <w:highlight w:val="none"/>
-          <w:vertAlign w:val="baseline"/>
-        </w:rPr>
-      </w:r>
-    </w:p>
-    <w:p>
-      <w:pPr>
-        <w:pBdr/>
-        <w:spacing/>
-        <w:ind/>
-        <w:rPr>
-          <w:color w:val="auto"/>
-          <w:sz w:val="24"/>
-          <w:szCs w:val="28"/>
-          <w:highlight w:val="none"/>
-          <w:vertAlign w:val="baseline"/>
-        </w:rPr>
-      </w:pPr>
-      <w:r>
-        <w:rPr>
-          <w:color w:val="auto"/>
-          <w:sz w:val="22"/>
-          <w:szCs w:val="24"/>
-          <w:highlight w:val="none"/>
-          <w:vertAlign w:val="baseline"/>
-        </w:rPr>
-        <w:t xml:space="preserve">drawPlanet() should use pygame’s draw.circle() method, using the attributes of the planet to set the colour and size of the circle. The size</w:t>
-      </w:r>
-      <w:r>
-        <w:rPr>
-          <w:color w:val="auto"/>
-          <w:sz w:val="22"/>
-          <w:szCs w:val="24"/>
-          <w:highlight w:val="none"/>
-          <w:vertAlign w:val="baseline"/>
-        </w:rPr>
-        <w:t xml:space="preserve"> of the planet will need to be multiplied by the distanceScale as pygame cannot draw circles with radii matching the actual size of planets. The function should take in position as an argument so that the planet can be drawn anywhere on the screen we want.</w:t>
-      </w:r>
-      <w:r>
-        <w:rPr>
-          <w:color w:val="auto"/>
-          <w:sz w:val="24"/>
-          <w:szCs w:val="28"/>
-          <w:highlight w:val="none"/>
-          <w:vertAlign w:val="baseline"/>
-        </w:rPr>
-      </w:r>
-      <w:r>
-        <w:rPr>
-          <w:color w:val="auto"/>
-          <w:sz w:val="24"/>
-          <w:szCs w:val="28"/>
+      <w:r>
+        <w:rPr>
+          <w:color w:val="000000" w:themeColor="text1"/>
+          <w:sz w:val="22"/>
+          <w:szCs w:val="22"/>
           <w:highlight w:val="none"/>
           <w:vertAlign w:val="baseline"/>
         </w:rPr>
@@ -19970,7 +20037,7 @@
       <w:footnotePr/>
       <w:endnotePr/>
       <w:type w:val="nextPage"/>
-      <w:pgSz w:h="16838" w:orient="portrait" w:w="11906"/>
+      <w:pgSz w:h="16838" w:orient="landscape" w:w="11906"/>
       <w:pgMar w:top="1134" w:right="850" w:bottom="1134" w:left="1701" w:header="709" w:footer="709" w:gutter="0"/>
       <w:cols w:num="1" w:sep="0" w:space="708" w:equalWidth="1"/>
     </w:sectPr>
@@ -20048,7 +20115,7 @@
 <w:hdr xmlns:wpc="http://schemas.microsoft.com/office/word/2010/wordprocessingCanvas" xmlns:mc="http://schemas.openxmlformats.org/markup-compatibility/2006" xmlns:o="urn:schemas-microsoft-com:office:office" xmlns:r="http://schemas.openxmlformats.org/officeDocument/2006/relationships" xmlns:m="http://schemas.openxmlformats.org/officeDocument/2006/math" xmlns:v="urn:schemas-microsoft-com:vml" xmlns:wp14="http://schemas.microsoft.com/office/word/2010/wordprocessingDrawing" xmlns:wp="http://schemas.openxmlformats.org/drawingml/2006/wordprocessingDrawing" xmlns:w10="urn:schemas-microsoft-com:office:word" xmlns:w="http://schemas.openxmlformats.org/wordprocessingml/2006/main" xmlns:w14="http://schemas.microsoft.com/office/word/2010/wordml" xmlns:w15="http://schemas.microsoft.com/office/word/2012/wordml" xmlns:wpg="http://schemas.microsoft.com/office/word/2010/wordprocessingGroup" xmlns:wpi="http://schemas.microsoft.com/office/word/2010/wordprocessingInk" xmlns:wne="http://schemas.microsoft.com/office/word/2006/wordml" xmlns:a="http://schemas.openxmlformats.org/drawingml/2006/main" xmlns:wps="http://schemas.microsoft.com/office/word/2010/wordprocessingShape" mc:Ignorable="w14 w15 wp14">
   <w:p>
     <w:pPr>
-      <w:pStyle w:val="751"/>
+      <w:pStyle w:val="708"/>
       <w:pBdr/>
       <w:spacing/>
       <w:ind/>
@@ -20754,6 +20821,134 @@
       <w:suff w:val="tab"/>
     </w:lvl>
   </w:abstractNum>
+  <w:abstractNum w:abstractNumId="5">
+    <w:lvl w:ilvl="0">
+      <w:isLgl w:val="false"/>
+      <w:lvlJc w:val="left"/>
+      <w:lvlText w:val="%1."/>
+      <w:numFmt w:val="decimal"/>
+      <w:pPr>
+        <w:pBdr/>
+        <w:spacing/>
+        <w:ind w:hanging="360" w:left="709"/>
+      </w:pPr>
+      <w:rPr/>
+      <w:start w:val="1"/>
+      <w:suff w:val="tab"/>
+    </w:lvl>
+    <w:lvl w:ilvl="1">
+      <w:isLgl w:val="false"/>
+      <w:lvlJc w:val="left"/>
+      <w:lvlText w:val="%2."/>
+      <w:numFmt w:val="lowerLetter"/>
+      <w:pPr>
+        <w:pBdr/>
+        <w:spacing/>
+        <w:ind w:hanging="360" w:left="1429"/>
+      </w:pPr>
+      <w:rPr/>
+      <w:start w:val="1"/>
+      <w:suff w:val="tab"/>
+    </w:lvl>
+    <w:lvl w:ilvl="2">
+      <w:isLgl w:val="false"/>
+      <w:lvlJc w:val="right"/>
+      <w:lvlText w:val="%3."/>
+      <w:numFmt w:val="lowerRoman"/>
+      <w:pPr>
+        <w:pBdr/>
+        <w:spacing/>
+        <w:ind w:hanging="180" w:left="2149"/>
+      </w:pPr>
+      <w:rPr/>
+      <w:start w:val="1"/>
+      <w:suff w:val="tab"/>
+    </w:lvl>
+    <w:lvl w:ilvl="3">
+      <w:isLgl w:val="false"/>
+      <w:lvlJc w:val="left"/>
+      <w:lvlText w:val="%4."/>
+      <w:numFmt w:val="decimal"/>
+      <w:pPr>
+        <w:pBdr/>
+        <w:spacing/>
+        <w:ind w:hanging="360" w:left="2869"/>
+      </w:pPr>
+      <w:rPr/>
+      <w:start w:val="1"/>
+      <w:suff w:val="tab"/>
+    </w:lvl>
+    <w:lvl w:ilvl="4">
+      <w:isLgl w:val="false"/>
+      <w:lvlJc w:val="left"/>
+      <w:lvlText w:val="%5."/>
+      <w:numFmt w:val="lowerLetter"/>
+      <w:pPr>
+        <w:pBdr/>
+        <w:spacing/>
+        <w:ind w:hanging="360" w:left="3589"/>
+      </w:pPr>
+      <w:rPr/>
+      <w:start w:val="1"/>
+      <w:suff w:val="tab"/>
+    </w:lvl>
+    <w:lvl w:ilvl="5">
+      <w:isLgl w:val="false"/>
+      <w:lvlJc w:val="right"/>
+      <w:lvlText w:val="%6."/>
+      <w:numFmt w:val="lowerRoman"/>
+      <w:pPr>
+        <w:pBdr/>
+        <w:spacing/>
+        <w:ind w:hanging="180" w:left="4309"/>
+      </w:pPr>
+      <w:rPr/>
+      <w:start w:val="1"/>
+      <w:suff w:val="tab"/>
+    </w:lvl>
+    <w:lvl w:ilvl="6">
+      <w:isLgl w:val="false"/>
+      <w:lvlJc w:val="left"/>
+      <w:lvlText w:val="%7."/>
+      <w:numFmt w:val="decimal"/>
+      <w:pPr>
+        <w:pBdr/>
+        <w:spacing/>
+        <w:ind w:hanging="360" w:left="5029"/>
+      </w:pPr>
+      <w:rPr/>
+      <w:start w:val="1"/>
+      <w:suff w:val="tab"/>
+    </w:lvl>
+    <w:lvl w:ilvl="7">
+      <w:isLgl w:val="false"/>
+      <w:lvlJc w:val="left"/>
+      <w:lvlText w:val="%8."/>
+      <w:numFmt w:val="lowerLetter"/>
+      <w:pPr>
+        <w:pBdr/>
+        <w:spacing/>
+        <w:ind w:hanging="360" w:left="5749"/>
+      </w:pPr>
+      <w:rPr/>
+      <w:start w:val="1"/>
+      <w:suff w:val="tab"/>
+    </w:lvl>
+    <w:lvl w:ilvl="8">
+      <w:isLgl w:val="false"/>
+      <w:lvlJc w:val="right"/>
+      <w:lvlText w:val="%9."/>
+      <w:numFmt w:val="lowerRoman"/>
+      <w:pPr>
+        <w:pBdr/>
+        <w:spacing/>
+        <w:ind w:hanging="180" w:left="6469"/>
+      </w:pPr>
+      <w:rPr/>
+      <w:start w:val="1"/>
+      <w:suff w:val="tab"/>
+    </w:lvl>
+  </w:abstractNum>
   <w:num w:numId="1">
     <w:abstractNumId w:val="0"/>
   </w:num>
@@ -20768,6 +20963,9 @@
   </w:num>
   <w:num w:numId="5">
     <w:abstractNumId w:val="4"/>
+  </w:num>
+  <w:num w:numId="6">
+    <w:abstractNumId w:val="5"/>
   </w:num>
 </w:numbering>
 </file>
@@ -20930,9 +21128,9 @@
     <w:lsdException w:name="Bibliography" w:uiPriority="37"/>
     <w:lsdException w:name="TOC Heading" w:uiPriority="39" w:qFormat="1"/>
   </w:latentStyles>
-  <w:style w:type="character" w:styleId="717">
+  <w:style w:type="character" w:styleId="674">
     <w:name w:val="Intense Emphasis"/>
-    <w:basedOn w:val="906"/>
+    <w:basedOn w:val="863"/>
     <w:uiPriority w:val="21"/>
     <w:qFormat/>
     <w:pPr>
@@ -20946,9 +21144,9 @@
       <w:color w:val="0f4761" w:themeColor="accent1" w:themeShade="BF"/>
     </w:rPr>
   </w:style>
-  <w:style w:type="character" w:styleId="718">
+  <w:style w:type="character" w:styleId="675">
     <w:name w:val="Intense Reference"/>
-    <w:basedOn w:val="906"/>
+    <w:basedOn w:val="863"/>
     <w:uiPriority w:val="32"/>
     <w:qFormat/>
     <w:pPr>
@@ -20964,9 +21162,9 @@
       <w:spacing w:val="5"/>
     </w:rPr>
   </w:style>
-  <w:style w:type="character" w:styleId="719">
+  <w:style w:type="character" w:styleId="676">
     <w:name w:val="Subtle Emphasis"/>
-    <w:basedOn w:val="906"/>
+    <w:basedOn w:val="863"/>
     <w:uiPriority w:val="19"/>
     <w:qFormat/>
     <w:pPr>
@@ -20980,9 +21178,9 @@
       <w:color w:val="404040" w:themeColor="text1" w:themeTint="BF"/>
     </w:rPr>
   </w:style>
-  <w:style w:type="character" w:styleId="720">
+  <w:style w:type="character" w:styleId="677">
     <w:name w:val="Emphasis"/>
-    <w:basedOn w:val="906"/>
+    <w:basedOn w:val="863"/>
     <w:uiPriority w:val="20"/>
     <w:qFormat/>
     <w:pPr>
@@ -20995,9 +21193,9 @@
       <w:iCs/>
     </w:rPr>
   </w:style>
-  <w:style w:type="character" w:styleId="721">
+  <w:style w:type="character" w:styleId="678">
     <w:name w:val="Strong"/>
-    <w:basedOn w:val="906"/>
+    <w:basedOn w:val="863"/>
     <w:uiPriority w:val="22"/>
     <w:qFormat/>
     <w:pPr>
@@ -21010,9 +21208,9 @@
       <w:bCs/>
     </w:rPr>
   </w:style>
-  <w:style w:type="character" w:styleId="722">
+  <w:style w:type="character" w:styleId="679">
     <w:name w:val="Subtle Reference"/>
-    <w:basedOn w:val="906"/>
+    <w:basedOn w:val="863"/>
     <w:uiPriority w:val="31"/>
     <w:qFormat/>
     <w:pPr>
@@ -21025,9 +21223,9 @@
       <w:color w:val="5a5a5a" w:themeColor="text1" w:themeTint="A5"/>
     </w:rPr>
   </w:style>
-  <w:style w:type="character" w:styleId="723">
+  <w:style w:type="character" w:styleId="680">
     <w:name w:val="Book Title"/>
-    <w:basedOn w:val="906"/>
+    <w:basedOn w:val="863"/>
     <w:uiPriority w:val="33"/>
     <w:qFormat/>
     <w:pPr>
@@ -21043,9 +21241,9 @@
       <w:spacing w:val="5"/>
     </w:rPr>
   </w:style>
-  <w:style w:type="character" w:styleId="724">
+  <w:style w:type="character" w:styleId="681">
     <w:name w:val="FollowedHyperlink"/>
-    <w:basedOn w:val="906"/>
+    <w:basedOn w:val="863"/>
     <w:uiPriority w:val="99"/>
     <w:semiHidden/>
     <w:unhideWhenUsed/>
@@ -21059,11 +21257,11 @@
       <w:u w:val="single"/>
     </w:rPr>
   </w:style>
-  <w:style w:type="paragraph" w:styleId="725">
+  <w:style w:type="paragraph" w:styleId="682">
     <w:name w:val="Heading 1"/>
-    <w:basedOn w:val="901"/>
-    <w:next w:val="901"/>
-    <w:link w:val="726"/>
+    <w:basedOn w:val="858"/>
+    <w:next w:val="858"/>
+    <w:link w:val="683"/>
     <w:uiPriority w:val="9"/>
     <w:qFormat/>
     <w:pPr>
@@ -21080,9 +21278,9 @@
       <w:szCs w:val="40"/>
     </w:rPr>
   </w:style>
-  <w:style w:type="character" w:styleId="726">
+  <w:style w:type="character" w:styleId="683">
     <w:name w:val="Heading 1 Char"/>
-    <w:link w:val="725"/>
+    <w:link w:val="682"/>
     <w:uiPriority w:val="9"/>
     <w:pPr>
       <w:pBdr/>
@@ -21095,11 +21293,11 @@
       <w:szCs w:val="40"/>
     </w:rPr>
   </w:style>
-  <w:style w:type="paragraph" w:styleId="727">
+  <w:style w:type="paragraph" w:styleId="684">
     <w:name w:val="Heading 2"/>
-    <w:basedOn w:val="901"/>
-    <w:next w:val="901"/>
-    <w:link w:val="728"/>
+    <w:basedOn w:val="858"/>
+    <w:next w:val="858"/>
+    <w:link w:val="685"/>
     <w:uiPriority w:val="9"/>
     <w:unhideWhenUsed/>
     <w:qFormat/>
@@ -21116,9 +21314,9 @@
       <w:sz w:val="34"/>
     </w:rPr>
   </w:style>
-  <w:style w:type="character" w:styleId="728">
+  <w:style w:type="character" w:styleId="685">
     <w:name w:val="Heading 2 Char"/>
-    <w:link w:val="727"/>
+    <w:link w:val="684"/>
     <w:uiPriority w:val="9"/>
     <w:pPr>
       <w:pBdr/>
@@ -21130,11 +21328,11 @@
       <w:sz w:val="34"/>
     </w:rPr>
   </w:style>
-  <w:style w:type="paragraph" w:styleId="729">
+  <w:style w:type="paragraph" w:styleId="686">
     <w:name w:val="Heading 3"/>
-    <w:basedOn w:val="901"/>
-    <w:next w:val="901"/>
-    <w:link w:val="730"/>
+    <w:basedOn w:val="858"/>
+    <w:next w:val="858"/>
+    <w:link w:val="687"/>
     <w:uiPriority w:val="9"/>
     <w:unhideWhenUsed/>
     <w:qFormat/>
@@ -21152,9 +21350,9 @@
       <w:szCs w:val="30"/>
     </w:rPr>
   </w:style>
-  <w:style w:type="character" w:styleId="730">
+  <w:style w:type="character" w:styleId="687">
     <w:name w:val="Heading 3 Char"/>
-    <w:link w:val="729"/>
+    <w:link w:val="686"/>
     <w:uiPriority w:val="9"/>
     <w:pPr>
       <w:pBdr/>
@@ -21167,11 +21365,11 @@
       <w:szCs w:val="30"/>
     </w:rPr>
   </w:style>
-  <w:style w:type="paragraph" w:styleId="731">
+  <w:style w:type="paragraph" w:styleId="688">
     <w:name w:val="Heading 4"/>
-    <w:basedOn w:val="901"/>
-    <w:next w:val="901"/>
-    <w:link w:val="732"/>
+    <w:basedOn w:val="858"/>
+    <w:next w:val="858"/>
+    <w:link w:val="689"/>
     <w:uiPriority w:val="9"/>
     <w:unhideWhenUsed/>
     <w:qFormat/>
@@ -21191,9 +21389,9 @@
       <w:szCs w:val="26"/>
     </w:rPr>
   </w:style>
-  <w:style w:type="character" w:styleId="732">
+  <w:style w:type="character" w:styleId="689">
     <w:name w:val="Heading 4 Char"/>
-    <w:link w:val="731"/>
+    <w:link w:val="688"/>
     <w:uiPriority w:val="9"/>
     <w:pPr>
       <w:pBdr/>
@@ -21208,11 +21406,11 @@
       <w:szCs w:val="26"/>
     </w:rPr>
   </w:style>
-  <w:style w:type="paragraph" w:styleId="733">
+  <w:style w:type="paragraph" w:styleId="690">
     <w:name w:val="Heading 5"/>
-    <w:basedOn w:val="901"/>
-    <w:next w:val="901"/>
-    <w:link w:val="734"/>
+    <w:basedOn w:val="858"/>
+    <w:next w:val="858"/>
+    <w:link w:val="691"/>
     <w:uiPriority w:val="9"/>
     <w:unhideWhenUsed/>
     <w:qFormat/>
@@ -21232,9 +21430,9 @@
       <w:szCs w:val="24"/>
     </w:rPr>
   </w:style>
-  <w:style w:type="character" w:styleId="734">
+  <w:style w:type="character" w:styleId="691">
     <w:name w:val="Heading 5 Char"/>
-    <w:link w:val="733"/>
+    <w:link w:val="690"/>
     <w:uiPriority w:val="9"/>
     <w:pPr>
       <w:pBdr/>
@@ -21249,11 +21447,11 @@
       <w:szCs w:val="24"/>
     </w:rPr>
   </w:style>
-  <w:style w:type="paragraph" w:styleId="735">
+  <w:style w:type="paragraph" w:styleId="692">
     <w:name w:val="Heading 6"/>
-    <w:basedOn w:val="901"/>
-    <w:next w:val="901"/>
-    <w:link w:val="736"/>
+    <w:basedOn w:val="858"/>
+    <w:next w:val="858"/>
+    <w:link w:val="693"/>
     <w:uiPriority w:val="9"/>
     <w:unhideWhenUsed/>
     <w:qFormat/>
@@ -21273,9 +21471,9 @@
       <w:szCs w:val="22"/>
     </w:rPr>
   </w:style>
-  <w:style w:type="character" w:styleId="736">
+  <w:style w:type="character" w:styleId="693">
     <w:name w:val="Heading 6 Char"/>
-    <w:link w:val="735"/>
+    <w:link w:val="692"/>
     <w:uiPriority w:val="9"/>
     <w:pPr>
       <w:pBdr/>
@@ -21290,11 +21488,11 @@
       <w:szCs w:val="22"/>
     </w:rPr>
   </w:style>
-  <w:style w:type="paragraph" w:styleId="737">
+  <w:style w:type="paragraph" w:styleId="694">
     <w:name w:val="Heading 7"/>
-    <w:basedOn w:val="901"/>
-    <w:next w:val="901"/>
-    <w:link w:val="738"/>
+    <w:basedOn w:val="858"/>
+    <w:next w:val="858"/>
+    <w:link w:val="695"/>
     <w:uiPriority w:val="9"/>
     <w:unhideWhenUsed/>
     <w:qFormat/>
@@ -21316,9 +21514,9 @@
       <w:szCs w:val="22"/>
     </w:rPr>
   </w:style>
-  <w:style w:type="character" w:styleId="738">
+  <w:style w:type="character" w:styleId="695">
     <w:name w:val="Heading 7 Char"/>
-    <w:link w:val="737"/>
+    <w:link w:val="694"/>
     <w:uiPriority w:val="9"/>
     <w:pPr>
       <w:pBdr/>
@@ -21335,11 +21533,11 @@
       <w:szCs w:val="22"/>
     </w:rPr>
   </w:style>
-  <w:style w:type="paragraph" w:styleId="739">
+  <w:style w:type="paragraph" w:styleId="696">
     <w:name w:val="Heading 8"/>
-    <w:basedOn w:val="901"/>
-    <w:next w:val="901"/>
-    <w:link w:val="740"/>
+    <w:basedOn w:val="858"/>
+    <w:next w:val="858"/>
+    <w:link w:val="697"/>
     <w:uiPriority w:val="9"/>
     <w:unhideWhenUsed/>
     <w:qFormat/>
@@ -21359,9 +21557,9 @@
       <w:szCs w:val="22"/>
     </w:rPr>
   </w:style>
-  <w:style w:type="character" w:styleId="740">
+  <w:style w:type="character" w:styleId="697">
     <w:name w:val="Heading 8 Char"/>
-    <w:link w:val="739"/>
+    <w:link w:val="696"/>
     <w:uiPriority w:val="9"/>
     <w:pPr>
       <w:pBdr/>
@@ -21376,11 +21574,11 @@
       <w:szCs w:val="22"/>
     </w:rPr>
   </w:style>
-  <w:style w:type="paragraph" w:styleId="741">
+  <w:style w:type="paragraph" w:styleId="698">
     <w:name w:val="Heading 9"/>
-    <w:basedOn w:val="901"/>
-    <w:next w:val="901"/>
-    <w:link w:val="742"/>
+    <w:basedOn w:val="858"/>
+    <w:next w:val="858"/>
+    <w:link w:val="699"/>
     <w:uiPriority w:val="9"/>
     <w:unhideWhenUsed/>
     <w:qFormat/>
@@ -21400,9 +21598,9 @@
       <w:szCs w:val="21"/>
     </w:rPr>
   </w:style>
-  <w:style w:type="character" w:styleId="742">
+  <w:style w:type="character" w:styleId="699">
     <w:name w:val="Heading 9 Char"/>
-    <w:link w:val="741"/>
+    <w:link w:val="698"/>
     <w:uiPriority w:val="9"/>
     <w:pPr>
       <w:pBdr/>
@@ -21417,11 +21615,11 @@
       <w:szCs w:val="21"/>
     </w:rPr>
   </w:style>
-  <w:style w:type="paragraph" w:styleId="743">
+  <w:style w:type="paragraph" w:styleId="700">
     <w:name w:val="Title"/>
-    <w:basedOn w:val="901"/>
-    <w:next w:val="901"/>
-    <w:link w:val="744"/>
+    <w:basedOn w:val="858"/>
+    <w:next w:val="858"/>
+    <w:link w:val="701"/>
     <w:uiPriority w:val="10"/>
     <w:qFormat/>
     <w:pPr>
@@ -21435,9 +21633,9 @@
       <w:szCs w:val="48"/>
     </w:rPr>
   </w:style>
-  <w:style w:type="character" w:styleId="744">
+  <w:style w:type="character" w:styleId="701">
     <w:name w:val="Title Char"/>
-    <w:link w:val="743"/>
+    <w:link w:val="700"/>
     <w:uiPriority w:val="10"/>
     <w:pPr>
       <w:pBdr/>
@@ -21449,11 +21647,11 @@
       <w:szCs w:val="48"/>
     </w:rPr>
   </w:style>
-  <w:style w:type="paragraph" w:styleId="745">
+  <w:style w:type="paragraph" w:styleId="702">
     <w:name w:val="Subtitle"/>
-    <w:basedOn w:val="901"/>
-    <w:next w:val="901"/>
-    <w:link w:val="746"/>
+    <w:basedOn w:val="858"/>
+    <w:next w:val="858"/>
+    <w:link w:val="703"/>
     <w:uiPriority w:val="11"/>
     <w:qFormat/>
     <w:pPr>
@@ -21466,9 +21664,9 @@
       <w:szCs w:val="24"/>
     </w:rPr>
   </w:style>
-  <w:style w:type="character" w:styleId="746">
+  <w:style w:type="character" w:styleId="703">
     <w:name w:val="Subtitle Char"/>
-    <w:link w:val="745"/>
+    <w:link w:val="702"/>
     <w:uiPriority w:val="11"/>
     <w:pPr>
       <w:pBdr/>
@@ -21480,11 +21678,11 @@
       <w:szCs w:val="24"/>
     </w:rPr>
   </w:style>
-  <w:style w:type="paragraph" w:styleId="747">
+  <w:style w:type="paragraph" w:styleId="704">
     <w:name w:val="Quote"/>
-    <w:basedOn w:val="901"/>
-    <w:next w:val="901"/>
-    <w:link w:val="748"/>
+    <w:basedOn w:val="858"/>
+    <w:next w:val="858"/>
+    <w:link w:val="705"/>
     <w:uiPriority w:val="29"/>
     <w:qFormat/>
     <w:pPr>
@@ -21496,9 +21694,9 @@
       <w:i/>
     </w:rPr>
   </w:style>
-  <w:style w:type="character" w:styleId="748">
+  <w:style w:type="character" w:styleId="705">
     <w:name w:val="Quote Char"/>
-    <w:link w:val="747"/>
+    <w:link w:val="704"/>
     <w:uiPriority w:val="29"/>
     <w:pPr>
       <w:pBdr/>
@@ -21509,11 +21707,11 @@
       <w:i/>
     </w:rPr>
   </w:style>
-  <w:style w:type="paragraph" w:styleId="749">
+  <w:style w:type="paragraph" w:styleId="706">
     <w:name w:val="Intense Quote"/>
-    <w:basedOn w:val="901"/>
-    <w:next w:val="901"/>
-    <w:link w:val="750"/>
+    <w:basedOn w:val="858"/>
+    <w:next w:val="858"/>
+    <w:link w:val="707"/>
     <w:uiPriority w:val="30"/>
     <w:qFormat/>
     <w:pPr>
@@ -21532,9 +21730,9 @@
       <w:i/>
     </w:rPr>
   </w:style>
-  <w:style w:type="character" w:styleId="750">
+  <w:style w:type="character" w:styleId="707">
     <w:name w:val="Intense Quote Char"/>
-    <w:link w:val="749"/>
+    <w:link w:val="706"/>
     <w:uiPriority w:val="30"/>
     <w:pPr>
       <w:pBdr/>
@@ -21545,10 +21743,10 @@
       <w:i/>
     </w:rPr>
   </w:style>
-  <w:style w:type="paragraph" w:styleId="751">
+  <w:style w:type="paragraph" w:styleId="708">
     <w:name w:val="Header"/>
-    <w:basedOn w:val="901"/>
-    <w:link w:val="752"/>
+    <w:basedOn w:val="858"/>
+    <w:link w:val="709"/>
     <w:uiPriority w:val="99"/>
     <w:unhideWhenUsed/>
     <w:pPr>
@@ -21561,9 +21759,9 @@
       <w:ind/>
     </w:pPr>
   </w:style>
-  <w:style w:type="character" w:styleId="752">
+  <w:style w:type="character" w:styleId="709">
     <w:name w:val="Header Char"/>
-    <w:link w:val="751"/>
+    <w:link w:val="708"/>
     <w:uiPriority w:val="99"/>
     <w:pPr>
       <w:pBdr/>
@@ -21571,10 +21769,10 @@
       <w:ind/>
     </w:pPr>
   </w:style>
-  <w:style w:type="paragraph" w:styleId="753">
+  <w:style w:type="paragraph" w:styleId="710">
     <w:name w:val="Footer"/>
-    <w:basedOn w:val="901"/>
-    <w:link w:val="756"/>
+    <w:basedOn w:val="858"/>
+    <w:link w:val="713"/>
     <w:uiPriority w:val="99"/>
     <w:unhideWhenUsed/>
     <w:pPr>
@@ -21587,9 +21785,9 @@
       <w:ind/>
     </w:pPr>
   </w:style>
-  <w:style w:type="character" w:styleId="754">
+  <w:style w:type="character" w:styleId="711">
     <w:name w:val="Footer Char"/>
-    <w:link w:val="753"/>
+    <w:link w:val="710"/>
     <w:uiPriority w:val="99"/>
     <w:pPr>
       <w:pBdr/>
@@ -21597,10 +21795,10 @@
       <w:ind/>
     </w:pPr>
   </w:style>
-  <w:style w:type="paragraph" w:styleId="755">
+  <w:style w:type="paragraph" w:styleId="712">
     <w:name w:val="Caption"/>
-    <w:basedOn w:val="901"/>
-    <w:next w:val="901"/>
+    <w:basedOn w:val="858"/>
+    <w:next w:val="858"/>
     <w:uiPriority w:val="35"/>
     <w:semiHidden/>
     <w:unhideWhenUsed/>
@@ -21618,10 +21816,10 @@
       <w:szCs w:val="18"/>
     </w:rPr>
   </w:style>
-  <w:style w:type="character" w:styleId="756">
+  <w:style w:type="character" w:styleId="713">
     <w:name w:val="Caption Char"/>
-    <w:basedOn w:val="755"/>
-    <w:link w:val="753"/>
+    <w:basedOn w:val="712"/>
+    <w:link w:val="710"/>
     <w:uiPriority w:val="99"/>
     <w:pPr>
       <w:pBdr/>
@@ -21629,9 +21827,9 @@
       <w:ind/>
     </w:pPr>
   </w:style>
-  <w:style w:type="table" w:styleId="757">
+  <w:style w:type="table" w:styleId="714">
     <w:name w:val="Table Grid"/>
-    <w:basedOn w:val="902"/>
+    <w:basedOn w:val="859"/>
     <w:uiPriority w:val="59"/>
     <w:pPr>
       <w:pBdr/>
@@ -21828,9 +22026,9 @@
       </w:tcPr>
     </w:tblStylePr>
   </w:style>
-  <w:style w:type="table" w:styleId="758">
+  <w:style w:type="table" w:styleId="715">
     <w:name w:val="Table Grid Light"/>
-    <w:basedOn w:val="902"/>
+    <w:basedOn w:val="859"/>
     <w:uiPriority w:val="59"/>
     <w:pPr>
       <w:pBdr/>
@@ -22027,9 +22225,9 @@
       </w:tcPr>
     </w:tblStylePr>
   </w:style>
-  <w:style w:type="table" w:styleId="759">
+  <w:style w:type="table" w:styleId="716">
     <w:name w:val="Plain Table 1"/>
-    <w:basedOn w:val="902"/>
+    <w:basedOn w:val="859"/>
     <w:uiPriority w:val="59"/>
     <w:pPr>
       <w:pBdr/>
@@ -22252,9 +22450,9 @@
       </w:tcPr>
     </w:tblStylePr>
   </w:style>
-  <w:style w:type="table" w:styleId="760">
+  <w:style w:type="table" w:styleId="717">
     <w:name w:val="Plain Table 2"/>
-    <w:basedOn w:val="902"/>
+    <w:basedOn w:val="859"/>
     <w:uiPriority w:val="59"/>
     <w:pPr>
       <w:pBdr/>
@@ -22485,9 +22683,9 @@
       </w:tcPr>
     </w:tblStylePr>
   </w:style>
-  <w:style w:type="table" w:styleId="761">
+  <w:style w:type="table" w:styleId="718">
     <w:name w:val="Plain Table 3"/>
-    <w:basedOn w:val="902"/>
+    <w:basedOn w:val="859"/>
     <w:uiPriority w:val="99"/>
     <w:pPr>
       <w:pBdr/>
@@ -22715,9 +22913,9 @@
       </w:tcPr>
     </w:tblStylePr>
   </w:style>
-  <w:style w:type="table" w:styleId="762">
+  <w:style w:type="table" w:styleId="719">
     <w:name w:val="Plain Table 4"/>
-    <w:basedOn w:val="902"/>
+    <w:basedOn w:val="859"/>
     <w:uiPriority w:val="99"/>
     <w:pPr>
       <w:pBdr/>
@@ -22931,9 +23129,9 @@
       </w:tcPr>
     </w:tblStylePr>
   </w:style>
-  <w:style w:type="table" w:styleId="763">
+  <w:style w:type="table" w:styleId="720">
     <w:name w:val="Plain Table 5"/>
-    <w:basedOn w:val="902"/>
+    <w:basedOn w:val="859"/>
     <w:uiPriority w:val="99"/>
     <w:pPr>
       <w:pBdr/>
@@ -23164,9 +23362,9 @@
       </w:tcPr>
     </w:tblStylePr>
   </w:style>
-  <w:style w:type="table" w:styleId="764">
+  <w:style w:type="table" w:styleId="721">
     <w:name w:val="Grid Table 1 Light"/>
-    <w:basedOn w:val="902"/>
+    <w:basedOn w:val="859"/>
     <w:uiPriority w:val="99"/>
     <w:pPr>
       <w:pBdr/>
@@ -23387,9 +23585,9 @@
       </w:tcPr>
     </w:tblStylePr>
   </w:style>
-  <w:style w:type="table" w:styleId="765">
+  <w:style w:type="table" w:styleId="722">
     <w:name w:val="Grid Table 1 Light - Accent 1"/>
-    <w:basedOn w:val="902"/>
+    <w:basedOn w:val="859"/>
     <w:uiPriority w:val="99"/>
     <w:pPr>
       <w:pBdr/>
@@ -23610,9 +23808,9 @@
       </w:tcPr>
     </w:tblStylePr>
   </w:style>
-  <w:style w:type="table" w:styleId="766">
+  <w:style w:type="table" w:styleId="723">
     <w:name w:val="Grid Table 1 Light - Accent 2"/>
-    <w:basedOn w:val="902"/>
+    <w:basedOn w:val="859"/>
     <w:uiPriority w:val="99"/>
     <w:pPr>
       <w:pBdr/>
@@ -23833,9 +24031,9 @@
       </w:tcPr>
     </w:tblStylePr>
   </w:style>
-  <w:style w:type="table" w:styleId="767">
+  <w:style w:type="table" w:styleId="724">
     <w:name w:val="Grid Table 1 Light - Accent 3"/>
-    <w:basedOn w:val="902"/>
+    <w:basedOn w:val="859"/>
     <w:uiPriority w:val="99"/>
     <w:pPr>
       <w:pBdr/>
@@ -24056,9 +24254,9 @@
       </w:tcPr>
     </w:tblStylePr>
   </w:style>
-  <w:style w:type="table" w:styleId="768">
+  <w:style w:type="table" w:styleId="725">
     <w:name w:val="Grid Table 1 Light - Accent 4"/>
-    <w:basedOn w:val="902"/>
+    <w:basedOn w:val="859"/>
     <w:uiPriority w:val="99"/>
     <w:pPr>
       <w:pBdr/>
@@ -24279,9 +24477,9 @@
       </w:tcPr>
     </w:tblStylePr>
   </w:style>
-  <w:style w:type="table" w:styleId="769">
+  <w:style w:type="table" w:styleId="726">
     <w:name w:val="Grid Table 1 Light - Accent 5"/>
-    <w:basedOn w:val="902"/>
+    <w:basedOn w:val="859"/>
     <w:uiPriority w:val="99"/>
     <w:pPr>
       <w:pBdr/>
@@ -24502,9 +24700,9 @@
       </w:tcPr>
     </w:tblStylePr>
   </w:style>
-  <w:style w:type="table" w:styleId="770">
+  <w:style w:type="table" w:styleId="727">
     <w:name w:val="Grid Table 1 Light - Accent 6"/>
-    <w:basedOn w:val="902"/>
+    <w:basedOn w:val="859"/>
     <w:uiPriority w:val="99"/>
     <w:pPr>
       <w:pBdr/>
@@ -24725,9 +24923,9 @@
       </w:tcPr>
     </w:tblStylePr>
   </w:style>
-  <w:style w:type="table" w:styleId="771">
+  <w:style w:type="table" w:styleId="728">
     <w:name w:val="Grid Table 2"/>
-    <w:basedOn w:val="902"/>
+    <w:basedOn w:val="859"/>
     <w:uiPriority w:val="99"/>
     <w:pPr>
       <w:pBdr/>
@@ -24957,9 +25155,9 @@
       </w:tcPr>
     </w:tblStylePr>
   </w:style>
-  <w:style w:type="table" w:styleId="772">
+  <w:style w:type="table" w:styleId="729">
     <w:name w:val="Grid Table 2 - Accent 1"/>
-    <w:basedOn w:val="902"/>
+    <w:basedOn w:val="859"/>
     <w:uiPriority w:val="99"/>
     <w:pPr>
       <w:pBdr/>
@@ -25189,9 +25387,9 @@
       </w:tcPr>
     </w:tblStylePr>
   </w:style>
-  <w:style w:type="table" w:styleId="773">
+  <w:style w:type="table" w:styleId="730">
     <w:name w:val="Grid Table 2 - Accent 2"/>
-    <w:basedOn w:val="902"/>
+    <w:basedOn w:val="859"/>
     <w:uiPriority w:val="99"/>
     <w:pPr>
       <w:pBdr/>
@@ -25421,9 +25619,9 @@
       </w:tcPr>
     </w:tblStylePr>
   </w:style>
-  <w:style w:type="table" w:styleId="774">
+  <w:style w:type="table" w:styleId="731">
     <w:name w:val="Grid Table 2 - Accent 3"/>
-    <w:basedOn w:val="902"/>
+    <w:basedOn w:val="859"/>
     <w:uiPriority w:val="99"/>
     <w:pPr>
       <w:pBdr/>
@@ -25653,9 +25851,9 @@
       </w:tcPr>
     </w:tblStylePr>
   </w:style>
-  <w:style w:type="table" w:styleId="775">
+  <w:style w:type="table" w:styleId="732">
     <w:name w:val="Grid Table 2 - Accent 4"/>
-    <w:basedOn w:val="902"/>
+    <w:basedOn w:val="859"/>
     <w:uiPriority w:val="99"/>
     <w:pPr>
       <w:pBdr/>
@@ -25885,9 +26083,9 @@
       </w:tcPr>
     </w:tblStylePr>
   </w:style>
-  <w:style w:type="table" w:styleId="776">
+  <w:style w:type="table" w:styleId="733">
     <w:name w:val="Grid Table 2 - Accent 5"/>
-    <w:basedOn w:val="902"/>
+    <w:basedOn w:val="859"/>
     <w:uiPriority w:val="99"/>
     <w:pPr>
       <w:pBdr/>
@@ -26117,9 +26315,9 @@
       </w:tcPr>
     </w:tblStylePr>
   </w:style>
-  <w:style w:type="table" w:styleId="777">
+  <w:style w:type="table" w:styleId="734">
     <w:name w:val="Grid Table 2 - Accent 6"/>
-    <w:basedOn w:val="902"/>
+    <w:basedOn w:val="859"/>
     <w:uiPriority w:val="99"/>
     <w:pPr>
       <w:pBdr/>
@@ -26349,9 +26547,9 @@
       </w:tcPr>
     </w:tblStylePr>
   </w:style>
-  <w:style w:type="table" w:styleId="778">
+  <w:style w:type="table" w:styleId="735">
     <w:name w:val="Grid Table 3"/>
-    <w:basedOn w:val="902"/>
+    <w:basedOn w:val="859"/>
     <w:uiPriority w:val="99"/>
     <w:pPr>
       <w:pBdr/>
@@ -26594,9 +26792,9 @@
       </w:tcPr>
     </w:tblStylePr>
   </w:style>
-  <w:style w:type="table" w:styleId="779">
+  <w:style w:type="table" w:styleId="736">
     <w:name w:val="Grid Table 3 - Accent 1"/>
-    <w:basedOn w:val="902"/>
+    <w:basedOn w:val="859"/>
     <w:uiPriority w:val="99"/>
     <w:pPr>
       <w:pBdr/>
@@ -26839,9 +27037,9 @@
       </w:tcPr>
     </w:tblStylePr>
   </w:style>
-  <w:style w:type="table" w:styleId="780">
+  <w:style w:type="table" w:styleId="737">
     <w:name w:val="Grid Table 3 - Accent 2"/>
-    <w:basedOn w:val="902"/>
+    <w:basedOn w:val="859"/>
     <w:uiPriority w:val="99"/>
     <w:pPr>
       <w:pBdr/>
@@ -27084,9 +27282,9 @@
       </w:tcPr>
     </w:tblStylePr>
   </w:style>
-  <w:style w:type="table" w:styleId="781">
+  <w:style w:type="table" w:styleId="738">
     <w:name w:val="Grid Table 3 - Accent 3"/>
-    <w:basedOn w:val="902"/>
+    <w:basedOn w:val="859"/>
     <w:uiPriority w:val="99"/>
     <w:pPr>
       <w:pBdr/>
@@ -27329,9 +27527,9 @@
       </w:tcPr>
     </w:tblStylePr>
   </w:style>
-  <w:style w:type="table" w:styleId="782">
+  <w:style w:type="table" w:styleId="739">
     <w:name w:val="Grid Table 3 - Accent 4"/>
-    <w:basedOn w:val="902"/>
+    <w:basedOn w:val="859"/>
     <w:uiPriority w:val="99"/>
     <w:pPr>
       <w:pBdr/>
@@ -27574,9 +27772,9 @@
       </w:tcPr>
     </w:tblStylePr>
   </w:style>
-  <w:style w:type="table" w:styleId="783">
+  <w:style w:type="table" w:styleId="740">
     <w:name w:val="Grid Table 3 - Accent 5"/>
-    <w:basedOn w:val="902"/>
+    <w:basedOn w:val="859"/>
     <w:uiPriority w:val="99"/>
     <w:pPr>
       <w:pBdr/>
@@ -27819,9 +28017,9 @@
       </w:tcPr>
     </w:tblStylePr>
   </w:style>
-  <w:style w:type="table" w:styleId="784">
+  <w:style w:type="table" w:styleId="741">
     <w:name w:val="Grid Table 3 - Accent 6"/>
-    <w:basedOn w:val="902"/>
+    <w:basedOn w:val="859"/>
     <w:uiPriority w:val="99"/>
     <w:pPr>
       <w:pBdr/>
@@ -28064,9 +28262,9 @@
       </w:tcPr>
     </w:tblStylePr>
   </w:style>
-  <w:style w:type="table" w:styleId="785">
+  <w:style w:type="table" w:styleId="742">
     <w:name w:val="Grid Table 4"/>
-    <w:basedOn w:val="902"/>
+    <w:basedOn w:val="859"/>
     <w:uiPriority w:val="59"/>
     <w:pPr>
       <w:pBdr/>
@@ -28297,9 +28495,9 @@
       </w:tcPr>
     </w:tblStylePr>
   </w:style>
-  <w:style w:type="table" w:styleId="786">
+  <w:style w:type="table" w:styleId="743">
     <w:name w:val="Grid Table 4 - Accent 1"/>
-    <w:basedOn w:val="902"/>
+    <w:basedOn w:val="859"/>
     <w:uiPriority w:val="59"/>
     <w:pPr>
       <w:pBdr/>
@@ -28530,9 +28728,9 @@
       </w:tcPr>
     </w:tblStylePr>
   </w:style>
-  <w:style w:type="table" w:styleId="787">
+  <w:style w:type="table" w:styleId="744">
     <w:name w:val="Grid Table 4 - Accent 2"/>
-    <w:basedOn w:val="902"/>
+    <w:basedOn w:val="859"/>
     <w:uiPriority w:val="59"/>
     <w:pPr>
       <w:pBdr/>
@@ -28763,9 +28961,9 @@
       </w:tcPr>
     </w:tblStylePr>
   </w:style>
-  <w:style w:type="table" w:styleId="788">
+  <w:style w:type="table" w:styleId="745">
     <w:name w:val="Grid Table 4 - Accent 3"/>
-    <w:basedOn w:val="902"/>
+    <w:basedOn w:val="859"/>
     <w:uiPriority w:val="59"/>
     <w:pPr>
       <w:pBdr/>
@@ -28996,9 +29194,9 @@
       </w:tcPr>
     </w:tblStylePr>
   </w:style>
-  <w:style w:type="table" w:styleId="789">
+  <w:style w:type="table" w:styleId="746">
     <w:name w:val="Grid Table 4 - Accent 4"/>
-    <w:basedOn w:val="902"/>
+    <w:basedOn w:val="859"/>
     <w:uiPriority w:val="59"/>
     <w:pPr>
       <w:pBdr/>
@@ -29229,9 +29427,9 @@
       </w:tcPr>
     </w:tblStylePr>
   </w:style>
-  <w:style w:type="table" w:styleId="790">
+  <w:style w:type="table" w:styleId="747">
     <w:name w:val="Grid Table 4 - Accent 5"/>
-    <w:basedOn w:val="902"/>
+    <w:basedOn w:val="859"/>
     <w:uiPriority w:val="59"/>
     <w:pPr>
       <w:pBdr/>
@@ -29462,9 +29660,9 @@
       </w:tcPr>
     </w:tblStylePr>
   </w:style>
-  <w:style w:type="table" w:styleId="791">
+  <w:style w:type="table" w:styleId="748">
     <w:name w:val="Grid Table 4 - Accent 6"/>
-    <w:basedOn w:val="902"/>
+    <w:basedOn w:val="859"/>
     <w:uiPriority w:val="59"/>
     <w:pPr>
       <w:pBdr/>
@@ -29695,9 +29893,9 @@
       </w:tcPr>
     </w:tblStylePr>
   </w:style>
-  <w:style w:type="table" w:styleId="792">
+  <w:style w:type="table" w:styleId="749">
     <w:name w:val="Grid Table 5 Dark"/>
-    <w:basedOn w:val="902"/>
+    <w:basedOn w:val="859"/>
     <w:uiPriority w:val="99"/>
     <w:pPr>
       <w:pBdr/>
@@ -29923,9 +30121,9 @@
       </w:tcPr>
     </w:tblStylePr>
   </w:style>
-  <w:style w:type="table" w:styleId="793">
+  <w:style w:type="table" w:styleId="750">
     <w:name w:val="Grid Table 5 Dark- Accent 1"/>
-    <w:basedOn w:val="902"/>
+    <w:basedOn w:val="859"/>
     <w:uiPriority w:val="99"/>
     <w:pPr>
       <w:pBdr/>
@@ -30151,9 +30349,9 @@
       </w:tcPr>
     </w:tblStylePr>
   </w:style>
-  <w:style w:type="table" w:styleId="794">
+  <w:style w:type="table" w:styleId="751">
     <w:name w:val="Grid Table 5 Dark - Accent 2"/>
-    <w:basedOn w:val="902"/>
+    <w:basedOn w:val="859"/>
     <w:uiPriority w:val="99"/>
     <w:pPr>
       <w:pBdr/>
@@ -30379,9 +30577,9 @@
       </w:tcPr>
     </w:tblStylePr>
   </w:style>
-  <w:style w:type="table" w:styleId="795">
+  <w:style w:type="table" w:styleId="752">
     <w:name w:val="Grid Table 5 Dark - Accent 3"/>
-    <w:basedOn w:val="902"/>
+    <w:basedOn w:val="859"/>
     <w:uiPriority w:val="99"/>
     <w:pPr>
       <w:pBdr/>
@@ -30607,9 +30805,9 @@
       </w:tcPr>
     </w:tblStylePr>
   </w:style>
-  <w:style w:type="table" w:styleId="796">
+  <w:style w:type="table" w:styleId="753">
     <w:name w:val="Grid Table 5 Dark- Accent 4"/>
-    <w:basedOn w:val="902"/>
+    <w:basedOn w:val="859"/>
     <w:uiPriority w:val="99"/>
     <w:pPr>
       <w:pBdr/>
@@ -30835,9 +31033,9 @@
       </w:tcPr>
     </w:tblStylePr>
   </w:style>
-  <w:style w:type="table" w:styleId="797">
+  <w:style w:type="table" w:styleId="754">
     <w:name w:val="Grid Table 5 Dark - Accent 5"/>
-    <w:basedOn w:val="902"/>
+    <w:basedOn w:val="859"/>
     <w:uiPriority w:val="99"/>
     <w:pPr>
       <w:pBdr/>
@@ -31063,9 +31261,9 @@
       </w:tcPr>
     </w:tblStylePr>
   </w:style>
-  <w:style w:type="table" w:styleId="798">
+  <w:style w:type="table" w:styleId="755">
     <w:name w:val="Grid Table 5 Dark - Accent 6"/>
-    <w:basedOn w:val="902"/>
+    <w:basedOn w:val="859"/>
     <w:uiPriority w:val="99"/>
     <w:pPr>
       <w:pBdr/>
@@ -31291,9 +31489,9 @@
       </w:tcPr>
     </w:tblStylePr>
   </w:style>
-  <w:style w:type="table" w:styleId="799">
+  <w:style w:type="table" w:styleId="756">
     <w:name w:val="Grid Table 6 Colorful"/>
-    <w:basedOn w:val="902"/>
+    <w:basedOn w:val="859"/>
     <w:uiPriority w:val="99"/>
     <w:pPr>
       <w:pBdr/>
@@ -31521,9 +31719,9 @@
       </w:tcPr>
     </w:tblStylePr>
   </w:style>
-  <w:style w:type="table" w:styleId="800">
+  <w:style w:type="table" w:styleId="757">
     <w:name w:val="Grid Table 6 Colorful - Accent 1"/>
-    <w:basedOn w:val="902"/>
+    <w:basedOn w:val="859"/>
     <w:uiPriority w:val="99"/>
     <w:pPr>
       <w:pBdr/>
@@ -31751,9 +31949,9 @@
       </w:tcPr>
     </w:tblStylePr>
   </w:style>
-  <w:style w:type="table" w:styleId="801">
+  <w:style w:type="table" w:styleId="758">
     <w:name w:val="Grid Table 6 Colorful - Accent 2"/>
-    <w:basedOn w:val="902"/>
+    <w:basedOn w:val="859"/>
     <w:uiPriority w:val="99"/>
     <w:pPr>
       <w:pBdr/>
@@ -31981,9 +32179,9 @@
       </w:tcPr>
     </w:tblStylePr>
   </w:style>
-  <w:style w:type="table" w:styleId="802">
+  <w:style w:type="table" w:styleId="759">
     <w:name w:val="Grid Table 6 Colorful - Accent 3"/>
-    <w:basedOn w:val="902"/>
+    <w:basedOn w:val="859"/>
     <w:uiPriority w:val="99"/>
     <w:pPr>
       <w:pBdr/>
@@ -32211,9 +32409,9 @@
       </w:tcPr>
     </w:tblStylePr>
   </w:style>
-  <w:style w:type="table" w:styleId="803">
+  <w:style w:type="table" w:styleId="760">
     <w:name w:val="Grid Table 6 Colorful - Accent 4"/>
-    <w:basedOn w:val="902"/>
+    <w:basedOn w:val="859"/>
     <w:uiPriority w:val="99"/>
     <w:pPr>
       <w:pBdr/>
@@ -32441,9 +32639,9 @@
       </w:tcPr>
     </w:tblStylePr>
   </w:style>
-  <w:style w:type="table" w:styleId="804">
+  <w:style w:type="table" w:styleId="761">
     <w:name w:val="Grid Table 6 Colorful - Accent 5"/>
-    <w:basedOn w:val="902"/>
+    <w:basedOn w:val="859"/>
     <w:uiPriority w:val="99"/>
     <w:pPr>
       <w:pBdr/>
@@ -32671,9 +32869,9 @@
       </w:tcPr>
     </w:tblStylePr>
   </w:style>
-  <w:style w:type="table" w:styleId="805">
+  <w:style w:type="table" w:styleId="762">
     <w:name w:val="Grid Table 6 Colorful - Accent 6"/>
-    <w:basedOn w:val="902"/>
+    <w:basedOn w:val="859"/>
     <w:uiPriority w:val="99"/>
     <w:pPr>
       <w:pBdr/>
@@ -32901,9 +33099,9 @@
       </w:tcPr>
     </w:tblStylePr>
   </w:style>
-  <w:style w:type="table" w:styleId="806">
+  <w:style w:type="table" w:styleId="763">
     <w:name w:val="Grid Table 7 Colorful"/>
-    <w:basedOn w:val="902"/>
+    <w:basedOn w:val="859"/>
     <w:uiPriority w:val="99"/>
     <w:pPr>
       <w:pBdr/>
@@ -33155,9 +33353,9 @@
       </w:tcPr>
     </w:tblStylePr>
   </w:style>
-  <w:style w:type="table" w:styleId="807">
+  <w:style w:type="table" w:styleId="764">
     <w:name w:val="Grid Table 7 Colorful - Accent 1"/>
-    <w:basedOn w:val="902"/>
+    <w:basedOn w:val="859"/>
     <w:uiPriority w:val="99"/>
     <w:pPr>
       <w:pBdr/>
@@ -33409,9 +33607,9 @@
       </w:tcPr>
     </w:tblStylePr>
   </w:style>
-  <w:style w:type="table" w:styleId="808">
+  <w:style w:type="table" w:styleId="765">
     <w:name w:val="Grid Table 7 Colorful - Accent 2"/>
-    <w:basedOn w:val="902"/>
+    <w:basedOn w:val="859"/>
     <w:uiPriority w:val="99"/>
     <w:pPr>
       <w:pBdr/>
@@ -33663,9 +33861,9 @@
       </w:tcPr>
     </w:tblStylePr>
   </w:style>
-  <w:style w:type="table" w:styleId="809">
+  <w:style w:type="table" w:styleId="766">
     <w:name w:val="Grid Table 7 Colorful - Accent 3"/>
-    <w:basedOn w:val="902"/>
+    <w:basedOn w:val="859"/>
     <w:uiPriority w:val="99"/>
     <w:pPr>
       <w:pBdr/>
@@ -33917,9 +34115,9 @@
       </w:tcPr>
     </w:tblStylePr>
   </w:style>
-  <w:style w:type="table" w:styleId="810">
+  <w:style w:type="table" w:styleId="767">
     <w:name w:val="Grid Table 7 Colorful - Accent 4"/>
-    <w:basedOn w:val="902"/>
+    <w:basedOn w:val="859"/>
     <w:uiPriority w:val="99"/>
     <w:pPr>
       <w:pBdr/>
@@ -34171,9 +34369,9 @@
       </w:tcPr>
     </w:tblStylePr>
   </w:style>
-  <w:style w:type="table" w:styleId="811">
+  <w:style w:type="table" w:styleId="768">
     <w:name w:val="Grid Table 7 Colorful - Accent 5"/>
-    <w:basedOn w:val="902"/>
+    <w:basedOn w:val="859"/>
     <w:uiPriority w:val="99"/>
     <w:pPr>
       <w:pBdr/>
@@ -34425,9 +34623,9 @@
       </w:tcPr>
     </w:tblStylePr>
   </w:style>
-  <w:style w:type="table" w:styleId="812">
+  <w:style w:type="table" w:styleId="769">
     <w:name w:val="Grid Table 7 Colorful - Accent 6"/>
-    <w:basedOn w:val="902"/>
+    <w:basedOn w:val="859"/>
     <w:uiPriority w:val="99"/>
     <w:pPr>
       <w:pBdr/>
@@ -34679,9 +34877,9 @@
       </w:tcPr>
     </w:tblStylePr>
   </w:style>
-  <w:style w:type="table" w:styleId="813">
+  <w:style w:type="table" w:styleId="770">
     <w:name w:val="List Table 1 Light"/>
-    <w:basedOn w:val="902"/>
+    <w:basedOn w:val="859"/>
     <w:uiPriority w:val="99"/>
     <w:pPr>
       <w:pBdr/>
@@ -34895,9 +35093,9 @@
       </w:tcPr>
     </w:tblStylePr>
   </w:style>
-  <w:style w:type="table" w:styleId="814">
+  <w:style w:type="table" w:styleId="771">
     <w:name w:val="List Table 1 Light - Accent 1"/>
-    <w:basedOn w:val="902"/>
+    <w:basedOn w:val="859"/>
     <w:uiPriority w:val="99"/>
     <w:pPr>
       <w:pBdr/>
@@ -35111,9 +35309,9 @@
       </w:tcPr>
     </w:tblStylePr>
   </w:style>
-  <w:style w:type="table" w:styleId="815">
+  <w:style w:type="table" w:styleId="772">
     <w:name w:val="List Table 1 Light - Accent 2"/>
-    <w:basedOn w:val="902"/>
+    <w:basedOn w:val="859"/>
     <w:uiPriority w:val="99"/>
     <w:pPr>
       <w:pBdr/>
@@ -35327,9 +35525,9 @@
       </w:tcPr>
     </w:tblStylePr>
   </w:style>
-  <w:style w:type="table" w:styleId="816">
+  <w:style w:type="table" w:styleId="773">
     <w:name w:val="List Table 1 Light - Accent 3"/>
-    <w:basedOn w:val="902"/>
+    <w:basedOn w:val="859"/>
     <w:uiPriority w:val="99"/>
     <w:pPr>
       <w:pBdr/>
@@ -35543,9 +35741,9 @@
       </w:tcPr>
     </w:tblStylePr>
   </w:style>
-  <w:style w:type="table" w:styleId="817">
+  <w:style w:type="table" w:styleId="774">
     <w:name w:val="List Table 1 Light - Accent 4"/>
-    <w:basedOn w:val="902"/>
+    <w:basedOn w:val="859"/>
     <w:uiPriority w:val="99"/>
     <w:pPr>
       <w:pBdr/>
@@ -35759,9 +35957,9 @@
       </w:tcPr>
     </w:tblStylePr>
   </w:style>
-  <w:style w:type="table" w:styleId="818">
+  <w:style w:type="table" w:styleId="775">
     <w:name w:val="List Table 1 Light - Accent 5"/>
-    <w:basedOn w:val="902"/>
+    <w:basedOn w:val="859"/>
     <w:uiPriority w:val="99"/>
     <w:pPr>
       <w:pBdr/>
@@ -35975,9 +36173,9 @@
       </w:tcPr>
     </w:tblStylePr>
   </w:style>
-  <w:style w:type="table" w:styleId="819">
+  <w:style w:type="table" w:styleId="776">
     <w:name w:val="List Table 1 Light - Accent 6"/>
-    <w:basedOn w:val="902"/>
+    <w:basedOn w:val="859"/>
     <w:uiPriority w:val="99"/>
     <w:pPr>
       <w:pBdr/>
@@ -36191,9 +36389,9 @@
       </w:tcPr>
     </w:tblStylePr>
   </w:style>
-  <w:style w:type="table" w:styleId="820">
+  <w:style w:type="table" w:styleId="777">
     <w:name w:val="List Table 2"/>
-    <w:basedOn w:val="902"/>
+    <w:basedOn w:val="859"/>
     <w:uiPriority w:val="99"/>
     <w:pPr>
       <w:pBdr/>
@@ -36429,9 +36627,9 @@
       </w:tcPr>
     </w:tblStylePr>
   </w:style>
-  <w:style w:type="table" w:styleId="821">
+  <w:style w:type="table" w:styleId="778">
     <w:name w:val="List Table 2 - Accent 1"/>
-    <w:basedOn w:val="902"/>
+    <w:basedOn w:val="859"/>
     <w:uiPriority w:val="99"/>
     <w:pPr>
       <w:pBdr/>
@@ -36667,9 +36865,9 @@
       </w:tcPr>
     </w:tblStylePr>
   </w:style>
-  <w:style w:type="table" w:styleId="822">
+  <w:style w:type="table" w:styleId="779">
     <w:name w:val="List Table 2 - Accent 2"/>
-    <w:basedOn w:val="902"/>
+    <w:basedOn w:val="859"/>
     <w:uiPriority w:val="99"/>
     <w:pPr>
       <w:pBdr/>
@@ -36905,9 +37103,9 @@
       </w:tcPr>
     </w:tblStylePr>
   </w:style>
-  <w:style w:type="table" w:styleId="823">
+  <w:style w:type="table" w:styleId="780">
     <w:name w:val="List Table 2 - Accent 3"/>
-    <w:basedOn w:val="902"/>
+    <w:basedOn w:val="859"/>
     <w:uiPriority w:val="99"/>
     <w:pPr>
       <w:pBdr/>
@@ -37143,9 +37341,9 @@
       </w:tcPr>
     </w:tblStylePr>
   </w:style>
-  <w:style w:type="table" w:styleId="824">
+  <w:style w:type="table" w:styleId="781">
     <w:name w:val="List Table 2 - Accent 4"/>
-    <w:basedOn w:val="902"/>
+    <w:basedOn w:val="859"/>
     <w:uiPriority w:val="99"/>
     <w:pPr>
       <w:pBdr/>
@@ -37381,9 +37579,9 @@
       </w:tcPr>
     </w:tblStylePr>
   </w:style>
-  <w:style w:type="table" w:styleId="825">
+  <w:style w:type="table" w:styleId="782">
     <w:name w:val="List Table 2 - Accent 5"/>
-    <w:basedOn w:val="902"/>
+    <w:basedOn w:val="859"/>
     <w:uiPriority w:val="99"/>
     <w:pPr>
       <w:pBdr/>
@@ -37619,9 +37817,9 @@
       </w:tcPr>
     </w:tblStylePr>
   </w:style>
-  <w:style w:type="table" w:styleId="826">
+  <w:style w:type="table" w:styleId="783">
     <w:name w:val="List Table 2 - Accent 6"/>
-    <w:basedOn w:val="902"/>
+    <w:basedOn w:val="859"/>
     <w:uiPriority w:val="99"/>
     <w:pPr>
       <w:pBdr/>
@@ -37857,9 +38055,9 @@
       </w:tcPr>
     </w:tblStylePr>
   </w:style>
-  <w:style w:type="table" w:styleId="827">
+  <w:style w:type="table" w:styleId="784">
     <w:name w:val="List Table 3"/>
-    <w:basedOn w:val="902"/>
+    <w:basedOn w:val="859"/>
     <w:uiPriority w:val="99"/>
     <w:pPr>
       <w:pBdr/>
@@ -38085,9 +38283,9 @@
       </w:tcPr>
     </w:tblStylePr>
   </w:style>
-  <w:style w:type="table" w:styleId="828">
+  <w:style w:type="table" w:styleId="785">
     <w:name w:val="List Table 3 - Accent 1"/>
-    <w:basedOn w:val="902"/>
+    <w:basedOn w:val="859"/>
     <w:uiPriority w:val="99"/>
     <w:pPr>
       <w:pBdr/>
@@ -38313,9 +38511,9 @@
       </w:tcPr>
     </w:tblStylePr>
   </w:style>
-  <w:style w:type="table" w:styleId="829">
+  <w:style w:type="table" w:styleId="786">
     <w:name w:val="List Table 3 - Accent 2"/>
-    <w:basedOn w:val="902"/>
+    <w:basedOn w:val="859"/>
     <w:uiPriority w:val="99"/>
     <w:pPr>
       <w:pBdr/>
@@ -38541,9 +38739,9 @@
       </w:tcPr>
     </w:tblStylePr>
   </w:style>
-  <w:style w:type="table" w:styleId="830">
+  <w:style w:type="table" w:styleId="787">
     <w:name w:val="List Table 3 - Accent 3"/>
-    <w:basedOn w:val="902"/>
+    <w:basedOn w:val="859"/>
     <w:uiPriority w:val="99"/>
     <w:pPr>
       <w:pBdr/>
@@ -38769,9 +38967,9 @@
       </w:tcPr>
     </w:tblStylePr>
   </w:style>
-  <w:style w:type="table" w:styleId="831">
+  <w:style w:type="table" w:styleId="788">
     <w:name w:val="List Table 3 - Accent 4"/>
-    <w:basedOn w:val="902"/>
+    <w:basedOn w:val="859"/>
     <w:uiPriority w:val="99"/>
     <w:pPr>
       <w:pBdr/>
@@ -38997,9 +39195,9 @@
       </w:tcPr>
     </w:tblStylePr>
   </w:style>
-  <w:style w:type="table" w:styleId="832">
+  <w:style w:type="table" w:styleId="789">
     <w:name w:val="List Table 3 - Accent 5"/>
-    <w:basedOn w:val="902"/>
+    <w:basedOn w:val="859"/>
     <w:uiPriority w:val="99"/>
     <w:pPr>
       <w:pBdr/>
@@ -39225,9 +39423,9 @@
       </w:tcPr>
     </w:tblStylePr>
   </w:style>
-  <w:style w:type="table" w:styleId="833">
+  <w:style w:type="table" w:styleId="790">
     <w:name w:val="List Table 3 - Accent 6"/>
-    <w:basedOn w:val="902"/>
+    <w:basedOn w:val="859"/>
     <w:uiPriority w:val="99"/>
     <w:pPr>
       <w:pBdr/>
@@ -39453,9 +39651,9 @@
       </w:tcPr>
     </w:tblStylePr>
   </w:style>
-  <w:style w:type="table" w:styleId="834">
+  <w:style w:type="table" w:styleId="791">
     <w:name w:val="List Table 4"/>
-    <w:basedOn w:val="902"/>
+    <w:basedOn w:val="859"/>
     <w:uiPriority w:val="99"/>
     <w:pPr>
       <w:pBdr/>
@@ -39678,9 +39876,9 @@
       </w:tcPr>
     </w:tblStylePr>
   </w:style>
-  <w:style w:type="table" w:styleId="835">
+  <w:style w:type="table" w:styleId="792">
     <w:name w:val="List Table 4 - Accent 1"/>
-    <w:basedOn w:val="902"/>
+    <w:basedOn w:val="859"/>
     <w:uiPriority w:val="99"/>
     <w:pPr>
       <w:pBdr/>
@@ -39903,9 +40101,9 @@
       </w:tcPr>
     </w:tblStylePr>
   </w:style>
-  <w:style w:type="table" w:styleId="836">
+  <w:style w:type="table" w:styleId="793">
     <w:name w:val="List Table 4 - Accent 2"/>
-    <w:basedOn w:val="902"/>
+    <w:basedOn w:val="859"/>
     <w:uiPriority w:val="99"/>
     <w:pPr>
       <w:pBdr/>
@@ -40128,9 +40326,9 @@
       </w:tcPr>
     </w:tblStylePr>
   </w:style>
-  <w:style w:type="table" w:styleId="837">
+  <w:style w:type="table" w:styleId="794">
     <w:name w:val="List Table 4 - Accent 3"/>
-    <w:basedOn w:val="902"/>
+    <w:basedOn w:val="859"/>
     <w:uiPriority w:val="99"/>
     <w:pPr>
       <w:pBdr/>
@@ -40353,9 +40551,9 @@
       </w:tcPr>
     </w:tblStylePr>
   </w:style>
-  <w:style w:type="table" w:styleId="838">
+  <w:style w:type="table" w:styleId="795">
     <w:name w:val="List Table 4 - Accent 4"/>
-    <w:basedOn w:val="902"/>
+    <w:basedOn w:val="859"/>
     <w:uiPriority w:val="99"/>
     <w:pPr>
       <w:pBdr/>
@@ -40578,9 +40776,9 @@
       </w:tcPr>
     </w:tblStylePr>
   </w:style>
-  <w:style w:type="table" w:styleId="839">
+  <w:style w:type="table" w:styleId="796">
     <w:name w:val="List Table 4 - Accent 5"/>
-    <w:basedOn w:val="902"/>
+    <w:basedOn w:val="859"/>
     <w:uiPriority w:val="99"/>
     <w:pPr>
       <w:pBdr/>
@@ -40803,9 +41001,9 @@
       </w:tcPr>
     </w:tblStylePr>
   </w:style>
-  <w:style w:type="table" w:styleId="840">
+  <w:style w:type="table" w:styleId="797">
     <w:name w:val="List Table 4 - Accent 6"/>
-    <w:basedOn w:val="902"/>
+    <w:basedOn w:val="859"/>
     <w:uiPriority w:val="99"/>
     <w:pPr>
       <w:pBdr/>
@@ -41028,9 +41226,9 @@
       </w:tcPr>
     </w:tblStylePr>
   </w:style>
-  <w:style w:type="table" w:styleId="841">
+  <w:style w:type="table" w:styleId="798">
     <w:name w:val="List Table 5 Dark"/>
-    <w:basedOn w:val="902"/>
+    <w:basedOn w:val="859"/>
     <w:uiPriority w:val="99"/>
     <w:pPr>
       <w:pBdr/>
@@ -41270,9 +41468,9 @@
       </w:tcPr>
     </w:tblStylePr>
   </w:style>
-  <w:style w:type="table" w:styleId="842">
+  <w:style w:type="table" w:styleId="799">
     <w:name w:val="List Table 5 Dark - Accent 1"/>
-    <w:basedOn w:val="902"/>
+    <w:basedOn w:val="859"/>
     <w:uiPriority w:val="99"/>
     <w:pPr>
       <w:pBdr/>
@@ -41512,9 +41710,9 @@
       </w:tcPr>
     </w:tblStylePr>
   </w:style>
-  <w:style w:type="table" w:styleId="843">
+  <w:style w:type="table" w:styleId="800">
     <w:name w:val="List Table 5 Dark - Accent 2"/>
-    <w:basedOn w:val="902"/>
+    <w:basedOn w:val="859"/>
     <w:uiPriority w:val="99"/>
     <w:pPr>
       <w:pBdr/>
@@ -41754,9 +41952,9 @@
       </w:tcPr>
     </w:tblStylePr>
   </w:style>
-  <w:style w:type="table" w:styleId="844">
+  <w:style w:type="table" w:styleId="801">
     <w:name w:val="List Table 5 Dark - Accent 3"/>
-    <w:basedOn w:val="902"/>
+    <w:basedOn w:val="859"/>
     <w:uiPriority w:val="99"/>
     <w:pPr>
       <w:pBdr/>
@@ -41996,9 +42194,9 @@
       </w:tcPr>
     </w:tblStylePr>
   </w:style>
-  <w:style w:type="table" w:styleId="845">
+  <w:style w:type="table" w:styleId="802">
     <w:name w:val="List Table 5 Dark - Accent 4"/>
-    <w:basedOn w:val="902"/>
+    <w:basedOn w:val="859"/>
     <w:uiPriority w:val="99"/>
     <w:pPr>
       <w:pBdr/>
@@ -42238,9 +42436,9 @@
       </w:tcPr>
     </w:tblStylePr>
   </w:style>
-  <w:style w:type="table" w:styleId="846">
+  <w:style w:type="table" w:styleId="803">
     <w:name w:val="List Table 5 Dark - Accent 5"/>
-    <w:basedOn w:val="902"/>
+    <w:basedOn w:val="859"/>
     <w:uiPriority w:val="99"/>
     <w:pPr>
       <w:pBdr/>
@@ -42480,9 +42678,9 @@
       </w:tcPr>
     </w:tblStylePr>
   </w:style>
-  <w:style w:type="table" w:styleId="847">
+  <w:style w:type="table" w:styleId="804">
     <w:name w:val="List Table 5 Dark - Accent 6"/>
-    <w:basedOn w:val="902"/>
+    <w:basedOn w:val="859"/>
     <w:uiPriority w:val="99"/>
     <w:pPr>
       <w:pBdr/>
@@ -42722,9 +42920,9 @@
       </w:tcPr>
     </w:tblStylePr>
   </w:style>
-  <w:style w:type="table" w:styleId="848">
+  <w:style w:type="table" w:styleId="805">
     <w:name w:val="List Table 6 Colorful"/>
-    <w:basedOn w:val="902"/>
+    <w:basedOn w:val="859"/>
     <w:uiPriority w:val="99"/>
     <w:pPr>
       <w:pBdr/>
@@ -42945,9 +43143,9 @@
       </w:tcPr>
     </w:tblStylePr>
   </w:style>
-  <w:style w:type="table" w:styleId="849">
+  <w:style w:type="table" w:styleId="806">
     <w:name w:val="List Table 6 Colorful - Accent 1"/>
-    <w:basedOn w:val="902"/>
+    <w:basedOn w:val="859"/>
     <w:uiPriority w:val="99"/>
     <w:pPr>
       <w:pBdr/>
@@ -43168,9 +43366,9 @@
       </w:tcPr>
     </w:tblStylePr>
   </w:style>
-  <w:style w:type="table" w:styleId="850">
+  <w:style w:type="table" w:styleId="807">
     <w:name w:val="List Table 6 Colorful - Accent 2"/>
-    <w:basedOn w:val="902"/>
+    <w:basedOn w:val="859"/>
     <w:uiPriority w:val="99"/>
     <w:pPr>
       <w:pBdr/>
@@ -43391,9 +43589,9 @@
       </w:tcPr>
     </w:tblStylePr>
   </w:style>
-  <w:style w:type="table" w:styleId="851">
+  <w:style w:type="table" w:styleId="808">
     <w:name w:val="List Table 6 Colorful - Accent 3"/>
-    <w:basedOn w:val="902"/>
+    <w:basedOn w:val="859"/>
     <w:uiPriority w:val="99"/>
     <w:pPr>
       <w:pBdr/>
@@ -43614,9 +43812,9 @@
       </w:tcPr>
     </w:tblStylePr>
   </w:style>
-  <w:style w:type="table" w:styleId="852">
+  <w:style w:type="table" w:styleId="809">
     <w:name w:val="List Table 6 Colorful - Accent 4"/>
-    <w:basedOn w:val="902"/>
+    <w:basedOn w:val="859"/>
     <w:uiPriority w:val="99"/>
     <w:pPr>
       <w:pBdr/>
@@ -43837,9 +44035,9 @@
       </w:tcPr>
     </w:tblStylePr>
   </w:style>
-  <w:style w:type="table" w:styleId="853">
+  <w:style w:type="table" w:styleId="810">
     <w:name w:val="List Table 6 Colorful - Accent 5"/>
-    <w:basedOn w:val="902"/>
+    <w:basedOn w:val="859"/>
     <w:uiPriority w:val="99"/>
     <w:pPr>
       <w:pBdr/>
@@ -44060,9 +44258,9 @@
       </w:tcPr>
     </w:tblStylePr>
   </w:style>
-  <w:style w:type="table" w:styleId="854">
+  <w:style w:type="table" w:styleId="811">
     <w:name w:val="List Table 6 Colorful - Accent 6"/>
-    <w:basedOn w:val="902"/>
+    <w:basedOn w:val="859"/>
     <w:uiPriority w:val="99"/>
     <w:pPr>
       <w:pBdr/>
@@ -44283,9 +44481,9 @@
       </w:tcPr>
     </w:tblStylePr>
   </w:style>
-  <w:style w:type="table" w:styleId="855">
+  <w:style w:type="table" w:styleId="812">
     <w:name w:val="List Table 7 Colorful"/>
-    <w:basedOn w:val="902"/>
+    <w:basedOn w:val="859"/>
     <w:uiPriority w:val="99"/>
     <w:pPr>
       <w:pBdr/>
@@ -44539,9 +44737,9 @@
       </w:tcPr>
     </w:tblStylePr>
   </w:style>
-  <w:style w:type="table" w:styleId="856">
+  <w:style w:type="table" w:styleId="813">
     <w:name w:val="List Table 7 Colorful - Accent 1"/>
-    <w:basedOn w:val="902"/>
+    <w:basedOn w:val="859"/>
     <w:uiPriority w:val="99"/>
     <w:pPr>
       <w:pBdr/>
@@ -44795,9 +44993,9 @@
       </w:tcPr>
     </w:tblStylePr>
   </w:style>
-  <w:style w:type="table" w:styleId="857">
+  <w:style w:type="table" w:styleId="814">
     <w:name w:val="List Table 7 Colorful - Accent 2"/>
-    <w:basedOn w:val="902"/>
+    <w:basedOn w:val="859"/>
     <w:uiPriority w:val="99"/>
     <w:pPr>
       <w:pBdr/>
@@ -45051,9 +45249,9 @@
       </w:tcPr>
     </w:tblStylePr>
   </w:style>
-  <w:style w:type="table" w:styleId="858">
+  <w:style w:type="table" w:styleId="815">
     <w:name w:val="List Table 7 Colorful - Accent 3"/>
-    <w:basedOn w:val="902"/>
+    <w:basedOn w:val="859"/>
     <w:uiPriority w:val="99"/>
     <w:pPr>
       <w:pBdr/>
@@ -45307,9 +45505,9 @@
       </w:tcPr>
     </w:tblStylePr>
   </w:style>
-  <w:style w:type="table" w:styleId="859">
+  <w:style w:type="table" w:styleId="816">
     <w:name w:val="List Table 7 Colorful - Accent 4"/>
-    <w:basedOn w:val="902"/>
+    <w:basedOn w:val="859"/>
     <w:uiPriority w:val="99"/>
     <w:pPr>
       <w:pBdr/>
@@ -45563,9 +45761,9 @@
       </w:tcPr>
     </w:tblStylePr>
   </w:style>
-  <w:style w:type="table" w:styleId="860">
+  <w:style w:type="table" w:styleId="817">
     <w:name w:val="List Table 7 Colorful - Accent 5"/>
-    <w:basedOn w:val="902"/>
+    <w:basedOn w:val="859"/>
     <w:uiPriority w:val="99"/>
     <w:pPr>
       <w:pBdr/>
@@ -45819,9 +46017,9 @@
       </w:tcPr>
     </w:tblStylePr>
   </w:style>
-  <w:style w:type="table" w:styleId="861">
+  <w:style w:type="table" w:styleId="818">
     <w:name w:val="List Table 7 Colorful - Accent 6"/>
-    <w:basedOn w:val="902"/>
+    <w:basedOn w:val="859"/>
     <w:uiPriority w:val="99"/>
     <w:pPr>
       <w:pBdr/>
@@ -46075,9 +46273,9 @@
       </w:tcPr>
     </w:tblStylePr>
   </w:style>
-  <w:style w:type="table" w:styleId="862">
+  <w:style w:type="table" w:styleId="819">
     <w:name w:val="Lined - Accent"/>
-    <w:basedOn w:val="902"/>
+    <w:basedOn w:val="859"/>
     <w:uiPriority w:val="99"/>
     <w:pPr>
       <w:pBdr/>
@@ -46312,9 +46510,9 @@
       </w:tcPr>
     </w:tblStylePr>
   </w:style>
-  <w:style w:type="table" w:styleId="863">
+  <w:style w:type="table" w:styleId="820">
     <w:name w:val="Lined - Accent 1"/>
-    <w:basedOn w:val="902"/>
+    <w:basedOn w:val="859"/>
     <w:uiPriority w:val="99"/>
     <w:pPr>
       <w:pBdr/>
@@ -46549,9 +46747,9 @@
       </w:tcPr>
     </w:tblStylePr>
   </w:style>
-  <w:style w:type="table" w:styleId="864">
+  <w:style w:type="table" w:styleId="821">
     <w:name w:val="Lined - Accent 2"/>
-    <w:basedOn w:val="902"/>
+    <w:basedOn w:val="859"/>
     <w:uiPriority w:val="99"/>
     <w:pPr>
       <w:pBdr/>
@@ -46786,9 +46984,9 @@
       </w:tcPr>
     </w:tblStylePr>
   </w:style>
-  <w:style w:type="table" w:styleId="865">
+  <w:style w:type="table" w:styleId="822">
     <w:name w:val="Lined - Accent 3"/>
-    <w:basedOn w:val="902"/>
+    <w:basedOn w:val="859"/>
     <w:uiPriority w:val="99"/>
     <w:pPr>
       <w:pBdr/>
@@ -47023,9 +47221,9 @@
       </w:tcPr>
     </w:tblStylePr>
   </w:style>
-  <w:style w:type="table" w:styleId="866">
+  <w:style w:type="table" w:styleId="823">
     <w:name w:val="Lined - Accent 4"/>
-    <w:basedOn w:val="902"/>
+    <w:basedOn w:val="859"/>
     <w:uiPriority w:val="99"/>
     <w:pPr>
       <w:pBdr/>
@@ -47260,9 +47458,9 @@
       </w:tcPr>
     </w:tblStylePr>
   </w:style>
-  <w:style w:type="table" w:styleId="867">
+  <w:style w:type="table" w:styleId="824">
     <w:name w:val="Lined - Accent 5"/>
-    <w:basedOn w:val="902"/>
+    <w:basedOn w:val="859"/>
     <w:uiPriority w:val="99"/>
     <w:pPr>
       <w:pBdr/>
@@ -47497,9 +47695,9 @@
       </w:tcPr>
     </w:tblStylePr>
   </w:style>
-  <w:style w:type="table" w:styleId="868">
+  <w:style w:type="table" w:styleId="825">
     <w:name w:val="Lined - Accent 6"/>
-    <w:basedOn w:val="902"/>
+    <w:basedOn w:val="859"/>
     <w:uiPriority w:val="99"/>
     <w:pPr>
       <w:pBdr/>
@@ -47734,9 +47932,9 @@
       </w:tcPr>
     </w:tblStylePr>
   </w:style>
-  <w:style w:type="table" w:styleId="869">
+  <w:style w:type="table" w:styleId="826">
     <w:name w:val="Bordered &amp; Lined - Accent"/>
-    <w:basedOn w:val="902"/>
+    <w:basedOn w:val="859"/>
     <w:uiPriority w:val="99"/>
     <w:pPr>
       <w:pBdr/>
@@ -47978,9 +48176,9 @@
       </w:tcPr>
     </w:tblStylePr>
   </w:style>
-  <w:style w:type="table" w:styleId="870">
+  <w:style w:type="table" w:styleId="827">
     <w:name w:val="Bordered &amp; Lined - Accent 1"/>
-    <w:basedOn w:val="902"/>
+    <w:basedOn w:val="859"/>
     <w:uiPriority w:val="99"/>
     <w:pPr>
       <w:pBdr/>
@@ -48222,9 +48420,9 @@
       </w:tcPr>
     </w:tblStylePr>
   </w:style>
-  <w:style w:type="table" w:styleId="871">
+  <w:style w:type="table" w:styleId="828">
     <w:name w:val="Bordered &amp; Lined - Accent 2"/>
-    <w:basedOn w:val="902"/>
+    <w:basedOn w:val="859"/>
     <w:uiPriority w:val="99"/>
     <w:pPr>
       <w:pBdr/>
@@ -48466,9 +48664,9 @@
       </w:tcPr>
     </w:tblStylePr>
   </w:style>
-  <w:style w:type="table" w:styleId="872">
+  <w:style w:type="table" w:styleId="829">
     <w:name w:val="Bordered &amp; Lined - Accent 3"/>
-    <w:basedOn w:val="902"/>
+    <w:basedOn w:val="859"/>
     <w:uiPriority w:val="99"/>
     <w:pPr>
       <w:pBdr/>
@@ -48710,9 +48908,9 @@
       </w:tcPr>
     </w:tblStylePr>
   </w:style>
-  <w:style w:type="table" w:styleId="873">
+  <w:style w:type="table" w:styleId="830">
     <w:name w:val="Bordered &amp; Lined - Accent 4"/>
-    <w:basedOn w:val="902"/>
+    <w:basedOn w:val="859"/>
     <w:uiPriority w:val="99"/>
     <w:pPr>
       <w:pBdr/>
@@ -48954,9 +49152,9 @@
       </w:tcPr>
     </w:tblStylePr>
   </w:style>
-  <w:style w:type="table" w:styleId="874">
+  <w:style w:type="table" w:styleId="831">
     <w:name w:val="Bordered &amp; Lined - Accent 5"/>
-    <w:basedOn w:val="902"/>
+    <w:basedOn w:val="859"/>
     <w:uiPriority w:val="99"/>
     <w:pPr>
       <w:pBdr/>
@@ -49198,9 +49396,9 @@
       </w:tcPr>
     </w:tblStylePr>
   </w:style>
-  <w:style w:type="table" w:styleId="875">
+  <w:style w:type="table" w:styleId="832">
     <w:name w:val="Bordered &amp; Lined - Accent 6"/>
-    <w:basedOn w:val="902"/>
+    <w:basedOn w:val="859"/>
     <w:uiPriority w:val="99"/>
     <w:pPr>
       <w:pBdr/>
@@ -49442,9 +49640,9 @@
       </w:tcPr>
     </w:tblStylePr>
   </w:style>
-  <w:style w:type="table" w:styleId="876">
+  <w:style w:type="table" w:styleId="833">
     <w:name w:val="Bordered"/>
-    <w:basedOn w:val="902"/>
+    <w:basedOn w:val="859"/>
     <w:uiPriority w:val="99"/>
     <w:pPr>
       <w:pBdr/>
@@ -49673,9 +49871,9 @@
       </w:tcPr>
     </w:tblStylePr>
   </w:style>
-  <w:style w:type="table" w:styleId="877">
+  <w:style w:type="table" w:styleId="834">
     <w:name w:val="Bordered - Accent 1"/>
-    <w:basedOn w:val="902"/>
+    <w:basedOn w:val="859"/>
     <w:uiPriority w:val="99"/>
     <w:pPr>
       <w:pBdr/>
@@ -49904,9 +50102,9 @@
       </w:tcPr>
     </w:tblStylePr>
   </w:style>
-  <w:style w:type="table" w:styleId="878">
+  <w:style w:type="table" w:styleId="835">
     <w:name w:val="Bordered - Accent 2"/>
-    <w:basedOn w:val="902"/>
+    <w:basedOn w:val="859"/>
     <w:uiPriority w:val="99"/>
     <w:pPr>
       <w:pBdr/>
@@ -50135,9 +50333,9 @@
       </w:tcPr>
     </w:tblStylePr>
   </w:style>
-  <w:style w:type="table" w:styleId="879">
+  <w:style w:type="table" w:styleId="836">
     <w:name w:val="Bordered - Accent 3"/>
-    <w:basedOn w:val="902"/>
+    <w:basedOn w:val="859"/>
     <w:uiPriority w:val="99"/>
     <w:pPr>
       <w:pBdr/>
@@ -50366,9 +50564,9 @@
       </w:tcPr>
     </w:tblStylePr>
   </w:style>
-  <w:style w:type="table" w:styleId="880">
+  <w:style w:type="table" w:styleId="837">
     <w:name w:val="Bordered - Accent 4"/>
-    <w:basedOn w:val="902"/>
+    <w:basedOn w:val="859"/>
     <w:uiPriority w:val="99"/>
     <w:pPr>
       <w:pBdr/>
@@ -50597,9 +50795,9 @@
       </w:tcPr>
     </w:tblStylePr>
   </w:style>
-  <w:style w:type="table" w:styleId="881">
+  <w:style w:type="table" w:styleId="838">
     <w:name w:val="Bordered - Accent 5"/>
-    <w:basedOn w:val="902"/>
+    <w:basedOn w:val="859"/>
     <w:uiPriority w:val="99"/>
     <w:pPr>
       <w:pBdr/>
@@ -50828,9 +51026,9 @@
       </w:tcPr>
     </w:tblStylePr>
   </w:style>
-  <w:style w:type="table" w:styleId="882">
+  <w:style w:type="table" w:styleId="839">
     <w:name w:val="Bordered - Accent 6"/>
-    <w:basedOn w:val="902"/>
+    <w:basedOn w:val="859"/>
     <w:uiPriority w:val="99"/>
     <w:pPr>
       <w:pBdr/>
@@ -51059,7 +51257,7 @@
       </w:tcPr>
     </w:tblStylePr>
   </w:style>
-  <w:style w:type="character" w:styleId="883">
+  <w:style w:type="character" w:styleId="840">
     <w:name w:val="Hyperlink"/>
     <w:uiPriority w:val="99"/>
     <w:unhideWhenUsed/>
@@ -51073,10 +51271,10 @@
       <w:u w:val="single"/>
     </w:rPr>
   </w:style>
-  <w:style w:type="paragraph" w:styleId="884">
+  <w:style w:type="paragraph" w:styleId="841">
     <w:name w:val="footnote text"/>
-    <w:basedOn w:val="901"/>
-    <w:link w:val="885"/>
+    <w:basedOn w:val="858"/>
+    <w:link w:val="842"/>
     <w:uiPriority w:val="99"/>
     <w:semiHidden/>
     <w:unhideWhenUsed/>
@@ -51089,9 +51287,9 @@
       <w:sz w:val="18"/>
     </w:rPr>
   </w:style>
-  <w:style w:type="character" w:styleId="885">
+  <w:style w:type="character" w:styleId="842">
     <w:name w:val="Footnote Text Char"/>
-    <w:link w:val="884"/>
+    <w:link w:val="841"/>
     <w:uiPriority w:val="99"/>
     <w:pPr>
       <w:pBdr/>
@@ -51102,7 +51300,7 @@
       <w:sz w:val="18"/>
     </w:rPr>
   </w:style>
-  <w:style w:type="character" w:styleId="886">
+  <w:style w:type="character" w:styleId="843">
     <w:name w:val="footnote reference"/>
     <w:uiPriority w:val="99"/>
     <w:unhideWhenUsed/>
@@ -51115,10 +51313,10 @@
       <w:vertAlign w:val="superscript"/>
     </w:rPr>
   </w:style>
-  <w:style w:type="paragraph" w:styleId="887">
+  <w:style w:type="paragraph" w:styleId="844">
     <w:name w:val="endnote text"/>
-    <w:basedOn w:val="901"/>
-    <w:link w:val="888"/>
+    <w:basedOn w:val="858"/>
+    <w:link w:val="845"/>
     <w:uiPriority w:val="99"/>
     <w:semiHidden/>
     <w:unhideWhenUsed/>
@@ -51131,9 +51329,9 @@
       <w:sz w:val="20"/>
     </w:rPr>
   </w:style>
-  <w:style w:type="character" w:styleId="888">
+  <w:style w:type="character" w:styleId="845">
     <w:name w:val="Endnote Text Char"/>
-    <w:link w:val="887"/>
+    <w:link w:val="844"/>
     <w:uiPriority w:val="99"/>
     <w:pPr>
       <w:pBdr/>
@@ -51144,7 +51342,7 @@
       <w:sz w:val="20"/>
     </w:rPr>
   </w:style>
-  <w:style w:type="character" w:styleId="889">
+  <w:style w:type="character" w:styleId="846">
     <w:name w:val="endnote reference"/>
     <w:uiPriority w:val="99"/>
     <w:semiHidden/>
@@ -51158,10 +51356,10 @@
       <w:vertAlign w:val="superscript"/>
     </w:rPr>
   </w:style>
-  <w:style w:type="paragraph" w:styleId="890">
+  <w:style w:type="paragraph" w:styleId="847">
     <w:name w:val="toc 1"/>
-    <w:basedOn w:val="901"/>
-    <w:next w:val="901"/>
+    <w:basedOn w:val="858"/>
+    <w:next w:val="858"/>
     <w:uiPriority w:val="39"/>
     <w:unhideWhenUsed/>
     <w:pPr>
@@ -51170,10 +51368,10 @@
       <w:ind w:right="0" w:firstLine="0" w:left="0"/>
     </w:pPr>
   </w:style>
-  <w:style w:type="paragraph" w:styleId="891">
+  <w:style w:type="paragraph" w:styleId="848">
     <w:name w:val="toc 2"/>
-    <w:basedOn w:val="901"/>
-    <w:next w:val="901"/>
+    <w:basedOn w:val="858"/>
+    <w:next w:val="858"/>
     <w:uiPriority w:val="39"/>
     <w:unhideWhenUsed/>
     <w:pPr>
@@ -51182,10 +51380,10 @@
       <w:ind w:right="0" w:firstLine="0" w:left="283"/>
     </w:pPr>
   </w:style>
-  <w:style w:type="paragraph" w:styleId="892">
+  <w:style w:type="paragraph" w:styleId="849">
     <w:name w:val="toc 3"/>
-    <w:basedOn w:val="901"/>
-    <w:next w:val="901"/>
+    <w:basedOn w:val="858"/>
+    <w:next w:val="858"/>
     <w:uiPriority w:val="39"/>
     <w:unhideWhenUsed/>
     <w:pPr>
@@ -51194,10 +51392,10 @@
       <w:ind w:right="0" w:firstLine="0" w:left="567"/>
     </w:pPr>
   </w:style>
-  <w:style w:type="paragraph" w:styleId="893">
+  <w:style w:type="paragraph" w:styleId="850">
     <w:name w:val="toc 4"/>
-    <w:basedOn w:val="901"/>
-    <w:next w:val="901"/>
+    <w:basedOn w:val="858"/>
+    <w:next w:val="858"/>
     <w:uiPriority w:val="39"/>
     <w:unhideWhenUsed/>
     <w:pPr>
@@ -51206,10 +51404,10 @@
       <w:ind w:right="0" w:firstLine="0" w:left="850"/>
     </w:pPr>
   </w:style>
-  <w:style w:type="paragraph" w:styleId="894">
+  <w:style w:type="paragraph" w:styleId="851">
     <w:name w:val="toc 5"/>
-    <w:basedOn w:val="901"/>
-    <w:next w:val="901"/>
+    <w:basedOn w:val="858"/>
+    <w:next w:val="858"/>
     <w:uiPriority w:val="39"/>
     <w:unhideWhenUsed/>
     <w:pPr>
@@ -51218,10 +51416,10 @@
       <w:ind w:right="0" w:firstLine="0" w:left="1134"/>
     </w:pPr>
   </w:style>
-  <w:style w:type="paragraph" w:styleId="895">
+  <w:style w:type="paragraph" w:styleId="852">
     <w:name w:val="toc 6"/>
-    <w:basedOn w:val="901"/>
-    <w:next w:val="901"/>
+    <w:basedOn w:val="858"/>
+    <w:next w:val="858"/>
     <w:uiPriority w:val="39"/>
     <w:unhideWhenUsed/>
     <w:pPr>
@@ -51230,10 +51428,10 @@
       <w:ind w:right="0" w:firstLine="0" w:left="1417"/>
     </w:pPr>
   </w:style>
-  <w:style w:type="paragraph" w:styleId="896">
+  <w:style w:type="paragraph" w:styleId="853">
     <w:name w:val="toc 7"/>
-    <w:basedOn w:val="901"/>
-    <w:next w:val="901"/>
+    <w:basedOn w:val="858"/>
+    <w:next w:val="858"/>
     <w:uiPriority w:val="39"/>
     <w:unhideWhenUsed/>
     <w:pPr>
@@ -51242,10 +51440,10 @@
       <w:ind w:right="0" w:firstLine="0" w:left="1701"/>
     </w:pPr>
   </w:style>
-  <w:style w:type="paragraph" w:styleId="897">
+  <w:style w:type="paragraph" w:styleId="854">
     <w:name w:val="toc 8"/>
-    <w:basedOn w:val="901"/>
-    <w:next w:val="901"/>
+    <w:basedOn w:val="858"/>
+    <w:next w:val="858"/>
     <w:uiPriority w:val="39"/>
     <w:unhideWhenUsed/>
     <w:pPr>
@@ -51254,10 +51452,10 @@
       <w:ind w:right="0" w:firstLine="0" w:left="1984"/>
     </w:pPr>
   </w:style>
-  <w:style w:type="paragraph" w:styleId="898">
+  <w:style w:type="paragraph" w:styleId="855">
     <w:name w:val="toc 9"/>
-    <w:basedOn w:val="901"/>
-    <w:next w:val="901"/>
+    <w:basedOn w:val="858"/>
+    <w:next w:val="858"/>
     <w:uiPriority w:val="39"/>
     <w:unhideWhenUsed/>
     <w:pPr>
@@ -51266,7 +51464,7 @@
       <w:ind w:right="0" w:firstLine="0" w:left="2268"/>
     </w:pPr>
   </w:style>
-  <w:style w:type="paragraph" w:styleId="899">
+  <w:style w:type="paragraph" w:styleId="856">
     <w:name w:val="TOC Heading"/>
     <w:uiPriority w:val="39"/>
     <w:unhideWhenUsed/>
@@ -51276,10 +51474,10 @@
       <w:ind/>
     </w:pPr>
   </w:style>
-  <w:style w:type="paragraph" w:styleId="900">
+  <w:style w:type="paragraph" w:styleId="857">
     <w:name w:val="table of figures"/>
-    <w:basedOn w:val="901"/>
-    <w:next w:val="901"/>
+    <w:basedOn w:val="858"/>
+    <w:next w:val="858"/>
     <w:uiPriority w:val="99"/>
     <w:unhideWhenUsed/>
     <w:pPr>
@@ -51288,7 +51486,7 @@
       <w:ind/>
     </w:pPr>
   </w:style>
-  <w:style w:type="paragraph" w:styleId="901" w:default="1">
+  <w:style w:type="paragraph" w:styleId="858" w:default="1">
     <w:name w:val="Normal"/>
     <w:qFormat/>
     <w:pPr>
@@ -51297,7 +51495,7 @@
       <w:ind/>
     </w:pPr>
   </w:style>
-  <w:style w:type="table" w:styleId="902" w:default="1">
+  <w:style w:type="table" w:styleId="859" w:default="1">
     <w:name w:val="Normal Table"/>
     <w:uiPriority w:val="99"/>
     <w:semiHidden/>
@@ -51490,7 +51688,7 @@
       </w:tcPr>
     </w:tblStylePr>
   </w:style>
-  <w:style w:type="numbering" w:styleId="903" w:default="1">
+  <w:style w:type="numbering" w:styleId="860" w:default="1">
     <w:name w:val="No List"/>
     <w:uiPriority w:val="99"/>
     <w:semiHidden/>
@@ -51501,9 +51699,9 @@
       <w:ind/>
     </w:pPr>
   </w:style>
-  <w:style w:type="paragraph" w:styleId="904">
+  <w:style w:type="paragraph" w:styleId="861">
     <w:name w:val="No Spacing"/>
-    <w:basedOn w:val="901"/>
+    <w:basedOn w:val="858"/>
     <w:uiPriority w:val="1"/>
     <w:qFormat/>
     <w:pPr>
@@ -51512,9 +51710,9 @@
       <w:ind/>
     </w:pPr>
   </w:style>
-  <w:style w:type="paragraph" w:styleId="905">
+  <w:style w:type="paragraph" w:styleId="862">
     <w:name w:val="List Paragraph"/>
-    <w:basedOn w:val="901"/>
+    <w:basedOn w:val="858"/>
     <w:uiPriority w:val="34"/>
     <w:qFormat/>
     <w:pPr>
@@ -51524,7 +51722,7 @@
       <w:contextualSpacing w:val="true"/>
     </w:pPr>
   </w:style>
-  <w:style w:type="character" w:styleId="906" w:default="1">
+  <w:style w:type="character" w:styleId="863" w:default="1">
     <w:name w:val="Default Paragraph Font"/>
     <w:uiPriority w:val="1"/>
     <w:semiHidden/>

</xml_diff>

<commit_message>
Big progress on design, just comparison left in display section!!
</commit_message>
<xml_diff>
--- a/Design.docx
+++ b/Design.docx
@@ -1020,7 +1020,7 @@
       <w:hyperlink r:id="rId11" w:tooltip="https://ssd.jpl.nasa.gov/api/horizons.api?format=text&amp;COMMAND='&quot;+target+&quot;'&amp;OBJ_DATA='YES'&amp;MAKE_EPHEM='YES'&amp;EPHEM_TYPE='VECTORS'&amp;START_TIME='&quot;+startTime+&quot;'&amp;STOP_TIME='&quot;+stopTime+&quot;'&amp;CENTER='500@0'&amp;STEP_SIZE='1 d'&amp;QUANTITIES='1,9,20,23,24,29'" w:history="1">
         <w:r>
           <w:rPr>
-            <w:rStyle w:val="840"/>
+            <w:rStyle w:val="842"/>
             <w:color w:val="000000" w:themeColor="text1"/>
             <w:sz w:val="22"/>
             <w:szCs w:val="18"/>
@@ -1030,7 +1030,7 @@
         </w:r>
         <w:r>
           <w:rPr>
-            <w:rStyle w:val="840"/>
+            <w:rStyle w:val="842"/>
             <w:color w:val="000000" w:themeColor="text1"/>
             <w:sz w:val="22"/>
             <w:szCs w:val="18"/>
@@ -1039,7 +1039,7 @@
         </w:r>
         <w:r>
           <w:rPr>
-            <w:rStyle w:val="840"/>
+            <w:rStyle w:val="842"/>
             <w:color w:val="000000" w:themeColor="text1"/>
             <w:sz w:val="22"/>
             <w:szCs w:val="18"/>
@@ -1180,7 +1180,7 @@
       <w:hyperlink r:id="rId12" w:tooltip="https://ssd-api.jpl.nasa.gov/doc/horizons.html#ephem_type" w:history="1">
         <w:r>
           <w:rPr>
-            <w:rStyle w:val="840"/>
+            <w:rStyle w:val="842"/>
             <w:color w:val="000000" w:themeColor="text1"/>
             <w:sz w:val="22"/>
             <w:szCs w:val="22"/>
@@ -1190,7 +1190,7 @@
         </w:r>
         <w:r>
           <w:rPr>
-            <w:rStyle w:val="840"/>
+            <w:rStyle w:val="842"/>
             <w:color w:val="000000" w:themeColor="text1"/>
             <w:sz w:val="22"/>
             <w:szCs w:val="22"/>
@@ -1199,7 +1199,7 @@
         </w:r>
         <w:r>
           <w:rPr>
-            <w:rStyle w:val="840"/>
+            <w:rStyle w:val="842"/>
             <w:color w:val="000000" w:themeColor="text1"/>
             <w:sz w:val="22"/>
             <w:szCs w:val="22"/>
@@ -2691,7 +2691,7 @@
     </w:p>
     <w:p>
       <w:pPr>
-        <w:pStyle w:val="862"/>
+        <w:pStyle w:val="864"/>
         <w:numPr>
           <w:ilvl w:val="0"/>
           <w:numId w:val="2"/>
@@ -2734,7 +2734,7 @@
     </w:p>
     <w:p>
       <w:pPr>
-        <w:pStyle w:val="862"/>
+        <w:pStyle w:val="864"/>
         <w:numPr>
           <w:ilvl w:val="0"/>
           <w:numId w:val="2"/>
@@ -4306,7 +4306,7 @@
     </w:p>
     <w:p>
       <w:pPr>
-        <w:pStyle w:val="862"/>
+        <w:pStyle w:val="864"/>
         <w:numPr>
           <w:ilvl w:val="0"/>
           <w:numId w:val="1"/>
@@ -4349,7 +4349,7 @@
     </w:p>
     <w:p>
       <w:pPr>
-        <w:pStyle w:val="862"/>
+        <w:pStyle w:val="864"/>
         <w:numPr>
           <w:ilvl w:val="0"/>
           <w:numId w:val="1"/>
@@ -4392,7 +4392,7 @@
     </w:p>
     <w:p>
       <w:pPr>
-        <w:pStyle w:val="862"/>
+        <w:pStyle w:val="864"/>
         <w:numPr>
           <w:ilvl w:val="0"/>
           <w:numId w:val="1"/>
@@ -5299,7 +5299,7 @@
     </w:p>
     <w:tbl>
       <w:tblPr>
-        <w:tblStyle w:val="714"/>
+        <w:tblStyle w:val="716"/>
         <w:tblW w:w="0" w:type="auto"/>
         <w:tblBorders/>
         <w:tblLook w:val="04A0" w:firstRow="1" w:lastRow="0" w:firstColumn="1" w:lastColumn="0" w:noHBand="0" w:noVBand="1"/>
@@ -8324,7 +8324,7 @@
     </w:p>
     <w:p>
       <w:pPr>
-        <w:pStyle w:val="862"/>
+        <w:pStyle w:val="864"/>
         <w:numPr>
           <w:ilvl w:val="0"/>
           <w:numId w:val="4"/>
@@ -8367,7 +8367,7 @@
     </w:p>
     <w:p>
       <w:pPr>
-        <w:pStyle w:val="862"/>
+        <w:pStyle w:val="864"/>
         <w:numPr>
           <w:ilvl w:val="0"/>
           <w:numId w:val="4"/>
@@ -8410,7 +8410,7 @@
     </w:p>
     <w:p>
       <w:pPr>
-        <w:pStyle w:val="862"/>
+        <w:pStyle w:val="864"/>
         <w:numPr>
           <w:ilvl w:val="0"/>
           <w:numId w:val="4"/>
@@ -8453,7 +8453,7 @@
     </w:p>
     <w:p>
       <w:pPr>
-        <w:pStyle w:val="862"/>
+        <w:pStyle w:val="864"/>
         <w:numPr>
           <w:ilvl w:val="0"/>
           <w:numId w:val="4"/>
@@ -8496,7 +8496,7 @@
     </w:p>
     <w:p>
       <w:pPr>
-        <w:pStyle w:val="862"/>
+        <w:pStyle w:val="864"/>
         <w:numPr>
           <w:ilvl w:val="0"/>
           <w:numId w:val="4"/>
@@ -18273,42 +18273,6 @@
           <w:vertAlign w:val="baseline"/>
         </w:rPr>
       </w:r>
-      <w:r>
-        <w:rPr>
-          <w:color w:val="000000" w:themeColor="text1"/>
-          <w:sz w:val="22"/>
-          <w:szCs w:val="22"/>
-          <w:highlight w:val="none"/>
-          <w:vertAlign w:val="baseline"/>
-        </w:rPr>
-      </w:r>
-      <w:r>
-        <w:rPr>
-          <w:color w:val="000000" w:themeColor="text1"/>
-          <w:sz w:val="22"/>
-          <w:szCs w:val="22"/>
-          <w:highlight w:val="none"/>
-          <w:vertAlign w:val="baseline"/>
-        </w:rPr>
-      </w:r>
-      <w:r>
-        <w:rPr>
-          <w:color w:val="000000" w:themeColor="text1"/>
-          <w:sz w:val="22"/>
-          <w:szCs w:val="22"/>
-          <w:highlight w:val="none"/>
-          <w:vertAlign w:val="baseline"/>
-        </w:rPr>
-      </w:r>
-      <w:r>
-        <w:rPr>
-          <w:color w:val="000000" w:themeColor="text1"/>
-          <w:sz w:val="22"/>
-          <w:szCs w:val="22"/>
-          <w:highlight w:val="none"/>
-          <w:vertAlign w:val="baseline"/>
-        </w:rPr>
-      </w:r>
     </w:p>
     <w:p>
       <w:pPr>
@@ -18383,8 +18347,9 @@
       </w:r>
       <w:r>
         <w:rPr>
-          <w:color w:val="2f5696"/>
-          <w:sz w:val="22"/>
+          <w:color w:val="2f5496" w:themeColor="accent5" w:themeShade="BF"/>
+          <w:sz w:val="22"/>
+          <w:szCs w:val="22"/>
           <w:highlight w:val="none"/>
           <w:vertAlign w:val="baseline"/>
         </w:rPr>
@@ -18658,6 +18623,7 @@
         <w:rPr>
           <w:color w:val="000000" w:themeColor="text1"/>
           <w:sz w:val="22"/>
+          <w:szCs w:val="22"/>
           <w:highlight w:val="none"/>
           <w:vertAlign w:val="baseline"/>
         </w:rPr>
@@ -18697,6 +18663,15 @@
         <w:rPr>
           <w:color w:val="000000" w:themeColor="text1"/>
           <w:sz w:val="22"/>
+          <w:highlight w:val="none"/>
+          <w:vertAlign w:val="baseline"/>
+        </w:rPr>
+      </w:r>
+      <w:r>
+        <w:rPr>
+          <w:color w:val="000000" w:themeColor="text1"/>
+          <w:sz w:val="22"/>
+          <w:szCs w:val="22"/>
           <w:highlight w:val="none"/>
           <w:vertAlign w:val="baseline"/>
         </w:rPr>
@@ -18878,21 +18853,9 @@
           <w:vertAlign w:val="baseline"/>
         </w:rPr>
       </w:r>
-      <w:r/>
-      <w:r>
-        <w:rPr>
-          <w:color w:val="000000" w:themeColor="text1"/>
-          <w:sz w:val="22"/>
-          <w:highlight w:val="none"/>
-          <w:vertAlign w:val="baseline"/>
-        </w:rPr>
-      </w:r>
-      <w:r>
-        <w:rPr>
-          <w:color w:val="000000" w:themeColor="text1"/>
-          <w:sz w:val="22"/>
-          <w:highlight w:val="none"/>
-          <w:vertAlign w:val="baseline"/>
+      <w:r>
+        <w:rPr>
+          <w:highlight w:val="none"/>
         </w:rPr>
       </w:r>
     </w:p>
@@ -18916,6 +18879,11 @@
           <w:highlight w:val="none"/>
         </w:rPr>
       </w:r>
+      <w:r>
+        <w:rPr>
+          <w:highlight w:val="none"/>
+        </w:rPr>
+      </w:r>
     </w:p>
     <w:p>
       <w:pPr>
@@ -18940,6 +18908,15 @@
           <w:highlight w:val="none"/>
         </w:rPr>
       </w:r>
+      <w:r>
+        <w:rPr>
+          <w:color w:val="000000" w:themeColor="text1"/>
+          <w:sz w:val="22"/>
+          <w:szCs w:val="22"/>
+          <w:highlight w:val="none"/>
+          <w:vertAlign w:val="baseline"/>
+        </w:rPr>
+      </w:r>
     </w:p>
     <w:p>
       <w:pPr>
@@ -18947,8 +18924,9 @@
         <w:spacing/>
         <w:ind/>
         <w:rPr>
-          <w:color w:val="2f5696"/>
-          <w:sz w:val="22"/>
+          <w:color w:val="2f5496" w:themeColor="accent5" w:themeShade="BF"/>
+          <w:sz w:val="22"/>
+          <w:szCs w:val="22"/>
           <w:highlight w:val="none"/>
           <w:vertAlign w:val="baseline"/>
         </w:rPr>
@@ -18960,20 +18938,22 @@
           <w:highlight w:val="none"/>
           <w:vertAlign w:val="baseline"/>
         </w:rPr>
-        <w:t xml:space="preserve">displayPlanets</w:t>
-      </w:r>
-      <w:r>
-        <w:rPr>
-          <w:color w:val="2f5696"/>
-          <w:sz w:val="22"/>
+        <w:t xml:space="preserve">drawPlanet</w:t>
+      </w:r>
+      <w:r>
+        <w:rPr>
+          <w:color w:val="2f5496" w:themeColor="accent5" w:themeShade="BF"/>
+          <w:sz w:val="22"/>
+          <w:szCs w:val="22"/>
           <w:highlight w:val="none"/>
           <w:vertAlign w:val="baseline"/>
         </w:rPr>
       </w:r>
       <w:r>
         <w:rPr>
-          <w:color w:val="2f5696"/>
-          <w:sz w:val="22"/>
+          <w:color w:val="2f5496" w:themeColor="accent5" w:themeShade="BF"/>
+          <w:sz w:val="22"/>
+          <w:szCs w:val="22"/>
           <w:highlight w:val="none"/>
           <w:vertAlign w:val="baseline"/>
         </w:rPr>
@@ -18996,11 +18976,415 @@
         <w:rPr>
           <w:color w:val="000000" w:themeColor="text1"/>
           <w:sz w:val="22"/>
-          <w:szCs w:val="22"/>
           <w:highlight w:val="none"/>
           <w:vertAlign w:val="baseline"/>
         </w:rPr>
-        <w:t xml:space="preserve">Drawing the planets is done with displayPlanets which runs a for loop iterating over the list planets and uses a method, drawPlanet() to display each one. It only runs drawPlanet() if the planet would be visible to save on resources, n</w:t>
+        <w:t xml:space="preserve">drawPlanet() needs to be able to draw a planet at any place on any surface. This is needed for the comparison mode as in that mode we are drawing planets at specific points that aren’t related to the posi</w:t>
+      </w:r>
+      <w:r>
+        <w:rPr>
+          <w:color w:val="000000" w:themeColor="text1"/>
+          <w:sz w:val="22"/>
+          <w:highlight w:val="none"/>
+          <w:vertAlign w:val="baseline"/>
+        </w:rPr>
+        <w:t xml:space="preserve">tion of the planet itself, and during the comparison the planets are drawn on surfaces other than the screen surface. It also needs the planet object itself to get the size and colour of the planet. These will all be passed in as arguments to the function.</w:t>
+      </w:r>
+      <w:r>
+        <w:rPr>
+          <w:color w:val="000000" w:themeColor="text1"/>
+          <w:sz w:val="22"/>
+          <w:szCs w:val="22"/>
+          <w:highlight w:val="none"/>
+          <w:vertAlign w:val="baseline"/>
+        </w:rPr>
+      </w:r>
+      <w:r>
+        <w:rPr>
+          <w:color w:val="000000" w:themeColor="text1"/>
+          <w:sz w:val="22"/>
+          <w:szCs w:val="22"/>
+          <w:highlight w:val="none"/>
+          <w:vertAlign w:val="baseline"/>
+        </w:rPr>
+      </w:r>
+    </w:p>
+    <w:p>
+      <w:pPr>
+        <w:pBdr/>
+        <w:spacing/>
+        <w:ind/>
+        <w:rPr>
+          <w:color w:val="000000" w:themeColor="text1"/>
+          <w:sz w:val="22"/>
+          <w:szCs w:val="22"/>
+          <w:highlight w:val="none"/>
+          <w:vertAlign w:val="baseline"/>
+        </w:rPr>
+      </w:pPr>
+      <w:r>
+        <w:rPr>
+          <w:color w:val="000000" w:themeColor="text1"/>
+          <w:sz w:val="22"/>
+          <w:highlight w:val="none"/>
+          <w:vertAlign w:val="baseline"/>
+        </w:rPr>
+        <w:t xml:space="preserve">The pygame.draw.circle() method will be used to draw the planet as a soli</w:t>
+      </w:r>
+      <w:r>
+        <w:rPr>
+          <w:color w:val="000000" w:themeColor="text1"/>
+          <w:sz w:val="22"/>
+          <w:highlight w:val="none"/>
+          <w:vertAlign w:val="baseline"/>
+        </w:rPr>
+        <w:t xml:space="preserve">d coloured circle. It will be given the surface to draw the circle on, get the colour of the circle with p.getColour(), draw the circle at the position given to it, and draw the circle with a radius of the scaled size of the planet, distScale*p.getSize(). </w:t>
+      </w:r>
+      <w:r>
+        <w:rPr>
+          <w:color w:val="000000" w:themeColor="text1"/>
+          <w:sz w:val="22"/>
+          <w:szCs w:val="22"/>
+          <w:highlight w:val="none"/>
+          <w:vertAlign w:val="baseline"/>
+        </w:rPr>
+      </w:r>
+      <w:r>
+        <w:rPr>
+          <w:color w:val="000000" w:themeColor="text1"/>
+          <w:sz w:val="22"/>
+          <w:szCs w:val="22"/>
+          <w:highlight w:val="none"/>
+          <w:vertAlign w:val="baseline"/>
+        </w:rPr>
+      </w:r>
+    </w:p>
+    <w:p>
+      <w:pPr>
+        <w:pBdr/>
+        <w:spacing/>
+        <w:ind/>
+        <w:rPr>
+          <w:color w:val="000000" w:themeColor="text1"/>
+          <w:sz w:val="22"/>
+          <w:szCs w:val="22"/>
+          <w:highlight w:val="none"/>
+          <w:vertAlign w:val="baseline"/>
+        </w:rPr>
+      </w:pPr>
+      <w:r>
+        <w:rPr>
+          <w:color w:val="000000" w:themeColor="text1"/>
+          <w:sz w:val="22"/>
+          <w:highlight w:val="none"/>
+          <w:vertAlign w:val="baseline"/>
+        </w:rPr>
+        <w:t xml:space="preserve">Telling pygame</w:t>
+      </w:r>
+      <w:r>
+        <w:rPr>
+          <w:color w:val="000000" w:themeColor="text1"/>
+          <w:sz w:val="22"/>
+          <w:highlight w:val="none"/>
+          <w:vertAlign w:val="baseline"/>
+        </w:rPr>
+        <w:t xml:space="preserve"> to draw a very large circle (i.e. millions of pixels in diametre) can cause a lot of lag. This would occur in my program if you were very zoomed in on a planet for whatever reason. To avoid this, a check will be done to see if the scaled radius of the pla</w:t>
+      </w:r>
+      <w:r>
+        <w:rPr>
+          <w:color w:val="000000" w:themeColor="text1"/>
+          <w:sz w:val="22"/>
+          <w:highlight w:val="none"/>
+          <w:vertAlign w:val="baseline"/>
+        </w:rPr>
+        <w:t xml:space="preserve">net is larger than the diagonal radius of the screen. This can be done by seeing if distScale*p.getSize() &lt; vec.mag(centre) or not. If this happens, then a circle will not be drawn, and instead the surface will just be filled with the colour of the planet.</w:t>
+      </w:r>
+      <w:r>
+        <w:rPr>
+          <w:color w:val="000000" w:themeColor="text1"/>
+          <w:sz w:val="22"/>
+          <w:szCs w:val="22"/>
+          <w:highlight w:val="none"/>
+          <w:vertAlign w:val="baseline"/>
+        </w:rPr>
+      </w:r>
+      <w:r>
+        <w:rPr>
+          <w:color w:val="000000" w:themeColor="text1"/>
+          <w:sz w:val="22"/>
+          <w:szCs w:val="22"/>
+          <w:highlight w:val="none"/>
+          <w:vertAlign w:val="baseline"/>
+        </w:rPr>
+      </w:r>
+    </w:p>
+    <w:p>
+      <w:pPr>
+        <w:pBdr/>
+        <w:spacing/>
+        <w:ind/>
+        <w:rPr>
+          <w:color w:val="000000" w:themeColor="text1"/>
+          <w:sz w:val="22"/>
+          <w:szCs w:val="22"/>
+          <w:highlight w:val="none"/>
+          <w:vertAlign w:val="baseline"/>
+        </w:rPr>
+      </w:pPr>
+      <w:r>
+        <w:rPr>
+          <w:color w:val="000000" w:themeColor="text1"/>
+          <w:sz w:val="22"/>
+          <w:highlight w:val="none"/>
+          <w:vertAlign w:val="baseline"/>
+        </w:rPr>
+        <w:t xml:space="preserve">Here is pseudocode for all of this:</w:t>
+      </w:r>
+      <w:r>
+        <w:rPr>
+          <w:color w:val="000000" w:themeColor="text1"/>
+          <w:sz w:val="22"/>
+          <w:szCs w:val="22"/>
+          <w:highlight w:val="none"/>
+          <w:vertAlign w:val="baseline"/>
+        </w:rPr>
+      </w:r>
+      <w:r>
+        <w:rPr>
+          <w:color w:val="000000" w:themeColor="text1"/>
+          <w:sz w:val="22"/>
+          <w:szCs w:val="22"/>
+          <w:highlight w:val="none"/>
+          <w:vertAlign w:val="baseline"/>
+        </w:rPr>
+      </w:r>
+    </w:p>
+    <w:p>
+      <w:pPr>
+        <w:pBdr/>
+        <w:spacing/>
+        <w:ind/>
+        <w:rPr>
+          <w:color w:val="000000" w:themeColor="text1"/>
+          <w:sz w:val="22"/>
+          <w:szCs w:val="22"/>
+          <w:highlight w:val="none"/>
+          <w:vertAlign w:val="baseline"/>
+        </w:rPr>
+      </w:pPr>
+      <w:r>
+        <w:rPr>
+          <w:color w:val="000000" w:themeColor="text1"/>
+          <w:sz w:val="22"/>
+          <w:highlight w:val="none"/>
+          <w:vertAlign w:val="baseline"/>
+        </w:rPr>
+      </w:r>
+      <w:r>
+        <mc:AlternateContent>
+          <mc:Choice Requires="wpg">
+            <w:drawing>
+              <wp:inline xmlns:wp="http://schemas.openxmlformats.org/drawingml/2006/wordprocessingDrawing" distT="0" distB="0" distL="0" distR="0">
+                <wp:extent cx="5940425" cy="1688648"/>
+                <wp:effectExtent l="0" t="0" r="0" b="0"/>
+                <wp:docPr id="39" name=""/>
+                <wp:cNvGraphicFramePr>
+                  <a:graphicFrameLocks xmlns:a="http://schemas.openxmlformats.org/drawingml/2006/main" noChangeAspect="1"/>
+                </wp:cNvGraphicFramePr>
+                <a:graphic xmlns:a="http://schemas.openxmlformats.org/drawingml/2006/main">
+                  <a:graphicData uri="http://schemas.openxmlformats.org/drawingml/2006/picture">
+                    <pic:pic xmlns:pic="http://schemas.openxmlformats.org/drawingml/2006/picture">
+                      <pic:nvPicPr>
+                        <pic:cNvPr id="829279228" name=""/>
+                        <pic:cNvPicPr>
+                          <a:picLocks noChangeAspect="1"/>
+                        </pic:cNvPicPr>
+                        <pic:nvPr/>
+                      </pic:nvPicPr>
+                      <pic:blipFill>
+                        <a:blip r:embed="rId50"/>
+                        <a:stretch/>
+                      </pic:blipFill>
+                      <pic:spPr bwMode="auto">
+                        <a:xfrm>
+                          <a:off x="0" y="0"/>
+                          <a:ext cx="5940423" cy="1688647"/>
+                        </a:xfrm>
+                        <a:prstGeom prst="rect">
+                          <a:avLst/>
+                        </a:prstGeom>
+                      </pic:spPr>
+                    </pic:pic>
+                  </a:graphicData>
+                </a:graphic>
+              </wp:inline>
+            </w:drawing>
+          </mc:Choice>
+          <mc:Fallback>
+            <w:pict>
+              <v:shapetype id="_x0000_t75" coordsize="21600,21600" o:spt="75" o:preferrelative="t" path="m@4@5l@4@11@9@11@9@5xe" filled="f" stroked="f">
+                <v:stroke joinstyle="miter"/>
+                <v:formulas>
+                  <v:f eqn="if lineDrawn pixelLineWidth 0"/>
+                  <v:f eqn="sum @0 1 0"/>
+                  <v:f eqn="sum 0 0 @1"/>
+                  <v:f eqn="prod @2 1 2"/>
+                  <v:f eqn="prod @3 21600 pixelWidth"/>
+                  <v:f eqn="prod @3 21600 pixelHeight"/>
+                  <v:f eqn="sum @0 0 1"/>
+                  <v:f eqn="prod @6 1 2"/>
+                  <v:f eqn="prod @7 21600 pixelWidth"/>
+                  <v:f eqn="sum @8 21600 0"/>
+                  <v:f eqn="prod @7 21600 pixelHeight"/>
+                  <v:f eqn="sum @10 21600 0"/>
+                </v:formulas>
+                <v:path o:extrusionok="f" gradientshapeok="t" o:connecttype="rect"/>
+                <o:lock v:ext="edit" aspectratio="t"/>
+              </v:shapetype>
+              <v:shape id="_x0000_i38" o:spid="_x0000_s38" type="#_x0000_t75" style="width:467.75pt;height:132.96pt;mso-wrap-distance-left:0.00pt;mso-wrap-distance-top:0.00pt;mso-wrap-distance-right:0.00pt;mso-wrap-distance-bottom:0.00pt;z-index:1;" stroked="false">
+                <v:imagedata r:id="rId50" o:title=""/>
+                <o:lock v:ext="edit" rotation="t"/>
+              </v:shape>
+            </w:pict>
+          </mc:Fallback>
+        </mc:AlternateContent>
+      </w:r>
+      <w:r>
+        <w:rPr>
+          <w:color w:val="000000" w:themeColor="text1"/>
+          <w:sz w:val="22"/>
+          <w:szCs w:val="22"/>
+          <w:highlight w:val="none"/>
+          <w:vertAlign w:val="baseline"/>
+        </w:rPr>
+      </w:r>
+      <w:r>
+        <w:rPr>
+          <w:color w:val="000000" w:themeColor="text1"/>
+          <w:sz w:val="22"/>
+          <w:szCs w:val="22"/>
+          <w:highlight w:val="none"/>
+          <w:vertAlign w:val="baseline"/>
+        </w:rPr>
+      </w:r>
+      <w:r>
+        <w:rPr>
+          <w:color w:val="2f5696" w:themeColor="accent5" w:themeShade="BF"/>
+          <w:sz w:val="22"/>
+          <w:highlight w:val="none"/>
+          <w:vertAlign w:val="baseline"/>
+        </w:rPr>
+      </w:r>
+      <w:r>
+        <w:rPr>
+          <w:color w:val="2f5696" w:themeColor="accent5" w:themeShade="BF"/>
+          <w:sz w:val="22"/>
+          <w:highlight w:val="none"/>
+          <w:vertAlign w:val="baseline"/>
+        </w:rPr>
+      </w:r>
+      <w:r>
+        <w:rPr>
+          <w:color w:val="000000" w:themeColor="text1"/>
+          <w:sz w:val="22"/>
+          <w:szCs w:val="22"/>
+          <w:highlight w:val="none"/>
+          <w:vertAlign w:val="baseline"/>
+        </w:rPr>
+      </w:r>
+    </w:p>
+    <w:p>
+      <w:pPr>
+        <w:pBdr/>
+        <w:spacing/>
+        <w:ind/>
+        <w:rPr>
+          <w:color w:val="2f5496" w:themeColor="accent5" w:themeShade="BF"/>
+          <w:sz w:val="22"/>
+          <w:szCs w:val="22"/>
+          <w:highlight w:val="none"/>
+          <w:vertAlign w:val="baseline"/>
+        </w:rPr>
+      </w:pPr>
+      <w:r>
+        <w:rPr>
+          <w:color w:val="2f5696" w:themeColor="accent5" w:themeShade="BF"/>
+          <w:sz w:val="22"/>
+          <w:highlight w:val="none"/>
+          <w:vertAlign w:val="baseline"/>
+        </w:rPr>
+      </w:r>
+      <w:r>
+        <w:rPr>
+          <w:color w:val="2f5696" w:themeColor="accent5" w:themeShade="BF"/>
+          <w:sz w:val="22"/>
+          <w:highlight w:val="none"/>
+          <w:vertAlign w:val="baseline"/>
+        </w:rPr>
+      </w:r>
+    </w:p>
+    <w:p>
+      <w:pPr>
+        <w:pBdr/>
+        <w:spacing/>
+        <w:ind/>
+        <w:rPr>
+          <w:color w:val="2f5496" w:themeColor="accent5" w:themeShade="BF"/>
+          <w:sz w:val="22"/>
+          <w:szCs w:val="22"/>
+          <w:highlight w:val="none"/>
+          <w:vertAlign w:val="baseline"/>
+        </w:rPr>
+      </w:pPr>
+      <w:r>
+        <w:rPr>
+          <w:color w:val="2f5696" w:themeColor="accent5" w:themeShade="BF"/>
+          <w:sz w:val="22"/>
+          <w:highlight w:val="none"/>
+          <w:vertAlign w:val="baseline"/>
+        </w:rPr>
+        <w:t xml:space="preserve">displayPlanets</w:t>
+      </w:r>
+      <w:r>
+        <w:rPr>
+          <w:color w:val="2f5696"/>
+          <w:sz w:val="22"/>
+          <w:highlight w:val="none"/>
+          <w:vertAlign w:val="baseline"/>
+        </w:rPr>
+      </w:r>
+      <w:r>
+        <w:rPr>
+          <w:color w:val="2f5496" w:themeColor="accent5" w:themeShade="BF"/>
+          <w:sz w:val="22"/>
+          <w:szCs w:val="22"/>
+          <w:highlight w:val="none"/>
+          <w:vertAlign w:val="baseline"/>
+        </w:rPr>
+      </w:r>
+    </w:p>
+    <w:p>
+      <w:pPr>
+        <w:pBdr/>
+        <w:spacing/>
+        <w:ind/>
+        <w:rPr>
+          <w:color w:val="000000" w:themeColor="text1"/>
+          <w:sz w:val="22"/>
+          <w:szCs w:val="22"/>
+          <w:highlight w:val="none"/>
+          <w:vertAlign w:val="baseline"/>
+        </w:rPr>
+      </w:pPr>
+      <w:r>
+        <w:rPr>
+          <w:color w:val="000000" w:themeColor="text1"/>
+          <w:sz w:val="22"/>
+          <w:szCs w:val="22"/>
+          <w:highlight w:val="none"/>
+          <w:vertAlign w:val="baseline"/>
+        </w:rPr>
+        <w:t xml:space="preserve">Drawing the planets is done with displayPlanets which runs a for loop iterating over the list planets and uses drawPlanet() to display each one. It only runs drawPlanet() if the planet would be visible to save on resources, n</w:t>
       </w:r>
       <w:r>
         <w:rPr>
@@ -19070,7 +19454,7 @@
               <wp:inline xmlns:wp="http://schemas.openxmlformats.org/drawingml/2006/wordprocessingDrawing" distT="0" distB="0" distL="0" distR="0">
                 <wp:extent cx="5940425" cy="1895717"/>
                 <wp:effectExtent l="0" t="0" r="0" b="0"/>
-                <wp:docPr id="39" name=""/>
+                <wp:docPr id="40" name=""/>
                 <wp:cNvGraphicFramePr>
                   <a:graphicFrameLocks xmlns:a="http://schemas.openxmlformats.org/drawingml/2006/main" noChangeAspect="1"/>
                 </wp:cNvGraphicFramePr>
@@ -19085,7 +19469,7 @@
                         <pic:nvPr/>
                       </pic:nvPicPr>
                       <pic:blipFill>
-                        <a:blip r:embed="rId50"/>
+                        <a:blip r:embed="rId51"/>
                         <a:stretch/>
                       </pic:blipFill>
                       <pic:spPr bwMode="auto">
@@ -19124,374 +19508,7 @@
                 <v:path o:extrusionok="f" gradientshapeok="t" o:connecttype="rect"/>
                 <o:lock v:ext="edit" aspectratio="t"/>
               </v:shapetype>
-              <v:shape id="_x0000_i38" o:spid="_x0000_s38" type="#_x0000_t75" style="width:467.75pt;height:149.27pt;mso-wrap-distance-left:0.00pt;mso-wrap-distance-top:0.00pt;mso-wrap-distance-right:0.00pt;mso-wrap-distance-bottom:0.00pt;z-index:1;" stroked="false">
-                <v:imagedata r:id="rId50" o:title=""/>
-                <o:lock v:ext="edit" rotation="t"/>
-              </v:shape>
-            </w:pict>
-          </mc:Fallback>
-        </mc:AlternateContent>
-      </w:r>
-      <w:r>
-        <w:rPr>
-          <w:color w:val="000000" w:themeColor="text1"/>
-          <w:sz w:val="22"/>
-          <w:szCs w:val="22"/>
-          <w:highlight w:val="none"/>
-          <w:vertAlign w:val="baseline"/>
-        </w:rPr>
-      </w:r>
-      <w:r/>
-      <w:r/>
-      <w:r/>
-      <w:r>
-        <w:rPr>
-          <w:color w:val="000000" w:themeColor="text1"/>
-          <w:sz w:val="22"/>
-          <w:szCs w:val="22"/>
-          <w:highlight w:val="none"/>
-          <w:vertAlign w:val="baseline"/>
-        </w:rPr>
-      </w:r>
-      <w:r>
-        <w:rPr>
-          <w:color w:val="000000" w:themeColor="text1"/>
-          <w:sz w:val="22"/>
-          <w:szCs w:val="22"/>
-          <w:highlight w:val="none"/>
-          <w:vertAlign w:val="baseline"/>
-        </w:rPr>
-      </w:r>
-      <w:r>
-        <w:rPr>
-          <w:color w:val="000000" w:themeColor="text1"/>
-          <w:sz w:val="22"/>
-          <w:szCs w:val="22"/>
-          <w:highlight w:val="none"/>
-          <w:vertAlign w:val="baseline"/>
-        </w:rPr>
-      </w:r>
-      <w:r>
-        <w:rPr>
-          <w:color w:val="000000" w:themeColor="text1"/>
-          <w:sz w:val="22"/>
-          <w:szCs w:val="22"/>
-          <w:highlight w:val="none"/>
-          <w:vertAlign w:val="baseline"/>
-        </w:rPr>
-      </w:r>
-      <w:r>
-        <w:rPr>
-          <w:color w:val="000000" w:themeColor="text1"/>
-          <w:sz w:val="22"/>
-          <w:szCs w:val="22"/>
-          <w:highlight w:val="none"/>
-          <w:vertAlign w:val="baseline"/>
-        </w:rPr>
-      </w:r>
-      <w:r>
-        <w:rPr>
-          <w:color w:val="2f5696" w:themeColor="accent5" w:themeShade="BF"/>
-          <w:sz w:val="22"/>
-          <w:highlight w:val="none"/>
-          <w:vertAlign w:val="baseline"/>
-        </w:rPr>
-      </w:r>
-      <w:r>
-        <w:rPr>
-          <w:color w:val="2f5696" w:themeColor="accent5" w:themeShade="BF"/>
-          <w:sz w:val="22"/>
-          <w:highlight w:val="none"/>
-          <w:vertAlign w:val="baseline"/>
-        </w:rPr>
-      </w:r>
-      <w:r>
-        <w:rPr>
-          <w:color w:val="000000" w:themeColor="text1"/>
-          <w:sz w:val="22"/>
-          <w:szCs w:val="22"/>
-          <w:highlight w:val="none"/>
-          <w:vertAlign w:val="baseline"/>
-        </w:rPr>
-      </w:r>
-    </w:p>
-    <w:p>
-      <w:pPr>
-        <w:pBdr/>
-        <w:spacing/>
-        <w:ind/>
-        <w:rPr>
-          <w:color w:val="2f5496" w:themeColor="accent5" w:themeShade="BF"/>
-          <w:sz w:val="22"/>
-          <w:szCs w:val="22"/>
-          <w:highlight w:val="none"/>
-          <w:vertAlign w:val="baseline"/>
-        </w:rPr>
-      </w:pPr>
-      <w:r>
-        <w:rPr>
-          <w:color w:val="2f5696" w:themeColor="accent5" w:themeShade="BF"/>
-          <w:sz w:val="22"/>
-          <w:highlight w:val="none"/>
-          <w:vertAlign w:val="baseline"/>
-        </w:rPr>
-      </w:r>
-      <w:r>
-        <w:rPr>
-          <w:color w:val="2f5696" w:themeColor="accent5" w:themeShade="BF"/>
-          <w:sz w:val="22"/>
-          <w:highlight w:val="none"/>
-          <w:vertAlign w:val="baseline"/>
-        </w:rPr>
-      </w:r>
-    </w:p>
-    <w:p>
-      <w:pPr>
-        <w:pBdr/>
-        <w:spacing/>
-        <w:ind/>
-        <w:rPr>
-          <w:color w:val="2f5496" w:themeColor="accent5" w:themeShade="BF"/>
-          <w:sz w:val="22"/>
-          <w:szCs w:val="22"/>
-          <w:highlight w:val="none"/>
-          <w:vertAlign w:val="baseline"/>
-        </w:rPr>
-      </w:pPr>
-      <w:r>
-        <w:rPr>
-          <w:color w:val="2f5696" w:themeColor="accent5" w:themeShade="BF"/>
-          <w:sz w:val="22"/>
-          <w:highlight w:val="none"/>
-          <w:vertAlign w:val="baseline"/>
-        </w:rPr>
-        <w:t xml:space="preserve">drawPlanet</w:t>
-      </w:r>
-      <w:r>
-        <w:rPr>
-          <w:color w:val="000000" w:themeColor="text1"/>
-          <w:sz w:val="22"/>
-          <w:szCs w:val="22"/>
-          <w:highlight w:val="none"/>
-          <w:vertAlign w:val="baseline"/>
-        </w:rPr>
-      </w:r>
-      <w:r>
-        <w:rPr>
-          <w:color w:val="2f5696"/>
-          <w:sz w:val="22"/>
-          <w:highlight w:val="none"/>
-          <w:vertAlign w:val="baseline"/>
-        </w:rPr>
-      </w:r>
-    </w:p>
-    <w:p>
-      <w:pPr>
-        <w:pBdr/>
-        <w:spacing/>
-        <w:ind/>
-        <w:rPr>
-          <w:color w:val="000000" w:themeColor="text1"/>
-          <w:sz w:val="22"/>
-          <w:szCs w:val="22"/>
-          <w:highlight w:val="none"/>
-          <w:vertAlign w:val="baseline"/>
-        </w:rPr>
-      </w:pPr>
-      <w:r>
-        <w:rPr>
-          <w:color w:val="000000" w:themeColor="text1"/>
-          <w:sz w:val="22"/>
-          <w:highlight w:val="none"/>
-          <w:vertAlign w:val="baseline"/>
-        </w:rPr>
-        <w:t xml:space="preserve">drawPlanet() needs to be able to draw a planet at any place on any surface. This is needed for the comparison mode as in that mode we are drawing planets at specific points that aren’t related to the position of the planet itself, and during the comparison the planets are drawn on surfaces other than the screen surface. It also needs the planet object itself to get the size and colour of the planet. These will all be passed in as arguments to the function.</w:t>
-      </w:r>
-      <w:r>
-        <w:rPr>
-          <w:color w:val="000000" w:themeColor="text1"/>
-          <w:sz w:val="22"/>
-          <w:highlight w:val="none"/>
-          <w:vertAlign w:val="baseline"/>
-        </w:rPr>
-      </w:r>
-    </w:p>
-    <w:p>
-      <w:pPr>
-        <w:pBdr/>
-        <w:spacing/>
-        <w:ind/>
-        <w:rPr>
-          <w:color w:val="000000" w:themeColor="text1"/>
-          <w:sz w:val="22"/>
-          <w:szCs w:val="22"/>
-          <w:highlight w:val="none"/>
-          <w:vertAlign w:val="baseline"/>
-        </w:rPr>
-      </w:pPr>
-      <w:r>
-        <w:rPr>
-          <w:color w:val="000000" w:themeColor="text1"/>
-          <w:sz w:val="22"/>
-          <w:highlight w:val="none"/>
-          <w:vertAlign w:val="baseline"/>
-        </w:rPr>
-        <w:t xml:space="preserve">The pygame.draw.circle() method will be used to draw the planet as a solid coloured circle. It will be given the surface to draw the circle on, get the colour of the circle with p.getColour(), draw the circle at the position given to it, and draw the circle with a radius of the scaled size of the planet, distScale*p.getSize(). </w:t>
-      </w:r>
-      <w:r>
-        <w:rPr>
-          <w:color w:val="000000" w:themeColor="text1"/>
-          <w:sz w:val="22"/>
-          <w:highlight w:val="none"/>
-          <w:vertAlign w:val="baseline"/>
-        </w:rPr>
-      </w:r>
-    </w:p>
-    <w:p>
-      <w:pPr>
-        <w:pBdr/>
-        <w:spacing/>
-        <w:ind/>
-        <w:rPr>
-          <w:color w:val="000000" w:themeColor="text1"/>
-          <w:sz w:val="22"/>
-          <w:szCs w:val="22"/>
-          <w:highlight w:val="none"/>
-          <w:vertAlign w:val="baseline"/>
-        </w:rPr>
-      </w:pPr>
-      <w:r>
-        <w:rPr>
-          <w:color w:val="000000" w:themeColor="text1"/>
-          <w:sz w:val="22"/>
-          <w:highlight w:val="none"/>
-          <w:vertAlign w:val="baseline"/>
-        </w:rPr>
-        <w:t xml:space="preserve">Telling pygame to draw a very large circle (i.e. millions of pixels in diametre) can cause a lot of lag. This would occur in my program if you were very zoomed in on a planet for whatever reason. To avoid this, a check will be done to see if the scaled radius of the planet is larger than the diagonal radius of the screen. This can be done by seeing if distScale*p.getSize() &lt; vec.mag(centre) or not. If this happens, then a circle will not be drawn, and instead the surface will just be filled with the colour of the planet.</w:t>
-      </w:r>
-      <w:r>
-        <w:rPr>
-          <w:color w:val="000000" w:themeColor="text1"/>
-          <w:sz w:val="22"/>
-          <w:highlight w:val="none"/>
-          <w:vertAlign w:val="baseline"/>
-        </w:rPr>
-      </w:r>
-    </w:p>
-    <w:p>
-      <w:pPr>
-        <w:pBdr/>
-        <w:spacing/>
-        <w:ind/>
-        <w:rPr>
-          <w:color w:val="000000" w:themeColor="text1"/>
-          <w:sz w:val="22"/>
-          <w:szCs w:val="22"/>
-          <w:highlight w:val="none"/>
-          <w:vertAlign w:val="baseline"/>
-        </w:rPr>
-      </w:pPr>
-      <w:r>
-        <w:rPr>
-          <w:color w:val="000000" w:themeColor="text1"/>
-          <w:sz w:val="22"/>
-          <w:highlight w:val="none"/>
-          <w:vertAlign w:val="baseline"/>
-        </w:rPr>
-        <w:t xml:space="preserve">Here is pseudocode for all of this:</w:t>
-      </w:r>
-      <w:r>
-        <w:rPr>
-          <w:color w:val="000000" w:themeColor="text1"/>
-          <w:sz w:val="22"/>
-          <w:highlight w:val="none"/>
-          <w:vertAlign w:val="baseline"/>
-        </w:rPr>
-      </w:r>
-    </w:p>
-    <w:p>
-      <w:pPr>
-        <w:pBdr/>
-        <w:spacing/>
-        <w:ind/>
-        <w:rPr>
-          <w:color w:val="000000" w:themeColor="text1"/>
-          <w:sz w:val="22"/>
-          <w:szCs w:val="22"/>
-          <w:highlight w:val="none"/>
-          <w:vertAlign w:val="baseline"/>
-        </w:rPr>
-      </w:pPr>
-      <w:r>
-        <w:rPr>
-          <w:color w:val="000000" w:themeColor="text1"/>
-          <w:sz w:val="22"/>
-          <w:highlight w:val="none"/>
-          <w:vertAlign w:val="baseline"/>
-        </w:rPr>
-      </w:r>
-      <w:r>
-        <mc:AlternateContent>
-          <mc:Choice Requires="wpg">
-            <w:drawing>
-              <wp:inline xmlns:wp="http://schemas.openxmlformats.org/drawingml/2006/wordprocessingDrawing" distT="0" distB="0" distL="0" distR="0">
-                <wp:extent cx="5940425" cy="1688648"/>
-                <wp:effectExtent l="0" t="0" r="0" b="0"/>
-                <wp:docPr id="40" name=""/>
-                <wp:cNvGraphicFramePr>
-                  <a:graphicFrameLocks xmlns:a="http://schemas.openxmlformats.org/drawingml/2006/main" noChangeAspect="1"/>
-                </wp:cNvGraphicFramePr>
-                <a:graphic xmlns:a="http://schemas.openxmlformats.org/drawingml/2006/main">
-                  <a:graphicData uri="http://schemas.openxmlformats.org/drawingml/2006/picture">
-                    <pic:pic xmlns:pic="http://schemas.openxmlformats.org/drawingml/2006/picture">
-                      <pic:nvPicPr>
-                        <pic:cNvPr id="806072209" name=""/>
-                        <pic:cNvPicPr>
-                          <a:picLocks noChangeAspect="1"/>
-                        </pic:cNvPicPr>
-                        <pic:nvPr/>
-                      </pic:nvPicPr>
-                      <pic:blipFill>
-                        <a:blip r:embed="rId51"/>
-                        <a:stretch/>
-                      </pic:blipFill>
-                      <pic:spPr bwMode="auto">
-                        <a:xfrm>
-                          <a:off x="0" y="0"/>
-                          <a:ext cx="5940424" cy="1688648"/>
-                        </a:xfrm>
-                        <a:prstGeom prst="rect">
-                          <a:avLst/>
-                        </a:prstGeom>
-                      </pic:spPr>
-                    </pic:pic>
-                  </a:graphicData>
-                </a:graphic>
-              </wp:inline>
-            </w:drawing>
-          </mc:Choice>
-          <mc:Fallback>
-            <w:pict>
-              <v:shapetype id="_x0000_t75" coordsize="21600,21600" o:spt="75" o:preferrelative="t" path="m@4@5l@4@11@9@11@9@5xe" filled="f" stroked="f">
-                <v:stroke joinstyle="miter"/>
-                <v:formulas>
-                  <v:f eqn="if lineDrawn pixelLineWidth 0"/>
-                  <v:f eqn="sum @0 1 0"/>
-                  <v:f eqn="sum 0 0 @1"/>
-                  <v:f eqn="prod @2 1 2"/>
-                  <v:f eqn="prod @3 21600 pixelWidth"/>
-                  <v:f eqn="prod @3 21600 pixelHeight"/>
-                  <v:f eqn="sum @0 0 1"/>
-                  <v:f eqn="prod @6 1 2"/>
-                  <v:f eqn="prod @7 21600 pixelWidth"/>
-                  <v:f eqn="sum @8 21600 0"/>
-                  <v:f eqn="prod @7 21600 pixelHeight"/>
-                  <v:f eqn="sum @10 21600 0"/>
-                </v:formulas>
-                <v:path o:extrusionok="f" gradientshapeok="t" o:connecttype="rect"/>
-                <o:lock v:ext="edit" aspectratio="t"/>
-              </v:shapetype>
-              <v:shape id="_x0000_i39" o:spid="_x0000_s39" type="#_x0000_t75" style="width:467.75pt;height:132.96pt;mso-wrap-distance-left:0.00pt;mso-wrap-distance-top:0.00pt;mso-wrap-distance-right:0.00pt;mso-wrap-distance-bottom:0.00pt;z-index:1;" stroked="false">
+              <v:shape id="_x0000_i39" o:spid="_x0000_s39" type="#_x0000_t75" style="width:467.75pt;height:149.27pt;mso-wrap-distance-left:0.00pt;mso-wrap-distance-top:0.00pt;mso-wrap-distance-right:0.00pt;mso-wrap-distance-bottom:0.00pt;z-index:1;" stroked="false">
                 <v:imagedata r:id="rId51" o:title=""/>
                 <o:lock v:ext="edit" rotation="t"/>
               </v:shape>
@@ -19503,6 +19520,7 @@
         <w:rPr>
           <w:color w:val="000000" w:themeColor="text1"/>
           <w:sz w:val="22"/>
+          <w:szCs w:val="22"/>
           <w:highlight w:val="none"/>
           <w:vertAlign w:val="baseline"/>
         </w:rPr>
@@ -19511,6 +19529,7 @@
         <w:rPr>
           <w:color w:val="000000" w:themeColor="text1"/>
           <w:sz w:val="22"/>
+          <w:szCs w:val="22"/>
           <w:highlight w:val="none"/>
           <w:vertAlign w:val="baseline"/>
         </w:rPr>
@@ -19522,7 +19541,7 @@
         <w:spacing/>
         <w:ind/>
         <w:rPr>
-          <w:color w:val="000000" w:themeColor="text1"/>
+          <w:color w:val="2f5496" w:themeColor="accent5" w:themeShade="BF"/>
           <w:sz w:val="22"/>
           <w:szCs w:val="22"/>
           <w:highlight w:val="none"/>
@@ -19531,7 +19550,7 @@
       </w:pPr>
       <w:r>
         <w:rPr>
-          <w:color w:val="000000" w:themeColor="text1"/>
+          <w:color w:val="2f5696" w:themeColor="accent5" w:themeShade="BF"/>
           <w:sz w:val="22"/>
           <w:highlight w:val="none"/>
           <w:vertAlign w:val="baseline"/>
@@ -19539,8 +19558,17 @@
       </w:r>
       <w:r>
         <w:rPr>
-          <w:color w:val="000000" w:themeColor="text1"/>
-          <w:sz w:val="22"/>
+          <w:color w:val="2f5696" w:themeColor="accent5" w:themeShade="BF"/>
+          <w:sz w:val="22"/>
+          <w:highlight w:val="none"/>
+          <w:vertAlign w:val="baseline"/>
+        </w:rPr>
+      </w:r>
+      <w:r>
+        <w:rPr>
+          <w:color w:val="2f5496" w:themeColor="accent5" w:themeShade="BF"/>
+          <w:sz w:val="22"/>
+          <w:szCs w:val="22"/>
           <w:highlight w:val="none"/>
           <w:vertAlign w:val="baseline"/>
         </w:rPr>
@@ -19552,24 +19580,24 @@
         <w:spacing/>
         <w:ind/>
         <w:rPr>
-          <w:color w:val="2f5696"/>
-          <w:sz w:val="22"/>
+          <w:color w:val="000000" w:themeColor="text1"/>
+          <w:sz w:val="22"/>
+          <w:szCs w:val="22"/>
           <w:highlight w:val="none"/>
           <w:vertAlign w:val="baseline"/>
         </w:rPr>
       </w:pPr>
       <w:r>
         <w:rPr>
-          <w:color w:val="2f5696" w:themeColor="accent5" w:themeShade="BF"/>
+          <w:color w:val="000000" w:themeColor="text1"/>
           <w:sz w:val="22"/>
           <w:highlight w:val="none"/>
           <w:vertAlign w:val="baseline"/>
         </w:rPr>
-        <w:t xml:space="preserve">displayLines</w:t>
-      </w:r>
-      <w:r>
-        <w:rPr>
-          <w:color w:val="2f5696"/>
+      </w:r>
+      <w:r>
+        <w:rPr>
+          <w:color w:val="000000" w:themeColor="text1"/>
           <w:sz w:val="22"/>
           <w:highlight w:val="none"/>
           <w:vertAlign w:val="baseline"/>
@@ -19577,8 +19605,9 @@
       </w:r>
       <w:r>
         <w:rPr>
-          <w:color w:val="2f5696"/>
-          <w:sz w:val="22"/>
+          <w:color w:val="000000" w:themeColor="text1"/>
+          <w:sz w:val="22"/>
+          <w:szCs w:val="22"/>
           <w:highlight w:val="none"/>
           <w:vertAlign w:val="baseline"/>
         </w:rPr>
@@ -19590,91 +19619,33 @@
         <w:spacing/>
         <w:ind/>
         <w:rPr>
-          <w:color w:val="000000" w:themeColor="text1"/>
-          <w:sz w:val="22"/>
-          <w:szCs w:val="22"/>
+          <w:color w:val="2f5696"/>
+          <w:sz w:val="22"/>
           <w:highlight w:val="none"/>
           <w:vertAlign w:val="baseline"/>
         </w:rPr>
       </w:pPr>
       <w:r>
         <w:rPr>
-          <w:color w:val="000000" w:themeColor="text1"/>
-          <w:sz w:val="22"/>
-          <w:szCs w:val="22"/>
+          <w:color w:val="2f5696" w:themeColor="accent5" w:themeShade="BF"/>
+          <w:sz w:val="22"/>
           <w:highlight w:val="none"/>
           <w:vertAlign w:val="baseline"/>
         </w:rPr>
-        <w:t xml:space="preserve">displayLines() works in a similar way with a for loop iterating over planets, but then it also needs to draw a few hundred lines for each planet. It does this by using getRecords() </w:t>
-      </w:r>
-      <w:r>
-        <w:rPr>
-          <w:color w:val="000000" w:themeColor="text1"/>
-          <w:sz w:val="22"/>
-          <w:szCs w:val="22"/>
+        <w:t xml:space="preserve">displayLines</w:t>
+      </w:r>
+      <w:r>
+        <w:rPr>
+          <w:color w:val="2f5696"/>
+          <w:sz w:val="22"/>
           <w:highlight w:val="none"/>
           <w:vertAlign w:val="baseline"/>
         </w:rPr>
-        <w:t xml:space="preserve">to get a list of the planet’s previous positions in chronological order, with the oldest record being the first item in the list. This list will be 300 long in the standard solar system, applying scaledPos() individually to every vector in this list would be very computationally expensive, and a bad idea. Luckily since all scaledPos()</w:t>
-      </w:r>
-      <w:r>
-        <w:rPr>
-          <w:color w:val="000000" w:themeColor="text1"/>
-          <w:sz w:val="22"/>
-          <w:szCs w:val="22"/>
-          <w:highlight w:val="none"/>
-          <w:vertAlign w:val="baseline"/>
-        </w:rPr>
-        <w:t xml:space="preserve"> does is multiply by a scalar, the distConst, we can use numpy arrays to do this operation all in one go, as you can multiply matrices by scalars in numpy. This is a massive performance increase and is the only reason the program runs at a reasonable framerate.</w:t>
-      </w:r>
-      <w:r>
-        <w:rPr>
-          <w:color w:val="000000" w:themeColor="text1"/>
-          <w:sz w:val="22"/>
-          <w:szCs w:val="22"/>
-          <w:highlight w:val="none"/>
-          <w:vertAlign w:val="baseline"/>
-        </w:rPr>
-        <w:t xml:space="preserve"> At the same time adjustment is added to all of the positions. The list created is called orbitalPath.</w:t>
-      </w:r>
-      <w:r>
-        <w:rPr>
-          <w:color w:val="000000" w:themeColor="text1"/>
-          <w:sz w:val="22"/>
-          <w:szCs w:val="22"/>
-          <w:highlight w:val="none"/>
-          <w:vertAlign w:val="baseline"/>
-        </w:rPr>
-      </w:r>
-      <w:r>
-        <w:rPr>
-          <w:color w:val="000000" w:themeColor="text1"/>
-          <w:sz w:val="22"/>
-          <w:szCs w:val="22"/>
-          <w:highlight w:val="none"/>
-          <w:vertAlign w:val="baseline"/>
-        </w:rPr>
-      </w:r>
-      <w:r>
-        <w:rPr>
-          <w:highlight w:val="none"/>
-        </w:rPr>
-      </w:r>
-      <w:r>
-        <w:rPr>
-          <w:highlight w:val="none"/>
-        </w:rPr>
-      </w:r>
-      <w:r>
-        <w:rPr>
-          <w:highlight w:val="none"/>
-        </w:rPr>
-      </w:r>
-      <w:r>
-        <w:rPr>
-          <w:color w:val="000000" w:themeColor="text1"/>
-          <w:sz w:val="22"/>
-          <w:szCs w:val="22"/>
+      </w:r>
+      <w:r>
+        <w:rPr>
+          <w:color w:val="2f5696"/>
+          <w:sz w:val="22"/>
           <w:highlight w:val="none"/>
           <w:vertAlign w:val="baseline"/>
         </w:rPr>
@@ -19701,7 +19672,66 @@
           <w:highlight w:val="none"/>
           <w:vertAlign w:val="baseline"/>
         </w:rPr>
-        <w:t xml:space="preserve">A variable, index, is set to -1. This is used to keep track of what line we’re on, as we want to draw older lines with a more faded colour. This will give a visual indicator of where the planet was at what time. If the line was all one solid colour it would not be clear where the planet was recently and where the planet was a while ago.</w:t>
+        <w:t xml:space="preserve">displayLines() works in a similar way with a for loop iterating over planets, but then it also needs to draw a few hundred lines for each planet. It does this by using getRecords() </w:t>
+      </w:r>
+      <w:r>
+        <w:rPr>
+          <w:color w:val="000000" w:themeColor="text1"/>
+          <w:sz w:val="22"/>
+          <w:szCs w:val="22"/>
+          <w:highlight w:val="none"/>
+          <w:vertAlign w:val="baseline"/>
+        </w:rPr>
+        <w:t xml:space="preserve">to get a list of the planet’s previous positions in chronological order, with th</w:t>
+      </w:r>
+      <w:r>
+        <w:rPr>
+          <w:color w:val="000000" w:themeColor="text1"/>
+          <w:sz w:val="22"/>
+          <w:szCs w:val="22"/>
+          <w:highlight w:val="none"/>
+          <w:vertAlign w:val="baseline"/>
+        </w:rPr>
+        <w:t xml:space="preserve">e oldest record being the first item in the list. This list will be 300 long in the standard solar system, applying scaledPos() individually to every vector in this list would be very computationally expensive, and a bad idea. Luckily since all scaledPos()</w:t>
+      </w:r>
+      <w:r>
+        <w:rPr>
+          <w:color w:val="000000" w:themeColor="text1"/>
+          <w:sz w:val="22"/>
+          <w:szCs w:val="22"/>
+          <w:highlight w:val="none"/>
+          <w:vertAlign w:val="baseline"/>
+        </w:rPr>
+        <w:t xml:space="preserve"> does</w:t>
+      </w:r>
+      <w:r>
+        <w:rPr>
+          <w:color w:val="000000" w:themeColor="text1"/>
+          <w:sz w:val="22"/>
+          <w:szCs w:val="22"/>
+          <w:highlight w:val="none"/>
+          <w:vertAlign w:val="baseline"/>
+        </w:rPr>
+        <w:t xml:space="preserve"> is multiply by a scalar, the distConst, we can use numpy arrays to do this operation all in one go, as you can multiply matrices by scalars in numpy. This is a massive performance increase and is the only reason the program runs at a reasonable framerate.</w:t>
+      </w:r>
+      <w:r>
+        <w:rPr>
+          <w:color w:val="000000" w:themeColor="text1"/>
+          <w:sz w:val="22"/>
+          <w:szCs w:val="22"/>
+          <w:highlight w:val="none"/>
+          <w:vertAlign w:val="baseline"/>
+        </w:rPr>
+        <w:t xml:space="preserve"> At the same time adjustment is added to all of the positions. The list created is called orbitalPath.</w:t>
+      </w:r>
+      <w:r>
+        <w:rPr>
+          <w:color w:val="000000" w:themeColor="text1"/>
+          <w:sz w:val="22"/>
+          <w:szCs w:val="22"/>
+          <w:highlight w:val="none"/>
+          <w:vertAlign w:val="baseline"/>
+        </w:rPr>
       </w:r>
       <w:r>
         <w:rPr>
@@ -19734,7 +19764,26 @@
           <w:highlight w:val="none"/>
           <w:vertAlign w:val="baseline"/>
         </w:rPr>
-        <w:t xml:space="preserve">A for loop is then used to iterate over orbitalPath, drawing a line between each consecutive pair of positions. Index will be incremented by one each loop and an “indexRatio” is calcuated, this is index/len(orbitalPath). This is used to determine the colour of the line.</w:t>
+        <w:t xml:space="preserve">A variable, index, is set to -1. This is used to keep track of what line we’re on,</w:t>
+      </w:r>
+      <w:r>
+        <w:rPr>
+          <w:color w:val="000000" w:themeColor="text1"/>
+          <w:sz w:val="22"/>
+          <w:szCs w:val="22"/>
+          <w:highlight w:val="none"/>
+          <w:vertAlign w:val="baseline"/>
+        </w:rPr>
+        <w:t xml:space="preserve"> as we want to draw older lines with a more faded colour. This will give a visual indicator of where the planet was at what time. If the line was all one solid colour it would not be clear where the planet was recently and where the planet was a while ago.</w:t>
+      </w:r>
+      <w:r>
+        <w:rPr>
+          <w:color w:val="000000" w:themeColor="text1"/>
+          <w:sz w:val="22"/>
+          <w:szCs w:val="22"/>
+          <w:highlight w:val="none"/>
+          <w:vertAlign w:val="baseline"/>
+        </w:rPr>
       </w:r>
       <w:r>
         <w:rPr>
@@ -19767,7 +19816,7 @@
           <w:highlight w:val="none"/>
           <w:vertAlign w:val="baseline"/>
         </w:rPr>
-        <w:t xml:space="preserve">There are two situations where we don’t want to draw a line:</w:t>
+        <w:t xml:space="preserve">A for loop is </w:t>
       </w:r>
       <w:r>
         <w:rPr>
@@ -19777,12 +19826,72 @@
           <w:highlight w:val="none"/>
           <w:vertAlign w:val="baseline"/>
         </w:rPr>
-      </w:r>
-      <w:r/>
+        <w:t xml:space="preserve">then used to iterate over orbitalPath, drawing a line between each consecutive pair of positions. Index will be incremented by one each loop and an “indexRatio” is calcuated, this is index/len(orbitalPath). This is used to determine the colour of the line.</w:t>
+      </w:r>
+      <w:r>
+        <w:rPr>
+          <w:color w:val="000000" w:themeColor="text1"/>
+          <w:sz w:val="22"/>
+          <w:szCs w:val="22"/>
+          <w:highlight w:val="none"/>
+          <w:vertAlign w:val="baseline"/>
+        </w:rPr>
+      </w:r>
+      <w:r>
+        <w:rPr>
+          <w:color w:val="000000" w:themeColor="text1"/>
+          <w:sz w:val="22"/>
+          <w:szCs w:val="22"/>
+          <w:highlight w:val="none"/>
+          <w:vertAlign w:val="baseline"/>
+        </w:rPr>
+      </w:r>
     </w:p>
     <w:p>
       <w:pPr>
-        <w:pStyle w:val="862"/>
+        <w:pBdr/>
+        <w:spacing/>
+        <w:ind/>
+        <w:rPr>
+          <w:color w:val="000000" w:themeColor="text1"/>
+          <w:sz w:val="22"/>
+          <w:szCs w:val="22"/>
+          <w:highlight w:val="none"/>
+          <w:vertAlign w:val="baseline"/>
+        </w:rPr>
+      </w:pPr>
+      <w:r>
+        <w:rPr>
+          <w:color w:val="000000" w:themeColor="text1"/>
+          <w:sz w:val="22"/>
+          <w:szCs w:val="22"/>
+          <w:highlight w:val="none"/>
+          <w:vertAlign w:val="baseline"/>
+        </w:rPr>
+        <w:t xml:space="preserve">There are two situations where we don’t want to draw a line:</w:t>
+      </w:r>
+      <w:r>
+        <w:rPr>
+          <w:color w:val="000000" w:themeColor="text1"/>
+          <w:sz w:val="22"/>
+          <w:szCs w:val="22"/>
+          <w:highlight w:val="none"/>
+          <w:vertAlign w:val="baseline"/>
+        </w:rPr>
+      </w:r>
+      <w:r>
+        <w:rPr>
+          <w:color w:val="000000" w:themeColor="text1"/>
+          <w:sz w:val="22"/>
+          <w:szCs w:val="22"/>
+          <w:highlight w:val="none"/>
+          <w:vertAlign w:val="baseline"/>
+        </w:rPr>
+      </w:r>
+    </w:p>
+    <w:p>
+      <w:pPr>
+        <w:pStyle w:val="864"/>
         <w:numPr>
           <w:ilvl w:val="0"/>
           <w:numId w:val="6"/>
@@ -19817,10 +19926,19 @@
           <w:vertAlign w:val="baseline"/>
         </w:rPr>
       </w:r>
+      <w:r>
+        <w:rPr>
+          <w:color w:val="000000" w:themeColor="text1"/>
+          <w:sz w:val="22"/>
+          <w:szCs w:val="22"/>
+          <w:highlight w:val="none"/>
+          <w:vertAlign w:val="baseline"/>
+        </w:rPr>
+      </w:r>
     </w:p>
     <w:p>
       <w:pPr>
-        <w:pStyle w:val="862"/>
+        <w:pStyle w:val="864"/>
         <w:numPr>
           <w:ilvl w:val="0"/>
           <w:numId w:val="6"/>
@@ -19844,7 +19962,36 @@
           <w:highlight w:val="none"/>
           <w:vertAlign w:val="baseline"/>
         </w:rPr>
-        <w:t xml:space="preserve">The line belongs to a satellite who’s host isn’t focused on at the moment and the satellite itself isn’t focused on. If the host is not focused on it’s very unlikely the satellite would be visible as moons are so much smaller than planets, so in this case there’s no point drawing it. To have access to this information displayLines() will be passed focus and comFocus as arguments, we will check first if the current planet is a satellite by seeing if p.getHost() == None or not and then check if the planet is focused on and if the planet’s host is focused on.</w:t>
+        <w:t xml:space="preserve">The line belongs to a satellite who’s host isn’t f</w:t>
+      </w:r>
+      <w:r>
+        <w:rPr>
+          <w:color w:val="000000" w:themeColor="text1"/>
+          <w:sz w:val="22"/>
+          <w:szCs w:val="22"/>
+          <w:highlight w:val="none"/>
+          <w:vertAlign w:val="baseline"/>
+        </w:rPr>
+        <w:t xml:space="preserve">ocused on at the moment and the satellite itself isn’t focused on. If the host is not focused on it’s very unlikely the satellite would be visible as moons are so much smaller than planets, so in this case there’s no point drawing it. To have access to thi</w:t>
+      </w:r>
+      <w:r>
+        <w:rPr>
+          <w:color w:val="000000" w:themeColor="text1"/>
+          <w:sz w:val="22"/>
+          <w:szCs w:val="22"/>
+          <w:highlight w:val="none"/>
+          <w:vertAlign w:val="baseline"/>
+        </w:rPr>
+        <w:t xml:space="preserve">s information displayLines() will be passed focus and comFocus as arguments, we will check first if the current planet is a satellite by seeing if p.getHost() == None or not and then check if the planet is focused on and if the planet’s host is focused on.</w:t>
+      </w:r>
+      <w:r>
+        <w:rPr>
+          <w:color w:val="000000" w:themeColor="text1"/>
+          <w:sz w:val="22"/>
+          <w:szCs w:val="22"/>
+          <w:highlight w:val="none"/>
+          <w:vertAlign w:val="baseline"/>
+        </w:rPr>
       </w:r>
       <w:r>
         <w:rPr>
@@ -19888,6 +20035,15 @@
           <w:vertAlign w:val="baseline"/>
         </w:rPr>
       </w:r>
+      <w:r>
+        <w:rPr>
+          <w:color w:val="000000" w:themeColor="text1"/>
+          <w:sz w:val="22"/>
+          <w:szCs w:val="22"/>
+          <w:highlight w:val="none"/>
+          <w:vertAlign w:val="baseline"/>
+        </w:rPr>
+      </w:r>
     </w:p>
     <w:p>
       <w:pPr>
@@ -19910,7 +20066,26 @@
           <w:highlight w:val="none"/>
           <w:vertAlign w:val="baseline"/>
         </w:rPr>
-        <w:t xml:space="preserve">Pygame.draw.aaline() needs a surface to draw the line on, the colour of the line and the start and end points for the line. The surface will be given to the function as an argument. The colour will be indexRatio*p.getColour(). This makes it so that older lines are drawn darker, with the darkest ones being drawn as black and completely fading into the background. The start and end points will simply be the current position and the next position in orbitalPath. Here is pseudocode showing all of this:</w:t>
+        <w:t xml:space="preserve">Pygame.draw.aaline() needs a surface to draw the line on, the colour of the line and the start and end points for the line. The surface will be given to the function as an argument. The colour will be indexRatio*p.getColour(). This makes it so tha</w:t>
+      </w:r>
+      <w:r>
+        <w:rPr>
+          <w:color w:val="000000" w:themeColor="text1"/>
+          <w:sz w:val="22"/>
+          <w:szCs w:val="22"/>
+          <w:highlight w:val="none"/>
+          <w:vertAlign w:val="baseline"/>
+        </w:rPr>
+        <w:t xml:space="preserve">t older lines are drawn darker, with the darkest ones being drawn as black and completely fading into the background. The start and end points will simply be the current position and the next position in orbitalPath. Here is pseudocode showing all of this:</w:t>
+      </w:r>
+      <w:r>
+        <w:rPr>
+          <w:color w:val="000000" w:themeColor="text1"/>
+          <w:sz w:val="22"/>
+          <w:szCs w:val="22"/>
+          <w:highlight w:val="none"/>
+          <w:vertAlign w:val="baseline"/>
+        </w:rPr>
       </w:r>
       <w:r>
         <w:rPr>
@@ -19928,11 +20103,7 @@
         <w:spacing/>
         <w:ind/>
         <w:rPr>
-          <w:color w:val="000000" w:themeColor="text1"/>
-          <w:sz w:val="22"/>
-          <w:szCs w:val="22"/>
-          <w:highlight w:val="none"/>
-          <w:vertAlign w:val="baseline"/>
+          <w:highlight w:val="none"/>
         </w:rPr>
       </w:pPr>
       <w:r>
@@ -20024,9 +20195,923 @@
       </w:r>
       <w:r>
         <w:rPr>
-          <w:color w:val="000000" w:themeColor="text1"/>
-          <w:sz w:val="22"/>
-          <w:szCs w:val="22"/>
+          <w:highlight w:val="none"/>
+        </w:rPr>
+      </w:r>
+    </w:p>
+    <w:p>
+      <w:pPr>
+        <w:pBdr/>
+        <w:spacing/>
+        <w:ind/>
+        <w:rPr>
+          <w:highlight w:val="none"/>
+        </w:rPr>
+      </w:pPr>
+      <w:r>
+        <w:rPr>
+          <w:highlight w:val="none"/>
+        </w:rPr>
+      </w:r>
+      <w:r>
+        <w:rPr>
+          <w:highlight w:val="none"/>
+        </w:rPr>
+      </w:r>
+    </w:p>
+    <w:p>
+      <w:pPr>
+        <w:pBdr/>
+        <w:spacing/>
+        <w:ind/>
+        <w:rPr>
+          <w:color w:val="2f5496" w:themeColor="accent5" w:themeShade="BF"/>
+          <w:sz w:val="22"/>
+          <w:szCs w:val="22"/>
+          <w:highlight w:val="none"/>
+          <w:vertAlign w:val="baseline"/>
+        </w:rPr>
+      </w:pPr>
+      <w:r>
+        <w:rPr>
+          <w:color w:val="2f5696" w:themeColor="accent5" w:themeShade="BF"/>
+          <w:sz w:val="22"/>
+          <w:highlight w:val="none"/>
+          <w:vertAlign w:val="baseline"/>
+        </w:rPr>
+        <w:t xml:space="preserve">drawArrow</w:t>
+      </w:r>
+      <w:r>
+        <w:rPr>
+          <w:highlight w:val="none"/>
+        </w:rPr>
+      </w:r>
+      <w:r>
+        <w:rPr>
+          <w:color w:val="2f5696"/>
+          <w:sz w:val="22"/>
+          <w:highlight w:val="none"/>
+          <w:vertAlign w:val="baseline"/>
+        </w:rPr>
+      </w:r>
+    </w:p>
+    <w:p>
+      <w:pPr>
+        <w:pBdr/>
+        <w:spacing/>
+        <w:ind/>
+        <w:rPr>
+          <w:color w:val="000000" w:themeColor="text1"/>
+          <w:sz w:val="22"/>
+          <w:szCs w:val="22"/>
+          <w:highlight w:val="none"/>
+          <w:vertAlign w:val="baseline"/>
+        </w:rPr>
+      </w:pPr>
+      <w:r>
+        <w:rPr>
+          <w:color w:val="000000" w:themeColor="text1"/>
+          <w:sz w:val="22"/>
+          <w:highlight w:val="none"/>
+          <w:vertAlign w:val="baseline"/>
+        </w:rPr>
+        <w:t xml:space="preserve">drawArrow should be able to take in a surface to draw an arrow, the colour to draw the arrow, and the start and end points of that arrow. To do this, we need to think about how an arrow is drawn. An arrow is made up of 3 lines, like this:</w:t>
+      </w:r>
+      <w:r>
+        <w:rPr>
+          <w:color w:val="000000" w:themeColor="text1"/>
+          <w:sz w:val="22"/>
+          <w:szCs w:val="22"/>
+          <w:highlight w:val="none"/>
+          <w:vertAlign w:val="baseline"/>
+        </w:rPr>
+      </w:r>
+    </w:p>
+    <w:p>
+      <w:pPr>
+        <w:pBdr/>
+        <w:spacing/>
+        <w:ind/>
+        <w:rPr>
+          <w:highlight w:val="none"/>
+        </w:rPr>
+      </w:pPr>
+      <w:r>
+        <w:rPr>
+          <w:color w:val="000000" w:themeColor="text1"/>
+          <w:sz w:val="22"/>
+          <w:highlight w:val="none"/>
+          <w:vertAlign w:val="baseline"/>
+        </w:rPr>
+      </w:r>
+      <w:r>
+        <mc:AlternateContent>
+          <mc:Choice Requires="wpg">
+            <w:drawing>
+              <wp:inline xmlns:wp="http://schemas.openxmlformats.org/drawingml/2006/wordprocessingDrawing" distT="0" distB="0" distL="0" distR="0">
+                <wp:extent cx="3867150" cy="7305675"/>
+                <wp:effectExtent l="0" t="0" r="0" b="0"/>
+                <wp:docPr id="42" name=""/>
+                <wp:cNvGraphicFramePr>
+                  <a:graphicFrameLocks xmlns:a="http://schemas.openxmlformats.org/drawingml/2006/main" noChangeAspect="1"/>
+                </wp:cNvGraphicFramePr>
+                <a:graphic xmlns:a="http://schemas.openxmlformats.org/drawingml/2006/main">
+                  <a:graphicData uri="http://schemas.openxmlformats.org/drawingml/2006/picture">
+                    <pic:pic xmlns:pic="http://schemas.openxmlformats.org/drawingml/2006/picture">
+                      <pic:nvPicPr>
+                        <pic:cNvPr id="1343530998" name=""/>
+                        <pic:cNvPicPr>
+                          <a:picLocks noChangeAspect="1"/>
+                        </pic:cNvPicPr>
+                        <pic:nvPr/>
+                      </pic:nvPicPr>
+                      <pic:blipFill>
+                        <a:blip r:embed="rId53"/>
+                        <a:stretch/>
+                      </pic:blipFill>
+                      <pic:spPr bwMode="auto">
+                        <a:xfrm>
+                          <a:off x="0" y="0"/>
+                          <a:ext cx="3867149" cy="7305674"/>
+                        </a:xfrm>
+                        <a:prstGeom prst="rect">
+                          <a:avLst/>
+                        </a:prstGeom>
+                      </pic:spPr>
+                    </pic:pic>
+                  </a:graphicData>
+                </a:graphic>
+              </wp:inline>
+            </w:drawing>
+          </mc:Choice>
+          <mc:Fallback>
+            <w:pict>
+              <v:shapetype id="_x0000_t75" coordsize="21600,21600" o:spt="75" o:preferrelative="t" path="m@4@5l@4@11@9@11@9@5xe" filled="f" stroked="f">
+                <v:stroke joinstyle="miter"/>
+                <v:formulas>
+                  <v:f eqn="if lineDrawn pixelLineWidth 0"/>
+                  <v:f eqn="sum @0 1 0"/>
+                  <v:f eqn="sum 0 0 @1"/>
+                  <v:f eqn="prod @2 1 2"/>
+                  <v:f eqn="prod @3 21600 pixelWidth"/>
+                  <v:f eqn="prod @3 21600 pixelHeight"/>
+                  <v:f eqn="sum @0 0 1"/>
+                  <v:f eqn="prod @6 1 2"/>
+                  <v:f eqn="prod @7 21600 pixelWidth"/>
+                  <v:f eqn="sum @8 21600 0"/>
+                  <v:f eqn="prod @7 21600 pixelHeight"/>
+                  <v:f eqn="sum @10 21600 0"/>
+                </v:formulas>
+                <v:path o:extrusionok="f" gradientshapeok="t" o:connecttype="rect"/>
+                <o:lock v:ext="edit" aspectratio="t"/>
+              </v:shapetype>
+              <v:shape id="_x0000_i41" o:spid="_x0000_s41" type="#_x0000_t75" style="width:304.50pt;height:575.25pt;mso-wrap-distance-left:0.00pt;mso-wrap-distance-top:0.00pt;mso-wrap-distance-right:0.00pt;mso-wrap-distance-bottom:0.00pt;z-index:1;" stroked="false">
+                <v:imagedata r:id="rId53" o:title=""/>
+                <o:lock v:ext="edit" rotation="t"/>
+              </v:shape>
+            </w:pict>
+          </mc:Fallback>
+        </mc:AlternateContent>
+      </w:r>
+      <w:r>
+        <w:rPr>
+          <w:color w:val="000000" w:themeColor="text1"/>
+          <w:sz w:val="22"/>
+          <w:highlight w:val="none"/>
+          <w:vertAlign w:val="baseline"/>
+        </w:rPr>
+      </w:r>
+      <w:r>
+        <w:rPr>
+          <w:color w:val="000000" w:themeColor="text1"/>
+          <w:sz w:val="22"/>
+          <w:szCs w:val="22"/>
+          <w:highlight w:val="none"/>
+          <w:vertAlign w:val="baseline"/>
+        </w:rPr>
+      </w:r>
+    </w:p>
+    <w:p>
+      <w:pPr>
+        <w:pBdr/>
+        <w:spacing/>
+        <w:ind/>
+        <w:rPr>
+          <w:color w:val="000000" w:themeColor="text1"/>
+          <w:sz w:val="22"/>
+          <w:szCs w:val="22"/>
+          <w:highlight w:val="none"/>
+          <w:vertAlign w:val="baseline"/>
+        </w:rPr>
+      </w:pPr>
+      <w:r>
+        <w:rPr>
+          <w:color w:val="000000" w:themeColor="text1"/>
+          <w:sz w:val="22"/>
+          <w:szCs w:val="22"/>
+          <w:highlight w:val="none"/>
+          <w:vertAlign w:val="baseline"/>
+        </w:rPr>
+      </w:r>
+      <w:r>
+        <w:rPr>
+          <w:color w:val="000000" w:themeColor="text1"/>
+          <w:sz w:val="22"/>
+          <w:szCs w:val="22"/>
+          <w:highlight w:val="none"/>
+          <w:vertAlign w:val="baseline"/>
+        </w:rPr>
+      </w:r>
+    </w:p>
+    <w:p>
+      <w:pPr>
+        <w:pBdr/>
+        <w:spacing/>
+        <w:ind/>
+        <w:rPr>
+          <w:highlight w:val="none"/>
+        </w:rPr>
+      </w:pPr>
+      <w:r>
+        <w:rPr>
+          <w:highlight w:val="none"/>
+        </w:rPr>
+        <w:t xml:space="preserve">The key thing to notice is that the two diagonal lines, the ones that make up the arrow head, lie on the perpendicular to the main line of the arrow. This means to draw an arrow we need to first draw a main line, and then pick two points that are on the perpendicular to that line near the tip. We then connect the tip to those two points with lines, and we have an arrow.</w:t>
+      </w:r>
+      <w:r>
+        <w:rPr>
+          <w:highlight w:val="none"/>
+        </w:rPr>
+      </w:r>
+    </w:p>
+    <w:p>
+      <w:pPr>
+        <w:pBdr/>
+        <w:spacing/>
+        <w:ind/>
+        <w:rPr>
+          <w:highlight w:val="none"/>
+        </w:rPr>
+      </w:pPr>
+      <w:r>
+        <w:rPr>
+          <w:highlight w:val="none"/>
+        </w:rPr>
+        <w:t xml:space="preserve">The way this is done in code is by making a vector representing the main line, this is endPos - startPos where endPos and startPos are the ends and beginning of the line respectively. Let’s call this mainVector, so mainVector = endPos – startPos. We then use pygame.draw.aaline() to draw a line between those tow points.</w:t>
+      </w:r>
+      <w:r>
+        <w:rPr>
+          <w:highlight w:val="none"/>
+        </w:rPr>
+      </w:r>
+    </w:p>
+    <w:p>
+      <w:pPr>
+        <w:pBdr/>
+        <w:spacing/>
+        <w:ind/>
+        <w:rPr>
+          <w:highlight w:val="none"/>
+        </w:rPr>
+      </w:pPr>
+      <w:r>
+        <w:rPr>
+          <w:highlight w:val="none"/>
+        </w:rPr>
+        <w:t xml:space="preserve">Next, we calculate the normal to mainVector. This is done using the vec.normal() method from my vectors file. So normal = vec.normal(mainVector). To pick our two points, we start at our startPos, go most of the way along mainVector, and then go a tiny bit along the normal in one direction or the other, like this:</w:t>
+      </w:r>
+      <w:r>
+        <w:rPr>
+          <w:highlight w:val="none"/>
+        </w:rPr>
+      </w:r>
+    </w:p>
+    <w:p>
+      <w:pPr>
+        <w:pBdr/>
+        <w:spacing/>
+        <w:ind/>
+        <w:rPr>
+          <w:highlight w:val="none"/>
+        </w:rPr>
+      </w:pPr>
+      <w:r>
+        <w:rPr>
+          <w:highlight w:val="none"/>
+        </w:rPr>
+        <w:t xml:space="preserve">point1 = startPos + 0.9*mainVector + 0.05*length*normal</w:t>
+      </w:r>
+      <w:r>
+        <w:rPr>
+          <w:highlight w:val="none"/>
+        </w:rPr>
+      </w:r>
+    </w:p>
+    <w:p>
+      <w:pPr>
+        <w:pBdr/>
+        <w:spacing/>
+        <w:ind/>
+        <w:rPr>
+          <w:highlight w:val="none"/>
+        </w:rPr>
+      </w:pPr>
+      <w:r>
+        <w:rPr>
+          <w:highlight w:val="none"/>
+        </w:rPr>
+        <w:t xml:space="preserve">point2 = startPos + 0.9*mainVector - 0.05*length*normal</w:t>
+      </w:r>
+      <w:r>
+        <w:rPr>
+          <w:highlight w:val="none"/>
+        </w:rPr>
+      </w:r>
+    </w:p>
+    <w:p>
+      <w:pPr>
+        <w:pBdr/>
+        <w:spacing/>
+        <w:ind/>
+        <w:rPr>
+          <w:highlight w:val="none"/>
+        </w:rPr>
+      </w:pPr>
+      <w:r>
+        <w:rPr>
+          <w:highlight w:val="none"/>
+        </w:rPr>
+        <w:t xml:space="preserve">This will generate two points lying on the perpendicular to mainVector. Now all we have to do is draw two lines between these points and the endPos of the line.</w:t>
+      </w:r>
+      <w:r>
+        <w:rPr>
+          <w:highlight w:val="none"/>
+        </w:rPr>
+      </w:r>
+    </w:p>
+    <w:p>
+      <w:pPr>
+        <w:pBdr/>
+        <w:spacing/>
+        <w:ind/>
+        <w:rPr>
+          <w:highlight w:val="none"/>
+        </w:rPr>
+      </w:pPr>
+      <w:r>
+        <w:rPr>
+          <w:highlight w:val="none"/>
+        </w:rPr>
+        <w:t xml:space="preserve">Here is pseudocode showing how this all works:</w:t>
+      </w:r>
+      <w:r>
+        <w:rPr>
+          <w:highlight w:val="none"/>
+        </w:rPr>
+      </w:r>
+    </w:p>
+    <w:p>
+      <w:pPr>
+        <w:pBdr/>
+        <w:spacing/>
+        <w:ind/>
+        <w:rPr>
+          <w:highlight w:val="none"/>
+        </w:rPr>
+      </w:pPr>
+      <w:r>
+        <w:rPr>
+          <w:highlight w:val="none"/>
+        </w:rPr>
+      </w:r>
+      <w:r>
+        <mc:AlternateContent>
+          <mc:Choice Requires="wpg">
+            <w:drawing>
+              <wp:inline xmlns:wp="http://schemas.openxmlformats.org/drawingml/2006/wordprocessingDrawing" distT="0" distB="0" distL="0" distR="0">
+                <wp:extent cx="5940425" cy="1825026"/>
+                <wp:effectExtent l="0" t="0" r="0" b="0"/>
+                <wp:docPr id="43" name=""/>
+                <wp:cNvGraphicFramePr>
+                  <a:graphicFrameLocks xmlns:a="http://schemas.openxmlformats.org/drawingml/2006/main" noChangeAspect="1"/>
+                </wp:cNvGraphicFramePr>
+                <a:graphic xmlns:a="http://schemas.openxmlformats.org/drawingml/2006/main">
+                  <a:graphicData uri="http://schemas.openxmlformats.org/drawingml/2006/picture">
+                    <pic:pic xmlns:pic="http://schemas.openxmlformats.org/drawingml/2006/picture">
+                      <pic:nvPicPr>
+                        <pic:cNvPr id="1447832264" name=""/>
+                        <pic:cNvPicPr>
+                          <a:picLocks noChangeAspect="1"/>
+                        </pic:cNvPicPr>
+                        <pic:nvPr/>
+                      </pic:nvPicPr>
+                      <pic:blipFill>
+                        <a:blip r:embed="rId54"/>
+                        <a:stretch/>
+                      </pic:blipFill>
+                      <pic:spPr bwMode="auto">
+                        <a:xfrm>
+                          <a:off x="0" y="0"/>
+                          <a:ext cx="5940424" cy="1825026"/>
+                        </a:xfrm>
+                        <a:prstGeom prst="rect">
+                          <a:avLst/>
+                        </a:prstGeom>
+                      </pic:spPr>
+                    </pic:pic>
+                  </a:graphicData>
+                </a:graphic>
+              </wp:inline>
+            </w:drawing>
+          </mc:Choice>
+          <mc:Fallback>
+            <w:pict>
+              <v:shapetype id="_x0000_t75" coordsize="21600,21600" o:spt="75" o:preferrelative="t" path="m@4@5l@4@11@9@11@9@5xe" filled="f" stroked="f">
+                <v:stroke joinstyle="miter"/>
+                <v:formulas>
+                  <v:f eqn="if lineDrawn pixelLineWidth 0"/>
+                  <v:f eqn="sum @0 1 0"/>
+                  <v:f eqn="sum 0 0 @1"/>
+                  <v:f eqn="prod @2 1 2"/>
+                  <v:f eqn="prod @3 21600 pixelWidth"/>
+                  <v:f eqn="prod @3 21600 pixelHeight"/>
+                  <v:f eqn="sum @0 0 1"/>
+                  <v:f eqn="prod @6 1 2"/>
+                  <v:f eqn="prod @7 21600 pixelWidth"/>
+                  <v:f eqn="sum @8 21600 0"/>
+                  <v:f eqn="prod @7 21600 pixelHeight"/>
+                  <v:f eqn="sum @10 21600 0"/>
+                </v:formulas>
+                <v:path o:extrusionok="f" gradientshapeok="t" o:connecttype="rect"/>
+                <o:lock v:ext="edit" aspectratio="t"/>
+              </v:shapetype>
+              <v:shape id="_x0000_i42" o:spid="_x0000_s42" type="#_x0000_t75" style="width:467.75pt;height:143.70pt;mso-wrap-distance-left:0.00pt;mso-wrap-distance-top:0.00pt;mso-wrap-distance-right:0.00pt;mso-wrap-distance-bottom:0.00pt;z-index:1;" stroked="false">
+                <v:imagedata r:id="rId54" o:title=""/>
+                <o:lock v:ext="edit" rotation="t"/>
+              </v:shape>
+            </w:pict>
+          </mc:Fallback>
+        </mc:AlternateContent>
+      </w:r>
+      <w:r>
+        <w:rPr>
+          <w:highlight w:val="none"/>
+        </w:rPr>
+      </w:r>
+      <w:r>
+        <w:rPr>
+          <w:highlight w:val="none"/>
+        </w:rPr>
+      </w:r>
+    </w:p>
+    <w:p>
+      <w:pPr>
+        <w:pBdr/>
+        <w:spacing/>
+        <w:ind/>
+        <w:rPr>
+          <w:highlight w:val="none"/>
+        </w:rPr>
+      </w:pPr>
+      <w:r>
+        <w:rPr>
+          <w:highlight w:val="none"/>
+        </w:rPr>
+      </w:r>
+      <w:r>
+        <w:rPr>
+          <w:highlight w:val="none"/>
+        </w:rPr>
+      </w:r>
+    </w:p>
+    <w:p>
+      <w:pPr>
+        <w:pBdr/>
+        <w:spacing/>
+        <w:ind/>
+        <w:rPr>
+          <w:color w:val="2f5496" w:themeColor="accent5" w:themeShade="BF"/>
+          <w:sz w:val="22"/>
+          <w:szCs w:val="22"/>
+          <w:highlight w:val="none"/>
+          <w:vertAlign w:val="baseline"/>
+        </w:rPr>
+      </w:pPr>
+      <w:r>
+        <w:rPr>
+          <w:color w:val="2f5696" w:themeColor="accent5" w:themeShade="BF"/>
+          <w:sz w:val="22"/>
+          <w:highlight w:val="none"/>
+          <w:vertAlign w:val="baseline"/>
+        </w:rPr>
+        <w:t xml:space="preserve">displayArrows</w:t>
+      </w:r>
+      <w:r>
+        <w:rPr>
+          <w:highlight w:val="none"/>
+        </w:rPr>
+      </w:r>
+      <w:r>
+        <w:rPr>
+          <w:color w:val="2f5496" w:themeColor="accent5" w:themeShade="BF"/>
+          <w:sz w:val="22"/>
+          <w:szCs w:val="22"/>
+          <w:highlight w:val="none"/>
+          <w:vertAlign w:val="baseline"/>
+        </w:rPr>
+      </w:r>
+    </w:p>
+    <w:p>
+      <w:pPr>
+        <w:pBdr/>
+        <w:spacing/>
+        <w:ind/>
+        <w:rPr>
+          <w:color w:val="000000" w:themeColor="text1"/>
+          <w:sz w:val="22"/>
+          <w:szCs w:val="22"/>
+          <w:highlight w:val="none"/>
+          <w:vertAlign w:val="baseline"/>
+        </w:rPr>
+      </w:pPr>
+      <w:r>
+        <w:rPr>
+          <w:color w:val="000000" w:themeColor="text1"/>
+          <w:sz w:val="22"/>
+          <w:highlight w:val="none"/>
+          <w:vertAlign w:val="baseline"/>
+        </w:rPr>
+        <w:t xml:space="preserve">displayArrows() needs to draw arrows that come out of the currently selected planet based on the forces acting on that planet. The function should have a check to see if comFocus is true as if it is that means no planet is selected and it shouldn’t display any arrows. A copy of the forces on the planet are stored in its arrows attribute and can be accessed with p.getArrows(). The currently selected planet can be found using planets[focus].</w:t>
+      </w:r>
+      <w:r>
+        <w:rPr>
+          <w:color w:val="000000" w:themeColor="text1"/>
+          <w:sz w:val="22"/>
+          <w:szCs w:val="22"/>
+          <w:highlight w:val="none"/>
+          <w:vertAlign w:val="baseline"/>
+        </w:rPr>
+      </w:r>
+    </w:p>
+    <w:p>
+      <w:pPr>
+        <w:pBdr/>
+        <w:spacing/>
+        <w:ind/>
+        <w:rPr>
+          <w:color w:val="000000" w:themeColor="text1"/>
+          <w:sz w:val="22"/>
+          <w:szCs w:val="22"/>
+          <w:highlight w:val="none"/>
+          <w:vertAlign w:val="baseline"/>
+        </w:rPr>
+      </w:pPr>
+      <w:r>
+        <w:rPr>
+          <w:color w:val="000000" w:themeColor="text1"/>
+          <w:sz w:val="22"/>
+          <w:highlight w:val="none"/>
+          <w:vertAlign w:val="baseline"/>
+        </w:rPr>
+        <w:t xml:space="preserve">The function will iterate over every arrow in p.getArrows() and draw them each.</w:t>
+      </w:r>
+      <w:r>
+        <w:rPr>
+          <w:color w:val="000000" w:themeColor="text1"/>
+          <w:sz w:val="22"/>
+          <w:highlight w:val="none"/>
+          <w:vertAlign w:val="baseline"/>
+        </w:rPr>
+      </w:r>
+    </w:p>
+    <w:p>
+      <w:pPr>
+        <w:pBdr/>
+        <w:spacing/>
+        <w:ind/>
+        <w:rPr>
+          <w:color w:val="000000" w:themeColor="text1"/>
+          <w:sz w:val="22"/>
+          <w:szCs w:val="22"/>
+          <w:highlight w:val="none"/>
+          <w:vertAlign w:val="baseline"/>
+        </w:rPr>
+      </w:pPr>
+      <w:r>
+        <w:rPr>
+          <w:color w:val="000000" w:themeColor="text1"/>
+          <w:sz w:val="22"/>
+          <w:highlight w:val="none"/>
+          <w:vertAlign w:val="baseline"/>
+        </w:rPr>
+        <w:t xml:space="preserve">drawArrow() takes 4 inputs, the surface, the colour, the startPos and the endPos. The surface will simply be passed into displayArrows() as an argument. The colour is just the first item stored in an arrow. The startPos should be the scaled and adjusted position of the planet.</w:t>
+      </w:r>
+      <w:r>
+        <w:rPr>
+          <w:color w:val="000000" w:themeColor="text1"/>
+          <w:sz w:val="22"/>
+          <w:highlight w:val="none"/>
+          <w:vertAlign w:val="baseline"/>
+        </w:rPr>
+      </w:r>
+    </w:p>
+    <w:p>
+      <w:pPr>
+        <w:pBdr/>
+        <w:spacing/>
+        <w:ind/>
+        <w:rPr>
+          <w:color w:val="000000" w:themeColor="text1"/>
+          <w:sz w:val="22"/>
+          <w:szCs w:val="22"/>
+          <w:highlight w:val="none"/>
+          <w:vertAlign w:val="baseline"/>
+        </w:rPr>
+      </w:pPr>
+      <w:r>
+        <w:rPr>
+          <w:color w:val="000000" w:themeColor="text1"/>
+          <w:sz w:val="22"/>
+          <w:highlight w:val="none"/>
+          <w:vertAlign w:val="baseline"/>
+        </w:rPr>
+        <w:t xml:space="preserve">The endPos is the complicated bit. It will be the adjusted and scaled position of the planet + some vector that represents the force. That vector should be in the direction of the force (referred to as arrow[1] from here on out) acting on the planet to accurately show the direction of it, and its length should be related to the size of arrow[1] as well as distScale so that arrows get smaller as you zoom out. However just making it directly proportional to arrow[1] would cause issues, as the forces are far, far too big to visible, and also the forces acting on an object like the sun are way bigger than forces acting on an object like the earth.</w:t>
+      </w:r>
+      <w:r>
+        <w:rPr>
+          <w:color w:val="000000" w:themeColor="text1"/>
+          <w:sz w:val="22"/>
+          <w:highlight w:val="none"/>
+          <w:vertAlign w:val="baseline"/>
+        </w:rPr>
+      </w:r>
+    </w:p>
+    <w:p>
+      <w:pPr>
+        <w:pBdr/>
+        <w:spacing/>
+        <w:ind/>
+        <w:rPr>
+          <w:color w:val="000000" w:themeColor="text1"/>
+          <w:sz w:val="22"/>
+          <w:szCs w:val="22"/>
+          <w:highlight w:val="none"/>
+          <w:vertAlign w:val="baseline"/>
+        </w:rPr>
+      </w:pPr>
+      <w:r>
+        <w:rPr>
+          <w:color w:val="000000" w:themeColor="text1"/>
+          <w:sz w:val="22"/>
+          <w:highlight w:val="none"/>
+          <w:vertAlign w:val="baseline"/>
+        </w:rPr>
+        <w:t xml:space="preserve">One idea would be to simply divide by the mass of the planet, this means the arrow would represent acceleration instead of force. The problem with this is that the arrows on the sun would end up being the same length as the arrows on the earth, which would look silly as the sun is way bigger compared to the arrows so less of them would be visible, and also because it wouldn’t convey the idea that the sun does have more force on it than the earth does.</w:t>
+      </w:r>
+      <w:r>
+        <w:rPr>
+          <w:color w:val="000000" w:themeColor="text1"/>
+          <w:sz w:val="22"/>
+          <w:highlight w:val="none"/>
+          <w:vertAlign w:val="baseline"/>
+        </w:rPr>
+      </w:r>
+    </w:p>
+    <w:p>
+      <w:pPr>
+        <w:pBdr/>
+        <w:spacing/>
+        <w:ind/>
+        <w:rPr>
+          <w:color w:val="000000" w:themeColor="text1"/>
+          <w:sz w:val="22"/>
+          <w:szCs w:val="22"/>
+          <w:highlight w:val="none"/>
+          <w:vertAlign w:val="baseline"/>
+        </w:rPr>
+      </w:pPr>
+      <w:r>
+        <w:rPr>
+          <w:color w:val="000000" w:themeColor="text1"/>
+          <w:sz w:val="22"/>
+          <w:highlight w:val="none"/>
+          <w:vertAlign w:val="baseline"/>
+        </w:rPr>
+        <w:t xml:space="preserve">What I’ve settled on to achieve a visually appealing and physically representative arrow is to instead divide by the log of the mass, this stops the arrows from getting too big but still means that larger masses have larger arrows. So the vector will be proportional to distScale*arrow[1]/log(p.getMass()). The proportionality constant is arbitrary, I have chosen 2*10^-12 as it leads to reasonably sized arrows.</w:t>
+      </w:r>
+      <w:r>
+        <w:rPr>
+          <w:color w:val="000000" w:themeColor="text1"/>
+          <w:sz w:val="22"/>
+          <w:highlight w:val="none"/>
+          <w:vertAlign w:val="baseline"/>
+        </w:rPr>
+      </w:r>
+    </w:p>
+    <w:p>
+      <w:pPr>
+        <w:pBdr/>
+        <w:spacing/>
+        <w:ind/>
+        <w:rPr>
+          <w:color w:val="000000" w:themeColor="text1"/>
+          <w:sz w:val="22"/>
+          <w:szCs w:val="22"/>
+          <w:highlight w:val="none"/>
+          <w:vertAlign w:val="baseline"/>
+        </w:rPr>
+      </w:pPr>
+      <w:r>
+        <w:rPr>
+          <w:color w:val="000000" w:themeColor="text1"/>
+          <w:sz w:val="22"/>
+          <w:highlight w:val="none"/>
+          <w:vertAlign w:val="baseline"/>
+        </w:rPr>
+        <w:t xml:space="preserve">So the endPos = p.getScaledPos()[:2]+adjustment+2*10^-12*distScale*arrow[1][:2]/log(p.getMass())</w:t>
+      </w:r>
+      <w:r>
+        <w:rPr>
+          <w:color w:val="000000" w:themeColor="text1"/>
+          <w:sz w:val="22"/>
+          <w:highlight w:val="none"/>
+          <w:vertAlign w:val="baseline"/>
+        </w:rPr>
+      </w:r>
+      <w:r>
+        <w:rPr>
+          <w:color w:val="000000" w:themeColor="text1"/>
+          <w:sz w:val="22"/>
+          <w:szCs w:val="22"/>
+          <w:highlight w:val="none"/>
+          <w:vertAlign w:val="baseline"/>
+        </w:rPr>
+      </w:r>
+    </w:p>
+    <w:p>
+      <w:pPr>
+        <w:pBdr/>
+        <w:spacing/>
+        <w:ind/>
+        <w:rPr>
+          <w:color w:val="000000" w:themeColor="text1"/>
+          <w:sz w:val="22"/>
+          <w:szCs w:val="22"/>
+          <w:highlight w:val="none"/>
+          <w:vertAlign w:val="baseline"/>
+        </w:rPr>
+      </w:pPr>
+      <w:r>
+        <w:rPr>
+          <w:color w:val="000000" w:themeColor="text1"/>
+          <w:sz w:val="22"/>
+          <w:highlight w:val="none"/>
+          <w:vertAlign w:val="baseline"/>
+        </w:rPr>
+        <w:t xml:space="preserve">Note that the [:2] makes everything 2d.</w:t>
+      </w:r>
+      <w:r>
+        <w:rPr>
+          <w:color w:val="000000" w:themeColor="text1"/>
+          <w:sz w:val="22"/>
+          <w:highlight w:val="none"/>
+          <w:vertAlign w:val="baseline"/>
+        </w:rPr>
+      </w:r>
+    </w:p>
+    <w:p>
+      <w:pPr>
+        <w:pBdr/>
+        <w:spacing/>
+        <w:ind/>
+        <w:rPr>
+          <w:color w:val="000000" w:themeColor="text1"/>
+          <w:sz w:val="22"/>
+          <w:szCs w:val="22"/>
+          <w:highlight w:val="none"/>
+          <w:vertAlign w:val="baseline"/>
+        </w:rPr>
+      </w:pPr>
+      <w:r>
+        <w:rPr>
+          <w:color w:val="000000" w:themeColor="text1"/>
+          <w:sz w:val="22"/>
+          <w:highlight w:val="none"/>
+          <w:vertAlign w:val="baseline"/>
+        </w:rPr>
+        <w:t xml:space="preserve">Here is pseudocode recapping everything said here:</w:t>
+      </w:r>
+      <w:r>
+        <w:rPr>
+          <w:color w:val="000000" w:themeColor="text1"/>
+          <w:sz w:val="22"/>
+          <w:highlight w:val="none"/>
+          <w:vertAlign w:val="baseline"/>
+        </w:rPr>
+      </w:r>
+    </w:p>
+    <w:p>
+      <w:pPr>
+        <w:pBdr/>
+        <w:spacing/>
+        <w:ind/>
+        <w:rPr>
+          <w:color w:val="000000" w:themeColor="text1"/>
+          <w:sz w:val="22"/>
+          <w:szCs w:val="22"/>
+          <w:highlight w:val="none"/>
+          <w:vertAlign w:val="baseline"/>
+        </w:rPr>
+      </w:pPr>
+      <w:r>
+        <w:rPr>
+          <w:color w:val="000000" w:themeColor="text1"/>
+          <w:sz w:val="22"/>
+          <w:highlight w:val="none"/>
+          <w:vertAlign w:val="baseline"/>
+        </w:rPr>
+      </w:r>
+      <w:r>
+        <mc:AlternateContent>
+          <mc:Choice Requires="wpg">
+            <w:drawing>
+              <wp:inline xmlns:wp="http://schemas.openxmlformats.org/drawingml/2006/wordprocessingDrawing" distT="0" distB="0" distL="0" distR="0">
+                <wp:extent cx="5940425" cy="1795756"/>
+                <wp:effectExtent l="0" t="0" r="0" b="0"/>
+                <wp:docPr id="44" name=""/>
+                <wp:cNvGraphicFramePr>
+                  <a:graphicFrameLocks xmlns:a="http://schemas.openxmlformats.org/drawingml/2006/main" noChangeAspect="1"/>
+                </wp:cNvGraphicFramePr>
+                <a:graphic xmlns:a="http://schemas.openxmlformats.org/drawingml/2006/main">
+                  <a:graphicData uri="http://schemas.openxmlformats.org/drawingml/2006/picture">
+                    <pic:pic xmlns:pic="http://schemas.openxmlformats.org/drawingml/2006/picture">
+                      <pic:nvPicPr>
+                        <pic:cNvPr id="447903383" name=""/>
+                        <pic:cNvPicPr>
+                          <a:picLocks noChangeAspect="1"/>
+                        </pic:cNvPicPr>
+                        <pic:nvPr/>
+                      </pic:nvPicPr>
+                      <pic:blipFill>
+                        <a:blip r:embed="rId55"/>
+                        <a:stretch/>
+                      </pic:blipFill>
+                      <pic:spPr bwMode="auto">
+                        <a:xfrm>
+                          <a:off x="0" y="0"/>
+                          <a:ext cx="5940424" cy="1795755"/>
+                        </a:xfrm>
+                        <a:prstGeom prst="rect">
+                          <a:avLst/>
+                        </a:prstGeom>
+                      </pic:spPr>
+                    </pic:pic>
+                  </a:graphicData>
+                </a:graphic>
+              </wp:inline>
+            </w:drawing>
+          </mc:Choice>
+          <mc:Fallback>
+            <w:pict>
+              <v:shapetype id="_x0000_t75" coordsize="21600,21600" o:spt="75" o:preferrelative="t" path="m@4@5l@4@11@9@11@9@5xe" filled="f" stroked="f">
+                <v:stroke joinstyle="miter"/>
+                <v:formulas>
+                  <v:f eqn="if lineDrawn pixelLineWidth 0"/>
+                  <v:f eqn="sum @0 1 0"/>
+                  <v:f eqn="sum 0 0 @1"/>
+                  <v:f eqn="prod @2 1 2"/>
+                  <v:f eqn="prod @3 21600 pixelWidth"/>
+                  <v:f eqn="prod @3 21600 pixelHeight"/>
+                  <v:f eqn="sum @0 0 1"/>
+                  <v:f eqn="prod @6 1 2"/>
+                  <v:f eqn="prod @7 21600 pixelWidth"/>
+                  <v:f eqn="sum @8 21600 0"/>
+                  <v:f eqn="prod @7 21600 pixelHeight"/>
+                  <v:f eqn="sum @10 21600 0"/>
+                </v:formulas>
+                <v:path o:extrusionok="f" gradientshapeok="t" o:connecttype="rect"/>
+                <o:lock v:ext="edit" aspectratio="t"/>
+              </v:shapetype>
+              <v:shape id="_x0000_i43" o:spid="_x0000_s43" type="#_x0000_t75" style="width:467.75pt;height:141.40pt;mso-wrap-distance-left:0.00pt;mso-wrap-distance-top:0.00pt;mso-wrap-distance-right:0.00pt;mso-wrap-distance-bottom:0.00pt;z-index:1;" stroked="false">
+                <v:imagedata r:id="rId55" o:title=""/>
+                <o:lock v:ext="edit" rotation="t"/>
+              </v:shape>
+            </w:pict>
+          </mc:Fallback>
+        </mc:AlternateContent>
+      </w:r>
+      <w:r>
+        <w:rPr>
+          <w:color w:val="000000" w:themeColor="text1"/>
+          <w:sz w:val="22"/>
+          <w:highlight w:val="none"/>
+          <w:vertAlign w:val="baseline"/>
+        </w:rPr>
+      </w:r>
+      <w:r>
+        <w:rPr>
+          <w:color w:val="000000" w:themeColor="text1"/>
+          <w:sz w:val="22"/>
           <w:highlight w:val="none"/>
           <w:vertAlign w:val="baseline"/>
         </w:rPr>
@@ -20115,7 +21200,7 @@
 <w:hdr xmlns:wpc="http://schemas.microsoft.com/office/word/2010/wordprocessingCanvas" xmlns:mc="http://schemas.openxmlformats.org/markup-compatibility/2006" xmlns:o="urn:schemas-microsoft-com:office:office" xmlns:r="http://schemas.openxmlformats.org/officeDocument/2006/relationships" xmlns:m="http://schemas.openxmlformats.org/officeDocument/2006/math" xmlns:v="urn:schemas-microsoft-com:vml" xmlns:wp14="http://schemas.microsoft.com/office/word/2010/wordprocessingDrawing" xmlns:wp="http://schemas.openxmlformats.org/drawingml/2006/wordprocessingDrawing" xmlns:w10="urn:schemas-microsoft-com:office:word" xmlns:w="http://schemas.openxmlformats.org/wordprocessingml/2006/main" xmlns:w14="http://schemas.microsoft.com/office/word/2010/wordml" xmlns:w15="http://schemas.microsoft.com/office/word/2012/wordml" xmlns:wpg="http://schemas.microsoft.com/office/word/2010/wordprocessingGroup" xmlns:wpi="http://schemas.microsoft.com/office/word/2010/wordprocessingInk" xmlns:wne="http://schemas.microsoft.com/office/word/2006/wordml" xmlns:a="http://schemas.openxmlformats.org/drawingml/2006/main" xmlns:wps="http://schemas.microsoft.com/office/word/2010/wordprocessingShape" mc:Ignorable="w14 w15 wp14">
   <w:p>
     <w:pPr>
-      <w:pStyle w:val="708"/>
+      <w:pStyle w:val="710"/>
       <w:pBdr/>
       <w:spacing/>
       <w:ind/>
@@ -21128,9 +22213,9 @@
     <w:lsdException w:name="Bibliography" w:uiPriority="37"/>
     <w:lsdException w:name="TOC Heading" w:uiPriority="39" w:qFormat="1"/>
   </w:latentStyles>
-  <w:style w:type="character" w:styleId="674">
+  <w:style w:type="character" w:styleId="676">
     <w:name w:val="Intense Emphasis"/>
-    <w:basedOn w:val="863"/>
+    <w:basedOn w:val="865"/>
     <w:uiPriority w:val="21"/>
     <w:qFormat/>
     <w:pPr>
@@ -21144,9 +22229,9 @@
       <w:color w:val="0f4761" w:themeColor="accent1" w:themeShade="BF"/>
     </w:rPr>
   </w:style>
-  <w:style w:type="character" w:styleId="675">
+  <w:style w:type="character" w:styleId="677">
     <w:name w:val="Intense Reference"/>
-    <w:basedOn w:val="863"/>
+    <w:basedOn w:val="865"/>
     <w:uiPriority w:val="32"/>
     <w:qFormat/>
     <w:pPr>
@@ -21162,9 +22247,9 @@
       <w:spacing w:val="5"/>
     </w:rPr>
   </w:style>
-  <w:style w:type="character" w:styleId="676">
+  <w:style w:type="character" w:styleId="678">
     <w:name w:val="Subtle Emphasis"/>
-    <w:basedOn w:val="863"/>
+    <w:basedOn w:val="865"/>
     <w:uiPriority w:val="19"/>
     <w:qFormat/>
     <w:pPr>
@@ -21178,9 +22263,9 @@
       <w:color w:val="404040" w:themeColor="text1" w:themeTint="BF"/>
     </w:rPr>
   </w:style>
-  <w:style w:type="character" w:styleId="677">
+  <w:style w:type="character" w:styleId="679">
     <w:name w:val="Emphasis"/>
-    <w:basedOn w:val="863"/>
+    <w:basedOn w:val="865"/>
     <w:uiPriority w:val="20"/>
     <w:qFormat/>
     <w:pPr>
@@ -21193,9 +22278,9 @@
       <w:iCs/>
     </w:rPr>
   </w:style>
-  <w:style w:type="character" w:styleId="678">
+  <w:style w:type="character" w:styleId="680">
     <w:name w:val="Strong"/>
-    <w:basedOn w:val="863"/>
+    <w:basedOn w:val="865"/>
     <w:uiPriority w:val="22"/>
     <w:qFormat/>
     <w:pPr>
@@ -21208,9 +22293,9 @@
       <w:bCs/>
     </w:rPr>
   </w:style>
-  <w:style w:type="character" w:styleId="679">
+  <w:style w:type="character" w:styleId="681">
     <w:name w:val="Subtle Reference"/>
-    <w:basedOn w:val="863"/>
+    <w:basedOn w:val="865"/>
     <w:uiPriority w:val="31"/>
     <w:qFormat/>
     <w:pPr>
@@ -21223,9 +22308,9 @@
       <w:color w:val="5a5a5a" w:themeColor="text1" w:themeTint="A5"/>
     </w:rPr>
   </w:style>
-  <w:style w:type="character" w:styleId="680">
+  <w:style w:type="character" w:styleId="682">
     <w:name w:val="Book Title"/>
-    <w:basedOn w:val="863"/>
+    <w:basedOn w:val="865"/>
     <w:uiPriority w:val="33"/>
     <w:qFormat/>
     <w:pPr>
@@ -21241,9 +22326,9 @@
       <w:spacing w:val="5"/>
     </w:rPr>
   </w:style>
-  <w:style w:type="character" w:styleId="681">
+  <w:style w:type="character" w:styleId="683">
     <w:name w:val="FollowedHyperlink"/>
-    <w:basedOn w:val="863"/>
+    <w:basedOn w:val="865"/>
     <w:uiPriority w:val="99"/>
     <w:semiHidden/>
     <w:unhideWhenUsed/>
@@ -21257,11 +22342,11 @@
       <w:u w:val="single"/>
     </w:rPr>
   </w:style>
-  <w:style w:type="paragraph" w:styleId="682">
+  <w:style w:type="paragraph" w:styleId="684">
     <w:name w:val="Heading 1"/>
-    <w:basedOn w:val="858"/>
-    <w:next w:val="858"/>
-    <w:link w:val="683"/>
+    <w:basedOn w:val="860"/>
+    <w:next w:val="860"/>
+    <w:link w:val="685"/>
     <w:uiPriority w:val="9"/>
     <w:qFormat/>
     <w:pPr>
@@ -21278,9 +22363,9 @@
       <w:szCs w:val="40"/>
     </w:rPr>
   </w:style>
-  <w:style w:type="character" w:styleId="683">
+  <w:style w:type="character" w:styleId="685">
     <w:name w:val="Heading 1 Char"/>
-    <w:link w:val="682"/>
+    <w:link w:val="684"/>
     <w:uiPriority w:val="9"/>
     <w:pPr>
       <w:pBdr/>
@@ -21293,11 +22378,11 @@
       <w:szCs w:val="40"/>
     </w:rPr>
   </w:style>
-  <w:style w:type="paragraph" w:styleId="684">
+  <w:style w:type="paragraph" w:styleId="686">
     <w:name w:val="Heading 2"/>
-    <w:basedOn w:val="858"/>
-    <w:next w:val="858"/>
-    <w:link w:val="685"/>
+    <w:basedOn w:val="860"/>
+    <w:next w:val="860"/>
+    <w:link w:val="687"/>
     <w:uiPriority w:val="9"/>
     <w:unhideWhenUsed/>
     <w:qFormat/>
@@ -21314,9 +22399,9 @@
       <w:sz w:val="34"/>
     </w:rPr>
   </w:style>
-  <w:style w:type="character" w:styleId="685">
+  <w:style w:type="character" w:styleId="687">
     <w:name w:val="Heading 2 Char"/>
-    <w:link w:val="684"/>
+    <w:link w:val="686"/>
     <w:uiPriority w:val="9"/>
     <w:pPr>
       <w:pBdr/>
@@ -21328,11 +22413,11 @@
       <w:sz w:val="34"/>
     </w:rPr>
   </w:style>
-  <w:style w:type="paragraph" w:styleId="686">
+  <w:style w:type="paragraph" w:styleId="688">
     <w:name w:val="Heading 3"/>
-    <w:basedOn w:val="858"/>
-    <w:next w:val="858"/>
-    <w:link w:val="687"/>
+    <w:basedOn w:val="860"/>
+    <w:next w:val="860"/>
+    <w:link w:val="689"/>
     <w:uiPriority w:val="9"/>
     <w:unhideWhenUsed/>
     <w:qFormat/>
@@ -21350,9 +22435,9 @@
       <w:szCs w:val="30"/>
     </w:rPr>
   </w:style>
-  <w:style w:type="character" w:styleId="687">
+  <w:style w:type="character" w:styleId="689">
     <w:name w:val="Heading 3 Char"/>
-    <w:link w:val="686"/>
+    <w:link w:val="688"/>
     <w:uiPriority w:val="9"/>
     <w:pPr>
       <w:pBdr/>
@@ -21365,11 +22450,11 @@
       <w:szCs w:val="30"/>
     </w:rPr>
   </w:style>
-  <w:style w:type="paragraph" w:styleId="688">
+  <w:style w:type="paragraph" w:styleId="690">
     <w:name w:val="Heading 4"/>
-    <w:basedOn w:val="858"/>
-    <w:next w:val="858"/>
-    <w:link w:val="689"/>
+    <w:basedOn w:val="860"/>
+    <w:next w:val="860"/>
+    <w:link w:val="691"/>
     <w:uiPriority w:val="9"/>
     <w:unhideWhenUsed/>
     <w:qFormat/>
@@ -21389,9 +22474,9 @@
       <w:szCs w:val="26"/>
     </w:rPr>
   </w:style>
-  <w:style w:type="character" w:styleId="689">
+  <w:style w:type="character" w:styleId="691">
     <w:name w:val="Heading 4 Char"/>
-    <w:link w:val="688"/>
+    <w:link w:val="690"/>
     <w:uiPriority w:val="9"/>
     <w:pPr>
       <w:pBdr/>
@@ -21406,11 +22491,11 @@
       <w:szCs w:val="26"/>
     </w:rPr>
   </w:style>
-  <w:style w:type="paragraph" w:styleId="690">
+  <w:style w:type="paragraph" w:styleId="692">
     <w:name w:val="Heading 5"/>
-    <w:basedOn w:val="858"/>
-    <w:next w:val="858"/>
-    <w:link w:val="691"/>
+    <w:basedOn w:val="860"/>
+    <w:next w:val="860"/>
+    <w:link w:val="693"/>
     <w:uiPriority w:val="9"/>
     <w:unhideWhenUsed/>
     <w:qFormat/>
@@ -21430,9 +22515,9 @@
       <w:szCs w:val="24"/>
     </w:rPr>
   </w:style>
-  <w:style w:type="character" w:styleId="691">
+  <w:style w:type="character" w:styleId="693">
     <w:name w:val="Heading 5 Char"/>
-    <w:link w:val="690"/>
+    <w:link w:val="692"/>
     <w:uiPriority w:val="9"/>
     <w:pPr>
       <w:pBdr/>
@@ -21447,11 +22532,11 @@
       <w:szCs w:val="24"/>
     </w:rPr>
   </w:style>
-  <w:style w:type="paragraph" w:styleId="692">
+  <w:style w:type="paragraph" w:styleId="694">
     <w:name w:val="Heading 6"/>
-    <w:basedOn w:val="858"/>
-    <w:next w:val="858"/>
-    <w:link w:val="693"/>
+    <w:basedOn w:val="860"/>
+    <w:next w:val="860"/>
+    <w:link w:val="695"/>
     <w:uiPriority w:val="9"/>
     <w:unhideWhenUsed/>
     <w:qFormat/>
@@ -21471,9 +22556,9 @@
       <w:szCs w:val="22"/>
     </w:rPr>
   </w:style>
-  <w:style w:type="character" w:styleId="693">
+  <w:style w:type="character" w:styleId="695">
     <w:name w:val="Heading 6 Char"/>
-    <w:link w:val="692"/>
+    <w:link w:val="694"/>
     <w:uiPriority w:val="9"/>
     <w:pPr>
       <w:pBdr/>
@@ -21488,11 +22573,11 @@
       <w:szCs w:val="22"/>
     </w:rPr>
   </w:style>
-  <w:style w:type="paragraph" w:styleId="694">
+  <w:style w:type="paragraph" w:styleId="696">
     <w:name w:val="Heading 7"/>
-    <w:basedOn w:val="858"/>
-    <w:next w:val="858"/>
-    <w:link w:val="695"/>
+    <w:basedOn w:val="860"/>
+    <w:next w:val="860"/>
+    <w:link w:val="697"/>
     <w:uiPriority w:val="9"/>
     <w:unhideWhenUsed/>
     <w:qFormat/>
@@ -21514,9 +22599,9 @@
       <w:szCs w:val="22"/>
     </w:rPr>
   </w:style>
-  <w:style w:type="character" w:styleId="695">
+  <w:style w:type="character" w:styleId="697">
     <w:name w:val="Heading 7 Char"/>
-    <w:link w:val="694"/>
+    <w:link w:val="696"/>
     <w:uiPriority w:val="9"/>
     <w:pPr>
       <w:pBdr/>
@@ -21533,11 +22618,11 @@
       <w:szCs w:val="22"/>
     </w:rPr>
   </w:style>
-  <w:style w:type="paragraph" w:styleId="696">
+  <w:style w:type="paragraph" w:styleId="698">
     <w:name w:val="Heading 8"/>
-    <w:basedOn w:val="858"/>
-    <w:next w:val="858"/>
-    <w:link w:val="697"/>
+    <w:basedOn w:val="860"/>
+    <w:next w:val="860"/>
+    <w:link w:val="699"/>
     <w:uiPriority w:val="9"/>
     <w:unhideWhenUsed/>
     <w:qFormat/>
@@ -21557,9 +22642,9 @@
       <w:szCs w:val="22"/>
     </w:rPr>
   </w:style>
-  <w:style w:type="character" w:styleId="697">
+  <w:style w:type="character" w:styleId="699">
     <w:name w:val="Heading 8 Char"/>
-    <w:link w:val="696"/>
+    <w:link w:val="698"/>
     <w:uiPriority w:val="9"/>
     <w:pPr>
       <w:pBdr/>
@@ -21574,11 +22659,11 @@
       <w:szCs w:val="22"/>
     </w:rPr>
   </w:style>
-  <w:style w:type="paragraph" w:styleId="698">
+  <w:style w:type="paragraph" w:styleId="700">
     <w:name w:val="Heading 9"/>
-    <w:basedOn w:val="858"/>
-    <w:next w:val="858"/>
-    <w:link w:val="699"/>
+    <w:basedOn w:val="860"/>
+    <w:next w:val="860"/>
+    <w:link w:val="701"/>
     <w:uiPriority w:val="9"/>
     <w:unhideWhenUsed/>
     <w:qFormat/>
@@ -21598,9 +22683,9 @@
       <w:szCs w:val="21"/>
     </w:rPr>
   </w:style>
-  <w:style w:type="character" w:styleId="699">
+  <w:style w:type="character" w:styleId="701">
     <w:name w:val="Heading 9 Char"/>
-    <w:link w:val="698"/>
+    <w:link w:val="700"/>
     <w:uiPriority w:val="9"/>
     <w:pPr>
       <w:pBdr/>
@@ -21615,11 +22700,11 @@
       <w:szCs w:val="21"/>
     </w:rPr>
   </w:style>
-  <w:style w:type="paragraph" w:styleId="700">
+  <w:style w:type="paragraph" w:styleId="702">
     <w:name w:val="Title"/>
-    <w:basedOn w:val="858"/>
-    <w:next w:val="858"/>
-    <w:link w:val="701"/>
+    <w:basedOn w:val="860"/>
+    <w:next w:val="860"/>
+    <w:link w:val="703"/>
     <w:uiPriority w:val="10"/>
     <w:qFormat/>
     <w:pPr>
@@ -21633,9 +22718,9 @@
       <w:szCs w:val="48"/>
     </w:rPr>
   </w:style>
-  <w:style w:type="character" w:styleId="701">
+  <w:style w:type="character" w:styleId="703">
     <w:name w:val="Title Char"/>
-    <w:link w:val="700"/>
+    <w:link w:val="702"/>
     <w:uiPriority w:val="10"/>
     <w:pPr>
       <w:pBdr/>
@@ -21647,11 +22732,11 @@
       <w:szCs w:val="48"/>
     </w:rPr>
   </w:style>
-  <w:style w:type="paragraph" w:styleId="702">
+  <w:style w:type="paragraph" w:styleId="704">
     <w:name w:val="Subtitle"/>
-    <w:basedOn w:val="858"/>
-    <w:next w:val="858"/>
-    <w:link w:val="703"/>
+    <w:basedOn w:val="860"/>
+    <w:next w:val="860"/>
+    <w:link w:val="705"/>
     <w:uiPriority w:val="11"/>
     <w:qFormat/>
     <w:pPr>
@@ -21664,9 +22749,9 @@
       <w:szCs w:val="24"/>
     </w:rPr>
   </w:style>
-  <w:style w:type="character" w:styleId="703">
+  <w:style w:type="character" w:styleId="705">
     <w:name w:val="Subtitle Char"/>
-    <w:link w:val="702"/>
+    <w:link w:val="704"/>
     <w:uiPriority w:val="11"/>
     <w:pPr>
       <w:pBdr/>
@@ -21678,11 +22763,11 @@
       <w:szCs w:val="24"/>
     </w:rPr>
   </w:style>
-  <w:style w:type="paragraph" w:styleId="704">
+  <w:style w:type="paragraph" w:styleId="706">
     <w:name w:val="Quote"/>
-    <w:basedOn w:val="858"/>
-    <w:next w:val="858"/>
-    <w:link w:val="705"/>
+    <w:basedOn w:val="860"/>
+    <w:next w:val="860"/>
+    <w:link w:val="707"/>
     <w:uiPriority w:val="29"/>
     <w:qFormat/>
     <w:pPr>
@@ -21694,9 +22779,9 @@
       <w:i/>
     </w:rPr>
   </w:style>
-  <w:style w:type="character" w:styleId="705">
+  <w:style w:type="character" w:styleId="707">
     <w:name w:val="Quote Char"/>
-    <w:link w:val="704"/>
+    <w:link w:val="706"/>
     <w:uiPriority w:val="29"/>
     <w:pPr>
       <w:pBdr/>
@@ -21707,11 +22792,11 @@
       <w:i/>
     </w:rPr>
   </w:style>
-  <w:style w:type="paragraph" w:styleId="706">
+  <w:style w:type="paragraph" w:styleId="708">
     <w:name w:val="Intense Quote"/>
-    <w:basedOn w:val="858"/>
-    <w:next w:val="858"/>
-    <w:link w:val="707"/>
+    <w:basedOn w:val="860"/>
+    <w:next w:val="860"/>
+    <w:link w:val="709"/>
     <w:uiPriority w:val="30"/>
     <w:qFormat/>
     <w:pPr>
@@ -21730,9 +22815,9 @@
       <w:i/>
     </w:rPr>
   </w:style>
-  <w:style w:type="character" w:styleId="707">
+  <w:style w:type="character" w:styleId="709">
     <w:name w:val="Intense Quote Char"/>
-    <w:link w:val="706"/>
+    <w:link w:val="708"/>
     <w:uiPriority w:val="30"/>
     <w:pPr>
       <w:pBdr/>
@@ -21743,36 +22828,10 @@
       <w:i/>
     </w:rPr>
   </w:style>
-  <w:style w:type="paragraph" w:styleId="708">
+  <w:style w:type="paragraph" w:styleId="710">
     <w:name w:val="Header"/>
-    <w:basedOn w:val="858"/>
-    <w:link w:val="709"/>
-    <w:uiPriority w:val="99"/>
-    <w:unhideWhenUsed/>
-    <w:pPr>
-      <w:pBdr/>
-      <w:tabs>
-        <w:tab w:val="center" w:leader="none" w:pos="7143"/>
-        <w:tab w:val="right" w:leader="none" w:pos="14287"/>
-      </w:tabs>
-      <w:spacing w:after="0" w:line="240" w:lineRule="auto"/>
-      <w:ind/>
-    </w:pPr>
-  </w:style>
-  <w:style w:type="character" w:styleId="709">
-    <w:name w:val="Header Char"/>
-    <w:link w:val="708"/>
-    <w:uiPriority w:val="99"/>
-    <w:pPr>
-      <w:pBdr/>
-      <w:spacing/>
-      <w:ind/>
-    </w:pPr>
-  </w:style>
-  <w:style w:type="paragraph" w:styleId="710">
-    <w:name w:val="Footer"/>
-    <w:basedOn w:val="858"/>
-    <w:link w:val="713"/>
+    <w:basedOn w:val="860"/>
+    <w:link w:val="711"/>
     <w:uiPriority w:val="99"/>
     <w:unhideWhenUsed/>
     <w:pPr>
@@ -21786,7 +22845,7 @@
     </w:pPr>
   </w:style>
   <w:style w:type="character" w:styleId="711">
-    <w:name w:val="Footer Char"/>
+    <w:name w:val="Header Char"/>
     <w:link w:val="710"/>
     <w:uiPriority w:val="99"/>
     <w:pPr>
@@ -21796,9 +22855,35 @@
     </w:pPr>
   </w:style>
   <w:style w:type="paragraph" w:styleId="712">
+    <w:name w:val="Footer"/>
+    <w:basedOn w:val="860"/>
+    <w:link w:val="715"/>
+    <w:uiPriority w:val="99"/>
+    <w:unhideWhenUsed/>
+    <w:pPr>
+      <w:pBdr/>
+      <w:tabs>
+        <w:tab w:val="center" w:leader="none" w:pos="7143"/>
+        <w:tab w:val="right" w:leader="none" w:pos="14287"/>
+      </w:tabs>
+      <w:spacing w:after="0" w:line="240" w:lineRule="auto"/>
+      <w:ind/>
+    </w:pPr>
+  </w:style>
+  <w:style w:type="character" w:styleId="713">
+    <w:name w:val="Footer Char"/>
+    <w:link w:val="712"/>
+    <w:uiPriority w:val="99"/>
+    <w:pPr>
+      <w:pBdr/>
+      <w:spacing/>
+      <w:ind/>
+    </w:pPr>
+  </w:style>
+  <w:style w:type="paragraph" w:styleId="714">
     <w:name w:val="Caption"/>
-    <w:basedOn w:val="858"/>
-    <w:next w:val="858"/>
+    <w:basedOn w:val="860"/>
+    <w:next w:val="860"/>
     <w:uiPriority w:val="35"/>
     <w:semiHidden/>
     <w:unhideWhenUsed/>
@@ -21816,10 +22901,10 @@
       <w:szCs w:val="18"/>
     </w:rPr>
   </w:style>
-  <w:style w:type="character" w:styleId="713">
+  <w:style w:type="character" w:styleId="715">
     <w:name w:val="Caption Char"/>
-    <w:basedOn w:val="712"/>
-    <w:link w:val="710"/>
+    <w:basedOn w:val="714"/>
+    <w:link w:val="712"/>
     <w:uiPriority w:val="99"/>
     <w:pPr>
       <w:pBdr/>
@@ -21827,9 +22912,9 @@
       <w:ind/>
     </w:pPr>
   </w:style>
-  <w:style w:type="table" w:styleId="714">
+  <w:style w:type="table" w:styleId="716">
     <w:name w:val="Table Grid"/>
-    <w:basedOn w:val="859"/>
+    <w:basedOn w:val="861"/>
     <w:uiPriority w:val="59"/>
     <w:pPr>
       <w:pBdr/>
@@ -22026,9 +23111,9 @@
       </w:tcPr>
     </w:tblStylePr>
   </w:style>
-  <w:style w:type="table" w:styleId="715">
+  <w:style w:type="table" w:styleId="717">
     <w:name w:val="Table Grid Light"/>
-    <w:basedOn w:val="859"/>
+    <w:basedOn w:val="861"/>
     <w:uiPriority w:val="59"/>
     <w:pPr>
       <w:pBdr/>
@@ -22225,9 +23310,9 @@
       </w:tcPr>
     </w:tblStylePr>
   </w:style>
-  <w:style w:type="table" w:styleId="716">
+  <w:style w:type="table" w:styleId="718">
     <w:name w:val="Plain Table 1"/>
-    <w:basedOn w:val="859"/>
+    <w:basedOn w:val="861"/>
     <w:uiPriority w:val="59"/>
     <w:pPr>
       <w:pBdr/>
@@ -22450,9 +23535,9 @@
       </w:tcPr>
     </w:tblStylePr>
   </w:style>
-  <w:style w:type="table" w:styleId="717">
+  <w:style w:type="table" w:styleId="719">
     <w:name w:val="Plain Table 2"/>
-    <w:basedOn w:val="859"/>
+    <w:basedOn w:val="861"/>
     <w:uiPriority w:val="59"/>
     <w:pPr>
       <w:pBdr/>
@@ -22683,9 +23768,9 @@
       </w:tcPr>
     </w:tblStylePr>
   </w:style>
-  <w:style w:type="table" w:styleId="718">
+  <w:style w:type="table" w:styleId="720">
     <w:name w:val="Plain Table 3"/>
-    <w:basedOn w:val="859"/>
+    <w:basedOn w:val="861"/>
     <w:uiPriority w:val="99"/>
     <w:pPr>
       <w:pBdr/>
@@ -22913,9 +23998,9 @@
       </w:tcPr>
     </w:tblStylePr>
   </w:style>
-  <w:style w:type="table" w:styleId="719">
+  <w:style w:type="table" w:styleId="721">
     <w:name w:val="Plain Table 4"/>
-    <w:basedOn w:val="859"/>
+    <w:basedOn w:val="861"/>
     <w:uiPriority w:val="99"/>
     <w:pPr>
       <w:pBdr/>
@@ -23129,9 +24214,9 @@
       </w:tcPr>
     </w:tblStylePr>
   </w:style>
-  <w:style w:type="table" w:styleId="720">
+  <w:style w:type="table" w:styleId="722">
     <w:name w:val="Plain Table 5"/>
-    <w:basedOn w:val="859"/>
+    <w:basedOn w:val="861"/>
     <w:uiPriority w:val="99"/>
     <w:pPr>
       <w:pBdr/>
@@ -23362,9 +24447,9 @@
       </w:tcPr>
     </w:tblStylePr>
   </w:style>
-  <w:style w:type="table" w:styleId="721">
+  <w:style w:type="table" w:styleId="723">
     <w:name w:val="Grid Table 1 Light"/>
-    <w:basedOn w:val="859"/>
+    <w:basedOn w:val="861"/>
     <w:uiPriority w:val="99"/>
     <w:pPr>
       <w:pBdr/>
@@ -23585,9 +24670,9 @@
       </w:tcPr>
     </w:tblStylePr>
   </w:style>
-  <w:style w:type="table" w:styleId="722">
+  <w:style w:type="table" w:styleId="724">
     <w:name w:val="Grid Table 1 Light - Accent 1"/>
-    <w:basedOn w:val="859"/>
+    <w:basedOn w:val="861"/>
     <w:uiPriority w:val="99"/>
     <w:pPr>
       <w:pBdr/>
@@ -23808,9 +24893,9 @@
       </w:tcPr>
     </w:tblStylePr>
   </w:style>
-  <w:style w:type="table" w:styleId="723">
+  <w:style w:type="table" w:styleId="725">
     <w:name w:val="Grid Table 1 Light - Accent 2"/>
-    <w:basedOn w:val="859"/>
+    <w:basedOn w:val="861"/>
     <w:uiPriority w:val="99"/>
     <w:pPr>
       <w:pBdr/>
@@ -24031,9 +25116,9 @@
       </w:tcPr>
     </w:tblStylePr>
   </w:style>
-  <w:style w:type="table" w:styleId="724">
+  <w:style w:type="table" w:styleId="726">
     <w:name w:val="Grid Table 1 Light - Accent 3"/>
-    <w:basedOn w:val="859"/>
+    <w:basedOn w:val="861"/>
     <w:uiPriority w:val="99"/>
     <w:pPr>
       <w:pBdr/>
@@ -24254,9 +25339,9 @@
       </w:tcPr>
     </w:tblStylePr>
   </w:style>
-  <w:style w:type="table" w:styleId="725">
+  <w:style w:type="table" w:styleId="727">
     <w:name w:val="Grid Table 1 Light - Accent 4"/>
-    <w:basedOn w:val="859"/>
+    <w:basedOn w:val="861"/>
     <w:uiPriority w:val="99"/>
     <w:pPr>
       <w:pBdr/>
@@ -24477,9 +25562,9 @@
       </w:tcPr>
     </w:tblStylePr>
   </w:style>
-  <w:style w:type="table" w:styleId="726">
+  <w:style w:type="table" w:styleId="728">
     <w:name w:val="Grid Table 1 Light - Accent 5"/>
-    <w:basedOn w:val="859"/>
+    <w:basedOn w:val="861"/>
     <w:uiPriority w:val="99"/>
     <w:pPr>
       <w:pBdr/>
@@ -24700,9 +25785,9 @@
       </w:tcPr>
     </w:tblStylePr>
   </w:style>
-  <w:style w:type="table" w:styleId="727">
+  <w:style w:type="table" w:styleId="729">
     <w:name w:val="Grid Table 1 Light - Accent 6"/>
-    <w:basedOn w:val="859"/>
+    <w:basedOn w:val="861"/>
     <w:uiPriority w:val="99"/>
     <w:pPr>
       <w:pBdr/>
@@ -24923,9 +26008,9 @@
       </w:tcPr>
     </w:tblStylePr>
   </w:style>
-  <w:style w:type="table" w:styleId="728">
+  <w:style w:type="table" w:styleId="730">
     <w:name w:val="Grid Table 2"/>
-    <w:basedOn w:val="859"/>
+    <w:basedOn w:val="861"/>
     <w:uiPriority w:val="99"/>
     <w:pPr>
       <w:pBdr/>
@@ -25155,9 +26240,9 @@
       </w:tcPr>
     </w:tblStylePr>
   </w:style>
-  <w:style w:type="table" w:styleId="729">
+  <w:style w:type="table" w:styleId="731">
     <w:name w:val="Grid Table 2 - Accent 1"/>
-    <w:basedOn w:val="859"/>
+    <w:basedOn w:val="861"/>
     <w:uiPriority w:val="99"/>
     <w:pPr>
       <w:pBdr/>
@@ -25387,9 +26472,9 @@
       </w:tcPr>
     </w:tblStylePr>
   </w:style>
-  <w:style w:type="table" w:styleId="730">
+  <w:style w:type="table" w:styleId="732">
     <w:name w:val="Grid Table 2 - Accent 2"/>
-    <w:basedOn w:val="859"/>
+    <w:basedOn w:val="861"/>
     <w:uiPriority w:val="99"/>
     <w:pPr>
       <w:pBdr/>
@@ -25619,9 +26704,9 @@
       </w:tcPr>
     </w:tblStylePr>
   </w:style>
-  <w:style w:type="table" w:styleId="731">
+  <w:style w:type="table" w:styleId="733">
     <w:name w:val="Grid Table 2 - Accent 3"/>
-    <w:basedOn w:val="859"/>
+    <w:basedOn w:val="861"/>
     <w:uiPriority w:val="99"/>
     <w:pPr>
       <w:pBdr/>
@@ -25851,9 +26936,9 @@
       </w:tcPr>
     </w:tblStylePr>
   </w:style>
-  <w:style w:type="table" w:styleId="732">
+  <w:style w:type="table" w:styleId="734">
     <w:name w:val="Grid Table 2 - Accent 4"/>
-    <w:basedOn w:val="859"/>
+    <w:basedOn w:val="861"/>
     <w:uiPriority w:val="99"/>
     <w:pPr>
       <w:pBdr/>
@@ -26083,9 +27168,9 @@
       </w:tcPr>
     </w:tblStylePr>
   </w:style>
-  <w:style w:type="table" w:styleId="733">
+  <w:style w:type="table" w:styleId="735">
     <w:name w:val="Grid Table 2 - Accent 5"/>
-    <w:basedOn w:val="859"/>
+    <w:basedOn w:val="861"/>
     <w:uiPriority w:val="99"/>
     <w:pPr>
       <w:pBdr/>
@@ -26315,9 +27400,9 @@
       </w:tcPr>
     </w:tblStylePr>
   </w:style>
-  <w:style w:type="table" w:styleId="734">
+  <w:style w:type="table" w:styleId="736">
     <w:name w:val="Grid Table 2 - Accent 6"/>
-    <w:basedOn w:val="859"/>
+    <w:basedOn w:val="861"/>
     <w:uiPriority w:val="99"/>
     <w:pPr>
       <w:pBdr/>
@@ -26547,9 +27632,9 @@
       </w:tcPr>
     </w:tblStylePr>
   </w:style>
-  <w:style w:type="table" w:styleId="735">
+  <w:style w:type="table" w:styleId="737">
     <w:name w:val="Grid Table 3"/>
-    <w:basedOn w:val="859"/>
+    <w:basedOn w:val="861"/>
     <w:uiPriority w:val="99"/>
     <w:pPr>
       <w:pBdr/>
@@ -26792,9 +27877,9 @@
       </w:tcPr>
     </w:tblStylePr>
   </w:style>
-  <w:style w:type="table" w:styleId="736">
+  <w:style w:type="table" w:styleId="738">
     <w:name w:val="Grid Table 3 - Accent 1"/>
-    <w:basedOn w:val="859"/>
+    <w:basedOn w:val="861"/>
     <w:uiPriority w:val="99"/>
     <w:pPr>
       <w:pBdr/>
@@ -27037,9 +28122,9 @@
       </w:tcPr>
     </w:tblStylePr>
   </w:style>
-  <w:style w:type="table" w:styleId="737">
+  <w:style w:type="table" w:styleId="739">
     <w:name w:val="Grid Table 3 - Accent 2"/>
-    <w:basedOn w:val="859"/>
+    <w:basedOn w:val="861"/>
     <w:uiPriority w:val="99"/>
     <w:pPr>
       <w:pBdr/>
@@ -27282,9 +28367,9 @@
       </w:tcPr>
     </w:tblStylePr>
   </w:style>
-  <w:style w:type="table" w:styleId="738">
+  <w:style w:type="table" w:styleId="740">
     <w:name w:val="Grid Table 3 - Accent 3"/>
-    <w:basedOn w:val="859"/>
+    <w:basedOn w:val="861"/>
     <w:uiPriority w:val="99"/>
     <w:pPr>
       <w:pBdr/>
@@ -27527,9 +28612,9 @@
       </w:tcPr>
     </w:tblStylePr>
   </w:style>
-  <w:style w:type="table" w:styleId="739">
+  <w:style w:type="table" w:styleId="741">
     <w:name w:val="Grid Table 3 - Accent 4"/>
-    <w:basedOn w:val="859"/>
+    <w:basedOn w:val="861"/>
     <w:uiPriority w:val="99"/>
     <w:pPr>
       <w:pBdr/>
@@ -27772,9 +28857,9 @@
       </w:tcPr>
     </w:tblStylePr>
   </w:style>
-  <w:style w:type="table" w:styleId="740">
+  <w:style w:type="table" w:styleId="742">
     <w:name w:val="Grid Table 3 - Accent 5"/>
-    <w:basedOn w:val="859"/>
+    <w:basedOn w:val="861"/>
     <w:uiPriority w:val="99"/>
     <w:pPr>
       <w:pBdr/>
@@ -28017,9 +29102,9 @@
       </w:tcPr>
     </w:tblStylePr>
   </w:style>
-  <w:style w:type="table" w:styleId="741">
+  <w:style w:type="table" w:styleId="743">
     <w:name w:val="Grid Table 3 - Accent 6"/>
-    <w:basedOn w:val="859"/>
+    <w:basedOn w:val="861"/>
     <w:uiPriority w:val="99"/>
     <w:pPr>
       <w:pBdr/>
@@ -28262,9 +29347,9 @@
       </w:tcPr>
     </w:tblStylePr>
   </w:style>
-  <w:style w:type="table" w:styleId="742">
+  <w:style w:type="table" w:styleId="744">
     <w:name w:val="Grid Table 4"/>
-    <w:basedOn w:val="859"/>
+    <w:basedOn w:val="861"/>
     <w:uiPriority w:val="59"/>
     <w:pPr>
       <w:pBdr/>
@@ -28495,9 +29580,9 @@
       </w:tcPr>
     </w:tblStylePr>
   </w:style>
-  <w:style w:type="table" w:styleId="743">
+  <w:style w:type="table" w:styleId="745">
     <w:name w:val="Grid Table 4 - Accent 1"/>
-    <w:basedOn w:val="859"/>
+    <w:basedOn w:val="861"/>
     <w:uiPriority w:val="59"/>
     <w:pPr>
       <w:pBdr/>
@@ -28728,9 +29813,9 @@
       </w:tcPr>
     </w:tblStylePr>
   </w:style>
-  <w:style w:type="table" w:styleId="744">
+  <w:style w:type="table" w:styleId="746">
     <w:name w:val="Grid Table 4 - Accent 2"/>
-    <w:basedOn w:val="859"/>
+    <w:basedOn w:val="861"/>
     <w:uiPriority w:val="59"/>
     <w:pPr>
       <w:pBdr/>
@@ -28961,9 +30046,9 @@
       </w:tcPr>
     </w:tblStylePr>
   </w:style>
-  <w:style w:type="table" w:styleId="745">
+  <w:style w:type="table" w:styleId="747">
     <w:name w:val="Grid Table 4 - Accent 3"/>
-    <w:basedOn w:val="859"/>
+    <w:basedOn w:val="861"/>
     <w:uiPriority w:val="59"/>
     <w:pPr>
       <w:pBdr/>
@@ -29194,9 +30279,9 @@
       </w:tcPr>
     </w:tblStylePr>
   </w:style>
-  <w:style w:type="table" w:styleId="746">
+  <w:style w:type="table" w:styleId="748">
     <w:name w:val="Grid Table 4 - Accent 4"/>
-    <w:basedOn w:val="859"/>
+    <w:basedOn w:val="861"/>
     <w:uiPriority w:val="59"/>
     <w:pPr>
       <w:pBdr/>
@@ -29427,9 +30512,9 @@
       </w:tcPr>
     </w:tblStylePr>
   </w:style>
-  <w:style w:type="table" w:styleId="747">
+  <w:style w:type="table" w:styleId="749">
     <w:name w:val="Grid Table 4 - Accent 5"/>
-    <w:basedOn w:val="859"/>
+    <w:basedOn w:val="861"/>
     <w:uiPriority w:val="59"/>
     <w:pPr>
       <w:pBdr/>
@@ -29660,9 +30745,9 @@
       </w:tcPr>
     </w:tblStylePr>
   </w:style>
-  <w:style w:type="table" w:styleId="748">
+  <w:style w:type="table" w:styleId="750">
     <w:name w:val="Grid Table 4 - Accent 6"/>
-    <w:basedOn w:val="859"/>
+    <w:basedOn w:val="861"/>
     <w:uiPriority w:val="59"/>
     <w:pPr>
       <w:pBdr/>
@@ -29893,9 +30978,9 @@
       </w:tcPr>
     </w:tblStylePr>
   </w:style>
-  <w:style w:type="table" w:styleId="749">
+  <w:style w:type="table" w:styleId="751">
     <w:name w:val="Grid Table 5 Dark"/>
-    <w:basedOn w:val="859"/>
+    <w:basedOn w:val="861"/>
     <w:uiPriority w:val="99"/>
     <w:pPr>
       <w:pBdr/>
@@ -30121,9 +31206,9 @@
       </w:tcPr>
     </w:tblStylePr>
   </w:style>
-  <w:style w:type="table" w:styleId="750">
+  <w:style w:type="table" w:styleId="752">
     <w:name w:val="Grid Table 5 Dark- Accent 1"/>
-    <w:basedOn w:val="859"/>
+    <w:basedOn w:val="861"/>
     <w:uiPriority w:val="99"/>
     <w:pPr>
       <w:pBdr/>
@@ -30349,9 +31434,9 @@
       </w:tcPr>
     </w:tblStylePr>
   </w:style>
-  <w:style w:type="table" w:styleId="751">
+  <w:style w:type="table" w:styleId="753">
     <w:name w:val="Grid Table 5 Dark - Accent 2"/>
-    <w:basedOn w:val="859"/>
+    <w:basedOn w:val="861"/>
     <w:uiPriority w:val="99"/>
     <w:pPr>
       <w:pBdr/>
@@ -30577,9 +31662,9 @@
       </w:tcPr>
     </w:tblStylePr>
   </w:style>
-  <w:style w:type="table" w:styleId="752">
+  <w:style w:type="table" w:styleId="754">
     <w:name w:val="Grid Table 5 Dark - Accent 3"/>
-    <w:basedOn w:val="859"/>
+    <w:basedOn w:val="861"/>
     <w:uiPriority w:val="99"/>
     <w:pPr>
       <w:pBdr/>
@@ -30805,9 +31890,9 @@
       </w:tcPr>
     </w:tblStylePr>
   </w:style>
-  <w:style w:type="table" w:styleId="753">
+  <w:style w:type="table" w:styleId="755">
     <w:name w:val="Grid Table 5 Dark- Accent 4"/>
-    <w:basedOn w:val="859"/>
+    <w:basedOn w:val="861"/>
     <w:uiPriority w:val="99"/>
     <w:pPr>
       <w:pBdr/>
@@ -31033,9 +32118,9 @@
       </w:tcPr>
     </w:tblStylePr>
   </w:style>
-  <w:style w:type="table" w:styleId="754">
+  <w:style w:type="table" w:styleId="756">
     <w:name w:val="Grid Table 5 Dark - Accent 5"/>
-    <w:basedOn w:val="859"/>
+    <w:basedOn w:val="861"/>
     <w:uiPriority w:val="99"/>
     <w:pPr>
       <w:pBdr/>
@@ -31261,9 +32346,9 @@
       </w:tcPr>
     </w:tblStylePr>
   </w:style>
-  <w:style w:type="table" w:styleId="755">
+  <w:style w:type="table" w:styleId="757">
     <w:name w:val="Grid Table 5 Dark - Accent 6"/>
-    <w:basedOn w:val="859"/>
+    <w:basedOn w:val="861"/>
     <w:uiPriority w:val="99"/>
     <w:pPr>
       <w:pBdr/>
@@ -31489,9 +32574,9 @@
       </w:tcPr>
     </w:tblStylePr>
   </w:style>
-  <w:style w:type="table" w:styleId="756">
+  <w:style w:type="table" w:styleId="758">
     <w:name w:val="Grid Table 6 Colorful"/>
-    <w:basedOn w:val="859"/>
+    <w:basedOn w:val="861"/>
     <w:uiPriority w:val="99"/>
     <w:pPr>
       <w:pBdr/>
@@ -31719,9 +32804,9 @@
       </w:tcPr>
     </w:tblStylePr>
   </w:style>
-  <w:style w:type="table" w:styleId="757">
+  <w:style w:type="table" w:styleId="759">
     <w:name w:val="Grid Table 6 Colorful - Accent 1"/>
-    <w:basedOn w:val="859"/>
+    <w:basedOn w:val="861"/>
     <w:uiPriority w:val="99"/>
     <w:pPr>
       <w:pBdr/>
@@ -31949,9 +33034,9 @@
       </w:tcPr>
     </w:tblStylePr>
   </w:style>
-  <w:style w:type="table" w:styleId="758">
+  <w:style w:type="table" w:styleId="760">
     <w:name w:val="Grid Table 6 Colorful - Accent 2"/>
-    <w:basedOn w:val="859"/>
+    <w:basedOn w:val="861"/>
     <w:uiPriority w:val="99"/>
     <w:pPr>
       <w:pBdr/>
@@ -32179,9 +33264,9 @@
       </w:tcPr>
     </w:tblStylePr>
   </w:style>
-  <w:style w:type="table" w:styleId="759">
+  <w:style w:type="table" w:styleId="761">
     <w:name w:val="Grid Table 6 Colorful - Accent 3"/>
-    <w:basedOn w:val="859"/>
+    <w:basedOn w:val="861"/>
     <w:uiPriority w:val="99"/>
     <w:pPr>
       <w:pBdr/>
@@ -32409,9 +33494,9 @@
       </w:tcPr>
     </w:tblStylePr>
   </w:style>
-  <w:style w:type="table" w:styleId="760">
+  <w:style w:type="table" w:styleId="762">
     <w:name w:val="Grid Table 6 Colorful - Accent 4"/>
-    <w:basedOn w:val="859"/>
+    <w:basedOn w:val="861"/>
     <w:uiPriority w:val="99"/>
     <w:pPr>
       <w:pBdr/>
@@ -32639,9 +33724,9 @@
       </w:tcPr>
     </w:tblStylePr>
   </w:style>
-  <w:style w:type="table" w:styleId="761">
+  <w:style w:type="table" w:styleId="763">
     <w:name w:val="Grid Table 6 Colorful - Accent 5"/>
-    <w:basedOn w:val="859"/>
+    <w:basedOn w:val="861"/>
     <w:uiPriority w:val="99"/>
     <w:pPr>
       <w:pBdr/>
@@ -32869,9 +33954,9 @@
       </w:tcPr>
     </w:tblStylePr>
   </w:style>
-  <w:style w:type="table" w:styleId="762">
+  <w:style w:type="table" w:styleId="764">
     <w:name w:val="Grid Table 6 Colorful - Accent 6"/>
-    <w:basedOn w:val="859"/>
+    <w:basedOn w:val="861"/>
     <w:uiPriority w:val="99"/>
     <w:pPr>
       <w:pBdr/>
@@ -33099,9 +34184,9 @@
       </w:tcPr>
     </w:tblStylePr>
   </w:style>
-  <w:style w:type="table" w:styleId="763">
+  <w:style w:type="table" w:styleId="765">
     <w:name w:val="Grid Table 7 Colorful"/>
-    <w:basedOn w:val="859"/>
+    <w:basedOn w:val="861"/>
     <w:uiPriority w:val="99"/>
     <w:pPr>
       <w:pBdr/>
@@ -33353,9 +34438,9 @@
       </w:tcPr>
     </w:tblStylePr>
   </w:style>
-  <w:style w:type="table" w:styleId="764">
+  <w:style w:type="table" w:styleId="766">
     <w:name w:val="Grid Table 7 Colorful - Accent 1"/>
-    <w:basedOn w:val="859"/>
+    <w:basedOn w:val="861"/>
     <w:uiPriority w:val="99"/>
     <w:pPr>
       <w:pBdr/>
@@ -33607,9 +34692,9 @@
       </w:tcPr>
     </w:tblStylePr>
   </w:style>
-  <w:style w:type="table" w:styleId="765">
+  <w:style w:type="table" w:styleId="767">
     <w:name w:val="Grid Table 7 Colorful - Accent 2"/>
-    <w:basedOn w:val="859"/>
+    <w:basedOn w:val="861"/>
     <w:uiPriority w:val="99"/>
     <w:pPr>
       <w:pBdr/>
@@ -33861,9 +34946,9 @@
       </w:tcPr>
     </w:tblStylePr>
   </w:style>
-  <w:style w:type="table" w:styleId="766">
+  <w:style w:type="table" w:styleId="768">
     <w:name w:val="Grid Table 7 Colorful - Accent 3"/>
-    <w:basedOn w:val="859"/>
+    <w:basedOn w:val="861"/>
     <w:uiPriority w:val="99"/>
     <w:pPr>
       <w:pBdr/>
@@ -34115,9 +35200,9 @@
       </w:tcPr>
     </w:tblStylePr>
   </w:style>
-  <w:style w:type="table" w:styleId="767">
+  <w:style w:type="table" w:styleId="769">
     <w:name w:val="Grid Table 7 Colorful - Accent 4"/>
-    <w:basedOn w:val="859"/>
+    <w:basedOn w:val="861"/>
     <w:uiPriority w:val="99"/>
     <w:pPr>
       <w:pBdr/>
@@ -34369,9 +35454,9 @@
       </w:tcPr>
     </w:tblStylePr>
   </w:style>
-  <w:style w:type="table" w:styleId="768">
+  <w:style w:type="table" w:styleId="770">
     <w:name w:val="Grid Table 7 Colorful - Accent 5"/>
-    <w:basedOn w:val="859"/>
+    <w:basedOn w:val="861"/>
     <w:uiPriority w:val="99"/>
     <w:pPr>
       <w:pBdr/>
@@ -34623,9 +35708,9 @@
       </w:tcPr>
     </w:tblStylePr>
   </w:style>
-  <w:style w:type="table" w:styleId="769">
+  <w:style w:type="table" w:styleId="771">
     <w:name w:val="Grid Table 7 Colorful - Accent 6"/>
-    <w:basedOn w:val="859"/>
+    <w:basedOn w:val="861"/>
     <w:uiPriority w:val="99"/>
     <w:pPr>
       <w:pBdr/>
@@ -34877,9 +35962,9 @@
       </w:tcPr>
     </w:tblStylePr>
   </w:style>
-  <w:style w:type="table" w:styleId="770">
+  <w:style w:type="table" w:styleId="772">
     <w:name w:val="List Table 1 Light"/>
-    <w:basedOn w:val="859"/>
+    <w:basedOn w:val="861"/>
     <w:uiPriority w:val="99"/>
     <w:pPr>
       <w:pBdr/>
@@ -35093,9 +36178,9 @@
       </w:tcPr>
     </w:tblStylePr>
   </w:style>
-  <w:style w:type="table" w:styleId="771">
+  <w:style w:type="table" w:styleId="773">
     <w:name w:val="List Table 1 Light - Accent 1"/>
-    <w:basedOn w:val="859"/>
+    <w:basedOn w:val="861"/>
     <w:uiPriority w:val="99"/>
     <w:pPr>
       <w:pBdr/>
@@ -35309,9 +36394,9 @@
       </w:tcPr>
     </w:tblStylePr>
   </w:style>
-  <w:style w:type="table" w:styleId="772">
+  <w:style w:type="table" w:styleId="774">
     <w:name w:val="List Table 1 Light - Accent 2"/>
-    <w:basedOn w:val="859"/>
+    <w:basedOn w:val="861"/>
     <w:uiPriority w:val="99"/>
     <w:pPr>
       <w:pBdr/>
@@ -35525,9 +36610,9 @@
       </w:tcPr>
     </w:tblStylePr>
   </w:style>
-  <w:style w:type="table" w:styleId="773">
+  <w:style w:type="table" w:styleId="775">
     <w:name w:val="List Table 1 Light - Accent 3"/>
-    <w:basedOn w:val="859"/>
+    <w:basedOn w:val="861"/>
     <w:uiPriority w:val="99"/>
     <w:pPr>
       <w:pBdr/>
@@ -35741,9 +36826,9 @@
       </w:tcPr>
     </w:tblStylePr>
   </w:style>
-  <w:style w:type="table" w:styleId="774">
+  <w:style w:type="table" w:styleId="776">
     <w:name w:val="List Table 1 Light - Accent 4"/>
-    <w:basedOn w:val="859"/>
+    <w:basedOn w:val="861"/>
     <w:uiPriority w:val="99"/>
     <w:pPr>
       <w:pBdr/>
@@ -35957,9 +37042,9 @@
       </w:tcPr>
     </w:tblStylePr>
   </w:style>
-  <w:style w:type="table" w:styleId="775">
+  <w:style w:type="table" w:styleId="777">
     <w:name w:val="List Table 1 Light - Accent 5"/>
-    <w:basedOn w:val="859"/>
+    <w:basedOn w:val="861"/>
     <w:uiPriority w:val="99"/>
     <w:pPr>
       <w:pBdr/>
@@ -36173,9 +37258,9 @@
       </w:tcPr>
     </w:tblStylePr>
   </w:style>
-  <w:style w:type="table" w:styleId="776">
+  <w:style w:type="table" w:styleId="778">
     <w:name w:val="List Table 1 Light - Accent 6"/>
-    <w:basedOn w:val="859"/>
+    <w:basedOn w:val="861"/>
     <w:uiPriority w:val="99"/>
     <w:pPr>
       <w:pBdr/>
@@ -36389,9 +37474,9 @@
       </w:tcPr>
     </w:tblStylePr>
   </w:style>
-  <w:style w:type="table" w:styleId="777">
+  <w:style w:type="table" w:styleId="779">
     <w:name w:val="List Table 2"/>
-    <w:basedOn w:val="859"/>
+    <w:basedOn w:val="861"/>
     <w:uiPriority w:val="99"/>
     <w:pPr>
       <w:pBdr/>
@@ -36627,9 +37712,9 @@
       </w:tcPr>
     </w:tblStylePr>
   </w:style>
-  <w:style w:type="table" w:styleId="778">
+  <w:style w:type="table" w:styleId="780">
     <w:name w:val="List Table 2 - Accent 1"/>
-    <w:basedOn w:val="859"/>
+    <w:basedOn w:val="861"/>
     <w:uiPriority w:val="99"/>
     <w:pPr>
       <w:pBdr/>
@@ -36865,9 +37950,9 @@
       </w:tcPr>
     </w:tblStylePr>
   </w:style>
-  <w:style w:type="table" w:styleId="779">
+  <w:style w:type="table" w:styleId="781">
     <w:name w:val="List Table 2 - Accent 2"/>
-    <w:basedOn w:val="859"/>
+    <w:basedOn w:val="861"/>
     <w:uiPriority w:val="99"/>
     <w:pPr>
       <w:pBdr/>
@@ -37103,9 +38188,9 @@
       </w:tcPr>
     </w:tblStylePr>
   </w:style>
-  <w:style w:type="table" w:styleId="780">
+  <w:style w:type="table" w:styleId="782">
     <w:name w:val="List Table 2 - Accent 3"/>
-    <w:basedOn w:val="859"/>
+    <w:basedOn w:val="861"/>
     <w:uiPriority w:val="99"/>
     <w:pPr>
       <w:pBdr/>
@@ -37341,9 +38426,9 @@
       </w:tcPr>
     </w:tblStylePr>
   </w:style>
-  <w:style w:type="table" w:styleId="781">
+  <w:style w:type="table" w:styleId="783">
     <w:name w:val="List Table 2 - Accent 4"/>
-    <w:basedOn w:val="859"/>
+    <w:basedOn w:val="861"/>
     <w:uiPriority w:val="99"/>
     <w:pPr>
       <w:pBdr/>
@@ -37579,9 +38664,9 @@
       </w:tcPr>
     </w:tblStylePr>
   </w:style>
-  <w:style w:type="table" w:styleId="782">
+  <w:style w:type="table" w:styleId="784">
     <w:name w:val="List Table 2 - Accent 5"/>
-    <w:basedOn w:val="859"/>
+    <w:basedOn w:val="861"/>
     <w:uiPriority w:val="99"/>
     <w:pPr>
       <w:pBdr/>
@@ -37817,9 +38902,9 @@
       </w:tcPr>
     </w:tblStylePr>
   </w:style>
-  <w:style w:type="table" w:styleId="783">
+  <w:style w:type="table" w:styleId="785">
     <w:name w:val="List Table 2 - Accent 6"/>
-    <w:basedOn w:val="859"/>
+    <w:basedOn w:val="861"/>
     <w:uiPriority w:val="99"/>
     <w:pPr>
       <w:pBdr/>
@@ -38055,9 +39140,9 @@
       </w:tcPr>
     </w:tblStylePr>
   </w:style>
-  <w:style w:type="table" w:styleId="784">
+  <w:style w:type="table" w:styleId="786">
     <w:name w:val="List Table 3"/>
-    <w:basedOn w:val="859"/>
+    <w:basedOn w:val="861"/>
     <w:uiPriority w:val="99"/>
     <w:pPr>
       <w:pBdr/>
@@ -38283,9 +39368,9 @@
       </w:tcPr>
     </w:tblStylePr>
   </w:style>
-  <w:style w:type="table" w:styleId="785">
+  <w:style w:type="table" w:styleId="787">
     <w:name w:val="List Table 3 - Accent 1"/>
-    <w:basedOn w:val="859"/>
+    <w:basedOn w:val="861"/>
     <w:uiPriority w:val="99"/>
     <w:pPr>
       <w:pBdr/>
@@ -38511,9 +39596,9 @@
       </w:tcPr>
     </w:tblStylePr>
   </w:style>
-  <w:style w:type="table" w:styleId="786">
+  <w:style w:type="table" w:styleId="788">
     <w:name w:val="List Table 3 - Accent 2"/>
-    <w:basedOn w:val="859"/>
+    <w:basedOn w:val="861"/>
     <w:uiPriority w:val="99"/>
     <w:pPr>
       <w:pBdr/>
@@ -38739,9 +39824,9 @@
       </w:tcPr>
     </w:tblStylePr>
   </w:style>
-  <w:style w:type="table" w:styleId="787">
+  <w:style w:type="table" w:styleId="789">
     <w:name w:val="List Table 3 - Accent 3"/>
-    <w:basedOn w:val="859"/>
+    <w:basedOn w:val="861"/>
     <w:uiPriority w:val="99"/>
     <w:pPr>
       <w:pBdr/>
@@ -38967,9 +40052,9 @@
       </w:tcPr>
     </w:tblStylePr>
   </w:style>
-  <w:style w:type="table" w:styleId="788">
+  <w:style w:type="table" w:styleId="790">
     <w:name w:val="List Table 3 - Accent 4"/>
-    <w:basedOn w:val="859"/>
+    <w:basedOn w:val="861"/>
     <w:uiPriority w:val="99"/>
     <w:pPr>
       <w:pBdr/>
@@ -39195,9 +40280,9 @@
       </w:tcPr>
     </w:tblStylePr>
   </w:style>
-  <w:style w:type="table" w:styleId="789">
+  <w:style w:type="table" w:styleId="791">
     <w:name w:val="List Table 3 - Accent 5"/>
-    <w:basedOn w:val="859"/>
+    <w:basedOn w:val="861"/>
     <w:uiPriority w:val="99"/>
     <w:pPr>
       <w:pBdr/>
@@ -39423,9 +40508,9 @@
       </w:tcPr>
     </w:tblStylePr>
   </w:style>
-  <w:style w:type="table" w:styleId="790">
+  <w:style w:type="table" w:styleId="792">
     <w:name w:val="List Table 3 - Accent 6"/>
-    <w:basedOn w:val="859"/>
+    <w:basedOn w:val="861"/>
     <w:uiPriority w:val="99"/>
     <w:pPr>
       <w:pBdr/>
@@ -39651,9 +40736,9 @@
       </w:tcPr>
     </w:tblStylePr>
   </w:style>
-  <w:style w:type="table" w:styleId="791">
+  <w:style w:type="table" w:styleId="793">
     <w:name w:val="List Table 4"/>
-    <w:basedOn w:val="859"/>
+    <w:basedOn w:val="861"/>
     <w:uiPriority w:val="99"/>
     <w:pPr>
       <w:pBdr/>
@@ -39876,9 +40961,9 @@
       </w:tcPr>
     </w:tblStylePr>
   </w:style>
-  <w:style w:type="table" w:styleId="792">
+  <w:style w:type="table" w:styleId="794">
     <w:name w:val="List Table 4 - Accent 1"/>
-    <w:basedOn w:val="859"/>
+    <w:basedOn w:val="861"/>
     <w:uiPriority w:val="99"/>
     <w:pPr>
       <w:pBdr/>
@@ -40101,9 +41186,9 @@
       </w:tcPr>
     </w:tblStylePr>
   </w:style>
-  <w:style w:type="table" w:styleId="793">
+  <w:style w:type="table" w:styleId="795">
     <w:name w:val="List Table 4 - Accent 2"/>
-    <w:basedOn w:val="859"/>
+    <w:basedOn w:val="861"/>
     <w:uiPriority w:val="99"/>
     <w:pPr>
       <w:pBdr/>
@@ -40326,9 +41411,9 @@
       </w:tcPr>
     </w:tblStylePr>
   </w:style>
-  <w:style w:type="table" w:styleId="794">
+  <w:style w:type="table" w:styleId="796">
     <w:name w:val="List Table 4 - Accent 3"/>
-    <w:basedOn w:val="859"/>
+    <w:basedOn w:val="861"/>
     <w:uiPriority w:val="99"/>
     <w:pPr>
       <w:pBdr/>
@@ -40551,9 +41636,9 @@
       </w:tcPr>
     </w:tblStylePr>
   </w:style>
-  <w:style w:type="table" w:styleId="795">
+  <w:style w:type="table" w:styleId="797">
     <w:name w:val="List Table 4 - Accent 4"/>
-    <w:basedOn w:val="859"/>
+    <w:basedOn w:val="861"/>
     <w:uiPriority w:val="99"/>
     <w:pPr>
       <w:pBdr/>
@@ -40776,9 +41861,9 @@
       </w:tcPr>
     </w:tblStylePr>
   </w:style>
-  <w:style w:type="table" w:styleId="796">
+  <w:style w:type="table" w:styleId="798">
     <w:name w:val="List Table 4 - Accent 5"/>
-    <w:basedOn w:val="859"/>
+    <w:basedOn w:val="861"/>
     <w:uiPriority w:val="99"/>
     <w:pPr>
       <w:pBdr/>
@@ -41001,9 +42086,9 @@
       </w:tcPr>
     </w:tblStylePr>
   </w:style>
-  <w:style w:type="table" w:styleId="797">
+  <w:style w:type="table" w:styleId="799">
     <w:name w:val="List Table 4 - Accent 6"/>
-    <w:basedOn w:val="859"/>
+    <w:basedOn w:val="861"/>
     <w:uiPriority w:val="99"/>
     <w:pPr>
       <w:pBdr/>
@@ -41226,9 +42311,9 @@
       </w:tcPr>
     </w:tblStylePr>
   </w:style>
-  <w:style w:type="table" w:styleId="798">
+  <w:style w:type="table" w:styleId="800">
     <w:name w:val="List Table 5 Dark"/>
-    <w:basedOn w:val="859"/>
+    <w:basedOn w:val="861"/>
     <w:uiPriority w:val="99"/>
     <w:pPr>
       <w:pBdr/>
@@ -41468,9 +42553,9 @@
       </w:tcPr>
     </w:tblStylePr>
   </w:style>
-  <w:style w:type="table" w:styleId="799">
+  <w:style w:type="table" w:styleId="801">
     <w:name w:val="List Table 5 Dark - Accent 1"/>
-    <w:basedOn w:val="859"/>
+    <w:basedOn w:val="861"/>
     <w:uiPriority w:val="99"/>
     <w:pPr>
       <w:pBdr/>
@@ -41710,9 +42795,9 @@
       </w:tcPr>
     </w:tblStylePr>
   </w:style>
-  <w:style w:type="table" w:styleId="800">
+  <w:style w:type="table" w:styleId="802">
     <w:name w:val="List Table 5 Dark - Accent 2"/>
-    <w:basedOn w:val="859"/>
+    <w:basedOn w:val="861"/>
     <w:uiPriority w:val="99"/>
     <w:pPr>
       <w:pBdr/>
@@ -41952,9 +43037,9 @@
       </w:tcPr>
     </w:tblStylePr>
   </w:style>
-  <w:style w:type="table" w:styleId="801">
+  <w:style w:type="table" w:styleId="803">
     <w:name w:val="List Table 5 Dark - Accent 3"/>
-    <w:basedOn w:val="859"/>
+    <w:basedOn w:val="861"/>
     <w:uiPriority w:val="99"/>
     <w:pPr>
       <w:pBdr/>
@@ -42194,9 +43279,9 @@
       </w:tcPr>
     </w:tblStylePr>
   </w:style>
-  <w:style w:type="table" w:styleId="802">
+  <w:style w:type="table" w:styleId="804">
     <w:name w:val="List Table 5 Dark - Accent 4"/>
-    <w:basedOn w:val="859"/>
+    <w:basedOn w:val="861"/>
     <w:uiPriority w:val="99"/>
     <w:pPr>
       <w:pBdr/>
@@ -42436,9 +43521,9 @@
       </w:tcPr>
     </w:tblStylePr>
   </w:style>
-  <w:style w:type="table" w:styleId="803">
+  <w:style w:type="table" w:styleId="805">
     <w:name w:val="List Table 5 Dark - Accent 5"/>
-    <w:basedOn w:val="859"/>
+    <w:basedOn w:val="861"/>
     <w:uiPriority w:val="99"/>
     <w:pPr>
       <w:pBdr/>
@@ -42678,9 +43763,9 @@
       </w:tcPr>
     </w:tblStylePr>
   </w:style>
-  <w:style w:type="table" w:styleId="804">
+  <w:style w:type="table" w:styleId="806">
     <w:name w:val="List Table 5 Dark - Accent 6"/>
-    <w:basedOn w:val="859"/>
+    <w:basedOn w:val="861"/>
     <w:uiPriority w:val="99"/>
     <w:pPr>
       <w:pBdr/>
@@ -42920,9 +44005,9 @@
       </w:tcPr>
     </w:tblStylePr>
   </w:style>
-  <w:style w:type="table" w:styleId="805">
+  <w:style w:type="table" w:styleId="807">
     <w:name w:val="List Table 6 Colorful"/>
-    <w:basedOn w:val="859"/>
+    <w:basedOn w:val="861"/>
     <w:uiPriority w:val="99"/>
     <w:pPr>
       <w:pBdr/>
@@ -43143,9 +44228,9 @@
       </w:tcPr>
     </w:tblStylePr>
   </w:style>
-  <w:style w:type="table" w:styleId="806">
+  <w:style w:type="table" w:styleId="808">
     <w:name w:val="List Table 6 Colorful - Accent 1"/>
-    <w:basedOn w:val="859"/>
+    <w:basedOn w:val="861"/>
     <w:uiPriority w:val="99"/>
     <w:pPr>
       <w:pBdr/>
@@ -43366,9 +44451,9 @@
       </w:tcPr>
     </w:tblStylePr>
   </w:style>
-  <w:style w:type="table" w:styleId="807">
+  <w:style w:type="table" w:styleId="809">
     <w:name w:val="List Table 6 Colorful - Accent 2"/>
-    <w:basedOn w:val="859"/>
+    <w:basedOn w:val="861"/>
     <w:uiPriority w:val="99"/>
     <w:pPr>
       <w:pBdr/>
@@ -43589,9 +44674,9 @@
       </w:tcPr>
     </w:tblStylePr>
   </w:style>
-  <w:style w:type="table" w:styleId="808">
+  <w:style w:type="table" w:styleId="810">
     <w:name w:val="List Table 6 Colorful - Accent 3"/>
-    <w:basedOn w:val="859"/>
+    <w:basedOn w:val="861"/>
     <w:uiPriority w:val="99"/>
     <w:pPr>
       <w:pBdr/>
@@ -43812,9 +44897,9 @@
       </w:tcPr>
     </w:tblStylePr>
   </w:style>
-  <w:style w:type="table" w:styleId="809">
+  <w:style w:type="table" w:styleId="811">
     <w:name w:val="List Table 6 Colorful - Accent 4"/>
-    <w:basedOn w:val="859"/>
+    <w:basedOn w:val="861"/>
     <w:uiPriority w:val="99"/>
     <w:pPr>
       <w:pBdr/>
@@ -44035,9 +45120,9 @@
       </w:tcPr>
     </w:tblStylePr>
   </w:style>
-  <w:style w:type="table" w:styleId="810">
+  <w:style w:type="table" w:styleId="812">
     <w:name w:val="List Table 6 Colorful - Accent 5"/>
-    <w:basedOn w:val="859"/>
+    <w:basedOn w:val="861"/>
     <w:uiPriority w:val="99"/>
     <w:pPr>
       <w:pBdr/>
@@ -44258,9 +45343,9 @@
       </w:tcPr>
     </w:tblStylePr>
   </w:style>
-  <w:style w:type="table" w:styleId="811">
+  <w:style w:type="table" w:styleId="813">
     <w:name w:val="List Table 6 Colorful - Accent 6"/>
-    <w:basedOn w:val="859"/>
+    <w:basedOn w:val="861"/>
     <w:uiPriority w:val="99"/>
     <w:pPr>
       <w:pBdr/>
@@ -44481,9 +45566,9 @@
       </w:tcPr>
     </w:tblStylePr>
   </w:style>
-  <w:style w:type="table" w:styleId="812">
+  <w:style w:type="table" w:styleId="814">
     <w:name w:val="List Table 7 Colorful"/>
-    <w:basedOn w:val="859"/>
+    <w:basedOn w:val="861"/>
     <w:uiPriority w:val="99"/>
     <w:pPr>
       <w:pBdr/>
@@ -44737,9 +45822,9 @@
       </w:tcPr>
     </w:tblStylePr>
   </w:style>
-  <w:style w:type="table" w:styleId="813">
+  <w:style w:type="table" w:styleId="815">
     <w:name w:val="List Table 7 Colorful - Accent 1"/>
-    <w:basedOn w:val="859"/>
+    <w:basedOn w:val="861"/>
     <w:uiPriority w:val="99"/>
     <w:pPr>
       <w:pBdr/>
@@ -44993,9 +46078,9 @@
       </w:tcPr>
     </w:tblStylePr>
   </w:style>
-  <w:style w:type="table" w:styleId="814">
+  <w:style w:type="table" w:styleId="816">
     <w:name w:val="List Table 7 Colorful - Accent 2"/>
-    <w:basedOn w:val="859"/>
+    <w:basedOn w:val="861"/>
     <w:uiPriority w:val="99"/>
     <w:pPr>
       <w:pBdr/>
@@ -45249,9 +46334,9 @@
       </w:tcPr>
     </w:tblStylePr>
   </w:style>
-  <w:style w:type="table" w:styleId="815">
+  <w:style w:type="table" w:styleId="817">
     <w:name w:val="List Table 7 Colorful - Accent 3"/>
-    <w:basedOn w:val="859"/>
+    <w:basedOn w:val="861"/>
     <w:uiPriority w:val="99"/>
     <w:pPr>
       <w:pBdr/>
@@ -45505,9 +46590,9 @@
       </w:tcPr>
     </w:tblStylePr>
   </w:style>
-  <w:style w:type="table" w:styleId="816">
+  <w:style w:type="table" w:styleId="818">
     <w:name w:val="List Table 7 Colorful - Accent 4"/>
-    <w:basedOn w:val="859"/>
+    <w:basedOn w:val="861"/>
     <w:uiPriority w:val="99"/>
     <w:pPr>
       <w:pBdr/>
@@ -45761,9 +46846,9 @@
       </w:tcPr>
     </w:tblStylePr>
   </w:style>
-  <w:style w:type="table" w:styleId="817">
+  <w:style w:type="table" w:styleId="819">
     <w:name w:val="List Table 7 Colorful - Accent 5"/>
-    <w:basedOn w:val="859"/>
+    <w:basedOn w:val="861"/>
     <w:uiPriority w:val="99"/>
     <w:pPr>
       <w:pBdr/>
@@ -46017,9 +47102,9 @@
       </w:tcPr>
     </w:tblStylePr>
   </w:style>
-  <w:style w:type="table" w:styleId="818">
+  <w:style w:type="table" w:styleId="820">
     <w:name w:val="List Table 7 Colorful - Accent 6"/>
-    <w:basedOn w:val="859"/>
+    <w:basedOn w:val="861"/>
     <w:uiPriority w:val="99"/>
     <w:pPr>
       <w:pBdr/>
@@ -46273,9 +47358,9 @@
       </w:tcPr>
     </w:tblStylePr>
   </w:style>
-  <w:style w:type="table" w:styleId="819">
+  <w:style w:type="table" w:styleId="821">
     <w:name w:val="Lined - Accent"/>
-    <w:basedOn w:val="859"/>
+    <w:basedOn w:val="861"/>
     <w:uiPriority w:val="99"/>
     <w:pPr>
       <w:pBdr/>
@@ -46510,9 +47595,9 @@
       </w:tcPr>
     </w:tblStylePr>
   </w:style>
-  <w:style w:type="table" w:styleId="820">
+  <w:style w:type="table" w:styleId="822">
     <w:name w:val="Lined - Accent 1"/>
-    <w:basedOn w:val="859"/>
+    <w:basedOn w:val="861"/>
     <w:uiPriority w:val="99"/>
     <w:pPr>
       <w:pBdr/>
@@ -46747,9 +47832,9 @@
       </w:tcPr>
     </w:tblStylePr>
   </w:style>
-  <w:style w:type="table" w:styleId="821">
+  <w:style w:type="table" w:styleId="823">
     <w:name w:val="Lined - Accent 2"/>
-    <w:basedOn w:val="859"/>
+    <w:basedOn w:val="861"/>
     <w:uiPriority w:val="99"/>
     <w:pPr>
       <w:pBdr/>
@@ -46984,9 +48069,9 @@
       </w:tcPr>
     </w:tblStylePr>
   </w:style>
-  <w:style w:type="table" w:styleId="822">
+  <w:style w:type="table" w:styleId="824">
     <w:name w:val="Lined - Accent 3"/>
-    <w:basedOn w:val="859"/>
+    <w:basedOn w:val="861"/>
     <w:uiPriority w:val="99"/>
     <w:pPr>
       <w:pBdr/>
@@ -47221,9 +48306,9 @@
       </w:tcPr>
     </w:tblStylePr>
   </w:style>
-  <w:style w:type="table" w:styleId="823">
+  <w:style w:type="table" w:styleId="825">
     <w:name w:val="Lined - Accent 4"/>
-    <w:basedOn w:val="859"/>
+    <w:basedOn w:val="861"/>
     <w:uiPriority w:val="99"/>
     <w:pPr>
       <w:pBdr/>
@@ -47458,9 +48543,9 @@
       </w:tcPr>
     </w:tblStylePr>
   </w:style>
-  <w:style w:type="table" w:styleId="824">
+  <w:style w:type="table" w:styleId="826">
     <w:name w:val="Lined - Accent 5"/>
-    <w:basedOn w:val="859"/>
+    <w:basedOn w:val="861"/>
     <w:uiPriority w:val="99"/>
     <w:pPr>
       <w:pBdr/>
@@ -47695,9 +48780,9 @@
       </w:tcPr>
     </w:tblStylePr>
   </w:style>
-  <w:style w:type="table" w:styleId="825">
+  <w:style w:type="table" w:styleId="827">
     <w:name w:val="Lined - Accent 6"/>
-    <w:basedOn w:val="859"/>
+    <w:basedOn w:val="861"/>
     <w:uiPriority w:val="99"/>
     <w:pPr>
       <w:pBdr/>
@@ -47932,9 +49017,9 @@
       </w:tcPr>
     </w:tblStylePr>
   </w:style>
-  <w:style w:type="table" w:styleId="826">
+  <w:style w:type="table" w:styleId="828">
     <w:name w:val="Bordered &amp; Lined - Accent"/>
-    <w:basedOn w:val="859"/>
+    <w:basedOn w:val="861"/>
     <w:uiPriority w:val="99"/>
     <w:pPr>
       <w:pBdr/>
@@ -48176,9 +49261,9 @@
       </w:tcPr>
     </w:tblStylePr>
   </w:style>
-  <w:style w:type="table" w:styleId="827">
+  <w:style w:type="table" w:styleId="829">
     <w:name w:val="Bordered &amp; Lined - Accent 1"/>
-    <w:basedOn w:val="859"/>
+    <w:basedOn w:val="861"/>
     <w:uiPriority w:val="99"/>
     <w:pPr>
       <w:pBdr/>
@@ -48420,9 +49505,9 @@
       </w:tcPr>
     </w:tblStylePr>
   </w:style>
-  <w:style w:type="table" w:styleId="828">
+  <w:style w:type="table" w:styleId="830">
     <w:name w:val="Bordered &amp; Lined - Accent 2"/>
-    <w:basedOn w:val="859"/>
+    <w:basedOn w:val="861"/>
     <w:uiPriority w:val="99"/>
     <w:pPr>
       <w:pBdr/>
@@ -48664,9 +49749,9 @@
       </w:tcPr>
     </w:tblStylePr>
   </w:style>
-  <w:style w:type="table" w:styleId="829">
+  <w:style w:type="table" w:styleId="831">
     <w:name w:val="Bordered &amp; Lined - Accent 3"/>
-    <w:basedOn w:val="859"/>
+    <w:basedOn w:val="861"/>
     <w:uiPriority w:val="99"/>
     <w:pPr>
       <w:pBdr/>
@@ -48908,9 +49993,9 @@
       </w:tcPr>
     </w:tblStylePr>
   </w:style>
-  <w:style w:type="table" w:styleId="830">
+  <w:style w:type="table" w:styleId="832">
     <w:name w:val="Bordered &amp; Lined - Accent 4"/>
-    <w:basedOn w:val="859"/>
+    <w:basedOn w:val="861"/>
     <w:uiPriority w:val="99"/>
     <w:pPr>
       <w:pBdr/>
@@ -49152,9 +50237,9 @@
       </w:tcPr>
     </w:tblStylePr>
   </w:style>
-  <w:style w:type="table" w:styleId="831">
+  <w:style w:type="table" w:styleId="833">
     <w:name w:val="Bordered &amp; Lined - Accent 5"/>
-    <w:basedOn w:val="859"/>
+    <w:basedOn w:val="861"/>
     <w:uiPriority w:val="99"/>
     <w:pPr>
       <w:pBdr/>
@@ -49396,9 +50481,9 @@
       </w:tcPr>
     </w:tblStylePr>
   </w:style>
-  <w:style w:type="table" w:styleId="832">
+  <w:style w:type="table" w:styleId="834">
     <w:name w:val="Bordered &amp; Lined - Accent 6"/>
-    <w:basedOn w:val="859"/>
+    <w:basedOn w:val="861"/>
     <w:uiPriority w:val="99"/>
     <w:pPr>
       <w:pBdr/>
@@ -49640,9 +50725,9 @@
       </w:tcPr>
     </w:tblStylePr>
   </w:style>
-  <w:style w:type="table" w:styleId="833">
+  <w:style w:type="table" w:styleId="835">
     <w:name w:val="Bordered"/>
-    <w:basedOn w:val="859"/>
+    <w:basedOn w:val="861"/>
     <w:uiPriority w:val="99"/>
     <w:pPr>
       <w:pBdr/>
@@ -49871,9 +50956,9 @@
       </w:tcPr>
     </w:tblStylePr>
   </w:style>
-  <w:style w:type="table" w:styleId="834">
+  <w:style w:type="table" w:styleId="836">
     <w:name w:val="Bordered - Accent 1"/>
-    <w:basedOn w:val="859"/>
+    <w:basedOn w:val="861"/>
     <w:uiPriority w:val="99"/>
     <w:pPr>
       <w:pBdr/>
@@ -50102,9 +51187,9 @@
       </w:tcPr>
     </w:tblStylePr>
   </w:style>
-  <w:style w:type="table" w:styleId="835">
+  <w:style w:type="table" w:styleId="837">
     <w:name w:val="Bordered - Accent 2"/>
-    <w:basedOn w:val="859"/>
+    <w:basedOn w:val="861"/>
     <w:uiPriority w:val="99"/>
     <w:pPr>
       <w:pBdr/>
@@ -50333,9 +51418,9 @@
       </w:tcPr>
     </w:tblStylePr>
   </w:style>
-  <w:style w:type="table" w:styleId="836">
+  <w:style w:type="table" w:styleId="838">
     <w:name w:val="Bordered - Accent 3"/>
-    <w:basedOn w:val="859"/>
+    <w:basedOn w:val="861"/>
     <w:uiPriority w:val="99"/>
     <w:pPr>
       <w:pBdr/>
@@ -50564,9 +51649,9 @@
       </w:tcPr>
     </w:tblStylePr>
   </w:style>
-  <w:style w:type="table" w:styleId="837">
+  <w:style w:type="table" w:styleId="839">
     <w:name w:val="Bordered - Accent 4"/>
-    <w:basedOn w:val="859"/>
+    <w:basedOn w:val="861"/>
     <w:uiPriority w:val="99"/>
     <w:pPr>
       <w:pBdr/>
@@ -50795,9 +51880,9 @@
       </w:tcPr>
     </w:tblStylePr>
   </w:style>
-  <w:style w:type="table" w:styleId="838">
+  <w:style w:type="table" w:styleId="840">
     <w:name w:val="Bordered - Accent 5"/>
-    <w:basedOn w:val="859"/>
+    <w:basedOn w:val="861"/>
     <w:uiPriority w:val="99"/>
     <w:pPr>
       <w:pBdr/>
@@ -51026,9 +52111,9 @@
       </w:tcPr>
     </w:tblStylePr>
   </w:style>
-  <w:style w:type="table" w:styleId="839">
+  <w:style w:type="table" w:styleId="841">
     <w:name w:val="Bordered - Accent 6"/>
-    <w:basedOn w:val="859"/>
+    <w:basedOn w:val="861"/>
     <w:uiPriority w:val="99"/>
     <w:pPr>
       <w:pBdr/>
@@ -51257,7 +52342,7 @@
       </w:tcPr>
     </w:tblStylePr>
   </w:style>
-  <w:style w:type="character" w:styleId="840">
+  <w:style w:type="character" w:styleId="842">
     <w:name w:val="Hyperlink"/>
     <w:uiPriority w:val="99"/>
     <w:unhideWhenUsed/>
@@ -51271,10 +52356,10 @@
       <w:u w:val="single"/>
     </w:rPr>
   </w:style>
-  <w:style w:type="paragraph" w:styleId="841">
+  <w:style w:type="paragraph" w:styleId="843">
     <w:name w:val="footnote text"/>
-    <w:basedOn w:val="858"/>
-    <w:link w:val="842"/>
+    <w:basedOn w:val="860"/>
+    <w:link w:val="844"/>
     <w:uiPriority w:val="99"/>
     <w:semiHidden/>
     <w:unhideWhenUsed/>
@@ -51287,9 +52372,9 @@
       <w:sz w:val="18"/>
     </w:rPr>
   </w:style>
-  <w:style w:type="character" w:styleId="842">
+  <w:style w:type="character" w:styleId="844">
     <w:name w:val="Footnote Text Char"/>
-    <w:link w:val="841"/>
+    <w:link w:val="843"/>
     <w:uiPriority w:val="99"/>
     <w:pPr>
       <w:pBdr/>
@@ -51300,7 +52385,7 @@
       <w:sz w:val="18"/>
     </w:rPr>
   </w:style>
-  <w:style w:type="character" w:styleId="843">
+  <w:style w:type="character" w:styleId="845">
     <w:name w:val="footnote reference"/>
     <w:uiPriority w:val="99"/>
     <w:unhideWhenUsed/>
@@ -51313,10 +52398,10 @@
       <w:vertAlign w:val="superscript"/>
     </w:rPr>
   </w:style>
-  <w:style w:type="paragraph" w:styleId="844">
+  <w:style w:type="paragraph" w:styleId="846">
     <w:name w:val="endnote text"/>
-    <w:basedOn w:val="858"/>
-    <w:link w:val="845"/>
+    <w:basedOn w:val="860"/>
+    <w:link w:val="847"/>
     <w:uiPriority w:val="99"/>
     <w:semiHidden/>
     <w:unhideWhenUsed/>
@@ -51329,9 +52414,9 @@
       <w:sz w:val="20"/>
     </w:rPr>
   </w:style>
-  <w:style w:type="character" w:styleId="845">
+  <w:style w:type="character" w:styleId="847">
     <w:name w:val="Endnote Text Char"/>
-    <w:link w:val="844"/>
+    <w:link w:val="846"/>
     <w:uiPriority w:val="99"/>
     <w:pPr>
       <w:pBdr/>
@@ -51342,7 +52427,7 @@
       <w:sz w:val="20"/>
     </w:rPr>
   </w:style>
-  <w:style w:type="character" w:styleId="846">
+  <w:style w:type="character" w:styleId="848">
     <w:name w:val="endnote reference"/>
     <w:uiPriority w:val="99"/>
     <w:semiHidden/>
@@ -51356,10 +52441,10 @@
       <w:vertAlign w:val="superscript"/>
     </w:rPr>
   </w:style>
-  <w:style w:type="paragraph" w:styleId="847">
+  <w:style w:type="paragraph" w:styleId="849">
     <w:name w:val="toc 1"/>
-    <w:basedOn w:val="858"/>
-    <w:next w:val="858"/>
+    <w:basedOn w:val="860"/>
+    <w:next w:val="860"/>
     <w:uiPriority w:val="39"/>
     <w:unhideWhenUsed/>
     <w:pPr>
@@ -51368,10 +52453,10 @@
       <w:ind w:right="0" w:firstLine="0" w:left="0"/>
     </w:pPr>
   </w:style>
-  <w:style w:type="paragraph" w:styleId="848">
+  <w:style w:type="paragraph" w:styleId="850">
     <w:name w:val="toc 2"/>
-    <w:basedOn w:val="858"/>
-    <w:next w:val="858"/>
+    <w:basedOn w:val="860"/>
+    <w:next w:val="860"/>
     <w:uiPriority w:val="39"/>
     <w:unhideWhenUsed/>
     <w:pPr>
@@ -51380,10 +52465,10 @@
       <w:ind w:right="0" w:firstLine="0" w:left="283"/>
     </w:pPr>
   </w:style>
-  <w:style w:type="paragraph" w:styleId="849">
+  <w:style w:type="paragraph" w:styleId="851">
     <w:name w:val="toc 3"/>
-    <w:basedOn w:val="858"/>
-    <w:next w:val="858"/>
+    <w:basedOn w:val="860"/>
+    <w:next w:val="860"/>
     <w:uiPriority w:val="39"/>
     <w:unhideWhenUsed/>
     <w:pPr>
@@ -51392,10 +52477,10 @@
       <w:ind w:right="0" w:firstLine="0" w:left="567"/>
     </w:pPr>
   </w:style>
-  <w:style w:type="paragraph" w:styleId="850">
+  <w:style w:type="paragraph" w:styleId="852">
     <w:name w:val="toc 4"/>
-    <w:basedOn w:val="858"/>
-    <w:next w:val="858"/>
+    <w:basedOn w:val="860"/>
+    <w:next w:val="860"/>
     <w:uiPriority w:val="39"/>
     <w:unhideWhenUsed/>
     <w:pPr>
@@ -51404,10 +52489,10 @@
       <w:ind w:right="0" w:firstLine="0" w:left="850"/>
     </w:pPr>
   </w:style>
-  <w:style w:type="paragraph" w:styleId="851">
+  <w:style w:type="paragraph" w:styleId="853">
     <w:name w:val="toc 5"/>
-    <w:basedOn w:val="858"/>
-    <w:next w:val="858"/>
+    <w:basedOn w:val="860"/>
+    <w:next w:val="860"/>
     <w:uiPriority w:val="39"/>
     <w:unhideWhenUsed/>
     <w:pPr>
@@ -51416,10 +52501,10 @@
       <w:ind w:right="0" w:firstLine="0" w:left="1134"/>
     </w:pPr>
   </w:style>
-  <w:style w:type="paragraph" w:styleId="852">
+  <w:style w:type="paragraph" w:styleId="854">
     <w:name w:val="toc 6"/>
-    <w:basedOn w:val="858"/>
-    <w:next w:val="858"/>
+    <w:basedOn w:val="860"/>
+    <w:next w:val="860"/>
     <w:uiPriority w:val="39"/>
     <w:unhideWhenUsed/>
     <w:pPr>
@@ -51428,10 +52513,10 @@
       <w:ind w:right="0" w:firstLine="0" w:left="1417"/>
     </w:pPr>
   </w:style>
-  <w:style w:type="paragraph" w:styleId="853">
+  <w:style w:type="paragraph" w:styleId="855">
     <w:name w:val="toc 7"/>
-    <w:basedOn w:val="858"/>
-    <w:next w:val="858"/>
+    <w:basedOn w:val="860"/>
+    <w:next w:val="860"/>
     <w:uiPriority w:val="39"/>
     <w:unhideWhenUsed/>
     <w:pPr>
@@ -51440,10 +52525,10 @@
       <w:ind w:right="0" w:firstLine="0" w:left="1701"/>
     </w:pPr>
   </w:style>
-  <w:style w:type="paragraph" w:styleId="854">
+  <w:style w:type="paragraph" w:styleId="856">
     <w:name w:val="toc 8"/>
-    <w:basedOn w:val="858"/>
-    <w:next w:val="858"/>
+    <w:basedOn w:val="860"/>
+    <w:next w:val="860"/>
     <w:uiPriority w:val="39"/>
     <w:unhideWhenUsed/>
     <w:pPr>
@@ -51452,10 +52537,10 @@
       <w:ind w:right="0" w:firstLine="0" w:left="1984"/>
     </w:pPr>
   </w:style>
-  <w:style w:type="paragraph" w:styleId="855">
+  <w:style w:type="paragraph" w:styleId="857">
     <w:name w:val="toc 9"/>
-    <w:basedOn w:val="858"/>
-    <w:next w:val="858"/>
+    <w:basedOn w:val="860"/>
+    <w:next w:val="860"/>
     <w:uiPriority w:val="39"/>
     <w:unhideWhenUsed/>
     <w:pPr>
@@ -51464,7 +52549,7 @@
       <w:ind w:right="0" w:firstLine="0" w:left="2268"/>
     </w:pPr>
   </w:style>
-  <w:style w:type="paragraph" w:styleId="856">
+  <w:style w:type="paragraph" w:styleId="858">
     <w:name w:val="TOC Heading"/>
     <w:uiPriority w:val="39"/>
     <w:unhideWhenUsed/>
@@ -51474,10 +52559,10 @@
       <w:ind/>
     </w:pPr>
   </w:style>
-  <w:style w:type="paragraph" w:styleId="857">
+  <w:style w:type="paragraph" w:styleId="859">
     <w:name w:val="table of figures"/>
-    <w:basedOn w:val="858"/>
-    <w:next w:val="858"/>
+    <w:basedOn w:val="860"/>
+    <w:next w:val="860"/>
     <w:uiPriority w:val="99"/>
     <w:unhideWhenUsed/>
     <w:pPr>
@@ -51486,7 +52571,7 @@
       <w:ind/>
     </w:pPr>
   </w:style>
-  <w:style w:type="paragraph" w:styleId="858" w:default="1">
+  <w:style w:type="paragraph" w:styleId="860" w:default="1">
     <w:name w:val="Normal"/>
     <w:qFormat/>
     <w:pPr>
@@ -51495,7 +52580,7 @@
       <w:ind/>
     </w:pPr>
   </w:style>
-  <w:style w:type="table" w:styleId="859" w:default="1">
+  <w:style w:type="table" w:styleId="861" w:default="1">
     <w:name w:val="Normal Table"/>
     <w:uiPriority w:val="99"/>
     <w:semiHidden/>
@@ -51688,7 +52773,7 @@
       </w:tcPr>
     </w:tblStylePr>
   </w:style>
-  <w:style w:type="numbering" w:styleId="860" w:default="1">
+  <w:style w:type="numbering" w:styleId="862" w:default="1">
     <w:name w:val="No List"/>
     <w:uiPriority w:val="99"/>
     <w:semiHidden/>
@@ -51699,9 +52784,9 @@
       <w:ind/>
     </w:pPr>
   </w:style>
-  <w:style w:type="paragraph" w:styleId="861">
+  <w:style w:type="paragraph" w:styleId="863">
     <w:name w:val="No Spacing"/>
-    <w:basedOn w:val="858"/>
+    <w:basedOn w:val="860"/>
     <w:uiPriority w:val="1"/>
     <w:qFormat/>
     <w:pPr>
@@ -51710,9 +52795,9 @@
       <w:ind/>
     </w:pPr>
   </w:style>
-  <w:style w:type="paragraph" w:styleId="862">
+  <w:style w:type="paragraph" w:styleId="864">
     <w:name w:val="List Paragraph"/>
-    <w:basedOn w:val="858"/>
+    <w:basedOn w:val="860"/>
     <w:uiPriority w:val="34"/>
     <w:qFormat/>
     <w:pPr>
@@ -51722,7 +52807,7 @@
       <w:contextualSpacing w:val="true"/>
     </w:pPr>
   </w:style>
-  <w:style w:type="character" w:styleId="863" w:default="1">
+  <w:style w:type="character" w:styleId="865" w:default="1">
     <w:name w:val="Default Paragraph Font"/>
     <w:uiPriority w:val="1"/>
     <w:semiHidden/>

</xml_diff>

<commit_message>
A bit of refactoring with code and idk what happened with design
</commit_message>
<xml_diff>
--- a/Design.docx
+++ b/Design.docx
@@ -11160,41 +11160,65 @@
         <w:spacing/>
         <w:ind/>
         <w:rPr>
+          <w:color w:val="000000" w:themeColor="text1"/>
+          <w:sz w:val="22"/>
+          <w:szCs w:val="22"/>
+          <w:highlight w:val="none"/>
+        </w:rPr>
+      </w:pPr>
+      <w:r>
+        <w:rPr>
+          <w:color w:val="000000" w:themeColor="text1"/>
+          <w:sz w:val="22"/>
+          <w:szCs w:val="22"/>
+          <w:highlight w:val="none"/>
+        </w:rPr>
+        <w:t xml:space="preserve">getEphemeris() uses Nasa’s Horizons database to get the positions of the planets at the date and time the program. The program then enters its main loop. It checks for </w:t>
+      </w:r>
+      <w:r>
+        <w:rPr>
+          <w:color w:val="000000" w:themeColor="text1"/>
+          <w:sz w:val="22"/>
+          <w:szCs w:val="22"/>
+          <w:highlight w:val="none"/>
+        </w:rPr>
+        <w:t xml:space="preserve">any inputs in case the user has tried to do anything, it simulates the tick and does all the physics, it displays the planets, and then it calculates the energies and outputs them to the console to demonstrate conservation of energy as requested by client. In my system parts section I will explain everything in the main loop of this flowchart in detail.</w:t>
+      </w:r>
+      <w:r>
+        <w:rPr>
           <w:color w:val="000000"/>
           <w:sz w:val="22"/>
           <w:szCs w:val="22"/>
           <w:highlight w:val="none"/>
         </w:rPr>
-      </w:pPr>
-      <w:r>
-        <w:rPr>
-          <w:color w:val="000000" w:themeColor="text1"/>
-          <w:sz w:val="22"/>
-          <w:szCs w:val="22"/>
-          <w:highlight w:val="none"/>
-        </w:rPr>
-        <w:t xml:space="preserve">getEphemeris() uses Nasa’s Horizons database to get the positions of the planets at the date and time the program. The program then enters its main loop. It checks for </w:t>
-      </w:r>
-      <w:r>
-        <w:rPr>
-          <w:color w:val="000000" w:themeColor="text1"/>
-          <w:sz w:val="22"/>
-          <w:szCs w:val="22"/>
-          <w:highlight w:val="none"/>
-        </w:rPr>
-        <w:t xml:space="preserve">any inputs in case the user has tried to do anything, it simulates the tick and does all the physics, it displays the planets, and then it calculates the energies and outputs them to the console to demonstrate conservation of energy as requested by client.</w:t>
-      </w:r>
-      <w:r>
-        <w:rPr>
-          <w:color w:val="000000"/>
-          <w:sz w:val="22"/>
-          <w:szCs w:val="22"/>
-          <w:highlight w:val="none"/>
-        </w:rPr>
-      </w:r>
-      <w:r>
-        <w:rPr>
-          <w:color w:val="000000"/>
+      </w:r>
+      <w:r>
+        <w:rPr>
+          <w:color w:val="000000" w:themeColor="text1"/>
+          <w:sz w:val="22"/>
+          <w:szCs w:val="22"/>
+          <w:highlight w:val="none"/>
+        </w:rPr>
+      </w:r>
+      <w:r>
+        <w:rPr>
+          <w:color w:val="000000" w:themeColor="text1"/>
+          <w:sz w:val="22"/>
+          <w:szCs w:val="22"/>
+          <w:highlight w:val="none"/>
+        </w:rPr>
+      </w:r>
+      <w:r>
+        <w:rPr>
+          <w:color w:val="000000" w:themeColor="text1"/>
+          <w:sz w:val="22"/>
+          <w:szCs w:val="22"/>
+          <w:highlight w:val="none"/>
+        </w:rPr>
+      </w:r>
+      <w:r>
+        <w:rPr>
+          <w:color w:val="000000" w:themeColor="text1"/>
           <w:sz w:val="22"/>
           <w:szCs w:val="22"/>
           <w:highlight w:val="none"/>
@@ -11946,7 +11970,7 @@
           <mc:Choice Requires="wpg">
             <w:drawing>
               <wp:inline xmlns:wp="http://schemas.openxmlformats.org/drawingml/2006/wordprocessingDrawing" distT="0" distB="0" distL="0" distR="0">
-                <wp:extent cx="5940425" cy="5188838"/>
+                <wp:extent cx="5940425" cy="5206861"/>
                 <wp:effectExtent l="0" t="0" r="0" b="0"/>
                 <wp:docPr id="24" name=""/>
                 <wp:cNvGraphicFramePr>
@@ -11956,7 +11980,7 @@
                   <a:graphicData uri="http://schemas.openxmlformats.org/drawingml/2006/picture">
                     <pic:pic xmlns:pic="http://schemas.openxmlformats.org/drawingml/2006/picture">
                       <pic:nvPicPr>
-                        <pic:cNvPr id="2055995832" name=""/>
+                        <pic:cNvPr id="753453479" name=""/>
                         <pic:cNvPicPr>
                           <a:picLocks noChangeAspect="1"/>
                         </pic:cNvPicPr>
@@ -11969,7 +11993,7 @@
                       <pic:spPr bwMode="auto">
                         <a:xfrm>
                           <a:off x="0" y="0"/>
-                          <a:ext cx="5940424" cy="5188838"/>
+                          <a:ext cx="5940424" cy="5206861"/>
                         </a:xfrm>
                         <a:prstGeom prst="rect">
                           <a:avLst/>
@@ -12002,7 +12026,7 @@
                 <v:path o:extrusionok="f" gradientshapeok="t" o:connecttype="rect"/>
                 <o:lock v:ext="edit" aspectratio="t"/>
               </v:shapetype>
-              <v:shape id="_x0000_i23" o:spid="_x0000_s23" type="#_x0000_t75" style="width:467.75pt;height:408.57pt;mso-wrap-distance-left:0.00pt;mso-wrap-distance-top:0.00pt;mso-wrap-distance-right:0.00pt;mso-wrap-distance-bottom:0.00pt;z-index:1;" stroked="false">
+              <v:shape id="_x0000_i23" o:spid="_x0000_s23" type="#_x0000_t75" style="width:467.75pt;height:409.99pt;mso-wrap-distance-left:0.00pt;mso-wrap-distance-top:0.00pt;mso-wrap-distance-right:0.00pt;mso-wrap-distance-bottom:0.00pt;z-index:1;" stroked="false">
                 <v:imagedata r:id="rId35" o:title=""/>
                 <o:lock v:ext="edit" rotation="t"/>
               </v:shape>
@@ -12014,6 +12038,24 @@
         <w:rPr>
           <w:color w:val="000000" w:themeColor="text1"/>
           <w:sz w:val="22"/>
+          <w:szCs w:val="16"/>
+          <w:highlight w:val="none"/>
+        </w:rPr>
+      </w:r>
+      <w:r/>
+      <w:r>
+        <w:rPr>
+          <w:color w:val="000000" w:themeColor="text1"/>
+          <w:sz w:val="22"/>
+          <w:szCs w:val="16"/>
+          <w:highlight w:val="none"/>
+        </w:rPr>
+      </w:r>
+      <w:r/>
+      <w:r>
+        <w:rPr>
+          <w:color w:val="000000" w:themeColor="text1"/>
+          <w:sz w:val="22"/>
           <w:szCs w:val="22"/>
           <w:highlight w:val="none"/>
         </w:rPr>
@@ -12052,7 +12094,7 @@
           <mc:Choice Requires="wpg">
             <w:drawing>
               <wp:inline xmlns:wp="http://schemas.openxmlformats.org/drawingml/2006/wordprocessingDrawing" distT="0" distB="0" distL="0" distR="0">
-                <wp:extent cx="5940425" cy="1809567"/>
+                <wp:extent cx="5940425" cy="2172791"/>
                 <wp:effectExtent l="0" t="0" r="0" b="0"/>
                 <wp:docPr id="25" name=""/>
                 <wp:cNvGraphicFramePr>
@@ -12062,7 +12104,7 @@
                   <a:graphicData uri="http://schemas.openxmlformats.org/drawingml/2006/picture">
                     <pic:pic xmlns:pic="http://schemas.openxmlformats.org/drawingml/2006/picture">
                       <pic:nvPicPr>
-                        <pic:cNvPr id="1729673307" name=""/>
+                        <pic:cNvPr id="1393985394" name=""/>
                         <pic:cNvPicPr>
                           <a:picLocks noChangeAspect="1"/>
                         </pic:cNvPicPr>
@@ -12075,7 +12117,7 @@
                       <pic:spPr bwMode="auto">
                         <a:xfrm>
                           <a:off x="0" y="0"/>
-                          <a:ext cx="5940424" cy="1809567"/>
+                          <a:ext cx="5940424" cy="2172790"/>
                         </a:xfrm>
                         <a:prstGeom prst="rect">
                           <a:avLst/>
@@ -12108,7 +12150,7 @@
                 <v:path o:extrusionok="f" gradientshapeok="t" o:connecttype="rect"/>
                 <o:lock v:ext="edit" aspectratio="t"/>
               </v:shapetype>
-              <v:shape id="_x0000_i24" o:spid="_x0000_s24" type="#_x0000_t75" style="width:467.75pt;height:142.49pt;mso-wrap-distance-left:0.00pt;mso-wrap-distance-top:0.00pt;mso-wrap-distance-right:0.00pt;mso-wrap-distance-bottom:0.00pt;z-index:1;" stroked="false">
+              <v:shape id="_x0000_i24" o:spid="_x0000_s24" type="#_x0000_t75" style="width:467.75pt;height:171.09pt;mso-wrap-distance-left:0.00pt;mso-wrap-distance-top:0.00pt;mso-wrap-distance-right:0.00pt;mso-wrap-distance-bottom:0.00pt;z-index:1;" stroked="false">
                 <v:imagedata r:id="rId36" o:title=""/>
                 <o:lock v:ext="edit" rotation="t"/>
               </v:shape>
@@ -12116,6 +12158,15 @@
           </mc:Fallback>
         </mc:AlternateContent>
       </w:r>
+      <w:r>
+        <w:rPr>
+          <w:color w:val="000000"/>
+          <w:sz w:val="22"/>
+          <w:szCs w:val="22"/>
+          <w:highlight w:val="none"/>
+        </w:rPr>
+      </w:r>
+      <w:r/>
       <w:r>
         <w:rPr>
           <w:color w:val="000000"/>
@@ -16790,19 +16841,6 @@
         <w:rPr>
           <w:color w:val="000000" w:themeColor="text1"/>
           <w:sz w:val="22"/>
-          <w:highlight w:val="none"/>
-          <w:vertAlign w:val="baseline"/>
-        </w:rPr>
-      </w:r>
-      <w:r>
-        <w:rPr>
-          <w:highlight w:val="none"/>
-        </w:rPr>
-      </w:r>
-      <w:r>
-        <w:rPr>
-          <w:color w:val="000000" w:themeColor="text1"/>
-          <w:sz w:val="22"/>
           <w:szCs w:val="22"/>
           <w:highlight w:val="none"/>
           <w:vertAlign w:val="baseline"/>
@@ -16978,7 +17016,16 @@
           <w:highlight w:val="none"/>
           <w:vertAlign w:val="baseline"/>
         </w:rPr>
-        <w:t xml:space="preserve">The purpose of the display is to give a view of the solar system, enable zooming in and out, and have the ability to focus the centre of the view (the “camera”) on any specific object / the c.o.m. (this is an actual acronym used by physicists for the centre of mass) of the system. </w:t>
+        <w:t xml:space="preserve">The purpose of the display</w:t>
+      </w:r>
+      <w:r>
+        <w:rPr>
+          <w:color w:val="000000" w:themeColor="text1"/>
+          <w:sz w:val="22"/>
+          <w:highlight w:val="none"/>
+          <w:vertAlign w:val="baseline"/>
+        </w:rPr>
+        <w:t xml:space="preserve"> is to give a view of the solar system, enable zooming in and out, and have the ability to focus the centre of the view (the “camera”) on any specific object / the c.o.m. (this is an actual acronym used by physicists for the centre of mass) of the system. </w:t>
       </w:r>
       <w:r>
         <w:rPr>
@@ -21973,7 +22020,7 @@
         <w:rPr>
           <w:color w:val="000000" w:themeColor="text1"/>
           <w:sz w:val="22"/>
-          <w:szCs w:val="18"/>
+          <w:szCs w:val="22"/>
           <w:highlight w:val="none"/>
         </w:rPr>
       </w:r>
@@ -22339,7 +22386,17 @@
           <w:highlight w:val="none"/>
           <w:vertAlign w:val="baseline"/>
         </w:rPr>
-        <w:t xml:space="preserve">won’t completely obscure things behind it. Text will then be rendered in front of the surface using pygame’s font.render() method. This will meet the client’s needs as it shows the info they’ve requested and also lets users edit planet masses as requested. Here is what the menu might look like:</w:t>
+        <w:t xml:space="preserve">won’t completely obscure things behind </w:t>
+      </w:r>
+      <w:r>
+        <w:rPr>
+          <w:color w:val="000000" w:themeColor="text1"/>
+          <w:sz w:val="22"/>
+          <w:szCs w:val="22"/>
+          <w:highlight w:val="none"/>
+          <w:vertAlign w:val="baseline"/>
+        </w:rPr>
+        <w:t xml:space="preserve">it. Text will then be rendered in front of the surface using pygame’s font.render() method. This will meet the client’s needs as it shows the info they’ve requested and also lets users edit planet masses as requested. Here is what the menu might look like:</w:t>
       </w:r>
       <w:r>
         <w:rPr>
@@ -22451,7 +22508,6 @@
           </mc:Fallback>
         </mc:AlternateContent>
       </w:r>
-      <w:r/>
       <w:r>
         <w:rPr>
           <w:color w:val="000000" w:themeColor="text1"/>
@@ -22554,7 +22610,17 @@
           <w:highlight w:val="none"/>
           <w:vertAlign w:val="baseline"/>
         </w:rPr>
-        <w:t xml:space="preserve">hanging attributes then the function should display different text explaining the keybinds. The function will be given changingAttributes, a boolean telling whether or not the user is changing attributes, as an argument, so that it can use an if statement to determine what to do. Here is what the menu would look like when editing attributes:</w:t>
+        <w:t xml:space="preserve">hanging attributes then the function should display different text explaining the keybi</w:t>
+      </w:r>
+      <w:r>
+        <w:rPr>
+          <w:color w:val="000000" w:themeColor="text1"/>
+          <w:sz w:val="22"/>
+          <w:szCs w:val="22"/>
+          <w:highlight w:val="none"/>
+          <w:vertAlign w:val="baseline"/>
+        </w:rPr>
+        <w:t xml:space="preserve">nds. The function will be given changingAttributes, a boolean telling whether or not the user is changing attributes, as an argument, so that it can use an if statement to determine what to do. Here is what the menu would look like when editing attributes:</w:t>
       </w:r>
       <w:r>
         <w:rPr>
@@ -22669,7 +22735,6 @@
           </mc:Fallback>
         </mc:AlternateContent>
       </w:r>
-      <w:r/>
       <w:r>
         <w:rPr>
           <w:color w:val="000000" w:themeColor="text1"/>
@@ -22871,11 +22936,7 @@
       </w:r>
       <w:r>
         <w:rPr>
-          <w:color w:val="000000" w:themeColor="text1"/>
-          <w:sz w:val="22"/>
-          <w:szCs w:val="22"/>
-          <w:highlight w:val="none"/>
-          <w:vertAlign w:val="baseline"/>
+          <w:highlight w:val="none"/>
         </w:rPr>
       </w:r>
       <w:r>
@@ -23263,6 +23324,7 @@
         <w:rPr>
           <w:color w:val="000000" w:themeColor="text1"/>
           <w:sz w:val="22"/>
+          <w:szCs w:val="22"/>
           <w:highlight w:val="none"/>
           <w:vertAlign w:val="baseline"/>
         </w:rPr>
@@ -23731,6 +23793,7 @@
         <w:rPr>
           <w:color w:val="000000" w:themeColor="text1"/>
           <w:sz w:val="22"/>
+          <w:szCs w:val="22"/>
           <w:highlight w:val="none"/>
           <w:vertAlign w:val="baseline"/>
         </w:rPr>
@@ -23790,6 +23853,7 @@
         <w:rPr>
           <w:color w:val="000000" w:themeColor="text1"/>
           <w:sz w:val="22"/>
+          <w:szCs w:val="22"/>
           <w:highlight w:val="none"/>
           <w:vertAlign w:val="baseline"/>
         </w:rPr>
@@ -23830,6 +23894,7 @@
         <w:rPr>
           <w:color w:val="000000" w:themeColor="text1"/>
           <w:sz w:val="22"/>
+          <w:szCs w:val="22"/>
           <w:highlight w:val="none"/>
           <w:vertAlign w:val="baseline"/>
         </w:rPr>
@@ -23879,6 +23944,7 @@
         <w:rPr>
           <w:color w:val="000000" w:themeColor="text1"/>
           <w:sz w:val="22"/>
+          <w:szCs w:val="22"/>
           <w:highlight w:val="none"/>
           <w:vertAlign w:val="baseline"/>
         </w:rPr>
@@ -23928,6 +23994,7 @@
         <w:rPr>
           <w:color w:val="000000" w:themeColor="text1"/>
           <w:sz w:val="22"/>
+          <w:szCs w:val="22"/>
           <w:highlight w:val="none"/>
           <w:vertAlign w:val="baseline"/>
         </w:rPr>
@@ -24086,6 +24153,7 @@
         <w:rPr>
           <w:color w:val="000000" w:themeColor="text1"/>
           <w:sz w:val="22"/>
+          <w:szCs w:val="22"/>
           <w:highlight w:val="none"/>
           <w:vertAlign w:val="baseline"/>
         </w:rPr>
@@ -24144,6 +24212,7 @@
         <w:rPr>
           <w:color w:val="000000" w:themeColor="text1"/>
           <w:sz w:val="22"/>
+          <w:szCs w:val="22"/>
           <w:highlight w:val="none"/>
           <w:vertAlign w:val="baseline"/>
         </w:rPr>
@@ -24252,6 +24321,7 @@
         <w:rPr>
           <w:color w:val="000000" w:themeColor="text1"/>
           <w:sz w:val="22"/>
+          <w:szCs w:val="22"/>
           <w:highlight w:val="none"/>
           <w:vertAlign w:val="baseline"/>
         </w:rPr>
@@ -24291,6 +24361,7 @@
         <w:rPr>
           <w:color w:val="000000" w:themeColor="text1"/>
           <w:sz w:val="22"/>
+          <w:szCs w:val="22"/>
           <w:highlight w:val="none"/>
           <w:vertAlign w:val="baseline"/>
         </w:rPr>
@@ -24327,21 +24398,20 @@
       </w:r>
       <w:r>
         <w:rPr>
-          <w:color w:val="000000" w:themeColor="text1"/>
-          <w:sz w:val="22"/>
-          <w:szCs w:val="22"/>
-          <w:highlight w:val="none"/>
-          <w:vertAlign w:val="baseline"/>
-        </w:rPr>
-      </w:r>
-      <w:r>
-        <w:rPr>
           <w:color w:val="5b9bd5" w:themeColor="accent1"/>
           <w:sz w:val="32"/>
           <w:szCs w:val="32"/>
           <w:highlight w:val="none"/>
         </w:rPr>
       </w:r>
+      <w:r>
+        <w:rPr>
+          <w:color w:val="5b9bd5" w:themeColor="accent1"/>
+          <w:sz w:val="32"/>
+          <w:szCs w:val="32"/>
+          <w:highlight w:val="none"/>
+        </w:rPr>
+      </w:r>
     </w:p>
     <w:p>
       <w:pPr>
@@ -24381,6 +24451,14 @@
           <w:highlight w:val="none"/>
         </w:rPr>
         <w:t xml:space="preserve"> which adds up the energy and momentum of planets, and zoom() which handles the interpolation for the distScale.</w:t>
+      </w:r>
+      <w:r>
+        <w:rPr>
+          <w:color w:val="000000" w:themeColor="text1"/>
+          <w:sz w:val="22"/>
+          <w:szCs w:val="22"/>
+          <w:highlight w:val="none"/>
+        </w:rPr>
       </w:r>
       <w:r>
         <w:rPr>
@@ -24413,20 +24491,20 @@
       </w:r>
       <w:r>
         <w:rPr>
-          <w:color w:val="000000" w:themeColor="text1"/>
-          <w:sz w:val="22"/>
-          <w:szCs w:val="22"/>
-          <w:highlight w:val="none"/>
-        </w:rPr>
-      </w:r>
-      <w:r>
-        <w:rPr>
           <w:color w:val="4472c4" w:themeColor="accent5"/>
           <w:sz w:val="28"/>
           <w:szCs w:val="28"/>
           <w:highlight w:val="none"/>
         </w:rPr>
       </w:r>
+      <w:r>
+        <w:rPr>
+          <w:color w:val="4472c4" w:themeColor="accent5"/>
+          <w:sz w:val="28"/>
+          <w:szCs w:val="28"/>
+          <w:highlight w:val="none"/>
+        </w:rPr>
+      </w:r>
     </w:p>
     <w:p>
       <w:pPr>
@@ -24447,13 +24525,30 @@
           <w:szCs w:val="16"/>
           <w:highlight w:val="none"/>
         </w:rPr>
-        <w:t xml:space="preserve">com stands for centre of mass, it’s a real acronym used by physicists. We need the centre of mass so that the user can focus on it, particularly useful when the mass of planets has been increased by a large amount. To find the centre of mass is quite simple, this is the formula for it:</w:t>
+        <w:t xml:space="preserve">com stands for centre of mass,</w:t>
       </w:r>
       <w:r>
         <w:rPr>
           <w:color w:val="000000" w:themeColor="text1"/>
           <w:sz w:val="22"/>
           <w:szCs w:val="16"/>
+          <w:highlight w:val="none"/>
+        </w:rPr>
+        <w:t xml:space="preserve"> it’s a real acronym used by physicists. We need the centre of mass so that the user can focus on it, particularly useful when the mass of planets has been increased by a large amount. To find the centre of mass is quite simple, this is the formula for it:</w:t>
+      </w:r>
+      <w:r>
+        <w:rPr>
+          <w:color w:val="000000" w:themeColor="text1"/>
+          <w:sz w:val="22"/>
+          <w:szCs w:val="16"/>
+          <w:highlight w:val="none"/>
+        </w:rPr>
+      </w:r>
+      <w:r>
+        <w:rPr>
+          <w:color w:val="000000" w:themeColor="text1"/>
+          <w:sz w:val="22"/>
+          <w:szCs w:val="22"/>
           <w:highlight w:val="none"/>
         </w:rPr>
       </w:r>
@@ -24493,7 +24588,7 @@
             <m:fPr>
               <m:ctrlPr>
                 <w:rPr>
-                  <w:rFonts w:hint="default" w:ascii="Cambria Math" w:hAnsi="Cambria Math" w:eastAsia="Cambria Math" w:cs="Cambria Math"/>
+                  <w:rFonts w:ascii="Cambria Math" w:hAnsi="Cambria Math" w:eastAsia="Cambria Math" w:cs="Cambria Math"/>
                   <w:i/>
                   <w:color w:val="000000" w:themeColor="text1"/>
                   <w:sz w:val="28"/>
@@ -24511,7 +24606,7 @@
                   <m:supHide m:val="on"/>
                   <m:ctrlPr>
                     <w:rPr>
-                      <w:rFonts w:hint="default" w:ascii="Cambria Math" w:hAnsi="Cambria Math" w:eastAsia="Cambria Math" w:cs="Cambria Math"/>
+                      <w:rFonts w:ascii="Cambria Math" w:hAnsi="Cambria Math" w:eastAsia="Cambria Math" w:cs="Cambria Math"/>
                       <w:i/>
                       <w:strike w:val="0"/>
                       <w:color w:val="auto" w:themeColor="text1"/>
@@ -24528,7 +24623,7 @@
                     <m:sSubPr>
                       <m:ctrlPr>
                         <w:rPr>
-                          <w:rFonts w:hint="default" w:ascii="Cambria Math" w:hAnsi="Cambria Math" w:eastAsia="Cambria Math" w:cs="Cambria Math"/>
+                          <w:rFonts w:ascii="Cambria Math" w:hAnsi="Cambria Math" w:eastAsia="Cambria Math" w:cs="Cambria Math"/>
                           <w:i/>
                           <w:strike w:val="0"/>
                           <w:color w:val="auto" w:themeColor="text1"/>
@@ -24584,7 +24679,7 @@
                     <m:sSubPr>
                       <m:ctrlPr>
                         <w:rPr>
-                          <w:rFonts w:hint="default" w:ascii="Cambria Math" w:hAnsi="Cambria Math" w:eastAsia="Cambria Math" w:cs="Cambria Math"/>
+                          <w:rFonts w:ascii="Cambria Math" w:hAnsi="Cambria Math" w:eastAsia="Cambria Math" w:cs="Cambria Math"/>
                           <w:i/>
                           <w:strike w:val="0"/>
                           <w:color w:val="000000" w:themeColor="text1"/>
@@ -24642,7 +24737,7 @@
                   <m:supHide m:val="on"/>
                   <m:ctrlPr>
                     <w:rPr>
-                      <w:rFonts w:hint="default" w:ascii="Cambria Math" w:hAnsi="Cambria Math" w:eastAsia="Cambria Math" w:cs="Cambria Math"/>
+                      <w:rFonts w:ascii="Cambria Math" w:hAnsi="Cambria Math" w:eastAsia="Cambria Math" w:cs="Cambria Math"/>
                       <w:i/>
                       <w:strike w:val="0"/>
                       <w:color w:val="auto" w:themeColor="text1"/>
@@ -24659,7 +24754,7 @@
                     <m:sSubPr>
                       <m:ctrlPr>
                         <w:rPr>
-                          <w:rFonts w:hint="default" w:ascii="Cambria Math" w:hAnsi="Cambria Math" w:eastAsia="Cambria Math" w:cs="Cambria Math"/>
+                          <w:rFonts w:ascii="Cambria Math" w:hAnsi="Cambria Math" w:eastAsia="Cambria Math" w:cs="Cambria Math"/>
                           <w:i/>
                           <w:strike w:val="0"/>
                           <w:color w:val="auto" w:themeColor="text1"/>
@@ -24729,7 +24824,7 @@
         <w:rPr>
           <w:color w:val="000000" w:themeColor="text1"/>
           <w:sz w:val="22"/>
-          <w:szCs w:val="16"/>
+          <w:szCs w:val="22"/>
           <w:highlight w:val="none"/>
         </w:rPr>
       </w:r>
@@ -24760,7 +24855,7 @@
           <m:sSubPr>
             <m:ctrlPr>
               <w:rPr>
-                <w:rFonts w:hint="default" w:ascii="Cambria Math" w:hAnsi="Cambria Math" w:eastAsia="Cambria Math" w:cs="Cambria Math"/>
+                <w:rFonts w:ascii="Cambria Math" w:hAnsi="Cambria Math" w:eastAsia="Cambria Math" w:cs="Cambria Math"/>
                 <w:i/>
                 <w:color w:val="000000" w:themeColor="text1"/>
                 <w:sz w:val="22"/>
@@ -24814,7 +24909,7 @@
           <m:sSubPr>
             <m:ctrlPr>
               <w:rPr>
-                <w:rFonts w:hint="default" w:ascii="Cambria Math" w:hAnsi="Cambria Math" w:eastAsia="Cambria Math" w:cs="Cambria Math"/>
+                <w:rFonts w:ascii="Cambria Math" w:hAnsi="Cambria Math" w:eastAsia="Cambria Math" w:cs="Cambria Math"/>
                 <w:i/>
                 <w:color w:val="000000" w:themeColor="text1"/>
                 <w:sz w:val="22"/>
@@ -24867,17 +24962,7 @@
         <w:rPr>
           <w:color w:val="000000" w:themeColor="text1"/>
           <w:sz w:val="22"/>
-          <w:szCs w:val="16"/>
-          <w:highlight w:val="none"/>
-        </w:rPr>
-      </w:r>
-      <w:r>
-        <w:rPr>
-          <w:highlight w:val="none"/>
-        </w:rPr>
-      </w:r>
-      <w:r>
-        <w:rPr>
+          <w:szCs w:val="22"/>
           <w:highlight w:val="none"/>
         </w:rPr>
       </w:r>
@@ -24978,28 +25063,6 @@
       </w:r>
       <w:r>
         <w:rPr>
-          <w:color w:val="000000" w:themeColor="text1"/>
-          <w:sz w:val="22"/>
-          <w:szCs w:val="16"/>
-          <w:highlight w:val="none"/>
-        </w:rPr>
-      </w:r>
-      <w:r/>
-      <w:r>
-        <w:rPr>
-          <w:color w:val="000000" w:themeColor="text1"/>
-          <w:sz w:val="22"/>
-          <w:szCs w:val="16"/>
-          <w:highlight w:val="none"/>
-        </w:rPr>
-      </w:r>
-      <w:r>
-        <w:rPr>
-          <w:highlight w:val="none"/>
-        </w:rPr>
-      </w:r>
-      <w:r>
-        <w:rPr>
           <w:highlight w:val="none"/>
         </w:rPr>
       </w:r>
@@ -25041,20 +25104,6 @@
         <w:rPr>
           <w:color w:val="4472c4" w:themeColor="accent5"/>
           <w:sz w:val="28"/>
-          <w:highlight w:val="none"/>
-        </w:rPr>
-      </w:r>
-      <w:r>
-        <w:rPr>
-          <w:color w:val="4472c4" w:themeColor="accent5"/>
-          <w:sz w:val="28"/>
-          <w:highlight w:val="none"/>
-        </w:rPr>
-      </w:r>
-      <w:r>
-        <w:rPr>
-          <w:color w:val="4472c4" w:themeColor="accent5"/>
-          <w:sz w:val="28"/>
           <w:szCs w:val="28"/>
           <w:highlight w:val="none"/>
         </w:rPr>
@@ -25079,7 +25128,24 @@
           <w:szCs w:val="18"/>
           <w:highlight w:val="none"/>
         </w:rPr>
-        <w:t xml:space="preserve">The client has said that displaying energy and momentum to show conservation laws would be helpful, so this will need to be done. Luckily, planets already have their energies and momentum as attributes, so all this needs is a simple for loop to add them up, shown here:</w:t>
+        <w:t xml:space="preserve">The client ha</w:t>
+      </w:r>
+      <w:r>
+        <w:rPr>
+          <w:color w:val="000000" w:themeColor="text1"/>
+          <w:sz w:val="22"/>
+          <w:szCs w:val="18"/>
+          <w:highlight w:val="none"/>
+        </w:rPr>
+        <w:t xml:space="preserve">s said that displaying energy and momentum to show conservation laws would be helpful, so this will need to be done. Luckily, planets already have their energies and momentum as attributes, so all this needs is a simple for loop to add them up, shown here:</w:t>
+      </w:r>
+      <w:r>
+        <w:rPr>
+          <w:color w:val="000000" w:themeColor="text1"/>
+          <w:sz w:val="22"/>
+          <w:szCs w:val="22"/>
+          <w:highlight w:val="none"/>
+        </w:rPr>
       </w:r>
       <w:r>
         <w:rPr>
@@ -25115,6 +25181,14 @@
           <w:color w:val="000000" w:themeColor="text1"/>
           <w:sz w:val="22"/>
           <w:szCs w:val="18"/>
+          <w:highlight w:val="none"/>
+        </w:rPr>
+      </w:r>
+      <w:r>
+        <w:rPr>
+          <w:color w:val="000000" w:themeColor="text1"/>
+          <w:sz w:val="22"/>
+          <w:szCs w:val="22"/>
           <w:highlight w:val="none"/>
         </w:rPr>
       </w:r>
@@ -25215,9 +25289,6 @@
       </w:r>
       <w:r>
         <w:rPr>
-          <w:color w:val="000000" w:themeColor="text1"/>
-          <w:sz w:val="22"/>
-          <w:szCs w:val="18"/>
           <w:highlight w:val="none"/>
         </w:rPr>
       </w:r>
@@ -25248,34 +25319,34 @@
           <w:highlight w:val="none"/>
         </w:rPr>
       </w:r>
-    </w:p>
-    <w:p>
-      <w:pPr>
-        <w:pBdr/>
-        <w:spacing/>
-        <w:ind/>
+      <w:r>
         <w:rPr>
           <w:color w:val="4472c4" w:themeColor="accent5"/>
           <w:sz w:val="28"/>
           <w:szCs w:val="28"/>
           <w:highlight w:val="none"/>
         </w:rPr>
-      </w:pPr>
-      <w:r>
-        <w:rPr>
-          <w:color w:val="4472c4" w:themeColor="accent5"/>
-          <w:sz w:val="28"/>
-          <w:highlight w:val="none"/>
-        </w:rPr>
-        <w:t xml:space="preserve">zoom</w:t>
-      </w:r>
-      <w:r>
+      </w:r>
+    </w:p>
+    <w:p>
+      <w:pPr>
+        <w:pBdr/>
+        <w:spacing/>
+        <w:ind/>
         <w:rPr>
           <w:color w:val="4472c4" w:themeColor="accent5"/>
           <w:sz w:val="28"/>
           <w:szCs w:val="28"/>
           <w:highlight w:val="none"/>
         </w:rPr>
+      </w:pPr>
+      <w:r>
+        <w:rPr>
+          <w:color w:val="4472c4" w:themeColor="accent5"/>
+          <w:sz w:val="28"/>
+          <w:highlight w:val="none"/>
+        </w:rPr>
+        <w:t xml:space="preserve">zoom</w:t>
       </w:r>
       <w:r>
         <w:rPr>
@@ -25285,6 +25356,14 @@
           <w:highlight w:val="none"/>
         </w:rPr>
       </w:r>
+      <w:r>
+        <w:rPr>
+          <w:color w:val="4472c4" w:themeColor="accent5"/>
+          <w:sz w:val="28"/>
+          <w:szCs w:val="28"/>
+          <w:highlight w:val="none"/>
+        </w:rPr>
+      </w:r>
     </w:p>
     <w:p>
       <w:pPr>
@@ -25305,7 +25384,33 @@
           <w:szCs w:val="18"/>
           <w:highlight w:val="none"/>
         </w:rPr>
-        <w:t xml:space="preserve">The problem with zooming is making it look natural. Clearly just changing the distScale instantly when you scroll would be extremely jarring, as the program would just snap to being more zoomed out or zoomed in. So, an extra variable is created, zoomScale, which is the intended new value for distScale. One approach would be to do linear interpolation between distScale and zoomScale so that you smoothly zoom out at a constant rate, but this would still have an abrupt stop once distScale reached zoomScale. Instead, a non-linear interpolation is used. This makes it so that distScale asymptotically approaches zoomScale, there is no abrupt stop. A graph of how this works is shown here, with distScale starting at 0 and then going up to 1:</w:t>
+        <w:t xml:space="preserve">The problem with zooming is making it look natural. Clearly just changing the distScale instantly when you scroll would be extremely jarring, as the program would just snap to being more zoomed out or zoomed in. So, an extra varia</w:t>
+      </w:r>
+      <w:r>
+        <w:rPr>
+          <w:color w:val="000000" w:themeColor="text1"/>
+          <w:sz w:val="22"/>
+          <w:szCs w:val="18"/>
+          <w:highlight w:val="none"/>
+        </w:rPr>
+        <w:t xml:space="preserve">ble is created, zoomScale, which is the intended new value for distScale. One approach would be to do linear interpolation between distScale and zoomScale so that you smoothly zoom out at a constant rate, but this would still have an abrupt stop once distS</w:t>
+      </w:r>
+      <w:r>
+        <w:rPr>
+          <w:color w:val="000000" w:themeColor="text1"/>
+          <w:sz w:val="22"/>
+          <w:szCs w:val="18"/>
+          <w:highlight w:val="none"/>
+        </w:rPr>
+        <w:t xml:space="preserve">cale reached zoomScale. Instead, a non-linear interpolation is used. This makes it so that distScale asymptotically approaches zoomScale, there is no abrupt stop. A graph of how this works is shown here, with distScale starting at 0 and then going up to 1:</w:t>
+      </w:r>
+      <w:r>
+        <w:rPr>
+          <w:color w:val="000000" w:themeColor="text1"/>
+          <w:sz w:val="22"/>
+          <w:szCs w:val="22"/>
+          <w:highlight w:val="none"/>
+        </w:rPr>
       </w:r>
       <w:r>
         <w:rPr>
@@ -25335,6 +25440,14 @@
       </w:r>
       <w:r>
         <w:rPr>
+          <w:highlight w:val="none"/>
+        </w:rPr>
+      </w:r>
+      <w:r>
+        <w:rPr>
+          <w:color w:val="000000" w:themeColor="text1"/>
+          <w:sz w:val="22"/>
+          <w:szCs w:val="22"/>
           <w:highlight w:val="none"/>
         </w:rPr>
       </w:r>
@@ -25433,30 +25546,8 @@
           <w:highlight w:val="none"/>
         </w:rPr>
       </w:r>
-      <w:r/>
-      <w:r>
-        <w:rPr>
-          <w:color w:val="000000" w:themeColor="text1"/>
-          <w:sz w:val="22"/>
-          <w:szCs w:val="22"/>
-          <w:highlight w:val="none"/>
-        </w:rPr>
-      </w:r>
-      <w:r>
-        <w:rPr>
-          <w:highlight w:val="none"/>
-        </w:rPr>
-      </w:r>
-      <w:r>
-        <w:rPr>
-          <w:highlight w:val="none"/>
-        </w:rPr>
-      </w:r>
-      <w:r>
-        <w:rPr>
-          <w:color w:val="000000" w:themeColor="text1"/>
-          <w:sz w:val="22"/>
-          <w:szCs w:val="22"/>
+      <w:r>
+        <w:rPr>
           <w:highlight w:val="none"/>
         </w:rPr>
       </w:r>
@@ -25480,6 +25571,11 @@
           <w:highlight w:val="none"/>
         </w:rPr>
       </w:r>
+      <w:r>
+        <w:rPr>
+          <w:highlight w:val="none"/>
+        </w:rPr>
+      </w:r>
     </w:p>
     <w:p>
       <w:pPr>
@@ -25494,7 +25590,18 @@
         <w:rPr>
           <w:highlight w:val="none"/>
         </w:rPr>
-        <w:t xml:space="preserve">The x-axis is time and y-axis is the value of distScale. As you can see distScale grows quickly at the start and then the growth slows down, and it approaches 1 but never quite reaches it. The dotted black line is the asymptote at y=1. This ends up creating a natural and smooth animation for zooming out that stops gradually instead of abruptly.</w:t>
+        <w:t xml:space="preserve">The x-axis is time and y-axis is the value of distScale. As you can see distScale grows qu</w:t>
+      </w:r>
+      <w:r>
+        <w:rPr>
+          <w:highlight w:val="none"/>
+        </w:rPr>
+        <w:t xml:space="preserve">ickly at the start and then the growth slows down, and it approaches 1 but never quite reaches it. The dotted black line is the asymptote at y=1. This ends up creating a natural and smooth animation for zooming out that stops gradually instead of abruptly.</w:t>
+      </w:r>
+      <w:r>
+        <w:rPr>
+          <w:highlight w:val="none"/>
+        </w:rPr>
       </w:r>
       <w:r>
         <w:rPr>
@@ -25527,7 +25634,7 @@
           <m:sSubPr>
             <m:ctrlPr>
               <w:rPr>
-                <w:rFonts w:hint="default" w:ascii="Cambria Math" w:hAnsi="Cambria Math" w:eastAsia="Cambria Math" w:cs="Cambria Math"/>
+                <w:rFonts w:ascii="Cambria Math" w:hAnsi="Cambria Math" w:eastAsia="Cambria Math" w:cs="Cambria Math"/>
                 <w:i/>
                 <w:highlight w:val="none"/>
               </w:rPr>
@@ -25606,6 +25713,11 @@
           <w:highlight w:val="none"/>
         </w:rPr>
       </w:r>
+      <w:r>
+        <w:rPr>
+          <w:highlight w:val="none"/>
+        </w:rPr>
+      </w:r>
     </w:p>
     <w:p>
       <w:pPr>
@@ -25628,7 +25740,7 @@
             <m:sSubPr>
               <m:ctrlPr>
                 <w:rPr>
-                  <w:rFonts w:hint="default" w:ascii="Cambria Math" w:hAnsi="Cambria Math" w:eastAsia="Cambria Math" w:cs="Cambria Math"/>
+                  <w:rFonts w:ascii="Cambria Math" w:hAnsi="Cambria Math" w:eastAsia="Cambria Math" w:cs="Cambria Math"/>
                   <w:i/>
                   <w:sz w:val="28"/>
                   <w:highlight w:val="none"/>
@@ -25680,7 +25792,7 @@
             <m:sSubPr>
               <m:ctrlPr>
                 <w:rPr>
-                  <w:rFonts w:hint="default" w:ascii="Cambria Math" w:hAnsi="Cambria Math" w:eastAsia="Cambria Math" w:cs="Cambria Math"/>
+                  <w:rFonts w:ascii="Cambria Math" w:hAnsi="Cambria Math" w:eastAsia="Cambria Math" w:cs="Cambria Math"/>
                   <w:i/>
                   <w:sz w:val="28"/>
                   <w:highlight w:val="none"/>
@@ -25894,7 +26006,6 @@
         </w:rPr>
         <w:t xml:space="preserve">is a suitable value for the program.</w:t>
       </w:r>
-      <w:r/>
       <w:r>
         <w:rPr>
           <w:rFonts w:ascii="Cambria Math" w:hAnsi="Cambria Math" w:eastAsia="Cambria Math" w:cs="Cambria Math"/>
@@ -25903,6 +26014,13 @@
           <w:highlight w:val="none"/>
         </w:rPr>
       </w:r>
+      <w:r>
+        <w:rPr>
+          <w:sz w:val="22"/>
+          <w:szCs w:val="22"/>
+          <w:highlight w:val="none"/>
+        </w:rPr>
+      </w:r>
     </w:p>
     <w:p>
       <w:pPr>
@@ -25921,7 +26039,22 @@
           <w:szCs w:val="22"/>
           <w:highlight w:val="none"/>
         </w:rPr>
-        <w:t xml:space="preserve">One thing to note is that if distScale grows very large it can cause lag due to pygame attempting to draw circles with very large radii, something it’s not good at. There is no point for distScale to be particularly big as the users would not be able to see anything, the planet they’d selected would fill the whole screen, so distScale is capped at 1000.</w:t>
+        <w:t xml:space="preserve">One thing to note is that if distScale grows very large it can cause lag due to pygame attempting t</w:t>
+      </w:r>
+      <w:r>
+        <w:rPr>
+          <w:sz w:val="22"/>
+          <w:szCs w:val="22"/>
+          <w:highlight w:val="none"/>
+        </w:rPr>
+        <w:t xml:space="preserve">o draw circles with very large radii, something it’s not good at. There is no point for distScale to be particularly big as the users would not be able to see anything, the planet they’d selected would fill the whole screen, so distScale is capped at 1000.</w:t>
+      </w:r>
+      <w:r>
+        <w:rPr>
+          <w:sz w:val="22"/>
+          <w:szCs w:val="22"/>
+          <w:highlight w:val="none"/>
+        </w:rPr>
       </w:r>
       <w:r>
         <w:rPr>
@@ -25949,6 +26082,13 @@
           <w:highlight w:val="none"/>
         </w:rPr>
         <w:t xml:space="preserve">Zoom() will be run every tick to carry out this interpolation process, and it makes distScale change smoothly over time. Here is pseudocode for it:</w:t>
+      </w:r>
+      <w:r>
+        <w:rPr>
+          <w:sz w:val="22"/>
+          <w:szCs w:val="22"/>
+          <w:highlight w:val="none"/>
+        </w:rPr>
       </w:r>
       <w:r>
         <w:rPr>
@@ -26052,8 +26192,6 @@
       </w:r>
       <w:r>
         <w:rPr>
-          <w:sz w:val="22"/>
-          <w:szCs w:val="22"/>
           <w:highlight w:val="none"/>
         </w:rPr>
       </w:r>
@@ -26077,6 +26215,14 @@
       </w:r>
       <w:r>
         <w:rPr>
+          <w:highlight w:val="none"/>
+        </w:rPr>
+      </w:r>
+      <w:r>
+        <w:rPr>
+          <w:rFonts w:ascii="Cambria Math" w:hAnsi="Cambria Math" w:eastAsia="Cambria Math" w:cs="Cambria Math"/>
+          <w:sz w:val="18"/>
+          <w:szCs w:val="18"/>
           <w:highlight w:val="none"/>
         </w:rPr>
       </w:r>

</xml_diff>